<commit_message>
refactors to support data_format at experiment_step level
</commit_message>
<xml_diff>
--- a/doc/cv-workbench.docx
+++ b/doc/cv-workbench.docx
@@ -2317,25 +2317,7 @@
               <w:cnfStyle w:val="000000100000" w:firstRow="0" w:lastRow="0" w:firstColumn="0" w:lastColumn="0" w:oddVBand="0" w:evenVBand="0" w:oddHBand="1" w:evenHBand="0" w:firstRowFirstColumn="0" w:firstRowLastColumn="0" w:lastRowFirstColumn="0" w:lastRowLastColumn="0"/>
             </w:pPr>
             <w:r>
-              <w:t xml:space="preserve">The </w:t>
-            </w:r>
-            <w:r>
-              <w:t xml:space="preserve">overall </w:t>
-            </w:r>
-            <w:r>
-              <w:t>m</w:t>
-            </w:r>
-            <w:r>
-              <w:t>ax</w:t>
-            </w:r>
-            <w:r>
-              <w:t xml:space="preserve">imum </w:t>
-            </w:r>
-            <w:r>
-              <w:t xml:space="preserve">image </w:t>
-            </w:r>
-            <w:r>
-              <w:t xml:space="preserve">pixel value </w:t>
+              <w:t xml:space="preserve">The overall maximum image pixel value </w:t>
             </w:r>
           </w:p>
         </w:tc>
@@ -2550,13 +2532,7 @@
               <w:cnfStyle w:val="000000100000" w:firstRow="0" w:lastRow="0" w:firstColumn="0" w:lastColumn="0" w:oddVBand="0" w:evenVBand="0" w:oddHBand="1" w:evenHBand="0" w:firstRowFirstColumn="0" w:firstRowLastColumn="0" w:lastRowFirstColumn="0" w:lastRowLastColumn="0"/>
             </w:pPr>
             <w:r>
-              <w:t xml:space="preserve">The </w:t>
-            </w:r>
-            <w:r>
-              <w:t>image pixel value</w:t>
-            </w:r>
-            <w:r>
-              <w:t xml:space="preserve"> mean </w:t>
+              <w:t xml:space="preserve">The image pixel value mean </w:t>
             </w:r>
           </w:p>
         </w:tc>
@@ -2608,13 +2584,7 @@
               <w:cnfStyle w:val="000000000000" w:firstRow="0" w:lastRow="0" w:firstColumn="0" w:lastColumn="0" w:oddVBand="0" w:evenVBand="0" w:oddHBand="0" w:evenHBand="0" w:firstRowFirstColumn="0" w:firstRowLastColumn="0" w:lastRowFirstColumn="0" w:lastRowLastColumn="0"/>
             </w:pPr>
             <w:r>
-              <w:t xml:space="preserve">The image </w:t>
-            </w:r>
-            <w:r>
-              <w:t>pixel value</w:t>
-            </w:r>
-            <w:r>
-              <w:t xml:space="preserve"> variance </w:t>
+              <w:t xml:space="preserve">The image pixel value variance </w:t>
             </w:r>
           </w:p>
         </w:tc>
@@ -2669,13 +2639,7 @@
               <w:cnfStyle w:val="000000100000" w:firstRow="0" w:lastRow="0" w:firstColumn="0" w:lastColumn="0" w:oddVBand="0" w:evenVBand="0" w:oddHBand="1" w:evenHBand="0" w:firstRowFirstColumn="0" w:firstRowLastColumn="0" w:lastRowFirstColumn="0" w:lastRowLastColumn="0"/>
             </w:pPr>
             <w:r>
-              <w:t xml:space="preserve">The image </w:t>
-            </w:r>
-            <w:r>
-              <w:t>pixel value</w:t>
-            </w:r>
-            <w:r>
-              <w:t xml:space="preserve"> sample variance </w:t>
+              <w:t xml:space="preserve">The image pixel value sample variance </w:t>
             </w:r>
           </w:p>
         </w:tc>
@@ -2727,13 +2691,7 @@
               <w:cnfStyle w:val="000000000000" w:firstRow="0" w:lastRow="0" w:firstColumn="0" w:lastColumn="0" w:oddVBand="0" w:evenVBand="0" w:oddHBand="0" w:evenHBand="0" w:firstRowFirstColumn="0" w:firstRowLastColumn="0" w:lastRowFirstColumn="0" w:lastRowLastColumn="0"/>
             </w:pPr>
             <w:r>
-              <w:t xml:space="preserve">The image </w:t>
-            </w:r>
-            <w:r>
-              <w:t>pixel value</w:t>
-            </w:r>
-            <w:r>
-              <w:t xml:space="preserve"> standard deviation </w:t>
+              <w:t xml:space="preserve">The image pixel value standard deviation </w:t>
             </w:r>
           </w:p>
         </w:tc>
@@ -3186,9 +3144,61 @@
     </w:p>
     <w:p>
       <w:pPr>
+        <w:pStyle w:val="code"/>
+        <w:rPr>
+          <w:sz w:val="20"/>
+          <w:szCs w:val="20"/>
+        </w:rPr>
+      </w:pPr>
+      <w:r>
+        <w:rPr>
+          <w:sz w:val="20"/>
+          <w:szCs w:val="20"/>
+        </w:rPr>
+        <w:t xml:space="preserve">  rho = rho_index – max_rho / 2</w:t>
+      </w:r>
+    </w:p>
+    <w:p>
+      <w:pPr>
+        <w:pStyle w:val="Normalafterlist"/>
+      </w:pPr>
+      <w:r>
+        <w:t>The Hough accumulator is indexed by (rho_index, theta_index)</w:t>
+      </w:r>
+      <w:r>
+        <w:t>, where theta_index is the index of the sampled angle used. theta_index corresponds to the angle:</w:t>
+      </w:r>
+    </w:p>
+    <w:p>
+      <w:pPr>
+        <w:pStyle w:val="code"/>
+        <w:rPr>
+          <w:sz w:val="20"/>
+          <w:szCs w:val="20"/>
+        </w:rPr>
+      </w:pPr>
+      <w:r>
+        <w:rPr>
+          <w:sz w:val="20"/>
+          <w:szCs w:val="20"/>
+        </w:rPr>
+        <w:t xml:space="preserve">  theta degrees = theta_index * theta_inc</w:t>
+      </w:r>
+    </w:p>
+    <w:p>
+      <w:pPr>
+        <w:pStyle w:val="Normalafterlist"/>
+      </w:pPr>
+      <w:r>
+        <w:t>Polar line (rho, theta) are generally input and stored as (rho_index, theta_index), except as noted.</w:t>
+      </w:r>
+    </w:p>
+    <w:p>
+      <w:pPr>
         <w:pStyle w:val="Heading3"/>
       </w:pPr>
       <w:r>
+        <w:lastRenderedPageBreak/>
         <w:t>Hough accumulator data binary file format</w:t>
       </w:r>
     </w:p>
@@ -3204,9 +3214,9 @@
         <w:tblLook w:val="04A0" w:firstRow="1" w:lastRow="0" w:firstColumn="1" w:lastColumn="0" w:noHBand="0" w:noVBand="1"/>
       </w:tblPr>
       <w:tblGrid>
-        <w:gridCol w:w="2214"/>
-        <w:gridCol w:w="2713"/>
-        <w:gridCol w:w="4423"/>
+        <w:gridCol w:w="2184"/>
+        <w:gridCol w:w="2652"/>
+        <w:gridCol w:w="4514"/>
       </w:tblGrid>
       <w:tr>
         <w:trPr>
@@ -3438,7 +3448,6 @@
                 <w:b w:val="0"/>
                 <w:bCs w:val="0"/>
               </w:rPr>
-              <w:lastRenderedPageBreak/>
               <w:t>min_count</w:t>
             </w:r>
           </w:p>
@@ -3788,7 +3797,7 @@
               <w:cnfStyle w:val="000000000000" w:firstRow="0" w:lastRow="0" w:firstColumn="0" w:lastColumn="0" w:oddVBand="0" w:evenVBand="0" w:oddHBand="0" w:evenHBand="0" w:firstRowFirstColumn="0" w:firstRowLastColumn="0" w:lastRowFirstColumn="0" w:lastRowLastColumn="0"/>
             </w:pPr>
             <w:r>
-              <w:t>The Hough accumulator (rho, theta) count data</w:t>
+              <w:t>The Hough accumulator (rho_index, theta_index) count data</w:t>
             </w:r>
           </w:p>
         </w:tc>
@@ -3864,7 +3873,7 @@
           </w:tcPr>
           <w:p>
             <w:r>
-              <w:t xml:space="preserve">the sample theta in degrees, followed by each accumulator count for that theta and rho </w:t>
+              <w:t>sample theta in degrees, followed by each accumulator count for the corresponding (rho_index, theta_index)</w:t>
             </w:r>
           </w:p>
         </w:tc>
@@ -3900,9 +3909,42 @@
     </w:p>
     <w:p>
       <w:r>
-        <w:t>The binary Hough peak line data is defined by the workbench, and have the following format:</w:t>
-      </w:r>
-    </w:p>
+        <w:t>The binary Hough peak line data is defined by the workbench, and have the following format. Polar line data is stored as (rho_index, theta_index). The corresponding rho and theta can be derived from:</w:t>
+      </w:r>
+    </w:p>
+    <w:p>
+      <w:pPr>
+        <w:pStyle w:val="code"/>
+        <w:rPr>
+          <w:sz w:val="20"/>
+          <w:szCs w:val="20"/>
+        </w:rPr>
+      </w:pPr>
+      <w:r>
+        <w:rPr>
+          <w:sz w:val="20"/>
+          <w:szCs w:val="20"/>
+        </w:rPr>
+        <w:t>rho = rho_index – max_rho / 2</w:t>
+      </w:r>
+    </w:p>
+    <w:p>
+      <w:pPr>
+        <w:pStyle w:val="code"/>
+        <w:rPr>
+          <w:sz w:val="20"/>
+          <w:szCs w:val="20"/>
+        </w:rPr>
+      </w:pPr>
+      <w:r>
+        <w:rPr>
+          <w:sz w:val="20"/>
+          <w:szCs w:val="20"/>
+        </w:rPr>
+        <w:t>theta degrees = theta_index * theta_inc</w:t>
+      </w:r>
+    </w:p>
+    <w:p/>
     <w:tbl>
       <w:tblPr>
         <w:tblStyle w:val="PlainTable1"/>
@@ -3910,13 +3952,15 @@
         <w:tblLook w:val="04A0" w:firstRow="1" w:lastRow="0" w:firstColumn="1" w:lastColumn="0" w:noHBand="0" w:noVBand="1"/>
       </w:tblPr>
       <w:tblGrid>
-        <w:gridCol w:w="2241"/>
-        <w:gridCol w:w="2517"/>
-        <w:gridCol w:w="4592"/>
+        <w:gridCol w:w="2038"/>
+        <w:gridCol w:w="2235"/>
+        <w:gridCol w:w="5077"/>
       </w:tblGrid>
       <w:tr>
         <w:trPr>
           <w:cnfStyle w:val="100000000000" w:firstRow="1" w:lastRow="0" w:firstColumn="0" w:lastColumn="0" w:oddVBand="0" w:evenVBand="0" w:oddHBand="0" w:evenHBand="0" w:firstRowFirstColumn="0" w:firstRowLastColumn="0" w:lastRowFirstColumn="0" w:lastRowLastColumn="0"/>
+          <w:cantSplit/>
+          <w:tblHeader/>
         </w:trPr>
         <w:tc>
           <w:tcPr>
@@ -4011,30 +4055,138 @@
               <w:cnfStyle w:val="000000100000" w:firstRow="0" w:lastRow="0" w:firstColumn="0" w:lastColumn="0" w:oddVBand="0" w:evenVBand="0" w:oddHBand="1" w:evenHBand="0" w:firstRowFirstColumn="0" w:firstRowLastColumn="0" w:lastRowFirstColumn="0" w:lastRowLastColumn="0"/>
             </w:pPr>
             <w:r>
-              <w:t xml:space="preserve">The number of polar lines (rho, theta, count) </w:t>
-            </w:r>
-          </w:p>
-        </w:tc>
-      </w:tr>
-      <w:tr>
-        <w:tc>
-          <w:tcPr>
-            <w:cnfStyle w:val="001000000000" w:firstRow="0" w:lastRow="0" w:firstColumn="1" w:lastColumn="0" w:oddVBand="0" w:evenVBand="0" w:oddHBand="0" w:evenHBand="0" w:firstRowFirstColumn="0" w:firstRowLastColumn="0" w:lastRowFirstColumn="0" w:lastRowLastColumn="0"/>
-            <w:tcW w:w="0" w:type="auto"/>
-          </w:tcPr>
-          <w:p>
-            <w:pPr>
-              <w:pStyle w:val="NoSpacing"/>
-              <w:rPr>
-                <w:b w:val="0"/>
-                <w:bCs w:val="0"/>
-              </w:rPr>
-            </w:pPr>
-            <w:r>
-              <w:rPr>
-                <w:b w:val="0"/>
-                <w:bCs w:val="0"/>
-              </w:rPr>
+              <w:t xml:space="preserve">The number of polar lines (rho_index, theta_index, count) </w:t>
+            </w:r>
+          </w:p>
+        </w:tc>
+      </w:tr>
+      <w:tr>
+        <w:tc>
+          <w:tcPr>
+            <w:cnfStyle w:val="001000000000" w:firstRow="0" w:lastRow="0" w:firstColumn="1" w:lastColumn="0" w:oddVBand="0" w:evenVBand="0" w:oddHBand="0" w:evenHBand="0" w:firstRowFirstColumn="0" w:firstRowLastColumn="0" w:lastRowFirstColumn="0" w:lastRowLastColumn="0"/>
+            <w:tcW w:w="0" w:type="auto"/>
+          </w:tcPr>
+          <w:p>
+            <w:pPr>
+              <w:pStyle w:val="NoSpacing"/>
+              <w:rPr>
+                <w:b w:val="0"/>
+                <w:bCs w:val="0"/>
+              </w:rPr>
+            </w:pPr>
+            <w:r>
+              <w:rPr>
+                <w:b w:val="0"/>
+                <w:bCs w:val="0"/>
+              </w:rPr>
+              <w:t>theta_inc</w:t>
+            </w:r>
+          </w:p>
+        </w:tc>
+        <w:tc>
+          <w:tcPr>
+            <w:tcW w:w="0" w:type="auto"/>
+          </w:tcPr>
+          <w:p>
+            <w:pPr>
+              <w:pStyle w:val="NoSpacing"/>
+              <w:cnfStyle w:val="000000000000" w:firstRow="0" w:lastRow="0" w:firstColumn="0" w:lastColumn="0" w:oddVBand="0" w:evenVBand="0" w:oddHBand="0" w:evenHBand="0" w:firstRowFirstColumn="0" w:firstRowLastColumn="0" w:lastRowFirstColumn="0" w:lastRowLastColumn="0"/>
+            </w:pPr>
+            <w:r>
+              <w:t>32-bit integer</w:t>
+            </w:r>
+          </w:p>
+        </w:tc>
+        <w:tc>
+          <w:tcPr>
+            <w:tcW w:w="0" w:type="auto"/>
+          </w:tcPr>
+          <w:p>
+            <w:pPr>
+              <w:pStyle w:val="NoSpacing"/>
+              <w:cnfStyle w:val="000000000000" w:firstRow="0" w:lastRow="0" w:firstColumn="0" w:lastColumn="0" w:oddVBand="0" w:evenVBand="0" w:oddHBand="0" w:evenHBand="0" w:firstRowFirstColumn="0" w:firstRowLastColumn="0" w:lastRowFirstColumn="0" w:lastRowLastColumn="0"/>
+            </w:pPr>
+            <w:r>
+              <w:t>The increment between sampled angles in degrees</w:t>
+            </w:r>
+          </w:p>
+        </w:tc>
+      </w:tr>
+      <w:tr>
+        <w:trPr>
+          <w:cnfStyle w:val="000000100000" w:firstRow="0" w:lastRow="0" w:firstColumn="0" w:lastColumn="0" w:oddVBand="0" w:evenVBand="0" w:oddHBand="1" w:evenHBand="0" w:firstRowFirstColumn="0" w:firstRowLastColumn="0" w:lastRowFirstColumn="0" w:lastRowLastColumn="0"/>
+        </w:trPr>
+        <w:tc>
+          <w:tcPr>
+            <w:cnfStyle w:val="001000000000" w:firstRow="0" w:lastRow="0" w:firstColumn="1" w:lastColumn="0" w:oddVBand="0" w:evenVBand="0" w:oddHBand="0" w:evenHBand="0" w:firstRowFirstColumn="0" w:firstRowLastColumn="0" w:lastRowFirstColumn="0" w:lastRowLastColumn="0"/>
+            <w:tcW w:w="0" w:type="auto"/>
+          </w:tcPr>
+          <w:p>
+            <w:pPr>
+              <w:pStyle w:val="NoSpacing"/>
+              <w:rPr>
+                <w:b w:val="0"/>
+                <w:bCs w:val="0"/>
+              </w:rPr>
+            </w:pPr>
+            <w:r>
+              <w:rPr>
+                <w:b w:val="0"/>
+                <w:bCs w:val="0"/>
+              </w:rPr>
+              <w:t>max_rho</w:t>
+            </w:r>
+          </w:p>
+        </w:tc>
+        <w:tc>
+          <w:tcPr>
+            <w:tcW w:w="0" w:type="auto"/>
+          </w:tcPr>
+          <w:p>
+            <w:pPr>
+              <w:pStyle w:val="NoSpacing"/>
+              <w:cnfStyle w:val="000000100000" w:firstRow="0" w:lastRow="0" w:firstColumn="0" w:lastColumn="0" w:oddVBand="0" w:evenVBand="0" w:oddHBand="1" w:evenHBand="0" w:firstRowFirstColumn="0" w:firstRowLastColumn="0" w:lastRowFirstColumn="0" w:lastRowLastColumn="0"/>
+            </w:pPr>
+            <w:r>
+              <w:t>32-bit integer</w:t>
+            </w:r>
+          </w:p>
+        </w:tc>
+        <w:tc>
+          <w:tcPr>
+            <w:tcW w:w="0" w:type="auto"/>
+          </w:tcPr>
+          <w:p>
+            <w:pPr>
+              <w:pStyle w:val="NoSpacing"/>
+              <w:cnfStyle w:val="000000100000" w:firstRow="0" w:lastRow="0" w:firstColumn="0" w:lastColumn="0" w:oddVBand="0" w:evenVBand="0" w:oddHBand="1" w:evenHBand="0" w:firstRowFirstColumn="0" w:firstRowLastColumn="0" w:lastRowFirstColumn="0" w:lastRowLastColumn="0"/>
+            </w:pPr>
+            <w:r>
+              <w:t>The number of rho values sampled</w:t>
+            </w:r>
+          </w:p>
+        </w:tc>
+      </w:tr>
+      <w:tr>
+        <w:tc>
+          <w:tcPr>
+            <w:cnfStyle w:val="001000000000" w:firstRow="0" w:lastRow="0" w:firstColumn="1" w:lastColumn="0" w:oddVBand="0" w:evenVBand="0" w:oddHBand="0" w:evenHBand="0" w:firstRowFirstColumn="0" w:firstRowLastColumn="0" w:lastRowFirstColumn="0" w:lastRowLastColumn="0"/>
+            <w:tcW w:w="0" w:type="auto"/>
+          </w:tcPr>
+          <w:p>
+            <w:pPr>
+              <w:pStyle w:val="NoSpacing"/>
+              <w:rPr>
+                <w:b w:val="0"/>
+                <w:bCs w:val="0"/>
+              </w:rPr>
+            </w:pPr>
+            <w:r>
+              <w:rPr>
+                <w:b w:val="0"/>
+                <w:bCs w:val="0"/>
+              </w:rPr>
+              <w:lastRenderedPageBreak/>
               <w:t>Hough peak line data</w:t>
             </w:r>
           </w:p>
@@ -4063,7 +4215,7 @@
               <w:cnfStyle w:val="000000000000" w:firstRow="0" w:lastRow="0" w:firstColumn="0" w:lastColumn="0" w:oddVBand="0" w:evenVBand="0" w:oddHBand="0" w:evenHBand="0" w:firstRowFirstColumn="0" w:firstRowLastColumn="0" w:lastRowFirstColumn="0" w:lastRowLastColumn="0"/>
             </w:pPr>
             <w:r>
-              <w:t xml:space="preserve">Parameters (rho, theta) and count for the lines </w:t>
+              <w:t>The Hough accumulator (rho_index, theta_index) count data</w:t>
             </w:r>
           </w:p>
         </w:tc>
@@ -4283,7 +4435,6 @@
         <w:pStyle w:val="Normalafterlist"/>
       </w:pPr>
       <w:r>
-        <w:lastRenderedPageBreak/>
         <w:t xml:space="preserve">Each </w:t>
       </w:r>
       <w:r>
@@ -4572,6 +4723,24 @@
         <w:pStyle w:val="code"/>
       </w:pPr>
       <w:r>
+        <w:t xml:space="preserve">         "format": "</w:t>
+      </w:r>
+      <w:r>
+        <w:rPr>
+          <w:i/>
+          <w:iCs/>
+        </w:rPr>
+        <w:t>data-format</w:t>
+      </w:r>
+      <w:r>
+        <w:t>",</w:t>
+      </w:r>
+    </w:p>
+    <w:p>
+      <w:pPr>
+        <w:pStyle w:val="code"/>
+      </w:pPr>
+      <w:r>
         <w:tab/>
         <w:t xml:space="preserve">  "repository": "</w:t>
       </w:r>
@@ -4666,358 +4835,42 @@
         <w:pStyle w:val="Heading2"/>
       </w:pPr>
       <w:r>
+        <w:lastRenderedPageBreak/>
         <w:t>Data Descriptors</w:t>
       </w:r>
     </w:p>
     <w:p>
       <w:r>
-        <w:t>Input and output data may be stored in different types of repositories. Repositories to be supported include the following. Only filesystem repositories are supported in the current release.</w:t>
-      </w:r>
-    </w:p>
-    <w:tbl>
-      <w:tblPr>
-        <w:tblStyle w:val="PlainTable1"/>
-        <w:tblW w:w="0" w:type="auto"/>
-        <w:tblLook w:val="04A0" w:firstRow="1" w:lastRow="0" w:firstColumn="1" w:lastColumn="0" w:noHBand="0" w:noVBand="1"/>
-      </w:tblPr>
-      <w:tblGrid>
-        <w:gridCol w:w="1830"/>
-        <w:gridCol w:w="3616"/>
-      </w:tblGrid>
-      <w:tr>
-        <w:trPr>
-          <w:cnfStyle w:val="100000000000" w:firstRow="1" w:lastRow="0" w:firstColumn="0" w:lastColumn="0" w:oddVBand="0" w:evenVBand="0" w:oddHBand="0" w:evenHBand="0" w:firstRowFirstColumn="0" w:firstRowLastColumn="0" w:lastRowFirstColumn="0" w:lastRowLastColumn="0"/>
-        </w:trPr>
-        <w:tc>
-          <w:tcPr>
-            <w:cnfStyle w:val="001000000000" w:firstRow="0" w:lastRow="0" w:firstColumn="1" w:lastColumn="0" w:oddVBand="0" w:evenVBand="0" w:oddHBand="0" w:evenHBand="0" w:firstRowFirstColumn="0" w:firstRowLastColumn="0" w:lastRowFirstColumn="0" w:lastRowLastColumn="0"/>
-            <w:tcW w:w="0" w:type="auto"/>
-          </w:tcPr>
-          <w:p>
-            <w:pPr>
-              <w:pStyle w:val="NoSpacing"/>
-            </w:pPr>
-            <w:r>
-              <w:t>Data repository</w:t>
-            </w:r>
-          </w:p>
-        </w:tc>
-        <w:tc>
-          <w:tcPr>
-            <w:tcW w:w="0" w:type="auto"/>
-          </w:tcPr>
-          <w:p>
-            <w:pPr>
-              <w:pStyle w:val="NoSpacing"/>
-              <w:cnfStyle w:val="100000000000" w:firstRow="1" w:lastRow="0" w:firstColumn="0" w:lastColumn="0" w:oddVBand="0" w:evenVBand="0" w:oddHBand="0" w:evenHBand="0" w:firstRowFirstColumn="0" w:firstRowLastColumn="0" w:lastRowFirstColumn="0" w:lastRowLastColumn="0"/>
-            </w:pPr>
-            <w:r>
-              <w:t>Description</w:t>
-            </w:r>
-          </w:p>
-        </w:tc>
-      </w:tr>
-      <w:tr>
-        <w:trPr>
-          <w:cnfStyle w:val="000000100000" w:firstRow="0" w:lastRow="0" w:firstColumn="0" w:lastColumn="0" w:oddVBand="0" w:evenVBand="0" w:oddHBand="1" w:evenHBand="0" w:firstRowFirstColumn="0" w:firstRowLastColumn="0" w:lastRowFirstColumn="0" w:lastRowLastColumn="0"/>
-        </w:trPr>
-        <w:tc>
-          <w:tcPr>
-            <w:cnfStyle w:val="001000000000" w:firstRow="0" w:lastRow="0" w:firstColumn="1" w:lastColumn="0" w:oddVBand="0" w:evenVBand="0" w:oddHBand="0" w:evenHBand="0" w:firstRowFirstColumn="0" w:firstRowLastColumn="0" w:lastRowFirstColumn="0" w:lastRowLastColumn="0"/>
-            <w:tcW w:w="0" w:type="auto"/>
-          </w:tcPr>
-          <w:p>
-            <w:pPr>
-              <w:pStyle w:val="NoSpacing"/>
-              <w:rPr>
-                <w:b w:val="0"/>
-                <w:bCs w:val="0"/>
-              </w:rPr>
-            </w:pPr>
-            <w:r>
-              <w:rPr>
-                <w:b w:val="0"/>
-                <w:bCs w:val="0"/>
-              </w:rPr>
-              <w:t>“filesystem”</w:t>
-            </w:r>
-          </w:p>
-        </w:tc>
-        <w:tc>
-          <w:tcPr>
-            <w:tcW w:w="0" w:type="auto"/>
-          </w:tcPr>
-          <w:p>
-            <w:pPr>
-              <w:pStyle w:val="NoSpacing"/>
-              <w:cnfStyle w:val="000000100000" w:firstRow="0" w:lastRow="0" w:firstColumn="0" w:lastColumn="0" w:oddVBand="0" w:evenVBand="0" w:oddHBand="1" w:evenHBand="0" w:firstRowFirstColumn="0" w:firstRowLastColumn="0" w:lastRowFirstColumn="0" w:lastRowLastColumn="0"/>
-            </w:pPr>
-            <w:r>
-              <w:t>Files on the filesystem</w:t>
-            </w:r>
-          </w:p>
-        </w:tc>
-      </w:tr>
-      <w:tr>
-        <w:tc>
-          <w:tcPr>
-            <w:cnfStyle w:val="001000000000" w:firstRow="0" w:lastRow="0" w:firstColumn="1" w:lastColumn="0" w:oddVBand="0" w:evenVBand="0" w:oddHBand="0" w:evenHBand="0" w:firstRowFirstColumn="0" w:firstRowLastColumn="0" w:lastRowFirstColumn="0" w:lastRowLastColumn="0"/>
-            <w:tcW w:w="0" w:type="auto"/>
-          </w:tcPr>
-          <w:p>
-            <w:pPr>
-              <w:pStyle w:val="NoSpacing"/>
-              <w:rPr>
-                <w:b w:val="0"/>
-                <w:bCs w:val="0"/>
-              </w:rPr>
-            </w:pPr>
-            <w:r>
-              <w:rPr>
-                <w:b w:val="0"/>
-                <w:bCs w:val="0"/>
-              </w:rPr>
-              <w:t>“berkeley_db”</w:t>
-            </w:r>
-          </w:p>
-        </w:tc>
-        <w:tc>
-          <w:tcPr>
-            <w:tcW w:w="0" w:type="auto"/>
-          </w:tcPr>
-          <w:p>
-            <w:pPr>
-              <w:pStyle w:val="NoSpacing"/>
-              <w:cnfStyle w:val="000000000000" w:firstRow="0" w:lastRow="0" w:firstColumn="0" w:lastColumn="0" w:oddVBand="0" w:evenVBand="0" w:oddHBand="0" w:evenHBand="0" w:firstRowFirstColumn="0" w:firstRowLastColumn="0" w:lastRowFirstColumn="0" w:lastRowLastColumn="0"/>
-            </w:pPr>
-            <w:r>
-              <w:t>In Berkeley DB records</w:t>
-            </w:r>
-          </w:p>
-        </w:tc>
-      </w:tr>
-      <w:tr>
-        <w:trPr>
-          <w:cnfStyle w:val="000000100000" w:firstRow="0" w:lastRow="0" w:firstColumn="0" w:lastColumn="0" w:oddVBand="0" w:evenVBand="0" w:oddHBand="1" w:evenHBand="0" w:firstRowFirstColumn="0" w:firstRowLastColumn="0" w:lastRowFirstColumn="0" w:lastRowLastColumn="0"/>
-        </w:trPr>
-        <w:tc>
-          <w:tcPr>
-            <w:cnfStyle w:val="001000000000" w:firstRow="0" w:lastRow="0" w:firstColumn="1" w:lastColumn="0" w:oddVBand="0" w:evenVBand="0" w:oddHBand="0" w:evenHBand="0" w:firstRowFirstColumn="0" w:firstRowLastColumn="0" w:lastRowFirstColumn="0" w:lastRowLastColumn="0"/>
-            <w:tcW w:w="0" w:type="auto"/>
-          </w:tcPr>
-          <w:p>
-            <w:pPr>
-              <w:pStyle w:val="NoSpacing"/>
-              <w:rPr>
-                <w:b w:val="0"/>
-                <w:bCs w:val="0"/>
-              </w:rPr>
-            </w:pPr>
-            <w:r>
-              <w:rPr>
-                <w:b w:val="0"/>
-                <w:bCs w:val="0"/>
-              </w:rPr>
-              <w:t>“internet”</w:t>
-            </w:r>
-          </w:p>
-        </w:tc>
-        <w:tc>
-          <w:tcPr>
-            <w:tcW w:w="0" w:type="auto"/>
-          </w:tcPr>
-          <w:p>
-            <w:pPr>
-              <w:pStyle w:val="NoSpacing"/>
-              <w:cnfStyle w:val="000000100000" w:firstRow="0" w:lastRow="0" w:firstColumn="0" w:lastColumn="0" w:oddVBand="0" w:evenVBand="0" w:oddHBand="1" w:evenHBand="0" w:firstRowFirstColumn="0" w:firstRowLastColumn="0" w:lastRowFirstColumn="0" w:lastRowLastColumn="0"/>
-            </w:pPr>
-            <w:r>
-              <w:t>Streamed Internet data (input only)</w:t>
-            </w:r>
-          </w:p>
-        </w:tc>
-      </w:tr>
-    </w:tbl>
-    <w:p>
-      <w:pPr>
-        <w:pStyle w:val="Normalafterlist"/>
-      </w:pPr>
-      <w:r>
-        <w:t>Each repository type has specific additional parameters. Only data stored on the filesystem is available in the current release. The filesystem data descriptor is specified with:</w:t>
-      </w:r>
-    </w:p>
-    <w:p>
-      <w:pPr>
-        <w:pStyle w:val="code"/>
-      </w:pPr>
-      <w:r>
-        <w:t xml:space="preserve">      "id": </w:t>
+        <w:t xml:space="preserve">The data descriptor determines what type of data is handled by the data descriptor, in what format is that data stored, and in which type of repository is the data found. The </w:t>
       </w:r>
       <w:r>
         <w:rPr>
           <w:i/>
           <w:iCs/>
         </w:rPr>
-        <w:t>descriptor-index</w:t>
-      </w:r>
-      <w:r>
-        <w:t>,</w:t>
-      </w:r>
-    </w:p>
-    <w:p>
-      <w:pPr>
-        <w:pStyle w:val="code"/>
-      </w:pPr>
-      <w:r>
-        <w:t xml:space="preserve">      "type": "</w:t>
+        <w:t>data-type</w:t>
+      </w:r>
+      <w:r>
+        <w:t xml:space="preserve"> </w:t>
+      </w:r>
+      <w:r>
+        <w:t xml:space="preserve">and </w:t>
       </w:r>
       <w:r>
         <w:rPr>
           <w:i/>
           <w:iCs/>
         </w:rPr>
-        <w:t>data-type</w:t>
-      </w:r>
-      <w:r>
-        <w:t>",</w:t>
-      </w:r>
-    </w:p>
-    <w:p>
-      <w:pPr>
-        <w:pStyle w:val="code"/>
-      </w:pPr>
-      <w:r>
-        <w:t xml:space="preserve">      "repository": "filesystem",</w:t>
-      </w:r>
-    </w:p>
-    <w:p>
-      <w:pPr>
-        <w:pStyle w:val="code"/>
-      </w:pPr>
-      <w:r>
-        <w:t xml:space="preserve">      "format": "</w:t>
-      </w:r>
-      <w:r>
-        <w:rPr>
-          <w:i/>
-          <w:iCs/>
-        </w:rPr>
-        <w:t>data-format</w:t>
-      </w:r>
-      <w:r>
-        <w:t>",</w:t>
-      </w:r>
-    </w:p>
-    <w:p>
-      <w:pPr>
-        <w:pStyle w:val="code"/>
-      </w:pPr>
-      <w:r>
-        <w:t xml:space="preserve">      "directory": "</w:t>
-      </w:r>
-      <w:r>
-        <w:rPr>
-          <w:i/>
-          <w:iCs/>
-        </w:rPr>
-        <w:t>directory-location</w:t>
-      </w:r>
-      <w:r>
-        <w:t>",</w:t>
-      </w:r>
-    </w:p>
-    <w:p>
-      <w:pPr>
-        <w:pStyle w:val="code"/>
-      </w:pPr>
-      <w:r>
-        <w:t xml:space="preserve">      "filename": "</w:t>
-      </w:r>
-      <w:r>
-        <w:rPr>
-          <w:i/>
-          <w:iCs/>
-        </w:rPr>
-        <w:t>filename-base</w:t>
-      </w:r>
-      <w:r>
-        <w:t>",</w:t>
-      </w:r>
-    </w:p>
-    <w:p>
-      <w:pPr>
-        <w:pStyle w:val="code"/>
-      </w:pPr>
-      <w:r>
-        <w:t xml:space="preserve">      "ext": "</w:t>
-      </w:r>
-      <w:r>
-        <w:rPr>
-          <w:i/>
-          <w:iCs/>
-        </w:rPr>
-        <w:t>filename-extension</w:t>
-      </w:r>
-      <w:r>
-        <w:t>"</w:t>
-      </w:r>
-    </w:p>
-    <w:p>
-      <w:pPr>
-        <w:pStyle w:val="Normalafterlist"/>
-      </w:pPr>
-      <w:r>
-        <w:t>The file path is “[</w:t>
-      </w:r>
-      <w:r>
-        <w:rPr>
-          <w:i/>
-          <w:iCs/>
-        </w:rPr>
-        <w:t>directory</w:t>
-      </w:r>
-      <w:r>
-        <w:t>/]</w:t>
-      </w:r>
-      <w:r>
-        <w:rPr>
-          <w:i/>
-          <w:iCs/>
-        </w:rPr>
-        <w:t>filename-base</w:t>
-      </w:r>
-      <w:r>
-        <w:t>.</w:t>
-      </w:r>
-      <w:r>
-        <w:rPr>
-          <w:i/>
-          <w:iCs/>
-        </w:rPr>
-        <w:t>filename-extension</w:t>
-      </w:r>
-      <w:r>
-        <w:t xml:space="preserve">". </w:t>
-      </w:r>
-      <w:r>
-        <w:rPr>
-          <w:i/>
-          <w:iCs/>
-        </w:rPr>
-        <w:t>data-type</w:t>
-      </w:r>
-      <w:r>
-        <w:t xml:space="preserve"> and </w:t>
-      </w:r>
-      <w:r>
-        <w:rPr>
-          <w:i/>
-          <w:iCs/>
-        </w:rPr>
         <w:t xml:space="preserve">data-format </w:t>
       </w:r>
       <w:r>
-        <w:t>have the following values. Text data is currently</w:t>
+        <w:t>ha</w:t>
+      </w:r>
+      <w:r>
+        <w:t>ve</w:t>
+      </w:r>
+      <w:r>
+        <w:t xml:space="preserve"> the following values. </w:t>
       </w:r>
     </w:p>
     <w:tbl>
@@ -5070,9 +4923,17 @@
           <w:p>
             <w:pPr>
               <w:cnfStyle w:val="100000000000" w:firstRow="1" w:lastRow="0" w:firstColumn="0" w:lastColumn="0" w:oddVBand="0" w:evenVBand="0" w:oddHBand="0" w:evenHBand="0" w:firstRowFirstColumn="0" w:firstRowLastColumn="0" w:lastRowFirstColumn="0" w:lastRowLastColumn="0"/>
-            </w:pPr>
-            <w:r>
-              <w:t>Data format</w:t>
+              <w:rPr>
+                <w:i/>
+                <w:iCs/>
+              </w:rPr>
+            </w:pPr>
+            <w:r>
+              <w:rPr>
+                <w:i/>
+                <w:iCs/>
+              </w:rPr>
+              <w:t>data-format</w:t>
             </w:r>
           </w:p>
         </w:tc>
@@ -5098,7 +4959,6 @@
                 <w:b w:val="0"/>
                 <w:bCs w:val="0"/>
               </w:rPr>
-              <w:lastRenderedPageBreak/>
               <w:t>Image</w:t>
             </w:r>
           </w:p>
@@ -5309,6 +5169,356 @@
         </w:tc>
       </w:tr>
     </w:tbl>
+    <w:p>
+      <w:pPr>
+        <w:pStyle w:val="Normalafterlist"/>
+      </w:pPr>
+      <w:r>
+        <w:t>Input and output data may be stored in different types of repositories. Not all data types and data formats are supported for any given repository. Repositories to be supported include the following. Only filesystem repositories are supported in the current release.</w:t>
+      </w:r>
+    </w:p>
+    <w:tbl>
+      <w:tblPr>
+        <w:tblStyle w:val="PlainTable1"/>
+        <w:tblW w:w="0" w:type="auto"/>
+        <w:tblLook w:val="04A0" w:firstRow="1" w:lastRow="0" w:firstColumn="1" w:lastColumn="0" w:noHBand="0" w:noVBand="1"/>
+      </w:tblPr>
+      <w:tblGrid>
+        <w:gridCol w:w="1830"/>
+        <w:gridCol w:w="3616"/>
+      </w:tblGrid>
+      <w:tr>
+        <w:trPr>
+          <w:cnfStyle w:val="100000000000" w:firstRow="1" w:lastRow="0" w:firstColumn="0" w:lastColumn="0" w:oddVBand="0" w:evenVBand="0" w:oddHBand="0" w:evenHBand="0" w:firstRowFirstColumn="0" w:firstRowLastColumn="0" w:lastRowFirstColumn="0" w:lastRowLastColumn="0"/>
+        </w:trPr>
+        <w:tc>
+          <w:tcPr>
+            <w:cnfStyle w:val="001000000000" w:firstRow="0" w:lastRow="0" w:firstColumn="1" w:lastColumn="0" w:oddVBand="0" w:evenVBand="0" w:oddHBand="0" w:evenHBand="0" w:firstRowFirstColumn="0" w:firstRowLastColumn="0" w:lastRowFirstColumn="0" w:lastRowLastColumn="0"/>
+            <w:tcW w:w="0" w:type="auto"/>
+          </w:tcPr>
+          <w:p>
+            <w:pPr>
+              <w:pStyle w:val="NoSpacing"/>
+            </w:pPr>
+            <w:r>
+              <w:t>Data repository</w:t>
+            </w:r>
+          </w:p>
+        </w:tc>
+        <w:tc>
+          <w:tcPr>
+            <w:tcW w:w="0" w:type="auto"/>
+          </w:tcPr>
+          <w:p>
+            <w:pPr>
+              <w:pStyle w:val="NoSpacing"/>
+              <w:cnfStyle w:val="100000000000" w:firstRow="1" w:lastRow="0" w:firstColumn="0" w:lastColumn="0" w:oddVBand="0" w:evenVBand="0" w:oddHBand="0" w:evenHBand="0" w:firstRowFirstColumn="0" w:firstRowLastColumn="0" w:lastRowFirstColumn="0" w:lastRowLastColumn="0"/>
+            </w:pPr>
+            <w:r>
+              <w:t>Description</w:t>
+            </w:r>
+          </w:p>
+        </w:tc>
+      </w:tr>
+      <w:tr>
+        <w:trPr>
+          <w:cnfStyle w:val="000000100000" w:firstRow="0" w:lastRow="0" w:firstColumn="0" w:lastColumn="0" w:oddVBand="0" w:evenVBand="0" w:oddHBand="1" w:evenHBand="0" w:firstRowFirstColumn="0" w:firstRowLastColumn="0" w:lastRowFirstColumn="0" w:lastRowLastColumn="0"/>
+        </w:trPr>
+        <w:tc>
+          <w:tcPr>
+            <w:cnfStyle w:val="001000000000" w:firstRow="0" w:lastRow="0" w:firstColumn="1" w:lastColumn="0" w:oddVBand="0" w:evenVBand="0" w:oddHBand="0" w:evenHBand="0" w:firstRowFirstColumn="0" w:firstRowLastColumn="0" w:lastRowFirstColumn="0" w:lastRowLastColumn="0"/>
+            <w:tcW w:w="0" w:type="auto"/>
+          </w:tcPr>
+          <w:p>
+            <w:pPr>
+              <w:pStyle w:val="NoSpacing"/>
+              <w:rPr>
+                <w:b w:val="0"/>
+                <w:bCs w:val="0"/>
+              </w:rPr>
+            </w:pPr>
+            <w:r>
+              <w:rPr>
+                <w:b w:val="0"/>
+                <w:bCs w:val="0"/>
+              </w:rPr>
+              <w:t>“filesystem”</w:t>
+            </w:r>
+          </w:p>
+        </w:tc>
+        <w:tc>
+          <w:tcPr>
+            <w:tcW w:w="0" w:type="auto"/>
+          </w:tcPr>
+          <w:p>
+            <w:pPr>
+              <w:pStyle w:val="NoSpacing"/>
+              <w:cnfStyle w:val="000000100000" w:firstRow="0" w:lastRow="0" w:firstColumn="0" w:lastColumn="0" w:oddVBand="0" w:evenVBand="0" w:oddHBand="1" w:evenHBand="0" w:firstRowFirstColumn="0" w:firstRowLastColumn="0" w:lastRowFirstColumn="0" w:lastRowLastColumn="0"/>
+            </w:pPr>
+            <w:r>
+              <w:t>Files on the filesystem</w:t>
+            </w:r>
+          </w:p>
+        </w:tc>
+      </w:tr>
+      <w:tr>
+        <w:tc>
+          <w:tcPr>
+            <w:cnfStyle w:val="001000000000" w:firstRow="0" w:lastRow="0" w:firstColumn="1" w:lastColumn="0" w:oddVBand="0" w:evenVBand="0" w:oddHBand="0" w:evenHBand="0" w:firstRowFirstColumn="0" w:firstRowLastColumn="0" w:lastRowFirstColumn="0" w:lastRowLastColumn="0"/>
+            <w:tcW w:w="0" w:type="auto"/>
+          </w:tcPr>
+          <w:p>
+            <w:pPr>
+              <w:pStyle w:val="NoSpacing"/>
+              <w:rPr>
+                <w:b w:val="0"/>
+                <w:bCs w:val="0"/>
+              </w:rPr>
+            </w:pPr>
+            <w:r>
+              <w:rPr>
+                <w:b w:val="0"/>
+                <w:bCs w:val="0"/>
+              </w:rPr>
+              <w:t>“berkeley_db”</w:t>
+            </w:r>
+          </w:p>
+        </w:tc>
+        <w:tc>
+          <w:tcPr>
+            <w:tcW w:w="0" w:type="auto"/>
+          </w:tcPr>
+          <w:p>
+            <w:pPr>
+              <w:pStyle w:val="NoSpacing"/>
+              <w:cnfStyle w:val="000000000000" w:firstRow="0" w:lastRow="0" w:firstColumn="0" w:lastColumn="0" w:oddVBand="0" w:evenVBand="0" w:oddHBand="0" w:evenHBand="0" w:firstRowFirstColumn="0" w:firstRowLastColumn="0" w:lastRowFirstColumn="0" w:lastRowLastColumn="0"/>
+            </w:pPr>
+            <w:r>
+              <w:t>In Berkeley DB records</w:t>
+            </w:r>
+          </w:p>
+        </w:tc>
+      </w:tr>
+      <w:tr>
+        <w:trPr>
+          <w:cnfStyle w:val="000000100000" w:firstRow="0" w:lastRow="0" w:firstColumn="0" w:lastColumn="0" w:oddVBand="0" w:evenVBand="0" w:oddHBand="1" w:evenHBand="0" w:firstRowFirstColumn="0" w:firstRowLastColumn="0" w:lastRowFirstColumn="0" w:lastRowLastColumn="0"/>
+        </w:trPr>
+        <w:tc>
+          <w:tcPr>
+            <w:cnfStyle w:val="001000000000" w:firstRow="0" w:lastRow="0" w:firstColumn="1" w:lastColumn="0" w:oddVBand="0" w:evenVBand="0" w:oddHBand="0" w:evenHBand="0" w:firstRowFirstColumn="0" w:firstRowLastColumn="0" w:lastRowFirstColumn="0" w:lastRowLastColumn="0"/>
+            <w:tcW w:w="0" w:type="auto"/>
+          </w:tcPr>
+          <w:p>
+            <w:pPr>
+              <w:pStyle w:val="NoSpacing"/>
+              <w:rPr>
+                <w:b w:val="0"/>
+                <w:bCs w:val="0"/>
+              </w:rPr>
+            </w:pPr>
+            <w:r>
+              <w:rPr>
+                <w:b w:val="0"/>
+                <w:bCs w:val="0"/>
+              </w:rPr>
+              <w:t>“internet”</w:t>
+            </w:r>
+          </w:p>
+        </w:tc>
+        <w:tc>
+          <w:tcPr>
+            <w:tcW w:w="0" w:type="auto"/>
+          </w:tcPr>
+          <w:p>
+            <w:pPr>
+              <w:pStyle w:val="NoSpacing"/>
+              <w:cnfStyle w:val="000000100000" w:firstRow="0" w:lastRow="0" w:firstColumn="0" w:lastColumn="0" w:oddVBand="0" w:evenVBand="0" w:oddHBand="1" w:evenHBand="0" w:firstRowFirstColumn="0" w:firstRowLastColumn="0" w:lastRowFirstColumn="0" w:lastRowLastColumn="0"/>
+            </w:pPr>
+            <w:r>
+              <w:t>Streamed Internet data (input only)</w:t>
+            </w:r>
+          </w:p>
+        </w:tc>
+      </w:tr>
+    </w:tbl>
+    <w:p>
+      <w:pPr>
+        <w:pStyle w:val="Normalafterlist"/>
+      </w:pPr>
+      <w:r>
+        <w:t xml:space="preserve">Each repository type has specific additional parameters. Only data stored on the filesystem is available in the current release. </w:t>
+      </w:r>
+    </w:p>
+    <w:p>
+      <w:pPr>
+        <w:pStyle w:val="Heading2"/>
+      </w:pPr>
+      <w:r>
+        <w:t>Filesystem data repository</w:t>
+      </w:r>
+    </w:p>
+    <w:p>
+      <w:pPr>
+        <w:pStyle w:val="Normalafterlist"/>
+      </w:pPr>
+      <w:r>
+        <w:t>The filesystem data descriptor is specified with:</w:t>
+      </w:r>
+    </w:p>
+    <w:p>
+      <w:pPr>
+        <w:pStyle w:val="code"/>
+      </w:pPr>
+      <w:r>
+        <w:t xml:space="preserve">      "id": </w:t>
+      </w:r>
+      <w:r>
+        <w:rPr>
+          <w:i/>
+          <w:iCs/>
+        </w:rPr>
+        <w:t>descriptor-index</w:t>
+      </w:r>
+      <w:r>
+        <w:t>,</w:t>
+      </w:r>
+    </w:p>
+    <w:p>
+      <w:pPr>
+        <w:pStyle w:val="code"/>
+      </w:pPr>
+      <w:r>
+        <w:t xml:space="preserve">      "type": "</w:t>
+      </w:r>
+      <w:r>
+        <w:rPr>
+          <w:i/>
+          <w:iCs/>
+        </w:rPr>
+        <w:t>data-type</w:t>
+      </w:r>
+      <w:r>
+        <w:t>",</w:t>
+      </w:r>
+    </w:p>
+    <w:p>
+      <w:pPr>
+        <w:pStyle w:val="code"/>
+      </w:pPr>
+      <w:r>
+        <w:t xml:space="preserve">      "format": "</w:t>
+      </w:r>
+      <w:r>
+        <w:rPr>
+          <w:i/>
+          <w:iCs/>
+        </w:rPr>
+        <w:t>data-format</w:t>
+      </w:r>
+      <w:r>
+        <w:t>",</w:t>
+      </w:r>
+    </w:p>
+    <w:p>
+      <w:pPr>
+        <w:pStyle w:val="code"/>
+      </w:pPr>
+      <w:r>
+        <w:t xml:space="preserve">      "repository": "filesystem",</w:t>
+      </w:r>
+    </w:p>
+    <w:p>
+      <w:pPr>
+        <w:pStyle w:val="code"/>
+      </w:pPr>
+      <w:r>
+        <w:t xml:space="preserve">      "directory": "</w:t>
+      </w:r>
+      <w:r>
+        <w:rPr>
+          <w:i/>
+          <w:iCs/>
+        </w:rPr>
+        <w:t>directory-location</w:t>
+      </w:r>
+      <w:r>
+        <w:t>",</w:t>
+      </w:r>
+    </w:p>
+    <w:p>
+      <w:pPr>
+        <w:pStyle w:val="code"/>
+      </w:pPr>
+      <w:r>
+        <w:t xml:space="preserve">      "filename": "</w:t>
+      </w:r>
+      <w:r>
+        <w:rPr>
+          <w:i/>
+          <w:iCs/>
+        </w:rPr>
+        <w:t>filename-base</w:t>
+      </w:r>
+      <w:r>
+        <w:t>",</w:t>
+      </w:r>
+    </w:p>
+    <w:p>
+      <w:pPr>
+        <w:pStyle w:val="code"/>
+      </w:pPr>
+      <w:r>
+        <w:t xml:space="preserve">      "ext": "</w:t>
+      </w:r>
+      <w:r>
+        <w:rPr>
+          <w:i/>
+          <w:iCs/>
+        </w:rPr>
+        <w:t>filename-extension</w:t>
+      </w:r>
+      <w:r>
+        <w:t>"</w:t>
+      </w:r>
+    </w:p>
+    <w:p>
+      <w:pPr>
+        <w:pStyle w:val="Normalafterlist"/>
+      </w:pPr>
+      <w:r>
+        <w:t>The filesystem data repository supports all data types and data formats listed above. The file path read from or written to is “[</w:t>
+      </w:r>
+      <w:r>
+        <w:rPr>
+          <w:i/>
+          <w:iCs/>
+        </w:rPr>
+        <w:t>directory</w:t>
+      </w:r>
+      <w:r>
+        <w:t>/]</w:t>
+      </w:r>
+      <w:r>
+        <w:rPr>
+          <w:i/>
+          <w:iCs/>
+        </w:rPr>
+        <w:t>filename-base</w:t>
+      </w:r>
+      <w:r>
+        <w:t>.</w:t>
+      </w:r>
+      <w:r>
+        <w:rPr>
+          <w:i/>
+          <w:iCs/>
+        </w:rPr>
+        <w:t>filename-extension</w:t>
+      </w:r>
+      <w:r>
+        <w:t>". The extension may default to specific values for certain operations, such as that the default extension for image JPEG data is “jpg”.</w:t>
+      </w:r>
+    </w:p>
     <w:p>
       <w:pPr>
         <w:pStyle w:val="Heading2"/>
@@ -5448,6 +5658,7 @@
           <w:b/>
           <w:bCs/>
         </w:rPr>
+        <w:lastRenderedPageBreak/>
         <w:tab/>
         <w:t xml:space="preserve">        “username”: “</w:t>
       </w:r>
@@ -6082,7 +6293,6 @@
         </w:rPr>
       </w:pPr>
       <w:r>
-        <w:lastRenderedPageBreak/>
         <w:tab/>
         <w:t xml:space="preserve">    </w:t>
       </w:r>
@@ -6895,7 +7105,6 @@
           <w:sz w:val="16"/>
           <w:szCs w:val="16"/>
         </w:rPr>
-        <w:lastRenderedPageBreak/>
         <w:tab/>
         <w:t xml:space="preserve">    }</w:t>
       </w:r>
@@ -7226,6 +7435,7 @@
               <w:pStyle w:val="code"/>
             </w:pPr>
             <w:r>
+              <w:lastRenderedPageBreak/>
               <w:t xml:space="preserve">      "type": "image",</w:t>
             </w:r>
           </w:p>
@@ -7292,7 +7502,12 @@
           </w:tcPr>
           <w:p>
             <w:r>
-              <w:t>The output data for the operator is a CV_32S binary image file named “square45-90_sobel_gray.bin” in the current directory. The Sobel operator defines that the image is CV_32S.</w:t>
+              <w:lastRenderedPageBreak/>
+              <w:t>The output data for the operator is a CV_32S binary image file named “square45-</w:t>
+            </w:r>
+            <w:r>
+              <w:lastRenderedPageBreak/>
+              <w:t>90_sobel_gray.bin” in the current directory. The Sobel operator defines that the image is CV_32S.</w:t>
             </w:r>
           </w:p>
         </w:tc>
@@ -7307,6 +7522,7 @@
               <w:pStyle w:val="code"/>
             </w:pPr>
             <w:r>
+              <w:lastRenderedPageBreak/>
               <w:t xml:space="preserve">  "parameters": {</w:t>
             </w:r>
           </w:p>
@@ -7963,7 +8179,6 @@
           <w:sz w:val="16"/>
           <w:szCs w:val="16"/>
         </w:rPr>
-        <w:lastRenderedPageBreak/>
         <w:tab/>
         <w:t xml:space="preserve">    "lower_out": "0",</w:t>
       </w:r>
@@ -8238,6 +8453,7 @@
               <w:pStyle w:val="code"/>
             </w:pPr>
             <w:r>
+              <w:lastRenderedPageBreak/>
               <w:t xml:space="preserve">  "output-data": [</w:t>
             </w:r>
           </w:p>
@@ -9171,7 +9387,6 @@
         <w:pStyle w:val="Heading2"/>
       </w:pPr>
       <w:r>
-        <w:lastRenderedPageBreak/>
         <w:t>filter-edge-kirsch Operator</w:t>
       </w:r>
     </w:p>
@@ -9574,6 +9789,7 @@
           </w:tcPr>
           <w:p>
             <w:r>
+              <w:lastRenderedPageBreak/>
               <w:t>Descriptor type</w:t>
             </w:r>
           </w:p>
@@ -10381,7 +10597,6 @@
           </w:tcPr>
           <w:p>
             <w:r>
-              <w:lastRenderedPageBreak/>
               <w:t>Descriptor type</w:t>
             </w:r>
           </w:p>
@@ -10909,6 +11124,7 @@
                 <w:b w:val="0"/>
                 <w:bCs w:val="0"/>
               </w:rPr>
+              <w:lastRenderedPageBreak/>
               <w:t>depth</w:t>
             </w:r>
           </w:p>
@@ -11678,7 +11894,6 @@
                 <w:b w:val="0"/>
                 <w:bCs w:val="0"/>
               </w:rPr>
-              <w:lastRenderedPageBreak/>
               <w:t>components</w:t>
             </w:r>
           </w:p>
@@ -11997,6 +12212,7 @@
           </w:tcPr>
           <w:p>
             <w:r>
+              <w:lastRenderedPageBreak/>
               <w:t>Descriptor type</w:t>
             </w:r>
           </w:p>
@@ -12678,7 +12894,6 @@
           </w:tcPr>
           <w:p>
             <w:r>
-              <w:lastRenderedPageBreak/>
               <w:t>Descriptor type</w:t>
             </w:r>
           </w:p>
@@ -13198,6 +13413,7 @@
                 <w:b w:val="0"/>
                 <w:bCs w:val="0"/>
               </w:rPr>
+              <w:lastRenderedPageBreak/>
               <w:t>cols</w:t>
             </w:r>
           </w:p>
@@ -13903,7 +14119,6 @@
         <w:pStyle w:val="Normalafterlist"/>
       </w:pPr>
       <w:r>
-        <w:lastRenderedPageBreak/>
         <w:t>The parameter to the create Hough accumulator operator is:</w:t>
       </w:r>
     </w:p>
@@ -14463,6 +14678,7 @@
                 <w:b w:val="0"/>
                 <w:bCs w:val="0"/>
               </w:rPr>
+              <w:lastRenderedPageBreak/>
               <w:t>max_count</w:t>
             </w:r>
           </w:p>
@@ -15006,7 +15222,7 @@
                 <w:b w:val="0"/>
                 <w:bCs w:val="0"/>
               </w:rPr>
-              <w:t>rho</w:t>
+              <w:t>rho_index</w:t>
             </w:r>
           </w:p>
         </w:tc>
@@ -15020,7 +15236,7 @@
               <w:cnfStyle w:val="000000000000" w:firstRow="0" w:lastRow="0" w:firstColumn="0" w:lastColumn="0" w:oddVBand="0" w:evenVBand="0" w:oddHBand="0" w:evenHBand="0" w:firstRowFirstColumn="0" w:firstRowLastColumn="0" w:lastRowFirstColumn="0" w:lastRowLastColumn="0"/>
             </w:pPr>
             <w:r>
-              <w:t>Polar line rho</w:t>
+              <w:t>Polar line rho index</w:t>
             </w:r>
           </w:p>
         </w:tc>
@@ -15047,8 +15263,7 @@
                 <w:b w:val="0"/>
                 <w:bCs w:val="0"/>
               </w:rPr>
-              <w:lastRenderedPageBreak/>
-              <w:t>theta</w:t>
+              <w:t>theta_index</w:t>
             </w:r>
           </w:p>
         </w:tc>
@@ -15585,6 +15800,7 @@
                 <w:b w:val="0"/>
                 <w:bCs w:val="0"/>
               </w:rPr>
+              <w:lastRenderedPageBreak/>
               <w:t>end-col</w:t>
             </w:r>
           </w:p>
@@ -16166,7 +16382,6 @@
           </w:tcPr>
           <w:p>
             <w:r>
-              <w:lastRenderedPageBreak/>
               <w:t>Input Image</w:t>
             </w:r>
           </w:p>
@@ -16640,6 +16855,7 @@
                 <w:b w:val="0"/>
                 <w:bCs w:val="0"/>
               </w:rPr>
+              <w:lastRenderedPageBreak/>
               <w:t>omitted</w:t>
             </w:r>
           </w:p>
@@ -17197,7 +17413,6 @@
         </w:rPr>
       </w:pPr>
       <w:r>
-        <w:lastRenderedPageBreak/>
         <w:t xml:space="preserve">      lower_out + (input value - </w:t>
       </w:r>
       <w:r>
@@ -17665,6 +17880,7 @@
                 <w:b w:val="0"/>
                 <w:bCs w:val="0"/>
               </w:rPr>
+              <w:lastRenderedPageBreak/>
               <w:t>upper_out</w:t>
             </w:r>
           </w:p>
@@ -18064,7 +18280,7 @@
       <w:rPr>
         <w:noProof/>
       </w:rPr>
-      <w:t>7/19/2022 7:36 AM</w:t>
+      <w:t>7/19/2022 1:36 PM</w:t>
     </w:r>
     <w:r>
       <w:fldChar w:fldCharType="end"/>
@@ -18135,7 +18351,7 @@
           <w:rPr>
             <w:noProof/>
           </w:rPr>
-          <w:t>7/19/2022 7:36 AM</w:t>
+          <w:t>7/19/2022 1:36 PM</w:t>
         </w:r>
         <w:r>
           <w:fldChar w:fldCharType="end"/>

</xml_diff>

<commit_message>
refactored image_header no longer to be pointer, used wb_utils::read_<type>... in image_header, histogram
</commit_message>
<xml_diff>
--- a/doc/cv-workbench.docx
+++ b/doc/cv-workbench.docx
@@ -8682,9 +8682,9 @@
       </w:tblPr>
       <w:tblGrid>
         <w:gridCol w:w="1219"/>
-        <w:gridCol w:w="1439"/>
+        <w:gridCol w:w="1036"/>
         <w:gridCol w:w="1109"/>
-        <w:gridCol w:w="5583"/>
+        <w:gridCol w:w="5986"/>
       </w:tblGrid>
       <w:tr>
         <w:trPr>
@@ -9121,7 +9121,7 @@
               <w:cnfStyle w:val="000000000000" w:firstRow="0" w:lastRow="0" w:firstColumn="0" w:lastColumn="0" w:oddVBand="0" w:evenVBand="0" w:oddHBand="0" w:evenHBand="0" w:firstRowFirstColumn="0" w:firstRowLastColumn="0" w:lastRowFirstColumn="0" w:lastRowLastColumn="0"/>
             </w:pPr>
             <w:r>
-              <w:t>Accumulator</w:t>
+              <w:t>Image</w:t>
             </w:r>
           </w:p>
         </w:tc>
@@ -13885,12 +13885,12 @@
         <w:pStyle w:val="Heading2"/>
       </w:pPr>
       <w:r>
-        <w:t>hough-accumulator-create Operator</w:t>
-      </w:r>
-    </w:p>
-    <w:p>
-      <w:r>
-        <w:t xml:space="preserve">The create Hough accumulator operator creates a Hough accumulator and stores it in binary or text format as described in section </w:t>
+        <w:t>hough-image-create Operator</w:t>
+      </w:r>
+    </w:p>
+    <w:p>
+      <w:r>
+        <w:t xml:space="preserve">The create image Hough operator creates a Hough accumulator from an image and stores it in binary or text format as described in section </w:t>
       </w:r>
       <w:r>
         <w:fldChar w:fldCharType="begin"/>
@@ -14158,7 +14158,7 @@
         <w:pStyle w:val="Normalafterlist"/>
       </w:pPr>
       <w:r>
-        <w:t>The parameters to the create Hough accumulator operator is:</w:t>
+        <w:t>The parameters to the create image Hough operator is:</w:t>
       </w:r>
     </w:p>
     <w:tbl>

</xml_diff>

<commit_message>
refactoring of histogram, hough; implemented read/write of both; fixed error.add() calls
</commit_message>
<xml_diff>
--- a/doc/cv-workbench.docx
+++ b/doc/cv-workbench.docx
@@ -1921,7 +1921,7 @@
     </w:p>
     <w:p>
       <w:r>
-        <w:t>Histograms count the number of different values for any data type containing a range of values, such as images. The stored histogram data bins correspond to a values ranging from a lower to an upper pixel value. The number of histogram bins, the lower value, and the upper value determine into which bin a value is counted. Values below the lower value are counted in the first bin, and values above the upper value are counted in the last bin. The bin corresponding to a value is given by this:</w:t>
+        <w:t>Histograms count the number of different values for any data type containing a range of values, such as images or Hough accumulators. The stored histogram data bins correspond to a values ranging from a lower to an upper pixel value. The number of histogram bins, the lower value, and the upper value determine into which bin a value is counted. Values below the lower value are counted in the first bin, and values above the upper value are counted in the last bin. The bin corresponding to a value is given by this:</w:t>
       </w:r>
     </w:p>
     <w:p>
@@ -1990,7 +1990,7 @@
     </w:p>
     <w:p>
       <w:r>
-        <w:t>Binary histogram files contain the statistics for the value distribution, such as the minimum, maximum, and total counts for all bins, and the histogram bin counts. The binary histogram data files are defined by the workbench, and have the following format:</w:t>
+        <w:t>Binary histogram files contain the statistics for a value distribution such as an image or Hough accumulator, such as the minimum, maximum, and total counts for all bins, and the histogram bin counts. The binary histogram data files are defined by the workbench, and have the following format:</w:t>
       </w:r>
     </w:p>
     <w:tbl>
@@ -2141,7 +2141,7 @@
               <w:cnfStyle w:val="000000000000" w:firstRow="0" w:lastRow="0" w:firstColumn="0" w:lastColumn="0" w:oddVBand="0" w:evenVBand="0" w:oddHBand="0" w:evenHBand="0" w:firstRowFirstColumn="0" w:firstRowLastColumn="0" w:lastRowFirstColumn="0" w:lastRowLastColumn="0"/>
             </w:pPr>
             <w:r>
-              <w:t>32-bit integer</w:t>
+              <w:t>32-bit float</w:t>
             </w:r>
           </w:p>
         </w:tc>
@@ -2196,6 +2196,58 @@
               <w:cnfStyle w:val="000000100000" w:firstRow="0" w:lastRow="0" w:firstColumn="0" w:lastColumn="0" w:oddVBand="0" w:evenVBand="0" w:oddHBand="1" w:evenHBand="0" w:firstRowFirstColumn="0" w:firstRowLastColumn="0" w:lastRowFirstColumn="0" w:lastRowLastColumn="0"/>
             </w:pPr>
             <w:r>
+              <w:t>32-bit float</w:t>
+            </w:r>
+          </w:p>
+        </w:tc>
+        <w:tc>
+          <w:tcPr>
+            <w:tcW w:w="0" w:type="auto"/>
+          </w:tcPr>
+          <w:p>
+            <w:pPr>
+              <w:pStyle w:val="NoSpacing"/>
+              <w:cnfStyle w:val="000000100000" w:firstRow="0" w:lastRow="0" w:firstColumn="0" w:lastColumn="0" w:oddVBand="0" w:evenVBand="0" w:oddHBand="1" w:evenHBand="0" w:firstRowFirstColumn="0" w:firstRowLastColumn="0" w:lastRowFirstColumn="0" w:lastRowLastColumn="0"/>
+            </w:pPr>
+            <w:r>
+              <w:t>The upper pixel value accumulated in the last histogram bin</w:t>
+            </w:r>
+          </w:p>
+        </w:tc>
+      </w:tr>
+      <w:tr>
+        <w:tc>
+          <w:tcPr>
+            <w:cnfStyle w:val="001000000000" w:firstRow="0" w:lastRow="0" w:firstColumn="1" w:lastColumn="0" w:oddVBand="0" w:evenVBand="0" w:oddHBand="0" w:evenHBand="0" w:firstRowFirstColumn="0" w:firstRowLastColumn="0" w:lastRowFirstColumn="0" w:lastRowLastColumn="0"/>
+            <w:tcW w:w="0" w:type="auto"/>
+          </w:tcPr>
+          <w:p>
+            <w:pPr>
+              <w:pStyle w:val="NoSpacing"/>
+              <w:rPr>
+                <w:b w:val="0"/>
+                <w:bCs w:val="0"/>
+              </w:rPr>
+            </w:pPr>
+            <w:r>
+              <w:rPr>
+                <w:b w:val="0"/>
+                <w:bCs w:val="0"/>
+              </w:rPr>
+              <w:t>total_count</w:t>
+            </w:r>
+          </w:p>
+        </w:tc>
+        <w:tc>
+          <w:tcPr>
+            <w:tcW w:w="0" w:type="auto"/>
+          </w:tcPr>
+          <w:p>
+            <w:pPr>
+              <w:pStyle w:val="NoSpacing"/>
+              <w:cnfStyle w:val="000000000000" w:firstRow="0" w:lastRow="0" w:firstColumn="0" w:lastColumn="0" w:oddVBand="0" w:evenVBand="0" w:oddHBand="0" w:evenHBand="0" w:firstRowFirstColumn="0" w:firstRowLastColumn="0" w:lastRowFirstColumn="0" w:lastRowLastColumn="0"/>
+            </w:pPr>
+            <w:r>
               <w:t>32-bit integer</w:t>
             </w:r>
           </w:p>
@@ -2207,62 +2259,10 @@
           <w:p>
             <w:pPr>
               <w:pStyle w:val="NoSpacing"/>
-              <w:cnfStyle w:val="000000100000" w:firstRow="0" w:lastRow="0" w:firstColumn="0" w:lastColumn="0" w:oddVBand="0" w:evenVBand="0" w:oddHBand="1" w:evenHBand="0" w:firstRowFirstColumn="0" w:firstRowLastColumn="0" w:lastRowFirstColumn="0" w:lastRowLastColumn="0"/>
-            </w:pPr>
-            <w:r>
-              <w:t>The upper pixel value accumulated in the last histogram bin</w:t>
-            </w:r>
-          </w:p>
-        </w:tc>
-      </w:tr>
-      <w:tr>
-        <w:tc>
-          <w:tcPr>
-            <w:cnfStyle w:val="001000000000" w:firstRow="0" w:lastRow="0" w:firstColumn="1" w:lastColumn="0" w:oddVBand="0" w:evenVBand="0" w:oddHBand="0" w:evenHBand="0" w:firstRowFirstColumn="0" w:firstRowLastColumn="0" w:lastRowFirstColumn="0" w:lastRowLastColumn="0"/>
-            <w:tcW w:w="0" w:type="auto"/>
-          </w:tcPr>
-          <w:p>
-            <w:pPr>
-              <w:pStyle w:val="NoSpacing"/>
-              <w:rPr>
-                <w:b w:val="0"/>
-                <w:bCs w:val="0"/>
-              </w:rPr>
-            </w:pPr>
-            <w:r>
-              <w:rPr>
-                <w:b w:val="0"/>
-                <w:bCs w:val="0"/>
-              </w:rPr>
-              <w:t>min_value</w:t>
-            </w:r>
-          </w:p>
-        </w:tc>
-        <w:tc>
-          <w:tcPr>
-            <w:tcW w:w="0" w:type="auto"/>
-          </w:tcPr>
-          <w:p>
-            <w:pPr>
-              <w:pStyle w:val="NoSpacing"/>
               <w:cnfStyle w:val="000000000000" w:firstRow="0" w:lastRow="0" w:firstColumn="0" w:lastColumn="0" w:oddVBand="0" w:evenVBand="0" w:oddHBand="0" w:evenHBand="0" w:firstRowFirstColumn="0" w:firstRowLastColumn="0" w:lastRowFirstColumn="0" w:lastRowLastColumn="0"/>
             </w:pPr>
             <w:r>
-              <w:t>32-bit integer</w:t>
-            </w:r>
-          </w:p>
-        </w:tc>
-        <w:tc>
-          <w:tcPr>
-            <w:tcW w:w="0" w:type="auto"/>
-          </w:tcPr>
-          <w:p>
-            <w:pPr>
-              <w:pStyle w:val="NoSpacing"/>
-              <w:cnfStyle w:val="000000000000" w:firstRow="0" w:lastRow="0" w:firstColumn="0" w:lastColumn="0" w:oddVBand="0" w:evenVBand="0" w:oddHBand="0" w:evenHBand="0" w:firstRowFirstColumn="0" w:firstRowLastColumn="0" w:lastRowFirstColumn="0" w:lastRowLastColumn="0"/>
-            </w:pPr>
-            <w:r>
-              <w:t xml:space="preserve">The overall minimum image pixel value </w:t>
+              <w:t>The total counts for all the bins</w:t>
             </w:r>
           </w:p>
         </w:tc>
@@ -2289,7 +2289,7 @@
                 <w:b w:val="0"/>
                 <w:bCs w:val="0"/>
               </w:rPr>
-              <w:t>max_value</w:t>
+              <w:t>min_count</w:t>
             </w:r>
           </w:p>
         </w:tc>
@@ -2317,31 +2317,31 @@
               <w:cnfStyle w:val="000000100000" w:firstRow="0" w:lastRow="0" w:firstColumn="0" w:lastColumn="0" w:oddVBand="0" w:evenVBand="0" w:oddHBand="1" w:evenHBand="0" w:firstRowFirstColumn="0" w:firstRowLastColumn="0" w:lastRowFirstColumn="0" w:lastRowLastColumn="0"/>
             </w:pPr>
             <w:r>
-              <w:t xml:space="preserve">The overall maximum image pixel value </w:t>
-            </w:r>
-          </w:p>
-        </w:tc>
-      </w:tr>
-      <w:tr>
-        <w:tc>
-          <w:tcPr>
-            <w:cnfStyle w:val="001000000000" w:firstRow="0" w:lastRow="0" w:firstColumn="1" w:lastColumn="0" w:oddVBand="0" w:evenVBand="0" w:oddHBand="0" w:evenHBand="0" w:firstRowFirstColumn="0" w:firstRowLastColumn="0" w:lastRowFirstColumn="0" w:lastRowLastColumn="0"/>
-            <w:tcW w:w="0" w:type="auto"/>
-          </w:tcPr>
-          <w:p>
-            <w:pPr>
-              <w:pStyle w:val="NoSpacing"/>
-              <w:rPr>
-                <w:b w:val="0"/>
-                <w:bCs w:val="0"/>
-              </w:rPr>
-            </w:pPr>
-            <w:r>
-              <w:rPr>
-                <w:b w:val="0"/>
-                <w:bCs w:val="0"/>
-              </w:rPr>
-              <w:t>min_count</w:t>
+              <w:t>The lowest count for any bin</w:t>
+            </w:r>
+          </w:p>
+        </w:tc>
+      </w:tr>
+      <w:tr>
+        <w:tc>
+          <w:tcPr>
+            <w:cnfStyle w:val="001000000000" w:firstRow="0" w:lastRow="0" w:firstColumn="1" w:lastColumn="0" w:oddVBand="0" w:evenVBand="0" w:oddHBand="0" w:evenHBand="0" w:firstRowFirstColumn="0" w:firstRowLastColumn="0" w:lastRowFirstColumn="0" w:lastRowLastColumn="0"/>
+            <w:tcW w:w="0" w:type="auto"/>
+          </w:tcPr>
+          <w:p>
+            <w:pPr>
+              <w:pStyle w:val="NoSpacing"/>
+              <w:rPr>
+                <w:b w:val="0"/>
+                <w:bCs w:val="0"/>
+              </w:rPr>
+            </w:pPr>
+            <w:r>
+              <w:rPr>
+                <w:b w:val="0"/>
+                <w:bCs w:val="0"/>
+              </w:rPr>
+              <w:t>max_count</w:t>
             </w:r>
           </w:p>
         </w:tc>
@@ -2369,7 +2369,7 @@
               <w:cnfStyle w:val="000000000000" w:firstRow="0" w:lastRow="0" w:firstColumn="0" w:lastColumn="0" w:oddVBand="0" w:evenVBand="0" w:oddHBand="0" w:evenHBand="0" w:firstRowFirstColumn="0" w:firstRowLastColumn="0" w:lastRowFirstColumn="0" w:lastRowLastColumn="0"/>
             </w:pPr>
             <w:r>
-              <w:t>The lowest count for any bin</w:t>
+              <w:t>The largest count for any bin</w:t>
             </w:r>
           </w:p>
         </w:tc>
@@ -2396,7 +2396,7 @@
                 <w:b w:val="0"/>
                 <w:bCs w:val="0"/>
               </w:rPr>
-              <w:t>max_count</w:t>
+              <w:t>mean</w:t>
             </w:r>
           </w:p>
         </w:tc>
@@ -2410,7 +2410,7 @@
               <w:cnfStyle w:val="000000100000" w:firstRow="0" w:lastRow="0" w:firstColumn="0" w:lastColumn="0" w:oddVBand="0" w:evenVBand="0" w:oddHBand="1" w:evenHBand="0" w:firstRowFirstColumn="0" w:firstRowLastColumn="0" w:lastRowFirstColumn="0" w:lastRowLastColumn="0"/>
             </w:pPr>
             <w:r>
-              <w:t>32-bit integer</w:t>
+              <w:t>32-bit float</w:t>
             </w:r>
           </w:p>
         </w:tc>
@@ -2424,31 +2424,31 @@
               <w:cnfStyle w:val="000000100000" w:firstRow="0" w:lastRow="0" w:firstColumn="0" w:lastColumn="0" w:oddVBand="0" w:evenVBand="0" w:oddHBand="1" w:evenHBand="0" w:firstRowFirstColumn="0" w:firstRowLastColumn="0" w:lastRowFirstColumn="0" w:lastRowLastColumn="0"/>
             </w:pPr>
             <w:r>
-              <w:t>The largest count for any bin</w:t>
-            </w:r>
-          </w:p>
-        </w:tc>
-      </w:tr>
-      <w:tr>
-        <w:tc>
-          <w:tcPr>
-            <w:cnfStyle w:val="001000000000" w:firstRow="0" w:lastRow="0" w:firstColumn="1" w:lastColumn="0" w:oddVBand="0" w:evenVBand="0" w:oddHBand="0" w:evenHBand="0" w:firstRowFirstColumn="0" w:firstRowLastColumn="0" w:lastRowFirstColumn="0" w:lastRowLastColumn="0"/>
-            <w:tcW w:w="0" w:type="auto"/>
-          </w:tcPr>
-          <w:p>
-            <w:pPr>
-              <w:pStyle w:val="NoSpacing"/>
-              <w:rPr>
-                <w:b w:val="0"/>
-                <w:bCs w:val="0"/>
-              </w:rPr>
-            </w:pPr>
-            <w:r>
-              <w:rPr>
-                <w:b w:val="0"/>
-                <w:bCs w:val="0"/>
-              </w:rPr>
-              <w:t>total_count</w:t>
+              <w:t xml:space="preserve">The image pixel value mean </w:t>
+            </w:r>
+          </w:p>
+        </w:tc>
+      </w:tr>
+      <w:tr>
+        <w:tc>
+          <w:tcPr>
+            <w:cnfStyle w:val="001000000000" w:firstRow="0" w:lastRow="0" w:firstColumn="1" w:lastColumn="0" w:oddVBand="0" w:evenVBand="0" w:oddHBand="0" w:evenHBand="0" w:firstRowFirstColumn="0" w:firstRowLastColumn="0" w:lastRowFirstColumn="0" w:lastRowLastColumn="0"/>
+            <w:tcW w:w="0" w:type="auto"/>
+          </w:tcPr>
+          <w:p>
+            <w:pPr>
+              <w:pStyle w:val="NoSpacing"/>
+              <w:rPr>
+                <w:b w:val="0"/>
+                <w:bCs w:val="0"/>
+              </w:rPr>
+            </w:pPr>
+            <w:r>
+              <w:rPr>
+                <w:b w:val="0"/>
+                <w:bCs w:val="0"/>
+              </w:rPr>
+              <w:t>variance</w:t>
             </w:r>
           </w:p>
         </w:tc>
@@ -2462,7 +2462,7 @@
               <w:cnfStyle w:val="000000000000" w:firstRow="0" w:lastRow="0" w:firstColumn="0" w:lastColumn="0" w:oddVBand="0" w:evenVBand="0" w:oddHBand="0" w:evenHBand="0" w:firstRowFirstColumn="0" w:firstRowLastColumn="0" w:lastRowFirstColumn="0" w:lastRowLastColumn="0"/>
             </w:pPr>
             <w:r>
-              <w:t>32-bit integer</w:t>
+              <w:t>32-bit float</w:t>
             </w:r>
           </w:p>
         </w:tc>
@@ -2476,7 +2476,13 @@
               <w:cnfStyle w:val="000000000000" w:firstRow="0" w:lastRow="0" w:firstColumn="0" w:lastColumn="0" w:oddVBand="0" w:evenVBand="0" w:oddHBand="0" w:evenHBand="0" w:firstRowFirstColumn="0" w:firstRowLastColumn="0" w:lastRowFirstColumn="0" w:lastRowLastColumn="0"/>
             </w:pPr>
             <w:r>
-              <w:t>The total counts for all the bins</w:t>
+              <w:t xml:space="preserve">The image pixel value </w:t>
+            </w:r>
+            <w:r>
+              <w:t>variance</w:t>
+            </w:r>
+            <w:r>
+              <w:t xml:space="preserve"> </w:t>
             </w:r>
           </w:p>
         </w:tc>
@@ -2504,7 +2510,7 @@
                 <w:b w:val="0"/>
                 <w:bCs w:val="0"/>
               </w:rPr>
-              <w:t>mean</w:t>
+              <w:t>sample variance</w:t>
             </w:r>
           </w:p>
         </w:tc>
@@ -2532,31 +2538,38 @@
               <w:cnfStyle w:val="000000100000" w:firstRow="0" w:lastRow="0" w:firstColumn="0" w:lastColumn="0" w:oddVBand="0" w:evenVBand="0" w:oddHBand="1" w:evenHBand="0" w:firstRowFirstColumn="0" w:firstRowLastColumn="0" w:lastRowFirstColumn="0" w:lastRowLastColumn="0"/>
             </w:pPr>
             <w:r>
-              <w:t xml:space="preserve">The image pixel value mean </w:t>
-            </w:r>
-          </w:p>
-        </w:tc>
-      </w:tr>
-      <w:tr>
-        <w:tc>
-          <w:tcPr>
-            <w:cnfStyle w:val="001000000000" w:firstRow="0" w:lastRow="0" w:firstColumn="1" w:lastColumn="0" w:oddVBand="0" w:evenVBand="0" w:oddHBand="0" w:evenHBand="0" w:firstRowFirstColumn="0" w:firstRowLastColumn="0" w:lastRowFirstColumn="0" w:lastRowLastColumn="0"/>
-            <w:tcW w:w="0" w:type="auto"/>
-          </w:tcPr>
-          <w:p>
-            <w:pPr>
-              <w:pStyle w:val="NoSpacing"/>
-              <w:rPr>
-                <w:b w:val="0"/>
-                <w:bCs w:val="0"/>
-              </w:rPr>
-            </w:pPr>
-            <w:r>
-              <w:rPr>
-                <w:b w:val="0"/>
-                <w:bCs w:val="0"/>
-              </w:rPr>
-              <w:t>variance</w:t>
+              <w:t xml:space="preserve">The image pixel value </w:t>
+            </w:r>
+            <w:r>
+              <w:t>sample variance</w:t>
+            </w:r>
+            <w:r>
+              <w:t xml:space="preserve"> </w:t>
+            </w:r>
+          </w:p>
+        </w:tc>
+      </w:tr>
+      <w:bookmarkEnd w:id="0"/>
+      <w:tr>
+        <w:tc>
+          <w:tcPr>
+            <w:cnfStyle w:val="001000000000" w:firstRow="0" w:lastRow="0" w:firstColumn="1" w:lastColumn="0" w:oddVBand="0" w:evenVBand="0" w:oddHBand="0" w:evenHBand="0" w:firstRowFirstColumn="0" w:firstRowLastColumn="0" w:lastRowFirstColumn="0" w:lastRowLastColumn="0"/>
+            <w:tcW w:w="0" w:type="auto"/>
+          </w:tcPr>
+          <w:p>
+            <w:pPr>
+              <w:pStyle w:val="NoSpacing"/>
+              <w:rPr>
+                <w:b w:val="0"/>
+                <w:bCs w:val="0"/>
+              </w:rPr>
+            </w:pPr>
+            <w:r>
+              <w:rPr>
+                <w:b w:val="0"/>
+                <w:bCs w:val="0"/>
+              </w:rPr>
+              <w:t>standard deviation</w:t>
             </w:r>
           </w:p>
         </w:tc>
@@ -2584,7 +2597,7 @@
               <w:cnfStyle w:val="000000000000" w:firstRow="0" w:lastRow="0" w:firstColumn="0" w:lastColumn="0" w:oddVBand="0" w:evenVBand="0" w:oddHBand="0" w:evenHBand="0" w:firstRowFirstColumn="0" w:firstRowLastColumn="0" w:lastRowFirstColumn="0" w:lastRowLastColumn="0"/>
             </w:pPr>
             <w:r>
-              <w:t xml:space="preserve">The image pixel value variance </w:t>
+              <w:t xml:space="preserve">The image pixel value standard deviation </w:t>
             </w:r>
           </w:p>
         </w:tc>
@@ -2611,7 +2624,7 @@
                 <w:b w:val="0"/>
                 <w:bCs w:val="0"/>
               </w:rPr>
-              <w:t>sample variance</w:t>
+              <w:t>min_value</w:t>
             </w:r>
           </w:p>
         </w:tc>
@@ -2625,7 +2638,7 @@
               <w:cnfStyle w:val="000000100000" w:firstRow="0" w:lastRow="0" w:firstColumn="0" w:lastColumn="0" w:oddVBand="0" w:evenVBand="0" w:oddHBand="1" w:evenHBand="0" w:firstRowFirstColumn="0" w:firstRowLastColumn="0" w:lastRowFirstColumn="0" w:lastRowLastColumn="0"/>
             </w:pPr>
             <w:r>
-              <w:t>32-bit float</w:t>
+              <w:t>32-bit integer</w:t>
             </w:r>
           </w:p>
         </w:tc>
@@ -2639,31 +2652,31 @@
               <w:cnfStyle w:val="000000100000" w:firstRow="0" w:lastRow="0" w:firstColumn="0" w:lastColumn="0" w:oddVBand="0" w:evenVBand="0" w:oddHBand="1" w:evenHBand="0" w:firstRowFirstColumn="0" w:firstRowLastColumn="0" w:lastRowFirstColumn="0" w:lastRowLastColumn="0"/>
             </w:pPr>
             <w:r>
-              <w:t xml:space="preserve">The image pixel value sample variance </w:t>
-            </w:r>
-          </w:p>
-        </w:tc>
-      </w:tr>
-      <w:tr>
-        <w:tc>
-          <w:tcPr>
-            <w:cnfStyle w:val="001000000000" w:firstRow="0" w:lastRow="0" w:firstColumn="1" w:lastColumn="0" w:oddVBand="0" w:evenVBand="0" w:oddHBand="0" w:evenHBand="0" w:firstRowFirstColumn="0" w:firstRowLastColumn="0" w:lastRowFirstColumn="0" w:lastRowLastColumn="0"/>
-            <w:tcW w:w="0" w:type="auto"/>
-          </w:tcPr>
-          <w:p>
-            <w:pPr>
-              <w:pStyle w:val="NoSpacing"/>
-              <w:rPr>
-                <w:b w:val="0"/>
-                <w:bCs w:val="0"/>
-              </w:rPr>
-            </w:pPr>
-            <w:r>
-              <w:rPr>
-                <w:b w:val="0"/>
-                <w:bCs w:val="0"/>
-              </w:rPr>
-              <w:t>standard deviation</w:t>
+              <w:t xml:space="preserve">The overall minimum image pixel value </w:t>
+            </w:r>
+          </w:p>
+        </w:tc>
+      </w:tr>
+      <w:tr>
+        <w:tc>
+          <w:tcPr>
+            <w:cnfStyle w:val="001000000000" w:firstRow="0" w:lastRow="0" w:firstColumn="1" w:lastColumn="0" w:oddVBand="0" w:evenVBand="0" w:oddHBand="0" w:evenHBand="0" w:firstRowFirstColumn="0" w:firstRowLastColumn="0" w:lastRowFirstColumn="0" w:lastRowLastColumn="0"/>
+            <w:tcW w:w="0" w:type="auto"/>
+          </w:tcPr>
+          <w:p>
+            <w:pPr>
+              <w:pStyle w:val="NoSpacing"/>
+              <w:rPr>
+                <w:b w:val="0"/>
+                <w:bCs w:val="0"/>
+              </w:rPr>
+            </w:pPr>
+            <w:r>
+              <w:rPr>
+                <w:b w:val="0"/>
+                <w:bCs w:val="0"/>
+              </w:rPr>
+              <w:t>max_value</w:t>
             </w:r>
           </w:p>
         </w:tc>
@@ -2677,7 +2690,7 @@
               <w:cnfStyle w:val="000000000000" w:firstRow="0" w:lastRow="0" w:firstColumn="0" w:lastColumn="0" w:oddVBand="0" w:evenVBand="0" w:oddHBand="0" w:evenHBand="0" w:firstRowFirstColumn="0" w:firstRowLastColumn="0" w:lastRowFirstColumn="0" w:lastRowLastColumn="0"/>
             </w:pPr>
             <w:r>
-              <w:t>32-bit float</w:t>
+              <w:t>32-bit integer</w:t>
             </w:r>
           </w:p>
         </w:tc>
@@ -2691,12 +2704,11 @@
               <w:cnfStyle w:val="000000000000" w:firstRow="0" w:lastRow="0" w:firstColumn="0" w:lastColumn="0" w:oddVBand="0" w:evenVBand="0" w:oddHBand="0" w:evenHBand="0" w:firstRowFirstColumn="0" w:firstRowLastColumn="0" w:lastRowFirstColumn="0" w:lastRowLastColumn="0"/>
             </w:pPr>
             <w:r>
-              <w:t xml:space="preserve">The image pixel value standard deviation </w:t>
-            </w:r>
-          </w:p>
-        </w:tc>
-      </w:tr>
-      <w:bookmarkEnd w:id="0"/>
+              <w:t xml:space="preserve">The overall maximum image pixel value </w:t>
+            </w:r>
+          </w:p>
+        </w:tc>
+      </w:tr>
       <w:tr>
         <w:trPr>
           <w:cnfStyle w:val="000000100000" w:firstRow="0" w:lastRow="0" w:firstColumn="0" w:lastColumn="0" w:oddVBand="0" w:evenVBand="0" w:oddHBand="1" w:evenHBand="0" w:firstRowFirstColumn="0" w:firstRowLastColumn="0" w:lastRowFirstColumn="0" w:lastRowLastColumn="0"/>
@@ -2719,6 +2731,7 @@
                 <w:b w:val="0"/>
                 <w:bCs w:val="0"/>
               </w:rPr>
+              <w:lastRenderedPageBreak/>
               <w:t>histogram data</w:t>
             </w:r>
           </w:p>
@@ -2759,7 +2772,6 @@
       </w:pPr>
       <w:bookmarkStart w:id="1" w:name="_Ref109109220"/>
       <w:r>
-        <w:lastRenderedPageBreak/>
         <w:t>Text histogram file format</w:t>
       </w:r>
       <w:bookmarkEnd w:id="1"/>
@@ -3069,7 +3081,7 @@
         <w:pStyle w:val="Normalafterlist"/>
       </w:pPr>
       <w:r>
-        <w:t>The number of rho values, max_rho, for images is:</w:t>
+        <w:t>The number of rho values, nrhos, for images is:</w:t>
       </w:r>
     </w:p>
     <w:p>
@@ -3085,7 +3097,7 @@
           <w:sz w:val="20"/>
           <w:szCs w:val="20"/>
         </w:rPr>
-        <w:t xml:space="preserve">  max_rho = sqrt(rows</w:t>
+        <w:t xml:space="preserve">  nrhos = sqrt(rows</w:t>
       </w:r>
       <w:r>
         <w:rPr>
@@ -3139,7 +3151,7 @@
           <w:sz w:val="20"/>
           <w:szCs w:val="20"/>
         </w:rPr>
-        <w:t xml:space="preserve">  rho_index = rho + max_rho / 2</w:t>
+        <w:t xml:space="preserve">  rho_index = rho + nrhos / 2</w:t>
       </w:r>
     </w:p>
     <w:p>
@@ -3155,7 +3167,7 @@
           <w:sz w:val="20"/>
           <w:szCs w:val="20"/>
         </w:rPr>
-        <w:t xml:space="preserve">  rho = rho_index – max_rho / 2</w:t>
+        <w:t xml:space="preserve">  rho = rho_index – nrhos / 2</w:t>
       </w:r>
     </w:p>
     <w:p>
@@ -3184,10 +3196,54 @@
     </w:p>
     <w:p>
       <w:pPr>
+        <w:pStyle w:val="code"/>
+        <w:rPr>
+          <w:sz w:val="20"/>
+          <w:szCs w:val="20"/>
+        </w:rPr>
+      </w:pPr>
+      <w:r>
+        <w:rPr>
+          <w:sz w:val="20"/>
+          <w:szCs w:val="20"/>
+        </w:rPr>
+        <w:t xml:space="preserve">  theta</w:t>
+      </w:r>
+      <w:r>
+        <w:rPr>
+          <w:sz w:val="20"/>
+          <w:szCs w:val="20"/>
+        </w:rPr>
+        <w:t xml:space="preserve">_index </w:t>
+      </w:r>
+      <w:r>
+        <w:rPr>
+          <w:sz w:val="20"/>
+          <w:szCs w:val="20"/>
+        </w:rPr>
+        <w:t>= theta degrees</w:t>
+      </w:r>
+      <w:r>
+        <w:rPr>
+          <w:sz w:val="20"/>
+          <w:szCs w:val="20"/>
+        </w:rPr>
+        <w:t xml:space="preserve"> /</w:t>
+      </w:r>
+      <w:r>
+        <w:rPr>
+          <w:sz w:val="20"/>
+          <w:szCs w:val="20"/>
+        </w:rPr>
+        <w:t xml:space="preserve"> theta_inc</w:t>
+      </w:r>
+    </w:p>
+    <w:p>
+      <w:pPr>
         <w:pStyle w:val="Normalafterlist"/>
       </w:pPr>
       <w:r>
-        <w:t>Polar line (rho, theta) are generally input and stored as (rho_index, theta_index), except as noted.</w:t>
+        <w:t>Polar lines (rho, theta) are generally input and stored as (rho_index, theta_index), except as noted.</w:t>
       </w:r>
     </w:p>
     <w:p>
@@ -3201,7 +3257,13 @@
     </w:p>
     <w:p>
       <w:r>
-        <w:t>Binary histogram files contain the Hough accumulator parameters, the Hough accumulator counts, and some statistics of the counts. The binary Hough accumulator data files are defined by the workbench, and include the following fields:</w:t>
+        <w:t xml:space="preserve">Binary </w:t>
+      </w:r>
+      <w:r>
+        <w:t xml:space="preserve">Hough accumulator </w:t>
+      </w:r>
+      <w:r>
+        <w:t>files contain the Hough accumulator counts and some statistics of the accumulator. The binary Hough accumulator data files are defined by the workbench, and include the following fields:</w:t>
       </w:r>
     </w:p>
     <w:tbl>
@@ -3211,9 +3273,9 @@
         <w:tblLook w:val="04A0" w:firstRow="1" w:lastRow="0" w:firstColumn="1" w:lastColumn="0" w:noHBand="0" w:noVBand="1"/>
       </w:tblPr>
       <w:tblGrid>
-        <w:gridCol w:w="2184"/>
-        <w:gridCol w:w="2652"/>
-        <w:gridCol w:w="4514"/>
+        <w:gridCol w:w="2146"/>
+        <w:gridCol w:w="2353"/>
+        <w:gridCol w:w="4851"/>
       </w:tblGrid>
       <w:tr>
         <w:trPr>
@@ -3338,7 +3400,7 @@
                 <w:b w:val="0"/>
                 <w:bCs w:val="0"/>
               </w:rPr>
-              <w:t>nthetas</w:t>
+              <w:t>nrhos</w:t>
             </w:r>
           </w:p>
         </w:tc>
@@ -3366,7 +3428,7 @@
               <w:cnfStyle w:val="000000000000" w:firstRow="0" w:lastRow="0" w:firstColumn="0" w:lastColumn="0" w:oddVBand="0" w:evenVBand="0" w:oddHBand="0" w:evenHBand="0" w:firstRowFirstColumn="0" w:firstRowLastColumn="0" w:lastRowFirstColumn="0" w:lastRowLastColumn="0"/>
             </w:pPr>
             <w:r>
-              <w:t>The number of angles sampled = 180 / theta_inc</w:t>
+              <w:t>The number of rho values sampled</w:t>
             </w:r>
           </w:p>
         </w:tc>
@@ -3393,7 +3455,7 @@
                 <w:b w:val="0"/>
                 <w:bCs w:val="0"/>
               </w:rPr>
-              <w:t>max_rho</w:t>
+              <w:t>rows</w:t>
             </w:r>
           </w:p>
         </w:tc>
@@ -3421,31 +3483,31 @@
               <w:cnfStyle w:val="000000100000" w:firstRow="0" w:lastRow="0" w:firstColumn="0" w:lastColumn="0" w:oddVBand="0" w:evenVBand="0" w:oddHBand="1" w:evenHBand="0" w:firstRowFirstColumn="0" w:firstRowLastColumn="0" w:lastRowFirstColumn="0" w:lastRowLastColumn="0"/>
             </w:pPr>
             <w:r>
-              <w:t>The number of rho values sampled</w:t>
-            </w:r>
-          </w:p>
-        </w:tc>
-      </w:tr>
-      <w:tr>
-        <w:tc>
-          <w:tcPr>
-            <w:cnfStyle w:val="001000000000" w:firstRow="0" w:lastRow="0" w:firstColumn="1" w:lastColumn="0" w:oddVBand="0" w:evenVBand="0" w:oddHBand="0" w:evenHBand="0" w:firstRowFirstColumn="0" w:firstRowLastColumn="0" w:lastRowFirstColumn="0" w:lastRowLastColumn="0"/>
-            <w:tcW w:w="0" w:type="auto"/>
-          </w:tcPr>
-          <w:p>
-            <w:pPr>
-              <w:pStyle w:val="NoSpacing"/>
-              <w:rPr>
-                <w:b w:val="0"/>
-                <w:bCs w:val="0"/>
-              </w:rPr>
-            </w:pPr>
-            <w:r>
-              <w:rPr>
-                <w:b w:val="0"/>
-                <w:bCs w:val="0"/>
-              </w:rPr>
-              <w:t>min_count</w:t>
+              <w:t>The number of rows in the image used to create the accumulator</w:t>
+            </w:r>
+          </w:p>
+        </w:tc>
+      </w:tr>
+      <w:tr>
+        <w:tc>
+          <w:tcPr>
+            <w:cnfStyle w:val="001000000000" w:firstRow="0" w:lastRow="0" w:firstColumn="1" w:lastColumn="0" w:oddVBand="0" w:evenVBand="0" w:oddHBand="0" w:evenHBand="0" w:firstRowFirstColumn="0" w:firstRowLastColumn="0" w:lastRowFirstColumn="0" w:lastRowLastColumn="0"/>
+            <w:tcW w:w="0" w:type="auto"/>
+          </w:tcPr>
+          <w:p>
+            <w:pPr>
+              <w:pStyle w:val="NoSpacing"/>
+              <w:rPr>
+                <w:b w:val="0"/>
+                <w:bCs w:val="0"/>
+              </w:rPr>
+            </w:pPr>
+            <w:r>
+              <w:rPr>
+                <w:b w:val="0"/>
+                <w:bCs w:val="0"/>
+              </w:rPr>
+              <w:t>cols</w:t>
             </w:r>
           </w:p>
         </w:tc>
@@ -3473,7 +3535,13 @@
               <w:cnfStyle w:val="000000000000" w:firstRow="0" w:lastRow="0" w:firstColumn="0" w:lastColumn="0" w:oddVBand="0" w:evenVBand="0" w:oddHBand="0" w:evenHBand="0" w:firstRowFirstColumn="0" w:firstRowLastColumn="0" w:lastRowFirstColumn="0" w:lastRowLastColumn="0"/>
             </w:pPr>
             <w:r>
-              <w:t>The lowest count for any bin</w:t>
+              <w:t xml:space="preserve">The number of </w:t>
+            </w:r>
+            <w:r>
+              <w:t>columns</w:t>
+            </w:r>
+            <w:r>
+              <w:t xml:space="preserve"> in the image used to create the accumulator</w:t>
             </w:r>
           </w:p>
         </w:tc>
@@ -3500,7 +3568,7 @@
                 <w:b w:val="0"/>
                 <w:bCs w:val="0"/>
               </w:rPr>
-              <w:t>max_count</w:t>
+              <w:t>hough accumulator data</w:t>
             </w:r>
           </w:p>
         </w:tc>
@@ -3514,7 +3582,7 @@
               <w:cnfStyle w:val="000000100000" w:firstRow="0" w:lastRow="0" w:firstColumn="0" w:lastColumn="0" w:oddVBand="0" w:evenVBand="0" w:oddHBand="1" w:evenHBand="0" w:firstRowFirstColumn="0" w:firstRowLastColumn="0" w:lastRowFirstColumn="0" w:lastRowLastColumn="0"/>
             </w:pPr>
             <w:r>
-              <w:t>32-bit integer</w:t>
+              <w:t>nrhos * nthetas 32-bit integers</w:t>
             </w:r>
           </w:p>
         </w:tc>
@@ -3526,272 +3594,6 @@
             <w:pPr>
               <w:pStyle w:val="NoSpacing"/>
               <w:cnfStyle w:val="000000100000" w:firstRow="0" w:lastRow="0" w:firstColumn="0" w:lastColumn="0" w:oddVBand="0" w:evenVBand="0" w:oddHBand="1" w:evenHBand="0" w:firstRowFirstColumn="0" w:firstRowLastColumn="0" w:lastRowFirstColumn="0" w:lastRowLastColumn="0"/>
-            </w:pPr>
-            <w:r>
-              <w:t>The largest count for any bin</w:t>
-            </w:r>
-          </w:p>
-        </w:tc>
-      </w:tr>
-      <w:tr>
-        <w:tc>
-          <w:tcPr>
-            <w:cnfStyle w:val="001000000000" w:firstRow="0" w:lastRow="0" w:firstColumn="1" w:lastColumn="0" w:oddVBand="0" w:evenVBand="0" w:oddHBand="0" w:evenHBand="0" w:firstRowFirstColumn="0" w:firstRowLastColumn="0" w:lastRowFirstColumn="0" w:lastRowLastColumn="0"/>
-            <w:tcW w:w="0" w:type="auto"/>
-          </w:tcPr>
-          <w:p>
-            <w:pPr>
-              <w:pStyle w:val="NoSpacing"/>
-              <w:rPr>
-                <w:b w:val="0"/>
-                <w:bCs w:val="0"/>
-              </w:rPr>
-            </w:pPr>
-            <w:r>
-              <w:rPr>
-                <w:b w:val="0"/>
-                <w:bCs w:val="0"/>
-              </w:rPr>
-              <w:t>mean</w:t>
-            </w:r>
-          </w:p>
-        </w:tc>
-        <w:tc>
-          <w:tcPr>
-            <w:tcW w:w="0" w:type="auto"/>
-          </w:tcPr>
-          <w:p>
-            <w:pPr>
-              <w:pStyle w:val="NoSpacing"/>
-              <w:cnfStyle w:val="000000000000" w:firstRow="0" w:lastRow="0" w:firstColumn="0" w:lastColumn="0" w:oddVBand="0" w:evenVBand="0" w:oddHBand="0" w:evenHBand="0" w:firstRowFirstColumn="0" w:firstRowLastColumn="0" w:lastRowFirstColumn="0" w:lastRowLastColumn="0"/>
-            </w:pPr>
-            <w:r>
-              <w:t>32-bit float</w:t>
-            </w:r>
-          </w:p>
-        </w:tc>
-        <w:tc>
-          <w:tcPr>
-            <w:tcW w:w="0" w:type="auto"/>
-          </w:tcPr>
-          <w:p>
-            <w:pPr>
-              <w:pStyle w:val="NoSpacing"/>
-              <w:cnfStyle w:val="000000000000" w:firstRow="0" w:lastRow="0" w:firstColumn="0" w:lastColumn="0" w:oddVBand="0" w:evenVBand="0" w:oddHBand="0" w:evenHBand="0" w:firstRowFirstColumn="0" w:firstRowLastColumn="0" w:lastRowFirstColumn="0" w:lastRowLastColumn="0"/>
-            </w:pPr>
-            <w:r>
-              <w:t>The mean for the hough accumulator counts</w:t>
-            </w:r>
-          </w:p>
-        </w:tc>
-      </w:tr>
-      <w:tr>
-        <w:trPr>
-          <w:cnfStyle w:val="000000100000" w:firstRow="0" w:lastRow="0" w:firstColumn="0" w:lastColumn="0" w:oddVBand="0" w:evenVBand="0" w:oddHBand="1" w:evenHBand="0" w:firstRowFirstColumn="0" w:firstRowLastColumn="0" w:lastRowFirstColumn="0" w:lastRowLastColumn="0"/>
-        </w:trPr>
-        <w:tc>
-          <w:tcPr>
-            <w:cnfStyle w:val="001000000000" w:firstRow="0" w:lastRow="0" w:firstColumn="1" w:lastColumn="0" w:oddVBand="0" w:evenVBand="0" w:oddHBand="0" w:evenHBand="0" w:firstRowFirstColumn="0" w:firstRowLastColumn="0" w:lastRowFirstColumn="0" w:lastRowLastColumn="0"/>
-            <w:tcW w:w="0" w:type="auto"/>
-          </w:tcPr>
-          <w:p>
-            <w:pPr>
-              <w:pStyle w:val="NoSpacing"/>
-              <w:rPr>
-                <w:b w:val="0"/>
-                <w:bCs w:val="0"/>
-              </w:rPr>
-            </w:pPr>
-            <w:r>
-              <w:rPr>
-                <w:b w:val="0"/>
-                <w:bCs w:val="0"/>
-              </w:rPr>
-              <w:t>variance</w:t>
-            </w:r>
-          </w:p>
-        </w:tc>
-        <w:tc>
-          <w:tcPr>
-            <w:tcW w:w="0" w:type="auto"/>
-          </w:tcPr>
-          <w:p>
-            <w:pPr>
-              <w:pStyle w:val="NoSpacing"/>
-              <w:cnfStyle w:val="000000100000" w:firstRow="0" w:lastRow="0" w:firstColumn="0" w:lastColumn="0" w:oddVBand="0" w:evenVBand="0" w:oddHBand="1" w:evenHBand="0" w:firstRowFirstColumn="0" w:firstRowLastColumn="0" w:lastRowFirstColumn="0" w:lastRowLastColumn="0"/>
-            </w:pPr>
-            <w:r>
-              <w:t>32-bit float</w:t>
-            </w:r>
-          </w:p>
-        </w:tc>
-        <w:tc>
-          <w:tcPr>
-            <w:tcW w:w="0" w:type="auto"/>
-          </w:tcPr>
-          <w:p>
-            <w:pPr>
-              <w:pStyle w:val="NoSpacing"/>
-              <w:cnfStyle w:val="000000100000" w:firstRow="0" w:lastRow="0" w:firstColumn="0" w:lastColumn="0" w:oddVBand="0" w:evenVBand="0" w:oddHBand="1" w:evenHBand="0" w:firstRowFirstColumn="0" w:firstRowLastColumn="0" w:lastRowFirstColumn="0" w:lastRowLastColumn="0"/>
-            </w:pPr>
-            <w:r>
-              <w:t>The variance for the hough accumulator counts</w:t>
-            </w:r>
-          </w:p>
-        </w:tc>
-      </w:tr>
-      <w:tr>
-        <w:tc>
-          <w:tcPr>
-            <w:cnfStyle w:val="001000000000" w:firstRow="0" w:lastRow="0" w:firstColumn="1" w:lastColumn="0" w:oddVBand="0" w:evenVBand="0" w:oddHBand="0" w:evenHBand="0" w:firstRowFirstColumn="0" w:firstRowLastColumn="0" w:lastRowFirstColumn="0" w:lastRowLastColumn="0"/>
-            <w:tcW w:w="0" w:type="auto"/>
-          </w:tcPr>
-          <w:p>
-            <w:pPr>
-              <w:pStyle w:val="NoSpacing"/>
-              <w:rPr>
-                <w:b w:val="0"/>
-                <w:bCs w:val="0"/>
-              </w:rPr>
-            </w:pPr>
-            <w:r>
-              <w:rPr>
-                <w:b w:val="0"/>
-                <w:bCs w:val="0"/>
-              </w:rPr>
-              <w:t>sample variance</w:t>
-            </w:r>
-          </w:p>
-        </w:tc>
-        <w:tc>
-          <w:tcPr>
-            <w:tcW w:w="0" w:type="auto"/>
-          </w:tcPr>
-          <w:p>
-            <w:pPr>
-              <w:pStyle w:val="NoSpacing"/>
-              <w:cnfStyle w:val="000000000000" w:firstRow="0" w:lastRow="0" w:firstColumn="0" w:lastColumn="0" w:oddVBand="0" w:evenVBand="0" w:oddHBand="0" w:evenHBand="0" w:firstRowFirstColumn="0" w:firstRowLastColumn="0" w:lastRowFirstColumn="0" w:lastRowLastColumn="0"/>
-            </w:pPr>
-            <w:r>
-              <w:t>32-bit float</w:t>
-            </w:r>
-          </w:p>
-        </w:tc>
-        <w:tc>
-          <w:tcPr>
-            <w:tcW w:w="0" w:type="auto"/>
-          </w:tcPr>
-          <w:p>
-            <w:pPr>
-              <w:pStyle w:val="NoSpacing"/>
-              <w:cnfStyle w:val="000000000000" w:firstRow="0" w:lastRow="0" w:firstColumn="0" w:lastColumn="0" w:oddVBand="0" w:evenVBand="0" w:oddHBand="0" w:evenHBand="0" w:firstRowFirstColumn="0" w:firstRowLastColumn="0" w:lastRowFirstColumn="0" w:lastRowLastColumn="0"/>
-            </w:pPr>
-            <w:r>
-              <w:t>The sample variance for the hough accumulator counts</w:t>
-            </w:r>
-          </w:p>
-        </w:tc>
-      </w:tr>
-      <w:tr>
-        <w:trPr>
-          <w:cnfStyle w:val="000000100000" w:firstRow="0" w:lastRow="0" w:firstColumn="0" w:lastColumn="0" w:oddVBand="0" w:evenVBand="0" w:oddHBand="1" w:evenHBand="0" w:firstRowFirstColumn="0" w:firstRowLastColumn="0" w:lastRowFirstColumn="0" w:lastRowLastColumn="0"/>
-        </w:trPr>
-        <w:tc>
-          <w:tcPr>
-            <w:cnfStyle w:val="001000000000" w:firstRow="0" w:lastRow="0" w:firstColumn="1" w:lastColumn="0" w:oddVBand="0" w:evenVBand="0" w:oddHBand="0" w:evenHBand="0" w:firstRowFirstColumn="0" w:firstRowLastColumn="0" w:lastRowFirstColumn="0" w:lastRowLastColumn="0"/>
-            <w:tcW w:w="0" w:type="auto"/>
-          </w:tcPr>
-          <w:p>
-            <w:pPr>
-              <w:pStyle w:val="NoSpacing"/>
-              <w:rPr>
-                <w:b w:val="0"/>
-                <w:bCs w:val="0"/>
-              </w:rPr>
-            </w:pPr>
-            <w:r>
-              <w:rPr>
-                <w:b w:val="0"/>
-                <w:bCs w:val="0"/>
-              </w:rPr>
-              <w:t>standard deviation</w:t>
-            </w:r>
-          </w:p>
-        </w:tc>
-        <w:tc>
-          <w:tcPr>
-            <w:tcW w:w="0" w:type="auto"/>
-          </w:tcPr>
-          <w:p>
-            <w:pPr>
-              <w:pStyle w:val="NoSpacing"/>
-              <w:cnfStyle w:val="000000100000" w:firstRow="0" w:lastRow="0" w:firstColumn="0" w:lastColumn="0" w:oddVBand="0" w:evenVBand="0" w:oddHBand="1" w:evenHBand="0" w:firstRowFirstColumn="0" w:firstRowLastColumn="0" w:lastRowFirstColumn="0" w:lastRowLastColumn="0"/>
-            </w:pPr>
-            <w:r>
-              <w:t>32-bit float</w:t>
-            </w:r>
-          </w:p>
-        </w:tc>
-        <w:tc>
-          <w:tcPr>
-            <w:tcW w:w="0" w:type="auto"/>
-          </w:tcPr>
-          <w:p>
-            <w:pPr>
-              <w:pStyle w:val="NoSpacing"/>
-              <w:cnfStyle w:val="000000100000" w:firstRow="0" w:lastRow="0" w:firstColumn="0" w:lastColumn="0" w:oddVBand="0" w:evenVBand="0" w:oddHBand="1" w:evenHBand="0" w:firstRowFirstColumn="0" w:firstRowLastColumn="0" w:lastRowFirstColumn="0" w:lastRowLastColumn="0"/>
-            </w:pPr>
-            <w:r>
-              <w:t>The standard deviation for the hough accumulator counts</w:t>
-            </w:r>
-          </w:p>
-        </w:tc>
-      </w:tr>
-      <w:tr>
-        <w:tc>
-          <w:tcPr>
-            <w:cnfStyle w:val="001000000000" w:firstRow="0" w:lastRow="0" w:firstColumn="1" w:lastColumn="0" w:oddVBand="0" w:evenVBand="0" w:oddHBand="0" w:evenHBand="0" w:firstRowFirstColumn="0" w:firstRowLastColumn="0" w:lastRowFirstColumn="0" w:lastRowLastColumn="0"/>
-            <w:tcW w:w="0" w:type="auto"/>
-          </w:tcPr>
-          <w:p>
-            <w:pPr>
-              <w:pStyle w:val="NoSpacing"/>
-              <w:rPr>
-                <w:b w:val="0"/>
-                <w:bCs w:val="0"/>
-              </w:rPr>
-            </w:pPr>
-            <w:r>
-              <w:rPr>
-                <w:b w:val="0"/>
-                <w:bCs w:val="0"/>
-              </w:rPr>
-              <w:t>hough accumulator data</w:t>
-            </w:r>
-          </w:p>
-        </w:tc>
-        <w:tc>
-          <w:tcPr>
-            <w:tcW w:w="0" w:type="auto"/>
-          </w:tcPr>
-          <w:p>
-            <w:pPr>
-              <w:pStyle w:val="NoSpacing"/>
-              <w:cnfStyle w:val="000000000000" w:firstRow="0" w:lastRow="0" w:firstColumn="0" w:lastColumn="0" w:oddVBand="0" w:evenVBand="0" w:oddHBand="0" w:evenHBand="0" w:firstRowFirstColumn="0" w:firstRowLastColumn="0" w:lastRowFirstColumn="0" w:lastRowLastColumn="0"/>
-            </w:pPr>
-            <w:r>
-              <w:t>max_rho * nthetas 32-bit integers</w:t>
-            </w:r>
-          </w:p>
-        </w:tc>
-        <w:tc>
-          <w:tcPr>
-            <w:tcW w:w="0" w:type="auto"/>
-          </w:tcPr>
-          <w:p>
-            <w:pPr>
-              <w:pStyle w:val="NoSpacing"/>
-              <w:cnfStyle w:val="000000000000" w:firstRow="0" w:lastRow="0" w:firstColumn="0" w:lastColumn="0" w:oddVBand="0" w:evenVBand="0" w:oddHBand="0" w:evenHBand="0" w:firstRowFirstColumn="0" w:firstRowLastColumn="0" w:lastRowFirstColumn="0" w:lastRowLastColumn="0"/>
             </w:pPr>
             <w:r>
               <w:t>The Hough accumulator (rho_index, theta_index) count data</w:t>
@@ -3848,7 +3650,7 @@
           </w:tcPr>
           <w:p>
             <w:r>
-              <w:t>rho values from -max_rho/2 to max_rho/2</w:t>
+              <w:t>rho values from -nrhos/2 to nrhos/2</w:t>
             </w:r>
           </w:p>
         </w:tc>
@@ -4131,7 +3933,7 @@
                 <w:b w:val="0"/>
                 <w:bCs w:val="0"/>
               </w:rPr>
-              <w:t>max_rho</w:t>
+              <w:t>nrhos</w:t>
             </w:r>
           </w:p>
         </w:tc>
@@ -4183,7 +3985,6 @@
                 <w:b w:val="0"/>
                 <w:bCs w:val="0"/>
               </w:rPr>
-              <w:lastRenderedPageBreak/>
               <w:t>Hough peak line data</w:t>
             </w:r>
           </w:p>
@@ -4251,6 +4052,7 @@
         <w:pStyle w:val="Heading1"/>
       </w:pPr>
       <w:r>
+        <w:lastRenderedPageBreak/>
         <w:t>Scripts</w:t>
       </w:r>
     </w:p>
@@ -4832,7 +4634,6 @@
         <w:pStyle w:val="Heading2"/>
       </w:pPr>
       <w:r>
-        <w:lastRenderedPageBreak/>
         <w:t>Data Descriptors</w:t>
       </w:r>
     </w:p>
@@ -5034,6 +4835,7 @@
               <w:cnfStyle w:val="000000000000" w:firstRow="0" w:lastRow="0" w:firstColumn="0" w:lastColumn="0" w:oddVBand="0" w:evenVBand="0" w:oddHBand="0" w:evenHBand="0" w:firstRowFirstColumn="0" w:firstRowLastColumn="0" w:lastRowFirstColumn="0" w:lastRowLastColumn="0"/>
             </w:pPr>
             <w:r>
+              <w:lastRenderedPageBreak/>
               <w:t>“text” for output text histogram data to display using gnuplot</w:t>
             </w:r>
           </w:p>
@@ -5060,6 +4862,7 @@
                 <w:b w:val="0"/>
                 <w:bCs w:val="0"/>
               </w:rPr>
+              <w:lastRenderedPageBreak/>
               <w:t>Hough accumulator data</w:t>
             </w:r>
           </w:p>
@@ -5646,7 +5449,6 @@
           <w:b/>
           <w:bCs/>
         </w:rPr>
-        <w:lastRenderedPageBreak/>
         <w:tab/>
         <w:t xml:space="preserve">        “username”: “</w:t>
       </w:r>
@@ -5878,6 +5680,7 @@
         <w:pStyle w:val="Normalafterlist"/>
       </w:pPr>
       <w:r>
+        <w:lastRenderedPageBreak/>
         <w:t xml:space="preserve">Results added to each </w:t>
       </w:r>
       <w:r>
@@ -6568,6 +6371,7 @@
         <w:pStyle w:val="Normalafterlist"/>
       </w:pPr>
       <w:r>
+        <w:lastRenderedPageBreak/>
         <w:t xml:space="preserve">The </w:t>
       </w:r>
       <w:r>
@@ -7447,7 +7251,6 @@
               <w:pStyle w:val="code"/>
             </w:pPr>
             <w:r>
-              <w:lastRenderedPageBreak/>
               <w:t xml:space="preserve">      "type": "image",</w:t>
             </w:r>
           </w:p>
@@ -7517,12 +7320,7 @@
               <w:cnfStyle w:val="000000100000" w:firstRow="0" w:lastRow="0" w:firstColumn="0" w:lastColumn="0" w:oddVBand="0" w:evenVBand="0" w:oddHBand="1" w:evenHBand="0" w:firstRowFirstColumn="0" w:firstRowLastColumn="0" w:lastRowFirstColumn="0" w:lastRowLastColumn="0"/>
             </w:pPr>
             <w:r>
-              <w:lastRenderedPageBreak/>
-              <w:t>The output data for the operator is a CV_32S binary image file named “square45-</w:t>
-            </w:r>
-            <w:r>
-              <w:lastRenderedPageBreak/>
-              <w:t>90_sobel_gray.bin” in the current directory. The Sobel operator defines that the image is CV_32S.</w:t>
+              <w:t>The output data for the operator is a CV_32S binary image file named “square45-90_sobel_gray.bin” in the current directory. The Sobel operator defines that the image is CV_32S.</w:t>
             </w:r>
           </w:p>
         </w:tc>
@@ -7538,7 +7336,6 @@
               <w:pStyle w:val="code"/>
             </w:pPr>
             <w:r>
-              <w:lastRenderedPageBreak/>
               <w:t xml:space="preserve">  "parameters": {</w:t>
             </w:r>
           </w:p>
@@ -7617,6 +7414,7 @@
         <w:pStyle w:val="Heading3"/>
       </w:pPr>
       <w:r>
+        <w:lastRenderedPageBreak/>
         <w:t xml:space="preserve">Image Intensity Map Operator script experiment step </w:t>
       </w:r>
     </w:p>
@@ -8518,7 +8316,6 @@
               <w:pStyle w:val="code"/>
             </w:pPr>
             <w:r>
-              <w:lastRenderedPageBreak/>
               <w:t xml:space="preserve">      "repository": "filesystem",</w:t>
             </w:r>
           </w:p>
@@ -8580,12 +8377,7 @@
               <w:cnfStyle w:val="000000100000" w:firstRow="0" w:lastRow="0" w:firstColumn="0" w:lastColumn="0" w:oddVBand="0" w:evenVBand="0" w:oddHBand="1" w:evenHBand="0" w:firstRowFirstColumn="0" w:firstRowLastColumn="0" w:lastRowFirstColumn="0" w:lastRowLastColumn="0"/>
             </w:pPr>
             <w:r>
-              <w:lastRenderedPageBreak/>
-              <w:t xml:space="preserve">The output data for the operator is a CV_8U binary JPEG file named “square45-90_sobel_gray.jpg” in the current directory. </w:t>
-            </w:r>
-            <w:r>
-              <w:lastRenderedPageBreak/>
-              <w:t>The CV_8U depth is implied by specifying a JPEG output format.</w:t>
+              <w:t>The output data for the operator is a CV_8U binary JPEG file named “square45-90_sobel_gray.jpg” in the current directory. The CV_8U depth is implied by specifying a JPEG output format.</w:t>
             </w:r>
           </w:p>
         </w:tc>
@@ -8601,7 +8393,6 @@
               <w:pStyle w:val="code"/>
             </w:pPr>
             <w:r>
-              <w:lastRenderedPageBreak/>
               <w:t xml:space="preserve">  "parameters": {</w:t>
             </w:r>
           </w:p>
@@ -8666,6 +8457,7 @@
         <w:pStyle w:val="Heading1"/>
       </w:pPr>
       <w:r>
+        <w:lastRenderedPageBreak/>
         <w:t>Operators</w:t>
       </w:r>
     </w:p>
@@ -8683,8 +8475,8 @@
       <w:tblGrid>
         <w:gridCol w:w="1219"/>
         <w:gridCol w:w="1036"/>
-        <w:gridCol w:w="1109"/>
-        <w:gridCol w:w="5986"/>
+        <w:gridCol w:w="1366"/>
+        <w:gridCol w:w="5729"/>
       </w:tblGrid>
       <w:tr>
         <w:trPr>
@@ -8799,6 +8591,72 @@
               <w:cnfStyle w:val="000000100000" w:firstRow="0" w:lastRow="0" w:firstColumn="0" w:lastColumn="0" w:oddVBand="0" w:evenVBand="0" w:oddHBand="1" w:evenHBand="0" w:firstRowFirstColumn="0" w:firstRowLastColumn="0" w:lastRowFirstColumn="0" w:lastRowLastColumn="0"/>
             </w:pPr>
             <w:r>
+              <w:t>Gaussian</w:t>
+            </w:r>
+          </w:p>
+        </w:tc>
+        <w:tc>
+          <w:tcPr>
+            <w:tcW w:w="0" w:type="auto"/>
+          </w:tcPr>
+          <w:p>
+            <w:pPr>
+              <w:pStyle w:val="NoSpacing"/>
+              <w:cnfStyle w:val="000000100000" w:firstRow="0" w:lastRow="0" w:firstColumn="0" w:lastColumn="0" w:oddVBand="0" w:evenVBand="0" w:oddHBand="1" w:evenHBand="0" w:firstRowFirstColumn="0" w:firstRowLastColumn="0" w:lastRowFirstColumn="0" w:lastRowLastColumn="0"/>
+            </w:pPr>
+            <w:r>
+              <w:t>Difference of Gaussian edge operator</w:t>
+            </w:r>
+          </w:p>
+        </w:tc>
+      </w:tr>
+      <w:tr>
+        <w:tc>
+          <w:tcPr>
+            <w:cnfStyle w:val="001000000000" w:firstRow="0" w:lastRow="0" w:firstColumn="1" w:lastColumn="0" w:oddVBand="0" w:evenVBand="0" w:oddHBand="0" w:evenHBand="0" w:firstRowFirstColumn="0" w:firstRowLastColumn="0" w:lastRowFirstColumn="0" w:lastRowLastColumn="0"/>
+            <w:tcW w:w="0" w:type="auto"/>
+          </w:tcPr>
+          <w:p>
+            <w:pPr>
+              <w:pStyle w:val="NoSpacing"/>
+              <w:rPr>
+                <w:b w:val="0"/>
+                <w:bCs w:val="0"/>
+              </w:rPr>
+            </w:pPr>
+            <w:r>
+              <w:rPr>
+                <w:b w:val="0"/>
+                <w:bCs w:val="0"/>
+              </w:rPr>
+              <w:t>Filter</w:t>
+            </w:r>
+          </w:p>
+        </w:tc>
+        <w:tc>
+          <w:tcPr>
+            <w:tcW w:w="0" w:type="auto"/>
+          </w:tcPr>
+          <w:p>
+            <w:pPr>
+              <w:pStyle w:val="NoSpacing"/>
+              <w:cnfStyle w:val="000000000000" w:firstRow="0" w:lastRow="0" w:firstColumn="0" w:lastColumn="0" w:oddVBand="0" w:evenVBand="0" w:oddHBand="0" w:evenHBand="0" w:firstRowFirstColumn="0" w:firstRowLastColumn="0" w:lastRowFirstColumn="0" w:lastRowLastColumn="0"/>
+            </w:pPr>
+            <w:r>
+              <w:t>Edge</w:t>
+            </w:r>
+          </w:p>
+        </w:tc>
+        <w:tc>
+          <w:tcPr>
+            <w:tcW w:w="0" w:type="auto"/>
+          </w:tcPr>
+          <w:p>
+            <w:pPr>
+              <w:pStyle w:val="NoSpacing"/>
+              <w:cnfStyle w:val="000000000000" w:firstRow="0" w:lastRow="0" w:firstColumn="0" w:lastColumn="0" w:oddVBand="0" w:evenVBand="0" w:oddHBand="0" w:evenHBand="0" w:firstRowFirstColumn="0" w:firstRowLastColumn="0" w:lastRowFirstColumn="0" w:lastRowLastColumn="0"/>
+            </w:pPr>
+            <w:r>
               <w:t>Kirsch</w:t>
             </w:r>
           </w:p>
@@ -8810,76 +8668,10 @@
           <w:p>
             <w:pPr>
               <w:pStyle w:val="NoSpacing"/>
-              <w:cnfStyle w:val="000000100000" w:firstRow="0" w:lastRow="0" w:firstColumn="0" w:lastColumn="0" w:oddVBand="0" w:evenVBand="0" w:oddHBand="1" w:evenHBand="0" w:firstRowFirstColumn="0" w:firstRowLastColumn="0" w:lastRowFirstColumn="0" w:lastRowLastColumn="0"/>
+              <w:cnfStyle w:val="000000000000" w:firstRow="0" w:lastRow="0" w:firstColumn="0" w:lastColumn="0" w:oddVBand="0" w:evenVBand="0" w:oddHBand="0" w:evenHBand="0" w:firstRowFirstColumn="0" w:firstRowLastColumn="0" w:lastRowFirstColumn="0" w:lastRowLastColumn="0"/>
             </w:pPr>
             <w:r>
               <w:t>Kirsch edge operator</w:t>
-            </w:r>
-          </w:p>
-        </w:tc>
-      </w:tr>
-      <w:tr>
-        <w:tc>
-          <w:tcPr>
-            <w:cnfStyle w:val="001000000000" w:firstRow="0" w:lastRow="0" w:firstColumn="1" w:lastColumn="0" w:oddVBand="0" w:evenVBand="0" w:oddHBand="0" w:evenHBand="0" w:firstRowFirstColumn="0" w:firstRowLastColumn="0" w:lastRowFirstColumn="0" w:lastRowLastColumn="0"/>
-            <w:tcW w:w="0" w:type="auto"/>
-          </w:tcPr>
-          <w:p>
-            <w:pPr>
-              <w:pStyle w:val="NoSpacing"/>
-              <w:rPr>
-                <w:b w:val="0"/>
-                <w:bCs w:val="0"/>
-              </w:rPr>
-            </w:pPr>
-            <w:r>
-              <w:rPr>
-                <w:b w:val="0"/>
-                <w:bCs w:val="0"/>
-              </w:rPr>
-              <w:t>Filter</w:t>
-            </w:r>
-          </w:p>
-        </w:tc>
-        <w:tc>
-          <w:tcPr>
-            <w:tcW w:w="0" w:type="auto"/>
-          </w:tcPr>
-          <w:p>
-            <w:pPr>
-              <w:pStyle w:val="NoSpacing"/>
-              <w:cnfStyle w:val="000000000000" w:firstRow="0" w:lastRow="0" w:firstColumn="0" w:lastColumn="0" w:oddVBand="0" w:evenVBand="0" w:oddHBand="0" w:evenHBand="0" w:firstRowFirstColumn="0" w:firstRowLastColumn="0" w:lastRowFirstColumn="0" w:lastRowLastColumn="0"/>
-            </w:pPr>
-            <w:r>
-              <w:t>Edge</w:t>
-            </w:r>
-          </w:p>
-        </w:tc>
-        <w:tc>
-          <w:tcPr>
-            <w:tcW w:w="0" w:type="auto"/>
-          </w:tcPr>
-          <w:p>
-            <w:pPr>
-              <w:pStyle w:val="NoSpacing"/>
-              <w:cnfStyle w:val="000000000000" w:firstRow="0" w:lastRow="0" w:firstColumn="0" w:lastColumn="0" w:oddVBand="0" w:evenVBand="0" w:oddHBand="0" w:evenHBand="0" w:firstRowFirstColumn="0" w:firstRowLastColumn="0" w:lastRowFirstColumn="0" w:lastRowLastColumn="0"/>
-            </w:pPr>
-            <w:r>
-              <w:t>Prewitt</w:t>
-            </w:r>
-          </w:p>
-        </w:tc>
-        <w:tc>
-          <w:tcPr>
-            <w:tcW w:w="0" w:type="auto"/>
-          </w:tcPr>
-          <w:p>
-            <w:pPr>
-              <w:pStyle w:val="NoSpacing"/>
-              <w:cnfStyle w:val="000000000000" w:firstRow="0" w:lastRow="0" w:firstColumn="0" w:lastColumn="0" w:oddVBand="0" w:evenVBand="0" w:oddHBand="0" w:evenHBand="0" w:firstRowFirstColumn="0" w:firstRowLastColumn="0" w:lastRowFirstColumn="0" w:lastRowLastColumn="0"/>
-            </w:pPr>
-            <w:r>
-              <w:t>Prewitt edge operator</w:t>
             </w:r>
           </w:p>
         </w:tc>
@@ -8934,7 +8726,7 @@
               <w:cnfStyle w:val="000000100000" w:firstRow="0" w:lastRow="0" w:firstColumn="0" w:lastColumn="0" w:oddVBand="0" w:evenVBand="0" w:oddHBand="1" w:evenHBand="0" w:firstRowFirstColumn="0" w:firstRowLastColumn="0" w:lastRowFirstColumn="0" w:lastRowLastColumn="0"/>
             </w:pPr>
             <w:r>
-              <w:t>Roberts</w:t>
+              <w:t>Laplacian</w:t>
             </w:r>
           </w:p>
         </w:tc>
@@ -8948,7 +8740,7 @@
               <w:cnfStyle w:val="000000100000" w:firstRow="0" w:lastRow="0" w:firstColumn="0" w:lastColumn="0" w:oddVBand="0" w:evenVBand="0" w:oddHBand="1" w:evenHBand="0" w:firstRowFirstColumn="0" w:firstRowLastColumn="0" w:lastRowFirstColumn="0" w:lastRowLastColumn="0"/>
             </w:pPr>
             <w:r>
-              <w:t>Roberts edge operator</w:t>
+              <w:t>Laplacian of Gaussian detector</w:t>
             </w:r>
           </w:p>
         </w:tc>
@@ -9000,7 +8792,7 @@
               <w:cnfStyle w:val="000000000000" w:firstRow="0" w:lastRow="0" w:firstColumn="0" w:lastColumn="0" w:oddVBand="0" w:evenVBand="0" w:oddHBand="0" w:evenHBand="0" w:firstRowFirstColumn="0" w:firstRowLastColumn="0" w:lastRowFirstColumn="0" w:lastRowLastColumn="0"/>
             </w:pPr>
             <w:r>
-              <w:t>Sobel</w:t>
+              <w:t>Prewitt</w:t>
             </w:r>
           </w:p>
         </w:tc>
@@ -9014,7 +8806,7 @@
               <w:cnfStyle w:val="000000000000" w:firstRow="0" w:lastRow="0" w:firstColumn="0" w:lastColumn="0" w:oddVBand="0" w:evenVBand="0" w:oddHBand="0" w:evenHBand="0" w:firstRowFirstColumn="0" w:firstRowLastColumn="0" w:lastRowFirstColumn="0" w:lastRowLastColumn="0"/>
             </w:pPr>
             <w:r>
-              <w:t>Sobel edge detector</w:t>
+              <w:t>Prewitt edge operator</w:t>
             </w:r>
           </w:p>
         </w:tc>
@@ -9041,7 +8833,7 @@
                 <w:b w:val="0"/>
                 <w:bCs w:val="0"/>
               </w:rPr>
-              <w:t>Histogram</w:t>
+              <w:t>Filter</w:t>
             </w:r>
           </w:p>
         </w:tc>
@@ -9055,7 +8847,7 @@
               <w:cnfStyle w:val="000000100000" w:firstRow="0" w:lastRow="0" w:firstColumn="0" w:lastColumn="0" w:oddVBand="0" w:evenVBand="0" w:oddHBand="1" w:evenHBand="0" w:firstRowFirstColumn="0" w:firstRowLastColumn="0" w:lastRowFirstColumn="0" w:lastRowLastColumn="0"/>
             </w:pPr>
             <w:r>
-              <w:t>Image</w:t>
+              <w:t>Edge</w:t>
             </w:r>
           </w:p>
         </w:tc>
@@ -9069,7 +8861,7 @@
               <w:cnfStyle w:val="000000100000" w:firstRow="0" w:lastRow="0" w:firstColumn="0" w:lastColumn="0" w:oddVBand="0" w:evenVBand="0" w:oddHBand="1" w:evenHBand="0" w:firstRowFirstColumn="0" w:firstRowLastColumn="0" w:lastRowFirstColumn="0" w:lastRowLastColumn="0"/>
             </w:pPr>
             <w:r>
-              <w:t>Create</w:t>
+              <w:t>Roberts</w:t>
             </w:r>
           </w:p>
         </w:tc>
@@ -9083,31 +8875,31 @@
               <w:cnfStyle w:val="000000100000" w:firstRow="0" w:lastRow="0" w:firstColumn="0" w:lastColumn="0" w:oddVBand="0" w:evenVBand="0" w:oddHBand="1" w:evenHBand="0" w:firstRowFirstColumn="0" w:firstRowLastColumn="0" w:lastRowFirstColumn="0" w:lastRowLastColumn="0"/>
             </w:pPr>
             <w:r>
-              <w:t>Histogram pixel value counts for an image</w:t>
-            </w:r>
-          </w:p>
-        </w:tc>
-      </w:tr>
-      <w:tr>
-        <w:tc>
-          <w:tcPr>
-            <w:cnfStyle w:val="001000000000" w:firstRow="0" w:lastRow="0" w:firstColumn="1" w:lastColumn="0" w:oddVBand="0" w:evenVBand="0" w:oddHBand="0" w:evenHBand="0" w:firstRowFirstColumn="0" w:firstRowLastColumn="0" w:lastRowFirstColumn="0" w:lastRowLastColumn="0"/>
-            <w:tcW w:w="0" w:type="auto"/>
-          </w:tcPr>
-          <w:p>
-            <w:pPr>
-              <w:pStyle w:val="NoSpacing"/>
-              <w:rPr>
-                <w:b w:val="0"/>
-                <w:bCs w:val="0"/>
-              </w:rPr>
-            </w:pPr>
-            <w:r>
-              <w:rPr>
-                <w:b w:val="0"/>
-                <w:bCs w:val="0"/>
-              </w:rPr>
-              <w:t>Hough</w:t>
+              <w:t>Roberts edge operator</w:t>
+            </w:r>
+          </w:p>
+        </w:tc>
+      </w:tr>
+      <w:tr>
+        <w:tc>
+          <w:tcPr>
+            <w:cnfStyle w:val="001000000000" w:firstRow="0" w:lastRow="0" w:firstColumn="1" w:lastColumn="0" w:oddVBand="0" w:evenVBand="0" w:oddHBand="0" w:evenHBand="0" w:firstRowFirstColumn="0" w:firstRowLastColumn="0" w:lastRowFirstColumn="0" w:lastRowLastColumn="0"/>
+            <w:tcW w:w="0" w:type="auto"/>
+          </w:tcPr>
+          <w:p>
+            <w:pPr>
+              <w:pStyle w:val="NoSpacing"/>
+              <w:rPr>
+                <w:b w:val="0"/>
+                <w:bCs w:val="0"/>
+              </w:rPr>
+            </w:pPr>
+            <w:r>
+              <w:rPr>
+                <w:b w:val="0"/>
+                <w:bCs w:val="0"/>
+              </w:rPr>
+              <w:t>Filter</w:t>
             </w:r>
           </w:p>
         </w:tc>
@@ -9121,7 +8913,7 @@
               <w:cnfStyle w:val="000000000000" w:firstRow="0" w:lastRow="0" w:firstColumn="0" w:lastColumn="0" w:oddVBand="0" w:evenVBand="0" w:oddHBand="0" w:evenHBand="0" w:firstRowFirstColumn="0" w:firstRowLastColumn="0" w:lastRowFirstColumn="0" w:lastRowLastColumn="0"/>
             </w:pPr>
             <w:r>
-              <w:t>Image</w:t>
+              <w:t>Edge</w:t>
             </w:r>
           </w:p>
         </w:tc>
@@ -9135,7 +8927,7 @@
               <w:cnfStyle w:val="000000000000" w:firstRow="0" w:lastRow="0" w:firstColumn="0" w:lastColumn="0" w:oddVBand="0" w:evenVBand="0" w:oddHBand="0" w:evenHBand="0" w:firstRowFirstColumn="0" w:firstRowLastColumn="0" w:lastRowFirstColumn="0" w:lastRowLastColumn="0"/>
             </w:pPr>
             <w:r>
-              <w:t>Create</w:t>
+              <w:t>Sobel</w:t>
             </w:r>
           </w:p>
         </w:tc>
@@ -9149,7 +8941,7 @@
               <w:cnfStyle w:val="000000000000" w:firstRow="0" w:lastRow="0" w:firstColumn="0" w:lastColumn="0" w:oddVBand="0" w:evenVBand="0" w:oddHBand="0" w:evenHBand="0" w:firstRowFirstColumn="0" w:firstRowLastColumn="0" w:lastRowFirstColumn="0" w:lastRowLastColumn="0"/>
             </w:pPr>
             <w:r>
-              <w:t>Accumulate Hough (rho, theta) counts from an image</w:t>
+              <w:t>Sobel edge operator</w:t>
             </w:r>
           </w:p>
         </w:tc>
@@ -9176,7 +8968,7 @@
                 <w:b w:val="0"/>
                 <w:bCs w:val="0"/>
               </w:rPr>
-              <w:t>Hough</w:t>
+              <w:t>Filter</w:t>
             </w:r>
           </w:p>
         </w:tc>
@@ -9190,7 +8982,7 @@
               <w:cnfStyle w:val="000000100000" w:firstRow="0" w:lastRow="0" w:firstColumn="0" w:lastColumn="0" w:oddVBand="0" w:evenVBand="0" w:oddHBand="1" w:evenHBand="0" w:firstRowFirstColumn="0" w:firstRowLastColumn="0" w:lastRowFirstColumn="0" w:lastRowLastColumn="0"/>
             </w:pPr>
             <w:r>
-              <w:t>Draw</w:t>
+              <w:t>Smooth</w:t>
             </w:r>
           </w:p>
         </w:tc>
@@ -9204,7 +8996,7 @@
               <w:cnfStyle w:val="000000100000" w:firstRow="0" w:lastRow="0" w:firstColumn="0" w:lastColumn="0" w:oddVBand="0" w:evenVBand="0" w:oddHBand="1" w:evenHBand="0" w:firstRowFirstColumn="0" w:firstRowLastColumn="0" w:lastRowFirstColumn="0" w:lastRowLastColumn="0"/>
             </w:pPr>
             <w:r>
-              <w:t>Line</w:t>
+              <w:t>Average</w:t>
             </w:r>
           </w:p>
         </w:tc>
@@ -9218,31 +9010,31 @@
               <w:cnfStyle w:val="000000100000" w:firstRow="0" w:lastRow="0" w:firstColumn="0" w:lastColumn="0" w:oddVBand="0" w:evenVBand="0" w:oddHBand="1" w:evenHBand="0" w:firstRowFirstColumn="0" w:firstRowLastColumn="0" w:lastRowFirstColumn="0" w:lastRowLastColumn="0"/>
             </w:pPr>
             <w:r>
-              <w:t>Draw an image line segment for a polar (rho, theta) line</w:t>
-            </w:r>
-          </w:p>
-        </w:tc>
-      </w:tr>
-      <w:tr>
-        <w:tc>
-          <w:tcPr>
-            <w:cnfStyle w:val="001000000000" w:firstRow="0" w:lastRow="0" w:firstColumn="1" w:lastColumn="0" w:oddVBand="0" w:evenVBand="0" w:oddHBand="0" w:evenHBand="0" w:firstRowFirstColumn="0" w:firstRowLastColumn="0" w:lastRowFirstColumn="0" w:lastRowLastColumn="0"/>
-            <w:tcW w:w="0" w:type="auto"/>
-          </w:tcPr>
-          <w:p>
-            <w:pPr>
-              <w:pStyle w:val="NoSpacing"/>
-              <w:rPr>
-                <w:b w:val="0"/>
-                <w:bCs w:val="0"/>
-              </w:rPr>
-            </w:pPr>
-            <w:r>
-              <w:rPr>
-                <w:b w:val="0"/>
-                <w:bCs w:val="0"/>
-              </w:rPr>
-              <w:t>Hough</w:t>
+              <w:t>Average smoothing operator</w:t>
+            </w:r>
+          </w:p>
+        </w:tc>
+      </w:tr>
+      <w:tr>
+        <w:tc>
+          <w:tcPr>
+            <w:cnfStyle w:val="001000000000" w:firstRow="0" w:lastRow="0" w:firstColumn="1" w:lastColumn="0" w:oddVBand="0" w:evenVBand="0" w:oddHBand="0" w:evenHBand="0" w:firstRowFirstColumn="0" w:firstRowLastColumn="0" w:lastRowFirstColumn="0" w:lastRowLastColumn="0"/>
+            <w:tcW w:w="0" w:type="auto"/>
+          </w:tcPr>
+          <w:p>
+            <w:pPr>
+              <w:pStyle w:val="NoSpacing"/>
+              <w:rPr>
+                <w:b w:val="0"/>
+                <w:bCs w:val="0"/>
+              </w:rPr>
+            </w:pPr>
+            <w:r>
+              <w:rPr>
+                <w:b w:val="0"/>
+                <w:bCs w:val="0"/>
+              </w:rPr>
+              <w:t>Filter</w:t>
             </w:r>
           </w:p>
         </w:tc>
@@ -9256,7 +9048,7 @@
               <w:cnfStyle w:val="000000000000" w:firstRow="0" w:lastRow="0" w:firstColumn="0" w:lastColumn="0" w:oddVBand="0" w:evenVBand="0" w:oddHBand="0" w:evenHBand="0" w:firstRowFirstColumn="0" w:firstRowLastColumn="0" w:lastRowFirstColumn="0" w:lastRowLastColumn="0"/>
             </w:pPr>
             <w:r>
-              <w:t>Peak</w:t>
+              <w:t>Smooth</w:t>
             </w:r>
           </w:p>
         </w:tc>
@@ -9270,7 +9062,7 @@
               <w:cnfStyle w:val="000000000000" w:firstRow="0" w:lastRow="0" w:firstColumn="0" w:lastColumn="0" w:oddVBand="0" w:evenVBand="0" w:oddHBand="0" w:evenHBand="0" w:firstRowFirstColumn="0" w:firstRowLastColumn="0" w:lastRowFirstColumn="0" w:lastRowLastColumn="0"/>
             </w:pPr>
             <w:r>
-              <w:t>Detect</w:t>
+              <w:t>Gaussian</w:t>
             </w:r>
           </w:p>
         </w:tc>
@@ -9284,7 +9076,7 @@
               <w:cnfStyle w:val="000000000000" w:firstRow="0" w:lastRow="0" w:firstColumn="0" w:lastColumn="0" w:oddVBand="0" w:evenVBand="0" w:oddHBand="0" w:evenHBand="0" w:firstRowFirstColumn="0" w:firstRowLastColumn="0" w:lastRowFirstColumn="0" w:lastRowLastColumn="0"/>
             </w:pPr>
             <w:r>
-              <w:t>Find Hough peak lines exceeding a threshold</w:t>
+              <w:t>Gaussian smoothing operator</w:t>
             </w:r>
           </w:p>
         </w:tc>
@@ -9301,6 +9093,473 @@
           <w:p>
             <w:pPr>
               <w:pStyle w:val="NoSpacing"/>
+            </w:pPr>
+            <w:r>
+              <w:rPr>
+                <w:b w:val="0"/>
+                <w:bCs w:val="0"/>
+              </w:rPr>
+              <w:t>Filter</w:t>
+            </w:r>
+          </w:p>
+        </w:tc>
+        <w:tc>
+          <w:tcPr>
+            <w:tcW w:w="0" w:type="auto"/>
+          </w:tcPr>
+          <w:p>
+            <w:pPr>
+              <w:pStyle w:val="NoSpacing"/>
+              <w:cnfStyle w:val="000000100000" w:firstRow="0" w:lastRow="0" w:firstColumn="0" w:lastColumn="0" w:oddVBand="0" w:evenVBand="0" w:oddHBand="1" w:evenHBand="0" w:firstRowFirstColumn="0" w:firstRowLastColumn="0" w:lastRowFirstColumn="0" w:lastRowLastColumn="0"/>
+            </w:pPr>
+            <w:r>
+              <w:t>Smooth</w:t>
+            </w:r>
+          </w:p>
+        </w:tc>
+        <w:tc>
+          <w:tcPr>
+            <w:tcW w:w="0" w:type="auto"/>
+          </w:tcPr>
+          <w:p>
+            <w:pPr>
+              <w:pStyle w:val="NoSpacing"/>
+              <w:cnfStyle w:val="000000100000" w:firstRow="0" w:lastRow="0" w:firstColumn="0" w:lastColumn="0" w:oddVBand="0" w:evenVBand="0" w:oddHBand="1" w:evenHBand="0" w:firstRowFirstColumn="0" w:firstRowLastColumn="0" w:lastRowFirstColumn="0" w:lastRowLastColumn="0"/>
+            </w:pPr>
+            <w:r>
+              <w:t>Median</w:t>
+            </w:r>
+          </w:p>
+        </w:tc>
+        <w:tc>
+          <w:tcPr>
+            <w:tcW w:w="0" w:type="auto"/>
+          </w:tcPr>
+          <w:p>
+            <w:pPr>
+              <w:pStyle w:val="NoSpacing"/>
+              <w:cnfStyle w:val="000000100000" w:firstRow="0" w:lastRow="0" w:firstColumn="0" w:lastColumn="0" w:oddVBand="0" w:evenVBand="0" w:oddHBand="1" w:evenHBand="0" w:firstRowFirstColumn="0" w:firstRowLastColumn="0" w:lastRowFirstColumn="0" w:lastRowLastColumn="0"/>
+            </w:pPr>
+            <w:r>
+              <w:t>Average smoothing operator</w:t>
+            </w:r>
+          </w:p>
+        </w:tc>
+      </w:tr>
+      <w:tr>
+        <w:tc>
+          <w:tcPr>
+            <w:cnfStyle w:val="001000000000" w:firstRow="0" w:lastRow="0" w:firstColumn="1" w:lastColumn="0" w:oddVBand="0" w:evenVBand="0" w:oddHBand="0" w:evenHBand="0" w:firstRowFirstColumn="0" w:firstRowLastColumn="0" w:lastRowFirstColumn="0" w:lastRowLastColumn="0"/>
+            <w:tcW w:w="0" w:type="auto"/>
+          </w:tcPr>
+          <w:p>
+            <w:pPr>
+              <w:pStyle w:val="NoSpacing"/>
+              <w:rPr>
+                <w:b w:val="0"/>
+                <w:bCs w:val="0"/>
+              </w:rPr>
+            </w:pPr>
+            <w:r>
+              <w:rPr>
+                <w:b w:val="0"/>
+                <w:bCs w:val="0"/>
+              </w:rPr>
+              <w:t>Histogram</w:t>
+            </w:r>
+          </w:p>
+        </w:tc>
+        <w:tc>
+          <w:tcPr>
+            <w:tcW w:w="0" w:type="auto"/>
+          </w:tcPr>
+          <w:p>
+            <w:pPr>
+              <w:pStyle w:val="NoSpacing"/>
+              <w:cnfStyle w:val="000000000000" w:firstRow="0" w:lastRow="0" w:firstColumn="0" w:lastColumn="0" w:oddVBand="0" w:evenVBand="0" w:oddHBand="0" w:evenHBand="0" w:firstRowFirstColumn="0" w:firstRowLastColumn="0" w:lastRowFirstColumn="0" w:lastRowLastColumn="0"/>
+            </w:pPr>
+            <w:r>
+              <w:t>Hough</w:t>
+            </w:r>
+          </w:p>
+        </w:tc>
+        <w:tc>
+          <w:tcPr>
+            <w:tcW w:w="0" w:type="auto"/>
+          </w:tcPr>
+          <w:p>
+            <w:pPr>
+              <w:pStyle w:val="NoSpacing"/>
+              <w:cnfStyle w:val="000000000000" w:firstRow="0" w:lastRow="0" w:firstColumn="0" w:lastColumn="0" w:oddVBand="0" w:evenVBand="0" w:oddHBand="0" w:evenHBand="0" w:firstRowFirstColumn="0" w:firstRowLastColumn="0" w:lastRowFirstColumn="0" w:lastRowLastColumn="0"/>
+            </w:pPr>
+            <w:r>
+              <w:t>Create</w:t>
+            </w:r>
+          </w:p>
+        </w:tc>
+        <w:tc>
+          <w:tcPr>
+            <w:tcW w:w="0" w:type="auto"/>
+          </w:tcPr>
+          <w:p>
+            <w:pPr>
+              <w:pStyle w:val="NoSpacing"/>
+              <w:cnfStyle w:val="000000000000" w:firstRow="0" w:lastRow="0" w:firstColumn="0" w:lastColumn="0" w:oddVBand="0" w:evenVBand="0" w:oddHBand="0" w:evenHBand="0" w:firstRowFirstColumn="0" w:firstRowLastColumn="0" w:lastRowFirstColumn="0" w:lastRowLastColumn="0"/>
+            </w:pPr>
+            <w:r>
+              <w:t>Histogram Hough accumulator counts</w:t>
+            </w:r>
+          </w:p>
+        </w:tc>
+      </w:tr>
+      <w:tr>
+        <w:trPr>
+          <w:cnfStyle w:val="000000100000" w:firstRow="0" w:lastRow="0" w:firstColumn="0" w:lastColumn="0" w:oddVBand="0" w:evenVBand="0" w:oddHBand="1" w:evenHBand="0" w:firstRowFirstColumn="0" w:firstRowLastColumn="0" w:lastRowFirstColumn="0" w:lastRowLastColumn="0"/>
+        </w:trPr>
+        <w:tc>
+          <w:tcPr>
+            <w:cnfStyle w:val="001000000000" w:firstRow="0" w:lastRow="0" w:firstColumn="1" w:lastColumn="0" w:oddVBand="0" w:evenVBand="0" w:oddHBand="0" w:evenHBand="0" w:firstRowFirstColumn="0" w:firstRowLastColumn="0" w:lastRowFirstColumn="0" w:lastRowLastColumn="0"/>
+            <w:tcW w:w="0" w:type="auto"/>
+          </w:tcPr>
+          <w:p>
+            <w:pPr>
+              <w:pStyle w:val="NoSpacing"/>
+              <w:rPr>
+                <w:b w:val="0"/>
+                <w:bCs w:val="0"/>
+              </w:rPr>
+            </w:pPr>
+            <w:r>
+              <w:rPr>
+                <w:b w:val="0"/>
+                <w:bCs w:val="0"/>
+              </w:rPr>
+              <w:t>Histogram</w:t>
+            </w:r>
+          </w:p>
+        </w:tc>
+        <w:tc>
+          <w:tcPr>
+            <w:tcW w:w="0" w:type="auto"/>
+          </w:tcPr>
+          <w:p>
+            <w:pPr>
+              <w:pStyle w:val="NoSpacing"/>
+              <w:cnfStyle w:val="000000100000" w:firstRow="0" w:lastRow="0" w:firstColumn="0" w:lastColumn="0" w:oddVBand="0" w:evenVBand="0" w:oddHBand="1" w:evenHBand="0" w:firstRowFirstColumn="0" w:firstRowLastColumn="0" w:lastRowFirstColumn="0" w:lastRowLastColumn="0"/>
+            </w:pPr>
+            <w:r>
+              <w:t>Image</w:t>
+            </w:r>
+          </w:p>
+        </w:tc>
+        <w:tc>
+          <w:tcPr>
+            <w:tcW w:w="0" w:type="auto"/>
+          </w:tcPr>
+          <w:p>
+            <w:pPr>
+              <w:pStyle w:val="NoSpacing"/>
+              <w:cnfStyle w:val="000000100000" w:firstRow="0" w:lastRow="0" w:firstColumn="0" w:lastColumn="0" w:oddVBand="0" w:evenVBand="0" w:oddHBand="1" w:evenHBand="0" w:firstRowFirstColumn="0" w:firstRowLastColumn="0" w:lastRowFirstColumn="0" w:lastRowLastColumn="0"/>
+            </w:pPr>
+            <w:r>
+              <w:t>Create</w:t>
+            </w:r>
+          </w:p>
+        </w:tc>
+        <w:tc>
+          <w:tcPr>
+            <w:tcW w:w="0" w:type="auto"/>
+          </w:tcPr>
+          <w:p>
+            <w:pPr>
+              <w:pStyle w:val="NoSpacing"/>
+              <w:cnfStyle w:val="000000100000" w:firstRow="0" w:lastRow="0" w:firstColumn="0" w:lastColumn="0" w:oddVBand="0" w:evenVBand="0" w:oddHBand="1" w:evenHBand="0" w:firstRowFirstColumn="0" w:firstRowLastColumn="0" w:lastRowFirstColumn="0" w:lastRowLastColumn="0"/>
+            </w:pPr>
+            <w:r>
+              <w:t>Histogram pixel value counts for an image</w:t>
+            </w:r>
+          </w:p>
+        </w:tc>
+      </w:tr>
+      <w:tr>
+        <w:tc>
+          <w:tcPr>
+            <w:cnfStyle w:val="001000000000" w:firstRow="0" w:lastRow="0" w:firstColumn="1" w:lastColumn="0" w:oddVBand="0" w:evenVBand="0" w:oddHBand="0" w:evenHBand="0" w:firstRowFirstColumn="0" w:firstRowLastColumn="0" w:lastRowFirstColumn="0" w:lastRowLastColumn="0"/>
+            <w:tcW w:w="0" w:type="auto"/>
+          </w:tcPr>
+          <w:p>
+            <w:pPr>
+              <w:pStyle w:val="NoSpacing"/>
+              <w:rPr>
+                <w:b w:val="0"/>
+                <w:bCs w:val="0"/>
+              </w:rPr>
+            </w:pPr>
+            <w:r>
+              <w:rPr>
+                <w:b w:val="0"/>
+                <w:bCs w:val="0"/>
+              </w:rPr>
+              <w:t>Histogram</w:t>
+            </w:r>
+          </w:p>
+        </w:tc>
+        <w:tc>
+          <w:tcPr>
+            <w:tcW w:w="0" w:type="auto"/>
+          </w:tcPr>
+          <w:p>
+            <w:pPr>
+              <w:pStyle w:val="NoSpacing"/>
+              <w:cnfStyle w:val="000000000000" w:firstRow="0" w:lastRow="0" w:firstColumn="0" w:lastColumn="0" w:oddVBand="0" w:evenVBand="0" w:oddHBand="0" w:evenHBand="0" w:firstRowFirstColumn="0" w:firstRowLastColumn="0" w:lastRowFirstColumn="0" w:lastRowLastColumn="0"/>
+            </w:pPr>
+            <w:r>
+              <w:t>Peak</w:t>
+            </w:r>
+          </w:p>
+        </w:tc>
+        <w:tc>
+          <w:tcPr>
+            <w:tcW w:w="0" w:type="auto"/>
+          </w:tcPr>
+          <w:p>
+            <w:pPr>
+              <w:pStyle w:val="NoSpacing"/>
+              <w:cnfStyle w:val="000000000000" w:firstRow="0" w:lastRow="0" w:firstColumn="0" w:lastColumn="0" w:oddVBand="0" w:evenVBand="0" w:oddHBand="0" w:evenHBand="0" w:firstRowFirstColumn="0" w:firstRowLastColumn="0" w:lastRowFirstColumn="0" w:lastRowLastColumn="0"/>
+            </w:pPr>
+            <w:r>
+              <w:t>Detect</w:t>
+            </w:r>
+          </w:p>
+        </w:tc>
+        <w:tc>
+          <w:tcPr>
+            <w:tcW w:w="0" w:type="auto"/>
+          </w:tcPr>
+          <w:p>
+            <w:pPr>
+              <w:pStyle w:val="NoSpacing"/>
+              <w:cnfStyle w:val="000000000000" w:firstRow="0" w:lastRow="0" w:firstColumn="0" w:lastColumn="0" w:oddVBand="0" w:evenVBand="0" w:oddHBand="0" w:evenHBand="0" w:firstRowFirstColumn="0" w:firstRowLastColumn="0" w:lastRowFirstColumn="0" w:lastRowLastColumn="0"/>
+            </w:pPr>
+            <w:r>
+              <w:t>Find histogram peaks exceeding a threshold</w:t>
+            </w:r>
+          </w:p>
+        </w:tc>
+      </w:tr>
+      <w:tr>
+        <w:trPr>
+          <w:cnfStyle w:val="000000100000" w:firstRow="0" w:lastRow="0" w:firstColumn="0" w:lastColumn="0" w:oddVBand="0" w:evenVBand="0" w:oddHBand="1" w:evenHBand="0" w:firstRowFirstColumn="0" w:firstRowLastColumn="0" w:lastRowFirstColumn="0" w:lastRowLastColumn="0"/>
+        </w:trPr>
+        <w:tc>
+          <w:tcPr>
+            <w:cnfStyle w:val="001000000000" w:firstRow="0" w:lastRow="0" w:firstColumn="1" w:lastColumn="0" w:oddVBand="0" w:evenVBand="0" w:oddHBand="0" w:evenHBand="0" w:firstRowFirstColumn="0" w:firstRowLastColumn="0" w:lastRowFirstColumn="0" w:lastRowLastColumn="0"/>
+            <w:tcW w:w="0" w:type="auto"/>
+          </w:tcPr>
+          <w:p>
+            <w:pPr>
+              <w:pStyle w:val="NoSpacing"/>
+              <w:rPr>
+                <w:b w:val="0"/>
+                <w:bCs w:val="0"/>
+              </w:rPr>
+            </w:pPr>
+            <w:r>
+              <w:rPr>
+                <w:b w:val="0"/>
+                <w:bCs w:val="0"/>
+              </w:rPr>
+              <w:t>Hough</w:t>
+            </w:r>
+          </w:p>
+        </w:tc>
+        <w:tc>
+          <w:tcPr>
+            <w:tcW w:w="0" w:type="auto"/>
+          </w:tcPr>
+          <w:p>
+            <w:pPr>
+              <w:pStyle w:val="NoSpacing"/>
+              <w:cnfStyle w:val="000000100000" w:firstRow="0" w:lastRow="0" w:firstColumn="0" w:lastColumn="0" w:oddVBand="0" w:evenVBand="0" w:oddHBand="1" w:evenHBand="0" w:firstRowFirstColumn="0" w:firstRowLastColumn="0" w:lastRowFirstColumn="0" w:lastRowLastColumn="0"/>
+            </w:pPr>
+            <w:r>
+              <w:t>Draw</w:t>
+            </w:r>
+          </w:p>
+        </w:tc>
+        <w:tc>
+          <w:tcPr>
+            <w:tcW w:w="0" w:type="auto"/>
+          </w:tcPr>
+          <w:p>
+            <w:pPr>
+              <w:pStyle w:val="NoSpacing"/>
+              <w:cnfStyle w:val="000000100000" w:firstRow="0" w:lastRow="0" w:firstColumn="0" w:lastColumn="0" w:oddVBand="0" w:evenVBand="0" w:oddHBand="1" w:evenHBand="0" w:firstRowFirstColumn="0" w:firstRowLastColumn="0" w:lastRowFirstColumn="0" w:lastRowLastColumn="0"/>
+            </w:pPr>
+            <w:r>
+              <w:t>Line</w:t>
+            </w:r>
+          </w:p>
+        </w:tc>
+        <w:tc>
+          <w:tcPr>
+            <w:tcW w:w="0" w:type="auto"/>
+          </w:tcPr>
+          <w:p>
+            <w:pPr>
+              <w:pStyle w:val="NoSpacing"/>
+              <w:cnfStyle w:val="000000100000" w:firstRow="0" w:lastRow="0" w:firstColumn="0" w:lastColumn="0" w:oddVBand="0" w:evenVBand="0" w:oddHBand="1" w:evenHBand="0" w:firstRowFirstColumn="0" w:firstRowLastColumn="0" w:lastRowFirstColumn="0" w:lastRowLastColumn="0"/>
+            </w:pPr>
+            <w:r>
+              <w:t>Draw an image line segment for a polar (rho, theta) line</w:t>
+            </w:r>
+          </w:p>
+        </w:tc>
+      </w:tr>
+      <w:tr>
+        <w:tc>
+          <w:tcPr>
+            <w:cnfStyle w:val="001000000000" w:firstRow="0" w:lastRow="0" w:firstColumn="1" w:lastColumn="0" w:oddVBand="0" w:evenVBand="0" w:oddHBand="0" w:evenHBand="0" w:firstRowFirstColumn="0" w:firstRowLastColumn="0" w:lastRowFirstColumn="0" w:lastRowLastColumn="0"/>
+            <w:tcW w:w="0" w:type="auto"/>
+          </w:tcPr>
+          <w:p>
+            <w:pPr>
+              <w:pStyle w:val="NoSpacing"/>
+              <w:rPr>
+                <w:b w:val="0"/>
+                <w:bCs w:val="0"/>
+              </w:rPr>
+            </w:pPr>
+            <w:r>
+              <w:rPr>
+                <w:b w:val="0"/>
+                <w:bCs w:val="0"/>
+              </w:rPr>
+              <w:t>Hough</w:t>
+            </w:r>
+          </w:p>
+        </w:tc>
+        <w:tc>
+          <w:tcPr>
+            <w:tcW w:w="0" w:type="auto"/>
+          </w:tcPr>
+          <w:p>
+            <w:pPr>
+              <w:pStyle w:val="NoSpacing"/>
+              <w:cnfStyle w:val="000000000000" w:firstRow="0" w:lastRow="0" w:firstColumn="0" w:lastColumn="0" w:oddVBand="0" w:evenVBand="0" w:oddHBand="0" w:evenHBand="0" w:firstRowFirstColumn="0" w:firstRowLastColumn="0" w:lastRowFirstColumn="0" w:lastRowLastColumn="0"/>
+            </w:pPr>
+            <w:r>
+              <w:t>Image</w:t>
+            </w:r>
+          </w:p>
+        </w:tc>
+        <w:tc>
+          <w:tcPr>
+            <w:tcW w:w="0" w:type="auto"/>
+          </w:tcPr>
+          <w:p>
+            <w:pPr>
+              <w:pStyle w:val="NoSpacing"/>
+              <w:cnfStyle w:val="000000000000" w:firstRow="0" w:lastRow="0" w:firstColumn="0" w:lastColumn="0" w:oddVBand="0" w:evenVBand="0" w:oddHBand="0" w:evenHBand="0" w:firstRowFirstColumn="0" w:firstRowLastColumn="0" w:lastRowFirstColumn="0" w:lastRowLastColumn="0"/>
+            </w:pPr>
+            <w:r>
+              <w:t>Create</w:t>
+            </w:r>
+          </w:p>
+        </w:tc>
+        <w:tc>
+          <w:tcPr>
+            <w:tcW w:w="0" w:type="auto"/>
+          </w:tcPr>
+          <w:p>
+            <w:pPr>
+              <w:pStyle w:val="NoSpacing"/>
+              <w:cnfStyle w:val="000000000000" w:firstRow="0" w:lastRow="0" w:firstColumn="0" w:lastColumn="0" w:oddVBand="0" w:evenVBand="0" w:oddHBand="0" w:evenHBand="0" w:firstRowFirstColumn="0" w:firstRowLastColumn="0" w:lastRowFirstColumn="0" w:lastRowLastColumn="0"/>
+            </w:pPr>
+            <w:r>
+              <w:t>Accumulate Hough (rho, theta) counts from an image</w:t>
+            </w:r>
+          </w:p>
+        </w:tc>
+      </w:tr>
+      <w:tr>
+        <w:trPr>
+          <w:cnfStyle w:val="000000100000" w:firstRow="0" w:lastRow="0" w:firstColumn="0" w:lastColumn="0" w:oddVBand="0" w:evenVBand="0" w:oddHBand="1" w:evenHBand="0" w:firstRowFirstColumn="0" w:firstRowLastColumn="0" w:lastRowFirstColumn="0" w:lastRowLastColumn="0"/>
+        </w:trPr>
+        <w:tc>
+          <w:tcPr>
+            <w:cnfStyle w:val="001000000000" w:firstRow="0" w:lastRow="0" w:firstColumn="1" w:lastColumn="0" w:oddVBand="0" w:evenVBand="0" w:oddHBand="0" w:evenHBand="0" w:firstRowFirstColumn="0" w:firstRowLastColumn="0" w:lastRowFirstColumn="0" w:lastRowLastColumn="0"/>
+            <w:tcW w:w="0" w:type="auto"/>
+          </w:tcPr>
+          <w:p>
+            <w:pPr>
+              <w:pStyle w:val="NoSpacing"/>
+              <w:rPr>
+                <w:b w:val="0"/>
+                <w:bCs w:val="0"/>
+              </w:rPr>
+            </w:pPr>
+            <w:r>
+              <w:rPr>
+                <w:b w:val="0"/>
+                <w:bCs w:val="0"/>
+              </w:rPr>
+              <w:t>Hough</w:t>
+            </w:r>
+          </w:p>
+        </w:tc>
+        <w:tc>
+          <w:tcPr>
+            <w:tcW w:w="0" w:type="auto"/>
+          </w:tcPr>
+          <w:p>
+            <w:pPr>
+              <w:pStyle w:val="NoSpacing"/>
+              <w:cnfStyle w:val="000000100000" w:firstRow="0" w:lastRow="0" w:firstColumn="0" w:lastColumn="0" w:oddVBand="0" w:evenVBand="0" w:oddHBand="1" w:evenHBand="0" w:firstRowFirstColumn="0" w:firstRowLastColumn="0" w:lastRowFirstColumn="0" w:lastRowLastColumn="0"/>
+            </w:pPr>
+            <w:r>
+              <w:t>Peak</w:t>
+            </w:r>
+          </w:p>
+        </w:tc>
+        <w:tc>
+          <w:tcPr>
+            <w:tcW w:w="0" w:type="auto"/>
+          </w:tcPr>
+          <w:p>
+            <w:pPr>
+              <w:pStyle w:val="NoSpacing"/>
+              <w:cnfStyle w:val="000000100000" w:firstRow="0" w:lastRow="0" w:firstColumn="0" w:lastColumn="0" w:oddVBand="0" w:evenVBand="0" w:oddHBand="1" w:evenHBand="0" w:firstRowFirstColumn="0" w:firstRowLastColumn="0" w:lastRowFirstColumn="0" w:lastRowLastColumn="0"/>
+            </w:pPr>
+            <w:r>
+              <w:t>Detect</w:t>
+            </w:r>
+          </w:p>
+        </w:tc>
+        <w:tc>
+          <w:tcPr>
+            <w:tcW w:w="0" w:type="auto"/>
+          </w:tcPr>
+          <w:p>
+            <w:pPr>
+              <w:pStyle w:val="NoSpacing"/>
+              <w:cnfStyle w:val="000000100000" w:firstRow="0" w:lastRow="0" w:firstColumn="0" w:lastColumn="0" w:oddVBand="0" w:evenVBand="0" w:oddHBand="1" w:evenHBand="0" w:firstRowFirstColumn="0" w:firstRowLastColumn="0" w:lastRowFirstColumn="0" w:lastRowLastColumn="0"/>
+            </w:pPr>
+            <w:r>
+              <w:t>Find Hough peak lines exceeding a threshold</w:t>
+            </w:r>
+          </w:p>
+        </w:tc>
+      </w:tr>
+      <w:tr>
+        <w:tc>
+          <w:tcPr>
+            <w:cnfStyle w:val="001000000000" w:firstRow="0" w:lastRow="0" w:firstColumn="1" w:lastColumn="0" w:oddVBand="0" w:evenVBand="0" w:oddHBand="0" w:evenHBand="0" w:firstRowFirstColumn="0" w:firstRowLastColumn="0" w:lastRowFirstColumn="0" w:lastRowLastColumn="0"/>
+            <w:tcW w:w="0" w:type="auto"/>
+          </w:tcPr>
+          <w:p>
+            <w:pPr>
+              <w:pStyle w:val="NoSpacing"/>
               <w:rPr>
                 <w:b w:val="0"/>
                 <w:bCs w:val="0"/>
@@ -9322,6 +9581,75 @@
           <w:p>
             <w:pPr>
               <w:pStyle w:val="NoSpacing"/>
+              <w:cnfStyle w:val="000000000000" w:firstRow="0" w:lastRow="0" w:firstColumn="0" w:lastColumn="0" w:oddVBand="0" w:evenVBand="0" w:oddHBand="0" w:evenHBand="0" w:firstRowFirstColumn="0" w:firstRowLastColumn="0" w:lastRowFirstColumn="0" w:lastRowLastColumn="0"/>
+            </w:pPr>
+            <w:r>
+              <w:t>Image</w:t>
+            </w:r>
+          </w:p>
+        </w:tc>
+        <w:tc>
+          <w:tcPr>
+            <w:tcW w:w="0" w:type="auto"/>
+          </w:tcPr>
+          <w:p>
+            <w:pPr>
+              <w:pStyle w:val="NoSpacing"/>
+              <w:cnfStyle w:val="000000000000" w:firstRow="0" w:lastRow="0" w:firstColumn="0" w:lastColumn="0" w:oddVBand="0" w:evenVBand="0" w:oddHBand="0" w:evenHBand="0" w:firstRowFirstColumn="0" w:firstRowLastColumn="0" w:lastRowFirstColumn="0" w:lastRowLastColumn="0"/>
+            </w:pPr>
+            <w:r>
+              <w:t>Copy</w:t>
+            </w:r>
+          </w:p>
+        </w:tc>
+        <w:tc>
+          <w:tcPr>
+            <w:tcW w:w="0" w:type="auto"/>
+          </w:tcPr>
+          <w:p>
+            <w:pPr>
+              <w:pStyle w:val="NoSpacing"/>
+              <w:cnfStyle w:val="000000000000" w:firstRow="0" w:lastRow="0" w:firstColumn="0" w:lastColumn="0" w:oddVBand="0" w:evenVBand="0" w:oddHBand="0" w:evenHBand="0" w:firstRowFirstColumn="0" w:firstRowLastColumn="0" w:lastRowFirstColumn="0" w:lastRowLastColumn="0"/>
+            </w:pPr>
+            <w:r>
+              <w:t>Copy image data and components from input to output images</w:t>
+            </w:r>
+          </w:p>
+        </w:tc>
+      </w:tr>
+      <w:tr>
+        <w:trPr>
+          <w:cnfStyle w:val="000000100000" w:firstRow="0" w:lastRow="0" w:firstColumn="0" w:lastColumn="0" w:oddVBand="0" w:evenVBand="0" w:oddHBand="1" w:evenHBand="0" w:firstRowFirstColumn="0" w:firstRowLastColumn="0" w:lastRowFirstColumn="0" w:lastRowLastColumn="0"/>
+        </w:trPr>
+        <w:tc>
+          <w:tcPr>
+            <w:cnfStyle w:val="001000000000" w:firstRow="0" w:lastRow="0" w:firstColumn="1" w:lastColumn="0" w:oddVBand="0" w:evenVBand="0" w:oddHBand="0" w:evenHBand="0" w:firstRowFirstColumn="0" w:firstRowLastColumn="0" w:lastRowFirstColumn="0" w:lastRowLastColumn="0"/>
+            <w:tcW w:w="0" w:type="auto"/>
+          </w:tcPr>
+          <w:p>
+            <w:pPr>
+              <w:pStyle w:val="NoSpacing"/>
+              <w:rPr>
+                <w:b w:val="0"/>
+                <w:bCs w:val="0"/>
+              </w:rPr>
+            </w:pPr>
+            <w:r>
+              <w:rPr>
+                <w:b w:val="0"/>
+                <w:bCs w:val="0"/>
+              </w:rPr>
+              <w:t>Transform</w:t>
+            </w:r>
+          </w:p>
+        </w:tc>
+        <w:tc>
+          <w:tcPr>
+            <w:tcW w:w="0" w:type="auto"/>
+          </w:tcPr>
+          <w:p>
+            <w:pPr>
+              <w:pStyle w:val="NoSpacing"/>
               <w:cnfStyle w:val="000000100000" w:firstRow="0" w:lastRow="0" w:firstColumn="0" w:lastColumn="0" w:oddVBand="0" w:evenVBand="0" w:oddHBand="1" w:evenHBand="0" w:firstRowFirstColumn="0" w:firstRowLastColumn="0" w:lastRowFirstColumn="0" w:lastRowLastColumn="0"/>
             </w:pPr>
             <w:r>
@@ -9339,7 +9667,7 @@
               <w:cnfStyle w:val="000000100000" w:firstRow="0" w:lastRow="0" w:firstColumn="0" w:lastColumn="0" w:oddVBand="0" w:evenVBand="0" w:oddHBand="1" w:evenHBand="0" w:firstRowFirstColumn="0" w:firstRowLastColumn="0" w:lastRowFirstColumn="0" w:lastRowLastColumn="0"/>
             </w:pPr>
             <w:r>
-              <w:t>Copy</w:t>
+              <w:t>Morphology</w:t>
             </w:r>
           </w:p>
         </w:tc>
@@ -9353,7 +9681,7 @@
               <w:cnfStyle w:val="000000100000" w:firstRow="0" w:lastRow="0" w:firstColumn="0" w:lastColumn="0" w:oddVBand="0" w:evenVBand="0" w:oddHBand="1" w:evenHBand="0" w:firstRowFirstColumn="0" w:firstRowLastColumn="0" w:lastRowFirstColumn="0" w:lastRowLastColumn="0"/>
             </w:pPr>
             <w:r>
-              <w:t>Copy image data and components from input to output images</w:t>
+              <w:t>Map binary images with dilate, erode, open, close, gradient, top hat, or black at morphology transforms.</w:t>
             </w:r>
           </w:p>
         </w:tc>
@@ -9425,6 +9753,341 @@
         </w:tc>
       </w:tr>
     </w:tbl>
+    <w:p>
+      <w:pPr>
+        <w:pStyle w:val="Normalafterlist"/>
+      </w:pPr>
+      <w:r>
+        <w:t>Typical use cases are:</w:t>
+      </w:r>
+    </w:p>
+    <w:tbl>
+      <w:tblPr>
+        <w:tblStyle w:val="PlainTable1"/>
+        <w:tblW w:w="0" w:type="auto"/>
+        <w:tblLook w:val="04A0" w:firstRow="1" w:lastRow="0" w:firstColumn="1" w:lastColumn="0" w:noHBand="0" w:noVBand="1"/>
+      </w:tblPr>
+      <w:tblGrid>
+        <w:gridCol w:w="1207"/>
+        <w:gridCol w:w="1794"/>
+        <w:gridCol w:w="5796"/>
+      </w:tblGrid>
+      <w:tr>
+        <w:trPr>
+          <w:cnfStyle w:val="100000000000" w:firstRow="1" w:lastRow="0" w:firstColumn="0" w:lastColumn="0" w:oddVBand="0" w:evenVBand="0" w:oddHBand="0" w:evenHBand="0" w:firstRowFirstColumn="0" w:firstRowLastColumn="0" w:lastRowFirstColumn="0" w:lastRowLastColumn="0"/>
+        </w:trPr>
+        <w:tc>
+          <w:tcPr>
+            <w:cnfStyle w:val="001000000000" w:firstRow="0" w:lastRow="0" w:firstColumn="1" w:lastColumn="0" w:oddVBand="0" w:evenVBand="0" w:oddHBand="0" w:evenHBand="0" w:firstRowFirstColumn="0" w:firstRowLastColumn="0" w:lastRowFirstColumn="0" w:lastRowLastColumn="0"/>
+            <w:tcW w:w="0" w:type="auto"/>
+          </w:tcPr>
+          <w:p>
+            <w:pPr>
+              <w:pStyle w:val="NoSpacing"/>
+            </w:pPr>
+            <w:r>
+              <w:t>Data type</w:t>
+            </w:r>
+          </w:p>
+        </w:tc>
+        <w:tc>
+          <w:tcPr>
+            <w:tcW w:w="0" w:type="auto"/>
+          </w:tcPr>
+          <w:p>
+            <w:pPr>
+              <w:pStyle w:val="NoSpacing"/>
+              <w:cnfStyle w:val="100000000000" w:firstRow="1" w:lastRow="0" w:firstColumn="0" w:lastColumn="0" w:oddVBand="0" w:evenVBand="0" w:oddHBand="0" w:evenHBand="0" w:firstRowFirstColumn="0" w:firstRowLastColumn="0" w:lastRowFirstColumn="0" w:lastRowLastColumn="0"/>
+            </w:pPr>
+            <w:r>
+              <w:t>Use</w:t>
+            </w:r>
+          </w:p>
+        </w:tc>
+        <w:tc>
+          <w:tcPr>
+            <w:tcW w:w="0" w:type="auto"/>
+          </w:tcPr>
+          <w:p>
+            <w:pPr>
+              <w:pStyle w:val="NoSpacing"/>
+              <w:cnfStyle w:val="100000000000" w:firstRow="1" w:lastRow="0" w:firstColumn="0" w:lastColumn="0" w:oddVBand="0" w:evenVBand="0" w:oddHBand="0" w:evenHBand="0" w:firstRowFirstColumn="0" w:firstRowLastColumn="0" w:lastRowFirstColumn="0" w:lastRowLastColumn="0"/>
+            </w:pPr>
+            <w:r>
+              <w:t>Steps</w:t>
+            </w:r>
+          </w:p>
+        </w:tc>
+      </w:tr>
+      <w:tr>
+        <w:trPr>
+          <w:cnfStyle w:val="000000100000" w:firstRow="0" w:lastRow="0" w:firstColumn="0" w:lastColumn="0" w:oddVBand="0" w:evenVBand="0" w:oddHBand="1" w:evenHBand="0" w:firstRowFirstColumn="0" w:firstRowLastColumn="0" w:lastRowFirstColumn="0" w:lastRowLastColumn="0"/>
+        </w:trPr>
+        <w:tc>
+          <w:tcPr>
+            <w:cnfStyle w:val="001000000000" w:firstRow="0" w:lastRow="0" w:firstColumn="1" w:lastColumn="0" w:oddVBand="0" w:evenVBand="0" w:oddHBand="0" w:evenHBand="0" w:firstRowFirstColumn="0" w:firstRowLastColumn="0" w:lastRowFirstColumn="0" w:lastRowLastColumn="0"/>
+            <w:tcW w:w="0" w:type="auto"/>
+          </w:tcPr>
+          <w:p>
+            <w:pPr>
+              <w:pStyle w:val="NoSpacing"/>
+            </w:pPr>
+            <w:r>
+              <w:t>Image</w:t>
+            </w:r>
+          </w:p>
+        </w:tc>
+        <w:tc>
+          <w:tcPr>
+            <w:tcW w:w="0" w:type="auto"/>
+          </w:tcPr>
+          <w:p>
+            <w:pPr>
+              <w:pStyle w:val="NoSpacing"/>
+              <w:cnfStyle w:val="000000100000" w:firstRow="0" w:lastRow="0" w:firstColumn="0" w:lastColumn="0" w:oddVBand="0" w:evenVBand="0" w:oddHBand="1" w:evenHBand="0" w:firstRowFirstColumn="0" w:firstRowLastColumn="0" w:lastRowFirstColumn="0" w:lastRowLastColumn="0"/>
+            </w:pPr>
+            <w:r>
+              <w:t>Generate edges</w:t>
+            </w:r>
+          </w:p>
+        </w:tc>
+        <w:tc>
+          <w:tcPr>
+            <w:tcW w:w="0" w:type="auto"/>
+          </w:tcPr>
+          <w:p>
+            <w:pPr>
+              <w:pStyle w:val="tablebullet"/>
+              <w:cnfStyle w:val="000000100000" w:firstRow="0" w:lastRow="0" w:firstColumn="0" w:lastColumn="0" w:oddVBand="0" w:evenVBand="0" w:oddHBand="1" w:evenHBand="0" w:firstRowFirstColumn="0" w:firstRowLastColumn="0" w:lastRowFirstColumn="0" w:lastRowLastColumn="0"/>
+              <w:rPr>
+                <w:sz w:val="20"/>
+                <w:szCs w:val="20"/>
+              </w:rPr>
+            </w:pPr>
+            <w:r>
+              <w:rPr>
+                <w:sz w:val="20"/>
+                <w:szCs w:val="20"/>
+              </w:rPr>
+              <w:t>edge filter image</w:t>
+            </w:r>
+          </w:p>
+          <w:p>
+            <w:pPr>
+              <w:pStyle w:val="tablebullet"/>
+              <w:cnfStyle w:val="000000100000" w:firstRow="0" w:lastRow="0" w:firstColumn="0" w:lastColumn="0" w:oddVBand="0" w:evenVBand="0" w:oddHBand="1" w:evenHBand="0" w:firstRowFirstColumn="0" w:firstRowLastColumn="0" w:lastRowFirstColumn="0" w:lastRowLastColumn="0"/>
+              <w:rPr>
+                <w:sz w:val="20"/>
+                <w:szCs w:val="20"/>
+              </w:rPr>
+            </w:pPr>
+            <w:r>
+              <w:rPr>
+                <w:sz w:val="20"/>
+                <w:szCs w:val="20"/>
+              </w:rPr>
+              <w:t>get image histogram and statistics</w:t>
+            </w:r>
+          </w:p>
+          <w:p>
+            <w:pPr>
+              <w:pStyle w:val="tablebullet"/>
+              <w:cnfStyle w:val="000000100000" w:firstRow="0" w:lastRow="0" w:firstColumn="0" w:lastColumn="0" w:oddVBand="0" w:evenVBand="0" w:oddHBand="1" w:evenHBand="0" w:firstRowFirstColumn="0" w:firstRowLastColumn="0" w:lastRowFirstColumn="0" w:lastRowLastColumn="0"/>
+              <w:rPr>
+                <w:sz w:val="20"/>
+                <w:szCs w:val="20"/>
+              </w:rPr>
+            </w:pPr>
+            <w:r>
+              <w:rPr>
+                <w:sz w:val="20"/>
+                <w:szCs w:val="20"/>
+              </w:rPr>
+              <w:t>analyze histogram and statistics to get edge thresholds</w:t>
+            </w:r>
+          </w:p>
+          <w:p>
+            <w:pPr>
+              <w:pStyle w:val="tablebullet"/>
+              <w:cnfStyle w:val="000000100000" w:firstRow="0" w:lastRow="0" w:firstColumn="0" w:lastColumn="0" w:oddVBand="0" w:evenVBand="0" w:oddHBand="1" w:evenHBand="0" w:firstRowFirstColumn="0" w:firstRowLastColumn="0" w:lastRowFirstColumn="0" w:lastRowLastColumn="0"/>
+              <w:rPr>
+                <w:sz w:val="20"/>
+                <w:szCs w:val="20"/>
+              </w:rPr>
+            </w:pPr>
+            <w:r>
+              <w:rPr>
+                <w:sz w:val="20"/>
+                <w:szCs w:val="20"/>
+              </w:rPr>
+              <w:t>select edges</w:t>
+            </w:r>
+          </w:p>
+          <w:p>
+            <w:pPr>
+              <w:pStyle w:val="tablebullet"/>
+              <w:cnfStyle w:val="000000100000" w:firstRow="0" w:lastRow="0" w:firstColumn="0" w:lastColumn="0" w:oddVBand="0" w:evenVBand="0" w:oddHBand="1" w:evenHBand="0" w:firstRowFirstColumn="0" w:firstRowLastColumn="0" w:lastRowFirstColumn="0" w:lastRowLastColumn="0"/>
+              <w:rPr>
+                <w:sz w:val="20"/>
+                <w:szCs w:val="20"/>
+              </w:rPr>
+            </w:pPr>
+            <w:r>
+              <w:rPr>
+                <w:sz w:val="20"/>
+                <w:szCs w:val="20"/>
+              </w:rPr>
+              <w:t>generate JPEG images for viewing</w:t>
+            </w:r>
+          </w:p>
+        </w:tc>
+      </w:tr>
+      <w:tr>
+        <w:tc>
+          <w:tcPr>
+            <w:cnfStyle w:val="001000000000" w:firstRow="0" w:lastRow="0" w:firstColumn="1" w:lastColumn="0" w:oddVBand="0" w:evenVBand="0" w:oddHBand="0" w:evenHBand="0" w:firstRowFirstColumn="0" w:firstRowLastColumn="0" w:lastRowFirstColumn="0" w:lastRowLastColumn="0"/>
+            <w:tcW w:w="0" w:type="auto"/>
+          </w:tcPr>
+          <w:p>
+            <w:pPr>
+              <w:pStyle w:val="NoSpacing"/>
+            </w:pPr>
+            <w:r>
+              <w:t>Hough</w:t>
+            </w:r>
+          </w:p>
+        </w:tc>
+        <w:tc>
+          <w:tcPr>
+            <w:tcW w:w="0" w:type="auto"/>
+          </w:tcPr>
+          <w:p>
+            <w:pPr>
+              <w:pStyle w:val="NoSpacing"/>
+              <w:cnfStyle w:val="000000000000" w:firstRow="0" w:lastRow="0" w:firstColumn="0" w:lastColumn="0" w:oddVBand="0" w:evenVBand="0" w:oddHBand="0" w:evenHBand="0" w:firstRowFirstColumn="0" w:firstRowLastColumn="0" w:lastRowFirstColumn="0" w:lastRowLastColumn="0"/>
+            </w:pPr>
+            <w:r>
+              <w:t>Detect lines</w:t>
+            </w:r>
+          </w:p>
+        </w:tc>
+        <w:tc>
+          <w:tcPr>
+            <w:tcW w:w="0" w:type="auto"/>
+          </w:tcPr>
+          <w:p>
+            <w:pPr>
+              <w:pStyle w:val="tablebullet"/>
+              <w:cnfStyle w:val="000000000000" w:firstRow="0" w:lastRow="0" w:firstColumn="0" w:lastColumn="0" w:oddVBand="0" w:evenVBand="0" w:oddHBand="0" w:evenHBand="0" w:firstRowFirstColumn="0" w:firstRowLastColumn="0" w:lastRowFirstColumn="0" w:lastRowLastColumn="0"/>
+              <w:rPr>
+                <w:sz w:val="20"/>
+                <w:szCs w:val="20"/>
+              </w:rPr>
+            </w:pPr>
+            <w:r>
+              <w:rPr>
+                <w:sz w:val="20"/>
+                <w:szCs w:val="20"/>
+              </w:rPr>
+              <w:t>generate edge image</w:t>
+            </w:r>
+          </w:p>
+          <w:p>
+            <w:pPr>
+              <w:pStyle w:val="tablebullet"/>
+              <w:cnfStyle w:val="000000000000" w:firstRow="0" w:lastRow="0" w:firstColumn="0" w:lastColumn="0" w:oddVBand="0" w:evenVBand="0" w:oddHBand="0" w:evenHBand="0" w:firstRowFirstColumn="0" w:firstRowLastColumn="0" w:lastRowFirstColumn="0" w:lastRowLastColumn="0"/>
+              <w:rPr>
+                <w:sz w:val="20"/>
+                <w:szCs w:val="20"/>
+              </w:rPr>
+            </w:pPr>
+            <w:r>
+              <w:rPr>
+                <w:sz w:val="20"/>
+                <w:szCs w:val="20"/>
+              </w:rPr>
+              <w:t>create Hough accumulator</w:t>
+            </w:r>
+          </w:p>
+          <w:p>
+            <w:pPr>
+              <w:pStyle w:val="tablebullet"/>
+              <w:cnfStyle w:val="000000000000" w:firstRow="0" w:lastRow="0" w:firstColumn="0" w:lastColumn="0" w:oddVBand="0" w:evenVBand="0" w:oddHBand="0" w:evenHBand="0" w:firstRowFirstColumn="0" w:firstRowLastColumn="0" w:lastRowFirstColumn="0" w:lastRowLastColumn="0"/>
+              <w:rPr>
+                <w:sz w:val="20"/>
+                <w:szCs w:val="20"/>
+              </w:rPr>
+            </w:pPr>
+            <w:r>
+              <w:rPr>
+                <w:sz w:val="20"/>
+                <w:szCs w:val="20"/>
+              </w:rPr>
+              <w:t>get Hough accumulator histogram and statistics</w:t>
+            </w:r>
+          </w:p>
+          <w:p>
+            <w:pPr>
+              <w:pStyle w:val="tablebullet"/>
+              <w:cnfStyle w:val="000000000000" w:firstRow="0" w:lastRow="0" w:firstColumn="0" w:lastColumn="0" w:oddVBand="0" w:evenVBand="0" w:oddHBand="0" w:evenHBand="0" w:firstRowFirstColumn="0" w:firstRowLastColumn="0" w:lastRowFirstColumn="0" w:lastRowLastColumn="0"/>
+              <w:rPr>
+                <w:sz w:val="20"/>
+                <w:szCs w:val="20"/>
+              </w:rPr>
+            </w:pPr>
+            <w:r>
+              <w:rPr>
+                <w:sz w:val="20"/>
+                <w:szCs w:val="20"/>
+              </w:rPr>
+              <w:t>analyze histogram and statistics to get Hough line thresholds</w:t>
+            </w:r>
+          </w:p>
+          <w:p>
+            <w:pPr>
+              <w:pStyle w:val="tablebullet"/>
+              <w:cnfStyle w:val="000000000000" w:firstRow="0" w:lastRow="0" w:firstColumn="0" w:lastColumn="0" w:oddVBand="0" w:evenVBand="0" w:oddHBand="0" w:evenHBand="0" w:firstRowFirstColumn="0" w:firstRowLastColumn="0" w:lastRowFirstColumn="0" w:lastRowLastColumn="0"/>
+              <w:rPr>
+                <w:sz w:val="20"/>
+                <w:szCs w:val="20"/>
+              </w:rPr>
+            </w:pPr>
+            <w:r>
+              <w:rPr>
+                <w:sz w:val="20"/>
+                <w:szCs w:val="20"/>
+              </w:rPr>
+              <w:t>select peaks</w:t>
+            </w:r>
+          </w:p>
+          <w:p>
+            <w:pPr>
+              <w:pStyle w:val="tablebullet"/>
+              <w:cnfStyle w:val="000000000000" w:firstRow="0" w:lastRow="0" w:firstColumn="0" w:lastColumn="0" w:oddVBand="0" w:evenVBand="0" w:oddHBand="0" w:evenHBand="0" w:firstRowFirstColumn="0" w:firstRowLastColumn="0" w:lastRowFirstColumn="0" w:lastRowLastColumn="0"/>
+              <w:rPr>
+                <w:sz w:val="20"/>
+                <w:szCs w:val="20"/>
+              </w:rPr>
+            </w:pPr>
+            <w:r>
+              <w:rPr>
+                <w:sz w:val="20"/>
+                <w:szCs w:val="20"/>
+              </w:rPr>
+              <w:t>draw lines in original JPEG image for viewing</w:t>
+            </w:r>
+          </w:p>
+        </w:tc>
+      </w:tr>
+    </w:tbl>
+    <w:p>
+      <w:pPr>
+        <w:pStyle w:val="Heading2"/>
+      </w:pPr>
+      <w:r>
+        <w:t>filter-edge-gaussian Operator</w:t>
+      </w:r>
+    </w:p>
     <w:p>
       <w:pPr>
         <w:pStyle w:val="Heading2"/>
@@ -9464,6 +10127,7 @@
               <w:pStyle w:val="NoSpacing"/>
             </w:pPr>
             <w:r>
+              <w:lastRenderedPageBreak/>
               <w:t>orientation</w:t>
             </w:r>
           </w:p>
@@ -9834,7 +10498,6 @@
           </w:tcPr>
           <w:p>
             <w:r>
-              <w:lastRenderedPageBreak/>
               <w:t>Descriptor type</w:t>
             </w:r>
           </w:p>
@@ -10470,6 +11133,14 @@
         </w:tc>
       </w:tr>
     </w:tbl>
+    <w:p>
+      <w:pPr>
+        <w:pStyle w:val="Heading2"/>
+      </w:pPr>
+      <w:r>
+        <w:t>filter-edge-laplacian Operator</w:t>
+      </w:r>
+    </w:p>
     <w:p>
       <w:pPr>
         <w:pStyle w:val="Heading2"/>
@@ -10795,6 +11466,7 @@
                 <w:b w:val="0"/>
                 <w:bCs w:val="0"/>
               </w:rPr>
+              <w:lastRenderedPageBreak/>
               <w:t>output</w:t>
             </w:r>
           </w:p>
@@ -11169,7 +11841,6 @@
                 <w:b w:val="0"/>
                 <w:bCs w:val="0"/>
               </w:rPr>
-              <w:lastRenderedPageBreak/>
               <w:t>depth</w:t>
             </w:r>
           </w:p>
@@ -12008,6 +12679,7 @@
                 <w:sz w:val="20"/>
                 <w:szCs w:val="20"/>
               </w:rPr>
+              <w:lastRenderedPageBreak/>
               <w:t>CV_8U has value 0</w:t>
             </w:r>
           </w:p>
@@ -12065,6 +12737,7 @@
                 <w:b w:val="0"/>
                 <w:bCs w:val="0"/>
               </w:rPr>
+              <w:lastRenderedPageBreak/>
               <w:t>pixel count</w:t>
             </w:r>
           </w:p>
@@ -12257,7 +12930,6 @@
           </w:tcPr>
           <w:p>
             <w:r>
-              <w:lastRenderedPageBreak/>
               <w:t>Descriptor type</w:t>
             </w:r>
           </w:p>
@@ -13155,6 +13827,7 @@
         <w:pStyle w:val="Normalafterlist"/>
       </w:pPr>
       <w:r>
+        <w:lastRenderedPageBreak/>
         <w:t xml:space="preserve">For text output format, the output data descriptor extension is ignored. The output text file has the extension “.txt” and the output gnuplot script has the extension “.gp” as described in section </w:t>
       </w:r>
       <w:r>
@@ -13452,7 +14125,6 @@
                 <w:b w:val="0"/>
                 <w:bCs w:val="0"/>
               </w:rPr>
-              <w:lastRenderedPageBreak/>
               <w:t>cols</w:t>
             </w:r>
           </w:p>
@@ -13752,85 +14424,6 @@
             </w:pPr>
             <w:r>
               <w:t>pixel value mean</w:t>
-            </w:r>
-          </w:p>
-        </w:tc>
-      </w:tr>
-      <w:tr>
-        <w:trPr>
-          <w:cnfStyle w:val="000000100000" w:firstRow="0" w:lastRow="0" w:firstColumn="0" w:lastColumn="0" w:oddVBand="0" w:evenVBand="0" w:oddHBand="1" w:evenHBand="0" w:firstRowFirstColumn="0" w:firstRowLastColumn="0" w:lastRowFirstColumn="0" w:lastRowLastColumn="0"/>
-        </w:trPr>
-        <w:tc>
-          <w:tcPr>
-            <w:cnfStyle w:val="001000000000" w:firstRow="0" w:lastRow="0" w:firstColumn="1" w:lastColumn="0" w:oddVBand="0" w:evenVBand="0" w:oddHBand="0" w:evenHBand="0" w:firstRowFirstColumn="0" w:firstRowLastColumn="0" w:lastRowFirstColumn="0" w:lastRowLastColumn="0"/>
-            <w:tcW w:w="0" w:type="auto"/>
-          </w:tcPr>
-          <w:p>
-            <w:pPr>
-              <w:pStyle w:val="NoSpacing"/>
-              <w:rPr>
-                <w:b w:val="0"/>
-                <w:bCs w:val="0"/>
-              </w:rPr>
-            </w:pPr>
-            <w:r>
-              <w:rPr>
-                <w:b w:val="0"/>
-                <w:bCs w:val="0"/>
-              </w:rPr>
-              <w:t>variance</w:t>
-            </w:r>
-          </w:p>
-        </w:tc>
-        <w:tc>
-          <w:tcPr>
-            <w:tcW w:w="0" w:type="auto"/>
-          </w:tcPr>
-          <w:p>
-            <w:pPr>
-              <w:pStyle w:val="NoSpacing"/>
-              <w:cnfStyle w:val="000000100000" w:firstRow="0" w:lastRow="0" w:firstColumn="0" w:lastColumn="0" w:oddVBand="0" w:evenVBand="0" w:oddHBand="1" w:evenHBand="0" w:firstRowFirstColumn="0" w:firstRowLastColumn="0" w:lastRowFirstColumn="0" w:lastRowLastColumn="0"/>
-            </w:pPr>
-            <w:r>
-              <w:t>pixel value variance</w:t>
-            </w:r>
-          </w:p>
-        </w:tc>
-      </w:tr>
-      <w:tr>
-        <w:tc>
-          <w:tcPr>
-            <w:cnfStyle w:val="001000000000" w:firstRow="0" w:lastRow="0" w:firstColumn="1" w:lastColumn="0" w:oddVBand="0" w:evenVBand="0" w:oddHBand="0" w:evenHBand="0" w:firstRowFirstColumn="0" w:firstRowLastColumn="0" w:lastRowFirstColumn="0" w:lastRowLastColumn="0"/>
-            <w:tcW w:w="0" w:type="auto"/>
-          </w:tcPr>
-          <w:p>
-            <w:pPr>
-              <w:pStyle w:val="NoSpacing"/>
-              <w:rPr>
-                <w:b w:val="0"/>
-                <w:bCs w:val="0"/>
-              </w:rPr>
-            </w:pPr>
-            <w:r>
-              <w:rPr>
-                <w:b w:val="0"/>
-                <w:bCs w:val="0"/>
-              </w:rPr>
-              <w:t>sample variance</w:t>
-            </w:r>
-          </w:p>
-        </w:tc>
-        <w:tc>
-          <w:tcPr>
-            <w:tcW w:w="0" w:type="auto"/>
-          </w:tcPr>
-          <w:p>
-            <w:pPr>
-              <w:pStyle w:val="NoSpacing"/>
-              <w:cnfStyle w:val="000000000000" w:firstRow="0" w:lastRow="0" w:firstColumn="0" w:lastColumn="0" w:oddVBand="0" w:evenVBand="0" w:oddHBand="0" w:evenHBand="0" w:firstRowFirstColumn="0" w:firstRowLastColumn="0" w:lastRowFirstColumn="0" w:lastRowLastColumn="0"/>
-            </w:pPr>
-            <w:r>
-              <w:t>pixel value sample variance</w:t>
             </w:r>
           </w:p>
         </w:tc>
@@ -14168,8 +14761,8 @@
         <w:tblLook w:val="04A0" w:firstRow="1" w:lastRow="0" w:firstColumn="1" w:lastColumn="0" w:noHBand="0" w:noVBand="1"/>
       </w:tblPr>
       <w:tblGrid>
-        <w:gridCol w:w="1280"/>
-        <w:gridCol w:w="8070"/>
+        <w:gridCol w:w="1696"/>
+        <w:gridCol w:w="7654"/>
       </w:tblGrid>
       <w:tr>
         <w:trPr>
@@ -14259,7 +14852,7 @@
                 <w:b w:val="0"/>
                 <w:bCs w:val="0"/>
               </w:rPr>
-              <w:t>threshold</w:t>
+              <w:t>pixel_threshold</w:t>
             </w:r>
           </w:p>
         </w:tc>
@@ -14272,13 +14865,7 @@
               <w:cnfStyle w:val="000000000000" w:firstRow="0" w:lastRow="0" w:firstColumn="0" w:lastColumn="0" w:oddVBand="0" w:evenVBand="0" w:oddHBand="0" w:evenHBand="0" w:firstRowFirstColumn="0" w:firstRowLastColumn="0" w:lastRowFirstColumn="0" w:lastRowLastColumn="0"/>
             </w:pPr>
             <w:r>
-              <w:t xml:space="preserve">pixel value threshold above which image points are candidates for </w:t>
-            </w:r>
-            <w:r>
-              <w:t>accumulating</w:t>
-            </w:r>
-            <w:r>
-              <w:t xml:space="preserve"> </w:t>
+              <w:t xml:space="preserve">pixel value threshold above which image points are candidates for accumulating </w:t>
             </w:r>
           </w:p>
         </w:tc>
@@ -14299,8 +14886,8 @@
         <w:tblLook w:val="04A0" w:firstRow="1" w:lastRow="0" w:firstColumn="1" w:lastColumn="0" w:noHBand="0" w:noVBand="1"/>
       </w:tblPr>
       <w:tblGrid>
-        <w:gridCol w:w="1808"/>
-        <w:gridCol w:w="7542"/>
+        <w:gridCol w:w="1901"/>
+        <w:gridCol w:w="7449"/>
       </w:tblGrid>
       <w:tr>
         <w:trPr>
@@ -14318,6 +14905,7 @@
               <w:pStyle w:val="NoSpacing"/>
             </w:pPr>
             <w:r>
+              <w:lastRenderedPageBreak/>
               <w:t>Field</w:t>
             </w:r>
           </w:p>
@@ -14602,7 +15190,7 @@
                 <w:b w:val="0"/>
                 <w:bCs w:val="0"/>
               </w:rPr>
-              <w:t>threshold</w:t>
+              <w:t>pixel_threshold</w:t>
             </w:r>
           </w:p>
         </w:tc>
@@ -14681,8 +15269,7 @@
                 <w:b w:val="0"/>
                 <w:bCs w:val="0"/>
               </w:rPr>
-              <w:lastRenderedPageBreak/>
-              <w:t>max_rho</w:t>
+              <w:t>nrhos</w:t>
             </w:r>
           </w:p>
         </w:tc>
@@ -14817,85 +15404,6 @@
             </w:pPr>
             <w:r>
               <w:t>The mean for the hough accumulator counts</w:t>
-            </w:r>
-          </w:p>
-        </w:tc>
-      </w:tr>
-      <w:tr>
-        <w:tc>
-          <w:tcPr>
-            <w:cnfStyle w:val="001000000000" w:firstRow="0" w:lastRow="0" w:firstColumn="1" w:lastColumn="0" w:oddVBand="0" w:evenVBand="0" w:oddHBand="0" w:evenHBand="0" w:firstRowFirstColumn="0" w:firstRowLastColumn="0" w:lastRowFirstColumn="0" w:lastRowLastColumn="0"/>
-            <w:tcW w:w="0" w:type="auto"/>
-          </w:tcPr>
-          <w:p>
-            <w:pPr>
-              <w:pStyle w:val="NoSpacing"/>
-              <w:rPr>
-                <w:b w:val="0"/>
-                <w:bCs w:val="0"/>
-              </w:rPr>
-            </w:pPr>
-            <w:r>
-              <w:rPr>
-                <w:b w:val="0"/>
-                <w:bCs w:val="0"/>
-              </w:rPr>
-              <w:t>variance</w:t>
-            </w:r>
-          </w:p>
-        </w:tc>
-        <w:tc>
-          <w:tcPr>
-            <w:tcW w:w="0" w:type="auto"/>
-          </w:tcPr>
-          <w:p>
-            <w:pPr>
-              <w:pStyle w:val="NoSpacing"/>
-              <w:cnfStyle w:val="000000000000" w:firstRow="0" w:lastRow="0" w:firstColumn="0" w:lastColumn="0" w:oddVBand="0" w:evenVBand="0" w:oddHBand="0" w:evenHBand="0" w:firstRowFirstColumn="0" w:firstRowLastColumn="0" w:lastRowFirstColumn="0" w:lastRowLastColumn="0"/>
-            </w:pPr>
-            <w:r>
-              <w:t>The variance for the hough accumulator counts</w:t>
-            </w:r>
-          </w:p>
-        </w:tc>
-      </w:tr>
-      <w:tr>
-        <w:trPr>
-          <w:cnfStyle w:val="000000100000" w:firstRow="0" w:lastRow="0" w:firstColumn="0" w:lastColumn="0" w:oddVBand="0" w:evenVBand="0" w:oddHBand="1" w:evenHBand="0" w:firstRowFirstColumn="0" w:firstRowLastColumn="0" w:lastRowFirstColumn="0" w:lastRowLastColumn="0"/>
-        </w:trPr>
-        <w:tc>
-          <w:tcPr>
-            <w:cnfStyle w:val="001000000000" w:firstRow="0" w:lastRow="0" w:firstColumn="1" w:lastColumn="0" w:oddVBand="0" w:evenVBand="0" w:oddHBand="0" w:evenHBand="0" w:firstRowFirstColumn="0" w:firstRowLastColumn="0" w:lastRowFirstColumn="0" w:lastRowLastColumn="0"/>
-            <w:tcW w:w="0" w:type="auto"/>
-          </w:tcPr>
-          <w:p>
-            <w:pPr>
-              <w:pStyle w:val="NoSpacing"/>
-              <w:rPr>
-                <w:b w:val="0"/>
-                <w:bCs w:val="0"/>
-              </w:rPr>
-            </w:pPr>
-            <w:r>
-              <w:rPr>
-                <w:b w:val="0"/>
-                <w:bCs w:val="0"/>
-              </w:rPr>
-              <w:t>sample variance</w:t>
-            </w:r>
-          </w:p>
-        </w:tc>
-        <w:tc>
-          <w:tcPr>
-            <w:tcW w:w="0" w:type="auto"/>
-          </w:tcPr>
-          <w:p>
-            <w:pPr>
-              <w:pStyle w:val="NoSpacing"/>
-              <w:cnfStyle w:val="000000100000" w:firstRow="0" w:lastRow="0" w:firstColumn="0" w:lastColumn="0" w:oddVBand="0" w:evenVBand="0" w:oddHBand="1" w:evenHBand="0" w:firstRowFirstColumn="0" w:firstRowLastColumn="0" w:lastRowFirstColumn="0" w:lastRowLastColumn="0"/>
-            </w:pPr>
-            <w:r>
-              <w:t>The sample variance for the hough accumulator counts</w:t>
             </w:r>
           </w:p>
         </w:tc>
@@ -15513,6 +16021,7 @@
               <w:pStyle w:val="NoSpacing"/>
             </w:pPr>
             <w:r>
+              <w:lastRenderedPageBreak/>
               <w:t>Field</w:t>
             </w:r>
           </w:p>
@@ -15732,7 +16241,6 @@
                 <w:sz w:val="20"/>
                 <w:szCs w:val="20"/>
               </w:rPr>
-              <w:lastRenderedPageBreak/>
               <w:t>CV_32F has value 2</w:t>
             </w:r>
           </w:p>
@@ -15760,7 +16268,6 @@
                 <w:b w:val="0"/>
                 <w:bCs w:val="0"/>
               </w:rPr>
-              <w:lastRenderedPageBreak/>
               <w:t>pixel count</w:t>
             </w:r>
           </w:p>
@@ -16199,13 +16706,7 @@
         <w:pStyle w:val="Normalafterlist"/>
       </w:pPr>
       <w:r>
-        <w:t xml:space="preserve">The parameters to the draw Hough </w:t>
-      </w:r>
-      <w:r>
-        <w:t xml:space="preserve">peak detect </w:t>
-      </w:r>
-      <w:r>
-        <w:t>operator are:</w:t>
+        <w:t>The parameters to the draw Hough peak detect operator are:</w:t>
       </w:r>
     </w:p>
     <w:tbl>
@@ -16294,6 +16795,44 @@
           </w:p>
         </w:tc>
       </w:tr>
+      <w:tr>
+        <w:tc>
+          <w:tcPr>
+            <w:cnfStyle w:val="001000000000" w:firstRow="0" w:lastRow="0" w:firstColumn="1" w:lastColumn="0" w:oddVBand="0" w:evenVBand="0" w:oddHBand="0" w:evenHBand="0" w:firstRowFirstColumn="0" w:firstRowLastColumn="0" w:lastRowFirstColumn="0" w:lastRowLastColumn="0"/>
+            <w:tcW w:w="1733" w:type="dxa"/>
+          </w:tcPr>
+          <w:p>
+            <w:pPr>
+              <w:pStyle w:val="NoSpacing"/>
+              <w:rPr>
+                <w:b w:val="0"/>
+                <w:bCs w:val="0"/>
+              </w:rPr>
+            </w:pPr>
+            <w:r>
+              <w:rPr>
+                <w:b w:val="0"/>
+                <w:bCs w:val="0"/>
+              </w:rPr>
+              <w:t>max_peaks</w:t>
+            </w:r>
+          </w:p>
+        </w:tc>
+        <w:tc>
+          <w:tcPr>
+            <w:tcW w:w="7617" w:type="dxa"/>
+          </w:tcPr>
+          <w:p>
+            <w:pPr>
+              <w:pStyle w:val="NoSpacing"/>
+              <w:cnfStyle w:val="000000000000" w:firstRow="0" w:lastRow="0" w:firstColumn="0" w:lastColumn="0" w:oddVBand="0" w:evenVBand="0" w:oddHBand="0" w:evenHBand="0" w:firstRowFirstColumn="0" w:firstRowLastColumn="0" w:lastRowFirstColumn="0" w:lastRowLastColumn="0"/>
+            </w:pPr>
+            <w:r>
+              <w:t>The maximum number of peaks to return</w:t>
+            </w:r>
+          </w:p>
+        </w:tc>
+      </w:tr>
     </w:tbl>
     <w:p>
       <w:pPr>
@@ -16449,7 +16988,7 @@
                 <w:b w:val="0"/>
                 <w:bCs w:val="0"/>
               </w:rPr>
-              <w:t>max_rho</w:t>
+              <w:t>nrhos</w:t>
             </w:r>
           </w:p>
         </w:tc>
@@ -16685,6 +17224,7 @@
                 <w:b w:val="0"/>
                 <w:bCs w:val="0"/>
               </w:rPr>
+              <w:lastRenderedPageBreak/>
               <w:t>Color</w:t>
             </w:r>
           </w:p>
@@ -16824,7 +17364,6 @@
           </w:tcPr>
           <w:p>
             <w:r>
-              <w:lastRenderedPageBreak/>
               <w:t>in_component</w:t>
             </w:r>
           </w:p>
@@ -17580,6 +18119,7 @@
     </w:p>
     <w:p>
       <w:r>
+        <w:lastRenderedPageBreak/>
         <w:t>The operator takes the following data descriptors:</w:t>
       </w:r>
     </w:p>
@@ -17852,7 +18392,6 @@
               <w:pStyle w:val="NoSpacing"/>
             </w:pPr>
             <w:r>
-              <w:lastRenderedPageBreak/>
               <w:t>parameter</w:t>
             </w:r>
           </w:p>
@@ -18385,19 +18924,11 @@
     <w:pPr>
       <w:pStyle w:val="Footer"/>
     </w:pPr>
-    <w:fldSimple w:instr=" DATE   \* MERGEFORMAT ">
-      <w:r>
-        <w:rPr>
-          <w:noProof/>
-        </w:rPr>
-        <w:t>7/21/2022</w:t>
-      </w:r>
-    </w:fldSimple>
     <w:r>
       <w:fldChar w:fldCharType="begin"/>
     </w:r>
     <w:r>
-      <w:instrText xml:space="preserve"> TIME  \@ "M/d/yyyy h:mm am/pm"  \* MERGEFORMAT </w:instrText>
+      <w:instrText xml:space="preserve"> DATE  \@ "M/d/yyyy h:mm am/pm"  \* MERGEFORMAT </w:instrText>
     </w:r>
     <w:r>
       <w:fldChar w:fldCharType="separate"/>
@@ -18406,7 +18937,7 @@
       <w:rPr>
         <w:noProof/>
       </w:rPr>
-      <w:t>7/21/2022 2:09 PM</w:t>
+      <w:t>7/22/2022 4:11 PM</w:t>
     </w:r>
     <w:r>
       <w:fldChar w:fldCharType="end"/>
@@ -18477,7 +19008,7 @@
           <w:rPr>
             <w:noProof/>
           </w:rPr>
-          <w:t>7/21/2022 2:09 PM</w:t>
+          <w:t>7/22/2022 2:08 PM</w:t>
         </w:r>
         <w:r>
           <w:fldChar w:fldCharType="end"/>

</xml_diff>

<commit_message>
added stubs for missing operators
</commit_message>
<xml_diff>
--- a/doc/cv-workbench.docx
+++ b/doc/cv-workbench.docx
@@ -83,7 +83,13 @@
     </w:p>
     <w:p>
       <w:r>
-        <w:t>The CV Workbench processes scripts to run image processing operators. It differs from these existing computer vision tools.</w:t>
+        <w:t>These are computer vision libraries and interactive systems. This framework was designed to provide an experimental environment using image processing operators that could</w:t>
+      </w:r>
+      <w:r>
+        <w:t xml:space="preserve"> </w:t>
+      </w:r>
+      <w:r>
+        <w:t xml:space="preserve">be implemented using these libraries. It is also designed not just as an interactive system but a tool to support experimentation and providing reproducible use image processing operations rather than casual interactive use. </w:t>
       </w:r>
     </w:p>
     <w:p>
@@ -103,8 +109,17 @@
         </w:r>
       </w:hyperlink>
       <w:r>
-        <w:t xml:space="preserve"> and </w:t>
-      </w:r>
+        <w:t xml:space="preserve"> is an open source library developed by Intel to showcase CPU-intensive applications. It relies on heavily optimized code.</w:t>
+      </w:r>
+    </w:p>
+    <w:p>
+      <w:pPr>
+        <w:pStyle w:val="ListParagraph"/>
+        <w:numPr>
+          <w:ilvl w:val="0"/>
+          <w:numId w:val="19"/>
+        </w:numPr>
+      </w:pPr>
       <w:hyperlink r:id="rId10" w:history="1">
         <w:r>
           <w:rPr>
@@ -114,7 +129,21 @@
         </w:r>
       </w:hyperlink>
       <w:r>
-        <w:t xml:space="preserve"> are libraries for performing computer vision functions with which users write programs in C++. New image processing operators can optionally be added to CV Workbench by programming them with these libraries.</w:t>
+        <w:t xml:space="preserve"> is an open source image processing library developed by the European Union that is conservative of CPU and memory resources. </w:t>
+      </w:r>
+      <w:hyperlink r:id="rId11" w:history="1">
+        <w:r>
+          <w:rPr>
+            <w:rStyle w:val="Hyperlink"/>
+          </w:rPr>
+          <w:t>NIP2</w:t>
+        </w:r>
+      </w:hyperlink>
+      <w:r>
+        <w:t xml:space="preserve"> </w:t>
+      </w:r>
+      <w:r>
+        <w:t>is an interactive interface to VIPS.</w:t>
       </w:r>
     </w:p>
     <w:p>
@@ -125,7 +154,27 @@
           <w:numId w:val="19"/>
         </w:numPr>
       </w:pPr>
-      <w:hyperlink r:id="rId11" w:history="1">
+      <w:hyperlink r:id="rId12" w:history="1">
+        <w:r>
+          <w:rPr>
+            <w:rStyle w:val="Hyperlink"/>
+          </w:rPr>
+          <w:t>CVIPTools</w:t>
+        </w:r>
+      </w:hyperlink>
+      <w:r>
+        <w:t xml:space="preserve"> is an open source image processing library developed by Southern Illinois University. It is used as a resource for educational and research use of image processing.</w:t>
+      </w:r>
+    </w:p>
+    <w:p>
+      <w:pPr>
+        <w:pStyle w:val="ListParagraph"/>
+        <w:numPr>
+          <w:ilvl w:val="0"/>
+          <w:numId w:val="19"/>
+        </w:numPr>
+      </w:pPr>
+      <w:hyperlink r:id="rId13" w:history="1">
         <w:r>
           <w:rPr>
             <w:rStyle w:val="Hyperlink"/>
@@ -134,7 +183,7 @@
         </w:r>
       </w:hyperlink>
       <w:r>
-        <w:t xml:space="preserve"> performs image operations using command line operations. CV Workbench runs image processing operations in a similar way, but uses JSON to make scripts easier to write and change.</w:t>
+        <w:t xml:space="preserve"> was developed at DuPont and provides both an open source library and an interactive operating system command line interface to run image processing operations. CV Workbench also runs from the operating command line, but uses JSON to make scripts easier to write and change and provides capabilities of recording and storing experiment results.</w:t>
       </w:r>
     </w:p>
     <w:p>
@@ -145,7 +194,7 @@
           <w:numId w:val="19"/>
         </w:numPr>
       </w:pPr>
-      <w:hyperlink r:id="rId12" w:history="1">
+      <w:hyperlink r:id="rId14" w:history="1">
         <w:r>
           <w:rPr>
             <w:rStyle w:val="Hyperlink"/>
@@ -154,29 +203,41 @@
         </w:r>
       </w:hyperlink>
       <w:r>
-        <w:t xml:space="preserve">, </w:t>
-      </w:r>
-      <w:hyperlink r:id="rId13" w:history="1">
+        <w:t xml:space="preserve"> was developed at University of California Berkeley and is an interactive program to perform computer vision operations manually. </w:t>
+      </w:r>
+    </w:p>
+    <w:p>
+      <w:pPr>
+        <w:pStyle w:val="ListParagraph"/>
+        <w:numPr>
+          <w:ilvl w:val="0"/>
+          <w:numId w:val="19"/>
+        </w:numPr>
+      </w:pPr>
+      <w:r>
+        <w:t xml:space="preserve">There are specialized interactive image processing systems for applications such as medical image processing developed by the </w:t>
+      </w:r>
+      <w:hyperlink r:id="rId15" w:history="1">
         <w:r>
           <w:rPr>
             <w:rStyle w:val="Hyperlink"/>
           </w:rPr>
-          <w:t>CVIPTools</w:t>
+          <w:t>University of Utah</w:t>
         </w:r>
       </w:hyperlink>
       <w:r>
-        <w:t xml:space="preserve">, and </w:t>
-      </w:r>
-      <w:hyperlink r:id="rId14" w:history="1">
+        <w:t xml:space="preserve"> and the </w:t>
+      </w:r>
+      <w:hyperlink r:id="rId16" w:history="1">
         <w:r>
           <w:rPr>
             <w:rStyle w:val="Hyperlink"/>
           </w:rPr>
-          <w:t>NIP2</w:t>
+          <w:t>NIH</w:t>
         </w:r>
       </w:hyperlink>
       <w:r>
-        <w:t xml:space="preserve"> are interactive programs to perform computer vision operations manually. CV Workbench uses scripts to make running series of image processing operations easier, and more reproducible and reliable.</w:t>
+        <w:t xml:space="preserve">.  </w:t>
       </w:r>
     </w:p>
     <w:p>
@@ -533,6 +594,8 @@
       <w:tr>
         <w:trPr>
           <w:cnfStyle w:val="100000000000" w:firstRow="1" w:lastRow="0" w:firstColumn="0" w:lastColumn="0" w:oddVBand="0" w:evenVBand="0" w:oddHBand="0" w:evenHBand="0" w:firstRowFirstColumn="0" w:firstRowLastColumn="0" w:lastRowFirstColumn="0" w:lastRowLastColumn="0"/>
+          <w:cantSplit/>
+          <w:tblHeader/>
         </w:trPr>
         <w:tc>
           <w:tcPr>
@@ -852,6 +915,7 @@
               <w:cnfStyle w:val="000000100000" w:firstRow="0" w:lastRow="0" w:firstColumn="0" w:lastColumn="0" w:oddVBand="0" w:evenVBand="0" w:oddHBand="1" w:evenHBand="0" w:firstRowFirstColumn="0" w:firstRowLastColumn="0" w:lastRowFirstColumn="0" w:lastRowLastColumn="0"/>
             </w:pPr>
             <w:r>
+              <w:lastRenderedPageBreak/>
               <w:t>Threshold selection</w:t>
             </w:r>
           </w:p>
@@ -876,6 +940,7 @@
                 <w:b w:val="0"/>
                 <w:bCs w:val="0"/>
               </w:rPr>
+              <w:lastRenderedPageBreak/>
               <w:t>Image operators</w:t>
             </w:r>
           </w:p>
@@ -1004,7 +1069,6 @@
         <w:pStyle w:val="Heading1"/>
       </w:pPr>
       <w:r>
-        <w:lastRenderedPageBreak/>
         <w:t>Experiments</w:t>
       </w:r>
     </w:p>
@@ -1098,6 +1162,8 @@
       <w:tr>
         <w:trPr>
           <w:cnfStyle w:val="100000000000" w:firstRow="1" w:lastRow="0" w:firstColumn="0" w:lastColumn="0" w:oddVBand="0" w:evenVBand="0" w:oddHBand="0" w:evenHBand="0" w:firstRowFirstColumn="0" w:firstRowLastColumn="0" w:lastRowFirstColumn="0" w:lastRowLastColumn="0"/>
+          <w:cantSplit/>
+          <w:tblHeader/>
         </w:trPr>
         <w:tc>
           <w:tcPr>
@@ -1302,6 +1368,8 @@
       <w:tr>
         <w:trPr>
           <w:cnfStyle w:val="100000000000" w:firstRow="1" w:lastRow="0" w:firstColumn="0" w:lastColumn="0" w:oddVBand="0" w:evenVBand="0" w:oddHBand="0" w:evenHBand="0" w:firstRowFirstColumn="0" w:firstRowLastColumn="0" w:lastRowFirstColumn="0" w:lastRowLastColumn="0"/>
+          <w:cantSplit/>
+          <w:tblHeader/>
         </w:trPr>
         <w:tc>
           <w:tcPr>
@@ -1514,14 +1582,18 @@
         <w:pStyle w:val="Normalafterlist"/>
       </w:pPr>
       <w:r>
-        <w:t>CV_8U images are in JPEG format. Images generated by operators generally use CV_8U, CV_32S, or CV_32F as input and generate CV_32S or CV_32F on output, except as noted in the operator descriptions. CV_32S and CV_32F images may be used interchangeably without having to specify the depth in operators, though CV_32F images are output if any input image is CV_32F. The "transform-intensity-map" operator can map CV_32S and CV_32F images to CV_8U JPEG for display.</w:t>
+        <w:t xml:space="preserve">CV_8U images are in JPEG format. Images generated by operators generally use CV_8U, CV_32S, or CV_32F as input and generate CV_32S or CV_32F on output, except as noted in the operator descriptions. CV_32S and CV_32F images may be used interchangeably without having to specify the depth in operators, though CV_32F images are output if any input image is </w:t>
+      </w:r>
+      <w:r>
+        <w:lastRenderedPageBreak/>
+        <w:t>CV_32F. The "transform-intensity-map" operator can map CV_32S and CV_32F images to CV_8U JPEG for display.</w:t>
       </w:r>
     </w:p>
     <w:p>
       <w:r>
         <w:t xml:space="preserve">JPEG image file format is defined by the </w:t>
       </w:r>
-      <w:hyperlink r:id="rId15" w:history="1">
+      <w:hyperlink r:id="rId17" w:history="1">
         <w:r>
           <w:rPr>
             <w:rStyle w:val="Hyperlink"/>
@@ -1530,7 +1602,7 @@
         </w:r>
       </w:hyperlink>
       <w:r>
-        <w:t>. ‘Binary’ image data files are defined by the workbench and have the following format. Color RGB pixels are stored as three consecutive pixel values, one for each component. The three pixel values represent the red, green, and blue components.</w:t>
+        <w:t>. The binary image data files are defined by the workbench and have the following format. Color RGB pixels are stored as three consecutive pixel values, one for each component. The three pixel values represent the red, green, and blue components.</w:t>
       </w:r>
     </w:p>
     <w:tbl>
@@ -1722,7 +1794,6 @@
                 <w:b w:val="0"/>
                 <w:bCs w:val="0"/>
               </w:rPr>
-              <w:lastRenderedPageBreak/>
               <w:t>components</w:t>
             </w:r>
           </w:p>
@@ -1921,7 +1992,7 @@
     </w:p>
     <w:p>
       <w:r>
-        <w:t>Histograms count the number of different values for any data type containing a range of values, such as images or Hough accumulators. The stored histogram data bins correspond to a values ranging from a lower to an upper pixel value. The number of histogram bins, the lower value, and the upper value determine into which bin a value is counted. Values below the lower value are counted in the first bin, and values above the upper value are counted in the last bin. The bin corresponding to a value is given by this:</w:t>
+        <w:t>Histograms count the number of different values for any data type containing a range of values, such as images or Hough accumulators. The histogram bins correspond to a data values ranging from a lower to an upper value. The number of histogram bins or nbins, the lower value or lower_value, and the upper value or upper_value determine into which bin a value is counted. Values below the lower value are counted in the first bin, and values above the upper value are counted in the last bin. The bin corresponding to a value is given by this:</w:t>
       </w:r>
     </w:p>
     <w:p>
@@ -1937,7 +2008,7 @@
         <w:pStyle w:val="code"/>
       </w:pPr>
       <w:r>
-        <w:t xml:space="preserve">    bin no. = 0</w:t>
+        <w:t xml:space="preserve">    bin = 0</w:t>
       </w:r>
     </w:p>
     <w:p>
@@ -1953,7 +2024,7 @@
         <w:pStyle w:val="code"/>
       </w:pPr>
       <w:r>
-        <w:t xml:space="preserve">    bin no. = no. bins – 1</w:t>
+        <w:t xml:space="preserve">    bin = nbins – 1</w:t>
       </w:r>
     </w:p>
     <w:p>
@@ -1969,7 +2040,7 @@
         <w:pStyle w:val="code"/>
       </w:pPr>
       <w:r>
-        <w:t xml:space="preserve">    bin no. = round((no. bins – 1) * (value – lower_value) / (upper_value – lower_value))</w:t>
+        <w:t xml:space="preserve">    bin = round((nbins – 1) * (value – lower_value) / (upper_value – lower_value))</w:t>
       </w:r>
     </w:p>
     <w:p>
@@ -1977,7 +2048,7 @@
         <w:pStyle w:val="Normalafterlist"/>
       </w:pPr>
       <w:r>
-        <w:t>The histogram data type indicates how histogram data is stored. There are both binary and text stored histogram formats. Binary histogram files are used only within this software. Text histogram files may be plotted with gnuplot or imported into Microsoft Excel for review.</w:t>
+        <w:t>The histogram data type format indicates how histogram data is stored. There are both binary and text stored histogram formats. Binary histogram files are used only within this software. Text histogram files may be plotted with gnuplot or imported into Microsoft Excel for review.</w:t>
       </w:r>
     </w:p>
     <w:p>
@@ -1990,7 +2061,7 @@
     </w:p>
     <w:p>
       <w:r>
-        <w:t>Binary histogram files contain the statistics for a value distribution such as an image or Hough accumulator, such as the minimum, maximum, and total counts for all bins, and the histogram bin counts. The binary histogram data files are defined by the workbench, and have the following format:</w:t>
+        <w:t>Binary histogram files contain the statistics for a value distribution for the input values, such for as an image or Hough accumulator, and statistics for the histogram, such as the minimum, maximum, and total counts for all bins. The binary histogram data files are defined by the workbench, and have the following format:</w:t>
       </w:r>
     </w:p>
     <w:tbl>
@@ -2289,6 +2360,7 @@
                 <w:b w:val="0"/>
                 <w:bCs w:val="0"/>
               </w:rPr>
+              <w:lastRenderedPageBreak/>
               <w:t>min_count</w:t>
             </w:r>
           </w:p>
@@ -2424,7 +2496,7 @@
               <w:cnfStyle w:val="000000100000" w:firstRow="0" w:lastRow="0" w:firstColumn="0" w:lastColumn="0" w:oddVBand="0" w:evenVBand="0" w:oddHBand="1" w:evenHBand="0" w:firstRowFirstColumn="0" w:firstRowLastColumn="0" w:lastRowFirstColumn="0" w:lastRowLastColumn="0"/>
             </w:pPr>
             <w:r>
-              <w:t xml:space="preserve">The image pixel value mean </w:t>
+              <w:t xml:space="preserve">The input value mean </w:t>
             </w:r>
           </w:p>
         </w:tc>
@@ -2476,13 +2548,7 @@
               <w:cnfStyle w:val="000000000000" w:firstRow="0" w:lastRow="0" w:firstColumn="0" w:lastColumn="0" w:oddVBand="0" w:evenVBand="0" w:oddHBand="0" w:evenHBand="0" w:firstRowFirstColumn="0" w:firstRowLastColumn="0" w:lastRowFirstColumn="0" w:lastRowLastColumn="0"/>
             </w:pPr>
             <w:r>
-              <w:t xml:space="preserve">The image pixel value </w:t>
-            </w:r>
-            <w:r>
-              <w:t>variance</w:t>
-            </w:r>
-            <w:r>
-              <w:t xml:space="preserve"> </w:t>
+              <w:t xml:space="preserve">The input value variance </w:t>
             </w:r>
           </w:p>
         </w:tc>
@@ -2538,13 +2604,7 @@
               <w:cnfStyle w:val="000000100000" w:firstRow="0" w:lastRow="0" w:firstColumn="0" w:lastColumn="0" w:oddVBand="0" w:evenVBand="0" w:oddHBand="1" w:evenHBand="0" w:firstRowFirstColumn="0" w:firstRowLastColumn="0" w:lastRowFirstColumn="0" w:lastRowLastColumn="0"/>
             </w:pPr>
             <w:r>
-              <w:t xml:space="preserve">The image pixel value </w:t>
-            </w:r>
-            <w:r>
-              <w:t>sample variance</w:t>
-            </w:r>
-            <w:r>
-              <w:t xml:space="preserve"> </w:t>
+              <w:t xml:space="preserve">The input value sample variance </w:t>
             </w:r>
           </w:p>
         </w:tc>
@@ -2597,7 +2657,7 @@
               <w:cnfStyle w:val="000000000000" w:firstRow="0" w:lastRow="0" w:firstColumn="0" w:lastColumn="0" w:oddVBand="0" w:evenVBand="0" w:oddHBand="0" w:evenHBand="0" w:firstRowFirstColumn="0" w:firstRowLastColumn="0" w:lastRowFirstColumn="0" w:lastRowLastColumn="0"/>
             </w:pPr>
             <w:r>
-              <w:t xml:space="preserve">The image pixel value standard deviation </w:t>
+              <w:t xml:space="preserve">The input value standard deviation </w:t>
             </w:r>
           </w:p>
         </w:tc>
@@ -2652,7 +2712,7 @@
               <w:cnfStyle w:val="000000100000" w:firstRow="0" w:lastRow="0" w:firstColumn="0" w:lastColumn="0" w:oddVBand="0" w:evenVBand="0" w:oddHBand="1" w:evenHBand="0" w:firstRowFirstColumn="0" w:firstRowLastColumn="0" w:lastRowFirstColumn="0" w:lastRowLastColumn="0"/>
             </w:pPr>
             <w:r>
-              <w:t xml:space="preserve">The overall minimum image pixel value </w:t>
+              <w:t xml:space="preserve">The overall minimum input value </w:t>
             </w:r>
           </w:p>
         </w:tc>
@@ -2704,7 +2764,7 @@
               <w:cnfStyle w:val="000000000000" w:firstRow="0" w:lastRow="0" w:firstColumn="0" w:lastColumn="0" w:oddVBand="0" w:evenVBand="0" w:oddHBand="0" w:evenHBand="0" w:firstRowFirstColumn="0" w:firstRowLastColumn="0" w:lastRowFirstColumn="0" w:lastRowLastColumn="0"/>
             </w:pPr>
             <w:r>
-              <w:t xml:space="preserve">The overall maximum image pixel value </w:t>
+              <w:t xml:space="preserve">The overall maximum input value </w:t>
             </w:r>
           </w:p>
         </w:tc>
@@ -2731,7 +2791,6 @@
                 <w:b w:val="0"/>
                 <w:bCs w:val="0"/>
               </w:rPr>
-              <w:lastRenderedPageBreak/>
               <w:t>histogram data</w:t>
             </w:r>
           </w:p>
@@ -3135,7 +3194,7 @@
         <w:pStyle w:val="Normalafterlist"/>
       </w:pPr>
       <w:r>
-        <w:t>Each rho is accessed in the accumulator by bin index rho_index that corresponds to a rho with the value:</w:t>
+        <w:t>Each rho is accessed in the accumulator by bin index rho_index that corresponds to a rho with the formulas:</w:t>
       </w:r>
     </w:p>
     <w:p>
@@ -3151,6 +3210,7 @@
           <w:sz w:val="20"/>
           <w:szCs w:val="20"/>
         </w:rPr>
+        <w:lastRenderedPageBreak/>
         <w:t xml:space="preserve">  rho_index = rho + nrhos / 2</w:t>
       </w:r>
     </w:p>
@@ -3207,35 +3267,7 @@
           <w:sz w:val="20"/>
           <w:szCs w:val="20"/>
         </w:rPr>
-        <w:t xml:space="preserve">  theta</w:t>
-      </w:r>
-      <w:r>
-        <w:rPr>
-          <w:sz w:val="20"/>
-          <w:szCs w:val="20"/>
-        </w:rPr>
-        <w:t xml:space="preserve">_index </w:t>
-      </w:r>
-      <w:r>
-        <w:rPr>
-          <w:sz w:val="20"/>
-          <w:szCs w:val="20"/>
-        </w:rPr>
-        <w:t>= theta degrees</w:t>
-      </w:r>
-      <w:r>
-        <w:rPr>
-          <w:sz w:val="20"/>
-          <w:szCs w:val="20"/>
-        </w:rPr>
-        <w:t xml:space="preserve"> /</w:t>
-      </w:r>
-      <w:r>
-        <w:rPr>
-          <w:sz w:val="20"/>
-          <w:szCs w:val="20"/>
-        </w:rPr>
-        <w:t xml:space="preserve"> theta_inc</w:t>
+        <w:t xml:space="preserve">  theta_index = theta degrees / theta_inc</w:t>
       </w:r>
     </w:p>
     <w:p>
@@ -3251,19 +3283,12 @@
         <w:pStyle w:val="Heading3"/>
       </w:pPr>
       <w:r>
-        <w:lastRenderedPageBreak/>
         <w:t>Hough accumulator data binary file format</w:t>
       </w:r>
     </w:p>
     <w:p>
       <w:r>
-        <w:t xml:space="preserve">Binary </w:t>
-      </w:r>
-      <w:r>
-        <w:t xml:space="preserve">Hough accumulator </w:t>
-      </w:r>
-      <w:r>
-        <w:t>files contain the Hough accumulator counts and some statistics of the accumulator. The binary Hough accumulator data files are defined by the workbench, and include the following fields:</w:t>
+        <w:t>Binary Hough accumulator files contain the Hough accumulator counts. The binary Hough accumulator data files are defined by the workbench, and include the following fields:</w:t>
       </w:r>
     </w:p>
     <w:tbl>
@@ -3535,13 +3560,7 @@
               <w:cnfStyle w:val="000000000000" w:firstRow="0" w:lastRow="0" w:firstColumn="0" w:lastColumn="0" w:oddVBand="0" w:evenVBand="0" w:oddHBand="0" w:evenHBand="0" w:firstRowFirstColumn="0" w:firstRowLastColumn="0" w:lastRowFirstColumn="0" w:lastRowLastColumn="0"/>
             </w:pPr>
             <w:r>
-              <w:t xml:space="preserve">The number of </w:t>
-            </w:r>
-            <w:r>
-              <w:t>columns</w:t>
-            </w:r>
-            <w:r>
-              <w:t xml:space="preserve"> in the image used to create the accumulator</w:t>
+              <w:t>The number of columns in the image used to create the accumulator</w:t>
             </w:r>
           </w:p>
         </w:tc>
@@ -3695,7 +3714,7 @@
         </w:rPr>
       </w:pPr>
       <w:r>
-        <w:t>Histogram peaks are polar (rho, theta) lines selected from the Hough accumulator. Each peak includes the accumulator count for that line.</w:t>
+        <w:t>Histogram peaks are polar (rho, theta) lines selected from the Hough accumulator for a given image. Each peak includes the accumulator count for that line.</w:t>
       </w:r>
     </w:p>
     <w:p>
@@ -3708,7 +3727,7 @@
     </w:p>
     <w:p>
       <w:r>
-        <w:t>The binary Hough peak line data is defined by the workbench, and have the following format. Polar line data is stored as (rho_index, theta_index). The corresponding rho and theta can be derived from:</w:t>
+        <w:t>The binary Hough peak line data is defined by the workbench and has the following format. Polar line data is stored as (rho_index, theta_index). The corresponding rho and theta can be derived from:</w:t>
       </w:r>
     </w:p>
     <w:p>
@@ -3743,7 +3762,15 @@
         <w:t>theta degrees = theta_index * theta_inc</w:t>
       </w:r>
     </w:p>
-    <w:p/>
+    <w:p>
+      <w:pPr>
+        <w:pStyle w:val="code"/>
+        <w:rPr>
+          <w:sz w:val="20"/>
+          <w:szCs w:val="20"/>
+        </w:rPr>
+      </w:pPr>
+    </w:p>
     <w:tbl>
       <w:tblPr>
         <w:tblStyle w:val="PlainTable1"/>
@@ -3985,6 +4012,7 @@
                 <w:b w:val="0"/>
                 <w:bCs w:val="0"/>
               </w:rPr>
+              <w:lastRenderedPageBreak/>
               <w:t>Hough peak line data</w:t>
             </w:r>
           </w:p>
@@ -4052,7 +4080,6 @@
         <w:pStyle w:val="Heading1"/>
       </w:pPr>
       <w:r>
-        <w:lastRenderedPageBreak/>
         <w:t>Scripts</w:t>
       </w:r>
     </w:p>
@@ -4407,11 +4434,6 @@
       <w:pPr>
         <w:pStyle w:val="Normalafterlist"/>
       </w:pPr>
-      <w:r>
-        <w:t>Multiple data descriptors may be specified for a step, for example if multiple input data sources are combined to produce the output, or for example if it is desired to produce both the binary and text formats for histogram data.</w:t>
-      </w:r>
-    </w:p>
-    <w:p>
       <w:r>
         <w:t xml:space="preserve">Each </w:t>
       </w:r>
@@ -4467,7 +4489,7 @@
         <w:pStyle w:val="Normalafterlist"/>
       </w:pPr>
       <w:r>
-        <w:t>The input-data-descriptors and output-data-descriptors are specified with:</w:t>
+        <w:t>Multiple data descriptors may be specified for a step, for example if multiple input data sources are combined to produce the output, or if it is desired to produce both the binary and text formats for histogram data. The input-data-descriptors and output-data-descriptors are specified with:</w:t>
       </w:r>
     </w:p>
     <w:p>
@@ -4634,6 +4656,7 @@
         <w:pStyle w:val="Heading2"/>
       </w:pPr>
       <w:r>
+        <w:lastRenderedPageBreak/>
         <w:t>Data Descriptors</w:t>
       </w:r>
     </w:p>
@@ -4676,6 +4699,8 @@
       <w:tr>
         <w:trPr>
           <w:cnfStyle w:val="100000000000" w:firstRow="1" w:lastRow="0" w:firstColumn="0" w:lastColumn="0" w:oddVBand="0" w:evenVBand="0" w:oddHBand="0" w:evenHBand="0" w:firstRowFirstColumn="0" w:firstRowLastColumn="0" w:lastRowFirstColumn="0" w:lastRowLastColumn="0"/>
+          <w:cantSplit/>
+          <w:tblHeader/>
         </w:trPr>
         <w:tc>
           <w:tcPr>
@@ -4835,7 +4860,6 @@
               <w:cnfStyle w:val="000000000000" w:firstRow="0" w:lastRow="0" w:firstColumn="0" w:lastColumn="0" w:oddVBand="0" w:evenVBand="0" w:oddHBand="0" w:evenHBand="0" w:firstRowFirstColumn="0" w:firstRowLastColumn="0" w:lastRowFirstColumn="0" w:lastRowLastColumn="0"/>
             </w:pPr>
             <w:r>
-              <w:lastRenderedPageBreak/>
               <w:t>“text” for output text histogram data to display using gnuplot</w:t>
             </w:r>
           </w:p>
@@ -4862,7 +4886,6 @@
                 <w:b w:val="0"/>
                 <w:bCs w:val="0"/>
               </w:rPr>
-              <w:lastRenderedPageBreak/>
               <w:t>Hough accumulator data</w:t>
             </w:r>
           </w:p>
@@ -4981,6 +5004,8 @@
       <w:tr>
         <w:trPr>
           <w:cnfStyle w:val="100000000000" w:firstRow="1" w:lastRow="0" w:firstColumn="0" w:lastColumn="0" w:oddVBand="0" w:evenVBand="0" w:oddHBand="0" w:evenHBand="0" w:firstRowFirstColumn="0" w:firstRowLastColumn="0" w:lastRowFirstColumn="0" w:lastRowLastColumn="0"/>
+          <w:cantSplit/>
+          <w:tblHeader/>
         </w:trPr>
         <w:tc>
           <w:tcPr>
@@ -5277,7 +5302,7 @@
         <w:pStyle w:val="Normalafterlist"/>
       </w:pPr>
       <w:r>
-        <w:t>The filesystem data repository supports all data types and data formats listed above. The file path read from or written to is “[</w:t>
+        <w:t>The filesystem data repository supports all data types and data formats listed above. The file path associated with the data descriptor is “</w:t>
       </w:r>
       <w:r>
         <w:rPr>
@@ -5287,7 +5312,7 @@
         <w:t>directory</w:t>
       </w:r>
       <w:r>
-        <w:t>/]</w:t>
+        <w:t>/</w:t>
       </w:r>
       <w:r>
         <w:rPr>
@@ -5330,7 +5355,7 @@
         <w:t>boldface</w:t>
       </w:r>
       <w:r>
-        <w:t>:</w:t>
+        <w:t>. The log results added for the experiment are:</w:t>
       </w:r>
     </w:p>
     <w:p>
@@ -5449,6 +5474,7 @@
           <w:b/>
           <w:bCs/>
         </w:rPr>
+        <w:lastRenderedPageBreak/>
         <w:tab/>
         <w:t xml:space="preserve">        “username”: “</w:t>
       </w:r>
@@ -5680,7 +5706,6 @@
         <w:pStyle w:val="Normalafterlist"/>
       </w:pPr>
       <w:r>
-        <w:lastRenderedPageBreak/>
         <w:t xml:space="preserve">Results added to each </w:t>
       </w:r>
       <w:r>
@@ -6283,7 +6308,7 @@
       </w:r>
     </w:p>
     <w:p>
-      <w:hyperlink r:id="rId16" w:history="1">
+      <w:hyperlink r:id="rId18" w:history="1">
         <w:r>
           <w:rPr>
             <w:rStyle w:val="Hyperlink"/>
@@ -6298,7 +6323,7 @@
       </w:r>
     </w:p>
     <w:p>
-      <w:hyperlink r:id="rId17" w:history="1">
+      <w:hyperlink r:id="rId19" w:history="1">
         <w:r>
           <w:rPr>
             <w:rStyle w:val="Hyperlink"/>
@@ -6311,7 +6336,7 @@
       <w:r>
         <w:t xml:space="preserve">The program can be run under an Intel-based Linux distribution such as </w:t>
       </w:r>
-      <w:hyperlink r:id="rId18" w:history="1">
+      <w:hyperlink r:id="rId20" w:history="1">
         <w:r>
           <w:rPr>
             <w:rStyle w:val="Hyperlink"/>
@@ -6322,7 +6347,7 @@
       <w:r>
         <w:t xml:space="preserve">. A version of Linux under which the program can be run on Windows 10 that is fairly easy to install uses </w:t>
       </w:r>
-      <w:hyperlink r:id="rId19" w:history="1">
+      <w:hyperlink r:id="rId21" w:history="1">
         <w:r>
           <w:rPr>
             <w:rStyle w:val="Hyperlink"/>
@@ -6371,7 +6396,6 @@
         <w:pStyle w:val="Normalafterlist"/>
       </w:pPr>
       <w:r>
-        <w:lastRenderedPageBreak/>
         <w:t xml:space="preserve">The </w:t>
       </w:r>
       <w:r>
@@ -7251,6 +7275,7 @@
               <w:pStyle w:val="code"/>
             </w:pPr>
             <w:r>
+              <w:lastRenderedPageBreak/>
               <w:t xml:space="preserve">      "type": "image",</w:t>
             </w:r>
           </w:p>
@@ -7320,7 +7345,12 @@
               <w:cnfStyle w:val="000000100000" w:firstRow="0" w:lastRow="0" w:firstColumn="0" w:lastColumn="0" w:oddVBand="0" w:evenVBand="0" w:oddHBand="1" w:evenHBand="0" w:firstRowFirstColumn="0" w:firstRowLastColumn="0" w:lastRowFirstColumn="0" w:lastRowLastColumn="0"/>
             </w:pPr>
             <w:r>
-              <w:t>The output data for the operator is a CV_32S binary image file named “square45-90_sobel_gray.bin” in the current directory. The Sobel operator defines that the image is CV_32S.</w:t>
+              <w:lastRenderedPageBreak/>
+              <w:t>The output data for the operator is a CV_32S binary image file named “square45-</w:t>
+            </w:r>
+            <w:r>
+              <w:lastRenderedPageBreak/>
+              <w:t>90_sobel_gray.bin” in the current directory. The Sobel operator defines that the image is CV_32S.</w:t>
             </w:r>
           </w:p>
         </w:tc>
@@ -7336,6 +7366,7 @@
               <w:pStyle w:val="code"/>
             </w:pPr>
             <w:r>
+              <w:lastRenderedPageBreak/>
               <w:t xml:space="preserve">  "parameters": {</w:t>
             </w:r>
           </w:p>
@@ -7414,7 +7445,6 @@
         <w:pStyle w:val="Heading3"/>
       </w:pPr>
       <w:r>
-        <w:lastRenderedPageBreak/>
         <w:t xml:space="preserve">Image Intensity Map Operator script experiment step </w:t>
       </w:r>
     </w:p>
@@ -8316,6 +8346,7 @@
               <w:pStyle w:val="code"/>
             </w:pPr>
             <w:r>
+              <w:lastRenderedPageBreak/>
               <w:t xml:space="preserve">      "repository": "filesystem",</w:t>
             </w:r>
           </w:p>
@@ -8377,7 +8408,12 @@
               <w:cnfStyle w:val="000000100000" w:firstRow="0" w:lastRow="0" w:firstColumn="0" w:lastColumn="0" w:oddVBand="0" w:evenVBand="0" w:oddHBand="1" w:evenHBand="0" w:firstRowFirstColumn="0" w:firstRowLastColumn="0" w:lastRowFirstColumn="0" w:lastRowLastColumn="0"/>
             </w:pPr>
             <w:r>
-              <w:t>The output data for the operator is a CV_8U binary JPEG file named “square45-90_sobel_gray.jpg” in the current directory. The CV_8U depth is implied by specifying a JPEG output format.</w:t>
+              <w:lastRenderedPageBreak/>
+              <w:t xml:space="preserve">The output data for the operator is a CV_8U binary JPEG file named “square45-90_sobel_gray.jpg” in the current directory. </w:t>
+            </w:r>
+            <w:r>
+              <w:lastRenderedPageBreak/>
+              <w:t>The CV_8U depth is implied by specifying a JPEG output format.</w:t>
             </w:r>
           </w:p>
         </w:tc>
@@ -8393,6 +8429,7 @@
               <w:pStyle w:val="code"/>
             </w:pPr>
             <w:r>
+              <w:lastRenderedPageBreak/>
               <w:t xml:space="preserve">  "parameters": {</w:t>
             </w:r>
           </w:p>
@@ -8457,13 +8494,12 @@
         <w:pStyle w:val="Heading1"/>
       </w:pPr>
       <w:r>
-        <w:lastRenderedPageBreak/>
         <w:t>Operators</w:t>
       </w:r>
     </w:p>
     <w:p>
       <w:r>
-        <w:t>Operators are predefined for various domains and classes as indicated below. The current version supports only a limited set of operators, but more are added for each release. The following operators are currently defined:</w:t>
+        <w:t>Operators are predefined for various domains and classes as indicated below. The current version supports only a limited set of operators, but more are added for each release. The following operators are currently defined. Those marked with ‘*’ are not yet implemented in the current version.</w:t>
       </w:r>
     </w:p>
     <w:tbl>
@@ -8476,7 +8512,8 @@
         <w:gridCol w:w="1219"/>
         <w:gridCol w:w="1036"/>
         <w:gridCol w:w="1366"/>
-        <w:gridCol w:w="5729"/>
+        <w:gridCol w:w="302"/>
+        <w:gridCol w:w="5427"/>
       </w:tblGrid>
       <w:tr>
         <w:trPr>
@@ -8535,6 +8572,17 @@
               <w:pStyle w:val="NoSpacing"/>
               <w:cnfStyle w:val="100000000000" w:firstRow="1" w:lastRow="0" w:firstColumn="0" w:lastColumn="0" w:oddVBand="0" w:evenVBand="0" w:oddHBand="0" w:evenHBand="0" w:firstRowFirstColumn="0" w:firstRowLastColumn="0" w:lastRowFirstColumn="0" w:lastRowLastColumn="0"/>
             </w:pPr>
+          </w:p>
+        </w:tc>
+        <w:tc>
+          <w:tcPr>
+            <w:tcW w:w="0" w:type="auto"/>
+          </w:tcPr>
+          <w:p>
+            <w:pPr>
+              <w:pStyle w:val="NoSpacing"/>
+              <w:cnfStyle w:val="100000000000" w:firstRow="1" w:lastRow="0" w:firstColumn="0" w:lastColumn="0" w:oddVBand="0" w:evenVBand="0" w:oddHBand="0" w:evenHBand="0" w:firstRowFirstColumn="0" w:firstRowLastColumn="0" w:lastRowFirstColumn="0" w:lastRowLastColumn="0"/>
+            </w:pPr>
             <w:r>
               <w:t>Description</w:t>
             </w:r>
@@ -8605,6 +8653,20 @@
               <w:cnfStyle w:val="000000100000" w:firstRow="0" w:lastRow="0" w:firstColumn="0" w:lastColumn="0" w:oddVBand="0" w:evenVBand="0" w:oddHBand="1" w:evenHBand="0" w:firstRowFirstColumn="0" w:firstRowLastColumn="0" w:lastRowFirstColumn="0" w:lastRowLastColumn="0"/>
             </w:pPr>
             <w:r>
+              <w:t>*</w:t>
+            </w:r>
+          </w:p>
+        </w:tc>
+        <w:tc>
+          <w:tcPr>
+            <w:tcW w:w="0" w:type="auto"/>
+          </w:tcPr>
+          <w:p>
+            <w:pPr>
+              <w:pStyle w:val="NoSpacing"/>
+              <w:cnfStyle w:val="000000100000" w:firstRow="0" w:lastRow="0" w:firstColumn="0" w:lastColumn="0" w:oddVBand="0" w:evenVBand="0" w:oddHBand="1" w:evenHBand="0" w:firstRowFirstColumn="0" w:firstRowLastColumn="0" w:lastRowFirstColumn="0" w:lastRowLastColumn="0"/>
+            </w:pPr>
+            <w:r>
               <w:t>Difference of Gaussian edge operator</w:t>
             </w:r>
           </w:p>
@@ -8659,6 +8721,17 @@
             <w:r>
               <w:t>Kirsch</w:t>
             </w:r>
+          </w:p>
+        </w:tc>
+        <w:tc>
+          <w:tcPr>
+            <w:tcW w:w="0" w:type="auto"/>
+          </w:tcPr>
+          <w:p>
+            <w:pPr>
+              <w:pStyle w:val="NoSpacing"/>
+              <w:cnfStyle w:val="000000000000" w:firstRow="0" w:lastRow="0" w:firstColumn="0" w:lastColumn="0" w:oddVBand="0" w:evenVBand="0" w:oddHBand="0" w:evenHBand="0" w:firstRowFirstColumn="0" w:firstRowLastColumn="0" w:lastRowFirstColumn="0" w:lastRowLastColumn="0"/>
+            </w:pPr>
           </w:p>
         </w:tc>
         <w:tc>
@@ -8740,6 +8813,20 @@
               <w:cnfStyle w:val="000000100000" w:firstRow="0" w:lastRow="0" w:firstColumn="0" w:lastColumn="0" w:oddVBand="0" w:evenVBand="0" w:oddHBand="1" w:evenHBand="0" w:firstRowFirstColumn="0" w:firstRowLastColumn="0" w:lastRowFirstColumn="0" w:lastRowLastColumn="0"/>
             </w:pPr>
             <w:r>
+              <w:t>*</w:t>
+            </w:r>
+          </w:p>
+        </w:tc>
+        <w:tc>
+          <w:tcPr>
+            <w:tcW w:w="0" w:type="auto"/>
+          </w:tcPr>
+          <w:p>
+            <w:pPr>
+              <w:pStyle w:val="NoSpacing"/>
+              <w:cnfStyle w:val="000000100000" w:firstRow="0" w:lastRow="0" w:firstColumn="0" w:lastColumn="0" w:oddVBand="0" w:evenVBand="0" w:oddHBand="1" w:evenHBand="0" w:firstRowFirstColumn="0" w:firstRowLastColumn="0" w:lastRowFirstColumn="0" w:lastRowLastColumn="0"/>
+            </w:pPr>
+            <w:r>
               <w:t>Laplacian of Gaussian detector</w:t>
             </w:r>
           </w:p>
@@ -8794,6 +8881,17 @@
             <w:r>
               <w:t>Prewitt</w:t>
             </w:r>
+          </w:p>
+        </w:tc>
+        <w:tc>
+          <w:tcPr>
+            <w:tcW w:w="0" w:type="auto"/>
+          </w:tcPr>
+          <w:p>
+            <w:pPr>
+              <w:pStyle w:val="NoSpacing"/>
+              <w:cnfStyle w:val="000000000000" w:firstRow="0" w:lastRow="0" w:firstColumn="0" w:lastColumn="0" w:oddVBand="0" w:evenVBand="0" w:oddHBand="0" w:evenHBand="0" w:firstRowFirstColumn="0" w:firstRowLastColumn="0" w:lastRowFirstColumn="0" w:lastRowLastColumn="0"/>
+            </w:pPr>
           </w:p>
         </w:tc>
         <w:tc>
@@ -8874,6 +8972,17 @@
               <w:pStyle w:val="NoSpacing"/>
               <w:cnfStyle w:val="000000100000" w:firstRow="0" w:lastRow="0" w:firstColumn="0" w:lastColumn="0" w:oddVBand="0" w:evenVBand="0" w:oddHBand="1" w:evenHBand="0" w:firstRowFirstColumn="0" w:firstRowLastColumn="0" w:lastRowFirstColumn="0" w:lastRowLastColumn="0"/>
             </w:pPr>
+          </w:p>
+        </w:tc>
+        <w:tc>
+          <w:tcPr>
+            <w:tcW w:w="0" w:type="auto"/>
+          </w:tcPr>
+          <w:p>
+            <w:pPr>
+              <w:pStyle w:val="NoSpacing"/>
+              <w:cnfStyle w:val="000000100000" w:firstRow="0" w:lastRow="0" w:firstColumn="0" w:lastColumn="0" w:oddVBand="0" w:evenVBand="0" w:oddHBand="1" w:evenHBand="0" w:firstRowFirstColumn="0" w:firstRowLastColumn="0" w:lastRowFirstColumn="0" w:lastRowLastColumn="0"/>
+            </w:pPr>
             <w:r>
               <w:t>Roberts edge operator</w:t>
             </w:r>
@@ -8929,6 +9038,17 @@
             <w:r>
               <w:t>Sobel</w:t>
             </w:r>
+          </w:p>
+        </w:tc>
+        <w:tc>
+          <w:tcPr>
+            <w:tcW w:w="0" w:type="auto"/>
+          </w:tcPr>
+          <w:p>
+            <w:pPr>
+              <w:pStyle w:val="NoSpacing"/>
+              <w:cnfStyle w:val="000000000000" w:firstRow="0" w:lastRow="0" w:firstColumn="0" w:lastColumn="0" w:oddVBand="0" w:evenVBand="0" w:oddHBand="0" w:evenHBand="0" w:firstRowFirstColumn="0" w:firstRowLastColumn="0" w:lastRowFirstColumn="0" w:lastRowLastColumn="0"/>
+            </w:pPr>
           </w:p>
         </w:tc>
         <w:tc>
@@ -9010,6 +9130,20 @@
               <w:cnfStyle w:val="000000100000" w:firstRow="0" w:lastRow="0" w:firstColumn="0" w:lastColumn="0" w:oddVBand="0" w:evenVBand="0" w:oddHBand="1" w:evenHBand="0" w:firstRowFirstColumn="0" w:firstRowLastColumn="0" w:lastRowFirstColumn="0" w:lastRowLastColumn="0"/>
             </w:pPr>
             <w:r>
+              <w:t>*</w:t>
+            </w:r>
+          </w:p>
+        </w:tc>
+        <w:tc>
+          <w:tcPr>
+            <w:tcW w:w="0" w:type="auto"/>
+          </w:tcPr>
+          <w:p>
+            <w:pPr>
+              <w:pStyle w:val="NoSpacing"/>
+              <w:cnfStyle w:val="000000100000" w:firstRow="0" w:lastRow="0" w:firstColumn="0" w:lastColumn="0" w:oddVBand="0" w:evenVBand="0" w:oddHBand="1" w:evenHBand="0" w:firstRowFirstColumn="0" w:firstRowLastColumn="0" w:lastRowFirstColumn="0" w:lastRowLastColumn="0"/>
+            </w:pPr>
+            <w:r>
               <w:t>Average smoothing operator</w:t>
             </w:r>
           </w:p>
@@ -9063,6 +9197,20 @@
             </w:pPr>
             <w:r>
               <w:t>Gaussian</w:t>
+            </w:r>
+          </w:p>
+        </w:tc>
+        <w:tc>
+          <w:tcPr>
+            <w:tcW w:w="0" w:type="auto"/>
+          </w:tcPr>
+          <w:p>
+            <w:pPr>
+              <w:pStyle w:val="NoSpacing"/>
+              <w:cnfStyle w:val="000000000000" w:firstRow="0" w:lastRow="0" w:firstColumn="0" w:lastColumn="0" w:oddVBand="0" w:evenVBand="0" w:oddHBand="0" w:evenHBand="0" w:firstRowFirstColumn="0" w:firstRowLastColumn="0" w:lastRowFirstColumn="0" w:lastRowLastColumn="0"/>
+            </w:pPr>
+            <w:r>
+              <w:t>*</w:t>
             </w:r>
           </w:p>
         </w:tc>
@@ -9141,6 +9289,20 @@
               <w:cnfStyle w:val="000000100000" w:firstRow="0" w:lastRow="0" w:firstColumn="0" w:lastColumn="0" w:oddVBand="0" w:evenVBand="0" w:oddHBand="1" w:evenHBand="0" w:firstRowFirstColumn="0" w:firstRowLastColumn="0" w:lastRowFirstColumn="0" w:lastRowLastColumn="0"/>
             </w:pPr>
             <w:r>
+              <w:t>*</w:t>
+            </w:r>
+          </w:p>
+        </w:tc>
+        <w:tc>
+          <w:tcPr>
+            <w:tcW w:w="0" w:type="auto"/>
+          </w:tcPr>
+          <w:p>
+            <w:pPr>
+              <w:pStyle w:val="NoSpacing"/>
+              <w:cnfStyle w:val="000000100000" w:firstRow="0" w:lastRow="0" w:firstColumn="0" w:lastColumn="0" w:oddVBand="0" w:evenVBand="0" w:oddHBand="1" w:evenHBand="0" w:firstRowFirstColumn="0" w:firstRowLastColumn="0" w:lastRowFirstColumn="0" w:lastRowLastColumn="0"/>
+            </w:pPr>
+            <w:r>
               <w:t>Average smoothing operator</w:t>
             </w:r>
           </w:p>
@@ -9194,6 +9356,20 @@
             </w:pPr>
             <w:r>
               <w:t>Create</w:t>
+            </w:r>
+          </w:p>
+        </w:tc>
+        <w:tc>
+          <w:tcPr>
+            <w:tcW w:w="0" w:type="auto"/>
+          </w:tcPr>
+          <w:p>
+            <w:pPr>
+              <w:pStyle w:val="NoSpacing"/>
+              <w:cnfStyle w:val="000000000000" w:firstRow="0" w:lastRow="0" w:firstColumn="0" w:lastColumn="0" w:oddVBand="0" w:evenVBand="0" w:oddHBand="0" w:evenHBand="0" w:firstRowFirstColumn="0" w:firstRowLastColumn="0" w:lastRowFirstColumn="0" w:lastRowLastColumn="0"/>
+            </w:pPr>
+            <w:r>
+              <w:t>*</w:t>
             </w:r>
           </w:p>
         </w:tc>
@@ -9275,6 +9451,17 @@
               <w:pStyle w:val="NoSpacing"/>
               <w:cnfStyle w:val="000000100000" w:firstRow="0" w:lastRow="0" w:firstColumn="0" w:lastColumn="0" w:oddVBand="0" w:evenVBand="0" w:oddHBand="1" w:evenHBand="0" w:firstRowFirstColumn="0" w:firstRowLastColumn="0" w:lastRowFirstColumn="0" w:lastRowLastColumn="0"/>
             </w:pPr>
+          </w:p>
+        </w:tc>
+        <w:tc>
+          <w:tcPr>
+            <w:tcW w:w="0" w:type="auto"/>
+          </w:tcPr>
+          <w:p>
+            <w:pPr>
+              <w:pStyle w:val="NoSpacing"/>
+              <w:cnfStyle w:val="000000100000" w:firstRow="0" w:lastRow="0" w:firstColumn="0" w:lastColumn="0" w:oddVBand="0" w:evenVBand="0" w:oddHBand="1" w:evenHBand="0" w:firstRowFirstColumn="0" w:firstRowLastColumn="0" w:lastRowFirstColumn="0" w:lastRowLastColumn="0"/>
+            </w:pPr>
             <w:r>
               <w:t>Histogram pixel value counts for an image</w:t>
             </w:r>
@@ -9329,6 +9516,20 @@
             </w:pPr>
             <w:r>
               <w:t>Detect</w:t>
+            </w:r>
+          </w:p>
+        </w:tc>
+        <w:tc>
+          <w:tcPr>
+            <w:tcW w:w="0" w:type="auto"/>
+          </w:tcPr>
+          <w:p>
+            <w:pPr>
+              <w:pStyle w:val="NoSpacing"/>
+              <w:cnfStyle w:val="000000000000" w:firstRow="0" w:lastRow="0" w:firstColumn="0" w:lastColumn="0" w:oddVBand="0" w:evenVBand="0" w:oddHBand="0" w:evenHBand="0" w:firstRowFirstColumn="0" w:firstRowLastColumn="0" w:lastRowFirstColumn="0" w:lastRowLastColumn="0"/>
+            </w:pPr>
+            <w:r>
+              <w:t>*</w:t>
             </w:r>
           </w:p>
         </w:tc>
@@ -9410,6 +9611,17 @@
               <w:pStyle w:val="NoSpacing"/>
               <w:cnfStyle w:val="000000100000" w:firstRow="0" w:lastRow="0" w:firstColumn="0" w:lastColumn="0" w:oddVBand="0" w:evenVBand="0" w:oddHBand="1" w:evenHBand="0" w:firstRowFirstColumn="0" w:firstRowLastColumn="0" w:lastRowFirstColumn="0" w:lastRowLastColumn="0"/>
             </w:pPr>
+          </w:p>
+        </w:tc>
+        <w:tc>
+          <w:tcPr>
+            <w:tcW w:w="0" w:type="auto"/>
+          </w:tcPr>
+          <w:p>
+            <w:pPr>
+              <w:pStyle w:val="NoSpacing"/>
+              <w:cnfStyle w:val="000000100000" w:firstRow="0" w:lastRow="0" w:firstColumn="0" w:lastColumn="0" w:oddVBand="0" w:evenVBand="0" w:oddHBand="1" w:evenHBand="0" w:firstRowFirstColumn="0" w:firstRowLastColumn="0" w:lastRowFirstColumn="0" w:lastRowLastColumn="0"/>
+            </w:pPr>
             <w:r>
               <w:t>Draw an image line segment for a polar (rho, theta) line</w:t>
             </w:r>
@@ -9465,6 +9677,17 @@
             <w:r>
               <w:t>Create</w:t>
             </w:r>
+          </w:p>
+        </w:tc>
+        <w:tc>
+          <w:tcPr>
+            <w:tcW w:w="0" w:type="auto"/>
+          </w:tcPr>
+          <w:p>
+            <w:pPr>
+              <w:pStyle w:val="NoSpacing"/>
+              <w:cnfStyle w:val="000000000000" w:firstRow="0" w:lastRow="0" w:firstColumn="0" w:lastColumn="0" w:oddVBand="0" w:evenVBand="0" w:oddHBand="0" w:evenHBand="0" w:firstRowFirstColumn="0" w:firstRowLastColumn="0" w:lastRowFirstColumn="0" w:lastRowLastColumn="0"/>
+            </w:pPr>
           </w:p>
         </w:tc>
         <w:tc>
@@ -9545,6 +9768,17 @@
               <w:pStyle w:val="NoSpacing"/>
               <w:cnfStyle w:val="000000100000" w:firstRow="0" w:lastRow="0" w:firstColumn="0" w:lastColumn="0" w:oddVBand="0" w:evenVBand="0" w:oddHBand="1" w:evenHBand="0" w:firstRowFirstColumn="0" w:firstRowLastColumn="0" w:lastRowFirstColumn="0" w:lastRowLastColumn="0"/>
             </w:pPr>
+          </w:p>
+        </w:tc>
+        <w:tc>
+          <w:tcPr>
+            <w:tcW w:w="0" w:type="auto"/>
+          </w:tcPr>
+          <w:p>
+            <w:pPr>
+              <w:pStyle w:val="NoSpacing"/>
+              <w:cnfStyle w:val="000000100000" w:firstRow="0" w:lastRow="0" w:firstColumn="0" w:lastColumn="0" w:oddVBand="0" w:evenVBand="0" w:oddHBand="1" w:evenHBand="0" w:firstRowFirstColumn="0" w:firstRowLastColumn="0" w:lastRowFirstColumn="0" w:lastRowLastColumn="0"/>
+            </w:pPr>
             <w:r>
               <w:t>Find Hough peak lines exceeding a threshold</w:t>
             </w:r>
@@ -9599,6 +9833,20 @@
             </w:pPr>
             <w:r>
               <w:t>Copy</w:t>
+            </w:r>
+          </w:p>
+        </w:tc>
+        <w:tc>
+          <w:tcPr>
+            <w:tcW w:w="0" w:type="auto"/>
+          </w:tcPr>
+          <w:p>
+            <w:pPr>
+              <w:pStyle w:val="NoSpacing"/>
+              <w:cnfStyle w:val="000000000000" w:firstRow="0" w:lastRow="0" w:firstColumn="0" w:lastColumn="0" w:oddVBand="0" w:evenVBand="0" w:oddHBand="0" w:evenHBand="0" w:firstRowFirstColumn="0" w:firstRowLastColumn="0" w:lastRowFirstColumn="0" w:lastRowLastColumn="0"/>
+            </w:pPr>
+            <w:r>
+              <w:t>*</w:t>
             </w:r>
           </w:p>
         </w:tc>
@@ -9681,6 +9929,20 @@
               <w:cnfStyle w:val="000000100000" w:firstRow="0" w:lastRow="0" w:firstColumn="0" w:lastColumn="0" w:oddVBand="0" w:evenVBand="0" w:oddHBand="1" w:evenHBand="0" w:firstRowFirstColumn="0" w:firstRowLastColumn="0" w:lastRowFirstColumn="0" w:lastRowLastColumn="0"/>
             </w:pPr>
             <w:r>
+              <w:t>*</w:t>
+            </w:r>
+          </w:p>
+        </w:tc>
+        <w:tc>
+          <w:tcPr>
+            <w:tcW w:w="0" w:type="auto"/>
+          </w:tcPr>
+          <w:p>
+            <w:pPr>
+              <w:pStyle w:val="NoSpacing"/>
+              <w:cnfStyle w:val="000000100000" w:firstRow="0" w:lastRow="0" w:firstColumn="0" w:lastColumn="0" w:oddVBand="0" w:evenVBand="0" w:oddHBand="1" w:evenHBand="0" w:firstRowFirstColumn="0" w:firstRowLastColumn="0" w:lastRowFirstColumn="0" w:lastRowLastColumn="0"/>
+            </w:pPr>
+            <w:r>
               <w:t>Map binary images with dilate, erode, open, close, gradient, top hat, or black at morphology transforms.</w:t>
             </w:r>
           </w:p>
@@ -9735,6 +9997,17 @@
             <w:r>
               <w:t>Map</w:t>
             </w:r>
+          </w:p>
+        </w:tc>
+        <w:tc>
+          <w:tcPr>
+            <w:tcW w:w="0" w:type="auto"/>
+          </w:tcPr>
+          <w:p>
+            <w:pPr>
+              <w:pStyle w:val="NoSpacing"/>
+              <w:cnfStyle w:val="000000000000" w:firstRow="0" w:lastRow="0" w:firstColumn="0" w:lastColumn="0" w:oddVBand="0" w:evenVBand="0" w:oddHBand="0" w:evenHBand="0" w:firstRowFirstColumn="0" w:firstRowLastColumn="0" w:lastRowFirstColumn="0" w:lastRowLastColumn="0"/>
+            </w:pPr>
           </w:p>
         </w:tc>
         <w:tc>
@@ -9775,6 +10048,8 @@
       <w:tr>
         <w:trPr>
           <w:cnfStyle w:val="100000000000" w:firstRow="1" w:lastRow="0" w:firstColumn="0" w:lastColumn="0" w:oddVBand="0" w:evenVBand="0" w:oddHBand="0" w:evenHBand="0" w:firstRowFirstColumn="0" w:firstRowLastColumn="0" w:lastRowFirstColumn="0" w:lastRowLastColumn="0"/>
+          <w:cantSplit/>
+          <w:tblHeader/>
         </w:trPr>
         <w:tc>
           <w:tcPr>
@@ -9953,6 +10228,7 @@
               <w:pStyle w:val="NoSpacing"/>
             </w:pPr>
             <w:r>
+              <w:lastRenderedPageBreak/>
               <w:t>Hough</w:t>
             </w:r>
           </w:p>
@@ -10127,7 +10403,6 @@
               <w:pStyle w:val="NoSpacing"/>
             </w:pPr>
             <w:r>
-              <w:lastRenderedPageBreak/>
               <w:t>orientation</w:t>
             </w:r>
           </w:p>
@@ -10731,6 +11006,8 @@
       <w:tr>
         <w:trPr>
           <w:cnfStyle w:val="100000000000" w:firstRow="1" w:lastRow="0" w:firstColumn="0" w:lastColumn="0" w:oddVBand="0" w:evenVBand="0" w:oddHBand="0" w:evenHBand="0" w:firstRowFirstColumn="0" w:firstRowLastColumn="0" w:lastRowFirstColumn="0" w:lastRowLastColumn="0"/>
+          <w:cantSplit/>
+          <w:tblHeader/>
         </w:trPr>
         <w:tc>
           <w:tcPr>
@@ -11138,6 +11415,7 @@
         <w:pStyle w:val="Heading2"/>
       </w:pPr>
       <w:r>
+        <w:lastRenderedPageBreak/>
         <w:t>filter-edge-laplacian Operator</w:t>
       </w:r>
     </w:p>
@@ -11466,7 +11744,6 @@
                 <w:b w:val="0"/>
                 <w:bCs w:val="0"/>
               </w:rPr>
-              <w:lastRenderedPageBreak/>
               <w:t>output</w:t>
             </w:r>
           </w:p>
@@ -11547,6 +11824,8 @@
       <w:tr>
         <w:trPr>
           <w:cnfStyle w:val="100000000000" w:firstRow="1" w:lastRow="0" w:firstColumn="0" w:lastColumn="0" w:oddVBand="0" w:evenVBand="0" w:oddHBand="0" w:evenHBand="0" w:firstRowFirstColumn="0" w:firstRowLastColumn="0" w:lastRowFirstColumn="0" w:lastRowLastColumn="0"/>
+          <w:cantSplit/>
+          <w:tblHeader/>
         </w:trPr>
         <w:tc>
           <w:tcPr>
@@ -12337,6 +12616,7 @@
         <w:pStyle w:val="Normalafterlist"/>
       </w:pPr>
       <w:r>
+        <w:lastRenderedPageBreak/>
         <w:t>The parameter to the Roberts operator is:</w:t>
       </w:r>
     </w:p>
@@ -12354,6 +12634,8 @@
       <w:tr>
         <w:trPr>
           <w:cnfStyle w:val="100000000000" w:firstRow="1" w:lastRow="0" w:firstColumn="0" w:lastColumn="0" w:oddVBand="0" w:evenVBand="0" w:oddHBand="0" w:evenHBand="0" w:firstRowFirstColumn="0" w:firstRowLastColumn="0" w:lastRowFirstColumn="0" w:lastRowLastColumn="0"/>
+          <w:cantSplit/>
+          <w:tblHeader/>
         </w:trPr>
         <w:tc>
           <w:tcPr>
@@ -12679,7 +12961,6 @@
                 <w:sz w:val="20"/>
                 <w:szCs w:val="20"/>
               </w:rPr>
-              <w:lastRenderedPageBreak/>
               <w:t>CV_8U has value 0</w:t>
             </w:r>
           </w:p>
@@ -12737,7 +13018,6 @@
                 <w:b w:val="0"/>
                 <w:bCs w:val="0"/>
               </w:rPr>
-              <w:lastRenderedPageBreak/>
               <w:t>pixel count</w:t>
             </w:r>
           </w:p>
@@ -13572,6 +13852,7 @@
         <w:pStyle w:val="Heading2"/>
       </w:pPr>
       <w:r>
+        <w:lastRenderedPageBreak/>
         <w:t>histogram-image-create Operator</w:t>
       </w:r>
     </w:p>
@@ -13827,7 +14108,6 @@
         <w:pStyle w:val="Normalafterlist"/>
       </w:pPr>
       <w:r>
-        <w:lastRenderedPageBreak/>
         <w:t xml:space="preserve">For text output format, the output data descriptor extension is ignored. The output text file has the extension “.txt” and the output gnuplot script has the extension “.gp” as described in section </w:t>
       </w:r>
       <w:r>
@@ -14688,6 +14968,7 @@
                 <w:b w:val="0"/>
                 <w:bCs w:val="0"/>
               </w:rPr>
+              <w:lastRenderedPageBreak/>
               <w:t>output</w:t>
             </w:r>
           </w:p>
@@ -14905,7 +15186,6 @@
               <w:pStyle w:val="NoSpacing"/>
             </w:pPr>
             <w:r>
-              <w:lastRenderedPageBreak/>
               <w:t>Field</w:t>
             </w:r>
           </w:p>
@@ -15481,6 +15761,8 @@
       <w:tr>
         <w:trPr>
           <w:cnfStyle w:val="100000000000" w:firstRow="1" w:lastRow="0" w:firstColumn="0" w:lastColumn="0" w:oddVBand="0" w:evenVBand="0" w:oddHBand="0" w:evenHBand="0" w:firstRowFirstColumn="0" w:firstRowLastColumn="0" w:lastRowFirstColumn="0" w:lastRowLastColumn="0"/>
+          <w:cantSplit/>
+          <w:tblHeader/>
         </w:trPr>
         <w:tc>
           <w:tcPr>
@@ -15705,6 +15987,7 @@
         <w:pStyle w:val="Normalafterlist"/>
       </w:pPr>
       <w:r>
+        <w:lastRenderedPageBreak/>
         <w:t>The parameters to the draw Hough draw line operator are:</w:t>
       </w:r>
     </w:p>
@@ -16021,7 +16304,6 @@
               <w:pStyle w:val="NoSpacing"/>
             </w:pPr>
             <w:r>
-              <w:lastRenderedPageBreak/>
               <w:t>Field</w:t>
             </w:r>
           </w:p>
@@ -17013,6 +17295,7 @@
         <w:pStyle w:val="Heading2"/>
       </w:pPr>
       <w:r>
+        <w:lastRenderedPageBreak/>
         <w:t>transform-image-copy Operator</w:t>
       </w:r>
     </w:p>
@@ -17224,7 +17507,6 @@
                 <w:b w:val="0"/>
                 <w:bCs w:val="0"/>
               </w:rPr>
-              <w:lastRenderedPageBreak/>
               <w:t>Color</w:t>
             </w:r>
           </w:p>
@@ -18002,7 +18284,11 @@
     </w:p>
     <w:p>
       <w:r>
-        <w:t>The transform intensity map operator maps the input image pixel value range to the specified output image pixel value range. Input JPEG and binary images can map to CV_8U JPEG images or CV_32S and CV_32F binary images The mapping of input to output intensity values are determined as follows.</w:t>
+        <w:t xml:space="preserve">The transform intensity map operator maps the input image pixel value range to the specified output image pixel value range. Input JPEG and binary images can map to CV_8U JPEG </w:t>
+      </w:r>
+      <w:r>
+        <w:lastRenderedPageBreak/>
+        <w:t>images or CV_32S and CV_32F binary images The mapping of input to output intensity values are determined as follows.</w:t>
       </w:r>
     </w:p>
     <w:p>
@@ -18119,7 +18405,6 @@
     </w:p>
     <w:p>
       <w:r>
-        <w:lastRenderedPageBreak/>
         <w:t>The operator takes the following data descriptors:</w:t>
       </w:r>
     </w:p>
@@ -18139,6 +18424,8 @@
       <w:tr>
         <w:trPr>
           <w:cnfStyle w:val="100000000000" w:firstRow="1" w:lastRow="0" w:firstColumn="0" w:lastColumn="0" w:oddVBand="0" w:evenVBand="0" w:oddHBand="0" w:evenHBand="0" w:firstRowFirstColumn="0" w:firstRowLastColumn="0" w:lastRowFirstColumn="0" w:lastRowLastColumn="0"/>
+          <w:cantSplit/>
+          <w:tblHeader/>
         </w:trPr>
         <w:tc>
           <w:tcPr>
@@ -18880,9 +19167,9 @@
       </w:pPr>
     </w:p>
     <w:sectPr>
-      <w:headerReference w:type="default" r:id="rId20"/>
-      <w:footerReference w:type="default" r:id="rId21"/>
-      <w:footerReference w:type="first" r:id="rId22"/>
+      <w:headerReference w:type="default" r:id="rId22"/>
+      <w:footerReference w:type="default" r:id="rId23"/>
+      <w:footerReference w:type="first" r:id="rId24"/>
       <w:pgSz w:w="12240" w:h="15840" w:code="1"/>
       <w:pgMar w:top="1440" w:right="1440" w:bottom="1440" w:left="1440" w:header="720" w:footer="720" w:gutter="0"/>
       <w:cols w:space="720"/>
@@ -18937,7 +19224,7 @@
       <w:rPr>
         <w:noProof/>
       </w:rPr>
-      <w:t>7/22/2022 4:11 PM</w:t>
+      <w:t>7/23/2022 1:43 PM</w:t>
     </w:r>
     <w:r>
       <w:fldChar w:fldCharType="end"/>
@@ -19008,7 +19295,7 @@
           <w:rPr>
             <w:noProof/>
           </w:rPr>
-          <w:t>7/22/2022 2:08 PM</w:t>
+          <w:t>7/23/2022 1:43 PM</w:t>
         </w:r>
         <w:r>
           <w:fldChar w:fldCharType="end"/>

</xml_diff>

<commit_message>
refactored enums to enum classes
</commit_message>
<xml_diff>
--- a/doc/cv-workbench.docx
+++ b/doc/cv-workbench.docx
@@ -29,37 +29,7 @@
     </w:p>
     <w:p>
       <w:r>
-        <w:t>The CV-Workbench is a framework to perform reproducible computer vision experiments. Users define experiment steps and store them allowing experiments to easily be reproduced.</w:t>
-      </w:r>
-      <w:r>
-        <w:t xml:space="preserve"> </w:t>
-      </w:r>
-      <w:r>
-        <w:t>An</w:t>
-      </w:r>
-      <w:r>
-        <w:t xml:space="preserve"> </w:t>
-      </w:r>
-      <w:r>
-        <w:t>experiment management module guides runs image processing operations.</w:t>
-      </w:r>
-      <w:r>
-        <w:t xml:space="preserve"> </w:t>
-      </w:r>
-      <w:r>
-        <w:t>Image processing modules run with the specified input images and parameters.</w:t>
-      </w:r>
-      <w:r>
-        <w:t xml:space="preserve"> </w:t>
-      </w:r>
-      <w:r>
-        <w:t>Output images and data are stored on completion with experiment results including notes and explanations.</w:t>
-      </w:r>
-      <w:r>
-        <w:t xml:space="preserve"> </w:t>
-      </w:r>
-      <w:r>
-        <w:t>Experiments can be shared between CV-Workbench instances installed on different machines.</w:t>
+        <w:t>The CV-Workbench is a framework to perform reproducible computer vision experiments. Users define experiment steps and store them allowing experiments to easily be reproduced. An experiment management module guides runs image processing operations. Image processing modules run with the specified input images and parameters. Output images and data are stored on completion with experiment results including notes and explanations. Experiments can be shared between CV-Workbench instances installed on different machines.</w:t>
       </w:r>
       <w:r>
         <w:rPr>
@@ -67,15 +37,7 @@
           <w:color w:val="222222"/>
           <w:shd w:val="clear" w:color="auto" w:fill="FFFFFF"/>
         </w:rPr>
-        <w:t>reproducible way</w:t>
-      </w:r>
-      <w:r>
-        <w:rPr>
-          <w:rFonts w:cs="Arial"/>
-          <w:color w:val="222222"/>
-          <w:shd w:val="clear" w:color="auto" w:fill="FFFFFF"/>
-        </w:rPr>
-        <w:t>.</w:t>
+        <w:t>reproducible way.</w:t>
       </w:r>
     </w:p>
     <w:p>
@@ -211,11 +173,17 @@
           <w:rPr>
             <w:rStyle w:val="Hyperlink"/>
           </w:rPr>
-          <w:t>CVIPTools</w:t>
+          <w:t>DIPSlib</w:t>
         </w:r>
       </w:hyperlink>
       <w:r>
-        <w:t xml:space="preserve"> is an open source image processing library developed by Southern Illinois University. It is used as a resource for educational and research use of image processing.</w:t>
+        <w:t xml:space="preserve"> is an open source image processing library developed by </w:t>
+      </w:r>
+      <w:r>
+        <w:t xml:space="preserve">Delft University of Technology </w:t>
+      </w:r>
+      <w:r>
+        <w:t xml:space="preserve">designed to be fast and easy to use. </w:t>
       </w:r>
     </w:p>
     <w:p>
@@ -227,6 +195,26 @@
         </w:numPr>
       </w:pPr>
       <w:hyperlink r:id="rId13" w:history="1">
+        <w:r>
+          <w:rPr>
+            <w:rStyle w:val="Hyperlink"/>
+          </w:rPr>
+          <w:t>CVIPTools</w:t>
+        </w:r>
+      </w:hyperlink>
+      <w:r>
+        <w:t xml:space="preserve"> is an open source image processing library developed by Southern Illinois University. It is used as a resource for educational and research use of image processing.</w:t>
+      </w:r>
+    </w:p>
+    <w:p>
+      <w:pPr>
+        <w:pStyle w:val="ListParagraph"/>
+        <w:numPr>
+          <w:ilvl w:val="0"/>
+          <w:numId w:val="19"/>
+        </w:numPr>
+      </w:pPr>
+      <w:hyperlink r:id="rId14" w:history="1">
         <w:r>
           <w:rPr>
             <w:rStyle w:val="Hyperlink"/>
@@ -246,7 +234,7 @@
           <w:numId w:val="19"/>
         </w:numPr>
       </w:pPr>
-      <w:hyperlink r:id="rId14" w:history="1">
+      <w:hyperlink r:id="rId15" w:history="1">
         <w:r>
           <w:rPr>
             <w:rStyle w:val="Hyperlink"/>
@@ -269,7 +257,7 @@
       <w:r>
         <w:t xml:space="preserve">There are specialized interactive image processing systems for applications such as medical image processing developed by the </w:t>
       </w:r>
-      <w:hyperlink r:id="rId15" w:history="1">
+      <w:hyperlink r:id="rId16" w:history="1">
         <w:r>
           <w:rPr>
             <w:rStyle w:val="Hyperlink"/>
@@ -280,7 +268,7 @@
       <w:r>
         <w:t xml:space="preserve"> and the </w:t>
       </w:r>
-      <w:hyperlink r:id="rId16" w:history="1">
+      <w:hyperlink r:id="rId17" w:history="1">
         <w:r>
           <w:rPr>
             <w:rStyle w:val="Hyperlink"/>
@@ -656,6 +644,7 @@
           </w:tcPr>
           <w:p>
             <w:r>
+              <w:lastRenderedPageBreak/>
               <w:t>Domain</w:t>
             </w:r>
           </w:p>
@@ -728,7 +717,6 @@
               <w:cnfStyle w:val="000000100000" w:firstRow="0" w:lastRow="0" w:firstColumn="0" w:lastColumn="0" w:oddVBand="0" w:evenVBand="0" w:oddHBand="1" w:evenHBand="0" w:firstRowFirstColumn="0" w:firstRowLastColumn="0" w:lastRowFirstColumn="0" w:lastRowLastColumn="0"/>
             </w:pPr>
             <w:r>
-              <w:lastRenderedPageBreak/>
               <w:t>Thresholding</w:t>
             </w:r>
           </w:p>
@@ -753,7 +741,6 @@
                 <w:b w:val="0"/>
                 <w:bCs w:val="0"/>
               </w:rPr>
-              <w:lastRenderedPageBreak/>
               <w:t>Correlation</w:t>
             </w:r>
           </w:p>
@@ -1403,7 +1390,11 @@
     </w:p>
     <w:p>
       <w:r>
-        <w:t>Images are a matrix of pixel values consists of one or more components. Grayscale images have one component value per pixel, color images have three RGB component values. Each component pixel value is stored as one of three binary formats. OpenCV “depth” codes are used to describe the binary formats.</w:t>
+        <w:t xml:space="preserve">Images are a matrix of pixel values consists of one or more components. Grayscale images have one component value per pixel, color images have three RGB component values. Each </w:t>
+      </w:r>
+      <w:r>
+        <w:lastRenderedPageBreak/>
+        <w:t>component pixel value is stored as one of three binary formats. OpenCV “depth” codes are used to describe the binary formats.</w:t>
       </w:r>
     </w:p>
     <w:tbl>
@@ -1433,7 +1424,6 @@
               <w:pStyle w:val="NoSpacing"/>
             </w:pPr>
             <w:r>
-              <w:lastRenderedPageBreak/>
               <w:t>Value depth</w:t>
             </w:r>
           </w:p>
@@ -1642,7 +1632,7 @@
       <w:r>
         <w:t xml:space="preserve">JPEG image file format is defined by the </w:t>
       </w:r>
-      <w:hyperlink r:id="rId17" w:history="1">
+      <w:hyperlink r:id="rId18" w:history="1">
         <w:r>
           <w:rPr>
             <w:rStyle w:val="Hyperlink"/>
@@ -2105,16 +2095,13 @@
         <w:pStyle w:val="Heading3"/>
       </w:pPr>
       <w:r>
+        <w:lastRenderedPageBreak/>
         <w:t>Binary histogram file format</w:t>
       </w:r>
     </w:p>
     <w:p>
       <w:r>
-        <w:t xml:space="preserve">Binary histogram files contain the statistics for a value distribution for the input values, such for as an image or Hough accumulator, and statistics for the histogram, such as the minimum, </w:t>
-      </w:r>
-      <w:r>
-        <w:lastRenderedPageBreak/>
-        <w:t>maximum, and total counts for all bins. The binary histogram data files are defined by the workbench, and have the following format:</w:t>
+        <w:t>Binary histogram files contain the statistics for a value distribution for the input values, such for as an image or Hough accumulator, and statistics for the histogram, such as the minimum, maximum, and total counts for all bins. The binary histogram data files are defined by the workbench, and have the following format:</w:t>
       </w:r>
     </w:p>
     <w:tbl>
@@ -3160,6 +3147,7 @@
           <w:sz w:val="20"/>
           <w:szCs w:val="20"/>
         </w:rPr>
+        <w:lastRenderedPageBreak/>
         <w:t xml:space="preserve">  nthetas = 180 / theta_inc</w:t>
       </w:r>
     </w:p>
@@ -3168,7 +3156,6 @@
         <w:pStyle w:val="Normalafterlist"/>
       </w:pPr>
       <w:r>
-        <w:lastRenderedPageBreak/>
         <w:t>For an image size (rows, cols), the polar line distance rho is computed from each (row, col) point with:</w:t>
       </w:r>
     </w:p>
@@ -3774,6 +3761,7 @@
         <w:pStyle w:val="Heading3"/>
       </w:pPr>
       <w:r>
+        <w:lastRenderedPageBreak/>
         <w:t>Hough peak line data binary file format</w:t>
       </w:r>
     </w:p>
@@ -3795,7 +3783,6 @@
           <w:sz w:val="20"/>
           <w:szCs w:val="20"/>
         </w:rPr>
-        <w:lastRenderedPageBreak/>
         <w:t>rho = rho_index – max_rho / 2</w:t>
       </w:r>
     </w:p>
@@ -4541,7 +4528,11 @@
         <w:pStyle w:val="Normalafterlist"/>
       </w:pPr>
       <w:r>
-        <w:t>Multiple data descriptors may be specified for a step, for example if multiple input data sources are combined to produce the output, or if it is desired to produce both the binary and text formats for histogram data. The input-data-descriptors and output-data-descriptors are specified with:</w:t>
+        <w:t xml:space="preserve">Multiple data descriptors may be specified for a step, for example if multiple input data sources are combined to produce the output, or if it is desired to produce both the binary and text </w:t>
+      </w:r>
+      <w:r>
+        <w:lastRenderedPageBreak/>
+        <w:t>formats for histogram data. The input-data-descriptors and output-data-descriptors are specified with:</w:t>
       </w:r>
     </w:p>
     <w:p>
@@ -4614,7 +4605,6 @@
         <w:pStyle w:val="code"/>
       </w:pPr>
       <w:r>
-        <w:lastRenderedPageBreak/>
         <w:tab/>
         <w:t xml:space="preserve">  "repository": "</w:t>
       </w:r>
@@ -5384,7 +5374,11 @@
         <w:t>filename-extension</w:t>
       </w:r>
       <w:r>
-        <w:t>". The extension may default to specific values for certain operations, such as that the default extension for image JPEG data is “jpg”.</w:t>
+        <w:t xml:space="preserve">". The </w:t>
+      </w:r>
+      <w:r>
+        <w:lastRenderedPageBreak/>
+        <w:t>extension may default to specific values for certain operations, such as that the default extension for image JPEG data is “jpg”.</w:t>
       </w:r>
     </w:p>
     <w:p>
@@ -5397,11 +5391,7 @@
     </w:p>
     <w:p>
       <w:r>
-        <w:t xml:space="preserve">Scripts run results are added back into the original experiment run JSON text file and saved into  a log file. Results are logged into different levels of the script. The format in which results are </w:t>
-      </w:r>
-      <w:r>
-        <w:lastRenderedPageBreak/>
-        <w:t xml:space="preserve">added to the top-level of the experiment script follows. Results data added is shown in </w:t>
+        <w:t xml:space="preserve">Scripts run results are added back into the original experiment run JSON text file and saved into  a log file. Results are logged into different levels of the script. The format in which results are added to the top-level of the experiment script follows. Results data added is shown in </w:t>
       </w:r>
       <w:r>
         <w:rPr>
@@ -6306,6 +6296,7 @@
         <w:pStyle w:val="Normalafterlist"/>
       </w:pPr>
       <w:r>
+        <w:lastRenderedPageBreak/>
         <w:t xml:space="preserve">where </w:t>
       </w:r>
       <w:r>
@@ -6354,7 +6345,6 @@
         <w:pStyle w:val="Heading2"/>
       </w:pPr>
       <w:r>
-        <w:lastRenderedPageBreak/>
         <w:t>Running the script</w:t>
       </w:r>
     </w:p>
@@ -6364,7 +6354,7 @@
       </w:r>
     </w:p>
     <w:p>
-      <w:hyperlink r:id="rId18" w:history="1">
+      <w:hyperlink r:id="rId19" w:history="1">
         <w:r>
           <w:rPr>
             <w:rStyle w:val="Hyperlink"/>
@@ -6379,7 +6369,7 @@
       </w:r>
     </w:p>
     <w:p>
-      <w:hyperlink r:id="rId19" w:history="1">
+      <w:hyperlink r:id="rId20" w:history="1">
         <w:r>
           <w:rPr>
             <w:rStyle w:val="Hyperlink"/>
@@ -6392,7 +6382,7 @@
       <w:r>
         <w:t xml:space="preserve">The program can be run under an Intel-based Linux distribution such as </w:t>
       </w:r>
-      <w:hyperlink r:id="rId20" w:history="1">
+      <w:hyperlink r:id="rId21" w:history="1">
         <w:r>
           <w:rPr>
             <w:rStyle w:val="Hyperlink"/>
@@ -6403,7 +6393,7 @@
       <w:r>
         <w:t xml:space="preserve">. A version of Linux under which the program can be run on Windows 10 that is fairly easy to install uses </w:t>
       </w:r>
-      <w:hyperlink r:id="rId21" w:history="1">
+      <w:hyperlink r:id="rId22" w:history="1">
         <w:r>
           <w:rPr>
             <w:rStyle w:val="Hyperlink"/>
@@ -7113,6 +7103,7 @@
           </w:tcPr>
           <w:p>
             <w:r>
+              <w:lastRenderedPageBreak/>
               <w:t>Script segment</w:t>
             </w:r>
           </w:p>
@@ -7190,7 +7181,6 @@
               <w:pStyle w:val="code"/>
             </w:pPr>
             <w:r>
-              <w:lastRenderedPageBreak/>
               <w:t xml:space="preserve">  "input-data": [</w:t>
             </w:r>
           </w:p>
@@ -8175,6 +8165,7 @@
           </w:tcPr>
           <w:p>
             <w:r>
+              <w:lastRenderedPageBreak/>
               <w:t>Script segment</w:t>
             </w:r>
           </w:p>
@@ -8252,7 +8243,6 @@
               <w:pStyle w:val="code"/>
             </w:pPr>
             <w:r>
-              <w:lastRenderedPageBreak/>
               <w:t xml:space="preserve">  "input-data": [</w:t>
             </w:r>
           </w:p>
@@ -10011,6 +10001,7 @@
                 <w:b w:val="0"/>
                 <w:bCs w:val="0"/>
               </w:rPr>
+              <w:lastRenderedPageBreak/>
               <w:t>Transform</w:t>
             </w:r>
           </w:p>
@@ -10064,11 +10055,7 @@
               <w:cnfStyle w:val="000000000000" w:firstRow="0" w:lastRow="0" w:firstColumn="0" w:lastColumn="0" w:oddVBand="0" w:evenVBand="0" w:oddHBand="0" w:evenHBand="0" w:firstRowFirstColumn="0" w:firstRowLastColumn="0" w:lastRowFirstColumn="0" w:lastRowLastColumn="0"/>
             </w:pPr>
             <w:r>
-              <w:t xml:space="preserve">Map CV_32S or CV_32F image intensities from an input intensity range to an output intensity range. </w:t>
-            </w:r>
-            <w:r>
-              <w:lastRenderedPageBreak/>
-              <w:t xml:space="preserve">Output images may be JPEG CV_8U images or binary CV_32S or CV_32F images. </w:t>
+              <w:t xml:space="preserve">Map CV_32S or CV_32F image intensities from an input intensity range to an output intensity range. Output images may be JPEG CV_8U images or binary CV_32S or CV_32F images. </w:t>
             </w:r>
           </w:p>
         </w:tc>
@@ -10079,7 +10066,6 @@
         <w:pStyle w:val="Normalafterlist"/>
       </w:pPr>
       <w:r>
-        <w:lastRenderedPageBreak/>
         <w:t>Typical use cases are:</w:t>
       </w:r>
     </w:p>
@@ -11192,6 +11178,7 @@
               <w:pStyle w:val="NoSpacing"/>
             </w:pPr>
             <w:r>
+              <w:lastRenderedPageBreak/>
               <w:t>Field</w:t>
             </w:r>
           </w:p>
@@ -11312,7 +11299,6 @@
                 <w:b w:val="0"/>
                 <w:bCs w:val="0"/>
               </w:rPr>
-              <w:lastRenderedPageBreak/>
               <w:t>components</w:t>
             </w:r>
           </w:p>
@@ -12315,6 +12301,7 @@
               <w:pStyle w:val="NoSpacing"/>
             </w:pPr>
             <w:r>
+              <w:lastRenderedPageBreak/>
               <w:t>orientation</w:t>
             </w:r>
           </w:p>
@@ -12419,7 +12406,6 @@
         <w:pStyle w:val="Normalafterlist"/>
       </w:pPr>
       <w:r>
-        <w:lastRenderedPageBreak/>
         <w:t>The operator takes the following data descriptors:</w:t>
       </w:r>
     </w:p>
@@ -13629,6 +13615,7 @@
               <w:pStyle w:val="NoSpacing"/>
             </w:pPr>
             <w:r>
+              <w:lastRenderedPageBreak/>
               <w:t>Field</w:t>
             </w:r>
           </w:p>
@@ -13749,7 +13736,6 @@
                 <w:b w:val="0"/>
                 <w:bCs w:val="0"/>
               </w:rPr>
-              <w:lastRenderedPageBreak/>
               <w:t>components</w:t>
             </w:r>
           </w:p>
@@ -14816,6 +14802,7 @@
                 <w:b w:val="0"/>
                 <w:bCs w:val="0"/>
               </w:rPr>
+              <w:lastRenderedPageBreak/>
               <w:t>sample variance</w:t>
             </w:r>
           </w:p>
@@ -14857,7 +14844,6 @@
                 <w:b w:val="0"/>
                 <w:bCs w:val="0"/>
               </w:rPr>
-              <w:lastRenderedPageBreak/>
               <w:t>standard deviation</w:t>
             </w:r>
           </w:p>
@@ -15935,16 +15921,13 @@
         <w:pStyle w:val="Heading2"/>
       </w:pPr>
       <w:r>
+        <w:lastRenderedPageBreak/>
         <w:t>hough-draw-line Operator</w:t>
       </w:r>
     </w:p>
     <w:p>
       <w:r>
-        <w:t xml:space="preserve">The Hough draw line operator draws a line segment corresponding to a polar line (rho, theta) in an image and stores the resulting image. JPEG input images can be stored as either JPEG or binary output images, but binary input images can only be stored as binary output images. </w:t>
-      </w:r>
-      <w:r>
-        <w:lastRenderedPageBreak/>
-        <w:t>Grayscale input images produce grayscale output images, and color input images produce color output images. Lines are drawn in the color output image out_component component if specified. The output color image component defaults to 1 if omitted, and is ignored for grayscale images.</w:t>
+        <w:t>The Hough draw line operator draws a line segment corresponding to a polar line (rho, theta) in an image and stores the resulting image. JPEG input images can be stored as either JPEG or binary output images, but binary input images can only be stored as binary output images. Grayscale input images produce grayscale output images, and color input images produce color output images. Lines are drawn in the color output image out_component component if specified. The output color image component defaults to 1 if omitted, and is ignored for grayscale images.</w:t>
       </w:r>
     </w:p>
     <w:p>
@@ -16949,6 +16932,7 @@
     </w:p>
     <w:p>
       <w:r>
+        <w:lastRenderedPageBreak/>
         <w:t>The operator takes the following data descriptors:</w:t>
       </w:r>
     </w:p>
@@ -17131,7 +17115,6 @@
                 <w:b w:val="0"/>
                 <w:bCs w:val="0"/>
               </w:rPr>
-              <w:lastRenderedPageBreak/>
               <w:t>output</w:t>
             </w:r>
           </w:p>
@@ -18124,6 +18107,7 @@
               <w:pStyle w:val="NoSpacing"/>
             </w:pPr>
             <w:r>
+              <w:lastRenderedPageBreak/>
               <w:t>parameter</w:t>
             </w:r>
           </w:p>
@@ -18226,7 +18210,6 @@
         <w:pStyle w:val="Normalafterlist"/>
       </w:pPr>
       <w:r>
-        <w:lastRenderedPageBreak/>
         <w:t>The experiment log output includes the output image pixel parameters:</w:t>
       </w:r>
     </w:p>
@@ -19098,6 +19081,7 @@
               <w:pStyle w:val="NoSpacing"/>
             </w:pPr>
             <w:r>
+              <w:lastRenderedPageBreak/>
               <w:t>Field</w:t>
             </w:r>
           </w:p>
@@ -19218,7 +19202,6 @@
                 <w:b w:val="0"/>
                 <w:bCs w:val="0"/>
               </w:rPr>
-              <w:lastRenderedPageBreak/>
               <w:t>components</w:t>
             </w:r>
           </w:p>
@@ -19371,9 +19354,9 @@
       </w:pPr>
     </w:p>
     <w:sectPr>
-      <w:headerReference w:type="default" r:id="rId22"/>
-      <w:footerReference w:type="default" r:id="rId23"/>
-      <w:footerReference w:type="first" r:id="rId24"/>
+      <w:headerReference w:type="default" r:id="rId23"/>
+      <w:footerReference w:type="default" r:id="rId24"/>
+      <w:footerReference w:type="first" r:id="rId25"/>
       <w:pgSz w:w="12240" w:h="15840" w:code="1"/>
       <w:pgMar w:top="1440" w:right="1440" w:bottom="1440" w:left="1440" w:header="720" w:footer="720" w:gutter="0"/>
       <w:cols w:space="720"/>
@@ -19428,7 +19411,7 @@
       <w:rPr>
         <w:noProof/>
       </w:rPr>
-      <w:t>7/27/2022 10:35 AM</w:t>
+      <w:t>7/27/2022 1:54 PM</w:t>
     </w:r>
     <w:r>
       <w:fldChar w:fldCharType="end"/>
@@ -19500,7 +19483,7 @@
           <w:rPr>
             <w:noProof/>
           </w:rPr>
-          <w:t>7/27/2022 10:35 AM</w:t>
+          <w:t>7/27/2022 1:54 PM</w:t>
         </w:r>
         <w:r>
           <w:fldChar w:fldCharType="end"/>

</xml_diff>

<commit_message>
refactored CV_.. classes to WB_..; started refactoring for log
</commit_message>
<xml_diff>
--- a/doc/cv-workbench.docx
+++ b/doc/cv-workbench.docx
@@ -29,12 +29,7 @@
     </w:p>
     <w:p>
       <w:r>
-        <w:t xml:space="preserve">The CV-Workbench is a framework to perform reproducible computer vision experiments. Users define experiment steps and store them allowing experiments to easily be reproduced. An experiment management module guides runs image processing operations. Image processing modules run with the specified input images and parameters. Output images and data are stored on completion with experiment results including notes and explanations. Experiments can be shared between CV-Workbench instances installed on different </w:t>
-      </w:r>
-      <w:proofErr w:type="spellStart"/>
-      <w:proofErr w:type="gramStart"/>
-      <w:r>
-        <w:t>machines.</w:t>
+        <w:t>The CV-Workbench is a framework to perform reproducible computer vision experiments. Users define experiment steps and store them allowing experiments to easily be reproduced. An experiment management module guides runs image processing operations. Image processing modules run with the specified input images and parameters. Output images and data are stored on completion with experiment results including notes and explanations. Experiments can be shared between CV-Workbench instances installed on different machines.</w:t>
       </w:r>
       <w:r>
         <w:rPr>
@@ -42,17 +37,7 @@
           <w:color w:val="222222"/>
           <w:shd w:val="clear" w:color="auto" w:fill="FFFFFF"/>
         </w:rPr>
-        <w:t>reproducible</w:t>
-      </w:r>
-      <w:proofErr w:type="spellEnd"/>
-      <w:proofErr w:type="gramEnd"/>
-      <w:r>
-        <w:rPr>
-          <w:rFonts w:cs="Arial"/>
-          <w:color w:val="222222"/>
-          <w:shd w:val="clear" w:color="auto" w:fill="FFFFFF"/>
-        </w:rPr>
-        <w:t xml:space="preserve"> way.</w:t>
+        <w:t>reproducible way.</w:t>
       </w:r>
     </w:p>
     <w:p>
@@ -62,36 +47,12 @@
     </w:p>
     <w:p>
       <w:r>
-        <w:t xml:space="preserve">Image processing operators use differences of intensities over the image to find features. Sequences of </w:t>
-      </w:r>
-      <w:proofErr w:type="gramStart"/>
-      <w:r>
-        <w:t>operators</w:t>
-      </w:r>
-      <w:proofErr w:type="gramEnd"/>
-      <w:r>
-        <w:t xml:space="preserve"> progressive clarify features from image intensities. Operators' function is tailored with parameters to adjust for varying imaging conditions. The operators and parameters are chosen by trial and error to determine the best processing sequence.</w:t>
-      </w:r>
-    </w:p>
-    <w:p>
-      <w:r>
-        <w:t xml:space="preserve">Computer vision techniques require testing against </w:t>
-      </w:r>
-      <w:proofErr w:type="gramStart"/>
-      <w:r>
-        <w:t>a large number of</w:t>
-      </w:r>
-      <w:proofErr w:type="gramEnd"/>
-      <w:r>
-        <w:t xml:space="preserve"> sample images. The tests </w:t>
-      </w:r>
-      <w:proofErr w:type="gramStart"/>
-      <w:r>
-        <w:t>have to</w:t>
-      </w:r>
-      <w:proofErr w:type="gramEnd"/>
-      <w:r>
-        <w:t xml:space="preserve"> be precisely performed to usefully compare results. Running tests manually is slow, tedious, and unreliable. Using scripts permits reproducibly running tests many times giving reliable results. Test results must be recorded to be able to analyze and verify them after the fact.</w:t>
+        <w:t>Image processing operators use differences of intensities over the image to find features. Sequences of operators progressive clarify features from image intensities. Operators' function is tailored with parameters to adjust for varying imaging conditions. The operators and parameters are chosen by trial and error to determine the best processing sequence.</w:t>
+      </w:r>
+    </w:p>
+    <w:p>
+      <w:r>
+        <w:t>Computer vision techniques require testing against a large number of sample images. The tests have to be precisely performed to usefully compare results. Running tests manually is slow, tedious, and unreliable. Using scripts permits reproducibly running tests many times giving reliable results. Test results must be recorded to be able to analyze and verify them after the fact.</w:t>
       </w:r>
     </w:p>
     <w:p>
@@ -165,15 +126,7 @@
         </w:r>
       </w:hyperlink>
       <w:r>
-        <w:t xml:space="preserve"> is an </w:t>
-      </w:r>
-      <w:proofErr w:type="gramStart"/>
-      <w:r>
-        <w:t>open source</w:t>
-      </w:r>
-      <w:proofErr w:type="gramEnd"/>
-      <w:r>
-        <w:t xml:space="preserve"> library developed by Intel to showcase CPU-intensive applications. It relies on heavily optimized code.</w:t>
+        <w:t xml:space="preserve"> is an open source library developed by Intel to showcase CPU-intensive applications. It relies on heavily optimized code.</w:t>
       </w:r>
     </w:p>
     <w:p>
@@ -193,15 +146,7 @@
         </w:r>
       </w:hyperlink>
       <w:r>
-        <w:t xml:space="preserve"> is an </w:t>
-      </w:r>
-      <w:proofErr w:type="gramStart"/>
-      <w:r>
-        <w:t>open source</w:t>
-      </w:r>
-      <w:proofErr w:type="gramEnd"/>
-      <w:r>
-        <w:t xml:space="preserve"> image processing library developed by the European Union that is conservative of CPU and memory resources. </w:t>
+        <w:t xml:space="preserve"> is an open source image processing library developed by the European Union that is conservative of CPU and memory resources. </w:t>
       </w:r>
       <w:hyperlink r:id="rId11" w:history="1">
         <w:r>
@@ -224,25 +169,15 @@
         </w:numPr>
       </w:pPr>
       <w:hyperlink r:id="rId12" w:history="1">
-        <w:proofErr w:type="spellStart"/>
         <w:r>
           <w:rPr>
             <w:rStyle w:val="Hyperlink"/>
           </w:rPr>
           <w:t>DIPSlib</w:t>
         </w:r>
-        <w:proofErr w:type="spellEnd"/>
       </w:hyperlink>
       <w:r>
-        <w:t xml:space="preserve"> is an </w:t>
-      </w:r>
-      <w:proofErr w:type="gramStart"/>
-      <w:r>
-        <w:t>open source</w:t>
-      </w:r>
-      <w:proofErr w:type="gramEnd"/>
-      <w:r>
-        <w:t xml:space="preserve"> image processing library developed by Delft University of Technology designed to be fast and easy to use. </w:t>
+        <w:t xml:space="preserve"> is an open source image processing library developed by Delft University of Technology designed to be fast and easy to use. </w:t>
       </w:r>
     </w:p>
     <w:p>
@@ -254,25 +189,15 @@
         </w:numPr>
       </w:pPr>
       <w:hyperlink r:id="rId13" w:history="1">
-        <w:proofErr w:type="spellStart"/>
         <w:r>
           <w:rPr>
             <w:rStyle w:val="Hyperlink"/>
           </w:rPr>
           <w:t>CVIPTools</w:t>
         </w:r>
-        <w:proofErr w:type="spellEnd"/>
       </w:hyperlink>
       <w:r>
-        <w:t xml:space="preserve"> is an </w:t>
-      </w:r>
-      <w:proofErr w:type="gramStart"/>
-      <w:r>
-        <w:t>open source</w:t>
-      </w:r>
-      <w:proofErr w:type="gramEnd"/>
-      <w:r>
-        <w:t xml:space="preserve"> image processing library developed by Southern Illinois University. It is used as a resource for educational and research use of image processing.</w:t>
+        <w:t xml:space="preserve"> is an open source image processing library developed by Southern Illinois University. It is used as a resource for educational and research use of image processing.</w:t>
       </w:r>
     </w:p>
     <w:p>
@@ -284,33 +209,15 @@
         </w:numPr>
       </w:pPr>
       <w:hyperlink r:id="rId14" w:history="1">
-        <w:proofErr w:type="spellStart"/>
         <w:r>
           <w:rPr>
             <w:rStyle w:val="Hyperlink"/>
           </w:rPr>
           <w:t>ImageMagick</w:t>
         </w:r>
-        <w:proofErr w:type="spellEnd"/>
       </w:hyperlink>
       <w:r>
-        <w:t xml:space="preserve"> was developed at DuPont and provides both an </w:t>
-      </w:r>
-      <w:proofErr w:type="gramStart"/>
-      <w:r>
-        <w:t>open source</w:t>
-      </w:r>
-      <w:proofErr w:type="gramEnd"/>
-      <w:r>
-        <w:t xml:space="preserve"> library and an interactive operating system command line interface to run image processing operations. CV Workbench also runs from the operating command </w:t>
-      </w:r>
-      <w:proofErr w:type="gramStart"/>
-      <w:r>
-        <w:t>line, but</w:t>
-      </w:r>
-      <w:proofErr w:type="gramEnd"/>
-      <w:r>
-        <w:t xml:space="preserve"> uses JSON to make scripts easier to write and change and provides capabilities of recording and storing experiment results.</w:t>
+        <w:t xml:space="preserve"> was developed at DuPont and provides both an open source library and an interactive operating system command line interface to run image processing operations. CV Workbench also runs from the operating command line, but uses JSON to make scripts easier to write and change and provides capabilities of recording and storing experiment results.</w:t>
       </w:r>
     </w:p>
     <w:p>
@@ -1006,13 +913,8 @@
               <w:pStyle w:val="NoSpacing"/>
               <w:cnfStyle w:val="000000100000" w:firstRow="0" w:lastRow="0" w:firstColumn="0" w:lastColumn="0" w:oddVBand="0" w:evenVBand="0" w:oddHBand="1" w:evenHBand="0" w:firstRowFirstColumn="0" w:firstRowLastColumn="0" w:lastRowFirstColumn="0" w:lastRowLastColumn="0"/>
             </w:pPr>
-            <w:proofErr w:type="spellStart"/>
-            <w:r>
-              <w:t>Histogramming</w:t>
-            </w:r>
-            <w:proofErr w:type="spellEnd"/>
-            <w:r>
-              <w:t xml:space="preserve"> image pixel values</w:t>
+            <w:r>
+              <w:t>Histogramming image pixel values</w:t>
             </w:r>
           </w:p>
           <w:p>
@@ -1020,13 +922,8 @@
               <w:pStyle w:val="NoSpacing"/>
               <w:cnfStyle w:val="000000100000" w:firstRow="0" w:lastRow="0" w:firstColumn="0" w:lastColumn="0" w:oddVBand="0" w:evenVBand="0" w:oddHBand="1" w:evenHBand="0" w:firstRowFirstColumn="0" w:firstRowLastColumn="0" w:lastRowFirstColumn="0" w:lastRowLastColumn="0"/>
             </w:pPr>
-            <w:proofErr w:type="spellStart"/>
-            <w:r>
-              <w:t>Histogramming</w:t>
-            </w:r>
-            <w:proofErr w:type="spellEnd"/>
-            <w:r>
-              <w:t xml:space="preserve"> Hough accumulator counts</w:t>
+            <w:r>
+              <w:t>Histogramming Hough accumulator counts</w:t>
             </w:r>
           </w:p>
           <w:p>
@@ -1034,13 +931,8 @@
               <w:pStyle w:val="NoSpacing"/>
               <w:cnfStyle w:val="000000100000" w:firstRow="0" w:lastRow="0" w:firstColumn="0" w:lastColumn="0" w:oddVBand="0" w:evenVBand="0" w:oddHBand="1" w:evenHBand="0" w:firstRowFirstColumn="0" w:firstRowLastColumn="0" w:lastRowFirstColumn="0" w:lastRowLastColumn="0"/>
             </w:pPr>
-            <w:proofErr w:type="spellStart"/>
-            <w:r>
-              <w:t>Histgramming</w:t>
-            </w:r>
-            <w:proofErr w:type="spellEnd"/>
-            <w:r>
-              <w:t xml:space="preserve"> feature values</w:t>
+            <w:r>
+              <w:t>Histgramming feature values</w:t>
             </w:r>
           </w:p>
           <w:p>
@@ -1743,15 +1635,7 @@
         </w:r>
       </w:hyperlink>
       <w:r>
-        <w:t xml:space="preserve">. The binary image data files are defined by the workbench and have the following format. Color RGB pixels are stored as three consecutive pixel values, one for each component. The </w:t>
-      </w:r>
-      <w:proofErr w:type="gramStart"/>
-      <w:r>
-        <w:t>three pixel</w:t>
-      </w:r>
-      <w:proofErr w:type="gramEnd"/>
-      <w:r>
-        <w:t xml:space="preserve"> values represent the red, green, and blue components.</w:t>
+        <w:t>. The binary image data files are defined by the workbench and have the following format. Color RGB pixels are stored as three consecutive pixel values, one for each component. The three pixel values represent the red, green, and blue components.</w:t>
       </w:r>
     </w:p>
     <w:tbl>
@@ -2141,39 +2025,7 @@
     </w:p>
     <w:p>
       <w:r>
-        <w:t xml:space="preserve">Histograms count the number of different values for any data type containing a range of values, such as images or Hough accumulators. The histogram bins correspond to a </w:t>
-      </w:r>
-      <w:proofErr w:type="gramStart"/>
-      <w:r>
-        <w:t>data values</w:t>
-      </w:r>
-      <w:proofErr w:type="gramEnd"/>
-      <w:r>
-        <w:t xml:space="preserve"> ranging from a lower to an upper value. The number of histogram bins or </w:t>
-      </w:r>
-      <w:proofErr w:type="spellStart"/>
-      <w:r>
-        <w:t>nbins</w:t>
-      </w:r>
-      <w:proofErr w:type="spellEnd"/>
-      <w:r>
-        <w:t xml:space="preserve">, the lower value or </w:t>
-      </w:r>
-      <w:proofErr w:type="spellStart"/>
-      <w:r>
-        <w:t>lower_value</w:t>
-      </w:r>
-      <w:proofErr w:type="spellEnd"/>
-      <w:r>
-        <w:t xml:space="preserve">, and the upper value or </w:t>
-      </w:r>
-      <w:proofErr w:type="spellStart"/>
-      <w:r>
-        <w:t>upper_value</w:t>
-      </w:r>
-      <w:proofErr w:type="spellEnd"/>
-      <w:r>
-        <w:t xml:space="preserve"> determine into which bin a value is counted. Values below the lower value are counted in the first bin, and values above the upper value are counted in the last bin. The bin corresponding to a value is given by this:</w:t>
+        <w:t>Histograms count the number of different values for any data type containing a range of values, such as images or Hough accumulators. The histogram bins correspond to a data values ranging from a lower to an upper value. The number of histogram bins or nbins, the lower value or lower_value, and the upper value or upper_value determine into which bin a value is counted. Values below the lower value are counted in the first bin, and values above the upper value are counted in the last bin. The bin corresponding to a value is given by this:</w:t>
       </w:r>
     </w:p>
     <w:p>
@@ -2181,13 +2033,8 @@
         <w:pStyle w:val="code"/>
       </w:pPr>
       <w:r>
-        <w:t xml:space="preserve">  if value &lt; </w:t>
-      </w:r>
-      <w:proofErr w:type="spellStart"/>
-      <w:r>
-        <w:t>lower_value</w:t>
-      </w:r>
-      <w:proofErr w:type="spellEnd"/>
+        <w:t xml:space="preserve">  if value &lt; lower_value</w:t>
+      </w:r>
     </w:p>
     <w:p>
       <w:pPr>
@@ -2202,28 +2049,15 @@
         <w:pStyle w:val="code"/>
       </w:pPr>
       <w:r>
-        <w:t xml:space="preserve">  else if value &gt; </w:t>
-      </w:r>
-      <w:proofErr w:type="spellStart"/>
-      <w:r>
-        <w:t>upper_value</w:t>
-      </w:r>
-      <w:proofErr w:type="spellEnd"/>
+        <w:t xml:space="preserve">  else if value &gt; upper_value</w:t>
+      </w:r>
     </w:p>
     <w:p>
       <w:pPr>
         <w:pStyle w:val="code"/>
       </w:pPr>
       <w:r>
-        <w:t xml:space="preserve">    bin = </w:t>
-      </w:r>
-      <w:proofErr w:type="spellStart"/>
-      <w:r>
-        <w:t>nbins</w:t>
-      </w:r>
-      <w:proofErr w:type="spellEnd"/>
-      <w:r>
-        <w:t xml:space="preserve"> – 1</w:t>
+        <w:t xml:space="preserve">    bin = nbins – 1</w:t>
       </w:r>
     </w:p>
     <w:p>
@@ -2239,47 +2073,7 @@
         <w:pStyle w:val="code"/>
       </w:pPr>
       <w:r>
-        <w:t xml:space="preserve">    bin = </w:t>
-      </w:r>
-      <w:proofErr w:type="gramStart"/>
-      <w:r>
-        <w:t>round(</w:t>
-      </w:r>
-      <w:proofErr w:type="gramEnd"/>
-      <w:r>
-        <w:t>(</w:t>
-      </w:r>
-      <w:proofErr w:type="spellStart"/>
-      <w:r>
-        <w:t>nbins</w:t>
-      </w:r>
-      <w:proofErr w:type="spellEnd"/>
-      <w:r>
-        <w:t xml:space="preserve"> – 1) * (value – </w:t>
-      </w:r>
-      <w:proofErr w:type="spellStart"/>
-      <w:r>
-        <w:t>lower_value</w:t>
-      </w:r>
-      <w:proofErr w:type="spellEnd"/>
-      <w:r>
-        <w:t>) / (</w:t>
-      </w:r>
-      <w:proofErr w:type="spellStart"/>
-      <w:r>
-        <w:t>upper_value</w:t>
-      </w:r>
-      <w:proofErr w:type="spellEnd"/>
-      <w:r>
-        <w:t xml:space="preserve"> – </w:t>
-      </w:r>
-      <w:proofErr w:type="spellStart"/>
-      <w:r>
-        <w:t>lower_value</w:t>
-      </w:r>
-      <w:proofErr w:type="spellEnd"/>
-      <w:r>
-        <w:t>))</w:t>
+        <w:t xml:space="preserve">    bin = round((nbins – 1) * (value – lower_value) / (upper_value – lower_value))</w:t>
       </w:r>
     </w:p>
     <w:p>
@@ -2381,7 +2175,6 @@
                 <w:bCs w:val="0"/>
               </w:rPr>
             </w:pPr>
-            <w:proofErr w:type="spellStart"/>
             <w:r>
               <w:rPr>
                 <w:b w:val="0"/>
@@ -2389,7 +2182,6 @@
               </w:rPr>
               <w:t>nbins</w:t>
             </w:r>
-            <w:proofErr w:type="spellEnd"/>
           </w:p>
         </w:tc>
         <w:tc>
@@ -2435,7 +2227,6 @@
                 <w:bCs w:val="0"/>
               </w:rPr>
             </w:pPr>
-            <w:proofErr w:type="spellStart"/>
             <w:r>
               <w:rPr>
                 <w:b w:val="0"/>
@@ -2443,7 +2234,6 @@
               </w:rPr>
               <w:t>lower_value</w:t>
             </w:r>
-            <w:proofErr w:type="spellEnd"/>
           </w:p>
         </w:tc>
         <w:tc>
@@ -2492,7 +2282,6 @@
                 <w:bCs w:val="0"/>
               </w:rPr>
             </w:pPr>
-            <w:proofErr w:type="spellStart"/>
             <w:r>
               <w:rPr>
                 <w:b w:val="0"/>
@@ -2500,7 +2289,6 @@
               </w:rPr>
               <w:t>upper_value</w:t>
             </w:r>
-            <w:proofErr w:type="spellEnd"/>
           </w:p>
         </w:tc>
         <w:tc>
@@ -2546,7 +2334,6 @@
                 <w:bCs w:val="0"/>
               </w:rPr>
             </w:pPr>
-            <w:proofErr w:type="spellStart"/>
             <w:r>
               <w:rPr>
                 <w:b w:val="0"/>
@@ -2554,7 +2341,6 @@
               </w:rPr>
               <w:t>min_count</w:t>
             </w:r>
-            <w:proofErr w:type="spellEnd"/>
           </w:p>
         </w:tc>
         <w:tc>
@@ -2603,7 +2389,6 @@
                 <w:bCs w:val="0"/>
               </w:rPr>
             </w:pPr>
-            <w:proofErr w:type="spellStart"/>
             <w:r>
               <w:rPr>
                 <w:b w:val="0"/>
@@ -2611,7 +2396,6 @@
               </w:rPr>
               <w:t>max_count</w:t>
             </w:r>
-            <w:proofErr w:type="spellEnd"/>
           </w:p>
         </w:tc>
         <w:tc>
@@ -2657,7 +2441,6 @@
                 <w:bCs w:val="0"/>
               </w:rPr>
             </w:pPr>
-            <w:proofErr w:type="spellStart"/>
             <w:r>
               <w:rPr>
                 <w:b w:val="0"/>
@@ -2665,7 +2448,6 @@
               </w:rPr>
               <w:t>total_count</w:t>
             </w:r>
-            <w:proofErr w:type="spellEnd"/>
           </w:p>
         </w:tc>
         <w:tc>
@@ -2930,7 +2712,6 @@
                 <w:bCs w:val="0"/>
               </w:rPr>
             </w:pPr>
-            <w:proofErr w:type="spellStart"/>
             <w:r>
               <w:rPr>
                 <w:b w:val="0"/>
@@ -2938,7 +2719,6 @@
               </w:rPr>
               <w:t>min_value</w:t>
             </w:r>
-            <w:proofErr w:type="spellEnd"/>
           </w:p>
         </w:tc>
         <w:tc>
@@ -2984,7 +2764,6 @@
                 <w:bCs w:val="0"/>
               </w:rPr>
             </w:pPr>
-            <w:proofErr w:type="spellStart"/>
             <w:r>
               <w:rPr>
                 <w:b w:val="0"/>
@@ -2992,7 +2771,6 @@
               </w:rPr>
               <w:t>max_value</w:t>
             </w:r>
-            <w:proofErr w:type="spellEnd"/>
           </w:p>
         </w:tc>
         <w:tc>
@@ -3059,13 +2837,8 @@
               <w:pStyle w:val="NoSpacing"/>
               <w:cnfStyle w:val="000000100000" w:firstRow="0" w:lastRow="0" w:firstColumn="0" w:lastColumn="0" w:oddVBand="0" w:evenVBand="0" w:oddHBand="1" w:evenHBand="0" w:firstRowFirstColumn="0" w:firstRowLastColumn="0" w:lastRowFirstColumn="0" w:lastRowLastColumn="0"/>
             </w:pPr>
-            <w:proofErr w:type="spellStart"/>
-            <w:r>
-              <w:t>nbins</w:t>
-            </w:r>
-            <w:proofErr w:type="spellEnd"/>
-            <w:r>
-              <w:t xml:space="preserve"> * 32-bit integers</w:t>
+            <w:r>
+              <w:t>nbins * 32-bit integers</w:t>
             </w:r>
           </w:p>
         </w:tc>
@@ -3137,15 +2910,7 @@
         <w:t>bin-value</w:t>
       </w:r>
       <w:r>
-        <w:t xml:space="preserve"> is the value that is accumulated </w:t>
-      </w:r>
-      <w:proofErr w:type="gramStart"/>
-      <w:r>
-        <w:t>in a given</w:t>
-      </w:r>
-      <w:proofErr w:type="gramEnd"/>
-      <w:r>
-        <w:t xml:space="preserve"> bin. It has this formula, where bin no. ranges from 0 to nbins-1:</w:t>
+        <w:t xml:space="preserve"> is the value that is accumulated in a given bin. It has this formula, where bin no. ranges from 0 to nbins-1:</w:t>
       </w:r>
     </w:p>
     <w:p>
@@ -3177,93 +2942,21 @@
           <w:sz w:val="20"/>
           <w:szCs w:val="20"/>
         </w:rPr>
-        <w:t xml:space="preserve">= </w:t>
-      </w:r>
-      <w:proofErr w:type="spellStart"/>
-      <w:r>
+        <w:t>= lower_value + bin no. * (upper_value - lower_value) / (nbins – 1)</w:t>
+      </w:r>
+    </w:p>
+    <w:p>
+      <w:pPr>
+        <w:pStyle w:val="code"/>
         <w:rPr>
           <w:sz w:val="20"/>
           <w:szCs w:val="20"/>
         </w:rPr>
-        <w:t>lower_value</w:t>
-      </w:r>
-      <w:proofErr w:type="spellEnd"/>
-      <w:r>
-        <w:rPr>
-          <w:sz w:val="20"/>
-          <w:szCs w:val="20"/>
-        </w:rPr>
-        <w:t xml:space="preserve"> + bin no. * (</w:t>
-      </w:r>
-      <w:proofErr w:type="spellStart"/>
-      <w:r>
-        <w:rPr>
-          <w:sz w:val="20"/>
-          <w:szCs w:val="20"/>
-        </w:rPr>
-        <w:t>upper_value</w:t>
-      </w:r>
-      <w:proofErr w:type="spellEnd"/>
-      <w:r>
-        <w:rPr>
-          <w:sz w:val="20"/>
-          <w:szCs w:val="20"/>
-        </w:rPr>
-        <w:t xml:space="preserve"> - </w:t>
-      </w:r>
-      <w:proofErr w:type="spellStart"/>
-      <w:r>
-        <w:rPr>
-          <w:sz w:val="20"/>
-          <w:szCs w:val="20"/>
-        </w:rPr>
-        <w:t>lower_value</w:t>
-      </w:r>
-      <w:proofErr w:type="spellEnd"/>
-      <w:r>
-        <w:rPr>
-          <w:sz w:val="20"/>
-          <w:szCs w:val="20"/>
-        </w:rPr>
-        <w:t>) / (</w:t>
-      </w:r>
-      <w:proofErr w:type="spellStart"/>
-      <w:r>
-        <w:rPr>
-          <w:sz w:val="20"/>
-          <w:szCs w:val="20"/>
-        </w:rPr>
-        <w:t>nbins</w:t>
-      </w:r>
-      <w:proofErr w:type="spellEnd"/>
-      <w:r>
-        <w:rPr>
-          <w:sz w:val="20"/>
-          <w:szCs w:val="20"/>
-        </w:rPr>
-        <w:t xml:space="preserve"> – 1)</w:t>
-      </w:r>
-    </w:p>
-    <w:p>
-      <w:pPr>
-        <w:pStyle w:val="code"/>
-        <w:rPr>
-          <w:sz w:val="20"/>
-          <w:szCs w:val="20"/>
-        </w:rPr>
-      </w:pPr>
-    </w:p>
-    <w:p>
-      <w:r>
-        <w:t xml:space="preserve">A </w:t>
-      </w:r>
-      <w:proofErr w:type="spellStart"/>
-      <w:r>
-        <w:t>gnuplot</w:t>
-      </w:r>
-      <w:proofErr w:type="spellEnd"/>
-      <w:r>
-        <w:t xml:space="preserve"> script file </w:t>
+      </w:pPr>
+    </w:p>
+    <w:p>
+      <w:r>
+        <w:t xml:space="preserve">A gnuplot script file </w:t>
       </w:r>
       <w:r>
         <w:rPr>
@@ -3324,23 +3017,23 @@
           <w:sz w:val="18"/>
           <w:szCs w:val="18"/>
         </w:rPr>
-        <w:t xml:space="preserve">.txt' using </w:t>
-      </w:r>
-      <w:proofErr w:type="gramStart"/>
-      <w:r>
+        <w:t>.txt' using 2:xtic(1)</w:t>
+      </w:r>
+    </w:p>
+    <w:p>
+      <w:pPr>
+        <w:pStyle w:val="code"/>
         <w:rPr>
           <w:sz w:val="18"/>
           <w:szCs w:val="18"/>
         </w:rPr>
-        <w:t>2:xtic</w:t>
-      </w:r>
-      <w:proofErr w:type="gramEnd"/>
+      </w:pPr>
       <w:r>
         <w:rPr>
           <w:sz w:val="18"/>
           <w:szCs w:val="18"/>
         </w:rPr>
-        <w:t>(1)</w:t>
+        <w:t xml:space="preserve">  pause -1 "Hit any key to continue"</w:t>
       </w:r>
     </w:p>
     <w:p>
@@ -3356,22 +3049,6 @@
           <w:sz w:val="18"/>
           <w:szCs w:val="18"/>
         </w:rPr>
-        <w:t xml:space="preserve">  pause -1 "Hit any key to continue"</w:t>
-      </w:r>
-    </w:p>
-    <w:p>
-      <w:pPr>
-        <w:pStyle w:val="code"/>
-        <w:rPr>
-          <w:sz w:val="18"/>
-          <w:szCs w:val="18"/>
-        </w:rPr>
-      </w:pPr>
-      <w:r>
-        <w:rPr>
-          <w:sz w:val="18"/>
-          <w:szCs w:val="18"/>
-        </w:rPr>
         <w:t xml:space="preserve">  </w:t>
       </w:r>
     </w:p>
@@ -3393,23 +3070,7 @@
           <w:sz w:val="20"/>
           <w:szCs w:val="20"/>
         </w:rPr>
-        <w:t xml:space="preserve">  $ </w:t>
-      </w:r>
-      <w:proofErr w:type="spellStart"/>
-      <w:r>
-        <w:rPr>
-          <w:sz w:val="20"/>
-          <w:szCs w:val="20"/>
-        </w:rPr>
-        <w:t>gnuplot</w:t>
-      </w:r>
-      <w:proofErr w:type="spellEnd"/>
-      <w:r>
-        <w:rPr>
-          <w:sz w:val="20"/>
-          <w:szCs w:val="20"/>
-        </w:rPr>
-        <w:t xml:space="preserve"> </w:t>
+        <w:t xml:space="preserve">  $ gnuplot </w:t>
       </w:r>
       <w:r>
         <w:rPr>
@@ -3464,23 +3125,7 @@
     </w:p>
     <w:p>
       <w:r>
-        <w:t xml:space="preserve">The Hough accumulator data type contains counts from the accumulated (rho, theta) polar lines calculated for each image point by the Hough algorithm. Lines are computed for angles theta between 0 and 180 degrees, where theta is incremented by a fixed number of degrees, </w:t>
-      </w:r>
-      <w:proofErr w:type="spellStart"/>
-      <w:r>
-        <w:t>theta_inc</w:t>
-      </w:r>
-      <w:proofErr w:type="spellEnd"/>
-      <w:r>
-        <w:t xml:space="preserve">, between samples. The number of angles, </w:t>
-      </w:r>
-      <w:proofErr w:type="spellStart"/>
-      <w:r>
-        <w:t>nthetas</w:t>
-      </w:r>
-      <w:proofErr w:type="spellEnd"/>
-      <w:r>
-        <w:t>, samples is:</w:t>
+        <w:t>The Hough accumulator data type contains counts from the accumulated (rho, theta) polar lines calculated for each image point by the Hough algorithm. Lines are computed for angles theta between 0 and 180 degrees, where theta is incremented by a fixed number of degrees, theta_inc, between samples. The number of angles, nthetas, samples is:</w:t>
       </w:r>
     </w:p>
     <w:p>
@@ -3497,120 +3142,55 @@
           <w:szCs w:val="20"/>
         </w:rPr>
         <w:lastRenderedPageBreak/>
-        <w:t xml:space="preserve">  </w:t>
-      </w:r>
-      <w:proofErr w:type="spellStart"/>
-      <w:r>
+        <w:t xml:space="preserve">  nthetas = 180 / theta_inc</w:t>
+      </w:r>
+    </w:p>
+    <w:p>
+      <w:pPr>
+        <w:pStyle w:val="Normalafterlist"/>
+      </w:pPr>
+      <w:r>
+        <w:t>For an image size (rows, cols), the polar line distance rho is computed from each (row, col) point with:</w:t>
+      </w:r>
+    </w:p>
+    <w:p>
+      <w:pPr>
+        <w:pStyle w:val="code"/>
         <w:rPr>
           <w:sz w:val="20"/>
           <w:szCs w:val="20"/>
         </w:rPr>
-        <w:t>nthetas</w:t>
-      </w:r>
-      <w:proofErr w:type="spellEnd"/>
+      </w:pPr>
       <w:r>
         <w:rPr>
           <w:sz w:val="20"/>
           <w:szCs w:val="20"/>
         </w:rPr>
-        <w:t xml:space="preserve"> = 180 / </w:t>
-      </w:r>
-      <w:proofErr w:type="spellStart"/>
-      <w:r>
+        <w:t xml:space="preserve">  rho = (col – cols/2) * cos(theta) + (rows/2 – rows) * sin(theta)</w:t>
+      </w:r>
+    </w:p>
+    <w:p>
+      <w:pPr>
+        <w:pStyle w:val="Normalafterlist"/>
+      </w:pPr>
+      <w:r>
+        <w:t>The number of rho values, nrhos, for images is:</w:t>
+      </w:r>
+    </w:p>
+    <w:p>
+      <w:pPr>
+        <w:pStyle w:val="code"/>
         <w:rPr>
           <w:sz w:val="20"/>
           <w:szCs w:val="20"/>
         </w:rPr>
-        <w:t>theta_inc</w:t>
-      </w:r>
-      <w:proofErr w:type="spellEnd"/>
-    </w:p>
-    <w:p>
-      <w:pPr>
-        <w:pStyle w:val="Normalafterlist"/>
-      </w:pPr>
-      <w:r>
-        <w:t>For an image size (rows, cols), the polar line distance rho is computed from each (row, col) point with:</w:t>
-      </w:r>
-    </w:p>
-    <w:p>
-      <w:pPr>
-        <w:pStyle w:val="code"/>
+      </w:pPr>
+      <w:r>
         <w:rPr>
           <w:sz w:val="20"/>
           <w:szCs w:val="20"/>
         </w:rPr>
-      </w:pPr>
-      <w:r>
-        <w:rPr>
-          <w:sz w:val="20"/>
-          <w:szCs w:val="20"/>
-        </w:rPr>
-        <w:t xml:space="preserve">  rho = (col – cols/2) * cos(theta) + (rows/2 – rows) * sin(theta)</w:t>
-      </w:r>
-    </w:p>
-    <w:p>
-      <w:pPr>
-        <w:pStyle w:val="Normalafterlist"/>
-      </w:pPr>
-      <w:r>
-        <w:t xml:space="preserve">The number of rho values, </w:t>
-      </w:r>
-      <w:proofErr w:type="spellStart"/>
-      <w:r>
-        <w:t>nrhos</w:t>
-      </w:r>
-      <w:proofErr w:type="spellEnd"/>
-      <w:r>
-        <w:t>, for images is:</w:t>
-      </w:r>
-    </w:p>
-    <w:p>
-      <w:pPr>
-        <w:pStyle w:val="code"/>
-        <w:rPr>
-          <w:sz w:val="20"/>
-          <w:szCs w:val="20"/>
-        </w:rPr>
-      </w:pPr>
-      <w:r>
-        <w:rPr>
-          <w:sz w:val="20"/>
-          <w:szCs w:val="20"/>
-        </w:rPr>
-        <w:t xml:space="preserve">  </w:t>
-      </w:r>
-      <w:proofErr w:type="spellStart"/>
-      <w:r>
-        <w:rPr>
-          <w:sz w:val="20"/>
-          <w:szCs w:val="20"/>
-        </w:rPr>
-        <w:t>nrhos</w:t>
-      </w:r>
-      <w:proofErr w:type="spellEnd"/>
-      <w:r>
-        <w:rPr>
-          <w:sz w:val="20"/>
-          <w:szCs w:val="20"/>
-        </w:rPr>
-        <w:t xml:space="preserve"> = </w:t>
-      </w:r>
-      <w:proofErr w:type="gramStart"/>
-      <w:r>
-        <w:rPr>
-          <w:sz w:val="20"/>
-          <w:szCs w:val="20"/>
-        </w:rPr>
-        <w:t>sqrt(</w:t>
-      </w:r>
-      <w:proofErr w:type="gramEnd"/>
-      <w:r>
-        <w:rPr>
-          <w:sz w:val="20"/>
-          <w:szCs w:val="20"/>
-        </w:rPr>
-        <w:t>rows</w:t>
+        <w:t xml:space="preserve">  nrhos = sqrt(rows</w:t>
       </w:r>
       <w:r>
         <w:rPr>
@@ -3648,15 +3228,7 @@
         <w:pStyle w:val="Normalafterlist"/>
       </w:pPr>
       <w:r>
-        <w:t xml:space="preserve">Each rho is accessed in the accumulator by bin index </w:t>
-      </w:r>
-      <w:proofErr w:type="spellStart"/>
-      <w:r>
-        <w:t>rho_index</w:t>
-      </w:r>
-      <w:proofErr w:type="spellEnd"/>
-      <w:r>
-        <w:t xml:space="preserve"> that corresponds to a rho with the formulas:</w:t>
+        <w:t>Each rho is accessed in the accumulator by bin index rho_index that corresponds to a rho with the formulas:</w:t>
       </w:r>
     </w:p>
     <w:p>
@@ -3672,39 +3244,47 @@
           <w:sz w:val="20"/>
           <w:szCs w:val="20"/>
         </w:rPr>
-        <w:t xml:space="preserve">  </w:t>
-      </w:r>
-      <w:proofErr w:type="spellStart"/>
-      <w:r>
+        <w:t xml:space="preserve">  rho_index = rho + nrhos / 2</w:t>
+      </w:r>
+    </w:p>
+    <w:p>
+      <w:pPr>
+        <w:pStyle w:val="code"/>
         <w:rPr>
           <w:sz w:val="20"/>
           <w:szCs w:val="20"/>
         </w:rPr>
-        <w:t>rho_index</w:t>
-      </w:r>
-      <w:proofErr w:type="spellEnd"/>
+      </w:pPr>
       <w:r>
         <w:rPr>
           <w:sz w:val="20"/>
           <w:szCs w:val="20"/>
         </w:rPr>
-        <w:t xml:space="preserve"> = rho + </w:t>
-      </w:r>
-      <w:proofErr w:type="spellStart"/>
-      <w:r>
+        <w:t xml:space="preserve">  rho = rho_index – nrhos / 2</w:t>
+      </w:r>
+    </w:p>
+    <w:p>
+      <w:pPr>
+        <w:pStyle w:val="Normalafterlist"/>
+      </w:pPr>
+      <w:r>
+        <w:t>The Hough accumulator is indexed by (rho_index, theta_index), where theta_index is the index of the sampled angle used. theta_index corresponds to the angle:</w:t>
+      </w:r>
+    </w:p>
+    <w:p>
+      <w:pPr>
+        <w:pStyle w:val="code"/>
         <w:rPr>
           <w:sz w:val="20"/>
           <w:szCs w:val="20"/>
         </w:rPr>
-        <w:t>nrhos</w:t>
-      </w:r>
-      <w:proofErr w:type="spellEnd"/>
+      </w:pPr>
       <w:r>
         <w:rPr>
           <w:sz w:val="20"/>
           <w:szCs w:val="20"/>
         </w:rPr>
-        <w:t xml:space="preserve"> / 2</w:t>
+        <w:t xml:space="preserve">  theta degrees = theta_index * theta_inc</w:t>
       </w:r>
     </w:p>
     <w:p>
@@ -3720,39 +3300,7 @@
           <w:sz w:val="20"/>
           <w:szCs w:val="20"/>
         </w:rPr>
-        <w:t xml:space="preserve">  rho = </w:t>
-      </w:r>
-      <w:proofErr w:type="spellStart"/>
-      <w:r>
-        <w:rPr>
-          <w:sz w:val="20"/>
-          <w:szCs w:val="20"/>
-        </w:rPr>
-        <w:t>rho_index</w:t>
-      </w:r>
-      <w:proofErr w:type="spellEnd"/>
-      <w:r>
-        <w:rPr>
-          <w:sz w:val="20"/>
-          <w:szCs w:val="20"/>
-        </w:rPr>
-        <w:t xml:space="preserve"> – </w:t>
-      </w:r>
-      <w:proofErr w:type="spellStart"/>
-      <w:r>
-        <w:rPr>
-          <w:sz w:val="20"/>
-          <w:szCs w:val="20"/>
-        </w:rPr>
-        <w:t>nrhos</w:t>
-      </w:r>
-      <w:proofErr w:type="spellEnd"/>
-      <w:r>
-        <w:rPr>
-          <w:sz w:val="20"/>
-          <w:szCs w:val="20"/>
-        </w:rPr>
-        <w:t xml:space="preserve"> / 2</w:t>
+        <w:t xml:space="preserve">  theta_index = theta degrees / theta_inc</w:t>
       </w:r>
     </w:p>
     <w:p>
@@ -3760,145 +3308,7 @@
         <w:pStyle w:val="Normalafterlist"/>
       </w:pPr>
       <w:r>
-        <w:t>The Hough accumulator is indexed by (</w:t>
-      </w:r>
-      <w:proofErr w:type="spellStart"/>
-      <w:r>
-        <w:t>rho_index</w:t>
-      </w:r>
-      <w:proofErr w:type="spellEnd"/>
-      <w:r>
-        <w:t xml:space="preserve">, </w:t>
-      </w:r>
-      <w:proofErr w:type="spellStart"/>
-      <w:r>
-        <w:t>theta_index</w:t>
-      </w:r>
-      <w:proofErr w:type="spellEnd"/>
-      <w:r>
-        <w:t xml:space="preserve">), where </w:t>
-      </w:r>
-      <w:proofErr w:type="spellStart"/>
-      <w:r>
-        <w:t>theta_index</w:t>
-      </w:r>
-      <w:proofErr w:type="spellEnd"/>
-      <w:r>
-        <w:t xml:space="preserve"> is the index of the sampled angle used. </w:t>
-      </w:r>
-      <w:proofErr w:type="spellStart"/>
-      <w:r>
-        <w:t>theta_index</w:t>
-      </w:r>
-      <w:proofErr w:type="spellEnd"/>
-      <w:r>
-        <w:t xml:space="preserve"> corresponds to the angle:</w:t>
-      </w:r>
-    </w:p>
-    <w:p>
-      <w:pPr>
-        <w:pStyle w:val="code"/>
-        <w:rPr>
-          <w:sz w:val="20"/>
-          <w:szCs w:val="20"/>
-        </w:rPr>
-      </w:pPr>
-      <w:r>
-        <w:rPr>
-          <w:sz w:val="20"/>
-          <w:szCs w:val="20"/>
-        </w:rPr>
-        <w:t xml:space="preserve">  theta degrees = </w:t>
-      </w:r>
-      <w:proofErr w:type="spellStart"/>
-      <w:r>
-        <w:rPr>
-          <w:sz w:val="20"/>
-          <w:szCs w:val="20"/>
-        </w:rPr>
-        <w:t>theta_index</w:t>
-      </w:r>
-      <w:proofErr w:type="spellEnd"/>
-      <w:r>
-        <w:rPr>
-          <w:sz w:val="20"/>
-          <w:szCs w:val="20"/>
-        </w:rPr>
-        <w:t xml:space="preserve"> * </w:t>
-      </w:r>
-      <w:proofErr w:type="spellStart"/>
-      <w:r>
-        <w:rPr>
-          <w:sz w:val="20"/>
-          <w:szCs w:val="20"/>
-        </w:rPr>
-        <w:t>theta_inc</w:t>
-      </w:r>
-      <w:proofErr w:type="spellEnd"/>
-    </w:p>
-    <w:p>
-      <w:pPr>
-        <w:pStyle w:val="code"/>
-        <w:rPr>
-          <w:sz w:val="20"/>
-          <w:szCs w:val="20"/>
-        </w:rPr>
-      </w:pPr>
-      <w:r>
-        <w:rPr>
-          <w:sz w:val="20"/>
-          <w:szCs w:val="20"/>
-        </w:rPr>
-        <w:t xml:space="preserve">  </w:t>
-      </w:r>
-      <w:proofErr w:type="spellStart"/>
-      <w:r>
-        <w:rPr>
-          <w:sz w:val="20"/>
-          <w:szCs w:val="20"/>
-        </w:rPr>
-        <w:t>theta_index</w:t>
-      </w:r>
-      <w:proofErr w:type="spellEnd"/>
-      <w:r>
-        <w:rPr>
-          <w:sz w:val="20"/>
-          <w:szCs w:val="20"/>
-        </w:rPr>
-        <w:t xml:space="preserve"> = theta degrees / </w:t>
-      </w:r>
-      <w:proofErr w:type="spellStart"/>
-      <w:r>
-        <w:rPr>
-          <w:sz w:val="20"/>
-          <w:szCs w:val="20"/>
-        </w:rPr>
-        <w:t>theta_inc</w:t>
-      </w:r>
-      <w:proofErr w:type="spellEnd"/>
-    </w:p>
-    <w:p>
-      <w:pPr>
-        <w:pStyle w:val="Normalafterlist"/>
-      </w:pPr>
-      <w:r>
-        <w:t>Polar lines (rho, theta) are generally input and stored as (</w:t>
-      </w:r>
-      <w:proofErr w:type="spellStart"/>
-      <w:r>
-        <w:t>rho_index</w:t>
-      </w:r>
-      <w:proofErr w:type="spellEnd"/>
-      <w:r>
-        <w:t xml:space="preserve">, </w:t>
-      </w:r>
-      <w:proofErr w:type="spellStart"/>
-      <w:r>
-        <w:t>theta_index</w:t>
-      </w:r>
-      <w:proofErr w:type="spellEnd"/>
-      <w:r>
-        <w:t>), except as noted.</w:t>
+        <w:t>Polar lines (rho, theta) are generally input and stored as (rho_index, theta_index), except as noted.</w:t>
       </w:r>
     </w:p>
     <w:p>
@@ -3991,7 +3401,6 @@
                 <w:bCs w:val="0"/>
               </w:rPr>
             </w:pPr>
-            <w:proofErr w:type="spellStart"/>
             <w:r>
               <w:rPr>
                 <w:b w:val="0"/>
@@ -3999,7 +3408,6 @@
               </w:rPr>
               <w:t>theta_inc</w:t>
             </w:r>
-            <w:proofErr w:type="spellEnd"/>
           </w:p>
         </w:tc>
         <w:tc>
@@ -4045,7 +3453,6 @@
                 <w:bCs w:val="0"/>
               </w:rPr>
             </w:pPr>
-            <w:proofErr w:type="spellStart"/>
             <w:r>
               <w:rPr>
                 <w:b w:val="0"/>
@@ -4053,7 +3460,6 @@
               </w:rPr>
               <w:t>nrhos</w:t>
             </w:r>
-            <w:proofErr w:type="spellEnd"/>
           </w:p>
         </w:tc>
         <w:tc>
@@ -4209,21 +3615,12 @@
                 <w:bCs w:val="0"/>
               </w:rPr>
             </w:pPr>
-            <w:proofErr w:type="spellStart"/>
-            <w:r>
-              <w:rPr>
-                <w:b w:val="0"/>
-                <w:bCs w:val="0"/>
-              </w:rPr>
-              <w:t>hough</w:t>
-            </w:r>
-            <w:proofErr w:type="spellEnd"/>
-            <w:r>
-              <w:rPr>
-                <w:b w:val="0"/>
-                <w:bCs w:val="0"/>
-              </w:rPr>
-              <w:t xml:space="preserve"> accumulator data</w:t>
+            <w:r>
+              <w:rPr>
+                <w:b w:val="0"/>
+                <w:bCs w:val="0"/>
+              </w:rPr>
+              <w:t>hough accumulator data</w:t>
             </w:r>
           </w:p>
         </w:tc>
@@ -4236,21 +3633,8 @@
               <w:pStyle w:val="NoSpacing"/>
               <w:cnfStyle w:val="000000100000" w:firstRow="0" w:lastRow="0" w:firstColumn="0" w:lastColumn="0" w:oddVBand="0" w:evenVBand="0" w:oddHBand="1" w:evenHBand="0" w:firstRowFirstColumn="0" w:firstRowLastColumn="0" w:lastRowFirstColumn="0" w:lastRowLastColumn="0"/>
             </w:pPr>
-            <w:proofErr w:type="spellStart"/>
-            <w:r>
-              <w:t>nrhos</w:t>
-            </w:r>
-            <w:proofErr w:type="spellEnd"/>
-            <w:r>
-              <w:t xml:space="preserve"> * </w:t>
-            </w:r>
-            <w:proofErr w:type="spellStart"/>
-            <w:r>
-              <w:t>nthetas</w:t>
-            </w:r>
-            <w:proofErr w:type="spellEnd"/>
-            <w:r>
-              <w:t xml:space="preserve"> 32-bit integers</w:t>
+            <w:r>
+              <w:t>nrhos * nthetas 32-bit integers</w:t>
             </w:r>
           </w:p>
         </w:tc>
@@ -4264,23 +3648,7 @@
               <w:cnfStyle w:val="000000100000" w:firstRow="0" w:lastRow="0" w:firstColumn="0" w:lastColumn="0" w:oddVBand="0" w:evenVBand="0" w:oddHBand="1" w:evenHBand="0" w:firstRowFirstColumn="0" w:firstRowLastColumn="0" w:lastRowFirstColumn="0" w:lastRowLastColumn="0"/>
             </w:pPr>
             <w:r>
-              <w:t>The Hough accumulator (</w:t>
-            </w:r>
-            <w:proofErr w:type="spellStart"/>
-            <w:r>
-              <w:t>rho_index</w:t>
-            </w:r>
-            <w:proofErr w:type="spellEnd"/>
-            <w:r>
-              <w:t xml:space="preserve">, </w:t>
-            </w:r>
-            <w:proofErr w:type="spellStart"/>
-            <w:r>
-              <w:t>theta_index</w:t>
-            </w:r>
-            <w:proofErr w:type="spellEnd"/>
-            <w:r>
-              <w:t>) count data</w:t>
+              <w:t>The Hough accumulator (rho_index, theta_index) count data</w:t>
             </w:r>
           </w:p>
         </w:tc>
@@ -4334,23 +3702,7 @@
           </w:tcPr>
           <w:p>
             <w:r>
-              <w:t>rho values from -</w:t>
-            </w:r>
-            <w:proofErr w:type="spellStart"/>
-            <w:r>
-              <w:t>nrhos</w:t>
-            </w:r>
-            <w:proofErr w:type="spellEnd"/>
-            <w:r>
-              <w:t xml:space="preserve">/2 to </w:t>
-            </w:r>
-            <w:proofErr w:type="spellStart"/>
-            <w:r>
-              <w:t>nrhos</w:t>
-            </w:r>
-            <w:proofErr w:type="spellEnd"/>
-            <w:r>
-              <w:t>/2</w:t>
+              <w:t>rho values from -nrhos/2 to nrhos/2</w:t>
             </w:r>
           </w:p>
         </w:tc>
@@ -4372,15 +3724,7 @@
           </w:tcPr>
           <w:p>
             <w:r>
-              <w:t xml:space="preserve">sample theta in degrees, followed by each accumulator count for the corresponding (rho, </w:t>
-            </w:r>
-            <w:proofErr w:type="spellStart"/>
-            <w:r>
-              <w:t>theta_index</w:t>
-            </w:r>
-            <w:proofErr w:type="spellEnd"/>
-            <w:r>
-              <w:t>)</w:t>
+              <w:t>sample theta in degrees, followed by each accumulator count for the corresponding (rho, theta_index)</w:t>
             </w:r>
           </w:p>
         </w:tc>
@@ -4417,23 +3761,7 @@
     </w:p>
     <w:p>
       <w:r>
-        <w:t>The binary Hough peak line data is defined by the workbench and has the following format. Polar line data is stored as (</w:t>
-      </w:r>
-      <w:proofErr w:type="spellStart"/>
-      <w:r>
-        <w:t>rho_index</w:t>
-      </w:r>
-      <w:proofErr w:type="spellEnd"/>
-      <w:r>
-        <w:t xml:space="preserve">, </w:t>
-      </w:r>
-      <w:proofErr w:type="spellStart"/>
-      <w:r>
-        <w:t>theta_index</w:t>
-      </w:r>
-      <w:proofErr w:type="spellEnd"/>
-      <w:r>
-        <w:t>). The corresponding rho and theta can be derived from:</w:t>
+        <w:t>The binary Hough peak line data is defined by the workbench and has the following format. Polar line data is stored as (rho_index, theta_index). The corresponding rho and theta can be derived from:</w:t>
       </w:r>
     </w:p>
     <w:p>
@@ -4449,81 +3777,24 @@
           <w:sz w:val="20"/>
           <w:szCs w:val="20"/>
         </w:rPr>
-        <w:t xml:space="preserve">rho = </w:t>
-      </w:r>
-      <w:proofErr w:type="spellStart"/>
-      <w:r>
+        <w:t>rho = rho_index – max_rho / 2</w:t>
+      </w:r>
+    </w:p>
+    <w:p>
+      <w:pPr>
+        <w:pStyle w:val="code"/>
         <w:rPr>
           <w:sz w:val="20"/>
           <w:szCs w:val="20"/>
         </w:rPr>
-        <w:t>rho_index</w:t>
-      </w:r>
-      <w:proofErr w:type="spellEnd"/>
+      </w:pPr>
       <w:r>
         <w:rPr>
           <w:sz w:val="20"/>
           <w:szCs w:val="20"/>
         </w:rPr>
-        <w:t xml:space="preserve"> – </w:t>
-      </w:r>
-      <w:proofErr w:type="spellStart"/>
-      <w:r>
-        <w:rPr>
-          <w:sz w:val="20"/>
-          <w:szCs w:val="20"/>
-        </w:rPr>
-        <w:t>max_rho</w:t>
-      </w:r>
-      <w:proofErr w:type="spellEnd"/>
-      <w:r>
-        <w:rPr>
-          <w:sz w:val="20"/>
-          <w:szCs w:val="20"/>
-        </w:rPr>
-        <w:t xml:space="preserve"> / 2</w:t>
-      </w:r>
-    </w:p>
-    <w:p>
-      <w:pPr>
-        <w:pStyle w:val="code"/>
-        <w:rPr>
-          <w:sz w:val="20"/>
-          <w:szCs w:val="20"/>
-        </w:rPr>
-      </w:pPr>
-      <w:r>
-        <w:rPr>
-          <w:sz w:val="20"/>
-          <w:szCs w:val="20"/>
-        </w:rPr>
-        <w:t xml:space="preserve">theta degrees = </w:t>
-      </w:r>
-      <w:proofErr w:type="spellStart"/>
-      <w:r>
-        <w:rPr>
-          <w:sz w:val="20"/>
-          <w:szCs w:val="20"/>
-        </w:rPr>
-        <w:t>theta_index</w:t>
-      </w:r>
-      <w:proofErr w:type="spellEnd"/>
-      <w:r>
-        <w:rPr>
-          <w:sz w:val="20"/>
-          <w:szCs w:val="20"/>
-        </w:rPr>
-        <w:t xml:space="preserve"> * </w:t>
-      </w:r>
-      <w:proofErr w:type="spellStart"/>
-      <w:r>
-        <w:rPr>
-          <w:sz w:val="20"/>
-          <w:szCs w:val="20"/>
-        </w:rPr>
-        <w:t>theta_inc</w:t>
-      </w:r>
-      <w:proofErr w:type="spellEnd"/>
+        <w:t>theta degrees = theta_index * theta_inc</w:t>
+      </w:r>
     </w:p>
     <w:p>
       <w:pPr>
@@ -4611,7 +3882,6 @@
                 <w:bCs w:val="0"/>
               </w:rPr>
             </w:pPr>
-            <w:proofErr w:type="spellStart"/>
             <w:r>
               <w:rPr>
                 <w:b w:val="0"/>
@@ -4619,7 +3889,6 @@
               </w:rPr>
               <w:t>nlines</w:t>
             </w:r>
-            <w:proofErr w:type="spellEnd"/>
           </w:p>
         </w:tc>
         <w:tc>
@@ -4646,42 +3915,25 @@
               <w:cnfStyle w:val="000000100000" w:firstRow="0" w:lastRow="0" w:firstColumn="0" w:lastColumn="0" w:oddVBand="0" w:evenVBand="0" w:oddHBand="1" w:evenHBand="0" w:firstRowFirstColumn="0" w:firstRowLastColumn="0" w:lastRowFirstColumn="0" w:lastRowLastColumn="0"/>
             </w:pPr>
             <w:r>
-              <w:t>The number of polar lines (</w:t>
-            </w:r>
-            <w:proofErr w:type="spellStart"/>
-            <w:r>
-              <w:t>rho_index</w:t>
-            </w:r>
-            <w:proofErr w:type="spellEnd"/>
-            <w:r>
-              <w:t xml:space="preserve">, </w:t>
-            </w:r>
-            <w:proofErr w:type="spellStart"/>
-            <w:r>
-              <w:t>theta_index</w:t>
-            </w:r>
-            <w:proofErr w:type="spellEnd"/>
-            <w:r>
-              <w:t xml:space="preserve">, count) </w:t>
-            </w:r>
-          </w:p>
-        </w:tc>
-      </w:tr>
-      <w:tr>
-        <w:tc>
-          <w:tcPr>
-            <w:cnfStyle w:val="001000000000" w:firstRow="0" w:lastRow="0" w:firstColumn="1" w:lastColumn="0" w:oddVBand="0" w:evenVBand="0" w:oddHBand="0" w:evenHBand="0" w:firstRowFirstColumn="0" w:firstRowLastColumn="0" w:lastRowFirstColumn="0" w:lastRowLastColumn="0"/>
-            <w:tcW w:w="0" w:type="auto"/>
-          </w:tcPr>
-          <w:p>
-            <w:pPr>
-              <w:pStyle w:val="NoSpacing"/>
-              <w:rPr>
-                <w:b w:val="0"/>
-                <w:bCs w:val="0"/>
-              </w:rPr>
-            </w:pPr>
-            <w:proofErr w:type="spellStart"/>
+              <w:t xml:space="preserve">The number of polar lines (rho_index, theta_index, count) </w:t>
+            </w:r>
+          </w:p>
+        </w:tc>
+      </w:tr>
+      <w:tr>
+        <w:tc>
+          <w:tcPr>
+            <w:cnfStyle w:val="001000000000" w:firstRow="0" w:lastRow="0" w:firstColumn="1" w:lastColumn="0" w:oddVBand="0" w:evenVBand="0" w:oddHBand="0" w:evenHBand="0" w:firstRowFirstColumn="0" w:firstRowLastColumn="0" w:lastRowFirstColumn="0" w:lastRowLastColumn="0"/>
+            <w:tcW w:w="0" w:type="auto"/>
+          </w:tcPr>
+          <w:p>
+            <w:pPr>
+              <w:pStyle w:val="NoSpacing"/>
+              <w:rPr>
+                <w:b w:val="0"/>
+                <w:bCs w:val="0"/>
+              </w:rPr>
+            </w:pPr>
             <w:r>
               <w:rPr>
                 <w:b w:val="0"/>
@@ -4689,7 +3941,6 @@
               </w:rPr>
               <w:t>theta_inc</w:t>
             </w:r>
-            <w:proofErr w:type="spellEnd"/>
           </w:p>
         </w:tc>
         <w:tc>
@@ -4738,7 +3989,6 @@
                 <w:bCs w:val="0"/>
               </w:rPr>
             </w:pPr>
-            <w:proofErr w:type="spellStart"/>
             <w:r>
               <w:rPr>
                 <w:b w:val="0"/>
@@ -4746,7 +3996,6 @@
               </w:rPr>
               <w:t>nrhos</w:t>
             </w:r>
-            <w:proofErr w:type="spellEnd"/>
           </w:p>
         </w:tc>
         <w:tc>
@@ -4811,15 +4060,7 @@
               <w:cnfStyle w:val="000000000000" w:firstRow="0" w:lastRow="0" w:firstColumn="0" w:lastColumn="0" w:oddVBand="0" w:evenVBand="0" w:oddHBand="0" w:evenHBand="0" w:firstRowFirstColumn="0" w:firstRowLastColumn="0" w:lastRowFirstColumn="0" w:lastRowLastColumn="0"/>
             </w:pPr>
             <w:r>
-              <w:t xml:space="preserve">3 * </w:t>
-            </w:r>
-            <w:proofErr w:type="spellStart"/>
-            <w:r>
-              <w:t>nlines</w:t>
-            </w:r>
-            <w:proofErr w:type="spellEnd"/>
-            <w:r>
-              <w:t xml:space="preserve"> 32-bit integers</w:t>
+              <w:t>3 * nlines 32-bit integers</w:t>
             </w:r>
           </w:p>
         </w:tc>
@@ -4833,23 +4074,7 @@
               <w:cnfStyle w:val="000000000000" w:firstRow="0" w:lastRow="0" w:firstColumn="0" w:lastColumn="0" w:oddVBand="0" w:evenVBand="0" w:oddHBand="0" w:evenHBand="0" w:firstRowFirstColumn="0" w:firstRowLastColumn="0" w:lastRowFirstColumn="0" w:lastRowLastColumn="0"/>
             </w:pPr>
             <w:r>
-              <w:t>The polar line (</w:t>
-            </w:r>
-            <w:proofErr w:type="spellStart"/>
-            <w:r>
-              <w:t>rho_index</w:t>
-            </w:r>
-            <w:proofErr w:type="spellEnd"/>
-            <w:r>
-              <w:t xml:space="preserve">, </w:t>
-            </w:r>
-            <w:proofErr w:type="spellStart"/>
-            <w:r>
-              <w:t>theta_index</w:t>
-            </w:r>
-            <w:proofErr w:type="spellEnd"/>
-            <w:r>
-              <w:t>, count) data</w:t>
+              <w:t>The polar line (rho_index, theta_index, count) data</w:t>
             </w:r>
           </w:p>
         </w:tc>
@@ -5021,11 +4246,7 @@
       </w:pPr>
       <w:r>
         <w:tab/>
-        <w:t xml:space="preserve">      </w:t>
-      </w:r>
-      <w:proofErr w:type="gramStart"/>
-      <w:r>
-        <w:t>a</w:t>
+        <w:t xml:space="preserve">      a</w:t>
       </w:r>
       <w:r>
         <w:rPr>
@@ -5034,7 +4255,6 @@
         </w:rPr>
         <w:t>dditional-steps</w:t>
       </w:r>
-      <w:proofErr w:type="gramEnd"/>
     </w:p>
     <w:p>
       <w:pPr>
@@ -5140,15 +4360,7 @@
       </w:pPr>
       <w:r>
         <w:tab/>
-        <w:t xml:space="preserve">  “</w:t>
-      </w:r>
-      <w:proofErr w:type="gramStart"/>
-      <w:r>
-        <w:t>input</w:t>
-      </w:r>
-      <w:proofErr w:type="gramEnd"/>
-      <w:r>
-        <w:t>-data”: [</w:t>
+        <w:t xml:space="preserve">  “input-data”: [</w:t>
       </w:r>
     </w:p>
     <w:p>
@@ -5179,15 +4391,7 @@
       </w:pPr>
       <w:r>
         <w:tab/>
-        <w:t xml:space="preserve">  “</w:t>
-      </w:r>
-      <w:proofErr w:type="gramStart"/>
-      <w:r>
-        <w:t>output</w:t>
-      </w:r>
-      <w:proofErr w:type="gramEnd"/>
-      <w:r>
-        <w:t>-data”: [</w:t>
+        <w:t xml:space="preserve">  “output-data”: [</w:t>
       </w:r>
     </w:p>
     <w:p>
@@ -5463,57 +4667,46 @@
       <w:r>
         <w:t xml:space="preserve">          "</w:t>
       </w:r>
-      <w:proofErr w:type="gramStart"/>
       <w:r>
         <w:rPr>
           <w:i/>
           <w:iCs/>
         </w:rPr>
-        <w:t>parameter</w:t>
-      </w:r>
-      <w:proofErr w:type="gramEnd"/>
+        <w:t>parameter-name</w:t>
+      </w:r>
+      <w:r>
+        <w:t>": "</w:t>
+      </w:r>
       <w:r>
         <w:rPr>
           <w:i/>
           <w:iCs/>
         </w:rPr>
-        <w:t>-name</w:t>
-      </w:r>
-      <w:r>
-        <w:t>": "</w:t>
+        <w:t>value</w:t>
+      </w:r>
+      <w:r>
+        <w:t>"</w:t>
+      </w:r>
+    </w:p>
+    <w:p>
+      <w:pPr>
+        <w:pStyle w:val="Heading2"/>
+      </w:pPr>
+      <w:r>
+        <w:t>Data Descriptors</w:t>
+      </w:r>
+    </w:p>
+    <w:p>
+      <w:r>
+        <w:t xml:space="preserve">The data descriptor determines what type of data is handled by the data descriptor, in what format is that data stored, and in which type of repository is the data found. The </w:t>
       </w:r>
       <w:r>
         <w:rPr>
           <w:i/>
           <w:iCs/>
         </w:rPr>
-        <w:t>value</w:t>
-      </w:r>
-      <w:r>
-        <w:t>"</w:t>
-      </w:r>
-    </w:p>
-    <w:p>
-      <w:pPr>
-        <w:pStyle w:val="Heading2"/>
-      </w:pPr>
-      <w:r>
-        <w:t>Data Descriptors</w:t>
-      </w:r>
-    </w:p>
-    <w:p>
-      <w:r>
-        <w:t xml:space="preserve">The data descriptor determines what type of data is handled by the data descriptor, in what format is that data stored, and in which type of repository is the data found. The </w:t>
-      </w:r>
-      <w:proofErr w:type="gramStart"/>
-      <w:r>
-        <w:rPr>
-          <w:i/>
-          <w:iCs/>
-        </w:rPr>
         <w:t>data-type</w:t>
       </w:r>
-      <w:proofErr w:type="gramEnd"/>
       <w:r>
         <w:t xml:space="preserve"> and </w:t>
       </w:r>
@@ -5564,21 +4757,12 @@
             <w:pPr>
               <w:cnfStyle w:val="100000000000" w:firstRow="1" w:lastRow="0" w:firstColumn="0" w:lastColumn="0" w:oddVBand="0" w:evenVBand="0" w:oddHBand="0" w:evenHBand="0" w:firstRowFirstColumn="0" w:firstRowLastColumn="0" w:lastRowFirstColumn="0" w:lastRowLastColumn="0"/>
             </w:pPr>
-            <w:proofErr w:type="gramStart"/>
             <w:r>
               <w:rPr>
                 <w:i/>
                 <w:iCs/>
               </w:rPr>
-              <w:t>data-type</w:t>
-            </w:r>
-            <w:proofErr w:type="gramEnd"/>
-            <w:r>
-              <w:rPr>
-                <w:i/>
-                <w:iCs/>
-              </w:rPr>
-              <w:t xml:space="preserve"> </w:t>
+              <w:t xml:space="preserve">data-type </w:t>
             </w:r>
           </w:p>
         </w:tc>
@@ -5751,15 +4935,7 @@
               <w:cnfStyle w:val="000000100000" w:firstRow="0" w:lastRow="0" w:firstColumn="0" w:lastColumn="0" w:oddVBand="0" w:evenVBand="0" w:oddHBand="1" w:evenHBand="0" w:firstRowFirstColumn="0" w:firstRowLastColumn="0" w:lastRowFirstColumn="0" w:lastRowLastColumn="0"/>
             </w:pPr>
             <w:r>
-              <w:t>“</w:t>
-            </w:r>
-            <w:proofErr w:type="spellStart"/>
-            <w:r>
-              <w:t>hough</w:t>
-            </w:r>
-            <w:proofErr w:type="spellEnd"/>
-            <w:r>
-              <w:t>”</w:t>
+              <w:t>“hough”</w:t>
             </w:r>
           </w:p>
         </w:tc>
@@ -5816,15 +4992,7 @@
               <w:cnfStyle w:val="000000000000" w:firstRow="0" w:lastRow="0" w:firstColumn="0" w:lastColumn="0" w:oddVBand="0" w:evenVBand="0" w:oddHBand="0" w:evenHBand="0" w:firstRowFirstColumn="0" w:firstRowLastColumn="0" w:lastRowFirstColumn="0" w:lastRowLastColumn="0"/>
             </w:pPr>
             <w:r>
-              <w:t>“</w:t>
-            </w:r>
-            <w:proofErr w:type="gramStart"/>
-            <w:r>
-              <w:t>polar</w:t>
-            </w:r>
-            <w:proofErr w:type="gramEnd"/>
-            <w:r>
-              <w:t>-line”</w:t>
+              <w:t>“polar-line”</w:t>
             </w:r>
           </w:p>
         </w:tc>
@@ -5964,32 +5132,7 @@
                 <w:b w:val="0"/>
                 <w:bCs w:val="0"/>
               </w:rPr>
-              <w:t>“</w:t>
-            </w:r>
-            <w:proofErr w:type="spellStart"/>
-            <w:proofErr w:type="gramStart"/>
-            <w:r>
-              <w:rPr>
-                <w:b w:val="0"/>
-                <w:bCs w:val="0"/>
-              </w:rPr>
-              <w:t>berkeley</w:t>
-            </w:r>
-            <w:proofErr w:type="gramEnd"/>
-            <w:r>
-              <w:rPr>
-                <w:b w:val="0"/>
-                <w:bCs w:val="0"/>
-              </w:rPr>
-              <w:t>_db</w:t>
-            </w:r>
-            <w:proofErr w:type="spellEnd"/>
-            <w:r>
-              <w:rPr>
-                <w:b w:val="0"/>
-                <w:bCs w:val="0"/>
-              </w:rPr>
-              <w:t>”</w:t>
+              <w:t>“berkeley_db”</w:t>
             </w:r>
           </w:p>
         </w:tc>
@@ -6177,15 +5320,7 @@
         <w:pStyle w:val="code"/>
       </w:pPr>
       <w:r>
-        <w:t xml:space="preserve">      "</w:t>
-      </w:r>
-      <w:proofErr w:type="spellStart"/>
-      <w:r>
-        <w:t>ext</w:t>
-      </w:r>
-      <w:proofErr w:type="spellEnd"/>
-      <w:r>
-        <w:t>": "</w:t>
+        <w:t xml:space="preserve">      "ext": "</w:t>
       </w:r>
       <w:r>
         <w:rPr>
@@ -6220,33 +5355,17 @@
           <w:i/>
           <w:iCs/>
         </w:rPr>
-        <w:t>filename-</w:t>
-      </w:r>
-      <w:proofErr w:type="spellStart"/>
+        <w:t>filename-base</w:t>
+      </w:r>
+      <w:r>
+        <w:t>.</w:t>
+      </w:r>
       <w:r>
         <w:rPr>
           <w:i/>
           <w:iCs/>
         </w:rPr>
-        <w:t>base</w:t>
-      </w:r>
-      <w:r>
-        <w:t>.</w:t>
-      </w:r>
-      <w:r>
-        <w:rPr>
-          <w:i/>
-          <w:iCs/>
-        </w:rPr>
-        <w:t>filename</w:t>
-      </w:r>
-      <w:proofErr w:type="spellEnd"/>
-      <w:r>
-        <w:rPr>
-          <w:i/>
-          <w:iCs/>
-        </w:rPr>
-        <w:t>-extension</w:t>
+        <w:t>filename-extension</w:t>
       </w:r>
       <w:r>
         <w:t xml:space="preserve">". The </w:t>
@@ -6266,15 +5385,7 @@
     </w:p>
     <w:p>
       <w:r>
-        <w:t xml:space="preserve">Scripts run results are added back into the original experiment run JSON text file and saved </w:t>
-      </w:r>
-      <w:proofErr w:type="gramStart"/>
-      <w:r>
-        <w:t>into  a</w:t>
-      </w:r>
-      <w:proofErr w:type="gramEnd"/>
-      <w:r>
-        <w:t xml:space="preserve"> log file. Results are logged into different levels of the script. The format in which results are added to the top-level of the experiment script follows. Results data added is shown in </w:t>
+        <w:t xml:space="preserve">Scripts run results are added back into the original experiment run JSON text file and saved into  a log file. Results are logged into different levels of the script. The format in which results are added to the top-level of the experiment script follows. Results data added is shown in </w:t>
       </w:r>
       <w:r>
         <w:rPr>
@@ -6321,56 +5432,24 @@
           <w:b/>
           <w:bCs/>
         </w:rPr>
-        <w:t xml:space="preserve">    “run</w:t>
-      </w:r>
-      <w:proofErr w:type="gramStart"/>
-      <w:r>
+        <w:t xml:space="preserve">    “run” : {</w:t>
+      </w:r>
+    </w:p>
+    <w:p>
+      <w:pPr>
+        <w:pStyle w:val="code"/>
         <w:rPr>
           <w:b/>
           <w:bCs/>
         </w:rPr>
-        <w:t>” :</w:t>
-      </w:r>
-      <w:proofErr w:type="gramEnd"/>
+      </w:pPr>
       <w:r>
         <w:rPr>
           <w:b/>
           <w:bCs/>
         </w:rPr>
-        <w:t xml:space="preserve"> {</w:t>
-      </w:r>
-    </w:p>
-    <w:p>
-      <w:pPr>
-        <w:pStyle w:val="code"/>
-        <w:rPr>
-          <w:b/>
-          <w:bCs/>
-        </w:rPr>
-      </w:pPr>
-      <w:r>
-        <w:rPr>
-          <w:b/>
-          <w:bCs/>
-        </w:rPr>
         <w:tab/>
-        <w:t xml:space="preserve">        “</w:t>
-      </w:r>
-      <w:proofErr w:type="gramStart"/>
-      <w:r>
-        <w:rPr>
-          <w:b/>
-          <w:bCs/>
-        </w:rPr>
-        <w:t>script</w:t>
-      </w:r>
-      <w:proofErr w:type="gramEnd"/>
-      <w:r>
-        <w:rPr>
-          <w:b/>
-          <w:bCs/>
-        </w:rPr>
-        <w:t>-path”: “</w:t>
+        <w:t xml:space="preserve">        “script-path”: “</w:t>
       </w:r>
       <w:r>
         <w:rPr>
@@ -6618,11 +5697,7 @@
       </w:pPr>
       <w:r>
         <w:tab/>
-        <w:t xml:space="preserve">      </w:t>
-      </w:r>
-      <w:proofErr w:type="gramStart"/>
-      <w:r>
-        <w:t>a</w:t>
+        <w:t xml:space="preserve">      a</w:t>
       </w:r>
       <w:r>
         <w:rPr>
@@ -6631,7 +5706,6 @@
         </w:rPr>
         <w:t>dditional-steps</w:t>
       </w:r>
-      <w:proofErr w:type="gramEnd"/>
     </w:p>
     <w:p>
       <w:pPr>
@@ -6737,15 +5811,7 @@
       </w:pPr>
       <w:r>
         <w:tab/>
-        <w:t xml:space="preserve">  “</w:t>
-      </w:r>
-      <w:proofErr w:type="gramStart"/>
-      <w:r>
-        <w:t>input</w:t>
-      </w:r>
-      <w:proofErr w:type="gramEnd"/>
-      <w:r>
-        <w:t>-data”: [</w:t>
+        <w:t xml:space="preserve">  “input-data”: [</w:t>
       </w:r>
     </w:p>
     <w:p>
@@ -6776,15 +5842,7 @@
       </w:pPr>
       <w:r>
         <w:tab/>
-        <w:t xml:space="preserve">  “</w:t>
-      </w:r>
-      <w:proofErr w:type="gramStart"/>
-      <w:r>
-        <w:t>output</w:t>
-      </w:r>
-      <w:proofErr w:type="gramEnd"/>
-      <w:r>
-        <w:t>-data”: [</w:t>
+        <w:t xml:space="preserve">  “output-data”: [</w:t>
       </w:r>
     </w:p>
     <w:p>
@@ -7016,15 +6074,7 @@
       </w:pPr>
       <w:r>
         <w:tab/>
-        <w:t xml:space="preserve">  “</w:t>
-      </w:r>
-      <w:proofErr w:type="gramStart"/>
-      <w:r>
-        <w:t>input</w:t>
-      </w:r>
-      <w:proofErr w:type="gramEnd"/>
-      <w:r>
-        <w:t>-data”: [</w:t>
+        <w:t xml:space="preserve">  “input-data”: [</w:t>
       </w:r>
     </w:p>
     <w:p>
@@ -7055,15 +6105,7 @@
       </w:pPr>
       <w:r>
         <w:tab/>
-        <w:t xml:space="preserve">  “</w:t>
-      </w:r>
-      <w:proofErr w:type="gramStart"/>
-      <w:r>
-        <w:t>output</w:t>
-      </w:r>
-      <w:proofErr w:type="gramEnd"/>
-      <w:r>
-        <w:t>-data”: [</w:t>
+        <w:t xml:space="preserve">  “output-data”: [</w:t>
       </w:r>
     </w:p>
     <w:p>
@@ -7240,23 +6282,7 @@
           <w:sz w:val="20"/>
           <w:szCs w:val="20"/>
         </w:rPr>
-        <w:t xml:space="preserve">  “</w:t>
-      </w:r>
-      <w:proofErr w:type="gramStart"/>
-      <w:r>
-        <w:rPr>
-          <w:sz w:val="20"/>
-          <w:szCs w:val="20"/>
-        </w:rPr>
-        <w:t>module</w:t>
-      </w:r>
-      <w:proofErr w:type="gramEnd"/>
-      <w:r>
-        <w:rPr>
-          <w:sz w:val="20"/>
-          <w:szCs w:val="20"/>
-        </w:rPr>
-        <w:t>-id”: “error-message”</w:t>
+        <w:t xml:space="preserve">  “module-id”: “error-message”</w:t>
       </w:r>
     </w:p>
     <w:p>
@@ -7359,15 +6385,7 @@
         </w:r>
       </w:hyperlink>
       <w:r>
-        <w:t xml:space="preserve">. A version of Linux under which the program can be run on Windows 10 that is </w:t>
-      </w:r>
-      <w:proofErr w:type="gramStart"/>
-      <w:r>
-        <w:t>fairly easy</w:t>
-      </w:r>
-      <w:proofErr w:type="gramEnd"/>
-      <w:r>
-        <w:t xml:space="preserve"> to install uses </w:t>
+        <w:t xml:space="preserve">. A version of Linux under which the program can be run on Windows 10 that is fairly easy to install uses </w:t>
       </w:r>
       <w:hyperlink r:id="rId22" w:history="1">
         <w:r>
@@ -7401,23 +6419,7 @@
           <w:sz w:val="20"/>
           <w:szCs w:val="20"/>
         </w:rPr>
-        <w:t xml:space="preserve">  </w:t>
-      </w:r>
-      <w:proofErr w:type="gramStart"/>
-      <w:r>
-        <w:rPr>
-          <w:sz w:val="20"/>
-          <w:szCs w:val="20"/>
-        </w:rPr>
-        <w:t>$ .</w:t>
-      </w:r>
-      <w:proofErr w:type="gramEnd"/>
-      <w:r>
-        <w:rPr>
-          <w:sz w:val="20"/>
-          <w:szCs w:val="20"/>
-        </w:rPr>
-        <w:t xml:space="preserve">/cv-workbench </w:t>
+        <w:t xml:space="preserve">  $ ./cv-workbench </w:t>
       </w:r>
       <w:r>
         <w:rPr>
@@ -7540,25 +6542,27 @@
           <w:szCs w:val="16"/>
         </w:rPr>
         <w:tab/>
-        <w:t xml:space="preserve">  "operator": "filter-edge-</w:t>
-      </w:r>
-      <w:proofErr w:type="spellStart"/>
-      <w:r>
+        <w:t xml:space="preserve">  "operator": "filter-edge-sobel",</w:t>
+      </w:r>
+    </w:p>
+    <w:p>
+      <w:pPr>
+        <w:shd w:val="clear" w:color="auto" w:fill="FFFFFF"/>
+        <w:spacing w:after="0" w:line="240" w:lineRule="auto"/>
         <w:rPr>
           <w:rFonts w:ascii="Lucida Console" w:hAnsi="Lucida Console"/>
           <w:sz w:val="16"/>
           <w:szCs w:val="16"/>
         </w:rPr>
-        <w:t>sobel</w:t>
-      </w:r>
-      <w:proofErr w:type="spellEnd"/>
+      </w:pPr>
       <w:r>
         <w:rPr>
           <w:rFonts w:ascii="Lucida Console" w:hAnsi="Lucida Console"/>
           <w:sz w:val="16"/>
           <w:szCs w:val="16"/>
         </w:rPr>
-        <w:t>",</w:t>
+        <w:tab/>
+        <w:t xml:space="preserve">  "input-data": [</w:t>
       </w:r>
     </w:p>
     <w:p>
@@ -7578,25 +6582,27 @@
           <w:szCs w:val="16"/>
         </w:rPr>
         <w:tab/>
-        <w:t xml:space="preserve">  "</w:t>
-      </w:r>
-      <w:proofErr w:type="gramStart"/>
-      <w:r>
+        <w:t xml:space="preserve">    {</w:t>
+      </w:r>
+    </w:p>
+    <w:p>
+      <w:pPr>
+        <w:shd w:val="clear" w:color="auto" w:fill="FFFFFF"/>
+        <w:spacing w:after="0" w:line="240" w:lineRule="auto"/>
         <w:rPr>
           <w:rFonts w:ascii="Lucida Console" w:hAnsi="Lucida Console"/>
           <w:sz w:val="16"/>
           <w:szCs w:val="16"/>
         </w:rPr>
-        <w:t>input</w:t>
-      </w:r>
-      <w:proofErr w:type="gramEnd"/>
+      </w:pPr>
       <w:r>
         <w:rPr>
           <w:rFonts w:ascii="Lucida Console" w:hAnsi="Lucida Console"/>
           <w:sz w:val="16"/>
           <w:szCs w:val="16"/>
         </w:rPr>
-        <w:t>-data": [</w:t>
+        <w:tab/>
+        <w:t xml:space="preserve">      "id": 1,</w:t>
       </w:r>
     </w:p>
     <w:p>
@@ -7616,7 +6622,7 @@
           <w:szCs w:val="16"/>
         </w:rPr>
         <w:tab/>
-        <w:t xml:space="preserve">    {</w:t>
+        <w:t xml:space="preserve">      "type": "image",</w:t>
       </w:r>
     </w:p>
     <w:p>
@@ -7636,7 +6642,7 @@
           <w:szCs w:val="16"/>
         </w:rPr>
         <w:tab/>
-        <w:t xml:space="preserve">      "id": 1,</w:t>
+        <w:t xml:space="preserve">      "repository": "filesystem",</w:t>
       </w:r>
     </w:p>
     <w:p>
@@ -7656,7 +6662,7 @@
           <w:szCs w:val="16"/>
         </w:rPr>
         <w:tab/>
-        <w:t xml:space="preserve">      "type": "image",</w:t>
+        <w:t xml:space="preserve">      "format": "jpeg",</w:t>
       </w:r>
     </w:p>
     <w:p>
@@ -7676,7 +6682,7 @@
           <w:szCs w:val="16"/>
         </w:rPr>
         <w:tab/>
-        <w:t xml:space="preserve">      "repository": "filesystem",</w:t>
+        <w:t xml:space="preserve">      "directory": ".",</w:t>
       </w:r>
     </w:p>
     <w:p>
@@ -7696,7 +6702,7 @@
           <w:szCs w:val="16"/>
         </w:rPr>
         <w:tab/>
-        <w:t xml:space="preserve">      "format": "jpeg",</w:t>
+        <w:t xml:space="preserve">      "filename": "square45-90_gray",</w:t>
       </w:r>
     </w:p>
     <w:p>
@@ -7716,7 +6722,7 @@
           <w:szCs w:val="16"/>
         </w:rPr>
         <w:tab/>
-        <w:t xml:space="preserve">      "directory": ".",</w:t>
+        <w:t xml:space="preserve">      "ext": "jpg"</w:t>
       </w:r>
     </w:p>
     <w:p>
@@ -7736,7 +6742,7 @@
           <w:szCs w:val="16"/>
         </w:rPr>
         <w:tab/>
-        <w:t xml:space="preserve">      "filename": "square45-90_gray",</w:t>
+        <w:t xml:space="preserve">    }</w:t>
       </w:r>
     </w:p>
     <w:p>
@@ -7756,25 +6762,27 @@
           <w:szCs w:val="16"/>
         </w:rPr>
         <w:tab/>
-        <w:t xml:space="preserve">      "</w:t>
-      </w:r>
-      <w:proofErr w:type="spellStart"/>
-      <w:r>
+        <w:t xml:space="preserve">  ],</w:t>
+      </w:r>
+    </w:p>
+    <w:p>
+      <w:pPr>
+        <w:shd w:val="clear" w:color="auto" w:fill="FFFFFF"/>
+        <w:spacing w:after="0" w:line="240" w:lineRule="auto"/>
         <w:rPr>
           <w:rFonts w:ascii="Lucida Console" w:hAnsi="Lucida Console"/>
           <w:sz w:val="16"/>
           <w:szCs w:val="16"/>
         </w:rPr>
-        <w:t>ext</w:t>
-      </w:r>
-      <w:proofErr w:type="spellEnd"/>
+      </w:pPr>
       <w:r>
         <w:rPr>
           <w:rFonts w:ascii="Lucida Console" w:hAnsi="Lucida Console"/>
           <w:sz w:val="16"/>
           <w:szCs w:val="16"/>
         </w:rPr>
-        <w:t>": "jpg"</w:t>
+        <w:tab/>
+        <w:t xml:space="preserve">  "output-data": [</w:t>
       </w:r>
     </w:p>
     <w:p>
@@ -7794,7 +6802,7 @@
           <w:szCs w:val="16"/>
         </w:rPr>
         <w:tab/>
-        <w:t xml:space="preserve">    }</w:t>
+        <w:t xml:space="preserve">    {</w:t>
       </w:r>
     </w:p>
     <w:p>
@@ -7814,7 +6822,7 @@
           <w:szCs w:val="16"/>
         </w:rPr>
         <w:tab/>
-        <w:t xml:space="preserve">  ],</w:t>
+        <w:t xml:space="preserve">      "id": 1,</w:t>
       </w:r>
     </w:p>
     <w:p>
@@ -7834,25 +6842,27 @@
           <w:szCs w:val="16"/>
         </w:rPr>
         <w:tab/>
-        <w:t xml:space="preserve">  "</w:t>
-      </w:r>
-      <w:proofErr w:type="gramStart"/>
-      <w:r>
+        <w:t xml:space="preserve">      "type": "image",</w:t>
+      </w:r>
+    </w:p>
+    <w:p>
+      <w:pPr>
+        <w:shd w:val="clear" w:color="auto" w:fill="FFFFFF"/>
+        <w:spacing w:after="0" w:line="240" w:lineRule="auto"/>
         <w:rPr>
           <w:rFonts w:ascii="Lucida Console" w:hAnsi="Lucida Console"/>
           <w:sz w:val="16"/>
           <w:szCs w:val="16"/>
         </w:rPr>
-        <w:t>output</w:t>
-      </w:r>
-      <w:proofErr w:type="gramEnd"/>
+      </w:pPr>
       <w:r>
         <w:rPr>
           <w:rFonts w:ascii="Lucida Console" w:hAnsi="Lucida Console"/>
           <w:sz w:val="16"/>
           <w:szCs w:val="16"/>
         </w:rPr>
-        <w:t>-data": [</w:t>
+        <w:tab/>
+        <w:t xml:space="preserve">      "repository": "filesystem",</w:t>
       </w:r>
     </w:p>
     <w:p>
@@ -7872,7 +6882,7 @@
           <w:szCs w:val="16"/>
         </w:rPr>
         <w:tab/>
-        <w:t xml:space="preserve">    {</w:t>
+        <w:t xml:space="preserve">      "format": "binary",</w:t>
       </w:r>
     </w:p>
     <w:p>
@@ -7892,7 +6902,7 @@
           <w:szCs w:val="16"/>
         </w:rPr>
         <w:tab/>
-        <w:t xml:space="preserve">      "id": 1,</w:t>
+        <w:t xml:space="preserve">      "directory": ".",</w:t>
       </w:r>
     </w:p>
     <w:p>
@@ -7912,7 +6922,7 @@
           <w:szCs w:val="16"/>
         </w:rPr>
         <w:tab/>
-        <w:t xml:space="preserve">      "type": "image",</w:t>
+        <w:t xml:space="preserve">      "filename": "square45-90_sobel_gray",</w:t>
       </w:r>
     </w:p>
     <w:p>
@@ -7932,105 +6942,7 @@
           <w:szCs w:val="16"/>
         </w:rPr>
         <w:tab/>
-        <w:t xml:space="preserve">      "repository": "filesystem",</w:t>
-      </w:r>
-    </w:p>
-    <w:p>
-      <w:pPr>
-        <w:shd w:val="clear" w:color="auto" w:fill="FFFFFF"/>
-        <w:spacing w:after="0" w:line="240" w:lineRule="auto"/>
-        <w:rPr>
-          <w:rFonts w:ascii="Lucida Console" w:hAnsi="Lucida Console"/>
-          <w:sz w:val="16"/>
-          <w:szCs w:val="16"/>
-        </w:rPr>
-      </w:pPr>
-      <w:r>
-        <w:rPr>
-          <w:rFonts w:ascii="Lucida Console" w:hAnsi="Lucida Console"/>
-          <w:sz w:val="16"/>
-          <w:szCs w:val="16"/>
-        </w:rPr>
-        <w:tab/>
-        <w:t xml:space="preserve">      "format": "binary",</w:t>
-      </w:r>
-    </w:p>
-    <w:p>
-      <w:pPr>
-        <w:shd w:val="clear" w:color="auto" w:fill="FFFFFF"/>
-        <w:spacing w:after="0" w:line="240" w:lineRule="auto"/>
-        <w:rPr>
-          <w:rFonts w:ascii="Lucida Console" w:hAnsi="Lucida Console"/>
-          <w:sz w:val="16"/>
-          <w:szCs w:val="16"/>
-        </w:rPr>
-      </w:pPr>
-      <w:r>
-        <w:rPr>
-          <w:rFonts w:ascii="Lucida Console" w:hAnsi="Lucida Console"/>
-          <w:sz w:val="16"/>
-          <w:szCs w:val="16"/>
-        </w:rPr>
-        <w:tab/>
-        <w:t xml:space="preserve">      "directory": ".",</w:t>
-      </w:r>
-    </w:p>
-    <w:p>
-      <w:pPr>
-        <w:shd w:val="clear" w:color="auto" w:fill="FFFFFF"/>
-        <w:spacing w:after="0" w:line="240" w:lineRule="auto"/>
-        <w:rPr>
-          <w:rFonts w:ascii="Lucida Console" w:hAnsi="Lucida Console"/>
-          <w:sz w:val="16"/>
-          <w:szCs w:val="16"/>
-        </w:rPr>
-      </w:pPr>
-      <w:r>
-        <w:rPr>
-          <w:rFonts w:ascii="Lucida Console" w:hAnsi="Lucida Console"/>
-          <w:sz w:val="16"/>
-          <w:szCs w:val="16"/>
-        </w:rPr>
-        <w:tab/>
-        <w:t xml:space="preserve">      "filename": "square45-90_sobel_gray",</w:t>
-      </w:r>
-    </w:p>
-    <w:p>
-      <w:pPr>
-        <w:shd w:val="clear" w:color="auto" w:fill="FFFFFF"/>
-        <w:spacing w:after="0" w:line="240" w:lineRule="auto"/>
-        <w:rPr>
-          <w:rFonts w:ascii="Lucida Console" w:hAnsi="Lucida Console"/>
-          <w:sz w:val="16"/>
-          <w:szCs w:val="16"/>
-        </w:rPr>
-      </w:pPr>
-      <w:r>
-        <w:rPr>
-          <w:rFonts w:ascii="Lucida Console" w:hAnsi="Lucida Console"/>
-          <w:sz w:val="16"/>
-          <w:szCs w:val="16"/>
-        </w:rPr>
-        <w:tab/>
-        <w:t xml:space="preserve">      "</w:t>
-      </w:r>
-      <w:proofErr w:type="spellStart"/>
-      <w:r>
-        <w:rPr>
-          <w:rFonts w:ascii="Lucida Console" w:hAnsi="Lucida Console"/>
-          <w:sz w:val="16"/>
-          <w:szCs w:val="16"/>
-        </w:rPr>
-        <w:t>ext</w:t>
-      </w:r>
-      <w:proofErr w:type="spellEnd"/>
-      <w:r>
-        <w:rPr>
-          <w:rFonts w:ascii="Lucida Console" w:hAnsi="Lucida Console"/>
-          <w:sz w:val="16"/>
-          <w:szCs w:val="16"/>
-        </w:rPr>
-        <w:t>": "bin"</w:t>
+        <w:t xml:space="preserve">      "ext": "bin"</w:t>
       </w:r>
     </w:p>
     <w:p>
@@ -8234,15 +7146,7 @@
               <w:pStyle w:val="code"/>
             </w:pPr>
             <w:r>
-              <w:t xml:space="preserve">  "operator": "filter-edge-</w:t>
-            </w:r>
-            <w:proofErr w:type="spellStart"/>
-            <w:r>
-              <w:t>sobel</w:t>
-            </w:r>
-            <w:proofErr w:type="spellEnd"/>
-            <w:r>
-              <w:t>",</w:t>
+              <w:t xml:space="preserve">  "operator": "filter-edge-sobel",</w:t>
             </w:r>
           </w:p>
         </w:tc>
@@ -8271,15 +7175,7 @@
               <w:pStyle w:val="code"/>
             </w:pPr>
             <w:r>
-              <w:t xml:space="preserve">  "</w:t>
-            </w:r>
-            <w:proofErr w:type="gramStart"/>
-            <w:r>
-              <w:t>input</w:t>
-            </w:r>
-            <w:proofErr w:type="gramEnd"/>
-            <w:r>
-              <w:t>-data": [</w:t>
+              <w:t xml:space="preserve">  "input-data": [</w:t>
             </w:r>
           </w:p>
           <w:p>
@@ -8343,15 +7239,7 @@
               <w:pStyle w:val="code"/>
             </w:pPr>
             <w:r>
-              <w:t xml:space="preserve">      "</w:t>
-            </w:r>
-            <w:proofErr w:type="spellStart"/>
-            <w:r>
-              <w:t>ext</w:t>
-            </w:r>
-            <w:proofErr w:type="spellEnd"/>
-            <w:r>
-              <w:t>": "jpg"</w:t>
+              <w:t xml:space="preserve">      "ext": "jpg"</w:t>
             </w:r>
           </w:p>
           <w:p>
@@ -8404,15 +7292,7 @@
               <w:pStyle w:val="code"/>
             </w:pPr>
             <w:r>
-              <w:t xml:space="preserve">  "</w:t>
-            </w:r>
-            <w:proofErr w:type="gramStart"/>
-            <w:r>
-              <w:t>output</w:t>
-            </w:r>
-            <w:proofErr w:type="gramEnd"/>
-            <w:r>
-              <w:t>-data": [</w:t>
+              <w:t xml:space="preserve">  "output-data": [</w:t>
             </w:r>
           </w:p>
           <w:p>
@@ -8476,15 +7356,7 @@
               <w:pStyle w:val="code"/>
             </w:pPr>
             <w:r>
-              <w:t xml:space="preserve">      "</w:t>
-            </w:r>
-            <w:proofErr w:type="spellStart"/>
-            <w:r>
-              <w:t>ext</w:t>
-            </w:r>
-            <w:proofErr w:type="spellEnd"/>
-            <w:r>
-              <w:t>": "bin"</w:t>
+              <w:t xml:space="preserve">      "ext": "bin"</w:t>
             </w:r>
           </w:p>
           <w:p>
@@ -8692,25 +7564,27 @@
           <w:szCs w:val="16"/>
         </w:rPr>
         <w:tab/>
-        <w:t xml:space="preserve">  "</w:t>
-      </w:r>
-      <w:proofErr w:type="gramStart"/>
-      <w:r>
+        <w:t xml:space="preserve">  "input-data": [</w:t>
+      </w:r>
+    </w:p>
+    <w:p>
+      <w:pPr>
+        <w:shd w:val="clear" w:color="auto" w:fill="FFFFFF"/>
+        <w:spacing w:after="0" w:line="240" w:lineRule="auto"/>
         <w:rPr>
           <w:rFonts w:ascii="Lucida Console" w:hAnsi="Lucida Console"/>
           <w:sz w:val="16"/>
           <w:szCs w:val="16"/>
         </w:rPr>
-        <w:t>input</w:t>
-      </w:r>
-      <w:proofErr w:type="gramEnd"/>
+      </w:pPr>
       <w:r>
         <w:rPr>
           <w:rFonts w:ascii="Lucida Console" w:hAnsi="Lucida Console"/>
           <w:sz w:val="16"/>
           <w:szCs w:val="16"/>
         </w:rPr>
-        <w:t>-data": [</w:t>
+        <w:tab/>
+        <w:t xml:space="preserve">    {</w:t>
       </w:r>
     </w:p>
     <w:p>
@@ -8730,7 +7604,7 @@
           <w:szCs w:val="16"/>
         </w:rPr>
         <w:tab/>
-        <w:t xml:space="preserve">    {</w:t>
+        <w:t xml:space="preserve">      "id": 1,</w:t>
       </w:r>
     </w:p>
     <w:p>
@@ -8750,7 +7624,7 @@
           <w:szCs w:val="16"/>
         </w:rPr>
         <w:tab/>
-        <w:t xml:space="preserve">      "id": 1,</w:t>
+        <w:t xml:space="preserve">      "type": "image",</w:t>
       </w:r>
     </w:p>
     <w:p>
@@ -8770,7 +7644,7 @@
           <w:szCs w:val="16"/>
         </w:rPr>
         <w:tab/>
-        <w:t xml:space="preserve">      "type": "image",</w:t>
+        <w:t xml:space="preserve">      "repository": "filesystem",</w:t>
       </w:r>
     </w:p>
     <w:p>
@@ -8790,7 +7664,7 @@
           <w:szCs w:val="16"/>
         </w:rPr>
         <w:tab/>
-        <w:t xml:space="preserve">      "repository": "filesystem",</w:t>
+        <w:t xml:space="preserve">      "format": "binary",</w:t>
       </w:r>
     </w:p>
     <w:p>
@@ -8810,7 +7684,7 @@
           <w:szCs w:val="16"/>
         </w:rPr>
         <w:tab/>
-        <w:t xml:space="preserve">      "format": "binary",</w:t>
+        <w:t xml:space="preserve">      "directory": ".",</w:t>
       </w:r>
     </w:p>
     <w:p>
@@ -8830,7 +7704,7 @@
           <w:szCs w:val="16"/>
         </w:rPr>
         <w:tab/>
-        <w:t xml:space="preserve">      "directory": ".",</w:t>
+        <w:t xml:space="preserve">      "filename": "square45-90_sobel_gray",</w:t>
       </w:r>
     </w:p>
     <w:p>
@@ -8850,7 +7724,7 @@
           <w:szCs w:val="16"/>
         </w:rPr>
         <w:tab/>
-        <w:t xml:space="preserve">      "filename": "square45-90_sobel_gray",</w:t>
+        <w:t xml:space="preserve">      "ext": "bin"</w:t>
       </w:r>
     </w:p>
     <w:p>
@@ -8870,25 +7744,27 @@
           <w:szCs w:val="16"/>
         </w:rPr>
         <w:tab/>
-        <w:t xml:space="preserve">      "</w:t>
-      </w:r>
-      <w:proofErr w:type="spellStart"/>
-      <w:r>
+        <w:t xml:space="preserve">    }</w:t>
+      </w:r>
+    </w:p>
+    <w:p>
+      <w:pPr>
+        <w:shd w:val="clear" w:color="auto" w:fill="FFFFFF"/>
+        <w:spacing w:after="0" w:line="240" w:lineRule="auto"/>
         <w:rPr>
           <w:rFonts w:ascii="Lucida Console" w:hAnsi="Lucida Console"/>
           <w:sz w:val="16"/>
           <w:szCs w:val="16"/>
         </w:rPr>
-        <w:t>ext</w:t>
-      </w:r>
-      <w:proofErr w:type="spellEnd"/>
+      </w:pPr>
       <w:r>
         <w:rPr>
           <w:rFonts w:ascii="Lucida Console" w:hAnsi="Lucida Console"/>
           <w:sz w:val="16"/>
           <w:szCs w:val="16"/>
         </w:rPr>
-        <w:t>": "bin"</w:t>
+        <w:tab/>
+        <w:t xml:space="preserve">  ],</w:t>
       </w:r>
     </w:p>
     <w:p>
@@ -8908,7 +7784,7 @@
           <w:szCs w:val="16"/>
         </w:rPr>
         <w:tab/>
-        <w:t xml:space="preserve">    }</w:t>
+        <w:t xml:space="preserve">  "output-data": [</w:t>
       </w:r>
     </w:p>
     <w:p>
@@ -8928,7 +7804,7 @@
           <w:szCs w:val="16"/>
         </w:rPr>
         <w:tab/>
-        <w:t xml:space="preserve">  ],</w:t>
+        <w:t xml:space="preserve">    {</w:t>
       </w:r>
     </w:p>
     <w:p>
@@ -8948,25 +7824,27 @@
           <w:szCs w:val="16"/>
         </w:rPr>
         <w:tab/>
-        <w:t xml:space="preserve">  "</w:t>
-      </w:r>
-      <w:proofErr w:type="gramStart"/>
-      <w:r>
+        <w:t xml:space="preserve">      "id": 1,</w:t>
+      </w:r>
+    </w:p>
+    <w:p>
+      <w:pPr>
+        <w:shd w:val="clear" w:color="auto" w:fill="FFFFFF"/>
+        <w:spacing w:after="0" w:line="240" w:lineRule="auto"/>
         <w:rPr>
           <w:rFonts w:ascii="Lucida Console" w:hAnsi="Lucida Console"/>
           <w:sz w:val="16"/>
           <w:szCs w:val="16"/>
         </w:rPr>
-        <w:t>output</w:t>
-      </w:r>
-      <w:proofErr w:type="gramEnd"/>
+      </w:pPr>
       <w:r>
         <w:rPr>
           <w:rFonts w:ascii="Lucida Console" w:hAnsi="Lucida Console"/>
           <w:sz w:val="16"/>
           <w:szCs w:val="16"/>
         </w:rPr>
-        <w:t>-data": [</w:t>
+        <w:tab/>
+        <w:t xml:space="preserve">      "type": "image",</w:t>
       </w:r>
     </w:p>
     <w:p>
@@ -8986,7 +7864,7 @@
           <w:szCs w:val="16"/>
         </w:rPr>
         <w:tab/>
-        <w:t xml:space="preserve">    {</w:t>
+        <w:t xml:space="preserve">      "repository": "filesystem",</w:t>
       </w:r>
     </w:p>
     <w:p>
@@ -9006,7 +7884,7 @@
           <w:szCs w:val="16"/>
         </w:rPr>
         <w:tab/>
-        <w:t xml:space="preserve">      "id": 1,</w:t>
+        <w:t xml:space="preserve">      "format": "jpeg",</w:t>
       </w:r>
     </w:p>
     <w:p>
@@ -9026,7 +7904,7 @@
           <w:szCs w:val="16"/>
         </w:rPr>
         <w:tab/>
-        <w:t xml:space="preserve">      "type": "image",</w:t>
+        <w:t xml:space="preserve">      "directory": ".",</w:t>
       </w:r>
     </w:p>
     <w:p>
@@ -9046,7 +7924,7 @@
           <w:szCs w:val="16"/>
         </w:rPr>
         <w:tab/>
-        <w:t xml:space="preserve">      "repository": "filesystem",</w:t>
+        <w:t xml:space="preserve">      "filename": "square45-90_sobel_gray",</w:t>
       </w:r>
     </w:p>
     <w:p>
@@ -9066,7 +7944,7 @@
           <w:szCs w:val="16"/>
         </w:rPr>
         <w:tab/>
-        <w:t xml:space="preserve">      "format": "jpeg",</w:t>
+        <w:t xml:space="preserve">      "ext": "jpg"</w:t>
       </w:r>
     </w:p>
     <w:p>
@@ -9086,7 +7964,7 @@
           <w:szCs w:val="16"/>
         </w:rPr>
         <w:tab/>
-        <w:t xml:space="preserve">      "directory": ".",</w:t>
+        <w:t xml:space="preserve">    }</w:t>
       </w:r>
     </w:p>
     <w:p>
@@ -9106,7 +7984,7 @@
           <w:szCs w:val="16"/>
         </w:rPr>
         <w:tab/>
-        <w:t xml:space="preserve">      "filename": "square45-90_sobel_gray",</w:t>
+        <w:t xml:space="preserve">  ],</w:t>
       </w:r>
     </w:p>
     <w:p>
@@ -9126,25 +8004,27 @@
           <w:szCs w:val="16"/>
         </w:rPr>
         <w:tab/>
-        <w:t xml:space="preserve">      "</w:t>
-      </w:r>
-      <w:proofErr w:type="spellStart"/>
-      <w:r>
+        <w:t xml:space="preserve">  "parameters": {</w:t>
+      </w:r>
+    </w:p>
+    <w:p>
+      <w:pPr>
+        <w:shd w:val="clear" w:color="auto" w:fill="FFFFFF"/>
+        <w:spacing w:after="0" w:line="240" w:lineRule="auto"/>
         <w:rPr>
           <w:rFonts w:ascii="Lucida Console" w:hAnsi="Lucida Console"/>
           <w:sz w:val="16"/>
           <w:szCs w:val="16"/>
         </w:rPr>
-        <w:t>ext</w:t>
-      </w:r>
-      <w:proofErr w:type="spellEnd"/>
+      </w:pPr>
       <w:r>
         <w:rPr>
           <w:rFonts w:ascii="Lucida Console" w:hAnsi="Lucida Console"/>
           <w:sz w:val="16"/>
           <w:szCs w:val="16"/>
         </w:rPr>
-        <w:t>": "jpg"</w:t>
+        <w:tab/>
+        <w:t xml:space="preserve">    "lower_in": "-1020",</w:t>
       </w:r>
     </w:p>
     <w:p>
@@ -9164,7 +8044,7 @@
           <w:szCs w:val="16"/>
         </w:rPr>
         <w:tab/>
-        <w:t xml:space="preserve">    }</w:t>
+        <w:t xml:space="preserve">    "upper_in": "1020",</w:t>
       </w:r>
     </w:p>
     <w:p>
@@ -9184,7 +8064,7 @@
           <w:szCs w:val="16"/>
         </w:rPr>
         <w:tab/>
-        <w:t xml:space="preserve">  ],</w:t>
+        <w:t xml:space="preserve">    "lower_out": "0",</w:t>
       </w:r>
     </w:p>
     <w:p>
@@ -9204,199 +8084,7 @@
           <w:szCs w:val="16"/>
         </w:rPr>
         <w:tab/>
-        <w:t xml:space="preserve">  "parameters": {</w:t>
-      </w:r>
-    </w:p>
-    <w:p>
-      <w:pPr>
-        <w:shd w:val="clear" w:color="auto" w:fill="FFFFFF"/>
-        <w:spacing w:after="0" w:line="240" w:lineRule="auto"/>
-        <w:rPr>
-          <w:rFonts w:ascii="Lucida Console" w:hAnsi="Lucida Console"/>
-          <w:sz w:val="16"/>
-          <w:szCs w:val="16"/>
-        </w:rPr>
-      </w:pPr>
-      <w:r>
-        <w:rPr>
-          <w:rFonts w:ascii="Lucida Console" w:hAnsi="Lucida Console"/>
-          <w:sz w:val="16"/>
-          <w:szCs w:val="16"/>
-        </w:rPr>
-        <w:tab/>
-        <w:t xml:space="preserve">    "</w:t>
-      </w:r>
-      <w:proofErr w:type="spellStart"/>
-      <w:proofErr w:type="gramStart"/>
-      <w:r>
-        <w:rPr>
-          <w:rFonts w:ascii="Lucida Console" w:hAnsi="Lucida Console"/>
-          <w:sz w:val="16"/>
-          <w:szCs w:val="16"/>
-        </w:rPr>
-        <w:t>lower</w:t>
-      </w:r>
-      <w:proofErr w:type="gramEnd"/>
-      <w:r>
-        <w:rPr>
-          <w:rFonts w:ascii="Lucida Console" w:hAnsi="Lucida Console"/>
-          <w:sz w:val="16"/>
-          <w:szCs w:val="16"/>
-        </w:rPr>
-        <w:t>_in</w:t>
-      </w:r>
-      <w:proofErr w:type="spellEnd"/>
-      <w:r>
-        <w:rPr>
-          <w:rFonts w:ascii="Lucida Console" w:hAnsi="Lucida Console"/>
-          <w:sz w:val="16"/>
-          <w:szCs w:val="16"/>
-        </w:rPr>
-        <w:t>": "-1020",</w:t>
-      </w:r>
-    </w:p>
-    <w:p>
-      <w:pPr>
-        <w:shd w:val="clear" w:color="auto" w:fill="FFFFFF"/>
-        <w:spacing w:after="0" w:line="240" w:lineRule="auto"/>
-        <w:rPr>
-          <w:rFonts w:ascii="Lucida Console" w:hAnsi="Lucida Console"/>
-          <w:sz w:val="16"/>
-          <w:szCs w:val="16"/>
-        </w:rPr>
-      </w:pPr>
-      <w:r>
-        <w:rPr>
-          <w:rFonts w:ascii="Lucida Console" w:hAnsi="Lucida Console"/>
-          <w:sz w:val="16"/>
-          <w:szCs w:val="16"/>
-        </w:rPr>
-        <w:tab/>
-        <w:t xml:space="preserve">    "</w:t>
-      </w:r>
-      <w:proofErr w:type="spellStart"/>
-      <w:proofErr w:type="gramStart"/>
-      <w:r>
-        <w:rPr>
-          <w:rFonts w:ascii="Lucida Console" w:hAnsi="Lucida Console"/>
-          <w:sz w:val="16"/>
-          <w:szCs w:val="16"/>
-        </w:rPr>
-        <w:t>upper</w:t>
-      </w:r>
-      <w:proofErr w:type="gramEnd"/>
-      <w:r>
-        <w:rPr>
-          <w:rFonts w:ascii="Lucida Console" w:hAnsi="Lucida Console"/>
-          <w:sz w:val="16"/>
-          <w:szCs w:val="16"/>
-        </w:rPr>
-        <w:t>_in</w:t>
-      </w:r>
-      <w:proofErr w:type="spellEnd"/>
-      <w:r>
-        <w:rPr>
-          <w:rFonts w:ascii="Lucida Console" w:hAnsi="Lucida Console"/>
-          <w:sz w:val="16"/>
-          <w:szCs w:val="16"/>
-        </w:rPr>
-        <w:t>": "1020",</w:t>
-      </w:r>
-    </w:p>
-    <w:p>
-      <w:pPr>
-        <w:shd w:val="clear" w:color="auto" w:fill="FFFFFF"/>
-        <w:spacing w:after="0" w:line="240" w:lineRule="auto"/>
-        <w:rPr>
-          <w:rFonts w:ascii="Lucida Console" w:hAnsi="Lucida Console"/>
-          <w:sz w:val="16"/>
-          <w:szCs w:val="16"/>
-        </w:rPr>
-      </w:pPr>
-      <w:r>
-        <w:rPr>
-          <w:rFonts w:ascii="Lucida Console" w:hAnsi="Lucida Console"/>
-          <w:sz w:val="16"/>
-          <w:szCs w:val="16"/>
-        </w:rPr>
-        <w:tab/>
-        <w:t xml:space="preserve">    "</w:t>
-      </w:r>
-      <w:proofErr w:type="spellStart"/>
-      <w:proofErr w:type="gramStart"/>
-      <w:r>
-        <w:rPr>
-          <w:rFonts w:ascii="Lucida Console" w:hAnsi="Lucida Console"/>
-          <w:sz w:val="16"/>
-          <w:szCs w:val="16"/>
-        </w:rPr>
-        <w:t>lower</w:t>
-      </w:r>
-      <w:proofErr w:type="gramEnd"/>
-      <w:r>
-        <w:rPr>
-          <w:rFonts w:ascii="Lucida Console" w:hAnsi="Lucida Console"/>
-          <w:sz w:val="16"/>
-          <w:szCs w:val="16"/>
-        </w:rPr>
-        <w:t>_out</w:t>
-      </w:r>
-      <w:proofErr w:type="spellEnd"/>
-      <w:r>
-        <w:rPr>
-          <w:rFonts w:ascii="Lucida Console" w:hAnsi="Lucida Console"/>
-          <w:sz w:val="16"/>
-          <w:szCs w:val="16"/>
-        </w:rPr>
-        <w:t>": "0",</w:t>
-      </w:r>
-    </w:p>
-    <w:p>
-      <w:pPr>
-        <w:shd w:val="clear" w:color="auto" w:fill="FFFFFF"/>
-        <w:spacing w:after="0" w:line="240" w:lineRule="auto"/>
-        <w:rPr>
-          <w:rFonts w:ascii="Lucida Console" w:hAnsi="Lucida Console"/>
-          <w:sz w:val="16"/>
-          <w:szCs w:val="16"/>
-        </w:rPr>
-      </w:pPr>
-      <w:r>
-        <w:rPr>
-          <w:rFonts w:ascii="Lucida Console" w:hAnsi="Lucida Console"/>
-          <w:sz w:val="16"/>
-          <w:szCs w:val="16"/>
-        </w:rPr>
-        <w:tab/>
-        <w:t xml:space="preserve">    "</w:t>
-      </w:r>
-      <w:proofErr w:type="spellStart"/>
-      <w:proofErr w:type="gramStart"/>
-      <w:r>
-        <w:rPr>
-          <w:rFonts w:ascii="Lucida Console" w:hAnsi="Lucida Console"/>
-          <w:sz w:val="16"/>
-          <w:szCs w:val="16"/>
-        </w:rPr>
-        <w:t>upper</w:t>
-      </w:r>
-      <w:proofErr w:type="gramEnd"/>
-      <w:r>
-        <w:rPr>
-          <w:rFonts w:ascii="Lucida Console" w:hAnsi="Lucida Console"/>
-          <w:sz w:val="16"/>
-          <w:szCs w:val="16"/>
-        </w:rPr>
-        <w:t>_out</w:t>
-      </w:r>
-      <w:proofErr w:type="spellEnd"/>
-      <w:r>
-        <w:rPr>
-          <w:rFonts w:ascii="Lucida Console" w:hAnsi="Lucida Console"/>
-          <w:sz w:val="16"/>
-          <w:szCs w:val="16"/>
-        </w:rPr>
-        <w:t>": "255",</w:t>
+        <w:t xml:space="preserve">    "upper_out": "255",</w:t>
       </w:r>
     </w:p>
     <w:p>
@@ -9549,15 +8237,7 @@
               <w:pStyle w:val="code"/>
             </w:pPr>
             <w:r>
-              <w:t xml:space="preserve">  "</w:t>
-            </w:r>
-            <w:proofErr w:type="gramStart"/>
-            <w:r>
-              <w:t>input</w:t>
-            </w:r>
-            <w:proofErr w:type="gramEnd"/>
-            <w:r>
-              <w:t>-data": [</w:t>
+              <w:t xml:space="preserve">  "input-data": [</w:t>
             </w:r>
           </w:p>
           <w:p>
@@ -9621,15 +8301,7 @@
               <w:pStyle w:val="code"/>
             </w:pPr>
             <w:r>
-              <w:t xml:space="preserve">      "</w:t>
-            </w:r>
-            <w:proofErr w:type="spellStart"/>
-            <w:r>
-              <w:t>ext</w:t>
-            </w:r>
-            <w:proofErr w:type="spellEnd"/>
-            <w:r>
-              <w:t>": "bin"</w:t>
+              <w:t xml:space="preserve">      "ext": "bin"</w:t>
             </w:r>
           </w:p>
           <w:p>
@@ -9677,15 +8349,7 @@
               <w:pStyle w:val="code"/>
             </w:pPr>
             <w:r>
-              <w:t xml:space="preserve">  "</w:t>
-            </w:r>
-            <w:proofErr w:type="gramStart"/>
-            <w:r>
-              <w:t>output</w:t>
-            </w:r>
-            <w:proofErr w:type="gramEnd"/>
-            <w:r>
-              <w:t>-data": [</w:t>
+              <w:t xml:space="preserve">  "output-data": [</w:t>
             </w:r>
           </w:p>
           <w:p>
@@ -9749,15 +8413,7 @@
               <w:pStyle w:val="code"/>
             </w:pPr>
             <w:r>
-              <w:t xml:space="preserve">      "</w:t>
-            </w:r>
-            <w:proofErr w:type="spellStart"/>
-            <w:r>
-              <w:t>ext</w:t>
-            </w:r>
-            <w:proofErr w:type="spellEnd"/>
-            <w:r>
-              <w:t>": "jpg"</w:t>
+              <w:t xml:space="preserve">      "ext": "jpg"</w:t>
             </w:r>
           </w:p>
           <w:p>
@@ -9810,20 +8466,7 @@
               <w:pStyle w:val="code"/>
             </w:pPr>
             <w:r>
-              <w:t xml:space="preserve">    "</w:t>
-            </w:r>
-            <w:proofErr w:type="spellStart"/>
-            <w:proofErr w:type="gramStart"/>
-            <w:r>
-              <w:t>lower</w:t>
-            </w:r>
-            <w:proofErr w:type="gramEnd"/>
-            <w:r>
-              <w:t>_in</w:t>
-            </w:r>
-            <w:proofErr w:type="spellEnd"/>
-            <w:r>
-              <w:t>": "-1020",</w:t>
+              <w:t xml:space="preserve">    "lower_in": "-1020",</w:t>
             </w:r>
           </w:p>
           <w:p>
@@ -9831,20 +8474,7 @@
               <w:pStyle w:val="code"/>
             </w:pPr>
             <w:r>
-              <w:t xml:space="preserve">    "</w:t>
-            </w:r>
-            <w:proofErr w:type="spellStart"/>
-            <w:proofErr w:type="gramStart"/>
-            <w:r>
-              <w:t>upper</w:t>
-            </w:r>
-            <w:proofErr w:type="gramEnd"/>
-            <w:r>
-              <w:t>_in</w:t>
-            </w:r>
-            <w:proofErr w:type="spellEnd"/>
-            <w:r>
-              <w:t>": "1020",</w:t>
+              <w:t xml:space="preserve">    "upper_in": "1020",</w:t>
             </w:r>
           </w:p>
           <w:p>
@@ -9852,20 +8482,7 @@
               <w:pStyle w:val="code"/>
             </w:pPr>
             <w:r>
-              <w:t xml:space="preserve">    "</w:t>
-            </w:r>
-            <w:proofErr w:type="spellStart"/>
-            <w:proofErr w:type="gramStart"/>
-            <w:r>
-              <w:t>lower</w:t>
-            </w:r>
-            <w:proofErr w:type="gramEnd"/>
-            <w:r>
-              <w:t>_out</w:t>
-            </w:r>
-            <w:proofErr w:type="spellEnd"/>
-            <w:r>
-              <w:t>": "0",</w:t>
+              <w:t xml:space="preserve">    "lower_out": "0",</w:t>
             </w:r>
           </w:p>
           <w:p>
@@ -9873,20 +8490,7 @@
               <w:pStyle w:val="code"/>
             </w:pPr>
             <w:r>
-              <w:t xml:space="preserve">    "</w:t>
-            </w:r>
-            <w:proofErr w:type="spellStart"/>
-            <w:proofErr w:type="gramStart"/>
-            <w:r>
-              <w:t>upper</w:t>
-            </w:r>
-            <w:proofErr w:type="gramEnd"/>
-            <w:r>
-              <w:t>_out</w:t>
-            </w:r>
-            <w:proofErr w:type="spellEnd"/>
-            <w:r>
-              <w:t>": "255"</w:t>
+              <w:t xml:space="preserve">    "upper_out": "255"</w:t>
             </w:r>
           </w:p>
           <w:p>
@@ -9907,47 +8511,7 @@
               <w:cnfStyle w:val="000000000000" w:firstRow="0" w:lastRow="0" w:firstColumn="0" w:lastColumn="0" w:oddVBand="0" w:evenVBand="0" w:oddHBand="0" w:evenHBand="0" w:firstRowFirstColumn="0" w:firstRowLastColumn="0" w:lastRowFirstColumn="0" w:lastRowLastColumn="0"/>
             </w:pPr>
             <w:r>
-              <w:t xml:space="preserve">The script parameter </w:t>
-            </w:r>
-            <w:proofErr w:type="gramStart"/>
-            <w:r>
-              <w:t>define</w:t>
-            </w:r>
-            <w:proofErr w:type="gramEnd"/>
-            <w:r>
-              <w:t xml:space="preserve"> </w:t>
-            </w:r>
-            <w:proofErr w:type="spellStart"/>
-            <w:r>
-              <w:t>lower_in</w:t>
-            </w:r>
-            <w:proofErr w:type="spellEnd"/>
-            <w:r>
-              <w:t xml:space="preserve">, </w:t>
-            </w:r>
-            <w:proofErr w:type="spellStart"/>
-            <w:r>
-              <w:t>upper_in</w:t>
-            </w:r>
-            <w:proofErr w:type="spellEnd"/>
-            <w:r>
-              <w:t xml:space="preserve">, </w:t>
-            </w:r>
-            <w:proofErr w:type="spellStart"/>
-            <w:r>
-              <w:t>lower_out</w:t>
-            </w:r>
-            <w:proofErr w:type="spellEnd"/>
-            <w:r>
-              <w:t xml:space="preserve">, and </w:t>
-            </w:r>
-            <w:proofErr w:type="spellStart"/>
-            <w:r>
-              <w:t>upper_out</w:t>
-            </w:r>
-            <w:proofErr w:type="spellEnd"/>
-            <w:r>
-              <w:t xml:space="preserve"> intensity mapping parameters. </w:t>
+              <w:t xml:space="preserve">The script parameter define lower_in, upper_in, lower_out, and upper_out intensity mapping parameters. </w:t>
             </w:r>
           </w:p>
         </w:tc>
@@ -12843,15 +11407,7 @@
         <w:pStyle w:val="Heading2"/>
       </w:pPr>
       <w:r>
-        <w:t>filter-edge-</w:t>
-      </w:r>
-      <w:proofErr w:type="spellStart"/>
-      <w:r>
-        <w:t>laplacian</w:t>
-      </w:r>
-      <w:proofErr w:type="spellEnd"/>
-      <w:r>
-        <w:t xml:space="preserve"> Operator</w:t>
+        <w:t>filter-edge-laplacian Operator</w:t>
       </w:r>
     </w:p>
     <w:p>
@@ -12859,15 +11415,7 @@
         <w:pStyle w:val="Heading2"/>
       </w:pPr>
       <w:r>
-        <w:t>filter-edge-</w:t>
-      </w:r>
-      <w:proofErr w:type="spellStart"/>
-      <w:r>
-        <w:t>prewitt</w:t>
-      </w:r>
-      <w:proofErr w:type="spellEnd"/>
-      <w:r>
-        <w:t xml:space="preserve"> Operator</w:t>
+        <w:t>filter-edge-prewitt Operator</w:t>
       </w:r>
     </w:p>
     <w:p>
@@ -12994,15 +11542,7 @@
               <w:cnfStyle w:val="000000000000" w:firstRow="0" w:lastRow="0" w:firstColumn="0" w:lastColumn="0" w:oddVBand="0" w:evenVBand="0" w:oddHBand="0" w:evenHBand="0" w:firstRowFirstColumn="0" w:firstRowLastColumn="0" w:lastRowFirstColumn="0" w:lastRowLastColumn="0"/>
             </w:pPr>
             <w:r>
-              <w:t>[1, 1, 1</w:t>
-            </w:r>
-            <w:proofErr w:type="gramStart"/>
-            <w:r>
-              <w:t>],  [</w:t>
-            </w:r>
-            <w:proofErr w:type="gramEnd"/>
-            <w:r>
-              <w:t>0, 0, 0],  [-1, -1, -1]</w:t>
+              <w:t>[1, 1, 1],  [0, 0, 0],  [-1, -1, -1]</w:t>
             </w:r>
           </w:p>
         </w:tc>
@@ -13647,15 +12187,7 @@
         <w:pStyle w:val="Heading2"/>
       </w:pPr>
       <w:r>
-        <w:t>filter-edge-</w:t>
-      </w:r>
-      <w:proofErr w:type="spellStart"/>
-      <w:r>
-        <w:t>roberts</w:t>
-      </w:r>
-      <w:proofErr w:type="spellEnd"/>
-      <w:r>
-        <w:t xml:space="preserve"> Operator</w:t>
+        <w:t>filter-edge-roberts Operator</w:t>
       </w:r>
     </w:p>
     <w:p>
@@ -13783,15 +12315,7 @@
               <w:cnfStyle w:val="000000000000" w:firstRow="0" w:lastRow="0" w:firstColumn="0" w:lastColumn="0" w:oddVBand="0" w:evenVBand="0" w:oddHBand="0" w:evenHBand="0" w:firstRowFirstColumn="0" w:firstRowLastColumn="0" w:lastRowFirstColumn="0" w:lastRowLastColumn="0"/>
             </w:pPr>
             <w:r>
-              <w:t>[1, 0</w:t>
-            </w:r>
-            <w:proofErr w:type="gramStart"/>
-            <w:r>
-              <w:t>],  [</w:t>
-            </w:r>
-            <w:proofErr w:type="gramEnd"/>
-            <w:r>
-              <w:t>0, -1]</w:t>
+              <w:t>[1, 0],  [0, -1]</w:t>
             </w:r>
           </w:p>
         </w:tc>
@@ -14436,15 +12960,7 @@
         <w:pStyle w:val="Heading2"/>
       </w:pPr>
       <w:r>
-        <w:t>filter-edge-</w:t>
-      </w:r>
-      <w:proofErr w:type="spellStart"/>
-      <w:r>
-        <w:t>sobel</w:t>
-      </w:r>
-      <w:proofErr w:type="spellEnd"/>
-      <w:r>
-        <w:t xml:space="preserve"> Operator</w:t>
+        <w:t>filter-edge-sobel Operator</w:t>
       </w:r>
     </w:p>
     <w:p>
@@ -14571,15 +13087,7 @@
               <w:cnfStyle w:val="000000000000" w:firstRow="0" w:lastRow="0" w:firstColumn="0" w:lastColumn="0" w:oddVBand="0" w:evenVBand="0" w:oddHBand="0" w:evenHBand="0" w:firstRowFirstColumn="0" w:firstRowLastColumn="0" w:lastRowFirstColumn="0" w:lastRowLastColumn="0"/>
             </w:pPr>
             <w:r>
-              <w:t>[1, 2, 1</w:t>
-            </w:r>
-            <w:proofErr w:type="gramStart"/>
-            <w:r>
-              <w:t>],  [</w:t>
-            </w:r>
-            <w:proofErr w:type="gramEnd"/>
-            <w:r>
-              <w:t>0, 0, 0],  [-1, -2, -1]</w:t>
+              <w:t>[1, 2, 1],  [0, 0, 0],  [-1, -2, -1]</w:t>
             </w:r>
           </w:p>
         </w:tc>
@@ -15249,15 +13757,7 @@
         <w:pStyle w:val="Heading2"/>
       </w:pPr>
       <w:r>
-        <w:t>histogram-</w:t>
-      </w:r>
-      <w:proofErr w:type="spellStart"/>
-      <w:r>
-        <w:t>hough</w:t>
-      </w:r>
-      <w:proofErr w:type="spellEnd"/>
-      <w:r>
-        <w:t>-create Operator</w:t>
+        <w:t>histogram-hough-create Operator</w:t>
       </w:r>
     </w:p>
     <w:p>
@@ -15520,15 +14020,7 @@
         <w:pStyle w:val="Normalafterlist"/>
       </w:pPr>
       <w:r>
-        <w:t>For text output format, the output data descriptor extension is ignored. The output text file has the extension “.txt” and the output gnuplot script has the extension “.</w:t>
-      </w:r>
-      <w:proofErr w:type="spellStart"/>
-      <w:r>
-        <w:t>gp</w:t>
-      </w:r>
-      <w:proofErr w:type="spellEnd"/>
-      <w:r>
-        <w:t xml:space="preserve">” as described in section </w:t>
+        <w:t xml:space="preserve">For text output format, the output data descriptor extension is ignored. The output text file has the extension “.txt” and the output gnuplot script has the extension “.gp” as described in section </w:t>
       </w:r>
       <w:r>
         <w:fldChar w:fldCharType="begin"/>
@@ -15608,7 +14100,6 @@
             <w:tcW w:w="0" w:type="auto"/>
           </w:tcPr>
           <w:p>
-            <w:proofErr w:type="spellStart"/>
             <w:r>
               <w:rPr>
                 <w:b w:val="0"/>
@@ -15616,7 +14107,6 @@
               </w:rPr>
               <w:t>nbins</w:t>
             </w:r>
-            <w:proofErr w:type="spellEnd"/>
           </w:p>
         </w:tc>
         <w:tc>
@@ -15648,7 +14138,6 @@
                 <w:bCs w:val="0"/>
               </w:rPr>
             </w:pPr>
-            <w:proofErr w:type="spellStart"/>
             <w:r>
               <w:rPr>
                 <w:b w:val="0"/>
@@ -15656,7 +14145,6 @@
               </w:rPr>
               <w:t>lower_value</w:t>
             </w:r>
-            <w:proofErr w:type="spellEnd"/>
           </w:p>
         </w:tc>
         <w:tc>
@@ -15691,7 +14179,6 @@
                 <w:bCs w:val="0"/>
               </w:rPr>
             </w:pPr>
-            <w:proofErr w:type="spellStart"/>
             <w:r>
               <w:rPr>
                 <w:b w:val="0"/>
@@ -15699,7 +14186,6 @@
               </w:rPr>
               <w:t>upper_value</w:t>
             </w:r>
-            <w:proofErr w:type="spellEnd"/>
           </w:p>
         </w:tc>
         <w:tc>
@@ -15994,7 +14480,6 @@
                 <w:bCs w:val="0"/>
               </w:rPr>
             </w:pPr>
-            <w:proofErr w:type="spellStart"/>
             <w:r>
               <w:rPr>
                 <w:b w:val="0"/>
@@ -16003,7 +14488,6 @@
               <w:lastRenderedPageBreak/>
               <w:t>min_count</w:t>
             </w:r>
-            <w:proofErr w:type="spellEnd"/>
           </w:p>
         </w:tc>
         <w:tc>
@@ -16035,7 +14519,6 @@
                 <w:bCs w:val="0"/>
               </w:rPr>
             </w:pPr>
-            <w:proofErr w:type="spellStart"/>
             <w:r>
               <w:rPr>
                 <w:b w:val="0"/>
@@ -16043,7 +14526,6 @@
               </w:rPr>
               <w:t>max_count</w:t>
             </w:r>
-            <w:proofErr w:type="spellEnd"/>
           </w:p>
         </w:tc>
         <w:tc>
@@ -16078,7 +14560,6 @@
                 <w:bCs w:val="0"/>
               </w:rPr>
             </w:pPr>
-            <w:proofErr w:type="spellStart"/>
             <w:r>
               <w:rPr>
                 <w:b w:val="0"/>
@@ -16086,7 +14567,6 @@
               </w:rPr>
               <w:t>total_count</w:t>
             </w:r>
-            <w:proofErr w:type="spellEnd"/>
           </w:p>
         </w:tc>
         <w:tc>
@@ -16276,7 +14756,6 @@
                 <w:bCs w:val="0"/>
               </w:rPr>
             </w:pPr>
-            <w:proofErr w:type="spellStart"/>
             <w:r>
               <w:rPr>
                 <w:b w:val="0"/>
@@ -16284,7 +14763,6 @@
               </w:rPr>
               <w:t>min_value</w:t>
             </w:r>
-            <w:proofErr w:type="spellEnd"/>
           </w:p>
         </w:tc>
         <w:tc>
@@ -16319,7 +14797,6 @@
                 <w:bCs w:val="0"/>
               </w:rPr>
             </w:pPr>
-            <w:proofErr w:type="spellStart"/>
             <w:r>
               <w:rPr>
                 <w:b w:val="0"/>
@@ -16327,7 +14804,6 @@
               </w:rPr>
               <w:t>max_value</w:t>
             </w:r>
-            <w:proofErr w:type="spellEnd"/>
           </w:p>
         </w:tc>
         <w:tc>
@@ -16358,34 +14834,13 @@
       <w:pPr>
         <w:pStyle w:val="Heading2"/>
       </w:pPr>
-      <w:proofErr w:type="spellStart"/>
-      <w:r>
-        <w:t>hough</w:t>
-      </w:r>
-      <w:proofErr w:type="spellEnd"/>
-      <w:r>
-        <w:t>-draw-line Operator</w:t>
-      </w:r>
-    </w:p>
-    <w:p>
-      <w:r>
-        <w:t xml:space="preserve">The Hough draw line operator draws a line segment corresponding to a polar line (rho, theta) in an image and stores the resulting image. JPEG input images can be stored as either JPEG or binary output images, but binary input images can only be stored as binary output images. Grayscale input images produce grayscale output images, and color input images produce color output images. Lines are drawn in the color output image </w:t>
-      </w:r>
-      <w:proofErr w:type="spellStart"/>
-      <w:r>
-        <w:t>out_component</w:t>
-      </w:r>
-      <w:proofErr w:type="spellEnd"/>
-      <w:r>
-        <w:t xml:space="preserve"> component if specified. The output color image component defaults to 1 if </w:t>
-      </w:r>
-      <w:proofErr w:type="gramStart"/>
-      <w:r>
-        <w:t>omitted, and</w:t>
-      </w:r>
-      <w:proofErr w:type="gramEnd"/>
-      <w:r>
-        <w:t xml:space="preserve"> is ignored for grayscale images.</w:t>
+      <w:r>
+        <w:t>hough-draw-line Operator</w:t>
+      </w:r>
+    </w:p>
+    <w:p>
+      <w:r>
+        <w:t>The Hough draw line operator draws a line segment corresponding to a polar line (rho, theta) in an image and stores the resulting image. JPEG input images can be stored as either JPEG or binary output images, but binary input images can only be stored as binary output images. Grayscale input images produce grayscale output images, and color input images produce color output images. Lines are drawn in the color output image out_component component if specified. The output color image component defaults to 1 if omitted, and is ignored for grayscale images.</w:t>
       </w:r>
     </w:p>
     <w:p>
@@ -16699,7 +15154,6 @@
                 <w:bCs w:val="0"/>
               </w:rPr>
             </w:pPr>
-            <w:proofErr w:type="spellStart"/>
             <w:r>
               <w:rPr>
                 <w:b w:val="0"/>
@@ -16707,7 +15161,6 @@
               </w:rPr>
               <w:t>theta_inc</w:t>
             </w:r>
-            <w:proofErr w:type="spellEnd"/>
           </w:p>
         </w:tc>
         <w:tc>
@@ -16719,23 +15172,7 @@
               <w:cnfStyle w:val="000000100000" w:firstRow="0" w:lastRow="0" w:firstColumn="0" w:lastColumn="0" w:oddVBand="0" w:evenVBand="0" w:oddHBand="1" w:evenHBand="0" w:firstRowFirstColumn="0" w:firstRowLastColumn="0" w:lastRowFirstColumn="0" w:lastRowLastColumn="0"/>
             </w:pPr>
             <w:r>
-              <w:t xml:space="preserve">increment for the Hough accumulator angle. The number of angles </w:t>
-            </w:r>
-            <w:proofErr w:type="gramStart"/>
-            <w:r>
-              <w:t>are</w:t>
-            </w:r>
-            <w:proofErr w:type="gramEnd"/>
-            <w:r>
-              <w:t xml:space="preserve"> 180 / </w:t>
-            </w:r>
-            <w:proofErr w:type="spellStart"/>
-            <w:r>
-              <w:t>theta_inc</w:t>
-            </w:r>
-            <w:proofErr w:type="spellEnd"/>
-            <w:r>
-              <w:t>.</w:t>
+              <w:t>increment for the Hough accumulator angle. The number of angles are 180 / theta_inc.</w:t>
             </w:r>
           </w:p>
         </w:tc>
@@ -16831,7 +15268,6 @@
                 <w:bCs w:val="0"/>
               </w:rPr>
             </w:pPr>
-            <w:proofErr w:type="spellStart"/>
             <w:r>
               <w:rPr>
                 <w:b w:val="0"/>
@@ -16839,7 +15275,6 @@
               </w:rPr>
               <w:t>theta_index</w:t>
             </w:r>
-            <w:proofErr w:type="spellEnd"/>
           </w:p>
         </w:tc>
         <w:tc>
@@ -16874,7 +15309,6 @@
                 <w:bCs w:val="0"/>
               </w:rPr>
             </w:pPr>
-            <w:proofErr w:type="spellStart"/>
             <w:r>
               <w:rPr>
                 <w:b w:val="0"/>
@@ -16882,7 +15316,6 @@
               </w:rPr>
               <w:t>pixel_value</w:t>
             </w:r>
-            <w:proofErr w:type="spellEnd"/>
           </w:p>
         </w:tc>
         <w:tc>
@@ -16914,7 +15347,6 @@
                 <w:bCs w:val="0"/>
               </w:rPr>
             </w:pPr>
-            <w:proofErr w:type="spellStart"/>
             <w:r>
               <w:rPr>
                 <w:b w:val="0"/>
@@ -16922,7 +15354,6 @@
               </w:rPr>
               <w:t>out_component</w:t>
             </w:r>
-            <w:proofErr w:type="spellEnd"/>
           </w:p>
         </w:tc>
         <w:tc>
@@ -17404,13 +15835,8 @@
       <w:pPr>
         <w:pStyle w:val="Heading2"/>
       </w:pPr>
-      <w:proofErr w:type="spellStart"/>
-      <w:r>
-        <w:t>hough</w:t>
-      </w:r>
-      <w:proofErr w:type="spellEnd"/>
-      <w:r>
-        <w:t>-image-create Operator</w:t>
+      <w:r>
+        <w:t>hough-image-create Operator</w:t>
       </w:r>
     </w:p>
     <w:p>
@@ -17646,15 +16072,7 @@
               <w:cnfStyle w:val="000000000000" w:firstRow="0" w:lastRow="0" w:firstColumn="0" w:lastColumn="0" w:oddVBand="0" w:evenVBand="0" w:oddHBand="0" w:evenHBand="0" w:firstRowFirstColumn="0" w:firstRowLastColumn="0" w:lastRowFirstColumn="0" w:lastRowLastColumn="0"/>
             </w:pPr>
             <w:r>
-              <w:t>“</w:t>
-            </w:r>
-            <w:proofErr w:type="spellStart"/>
-            <w:r>
-              <w:t>hough</w:t>
-            </w:r>
-            <w:proofErr w:type="spellEnd"/>
-            <w:r>
-              <w:t>”</w:t>
+              <w:t>“hough”</w:t>
             </w:r>
           </w:p>
         </w:tc>
@@ -17751,7 +16169,6 @@
                 <w:bCs w:val="0"/>
               </w:rPr>
             </w:pPr>
-            <w:proofErr w:type="spellStart"/>
             <w:r>
               <w:rPr>
                 <w:b w:val="0"/>
@@ -17759,7 +16176,6 @@
               </w:rPr>
               <w:t>theta_inc</w:t>
             </w:r>
-            <w:proofErr w:type="spellEnd"/>
           </w:p>
         </w:tc>
         <w:tc>
@@ -17771,41 +16187,24 @@
               <w:cnfStyle w:val="000000100000" w:firstRow="0" w:lastRow="0" w:firstColumn="0" w:lastColumn="0" w:oddVBand="0" w:evenVBand="0" w:oddHBand="1" w:evenHBand="0" w:firstRowFirstColumn="0" w:firstRowLastColumn="0" w:lastRowFirstColumn="0" w:lastRowLastColumn="0"/>
             </w:pPr>
             <w:r>
-              <w:t xml:space="preserve">increment for the Hough accumulator angle. The number of angles </w:t>
-            </w:r>
-            <w:proofErr w:type="gramStart"/>
-            <w:r>
-              <w:t>are</w:t>
-            </w:r>
-            <w:proofErr w:type="gramEnd"/>
-            <w:r>
-              <w:t xml:space="preserve"> 180 / </w:t>
-            </w:r>
-            <w:proofErr w:type="spellStart"/>
-            <w:r>
-              <w:t>theta_inc</w:t>
-            </w:r>
-            <w:proofErr w:type="spellEnd"/>
-            <w:r>
-              <w:t>.</w:t>
-            </w:r>
-          </w:p>
-        </w:tc>
-      </w:tr>
-      <w:tr>
-        <w:tc>
-          <w:tcPr>
-            <w:cnfStyle w:val="001000000000" w:firstRow="0" w:lastRow="0" w:firstColumn="1" w:lastColumn="0" w:oddVBand="0" w:evenVBand="0" w:oddHBand="0" w:evenHBand="0" w:firstRowFirstColumn="0" w:firstRowLastColumn="0" w:lastRowFirstColumn="0" w:lastRowLastColumn="0"/>
-            <w:tcW w:w="0" w:type="auto"/>
-          </w:tcPr>
-          <w:p>
-            <w:pPr>
-              <w:rPr>
-                <w:b w:val="0"/>
-                <w:bCs w:val="0"/>
-              </w:rPr>
-            </w:pPr>
-            <w:proofErr w:type="spellStart"/>
+              <w:t>increment for the Hough accumulator angle. The number of angles are 180 / theta_inc.</w:t>
+            </w:r>
+          </w:p>
+        </w:tc>
+      </w:tr>
+      <w:tr>
+        <w:tc>
+          <w:tcPr>
+            <w:cnfStyle w:val="001000000000" w:firstRow="0" w:lastRow="0" w:firstColumn="1" w:lastColumn="0" w:oddVBand="0" w:evenVBand="0" w:oddHBand="0" w:evenHBand="0" w:firstRowFirstColumn="0" w:firstRowLastColumn="0" w:lastRowFirstColumn="0" w:lastRowLastColumn="0"/>
+            <w:tcW w:w="0" w:type="auto"/>
+          </w:tcPr>
+          <w:p>
+            <w:pPr>
+              <w:rPr>
+                <w:b w:val="0"/>
+                <w:bCs w:val="0"/>
+              </w:rPr>
+            </w:pPr>
             <w:r>
               <w:rPr>
                 <w:b w:val="0"/>
@@ -17813,7 +16212,6 @@
               </w:rPr>
               <w:t>pixel_threshold</w:t>
             </w:r>
-            <w:proofErr w:type="spellEnd"/>
           </w:p>
         </w:tc>
         <w:tc>
@@ -18106,7 +16504,6 @@
                 <w:bCs w:val="0"/>
               </w:rPr>
             </w:pPr>
-            <w:proofErr w:type="spellStart"/>
             <w:r>
               <w:rPr>
                 <w:b w:val="0"/>
@@ -18114,7 +16511,6 @@
               </w:rPr>
               <w:t>theta_inc</w:t>
             </w:r>
-            <w:proofErr w:type="spellEnd"/>
           </w:p>
         </w:tc>
         <w:tc>
@@ -18146,7 +16542,6 @@
                 <w:bCs w:val="0"/>
               </w:rPr>
             </w:pPr>
-            <w:proofErr w:type="spellStart"/>
             <w:r>
               <w:rPr>
                 <w:b w:val="0"/>
@@ -18154,7 +16549,6 @@
               </w:rPr>
               <w:t>pixel_threshold</w:t>
             </w:r>
-            <w:proofErr w:type="spellEnd"/>
           </w:p>
         </w:tc>
         <w:tc>
@@ -18189,7 +16583,6 @@
                 <w:bCs w:val="0"/>
               </w:rPr>
             </w:pPr>
-            <w:proofErr w:type="spellStart"/>
             <w:r>
               <w:rPr>
                 <w:b w:val="0"/>
@@ -18197,7 +16590,6 @@
               </w:rPr>
               <w:t>nthetas</w:t>
             </w:r>
-            <w:proofErr w:type="spellEnd"/>
           </w:p>
         </w:tc>
         <w:tc>
@@ -18210,31 +16602,25 @@
               <w:cnfStyle w:val="000000100000" w:firstRow="0" w:lastRow="0" w:firstColumn="0" w:lastColumn="0" w:oddVBand="0" w:evenVBand="0" w:oddHBand="1" w:evenHBand="0" w:firstRowFirstColumn="0" w:firstRowLastColumn="0" w:lastRowFirstColumn="0" w:lastRowLastColumn="0"/>
             </w:pPr>
             <w:r>
-              <w:t xml:space="preserve">The number of angles sampled = 180 / </w:t>
-            </w:r>
-            <w:proofErr w:type="spellStart"/>
-            <w:r>
-              <w:t>theta_inc</w:t>
-            </w:r>
-            <w:proofErr w:type="spellEnd"/>
-          </w:p>
-        </w:tc>
-      </w:tr>
-      <w:tr>
-        <w:tc>
-          <w:tcPr>
-            <w:cnfStyle w:val="001000000000" w:firstRow="0" w:lastRow="0" w:firstColumn="1" w:lastColumn="0" w:oddVBand="0" w:evenVBand="0" w:oddHBand="0" w:evenHBand="0" w:firstRowFirstColumn="0" w:firstRowLastColumn="0" w:lastRowFirstColumn="0" w:lastRowLastColumn="0"/>
-            <w:tcW w:w="0" w:type="auto"/>
-          </w:tcPr>
-          <w:p>
-            <w:pPr>
-              <w:pStyle w:val="NoSpacing"/>
-              <w:rPr>
-                <w:b w:val="0"/>
-                <w:bCs w:val="0"/>
-              </w:rPr>
-            </w:pPr>
-            <w:proofErr w:type="spellStart"/>
+              <w:t>The number of angles sampled = 180 / theta_inc</w:t>
+            </w:r>
+          </w:p>
+        </w:tc>
+      </w:tr>
+      <w:tr>
+        <w:tc>
+          <w:tcPr>
+            <w:cnfStyle w:val="001000000000" w:firstRow="0" w:lastRow="0" w:firstColumn="1" w:lastColumn="0" w:oddVBand="0" w:evenVBand="0" w:oddHBand="0" w:evenHBand="0" w:firstRowFirstColumn="0" w:firstRowLastColumn="0" w:lastRowFirstColumn="0" w:lastRowLastColumn="0"/>
+            <w:tcW w:w="0" w:type="auto"/>
+          </w:tcPr>
+          <w:p>
+            <w:pPr>
+              <w:pStyle w:val="NoSpacing"/>
+              <w:rPr>
+                <w:b w:val="0"/>
+                <w:bCs w:val="0"/>
+              </w:rPr>
+            </w:pPr>
             <w:r>
               <w:rPr>
                 <w:b w:val="0"/>
@@ -18242,7 +16628,6 @@
               </w:rPr>
               <w:t>nrhos</w:t>
             </w:r>
-            <w:proofErr w:type="spellEnd"/>
           </w:p>
         </w:tc>
         <w:tc>
@@ -18277,7 +16662,6 @@
                 <w:bCs w:val="0"/>
               </w:rPr>
             </w:pPr>
-            <w:proofErr w:type="spellStart"/>
             <w:r>
               <w:rPr>
                 <w:b w:val="0"/>
@@ -18285,7 +16669,6 @@
               </w:rPr>
               <w:t>min_count</w:t>
             </w:r>
-            <w:proofErr w:type="spellEnd"/>
           </w:p>
         </w:tc>
         <w:tc>
@@ -18317,7 +16700,6 @@
                 <w:bCs w:val="0"/>
               </w:rPr>
             </w:pPr>
-            <w:proofErr w:type="spellStart"/>
             <w:r>
               <w:rPr>
                 <w:b w:val="0"/>
@@ -18325,7 +16707,6 @@
               </w:rPr>
               <w:t>max_count</w:t>
             </w:r>
-            <w:proofErr w:type="spellEnd"/>
           </w:p>
         </w:tc>
         <w:tc>
@@ -18379,15 +16760,7 @@
               <w:cnfStyle w:val="000000100000" w:firstRow="0" w:lastRow="0" w:firstColumn="0" w:lastColumn="0" w:oddVBand="0" w:evenVBand="0" w:oddHBand="1" w:evenHBand="0" w:firstRowFirstColumn="0" w:firstRowLastColumn="0" w:lastRowFirstColumn="0" w:lastRowLastColumn="0"/>
             </w:pPr>
             <w:r>
-              <w:t xml:space="preserve">The mean for the </w:t>
-            </w:r>
-            <w:proofErr w:type="spellStart"/>
-            <w:r>
-              <w:t>hough</w:t>
-            </w:r>
-            <w:proofErr w:type="spellEnd"/>
-            <w:r>
-              <w:t xml:space="preserve"> accumulator counts</w:t>
+              <w:t>The mean for the hough accumulator counts</w:t>
             </w:r>
           </w:p>
         </w:tc>
@@ -18426,15 +16799,7 @@
               <w:cnfStyle w:val="000000000000" w:firstRow="0" w:lastRow="0" w:firstColumn="0" w:lastColumn="0" w:oddVBand="0" w:evenVBand="0" w:oddHBand="0" w:evenHBand="0" w:firstRowFirstColumn="0" w:firstRowLastColumn="0" w:lastRowFirstColumn="0" w:lastRowLastColumn="0"/>
             </w:pPr>
             <w:r>
-              <w:t xml:space="preserve">The standard deviation for the </w:t>
-            </w:r>
-            <w:proofErr w:type="spellStart"/>
-            <w:r>
-              <w:t>hough</w:t>
-            </w:r>
-            <w:proofErr w:type="spellEnd"/>
-            <w:r>
-              <w:t xml:space="preserve"> accumulator counts</w:t>
+              <w:t>The standard deviation for the hough accumulator counts</w:t>
             </w:r>
           </w:p>
         </w:tc>
@@ -18444,24 +16809,14 @@
       <w:pPr>
         <w:pStyle w:val="Heading2"/>
       </w:pPr>
-      <w:proofErr w:type="spellStart"/>
-      <w:r>
-        <w:t>hough</w:t>
-      </w:r>
-      <w:proofErr w:type="spellEnd"/>
-      <w:r>
-        <w:t>-peak-detect Operator</w:t>
-      </w:r>
-    </w:p>
-    <w:p>
-      <w:r>
-        <w:t xml:space="preserve">The Hough peak detect operator finds polar lines (rho, theta) in the Hough accumulator data where the counts exceed a </w:t>
-      </w:r>
-      <w:proofErr w:type="gramStart"/>
-      <w:r>
-        <w:t>threshold..</w:t>
-      </w:r>
-      <w:proofErr w:type="gramEnd"/>
+      <w:r>
+        <w:t>hough-peak-detect Operator</w:t>
+      </w:r>
+    </w:p>
+    <w:p>
+      <w:r>
+        <w:t>The Hough peak detect operator finds polar lines (rho, theta) in the Hough accumulator data where the counts exceed a threshold..</w:t>
+      </w:r>
     </w:p>
     <w:p>
       <w:r>
@@ -18598,15 +16953,7 @@
               <w:cnfStyle w:val="000000100000" w:firstRow="0" w:lastRow="0" w:firstColumn="0" w:lastColumn="0" w:oddVBand="0" w:evenVBand="0" w:oddHBand="1" w:evenHBand="0" w:firstRowFirstColumn="0" w:firstRowLastColumn="0" w:lastRowFirstColumn="0" w:lastRowLastColumn="0"/>
             </w:pPr>
             <w:r>
-              <w:t>“</w:t>
-            </w:r>
-            <w:proofErr w:type="spellStart"/>
-            <w:r>
-              <w:t>hough</w:t>
-            </w:r>
-            <w:proofErr w:type="spellEnd"/>
-            <w:r>
-              <w:t>”</w:t>
+              <w:t>“hough”</w:t>
             </w:r>
           </w:p>
         </w:tc>
@@ -18821,7 +17168,6 @@
                 <w:bCs w:val="0"/>
               </w:rPr>
             </w:pPr>
-            <w:proofErr w:type="spellStart"/>
             <w:r>
               <w:rPr>
                 <w:b w:val="0"/>
@@ -18829,7 +17175,6 @@
               </w:rPr>
               <w:t>max_peaks</w:t>
             </w:r>
-            <w:proofErr w:type="spellEnd"/>
           </w:p>
         </w:tc>
         <w:tc>
@@ -18918,7 +17263,6 @@
                 <w:bCs w:val="0"/>
               </w:rPr>
             </w:pPr>
-            <w:proofErr w:type="spellStart"/>
             <w:r>
               <w:rPr>
                 <w:b w:val="0"/>
@@ -18926,7 +17270,6 @@
               </w:rPr>
               <w:t>theta_inc</w:t>
             </w:r>
-            <w:proofErr w:type="spellEnd"/>
           </w:p>
         </w:tc>
         <w:tc>
@@ -18958,7 +17301,6 @@
                 <w:bCs w:val="0"/>
               </w:rPr>
             </w:pPr>
-            <w:proofErr w:type="spellStart"/>
             <w:r>
               <w:rPr>
                 <w:b w:val="0"/>
@@ -18966,7 +17308,6 @@
               </w:rPr>
               <w:t>nthetas</w:t>
             </w:r>
-            <w:proofErr w:type="spellEnd"/>
           </w:p>
         </w:tc>
         <w:tc>
@@ -18979,13 +17320,8 @@
               <w:cnfStyle w:val="000000000000" w:firstRow="0" w:lastRow="0" w:firstColumn="0" w:lastColumn="0" w:oddVBand="0" w:evenVBand="0" w:oddHBand="0" w:evenHBand="0" w:firstRowFirstColumn="0" w:firstRowLastColumn="0" w:lastRowFirstColumn="0" w:lastRowLastColumn="0"/>
             </w:pPr>
             <w:r>
-              <w:t xml:space="preserve">The number of angles sampled = 180 / </w:t>
-            </w:r>
-            <w:proofErr w:type="spellStart"/>
-            <w:r>
-              <w:t>theta_inc</w:t>
-            </w:r>
-            <w:proofErr w:type="spellEnd"/>
+              <w:t>The number of angles sampled = 180 / theta_inc</w:t>
+            </w:r>
           </w:p>
         </w:tc>
       </w:tr>
@@ -19006,7 +17342,6 @@
                 <w:bCs w:val="0"/>
               </w:rPr>
             </w:pPr>
-            <w:proofErr w:type="spellStart"/>
             <w:r>
               <w:rPr>
                 <w:b w:val="0"/>
@@ -19014,7 +17349,6 @@
               </w:rPr>
               <w:t>nrhos</w:t>
             </w:r>
-            <w:proofErr w:type="spellEnd"/>
           </w:p>
         </w:tc>
         <w:tc>
@@ -19206,56 +17540,24 @@
                 <w:sz w:val="20"/>
                 <w:szCs w:val="20"/>
               </w:rPr>
-              <w:t xml:space="preserve">Copy the input image to the output image </w:t>
-            </w:r>
-            <w:proofErr w:type="spellStart"/>
-            <w:r>
+              <w:t xml:space="preserve">Copy the input image to the output image out_component component. </w:t>
+            </w:r>
+          </w:p>
+          <w:p>
+            <w:pPr>
+              <w:pStyle w:val="tablebullet"/>
+              <w:cnfStyle w:val="000000000000" w:firstRow="0" w:lastRow="0" w:firstColumn="0" w:lastColumn="0" w:oddVBand="0" w:evenVBand="0" w:oddHBand="0" w:evenHBand="0" w:firstRowFirstColumn="0" w:firstRowLastColumn="0" w:lastRowFirstColumn="0" w:lastRowLastColumn="0"/>
               <w:rPr>
                 <w:sz w:val="20"/>
                 <w:szCs w:val="20"/>
               </w:rPr>
-              <w:t>out_component</w:t>
-            </w:r>
-            <w:proofErr w:type="spellEnd"/>
+            </w:pPr>
             <w:r>
               <w:rPr>
                 <w:sz w:val="20"/>
                 <w:szCs w:val="20"/>
               </w:rPr>
-              <w:t xml:space="preserve"> component. </w:t>
-            </w:r>
-          </w:p>
-          <w:p>
-            <w:pPr>
-              <w:pStyle w:val="tablebullet"/>
-              <w:cnfStyle w:val="000000000000" w:firstRow="0" w:lastRow="0" w:firstColumn="0" w:lastColumn="0" w:oddVBand="0" w:evenVBand="0" w:oddHBand="0" w:evenHBand="0" w:firstRowFirstColumn="0" w:firstRowLastColumn="0" w:lastRowFirstColumn="0" w:lastRowLastColumn="0"/>
-              <w:rPr>
-                <w:sz w:val="20"/>
-                <w:szCs w:val="20"/>
-              </w:rPr>
-            </w:pPr>
-            <w:r>
-              <w:rPr>
-                <w:sz w:val="20"/>
-                <w:szCs w:val="20"/>
-              </w:rPr>
-              <w:t xml:space="preserve">Copy the input image to the first output image component if the </w:t>
-            </w:r>
-            <w:proofErr w:type="spellStart"/>
-            <w:r>
-              <w:rPr>
-                <w:sz w:val="20"/>
-                <w:szCs w:val="20"/>
-              </w:rPr>
-              <w:t>out_component</w:t>
-            </w:r>
-            <w:proofErr w:type="spellEnd"/>
-            <w:r>
-              <w:rPr>
-                <w:sz w:val="20"/>
-                <w:szCs w:val="20"/>
-              </w:rPr>
-              <w:t xml:space="preserve"> parameter is omitted.</w:t>
+              <w:t>Copy the input image to the first output image component if the out_component parameter is omitted.</w:t>
             </w:r>
           </w:p>
         </w:tc>
@@ -19316,72 +17618,24 @@
                 <w:sz w:val="20"/>
                 <w:szCs w:val="20"/>
               </w:rPr>
-              <w:t xml:space="preserve">Copy the input image </w:t>
-            </w:r>
-            <w:proofErr w:type="spellStart"/>
-            <w:r>
+              <w:t xml:space="preserve">Copy the input image in_component component to the output image in_component component. </w:t>
+            </w:r>
+          </w:p>
+          <w:p>
+            <w:pPr>
+              <w:pStyle w:val="tablebullet"/>
+              <w:cnfStyle w:val="000000100000" w:firstRow="0" w:lastRow="0" w:firstColumn="0" w:lastColumn="0" w:oddVBand="0" w:evenVBand="0" w:oddHBand="1" w:evenHBand="0" w:firstRowFirstColumn="0" w:firstRowLastColumn="0" w:lastRowFirstColumn="0" w:lastRowLastColumn="0"/>
               <w:rPr>
                 <w:sz w:val="20"/>
                 <w:szCs w:val="20"/>
               </w:rPr>
-              <w:t>in_component</w:t>
-            </w:r>
-            <w:proofErr w:type="spellEnd"/>
+            </w:pPr>
             <w:r>
               <w:rPr>
                 <w:sz w:val="20"/>
                 <w:szCs w:val="20"/>
               </w:rPr>
-              <w:t xml:space="preserve"> component to the output image </w:t>
-            </w:r>
-            <w:proofErr w:type="spellStart"/>
-            <w:r>
-              <w:rPr>
-                <w:sz w:val="20"/>
-                <w:szCs w:val="20"/>
-              </w:rPr>
-              <w:t>in_component</w:t>
-            </w:r>
-            <w:proofErr w:type="spellEnd"/>
-            <w:r>
-              <w:rPr>
-                <w:sz w:val="20"/>
-                <w:szCs w:val="20"/>
-              </w:rPr>
-              <w:t xml:space="preserve"> component. </w:t>
-            </w:r>
-          </w:p>
-          <w:p>
-            <w:pPr>
-              <w:pStyle w:val="tablebullet"/>
-              <w:cnfStyle w:val="000000100000" w:firstRow="0" w:lastRow="0" w:firstColumn="0" w:lastColumn="0" w:oddVBand="0" w:evenVBand="0" w:oddHBand="1" w:evenHBand="0" w:firstRowFirstColumn="0" w:firstRowLastColumn="0" w:lastRowFirstColumn="0" w:lastRowLastColumn="0"/>
-              <w:rPr>
-                <w:sz w:val="20"/>
-                <w:szCs w:val="20"/>
-              </w:rPr>
-            </w:pPr>
-            <w:r>
-              <w:rPr>
-                <w:sz w:val="20"/>
-                <w:szCs w:val="20"/>
-              </w:rPr>
-              <w:t xml:space="preserve">Copy the first input image component to the output image if the </w:t>
-            </w:r>
-            <w:proofErr w:type="spellStart"/>
-            <w:r>
-              <w:rPr>
-                <w:sz w:val="20"/>
-                <w:szCs w:val="20"/>
-              </w:rPr>
-              <w:t>in_component</w:t>
-            </w:r>
-            <w:proofErr w:type="spellEnd"/>
-            <w:r>
-              <w:rPr>
-                <w:sz w:val="20"/>
-                <w:szCs w:val="20"/>
-              </w:rPr>
-              <w:t xml:space="preserve"> parameter is omitted.</w:t>
+              <w:t>Copy the first input image component to the output image if the in_component parameter is omitted.</w:t>
             </w:r>
           </w:p>
         </w:tc>
@@ -19441,23 +17695,7 @@
         <w:pStyle w:val="Normalafterlist"/>
       </w:pPr>
       <w:r>
-        <w:t xml:space="preserve">There are several variations depending whether the </w:t>
-      </w:r>
-      <w:proofErr w:type="spellStart"/>
-      <w:r>
-        <w:t>in_component</w:t>
-      </w:r>
-      <w:proofErr w:type="spellEnd"/>
-      <w:r>
-        <w:t xml:space="preserve"> or </w:t>
-      </w:r>
-      <w:proofErr w:type="spellStart"/>
-      <w:r>
-        <w:t>out_component</w:t>
-      </w:r>
-      <w:proofErr w:type="spellEnd"/>
-      <w:r>
-        <w:t xml:space="preserve"> parameters are specified.</w:t>
+        <w:t>There are several variations depending whether the in_component or out_component parameters are specified.</w:t>
       </w:r>
     </w:p>
     <w:tbl>
@@ -19483,11 +17721,9 @@
             <w:tcW w:w="0" w:type="auto"/>
           </w:tcPr>
           <w:p>
-            <w:proofErr w:type="spellStart"/>
             <w:r>
               <w:t>in_component</w:t>
             </w:r>
-            <w:proofErr w:type="spellEnd"/>
           </w:p>
         </w:tc>
         <w:tc>
@@ -19498,11 +17734,9 @@
             <w:pPr>
               <w:cnfStyle w:val="100000000000" w:firstRow="1" w:lastRow="0" w:firstColumn="0" w:lastColumn="0" w:oddVBand="0" w:evenVBand="0" w:oddHBand="0" w:evenHBand="0" w:firstRowFirstColumn="0" w:firstRowLastColumn="0" w:lastRowFirstColumn="0" w:lastRowLastColumn="0"/>
             </w:pPr>
-            <w:proofErr w:type="spellStart"/>
             <w:r>
               <w:t>out_component</w:t>
             </w:r>
-            <w:proofErr w:type="spellEnd"/>
           </w:p>
         </w:tc>
         <w:tc>
@@ -19567,23 +17801,7 @@
               <w:cnfStyle w:val="000000100000" w:firstRow="0" w:lastRow="0" w:firstColumn="0" w:lastColumn="0" w:oddVBand="0" w:evenVBand="0" w:oddHBand="1" w:evenHBand="0" w:firstRowFirstColumn="0" w:firstRowLastColumn="0" w:lastRowFirstColumn="0" w:lastRowLastColumn="0"/>
             </w:pPr>
             <w:r>
-              <w:t xml:space="preserve">Copy the input image </w:t>
-            </w:r>
-            <w:proofErr w:type="spellStart"/>
-            <w:r>
-              <w:t>in_component</w:t>
-            </w:r>
-            <w:proofErr w:type="spellEnd"/>
-            <w:r>
-              <w:t xml:space="preserve"> to the output image </w:t>
-            </w:r>
-            <w:proofErr w:type="spellStart"/>
-            <w:r>
-              <w:t>out_component</w:t>
-            </w:r>
-            <w:proofErr w:type="spellEnd"/>
-            <w:r>
-              <w:t xml:space="preserve"> component </w:t>
+              <w:t xml:space="preserve">Copy the input image in_component to the output image out_component component </w:t>
             </w:r>
           </w:p>
         </w:tc>
@@ -19634,23 +17852,7 @@
               <w:cnfStyle w:val="000000000000" w:firstRow="0" w:lastRow="0" w:firstColumn="0" w:lastColumn="0" w:oddVBand="0" w:evenVBand="0" w:oddHBand="0" w:evenHBand="0" w:firstRowFirstColumn="0" w:firstRowLastColumn="0" w:lastRowFirstColumn="0" w:lastRowLastColumn="0"/>
             </w:pPr>
             <w:r>
-              <w:t xml:space="preserve">Copy the input image </w:t>
-            </w:r>
-            <w:proofErr w:type="spellStart"/>
-            <w:r>
-              <w:t>in_component</w:t>
-            </w:r>
-            <w:proofErr w:type="spellEnd"/>
-            <w:r>
-              <w:t xml:space="preserve"> component to the </w:t>
-            </w:r>
-            <w:proofErr w:type="spellStart"/>
-            <w:r>
-              <w:t>in_component</w:t>
-            </w:r>
-            <w:proofErr w:type="spellEnd"/>
-            <w:r>
-              <w:t xml:space="preserve"> component of the output image</w:t>
+              <w:t>Copy the input image in_component component to the in_component component of the output image</w:t>
             </w:r>
           </w:p>
         </w:tc>
@@ -19703,23 +17905,7 @@
               <w:cnfStyle w:val="000000100000" w:firstRow="0" w:lastRow="0" w:firstColumn="0" w:lastColumn="0" w:oddVBand="0" w:evenVBand="0" w:oddHBand="1" w:evenHBand="0" w:firstRowFirstColumn="0" w:firstRowLastColumn="0" w:lastRowFirstColumn="0" w:lastRowLastColumn="0"/>
             </w:pPr>
             <w:r>
-              <w:t xml:space="preserve">Copy the input image </w:t>
-            </w:r>
-            <w:proofErr w:type="spellStart"/>
-            <w:r>
-              <w:t>out_component</w:t>
-            </w:r>
-            <w:proofErr w:type="spellEnd"/>
-            <w:r>
-              <w:t xml:space="preserve"> component to the output image </w:t>
-            </w:r>
-            <w:proofErr w:type="spellStart"/>
-            <w:r>
-              <w:t>out_component</w:t>
-            </w:r>
-            <w:proofErr w:type="spellEnd"/>
-            <w:r>
-              <w:t xml:space="preserve"> component </w:t>
+              <w:t xml:space="preserve">Copy the input image out_component component to the output image out_component component </w:t>
             </w:r>
           </w:p>
         </w:tc>
@@ -19844,7 +18030,6 @@
                 <w:bCs w:val="0"/>
               </w:rPr>
             </w:pPr>
-            <w:proofErr w:type="spellStart"/>
             <w:r>
               <w:rPr>
                 <w:b w:val="0"/>
@@ -19852,7 +18037,6 @@
               </w:rPr>
               <w:t>in_component</w:t>
             </w:r>
-            <w:proofErr w:type="spellEnd"/>
           </w:p>
         </w:tc>
         <w:tc>
@@ -19883,7 +18067,6 @@
                 <w:bCs w:val="0"/>
               </w:rPr>
             </w:pPr>
-            <w:proofErr w:type="spellStart"/>
             <w:r>
               <w:rPr>
                 <w:b w:val="0"/>
@@ -19891,7 +18074,6 @@
               </w:rPr>
               <w:t>out_component</w:t>
             </w:r>
-            <w:proofErr w:type="spellEnd"/>
           </w:p>
         </w:tc>
         <w:tc>
@@ -20189,19 +18371,7 @@
         <w:t xml:space="preserve">structuring element </w:t>
       </w:r>
       <w:r>
-        <w:t xml:space="preserve">at each pixel position and </w:t>
-      </w:r>
-      <w:r>
-        <w:t>decides</w:t>
-      </w:r>
-      <w:r>
-        <w:t xml:space="preserve"> as to what output value to produce. The image may be treated as a binary or as a grayscale image.</w:t>
-      </w:r>
-      <w:r>
-        <w:t xml:space="preserve"> </w:t>
-      </w:r>
-      <w:r>
-        <w:t>Compound operations combine more than one operation.</w:t>
+        <w:t>at each pixel position and decides as to what output value to produce. The image may be treated as a binary or as a grayscale image. Compound operations combine more than one operation.</w:t>
       </w:r>
     </w:p>
     <w:tbl>
@@ -20564,10 +18734,7 @@
         <w:pStyle w:val="Normalafterlist"/>
       </w:pPr>
       <w:r>
-        <w:t>The variables in these operations are</w:t>
-      </w:r>
-      <w:r>
-        <w:t xml:space="preserve"> as follows.</w:t>
+        <w:t>The variables in these operations are as follows.</w:t>
       </w:r>
     </w:p>
     <w:tbl>
@@ -20577,8 +18744,8 @@
         <w:tblLook w:val="04A0" w:firstRow="1" w:lastRow="0" w:firstColumn="1" w:lastColumn="0" w:noHBand="0" w:noVBand="1"/>
       </w:tblPr>
       <w:tblGrid>
-        <w:gridCol w:w="1698"/>
-        <w:gridCol w:w="7652"/>
+        <w:gridCol w:w="1650"/>
+        <w:gridCol w:w="7700"/>
       </w:tblGrid>
       <w:tr>
         <w:trPr>
@@ -20687,15 +18854,7 @@
               <w:cnfStyle w:val="000000000000" w:firstRow="0" w:lastRow="0" w:firstColumn="0" w:lastColumn="0" w:oddVBand="0" w:evenVBand="0" w:oddHBand="0" w:evenHBand="0" w:firstRowFirstColumn="0" w:firstRowLastColumn="0" w:lastRowFirstColumn="0" w:lastRowLastColumn="0"/>
             </w:pPr>
             <w:r>
-              <w:t xml:space="preserve">A selected structuring element shape. Shapes supported in the current release are </w:t>
-            </w:r>
-            <w:proofErr w:type="gramStart"/>
-            <w:r>
-              <w:t>rectangle(</w:t>
-            </w:r>
-            <w:proofErr w:type="gramEnd"/>
-            <w:r>
-              <w:t xml:space="preserve">height, width) and cross(height, width, thickness). </w:t>
+              <w:t>A selected structuring element shape. Shapes supported in the current release are rectangle(height, width), ellipse(height, width), cross(height, width, thickness).</w:t>
             </w:r>
           </w:p>
         </w:tc>
@@ -20736,15 +18895,7 @@
               <w:cnfStyle w:val="000000100000" w:firstRow="0" w:lastRow="0" w:firstColumn="0" w:lastColumn="0" w:oddVBand="0" w:evenVBand="0" w:oddHBand="1" w:evenHBand="0" w:firstRowFirstColumn="0" w:firstRowLastColumn="0" w:lastRowFirstColumn="0" w:lastRowLastColumn="0"/>
             </w:pPr>
             <w:r>
-              <w:t>Whether the image is treated as binary (</w:t>
-            </w:r>
-            <w:proofErr w:type="spellStart"/>
-            <w:r>
-              <w:t>thresholded</w:t>
-            </w:r>
-            <w:proofErr w:type="spellEnd"/>
-            <w:r>
-              <w:t>) or grayscale.</w:t>
+              <w:t>Whether the image is treated as binary (thresholded) or grayscale.</w:t>
             </w:r>
           </w:p>
         </w:tc>
@@ -20755,10 +18906,7 @@
         <w:pStyle w:val="Normalafterlist"/>
       </w:pPr>
       <w:r>
-        <w:t>The operator takes the following data descriptors</w:t>
-      </w:r>
-      <w:r>
-        <w:t xml:space="preserve">. </w:t>
+        <w:t xml:space="preserve">The operator takes the following data descriptors. </w:t>
       </w:r>
     </w:p>
     <w:tbl>
@@ -21004,25 +19152,7 @@
         <w:pStyle w:val="Normalafterlist"/>
       </w:pPr>
       <w:r>
-        <w:t>The parameter</w:t>
-      </w:r>
-      <w:r>
-        <w:t>s</w:t>
-      </w:r>
-      <w:r>
-        <w:t xml:space="preserve"> to the </w:t>
-      </w:r>
-      <w:r>
-        <w:t>Morphology</w:t>
-      </w:r>
-      <w:r>
-        <w:t xml:space="preserve"> operator </w:t>
-      </w:r>
-      <w:r>
-        <w:t>are</w:t>
-      </w:r>
-      <w:r>
-        <w:t>:</w:t>
+        <w:t>The parameters to the Morphology operator are:</w:t>
       </w:r>
     </w:p>
     <w:tbl>
@@ -21136,7 +19266,7 @@
               <w:cnfStyle w:val="000000000000" w:firstRow="0" w:lastRow="0" w:firstColumn="0" w:lastColumn="0" w:oddVBand="0" w:evenVBand="0" w:oddHBand="0" w:evenHBand="0" w:firstRowFirstColumn="0" w:firstRowLastColumn="0" w:lastRowFirstColumn="0" w:lastRowLastColumn="0"/>
             </w:pPr>
             <w:r>
-              <w:t>Shape of the structuring element: “rectangle”, “cross”</w:t>
+              <w:t>Shape of the structuring element: “rectangle”, “cross”, “ellipse”</w:t>
             </w:r>
           </w:p>
         </w:tc>
@@ -21175,13 +19305,7 @@
               <w:cnfStyle w:val="000000100000" w:firstRow="0" w:lastRow="0" w:firstColumn="0" w:lastColumn="0" w:oddVBand="0" w:evenVBand="0" w:oddHBand="1" w:evenHBand="0" w:firstRowFirstColumn="0" w:firstRowLastColumn="0" w:lastRowFirstColumn="0" w:lastRowLastColumn="0"/>
             </w:pPr>
             <w:r>
-              <w:t>Rectangle or cross</w:t>
-            </w:r>
-            <w:r>
-              <w:t xml:space="preserve"> pixel</w:t>
-            </w:r>
-            <w:r>
-              <w:t xml:space="preserve"> height</w:t>
+              <w:t>Rectangle, ellipse, or cross pixel height</w:t>
             </w:r>
           </w:p>
         </w:tc>
@@ -21217,16 +19341,7 @@
               <w:cnfStyle w:val="000000000000" w:firstRow="0" w:lastRow="0" w:firstColumn="0" w:lastColumn="0" w:oddVBand="0" w:evenVBand="0" w:oddHBand="0" w:evenHBand="0" w:firstRowFirstColumn="0" w:firstRowLastColumn="0" w:lastRowFirstColumn="0" w:lastRowLastColumn="0"/>
             </w:pPr>
             <w:r>
-              <w:t xml:space="preserve">Rectangle or cross </w:t>
-            </w:r>
-            <w:r>
-              <w:t>pixel</w:t>
-            </w:r>
-            <w:r>
-              <w:t xml:space="preserve"> </w:t>
-            </w:r>
-            <w:r>
-              <w:t>width</w:t>
+              <w:t>Rectangle, ellipse, or cross pixel width</w:t>
             </w:r>
           </w:p>
         </w:tc>
@@ -21265,16 +19380,7 @@
               <w:cnfStyle w:val="000000100000" w:firstRow="0" w:lastRow="0" w:firstColumn="0" w:lastColumn="0" w:oddVBand="0" w:evenVBand="0" w:oddHBand="1" w:evenHBand="0" w:firstRowFirstColumn="0" w:firstRowLastColumn="0" w:lastRowFirstColumn="0" w:lastRowLastColumn="0"/>
             </w:pPr>
             <w:r>
-              <w:t xml:space="preserve">Cross </w:t>
-            </w:r>
-            <w:r>
-              <w:t>pixel</w:t>
-            </w:r>
-            <w:r>
-              <w:t xml:space="preserve"> </w:t>
-            </w:r>
-            <w:r>
-              <w:t>thickness</w:t>
+              <w:t>Cross pixel thickness</w:t>
             </w:r>
           </w:p>
         </w:tc>
@@ -21385,10 +19491,7 @@
               <w:cnfStyle w:val="000000000000" w:firstRow="0" w:lastRow="0" w:firstColumn="0" w:lastColumn="0" w:oddVBand="0" w:evenVBand="0" w:oddHBand="0" w:evenHBand="0" w:firstRowFirstColumn="0" w:firstRowLastColumn="0" w:lastRowFirstColumn="0" w:lastRowLastColumn="0"/>
             </w:pPr>
             <w:r>
-              <w:t xml:space="preserve">Iteration count for first operation of </w:t>
-            </w:r>
-            <w:r>
-              <w:t>open, close, top-hat, or back-hat</w:t>
+              <w:t>Iteration count for first operation of open, close, top-hat, or back-hat</w:t>
             </w:r>
           </w:p>
         </w:tc>
@@ -21427,13 +19530,7 @@
               <w:cnfStyle w:val="000000100000" w:firstRow="0" w:lastRow="0" w:firstColumn="0" w:lastColumn="0" w:oddVBand="0" w:evenVBand="0" w:oddHBand="1" w:evenHBand="0" w:firstRowFirstColumn="0" w:firstRowLastColumn="0" w:lastRowFirstColumn="0" w:lastRowLastColumn="0"/>
             </w:pPr>
             <w:r>
-              <w:t xml:space="preserve">Iteration count for </w:t>
-            </w:r>
-            <w:r>
-              <w:t>second</w:t>
-            </w:r>
-            <w:r>
-              <w:t xml:space="preserve"> operation of open, close, top-hat, or back-hat</w:t>
+              <w:t>Iteration count for second operation of open, close, top-hat, or back-hat</w:t>
             </w:r>
           </w:p>
         </w:tc>
@@ -21681,7 +19778,6 @@
       <w:r>
         <w:t xml:space="preserve">  if input value &lt; </w:t>
       </w:r>
-      <w:proofErr w:type="spellStart"/>
       <w:r>
         <w:rPr>
           <w:rFonts w:eastAsia="Times New Roman" w:cs="Arial"/>
@@ -21689,20 +19785,14 @@
         </w:rPr>
         <w:t>lower_in</w:t>
       </w:r>
-      <w:proofErr w:type="spellEnd"/>
     </w:p>
     <w:p>
       <w:pPr>
         <w:pStyle w:val="code"/>
       </w:pPr>
       <w:r>
-        <w:t xml:space="preserve">    output value = </w:t>
-      </w:r>
-      <w:proofErr w:type="spellStart"/>
-      <w:r>
-        <w:t>lower_out</w:t>
-      </w:r>
-      <w:proofErr w:type="spellEnd"/>
+        <w:t xml:space="preserve">    output value = lower_out</w:t>
+      </w:r>
     </w:p>
     <w:p>
       <w:pPr>
@@ -21711,7 +19801,6 @@
       <w:r>
         <w:t xml:space="preserve">  else if input value &gt;= </w:t>
       </w:r>
-      <w:proofErr w:type="spellStart"/>
       <w:r>
         <w:rPr>
           <w:rFonts w:eastAsia="Times New Roman" w:cs="Arial"/>
@@ -21719,20 +19808,14 @@
         </w:rPr>
         <w:t>upper_in</w:t>
       </w:r>
-      <w:proofErr w:type="spellEnd"/>
     </w:p>
     <w:p>
       <w:pPr>
         <w:pStyle w:val="code"/>
       </w:pPr>
       <w:r>
-        <w:t xml:space="preserve">    output value = </w:t>
-      </w:r>
-      <w:proofErr w:type="spellStart"/>
-      <w:r>
-        <w:t>upper_out</w:t>
-      </w:r>
-      <w:proofErr w:type="spellEnd"/>
+        <w:t xml:space="preserve">    output value = upper_out</w:t>
+      </w:r>
     </w:p>
     <w:p>
       <w:pPr>
@@ -21759,17 +19842,8 @@
         </w:rPr>
       </w:pPr>
       <w:r>
-        <w:t xml:space="preserve">      </w:t>
-      </w:r>
-      <w:proofErr w:type="spellStart"/>
-      <w:r>
-        <w:t>lower_out</w:t>
-      </w:r>
-      <w:proofErr w:type="spellEnd"/>
-      <w:r>
-        <w:t xml:space="preserve"> + (input value - </w:t>
-      </w:r>
-      <w:proofErr w:type="spellStart"/>
+        <w:t xml:space="preserve">      lower_out + (input value - </w:t>
+      </w:r>
       <w:r>
         <w:rPr>
           <w:rFonts w:eastAsia="Times New Roman" w:cs="Arial"/>
@@ -21777,19 +19851,9 @@
         </w:rPr>
         <w:t>lower_in</w:t>
       </w:r>
-      <w:proofErr w:type="spellEnd"/>
-      <w:r>
-        <w:t>) * (</w:t>
-      </w:r>
-      <w:proofErr w:type="spellStart"/>
-      <w:r>
-        <w:t>upper_out</w:t>
-      </w:r>
-      <w:proofErr w:type="spellEnd"/>
-      <w:r>
-        <w:t xml:space="preserve"> - </w:t>
-      </w:r>
-      <w:proofErr w:type="spellStart"/>
+      <w:r>
+        <w:t xml:space="preserve">) * (upper_out - </w:t>
+      </w:r>
       <w:r>
         <w:rPr>
           <w:rFonts w:eastAsia="Times New Roman" w:cs="Arial"/>
@@ -21797,19 +19861,9 @@
         </w:rPr>
         <w:t>upper_in</w:t>
       </w:r>
-      <w:proofErr w:type="spellEnd"/>
-      <w:r>
-        <w:t>) / (</w:t>
-      </w:r>
-      <w:proofErr w:type="spellStart"/>
-      <w:r>
-        <w:t>lower_out</w:t>
-      </w:r>
-      <w:proofErr w:type="spellEnd"/>
-      <w:r>
-        <w:t xml:space="preserve"> - </w:t>
-      </w:r>
-      <w:proofErr w:type="spellStart"/>
+      <w:r>
+        <w:t xml:space="preserve">) / (lower_out - </w:t>
+      </w:r>
       <w:r>
         <w:rPr>
           <w:rFonts w:eastAsia="Times New Roman" w:cs="Arial"/>
@@ -21817,7 +19871,6 @@
         </w:rPr>
         <w:t>lower_in</w:t>
       </w:r>
-      <w:proofErr w:type="spellEnd"/>
       <w:r>
         <w:t>)</w:t>
       </w:r>
@@ -21827,39 +19880,7 @@
         <w:pStyle w:val="Normalafterlist"/>
       </w:pPr>
       <w:r>
-        <w:t xml:space="preserve">The operator can threshold images by specifying </w:t>
-      </w:r>
-      <w:proofErr w:type="spellStart"/>
-      <w:r>
-        <w:t>lower_in</w:t>
-      </w:r>
-      <w:proofErr w:type="spellEnd"/>
-      <w:r>
-        <w:t xml:space="preserve"> = </w:t>
-      </w:r>
-      <w:proofErr w:type="spellStart"/>
-      <w:r>
-        <w:t>upper_in</w:t>
-      </w:r>
-      <w:proofErr w:type="spellEnd"/>
-      <w:r>
-        <w:t xml:space="preserve"> = threshold value. </w:t>
-      </w:r>
-      <w:proofErr w:type="spellStart"/>
-      <w:r>
-        <w:t>Lower_out</w:t>
-      </w:r>
-      <w:proofErr w:type="spellEnd"/>
-      <w:r>
-        <w:t xml:space="preserve"> then is the output pixel value for input pixel values &lt; threshold, and </w:t>
-      </w:r>
-      <w:proofErr w:type="spellStart"/>
-      <w:r>
-        <w:t>upper_out</w:t>
-      </w:r>
-      <w:proofErr w:type="spellEnd"/>
-      <w:r>
-        <w:t xml:space="preserve"> is the output pixel value for input pixel values &gt;= threshold. </w:t>
+        <w:t xml:space="preserve">The operator can threshold images by specifying lower_in = upper_in = threshold value. Lower_out then is the output pixel value for input pixel values &lt; threshold, and upper_out is the output pixel value for input pixel values &gt;= threshold. </w:t>
       </w:r>
     </w:p>
     <w:p>
@@ -22099,15 +20120,7 @@
               <w:cnfStyle w:val="000000000000" w:firstRow="0" w:lastRow="0" w:firstColumn="0" w:lastColumn="0" w:oddVBand="0" w:evenVBand="0" w:oddHBand="0" w:evenHBand="0" w:firstRowFirstColumn="0" w:firstRowLastColumn="0" w:lastRowFirstColumn="0" w:lastRowLastColumn="0"/>
             </w:pPr>
             <w:r>
-              <w:t xml:space="preserve">output CV_8U, CV_32S, or CV_32F mapped </w:t>
-            </w:r>
-            <w:proofErr w:type="gramStart"/>
-            <w:r>
-              <w:t>intensity  image</w:t>
-            </w:r>
-            <w:proofErr w:type="gramEnd"/>
-            <w:r>
-              <w:t xml:space="preserve">. </w:t>
+              <w:t xml:space="preserve">output CV_8U, CV_32S, or CV_32F mapped intensity  image. </w:t>
             </w:r>
           </w:p>
         </w:tc>
@@ -22182,7 +20195,6 @@
                 <w:bCs w:val="0"/>
               </w:rPr>
             </w:pPr>
-            <w:proofErr w:type="spellStart"/>
             <w:r>
               <w:rPr>
                 <w:b w:val="0"/>
@@ -22190,7 +20202,6 @@
               </w:rPr>
               <w:t>lower_in</w:t>
             </w:r>
-            <w:proofErr w:type="spellEnd"/>
           </w:p>
         </w:tc>
         <w:tc>
@@ -22221,7 +20232,6 @@
                 <w:bCs w:val="0"/>
               </w:rPr>
             </w:pPr>
-            <w:proofErr w:type="spellStart"/>
             <w:r>
               <w:rPr>
                 <w:b w:val="0"/>
@@ -22229,7 +20239,6 @@
               </w:rPr>
               <w:t>upper_in</w:t>
             </w:r>
-            <w:proofErr w:type="spellEnd"/>
           </w:p>
         </w:tc>
         <w:tc>
@@ -22263,7 +20272,6 @@
                 <w:bCs w:val="0"/>
               </w:rPr>
             </w:pPr>
-            <w:proofErr w:type="spellStart"/>
             <w:r>
               <w:rPr>
                 <w:b w:val="0"/>
@@ -22271,7 +20279,6 @@
               </w:rPr>
               <w:t>lower_out</w:t>
             </w:r>
-            <w:proofErr w:type="spellEnd"/>
           </w:p>
         </w:tc>
         <w:tc>
@@ -22302,7 +20309,6 @@
                 <w:bCs w:val="0"/>
               </w:rPr>
             </w:pPr>
-            <w:proofErr w:type="spellStart"/>
             <w:r>
               <w:rPr>
                 <w:b w:val="0"/>
@@ -22310,7 +20316,6 @@
               </w:rPr>
               <w:t>upper_out</w:t>
             </w:r>
-            <w:proofErr w:type="spellEnd"/>
           </w:p>
         </w:tc>
         <w:tc>
@@ -22334,23 +20339,7 @@
         <w:pStyle w:val="Normalafterlist"/>
       </w:pPr>
       <w:r>
-        <w:t xml:space="preserve">If </w:t>
-      </w:r>
-      <w:proofErr w:type="spellStart"/>
-      <w:r>
-        <w:t>lower_in</w:t>
-      </w:r>
-      <w:proofErr w:type="spellEnd"/>
-      <w:r>
-        <w:t xml:space="preserve"> or </w:t>
-      </w:r>
-      <w:proofErr w:type="spellStart"/>
-      <w:r>
-        <w:t>lower_out</w:t>
-      </w:r>
-      <w:proofErr w:type="spellEnd"/>
-      <w:r>
-        <w:t xml:space="preserve"> are omitted, they default to the lowest input image pixel value or highest input image pixel value.</w:t>
+        <w:t>If lower_in or lower_out are omitted, they default to the lowest input image pixel value or highest input image pixel value.</w:t>
       </w:r>
     </w:p>
     <w:p>
@@ -22716,7 +20705,7 @@
       <w:rPr>
         <w:noProof/>
       </w:rPr>
-      <w:t>7/29/2022 7:51 PM</w:t>
+      <w:t>7/30/2022 10:30 AM</w:t>
     </w:r>
     <w:r>
       <w:fldChar w:fldCharType="end"/>
@@ -22788,7 +20777,7 @@
           <w:rPr>
             <w:noProof/>
           </w:rPr>
-          <w:t>7/29/2022 7:51 PM</w:t>
+          <w:t>7/30/2022 10:30 AM</w:t>
         </w:r>
         <w:r>
           <w:fldChar w:fldCharType="end"/>
@@ -26694,7 +24683,6 @@
   <w:style w:type="paragraph" w:default="1" w:styleId="Normal">
     <w:name w:val="Normal"/>
     <w:qFormat/>
-    <w:rsid w:val="00854395"/>
     <w:rPr>
       <w:rFonts w:ascii="Arial" w:hAnsi="Arial"/>
     </w:rPr>

</xml_diff>

<commit_message>
logging added tests working removed warnings
</commit_message>
<xml_diff>
--- a/doc/cv-workbench.docx
+++ b/doc/cv-workbench.docx
@@ -16105,7 +16105,15 @@
         <w:pStyle w:val="Normalafterlist"/>
       </w:pPr>
       <w:r>
-        <w:t>The parameters to the create image histogram operator are:</w:t>
+        <w:t xml:space="preserve">The parameters to the create </w:t>
+      </w:r>
+      <w:proofErr w:type="spellStart"/>
+      <w:r>
+        <w:t>hough</w:t>
+      </w:r>
+      <w:proofErr w:type="spellEnd"/>
+      <w:r>
+        <w:t xml:space="preserve"> histogram operator are:</w:t>
       </w:r>
     </w:p>
     <w:tbl>
@@ -16275,7 +16283,7 @@
         <w:pStyle w:val="Normalafterlist"/>
       </w:pPr>
       <w:r>
-        <w:t>The experiment log output includes the histogram and image statistics:</w:t>
+        <w:t>The experiment log output includes the histogram and Hough accumulator statistics:</w:t>
       </w:r>
     </w:p>
     <w:tbl>
@@ -16285,8 +16293,8 @@
         <w:tblLook w:val="04A0" w:firstRow="1" w:lastRow="0" w:firstColumn="1" w:lastColumn="0" w:noHBand="0" w:noVBand="1"/>
       </w:tblPr>
       <w:tblGrid>
-        <w:gridCol w:w="2108"/>
-        <w:gridCol w:w="7242"/>
+        <w:gridCol w:w="3274"/>
+        <w:gridCol w:w="5890"/>
       </w:tblGrid>
       <w:tr>
         <w:trPr>
@@ -16340,13 +16348,15 @@
                 <w:bCs w:val="0"/>
               </w:rPr>
             </w:pPr>
-            <w:r>
-              <w:rPr>
-                <w:b w:val="0"/>
-                <w:bCs w:val="0"/>
-              </w:rPr>
-              <w:t>rows</w:t>
-            </w:r>
+            <w:proofErr w:type="spellStart"/>
+            <w:r>
+              <w:rPr>
+                <w:b w:val="0"/>
+                <w:bCs w:val="0"/>
+              </w:rPr>
+              <w:t>lower_value</w:t>
+            </w:r>
+            <w:proofErr w:type="spellEnd"/>
           </w:p>
         </w:tc>
         <w:tc>
@@ -16359,32 +16369,34 @@
               <w:cnfStyle w:val="000000100000" w:firstRow="0" w:lastRow="0" w:firstColumn="0" w:lastColumn="0" w:oddVBand="0" w:evenVBand="0" w:oddHBand="1" w:evenHBand="0" w:firstRowFirstColumn="0" w:firstRowLastColumn="0" w:lastRowFirstColumn="0" w:lastRowLastColumn="0"/>
             </w:pPr>
             <w:r>
-              <w:t>The number of image rows</w:t>
-            </w:r>
-          </w:p>
-        </w:tc>
-      </w:tr>
-      <w:tr>
-        <w:tc>
-          <w:tcPr>
-            <w:cnfStyle w:val="001000000000" w:firstRow="0" w:lastRow="0" w:firstColumn="1" w:lastColumn="0" w:oddVBand="0" w:evenVBand="0" w:oddHBand="0" w:evenHBand="0" w:firstRowFirstColumn="0" w:firstRowLastColumn="0" w:lastRowFirstColumn="0" w:lastRowLastColumn="0"/>
-            <w:tcW w:w="0" w:type="auto"/>
-          </w:tcPr>
-          <w:p>
-            <w:pPr>
-              <w:pStyle w:val="NoSpacing"/>
-              <w:rPr>
-                <w:b w:val="0"/>
-                <w:bCs w:val="0"/>
-              </w:rPr>
-            </w:pPr>
-            <w:r>
-              <w:rPr>
-                <w:b w:val="0"/>
-                <w:bCs w:val="0"/>
-              </w:rPr>
-              <w:t>cols</w:t>
-            </w:r>
+              <w:t>The minimum value accumulated in the first histogram bin</w:t>
+            </w:r>
+          </w:p>
+        </w:tc>
+      </w:tr>
+      <w:tr>
+        <w:tc>
+          <w:tcPr>
+            <w:cnfStyle w:val="001000000000" w:firstRow="0" w:lastRow="0" w:firstColumn="1" w:lastColumn="0" w:oddVBand="0" w:evenVBand="0" w:oddHBand="0" w:evenHBand="0" w:firstRowFirstColumn="0" w:firstRowLastColumn="0" w:lastRowFirstColumn="0" w:lastRowLastColumn="0"/>
+            <w:tcW w:w="0" w:type="auto"/>
+          </w:tcPr>
+          <w:p>
+            <w:pPr>
+              <w:pStyle w:val="NoSpacing"/>
+              <w:rPr>
+                <w:b w:val="0"/>
+                <w:bCs w:val="0"/>
+              </w:rPr>
+            </w:pPr>
+            <w:proofErr w:type="spellStart"/>
+            <w:r>
+              <w:rPr>
+                <w:b w:val="0"/>
+                <w:bCs w:val="0"/>
+              </w:rPr>
+              <w:t>upper_value</w:t>
+            </w:r>
+            <w:proofErr w:type="spellEnd"/>
           </w:p>
         </w:tc>
         <w:tc>
@@ -16397,7 +16409,7 @@
               <w:cnfStyle w:val="000000000000" w:firstRow="0" w:lastRow="0" w:firstColumn="0" w:lastColumn="0" w:oddVBand="0" w:evenVBand="0" w:oddHBand="0" w:evenHBand="0" w:firstRowFirstColumn="0" w:firstRowLastColumn="0" w:lastRowFirstColumn="0" w:lastRowLastColumn="0"/>
             </w:pPr>
             <w:r>
-              <w:t>The number of image columns</w:t>
+              <w:t>The maximum value accumulated in the last histogram bin</w:t>
             </w:r>
           </w:p>
         </w:tc>
@@ -16424,7 +16436,14 @@
                 <w:b w:val="0"/>
                 <w:bCs w:val="0"/>
               </w:rPr>
-              <w:t>components</w:t>
+              <w:t xml:space="preserve">accumulator </w:t>
+            </w:r>
+            <w:r>
+              <w:rPr>
+                <w:b w:val="0"/>
+                <w:bCs w:val="0"/>
+              </w:rPr>
+              <w:t>count</w:t>
             </w:r>
           </w:p>
         </w:tc>
@@ -16438,31 +16457,44 @@
               <w:cnfStyle w:val="000000100000" w:firstRow="0" w:lastRow="0" w:firstColumn="0" w:lastColumn="0" w:oddVBand="0" w:evenVBand="0" w:oddHBand="1" w:evenHBand="0" w:firstRowFirstColumn="0" w:firstRowLastColumn="0" w:lastRowFirstColumn="0" w:lastRowLastColumn="0"/>
             </w:pPr>
             <w:r>
-              <w:t>The number of image components. Grayscale images have 1 component, color images have 3 components.</w:t>
-            </w:r>
-          </w:p>
-        </w:tc>
-      </w:tr>
-      <w:tr>
-        <w:tc>
-          <w:tcPr>
-            <w:cnfStyle w:val="001000000000" w:firstRow="0" w:lastRow="0" w:firstColumn="1" w:lastColumn="0" w:oddVBand="0" w:evenVBand="0" w:oddHBand="0" w:evenHBand="0" w:firstRowFirstColumn="0" w:firstRowLastColumn="0" w:lastRowFirstColumn="0" w:lastRowLastColumn="0"/>
-            <w:tcW w:w="0" w:type="auto"/>
-          </w:tcPr>
-          <w:p>
-            <w:pPr>
-              <w:pStyle w:val="NoSpacing"/>
-              <w:rPr>
-                <w:b w:val="0"/>
-                <w:bCs w:val="0"/>
-              </w:rPr>
-            </w:pPr>
-            <w:r>
-              <w:rPr>
-                <w:b w:val="0"/>
-                <w:bCs w:val="0"/>
-              </w:rPr>
-              <w:t>depth</w:t>
+              <w:t xml:space="preserve">accumulator </w:t>
+            </w:r>
+            <w:proofErr w:type="spellStart"/>
+            <w:r>
+              <w:t>nrhos</w:t>
+            </w:r>
+            <w:proofErr w:type="spellEnd"/>
+            <w:r>
+              <w:t xml:space="preserve"> * </w:t>
+            </w:r>
+            <w:proofErr w:type="spellStart"/>
+            <w:r>
+              <w:t>nthetas</w:t>
+            </w:r>
+            <w:proofErr w:type="spellEnd"/>
+          </w:p>
+        </w:tc>
+      </w:tr>
+      <w:tr>
+        <w:tc>
+          <w:tcPr>
+            <w:cnfStyle w:val="001000000000" w:firstRow="0" w:lastRow="0" w:firstColumn="1" w:lastColumn="0" w:oddVBand="0" w:evenVBand="0" w:oddHBand="0" w:evenHBand="0" w:firstRowFirstColumn="0" w:firstRowLastColumn="0" w:lastRowFirstColumn="0" w:lastRowLastColumn="0"/>
+            <w:tcW w:w="0" w:type="auto"/>
+          </w:tcPr>
+          <w:p>
+            <w:pPr>
+              <w:pStyle w:val="NoSpacing"/>
+              <w:rPr>
+                <w:b w:val="0"/>
+                <w:bCs w:val="0"/>
+              </w:rPr>
+            </w:pPr>
+            <w:r>
+              <w:rPr>
+                <w:b w:val="0"/>
+                <w:bCs w:val="0"/>
+              </w:rPr>
+              <w:t>accumulator mean</w:t>
             </w:r>
           </w:p>
         </w:tc>
@@ -16476,68 +16508,8 @@
               <w:cnfStyle w:val="000000000000" w:firstRow="0" w:lastRow="0" w:firstColumn="0" w:lastColumn="0" w:oddVBand="0" w:evenVBand="0" w:oddHBand="0" w:evenHBand="0" w:firstRowFirstColumn="0" w:firstRowLastColumn="0" w:lastRowFirstColumn="0" w:lastRowLastColumn="0"/>
             </w:pPr>
             <w:r>
-              <w:t>Pixel value data type.</w:t>
-            </w:r>
-          </w:p>
-          <w:p>
-            <w:pPr>
-              <w:pStyle w:val="tablebullet"/>
-              <w:cnfStyle w:val="000000000000" w:firstRow="0" w:lastRow="0" w:firstColumn="0" w:lastColumn="0" w:oddVBand="0" w:evenVBand="0" w:oddHBand="0" w:evenHBand="0" w:firstRowFirstColumn="0" w:firstRowLastColumn="0" w:lastRowFirstColumn="0" w:lastRowLastColumn="0"/>
-              <w:rPr>
-                <w:sz w:val="20"/>
-                <w:szCs w:val="20"/>
-              </w:rPr>
-            </w:pPr>
-            <w:proofErr w:type="spellStart"/>
-            <w:r>
-              <w:rPr>
-                <w:sz w:val="20"/>
-                <w:szCs w:val="20"/>
-              </w:rPr>
-              <w:t>CV_8U</w:t>
-            </w:r>
-            <w:proofErr w:type="spellEnd"/>
-            <w:r>
-              <w:rPr>
-                <w:sz w:val="20"/>
-                <w:szCs w:val="20"/>
-              </w:rPr>
-              <w:t xml:space="preserve"> </w:t>
-            </w:r>
-          </w:p>
-          <w:p>
-            <w:pPr>
-              <w:pStyle w:val="tablebullet"/>
-              <w:cnfStyle w:val="000000000000" w:firstRow="0" w:lastRow="0" w:firstColumn="0" w:lastColumn="0" w:oddVBand="0" w:evenVBand="0" w:oddHBand="0" w:evenHBand="0" w:firstRowFirstColumn="0" w:firstRowLastColumn="0" w:lastRowFirstColumn="0" w:lastRowLastColumn="0"/>
-              <w:rPr>
-                <w:sz w:val="20"/>
-                <w:szCs w:val="20"/>
-              </w:rPr>
-            </w:pPr>
-            <w:proofErr w:type="spellStart"/>
-            <w:r>
-              <w:rPr>
-                <w:sz w:val="20"/>
-                <w:szCs w:val="20"/>
-              </w:rPr>
-              <w:t>CV_32S</w:t>
-            </w:r>
-            <w:proofErr w:type="spellEnd"/>
-          </w:p>
-          <w:p>
-            <w:pPr>
-              <w:pStyle w:val="tablebullet"/>
-              <w:cnfStyle w:val="000000000000" w:firstRow="0" w:lastRow="0" w:firstColumn="0" w:lastColumn="0" w:oddVBand="0" w:evenVBand="0" w:oddHBand="0" w:evenHBand="0" w:firstRowFirstColumn="0" w:firstRowLastColumn="0" w:lastRowFirstColumn="0" w:lastRowLastColumn="0"/>
-            </w:pPr>
-            <w:proofErr w:type="spellStart"/>
-            <w:r>
-              <w:rPr>
-                <w:sz w:val="20"/>
-                <w:szCs w:val="20"/>
-              </w:rPr>
-              <w:t>CV_32F</w:t>
-            </w:r>
-            <w:proofErr w:type="spellEnd"/>
+              <w:t xml:space="preserve">accumulator value mean </w:t>
+            </w:r>
           </w:p>
         </w:tc>
       </w:tr>
@@ -16563,7 +16535,7 @@
                 <w:b w:val="0"/>
                 <w:bCs w:val="0"/>
               </w:rPr>
-              <w:t>pixel count</w:t>
+              <w:t>accumulator standard deviation</w:t>
             </w:r>
           </w:p>
         </w:tc>
@@ -16577,31 +16549,31 @@
               <w:cnfStyle w:val="000000100000" w:firstRow="0" w:lastRow="0" w:firstColumn="0" w:lastColumn="0" w:oddVBand="0" w:evenVBand="0" w:oddHBand="1" w:evenHBand="0" w:firstRowFirstColumn="0" w:firstRowLastColumn="0" w:lastRowFirstColumn="0" w:lastRowLastColumn="0"/>
             </w:pPr>
             <w:r>
-              <w:t>image rows * cols * components</w:t>
-            </w:r>
-          </w:p>
-        </w:tc>
-      </w:tr>
-      <w:tr>
-        <w:tc>
-          <w:tcPr>
-            <w:cnfStyle w:val="001000000000" w:firstRow="0" w:lastRow="0" w:firstColumn="1" w:lastColumn="0" w:oddVBand="0" w:evenVBand="0" w:oddHBand="0" w:evenHBand="0" w:firstRowFirstColumn="0" w:firstRowLastColumn="0" w:lastRowFirstColumn="0" w:lastRowLastColumn="0"/>
-            <w:tcW w:w="0" w:type="auto"/>
-          </w:tcPr>
-          <w:p>
-            <w:pPr>
-              <w:pStyle w:val="NoSpacing"/>
-              <w:rPr>
-                <w:b w:val="0"/>
-                <w:bCs w:val="0"/>
-              </w:rPr>
-            </w:pPr>
-            <w:r>
-              <w:rPr>
-                <w:b w:val="0"/>
-                <w:bCs w:val="0"/>
-              </w:rPr>
-              <w:t>pixel mean</w:t>
+              <w:t>accumulator value standard deviation</w:t>
+            </w:r>
+          </w:p>
+        </w:tc>
+      </w:tr>
+      <w:tr>
+        <w:tc>
+          <w:tcPr>
+            <w:cnfStyle w:val="001000000000" w:firstRow="0" w:lastRow="0" w:firstColumn="1" w:lastColumn="0" w:oddVBand="0" w:evenVBand="0" w:oddHBand="0" w:evenHBand="0" w:firstRowFirstColumn="0" w:firstRowLastColumn="0" w:lastRowFirstColumn="0" w:lastRowLastColumn="0"/>
+            <w:tcW w:w="0" w:type="auto"/>
+          </w:tcPr>
+          <w:p>
+            <w:pPr>
+              <w:pStyle w:val="NoSpacing"/>
+              <w:rPr>
+                <w:b w:val="0"/>
+                <w:bCs w:val="0"/>
+              </w:rPr>
+            </w:pPr>
+            <w:r>
+              <w:rPr>
+                <w:b w:val="0"/>
+                <w:bCs w:val="0"/>
+              </w:rPr>
+              <w:t>min accumulator value</w:t>
             </w:r>
           </w:p>
         </w:tc>
@@ -16615,7 +16587,7 @@
               <w:cnfStyle w:val="000000000000" w:firstRow="0" w:lastRow="0" w:firstColumn="0" w:lastColumn="0" w:oddVBand="0" w:evenVBand="0" w:oddHBand="0" w:evenHBand="0" w:firstRowFirstColumn="0" w:firstRowLastColumn="0" w:lastRowFirstColumn="0" w:lastRowLastColumn="0"/>
             </w:pPr>
             <w:r>
-              <w:t xml:space="preserve">pixel value mean </w:t>
+              <w:t>minimum accumulator value</w:t>
             </w:r>
           </w:p>
         </w:tc>
@@ -16642,7 +16614,7 @@
                 <w:b w:val="0"/>
                 <w:bCs w:val="0"/>
               </w:rPr>
-              <w:t>pixel standard deviation</w:t>
+              <w:t>max accumulator value</w:t>
             </w:r>
           </w:p>
         </w:tc>
@@ -16656,86 +16628,7 @@
               <w:cnfStyle w:val="000000100000" w:firstRow="0" w:lastRow="0" w:firstColumn="0" w:lastColumn="0" w:oddVBand="0" w:evenVBand="0" w:oddHBand="1" w:evenHBand="0" w:firstRowFirstColumn="0" w:firstRowLastColumn="0" w:lastRowFirstColumn="0" w:lastRowLastColumn="0"/>
             </w:pPr>
             <w:r>
-              <w:t>pixel value standard deviation</w:t>
-            </w:r>
-          </w:p>
-        </w:tc>
-      </w:tr>
-      <w:tr>
-        <w:tc>
-          <w:tcPr>
-            <w:cnfStyle w:val="001000000000" w:firstRow="0" w:lastRow="0" w:firstColumn="1" w:lastColumn="0" w:oddVBand="0" w:evenVBand="0" w:oddHBand="0" w:evenHBand="0" w:firstRowFirstColumn="0" w:firstRowLastColumn="0" w:lastRowFirstColumn="0" w:lastRowLastColumn="0"/>
-            <w:tcW w:w="0" w:type="auto"/>
-          </w:tcPr>
-          <w:p>
-            <w:pPr>
-              <w:pStyle w:val="NoSpacing"/>
-              <w:rPr>
-                <w:b w:val="0"/>
-                <w:bCs w:val="0"/>
-              </w:rPr>
-            </w:pPr>
-            <w:r>
-              <w:rPr>
-                <w:b w:val="0"/>
-                <w:bCs w:val="0"/>
-              </w:rPr>
-              <w:t>min pixel value</w:t>
-            </w:r>
-          </w:p>
-        </w:tc>
-        <w:tc>
-          <w:tcPr>
-            <w:tcW w:w="0" w:type="auto"/>
-          </w:tcPr>
-          <w:p>
-            <w:pPr>
-              <w:pStyle w:val="NoSpacing"/>
-              <w:cnfStyle w:val="000000000000" w:firstRow="0" w:lastRow="0" w:firstColumn="0" w:lastColumn="0" w:oddVBand="0" w:evenVBand="0" w:oddHBand="0" w:evenHBand="0" w:firstRowFirstColumn="0" w:firstRowLastColumn="0" w:lastRowFirstColumn="0" w:lastRowLastColumn="0"/>
-            </w:pPr>
-            <w:r>
-              <w:t>minimum pixel value</w:t>
-            </w:r>
-          </w:p>
-        </w:tc>
-      </w:tr>
-      <w:tr>
-        <w:trPr>
-          <w:cnfStyle w:val="000000100000" w:firstRow="0" w:lastRow="0" w:firstColumn="0" w:lastColumn="0" w:oddVBand="0" w:evenVBand="0" w:oddHBand="1" w:evenHBand="0" w:firstRowFirstColumn="0" w:firstRowLastColumn="0" w:lastRowFirstColumn="0" w:lastRowLastColumn="0"/>
-        </w:trPr>
-        <w:tc>
-          <w:tcPr>
-            <w:cnfStyle w:val="001000000000" w:firstRow="0" w:lastRow="0" w:firstColumn="1" w:lastColumn="0" w:oddVBand="0" w:evenVBand="0" w:oddHBand="0" w:evenHBand="0" w:firstRowFirstColumn="0" w:firstRowLastColumn="0" w:lastRowFirstColumn="0" w:lastRowLastColumn="0"/>
-            <w:tcW w:w="0" w:type="auto"/>
-          </w:tcPr>
-          <w:p>
-            <w:pPr>
-              <w:pStyle w:val="NoSpacing"/>
-              <w:rPr>
-                <w:b w:val="0"/>
-                <w:bCs w:val="0"/>
-              </w:rPr>
-            </w:pPr>
-            <w:r>
-              <w:rPr>
-                <w:b w:val="0"/>
-                <w:bCs w:val="0"/>
-              </w:rPr>
-              <w:t>max pixel value</w:t>
-            </w:r>
-          </w:p>
-        </w:tc>
-        <w:tc>
-          <w:tcPr>
-            <w:tcW w:w="0" w:type="auto"/>
-          </w:tcPr>
-          <w:p>
-            <w:pPr>
-              <w:pStyle w:val="NoSpacing"/>
-              <w:cnfStyle w:val="000000100000" w:firstRow="0" w:lastRow="0" w:firstColumn="0" w:lastColumn="0" w:oddVBand="0" w:evenVBand="0" w:oddHBand="1" w:evenHBand="0" w:firstRowFirstColumn="0" w:firstRowLastColumn="0" w:lastRowFirstColumn="0" w:lastRowLastColumn="0"/>
-            </w:pPr>
-            <w:r>
-              <w:t>maximum pixel value</w:t>
+              <w:t>maximum accumulator value</w:t>
             </w:r>
           </w:p>
         </w:tc>
@@ -17139,7 +17032,23 @@
         <w:pStyle w:val="Normalafterlist"/>
       </w:pPr>
       <w:r>
-        <w:t>The parameters to the create image histogram operator are:</w:t>
+        <w:t xml:space="preserve">The parameters to the create image histogram operator are. The </w:t>
+      </w:r>
+      <w:proofErr w:type="spellStart"/>
+      <w:r>
+        <w:t>lower_value</w:t>
+      </w:r>
+      <w:proofErr w:type="spellEnd"/>
+      <w:r>
+        <w:t xml:space="preserve"> and </w:t>
+      </w:r>
+      <w:proofErr w:type="spellStart"/>
+      <w:r>
+        <w:t>upper_value</w:t>
+      </w:r>
+      <w:proofErr w:type="spellEnd"/>
+      <w:r>
+        <w:t xml:space="preserve"> parameters may be omitted and default to the image minimum and maximum values.</w:t>
       </w:r>
     </w:p>
     <w:tbl>
@@ -17308,7 +17217,7 @@
         <w:pStyle w:val="Normalafterlist"/>
       </w:pPr>
       <w:r>
-        <w:t>The experiment log output includes the histogram and image statistics:</w:t>
+        <w:t>The experiment log output includes the histogram and image statistics.</w:t>
       </w:r>
     </w:p>
     <w:tbl>
@@ -17318,8 +17227,8 @@
         <w:tblLook w:val="04A0" w:firstRow="1" w:lastRow="0" w:firstColumn="1" w:lastColumn="0" w:noHBand="0" w:noVBand="1"/>
       </w:tblPr>
       <w:tblGrid>
-        <w:gridCol w:w="2108"/>
-        <w:gridCol w:w="7242"/>
+        <w:gridCol w:w="2528"/>
+        <w:gridCol w:w="5890"/>
       </w:tblGrid>
       <w:tr>
         <w:trPr>
@@ -17337,7 +17246,6 @@
               <w:pStyle w:val="NoSpacing"/>
             </w:pPr>
             <w:r>
-              <w:lastRenderedPageBreak/>
               <w:t>Field</w:t>
             </w:r>
           </w:p>
@@ -17374,13 +17282,15 @@
                 <w:bCs w:val="0"/>
               </w:rPr>
             </w:pPr>
-            <w:r>
-              <w:rPr>
-                <w:b w:val="0"/>
-                <w:bCs w:val="0"/>
-              </w:rPr>
-              <w:t>rows</w:t>
-            </w:r>
+            <w:proofErr w:type="spellStart"/>
+            <w:r>
+              <w:rPr>
+                <w:b w:val="0"/>
+                <w:bCs w:val="0"/>
+              </w:rPr>
+              <w:t>lower_value</w:t>
+            </w:r>
+            <w:proofErr w:type="spellEnd"/>
           </w:p>
         </w:tc>
         <w:tc>
@@ -17393,32 +17303,34 @@
               <w:cnfStyle w:val="000000100000" w:firstRow="0" w:lastRow="0" w:firstColumn="0" w:lastColumn="0" w:oddVBand="0" w:evenVBand="0" w:oddHBand="1" w:evenHBand="0" w:firstRowFirstColumn="0" w:firstRowLastColumn="0" w:lastRowFirstColumn="0" w:lastRowLastColumn="0"/>
             </w:pPr>
             <w:r>
-              <w:t>The number of image rows</w:t>
-            </w:r>
-          </w:p>
-        </w:tc>
-      </w:tr>
-      <w:tr>
-        <w:tc>
-          <w:tcPr>
-            <w:cnfStyle w:val="001000000000" w:firstRow="0" w:lastRow="0" w:firstColumn="1" w:lastColumn="0" w:oddVBand="0" w:evenVBand="0" w:oddHBand="0" w:evenHBand="0" w:firstRowFirstColumn="0" w:firstRowLastColumn="0" w:lastRowFirstColumn="0" w:lastRowLastColumn="0"/>
-            <w:tcW w:w="0" w:type="auto"/>
-          </w:tcPr>
-          <w:p>
-            <w:pPr>
-              <w:pStyle w:val="NoSpacing"/>
-              <w:rPr>
-                <w:b w:val="0"/>
-                <w:bCs w:val="0"/>
-              </w:rPr>
-            </w:pPr>
-            <w:r>
-              <w:rPr>
-                <w:b w:val="0"/>
-                <w:bCs w:val="0"/>
-              </w:rPr>
-              <w:t>cols</w:t>
-            </w:r>
+              <w:t>The minimum value accumulated in the first histogram bin</w:t>
+            </w:r>
+          </w:p>
+        </w:tc>
+      </w:tr>
+      <w:tr>
+        <w:tc>
+          <w:tcPr>
+            <w:cnfStyle w:val="001000000000" w:firstRow="0" w:lastRow="0" w:firstColumn="1" w:lastColumn="0" w:oddVBand="0" w:evenVBand="0" w:oddHBand="0" w:evenHBand="0" w:firstRowFirstColumn="0" w:firstRowLastColumn="0" w:lastRowFirstColumn="0" w:lastRowLastColumn="0"/>
+            <w:tcW w:w="0" w:type="auto"/>
+          </w:tcPr>
+          <w:p>
+            <w:pPr>
+              <w:pStyle w:val="NoSpacing"/>
+              <w:rPr>
+                <w:b w:val="0"/>
+                <w:bCs w:val="0"/>
+              </w:rPr>
+            </w:pPr>
+            <w:proofErr w:type="spellStart"/>
+            <w:r>
+              <w:rPr>
+                <w:b w:val="0"/>
+                <w:bCs w:val="0"/>
+              </w:rPr>
+              <w:t>upper_value</w:t>
+            </w:r>
+            <w:proofErr w:type="spellEnd"/>
           </w:p>
         </w:tc>
         <w:tc>
@@ -17431,7 +17343,7 @@
               <w:cnfStyle w:val="000000000000" w:firstRow="0" w:lastRow="0" w:firstColumn="0" w:lastColumn="0" w:oddVBand="0" w:evenVBand="0" w:oddHBand="0" w:evenHBand="0" w:firstRowFirstColumn="0" w:firstRowLastColumn="0" w:lastRowFirstColumn="0" w:lastRowLastColumn="0"/>
             </w:pPr>
             <w:r>
-              <w:t>The number of image columns</w:t>
+              <w:t>The maximum value accumulated in the last histogram bin</w:t>
             </w:r>
           </w:p>
         </w:tc>
@@ -17458,7 +17370,7 @@
                 <w:b w:val="0"/>
                 <w:bCs w:val="0"/>
               </w:rPr>
-              <w:t>components</w:t>
+              <w:t>pixel count</w:t>
             </w:r>
           </w:p>
         </w:tc>
@@ -17472,34 +17384,31 @@
               <w:cnfStyle w:val="000000100000" w:firstRow="0" w:lastRow="0" w:firstColumn="0" w:lastColumn="0" w:oddVBand="0" w:evenVBand="0" w:oddHBand="1" w:evenHBand="0" w:firstRowFirstColumn="0" w:firstRowLastColumn="0" w:lastRowFirstColumn="0" w:lastRowLastColumn="0"/>
             </w:pPr>
             <w:r>
-              <w:t>The number of image components. Grayscale images have 1 component, color images have 3 components.</w:t>
-            </w:r>
-          </w:p>
-        </w:tc>
-      </w:tr>
-      <w:tr>
-        <w:trPr>
-          <w:cantSplit/>
-        </w:trPr>
-        <w:tc>
-          <w:tcPr>
-            <w:cnfStyle w:val="001000000000" w:firstRow="0" w:lastRow="0" w:firstColumn="1" w:lastColumn="0" w:oddVBand="0" w:evenVBand="0" w:oddHBand="0" w:evenHBand="0" w:firstRowFirstColumn="0" w:firstRowLastColumn="0" w:lastRowFirstColumn="0" w:lastRowLastColumn="0"/>
-            <w:tcW w:w="0" w:type="auto"/>
-          </w:tcPr>
-          <w:p>
-            <w:pPr>
-              <w:pStyle w:val="NoSpacing"/>
-              <w:rPr>
-                <w:b w:val="0"/>
-                <w:bCs w:val="0"/>
-              </w:rPr>
-            </w:pPr>
-            <w:r>
-              <w:rPr>
-                <w:b w:val="0"/>
-                <w:bCs w:val="0"/>
-              </w:rPr>
-              <w:t>depth</w:t>
+              <w:t>image rows * cols * components</w:t>
+            </w:r>
+          </w:p>
+        </w:tc>
+      </w:tr>
+      <w:tr>
+        <w:tc>
+          <w:tcPr>
+            <w:cnfStyle w:val="001000000000" w:firstRow="0" w:lastRow="0" w:firstColumn="1" w:lastColumn="0" w:oddVBand="0" w:evenVBand="0" w:oddHBand="0" w:evenHBand="0" w:firstRowFirstColumn="0" w:firstRowLastColumn="0" w:lastRowFirstColumn="0" w:lastRowLastColumn="0"/>
+            <w:tcW w:w="0" w:type="auto"/>
+          </w:tcPr>
+          <w:p>
+            <w:pPr>
+              <w:pStyle w:val="NoSpacing"/>
+              <w:rPr>
+                <w:b w:val="0"/>
+                <w:bCs w:val="0"/>
+              </w:rPr>
+            </w:pPr>
+            <w:r>
+              <w:rPr>
+                <w:b w:val="0"/>
+                <w:bCs w:val="0"/>
+              </w:rPr>
+              <w:t>pixel mean</w:t>
             </w:r>
           </w:p>
         </w:tc>
@@ -17513,68 +17422,8 @@
               <w:cnfStyle w:val="000000000000" w:firstRow="0" w:lastRow="0" w:firstColumn="0" w:lastColumn="0" w:oddVBand="0" w:evenVBand="0" w:oddHBand="0" w:evenHBand="0" w:firstRowFirstColumn="0" w:firstRowLastColumn="0" w:lastRowFirstColumn="0" w:lastRowLastColumn="0"/>
             </w:pPr>
             <w:r>
-              <w:t>Pixel value data type.</w:t>
-            </w:r>
-          </w:p>
-          <w:p>
-            <w:pPr>
-              <w:pStyle w:val="tablebullet"/>
-              <w:cnfStyle w:val="000000000000" w:firstRow="0" w:lastRow="0" w:firstColumn="0" w:lastColumn="0" w:oddVBand="0" w:evenVBand="0" w:oddHBand="0" w:evenHBand="0" w:firstRowFirstColumn="0" w:firstRowLastColumn="0" w:lastRowFirstColumn="0" w:lastRowLastColumn="0"/>
-              <w:rPr>
-                <w:sz w:val="20"/>
-                <w:szCs w:val="20"/>
-              </w:rPr>
-            </w:pPr>
-            <w:proofErr w:type="spellStart"/>
-            <w:r>
-              <w:rPr>
-                <w:sz w:val="20"/>
-                <w:szCs w:val="20"/>
-              </w:rPr>
-              <w:t>CV_8U</w:t>
-            </w:r>
-            <w:proofErr w:type="spellEnd"/>
-            <w:r>
-              <w:rPr>
-                <w:sz w:val="20"/>
-                <w:szCs w:val="20"/>
-              </w:rPr>
-              <w:t xml:space="preserve"> </w:t>
-            </w:r>
-          </w:p>
-          <w:p>
-            <w:pPr>
-              <w:pStyle w:val="tablebullet"/>
-              <w:cnfStyle w:val="000000000000" w:firstRow="0" w:lastRow="0" w:firstColumn="0" w:lastColumn="0" w:oddVBand="0" w:evenVBand="0" w:oddHBand="0" w:evenHBand="0" w:firstRowFirstColumn="0" w:firstRowLastColumn="0" w:lastRowFirstColumn="0" w:lastRowLastColumn="0"/>
-              <w:rPr>
-                <w:sz w:val="20"/>
-                <w:szCs w:val="20"/>
-              </w:rPr>
-            </w:pPr>
-            <w:proofErr w:type="spellStart"/>
-            <w:r>
-              <w:rPr>
-                <w:sz w:val="20"/>
-                <w:szCs w:val="20"/>
-              </w:rPr>
-              <w:t>CV_32S</w:t>
-            </w:r>
-            <w:proofErr w:type="spellEnd"/>
-          </w:p>
-          <w:p>
-            <w:pPr>
-              <w:pStyle w:val="tablebullet"/>
-              <w:cnfStyle w:val="000000000000" w:firstRow="0" w:lastRow="0" w:firstColumn="0" w:lastColumn="0" w:oddVBand="0" w:evenVBand="0" w:oddHBand="0" w:evenHBand="0" w:firstRowFirstColumn="0" w:firstRowLastColumn="0" w:lastRowFirstColumn="0" w:lastRowLastColumn="0"/>
-            </w:pPr>
-            <w:proofErr w:type="spellStart"/>
-            <w:r>
-              <w:rPr>
-                <w:sz w:val="20"/>
-                <w:szCs w:val="20"/>
-              </w:rPr>
-              <w:t>CV_32F</w:t>
-            </w:r>
-            <w:proofErr w:type="spellEnd"/>
+              <w:t xml:space="preserve">pixel value mean </w:t>
+            </w:r>
           </w:p>
         </w:tc>
       </w:tr>
@@ -17600,7 +17449,7 @@
                 <w:b w:val="0"/>
                 <w:bCs w:val="0"/>
               </w:rPr>
-              <w:t>pixel count</w:t>
+              <w:t>pixel standard deviation</w:t>
             </w:r>
           </w:p>
         </w:tc>
@@ -17614,85 +17463,6 @@
               <w:cnfStyle w:val="000000100000" w:firstRow="0" w:lastRow="0" w:firstColumn="0" w:lastColumn="0" w:oddVBand="0" w:evenVBand="0" w:oddHBand="1" w:evenHBand="0" w:firstRowFirstColumn="0" w:firstRowLastColumn="0" w:lastRowFirstColumn="0" w:lastRowLastColumn="0"/>
             </w:pPr>
             <w:r>
-              <w:t>image rows * cols * components</w:t>
-            </w:r>
-          </w:p>
-        </w:tc>
-      </w:tr>
-      <w:tr>
-        <w:tc>
-          <w:tcPr>
-            <w:cnfStyle w:val="001000000000" w:firstRow="0" w:lastRow="0" w:firstColumn="1" w:lastColumn="0" w:oddVBand="0" w:evenVBand="0" w:oddHBand="0" w:evenHBand="0" w:firstRowFirstColumn="0" w:firstRowLastColumn="0" w:lastRowFirstColumn="0" w:lastRowLastColumn="0"/>
-            <w:tcW w:w="0" w:type="auto"/>
-          </w:tcPr>
-          <w:p>
-            <w:pPr>
-              <w:pStyle w:val="NoSpacing"/>
-              <w:rPr>
-                <w:b w:val="0"/>
-                <w:bCs w:val="0"/>
-              </w:rPr>
-            </w:pPr>
-            <w:r>
-              <w:rPr>
-                <w:b w:val="0"/>
-                <w:bCs w:val="0"/>
-              </w:rPr>
-              <w:t>pixel mean</w:t>
-            </w:r>
-          </w:p>
-        </w:tc>
-        <w:tc>
-          <w:tcPr>
-            <w:tcW w:w="0" w:type="auto"/>
-          </w:tcPr>
-          <w:p>
-            <w:pPr>
-              <w:pStyle w:val="NoSpacing"/>
-              <w:cnfStyle w:val="000000000000" w:firstRow="0" w:lastRow="0" w:firstColumn="0" w:lastColumn="0" w:oddVBand="0" w:evenVBand="0" w:oddHBand="0" w:evenHBand="0" w:firstRowFirstColumn="0" w:firstRowLastColumn="0" w:lastRowFirstColumn="0" w:lastRowLastColumn="0"/>
-            </w:pPr>
-            <w:r>
-              <w:t xml:space="preserve">pixel value mean </w:t>
-            </w:r>
-          </w:p>
-        </w:tc>
-      </w:tr>
-      <w:tr>
-        <w:trPr>
-          <w:cnfStyle w:val="000000100000" w:firstRow="0" w:lastRow="0" w:firstColumn="0" w:lastColumn="0" w:oddVBand="0" w:evenVBand="0" w:oddHBand="1" w:evenHBand="0" w:firstRowFirstColumn="0" w:firstRowLastColumn="0" w:lastRowFirstColumn="0" w:lastRowLastColumn="0"/>
-        </w:trPr>
-        <w:tc>
-          <w:tcPr>
-            <w:cnfStyle w:val="001000000000" w:firstRow="0" w:lastRow="0" w:firstColumn="1" w:lastColumn="0" w:oddVBand="0" w:evenVBand="0" w:oddHBand="0" w:evenHBand="0" w:firstRowFirstColumn="0" w:firstRowLastColumn="0" w:lastRowFirstColumn="0" w:lastRowLastColumn="0"/>
-            <w:tcW w:w="0" w:type="auto"/>
-          </w:tcPr>
-          <w:p>
-            <w:pPr>
-              <w:pStyle w:val="NoSpacing"/>
-              <w:rPr>
-                <w:b w:val="0"/>
-                <w:bCs w:val="0"/>
-              </w:rPr>
-            </w:pPr>
-            <w:r>
-              <w:rPr>
-                <w:b w:val="0"/>
-                <w:bCs w:val="0"/>
-              </w:rPr>
-              <w:t>pixel standard deviation</w:t>
-            </w:r>
-          </w:p>
-        </w:tc>
-        <w:tc>
-          <w:tcPr>
-            <w:tcW w:w="0" w:type="auto"/>
-          </w:tcPr>
-          <w:p>
-            <w:pPr>
-              <w:pStyle w:val="NoSpacing"/>
-              <w:cnfStyle w:val="000000100000" w:firstRow="0" w:lastRow="0" w:firstColumn="0" w:lastColumn="0" w:oddVBand="0" w:evenVBand="0" w:oddHBand="1" w:evenHBand="0" w:firstRowFirstColumn="0" w:firstRowLastColumn="0" w:lastRowFirstColumn="0" w:lastRowLastColumn="0"/>
-            </w:pPr>
-            <w:r>
               <w:t>pixel value standard deviation</w:t>
             </w:r>
           </w:p>
@@ -17717,6 +17487,7 @@
                 <w:b w:val="0"/>
                 <w:bCs w:val="0"/>
               </w:rPr>
+              <w:lastRenderedPageBreak/>
               <w:t>min pixel value</w:t>
             </w:r>
           </w:p>
@@ -18319,30 +18090,32 @@
           </w:tcPr>
           <w:p>
             <w:pPr>
-              <w:rPr>
-                <w:b w:val="0"/>
-                <w:bCs w:val="0"/>
-              </w:rPr>
-            </w:pPr>
-            <w:r>
-              <w:rPr>
-                <w:b w:val="0"/>
-                <w:bCs w:val="0"/>
-              </w:rPr>
-              <w:t>threshold</w:t>
-            </w:r>
-          </w:p>
-        </w:tc>
-        <w:tc>
-          <w:tcPr>
-            <w:tcW w:w="0" w:type="auto"/>
-          </w:tcPr>
-          <w:p>
-            <w:pPr>
+              <w:pStyle w:val="NoSpacing"/>
+              <w:rPr>
+                <w:b w:val="0"/>
+                <w:bCs w:val="0"/>
+              </w:rPr>
+            </w:pPr>
+            <w:r>
+              <w:rPr>
+                <w:b w:val="0"/>
+                <w:bCs w:val="0"/>
+              </w:rPr>
+              <w:t>rho</w:t>
+            </w:r>
+          </w:p>
+        </w:tc>
+        <w:tc>
+          <w:tcPr>
+            <w:tcW w:w="0" w:type="auto"/>
+          </w:tcPr>
+          <w:p>
+            <w:pPr>
+              <w:pStyle w:val="NoSpacing"/>
               <w:cnfStyle w:val="000000000000" w:firstRow="0" w:lastRow="0" w:firstColumn="0" w:lastColumn="0" w:oddVBand="0" w:evenVBand="0" w:oddHBand="0" w:evenHBand="0" w:firstRowFirstColumn="0" w:firstRowLastColumn="0" w:lastRowFirstColumn="0" w:lastRowLastColumn="0"/>
             </w:pPr>
             <w:r>
-              <w:t xml:space="preserve">pixel value threshold above which image points are candidates for accumulating </w:t>
+              <w:t xml:space="preserve">Polar line rho </w:t>
             </w:r>
           </w:p>
         </w:tc>
@@ -18364,13 +18137,15 @@
                 <w:bCs w:val="0"/>
               </w:rPr>
             </w:pPr>
-            <w:r>
-              <w:rPr>
-                <w:b w:val="0"/>
-                <w:bCs w:val="0"/>
-              </w:rPr>
-              <w:t>rho</w:t>
-            </w:r>
+            <w:proofErr w:type="spellStart"/>
+            <w:r>
+              <w:rPr>
+                <w:b w:val="0"/>
+                <w:bCs w:val="0"/>
+              </w:rPr>
+              <w:t>theta_index</w:t>
+            </w:r>
+            <w:proofErr w:type="spellEnd"/>
           </w:p>
         </w:tc>
         <w:tc>
@@ -18383,7 +18158,7 @@
               <w:cnfStyle w:val="000000100000" w:firstRow="0" w:lastRow="0" w:firstColumn="0" w:lastColumn="0" w:oddVBand="0" w:evenVBand="0" w:oddHBand="1" w:evenHBand="0" w:firstRowFirstColumn="0" w:firstRowLastColumn="0" w:lastRowFirstColumn="0" w:lastRowLastColumn="0"/>
             </w:pPr>
             <w:r>
-              <w:t xml:space="preserve">Polar line rho </w:t>
+              <w:t>Polar line angle</w:t>
             </w:r>
           </w:p>
         </w:tc>
@@ -18408,7 +18183,7 @@
                 <w:b w:val="0"/>
                 <w:bCs w:val="0"/>
               </w:rPr>
-              <w:t>theta_index</w:t>
+              <w:t>pixel_value</w:t>
             </w:r>
             <w:proofErr w:type="spellEnd"/>
           </w:p>
@@ -18423,7 +18198,7 @@
               <w:cnfStyle w:val="000000000000" w:firstRow="0" w:lastRow="0" w:firstColumn="0" w:lastColumn="0" w:oddVBand="0" w:evenVBand="0" w:oddHBand="0" w:evenHBand="0" w:firstRowFirstColumn="0" w:firstRowLastColumn="0" w:lastRowFirstColumn="0" w:lastRowLastColumn="0"/>
             </w:pPr>
             <w:r>
-              <w:t>Polar line angle</w:t>
+              <w:t>Pixel value for drawn line segment</w:t>
             </w:r>
           </w:p>
         </w:tc>
@@ -18451,7 +18226,7 @@
                 <w:b w:val="0"/>
                 <w:bCs w:val="0"/>
               </w:rPr>
-              <w:t>pixel_value</w:t>
+              <w:t>out_component</w:t>
             </w:r>
             <w:proofErr w:type="spellEnd"/>
           </w:p>
@@ -18464,46 +18239,6 @@
             <w:pPr>
               <w:pStyle w:val="NoSpacing"/>
               <w:cnfStyle w:val="000000100000" w:firstRow="0" w:lastRow="0" w:firstColumn="0" w:lastColumn="0" w:oddVBand="0" w:evenVBand="0" w:oddHBand="1" w:evenHBand="0" w:firstRowFirstColumn="0" w:firstRowLastColumn="0" w:lastRowFirstColumn="0" w:lastRowLastColumn="0"/>
-            </w:pPr>
-            <w:r>
-              <w:t>Pixel value for drawn line segment</w:t>
-            </w:r>
-          </w:p>
-        </w:tc>
-      </w:tr>
-      <w:tr>
-        <w:tc>
-          <w:tcPr>
-            <w:cnfStyle w:val="001000000000" w:firstRow="0" w:lastRow="0" w:firstColumn="1" w:lastColumn="0" w:oddVBand="0" w:evenVBand="0" w:oddHBand="0" w:evenHBand="0" w:firstRowFirstColumn="0" w:firstRowLastColumn="0" w:lastRowFirstColumn="0" w:lastRowLastColumn="0"/>
-            <w:tcW w:w="0" w:type="auto"/>
-          </w:tcPr>
-          <w:p>
-            <w:pPr>
-              <w:pStyle w:val="NoSpacing"/>
-              <w:rPr>
-                <w:b w:val="0"/>
-                <w:bCs w:val="0"/>
-              </w:rPr>
-            </w:pPr>
-            <w:proofErr w:type="spellStart"/>
-            <w:r>
-              <w:rPr>
-                <w:b w:val="0"/>
-                <w:bCs w:val="0"/>
-              </w:rPr>
-              <w:t>out_component</w:t>
-            </w:r>
-            <w:proofErr w:type="spellEnd"/>
-          </w:p>
-        </w:tc>
-        <w:tc>
-          <w:tcPr>
-            <w:tcW w:w="0" w:type="auto"/>
-          </w:tcPr>
-          <w:p>
-            <w:pPr>
-              <w:pStyle w:val="NoSpacing"/>
-              <w:cnfStyle w:val="000000000000" w:firstRow="0" w:lastRow="0" w:firstColumn="0" w:lastColumn="0" w:oddVBand="0" w:evenVBand="0" w:oddHBand="0" w:evenHBand="0" w:firstRowFirstColumn="0" w:firstRowLastColumn="0" w:lastRowFirstColumn="0" w:lastRowLastColumn="0"/>
             </w:pPr>
             <w:r>
               <w:t>Color output image component in which to draw line</w:t>
@@ -18527,8 +18262,8 @@
         <w:tblLook w:val="04A0" w:firstRow="1" w:lastRow="0" w:firstColumn="1" w:lastColumn="0" w:noHBand="0" w:noVBand="1"/>
       </w:tblPr>
       <w:tblGrid>
-        <w:gridCol w:w="1415"/>
-        <w:gridCol w:w="7935"/>
+        <w:gridCol w:w="1072"/>
+        <w:gridCol w:w="3261"/>
       </w:tblGrid>
       <w:tr>
         <w:trPr>
@@ -18546,7 +18281,6 @@
               <w:pStyle w:val="NoSpacing"/>
             </w:pPr>
             <w:r>
-              <w:lastRenderedPageBreak/>
               <w:t>Field</w:t>
             </w:r>
           </w:p>
@@ -18588,7 +18322,7 @@
                 <w:b w:val="0"/>
                 <w:bCs w:val="0"/>
               </w:rPr>
-              <w:t>rows</w:t>
+              <w:t>start-row</w:t>
             </w:r>
           </w:p>
         </w:tc>
@@ -18602,31 +18336,31 @@
               <w:cnfStyle w:val="000000100000" w:firstRow="0" w:lastRow="0" w:firstColumn="0" w:lastColumn="0" w:oddVBand="0" w:evenVBand="0" w:oddHBand="1" w:evenHBand="0" w:firstRowFirstColumn="0" w:firstRowLastColumn="0" w:lastRowFirstColumn="0" w:lastRowLastColumn="0"/>
             </w:pPr>
             <w:r>
-              <w:t>The number of image rows</w:t>
-            </w:r>
-          </w:p>
-        </w:tc>
-      </w:tr>
-      <w:tr>
-        <w:tc>
-          <w:tcPr>
-            <w:cnfStyle w:val="001000000000" w:firstRow="0" w:lastRow="0" w:firstColumn="1" w:lastColumn="0" w:oddVBand="0" w:evenVBand="0" w:oddHBand="0" w:evenHBand="0" w:firstRowFirstColumn="0" w:firstRowLastColumn="0" w:lastRowFirstColumn="0" w:lastRowLastColumn="0"/>
-            <w:tcW w:w="0" w:type="auto"/>
-          </w:tcPr>
-          <w:p>
-            <w:pPr>
-              <w:pStyle w:val="NoSpacing"/>
-              <w:rPr>
-                <w:b w:val="0"/>
-                <w:bCs w:val="0"/>
-              </w:rPr>
-            </w:pPr>
-            <w:r>
-              <w:rPr>
-                <w:b w:val="0"/>
-                <w:bCs w:val="0"/>
-              </w:rPr>
-              <w:t>cols</w:t>
+              <w:t>line segment start point row</w:t>
+            </w:r>
+          </w:p>
+        </w:tc>
+      </w:tr>
+      <w:tr>
+        <w:tc>
+          <w:tcPr>
+            <w:cnfStyle w:val="001000000000" w:firstRow="0" w:lastRow="0" w:firstColumn="1" w:lastColumn="0" w:oddVBand="0" w:evenVBand="0" w:oddHBand="0" w:evenHBand="0" w:firstRowFirstColumn="0" w:firstRowLastColumn="0" w:lastRowFirstColumn="0" w:lastRowLastColumn="0"/>
+            <w:tcW w:w="0" w:type="auto"/>
+          </w:tcPr>
+          <w:p>
+            <w:pPr>
+              <w:pStyle w:val="NoSpacing"/>
+              <w:rPr>
+                <w:b w:val="0"/>
+                <w:bCs w:val="0"/>
+              </w:rPr>
+            </w:pPr>
+            <w:r>
+              <w:rPr>
+                <w:b w:val="0"/>
+                <w:bCs w:val="0"/>
+              </w:rPr>
+              <w:t>start-col</w:t>
             </w:r>
           </w:p>
         </w:tc>
@@ -18640,7 +18374,7 @@
               <w:cnfStyle w:val="000000000000" w:firstRow="0" w:lastRow="0" w:firstColumn="0" w:lastColumn="0" w:oddVBand="0" w:evenVBand="0" w:oddHBand="0" w:evenHBand="0" w:firstRowFirstColumn="0" w:firstRowLastColumn="0" w:lastRowFirstColumn="0" w:lastRowLastColumn="0"/>
             </w:pPr>
             <w:r>
-              <w:t>The number of image columns</w:t>
+              <w:t>line segment start point column</w:t>
             </w:r>
           </w:p>
         </w:tc>
@@ -18667,7 +18401,7 @@
                 <w:b w:val="0"/>
                 <w:bCs w:val="0"/>
               </w:rPr>
-              <w:t>components</w:t>
+              <w:t>end-row</w:t>
             </w:r>
           </w:p>
         </w:tc>
@@ -18681,31 +18415,31 @@
               <w:cnfStyle w:val="000000100000" w:firstRow="0" w:lastRow="0" w:firstColumn="0" w:lastColumn="0" w:oddVBand="0" w:evenVBand="0" w:oddHBand="1" w:evenHBand="0" w:firstRowFirstColumn="0" w:firstRowLastColumn="0" w:lastRowFirstColumn="0" w:lastRowLastColumn="0"/>
             </w:pPr>
             <w:r>
-              <w:t>The number of image components. Grayscale images have 1 component, color images have 3 components.</w:t>
-            </w:r>
-          </w:p>
-        </w:tc>
-      </w:tr>
-      <w:tr>
-        <w:tc>
-          <w:tcPr>
-            <w:cnfStyle w:val="001000000000" w:firstRow="0" w:lastRow="0" w:firstColumn="1" w:lastColumn="0" w:oddVBand="0" w:evenVBand="0" w:oddHBand="0" w:evenHBand="0" w:firstRowFirstColumn="0" w:firstRowLastColumn="0" w:lastRowFirstColumn="0" w:lastRowLastColumn="0"/>
-            <w:tcW w:w="0" w:type="auto"/>
-          </w:tcPr>
-          <w:p>
-            <w:pPr>
-              <w:pStyle w:val="NoSpacing"/>
-              <w:rPr>
-                <w:b w:val="0"/>
-                <w:bCs w:val="0"/>
-              </w:rPr>
-            </w:pPr>
-            <w:r>
-              <w:rPr>
-                <w:b w:val="0"/>
-                <w:bCs w:val="0"/>
-              </w:rPr>
-              <w:t>depth</w:t>
+              <w:t>line segment end point row</w:t>
+            </w:r>
+          </w:p>
+        </w:tc>
+      </w:tr>
+      <w:tr>
+        <w:tc>
+          <w:tcPr>
+            <w:cnfStyle w:val="001000000000" w:firstRow="0" w:lastRow="0" w:firstColumn="1" w:lastColumn="0" w:oddVBand="0" w:evenVBand="0" w:oddHBand="0" w:evenHBand="0" w:firstRowFirstColumn="0" w:firstRowLastColumn="0" w:lastRowFirstColumn="0" w:lastRowLastColumn="0"/>
+            <w:tcW w:w="0" w:type="auto"/>
+          </w:tcPr>
+          <w:p>
+            <w:pPr>
+              <w:pStyle w:val="NoSpacing"/>
+              <w:rPr>
+                <w:b w:val="0"/>
+                <w:bCs w:val="0"/>
+              </w:rPr>
+            </w:pPr>
+            <w:r>
+              <w:rPr>
+                <w:b w:val="0"/>
+                <w:bCs w:val="0"/>
+              </w:rPr>
+              <w:t>end-col</w:t>
             </w:r>
           </w:p>
         </w:tc>
@@ -18717,265 +18451,6 @@
             <w:pPr>
               <w:pStyle w:val="NoSpacing"/>
               <w:cnfStyle w:val="000000000000" w:firstRow="0" w:lastRow="0" w:firstColumn="0" w:lastColumn="0" w:oddVBand="0" w:evenVBand="0" w:oddHBand="0" w:evenHBand="0" w:firstRowFirstColumn="0" w:firstRowLastColumn="0" w:lastRowFirstColumn="0" w:lastRowLastColumn="0"/>
-            </w:pPr>
-            <w:r>
-              <w:t>Pixel value data type.</w:t>
-            </w:r>
-          </w:p>
-          <w:p>
-            <w:pPr>
-              <w:pStyle w:val="tablebullet"/>
-              <w:cnfStyle w:val="000000000000" w:firstRow="0" w:lastRow="0" w:firstColumn="0" w:lastColumn="0" w:oddVBand="0" w:evenVBand="0" w:oddHBand="0" w:evenHBand="0" w:firstRowFirstColumn="0" w:firstRowLastColumn="0" w:lastRowFirstColumn="0" w:lastRowLastColumn="0"/>
-              <w:rPr>
-                <w:sz w:val="20"/>
-                <w:szCs w:val="20"/>
-              </w:rPr>
-            </w:pPr>
-            <w:proofErr w:type="spellStart"/>
-            <w:r>
-              <w:rPr>
-                <w:sz w:val="20"/>
-                <w:szCs w:val="20"/>
-              </w:rPr>
-              <w:t>CV_8U</w:t>
-            </w:r>
-            <w:proofErr w:type="spellEnd"/>
-            <w:r>
-              <w:rPr>
-                <w:sz w:val="20"/>
-                <w:szCs w:val="20"/>
-              </w:rPr>
-              <w:t xml:space="preserve"> </w:t>
-            </w:r>
-          </w:p>
-          <w:p>
-            <w:pPr>
-              <w:pStyle w:val="tablebullet"/>
-              <w:cnfStyle w:val="000000000000" w:firstRow="0" w:lastRow="0" w:firstColumn="0" w:lastColumn="0" w:oddVBand="0" w:evenVBand="0" w:oddHBand="0" w:evenHBand="0" w:firstRowFirstColumn="0" w:firstRowLastColumn="0" w:lastRowFirstColumn="0" w:lastRowLastColumn="0"/>
-              <w:rPr>
-                <w:sz w:val="20"/>
-                <w:szCs w:val="20"/>
-              </w:rPr>
-            </w:pPr>
-            <w:proofErr w:type="spellStart"/>
-            <w:r>
-              <w:rPr>
-                <w:sz w:val="20"/>
-                <w:szCs w:val="20"/>
-              </w:rPr>
-              <w:t>CV_32S</w:t>
-            </w:r>
-            <w:proofErr w:type="spellEnd"/>
-          </w:p>
-          <w:p>
-            <w:pPr>
-              <w:pStyle w:val="tablebullet"/>
-              <w:cnfStyle w:val="000000000000" w:firstRow="0" w:lastRow="0" w:firstColumn="0" w:lastColumn="0" w:oddVBand="0" w:evenVBand="0" w:oddHBand="0" w:evenHBand="0" w:firstRowFirstColumn="0" w:firstRowLastColumn="0" w:lastRowFirstColumn="0" w:lastRowLastColumn="0"/>
-            </w:pPr>
-            <w:proofErr w:type="spellStart"/>
-            <w:r>
-              <w:rPr>
-                <w:sz w:val="20"/>
-                <w:szCs w:val="20"/>
-              </w:rPr>
-              <w:t>CV_32F</w:t>
-            </w:r>
-            <w:proofErr w:type="spellEnd"/>
-          </w:p>
-        </w:tc>
-      </w:tr>
-      <w:tr>
-        <w:trPr>
-          <w:cnfStyle w:val="000000100000" w:firstRow="0" w:lastRow="0" w:firstColumn="0" w:lastColumn="0" w:oddVBand="0" w:evenVBand="0" w:oddHBand="1" w:evenHBand="0" w:firstRowFirstColumn="0" w:firstRowLastColumn="0" w:lastRowFirstColumn="0" w:lastRowLastColumn="0"/>
-        </w:trPr>
-        <w:tc>
-          <w:tcPr>
-            <w:cnfStyle w:val="001000000000" w:firstRow="0" w:lastRow="0" w:firstColumn="1" w:lastColumn="0" w:oddVBand="0" w:evenVBand="0" w:oddHBand="0" w:evenHBand="0" w:firstRowFirstColumn="0" w:firstRowLastColumn="0" w:lastRowFirstColumn="0" w:lastRowLastColumn="0"/>
-            <w:tcW w:w="0" w:type="auto"/>
-          </w:tcPr>
-          <w:p>
-            <w:pPr>
-              <w:pStyle w:val="NoSpacing"/>
-              <w:rPr>
-                <w:b w:val="0"/>
-                <w:bCs w:val="0"/>
-              </w:rPr>
-            </w:pPr>
-            <w:r>
-              <w:rPr>
-                <w:b w:val="0"/>
-                <w:bCs w:val="0"/>
-              </w:rPr>
-              <w:t>pixel count</w:t>
-            </w:r>
-          </w:p>
-        </w:tc>
-        <w:tc>
-          <w:tcPr>
-            <w:tcW w:w="0" w:type="auto"/>
-          </w:tcPr>
-          <w:p>
-            <w:pPr>
-              <w:pStyle w:val="NoSpacing"/>
-              <w:cnfStyle w:val="000000100000" w:firstRow="0" w:lastRow="0" w:firstColumn="0" w:lastColumn="0" w:oddVBand="0" w:evenVBand="0" w:oddHBand="1" w:evenHBand="0" w:firstRowFirstColumn="0" w:firstRowLastColumn="0" w:lastRowFirstColumn="0" w:lastRowLastColumn="0"/>
-            </w:pPr>
-            <w:r>
-              <w:t>image rows * cols * components</w:t>
-            </w:r>
-          </w:p>
-        </w:tc>
-      </w:tr>
-      <w:tr>
-        <w:tc>
-          <w:tcPr>
-            <w:cnfStyle w:val="001000000000" w:firstRow="0" w:lastRow="0" w:firstColumn="1" w:lastColumn="0" w:oddVBand="0" w:evenVBand="0" w:oddHBand="0" w:evenHBand="0" w:firstRowFirstColumn="0" w:firstRowLastColumn="0" w:lastRowFirstColumn="0" w:lastRowLastColumn="0"/>
-            <w:tcW w:w="0" w:type="auto"/>
-          </w:tcPr>
-          <w:p>
-            <w:pPr>
-              <w:pStyle w:val="NoSpacing"/>
-              <w:rPr>
-                <w:b w:val="0"/>
-                <w:bCs w:val="0"/>
-              </w:rPr>
-            </w:pPr>
-            <w:r>
-              <w:rPr>
-                <w:b w:val="0"/>
-                <w:bCs w:val="0"/>
-              </w:rPr>
-              <w:t>start-row</w:t>
-            </w:r>
-          </w:p>
-        </w:tc>
-        <w:tc>
-          <w:tcPr>
-            <w:tcW w:w="0" w:type="auto"/>
-          </w:tcPr>
-          <w:p>
-            <w:pPr>
-              <w:pStyle w:val="NoSpacing"/>
-              <w:cnfStyle w:val="000000000000" w:firstRow="0" w:lastRow="0" w:firstColumn="0" w:lastColumn="0" w:oddVBand="0" w:evenVBand="0" w:oddHBand="0" w:evenHBand="0" w:firstRowFirstColumn="0" w:firstRowLastColumn="0" w:lastRowFirstColumn="0" w:lastRowLastColumn="0"/>
-            </w:pPr>
-            <w:r>
-              <w:t>line segment start point row</w:t>
-            </w:r>
-          </w:p>
-        </w:tc>
-      </w:tr>
-      <w:tr>
-        <w:trPr>
-          <w:cnfStyle w:val="000000100000" w:firstRow="0" w:lastRow="0" w:firstColumn="0" w:lastColumn="0" w:oddVBand="0" w:evenVBand="0" w:oddHBand="1" w:evenHBand="0" w:firstRowFirstColumn="0" w:firstRowLastColumn="0" w:lastRowFirstColumn="0" w:lastRowLastColumn="0"/>
-        </w:trPr>
-        <w:tc>
-          <w:tcPr>
-            <w:cnfStyle w:val="001000000000" w:firstRow="0" w:lastRow="0" w:firstColumn="1" w:lastColumn="0" w:oddVBand="0" w:evenVBand="0" w:oddHBand="0" w:evenHBand="0" w:firstRowFirstColumn="0" w:firstRowLastColumn="0" w:lastRowFirstColumn="0" w:lastRowLastColumn="0"/>
-            <w:tcW w:w="0" w:type="auto"/>
-          </w:tcPr>
-          <w:p>
-            <w:pPr>
-              <w:pStyle w:val="NoSpacing"/>
-              <w:rPr>
-                <w:b w:val="0"/>
-                <w:bCs w:val="0"/>
-              </w:rPr>
-            </w:pPr>
-            <w:r>
-              <w:rPr>
-                <w:b w:val="0"/>
-                <w:bCs w:val="0"/>
-              </w:rPr>
-              <w:t>start-col</w:t>
-            </w:r>
-          </w:p>
-        </w:tc>
-        <w:tc>
-          <w:tcPr>
-            <w:tcW w:w="0" w:type="auto"/>
-          </w:tcPr>
-          <w:p>
-            <w:pPr>
-              <w:pStyle w:val="NoSpacing"/>
-              <w:cnfStyle w:val="000000100000" w:firstRow="0" w:lastRow="0" w:firstColumn="0" w:lastColumn="0" w:oddVBand="0" w:evenVBand="0" w:oddHBand="1" w:evenHBand="0" w:firstRowFirstColumn="0" w:firstRowLastColumn="0" w:lastRowFirstColumn="0" w:lastRowLastColumn="0"/>
-            </w:pPr>
-            <w:r>
-              <w:t>line segment start point column</w:t>
-            </w:r>
-          </w:p>
-        </w:tc>
-      </w:tr>
-      <w:tr>
-        <w:tc>
-          <w:tcPr>
-            <w:cnfStyle w:val="001000000000" w:firstRow="0" w:lastRow="0" w:firstColumn="1" w:lastColumn="0" w:oddVBand="0" w:evenVBand="0" w:oddHBand="0" w:evenHBand="0" w:firstRowFirstColumn="0" w:firstRowLastColumn="0" w:lastRowFirstColumn="0" w:lastRowLastColumn="0"/>
-            <w:tcW w:w="0" w:type="auto"/>
-          </w:tcPr>
-          <w:p>
-            <w:pPr>
-              <w:pStyle w:val="NoSpacing"/>
-              <w:rPr>
-                <w:b w:val="0"/>
-                <w:bCs w:val="0"/>
-              </w:rPr>
-            </w:pPr>
-            <w:r>
-              <w:rPr>
-                <w:b w:val="0"/>
-                <w:bCs w:val="0"/>
-              </w:rPr>
-              <w:t>end-row</w:t>
-            </w:r>
-          </w:p>
-        </w:tc>
-        <w:tc>
-          <w:tcPr>
-            <w:tcW w:w="0" w:type="auto"/>
-          </w:tcPr>
-          <w:p>
-            <w:pPr>
-              <w:pStyle w:val="NoSpacing"/>
-              <w:cnfStyle w:val="000000000000" w:firstRow="0" w:lastRow="0" w:firstColumn="0" w:lastColumn="0" w:oddVBand="0" w:evenVBand="0" w:oddHBand="0" w:evenHBand="0" w:firstRowFirstColumn="0" w:firstRowLastColumn="0" w:lastRowFirstColumn="0" w:lastRowLastColumn="0"/>
-            </w:pPr>
-            <w:r>
-              <w:t>line segment end point row</w:t>
-            </w:r>
-          </w:p>
-        </w:tc>
-      </w:tr>
-      <w:tr>
-        <w:trPr>
-          <w:cnfStyle w:val="000000100000" w:firstRow="0" w:lastRow="0" w:firstColumn="0" w:lastColumn="0" w:oddVBand="0" w:evenVBand="0" w:oddHBand="1" w:evenHBand="0" w:firstRowFirstColumn="0" w:firstRowLastColumn="0" w:lastRowFirstColumn="0" w:lastRowLastColumn="0"/>
-        </w:trPr>
-        <w:tc>
-          <w:tcPr>
-            <w:cnfStyle w:val="001000000000" w:firstRow="0" w:lastRow="0" w:firstColumn="1" w:lastColumn="0" w:oddVBand="0" w:evenVBand="0" w:oddHBand="0" w:evenHBand="0" w:firstRowFirstColumn="0" w:firstRowLastColumn="0" w:lastRowFirstColumn="0" w:lastRowLastColumn="0"/>
-            <w:tcW w:w="0" w:type="auto"/>
-          </w:tcPr>
-          <w:p>
-            <w:pPr>
-              <w:pStyle w:val="NoSpacing"/>
-              <w:rPr>
-                <w:b w:val="0"/>
-                <w:bCs w:val="0"/>
-              </w:rPr>
-            </w:pPr>
-            <w:r>
-              <w:rPr>
-                <w:b w:val="0"/>
-                <w:bCs w:val="0"/>
-              </w:rPr>
-              <w:t>end-col</w:t>
-            </w:r>
-          </w:p>
-        </w:tc>
-        <w:tc>
-          <w:tcPr>
-            <w:tcW w:w="0" w:type="auto"/>
-          </w:tcPr>
-          <w:p>
-            <w:pPr>
-              <w:pStyle w:val="NoSpacing"/>
-              <w:cnfStyle w:val="000000100000" w:firstRow="0" w:lastRow="0" w:firstColumn="0" w:lastColumn="0" w:oddVBand="0" w:evenVBand="0" w:oddHBand="1" w:evenHBand="0" w:firstRowFirstColumn="0" w:firstRowLastColumn="0" w:lastRowFirstColumn="0" w:lastRowLastColumn="0"/>
             </w:pPr>
             <w:r>
               <w:t>line segment end point column</w:t>
@@ -19070,6 +18545,7 @@
           </w:tcPr>
           <w:p>
             <w:r>
+              <w:lastRenderedPageBreak/>
               <w:t>Descriptor type</w:t>
             </w:r>
           </w:p>
@@ -19871,7 +19347,6 @@
                 <w:b w:val="0"/>
                 <w:bCs w:val="0"/>
               </w:rPr>
-              <w:lastRenderedPageBreak/>
               <w:t xml:space="preserve">bin </w:t>
             </w:r>
             <w:proofErr w:type="spellStart"/>
@@ -20319,7 +19794,15 @@
         <w:pStyle w:val="Normalafterlist"/>
       </w:pPr>
       <w:r>
-        <w:t>The parameters to the draw Hough peak detect operator are:</w:t>
+        <w:t xml:space="preserve">The parameters to the draw Hough peak detect operator are as follows. Only one of either the threshold or </w:t>
+      </w:r>
+      <w:proofErr w:type="spellStart"/>
+      <w:r>
+        <w:t>max_peaks</w:t>
+      </w:r>
+      <w:proofErr w:type="spellEnd"/>
+      <w:r>
+        <w:t xml:space="preserve"> parameter should be supplied.</w:t>
       </w:r>
     </w:p>
     <w:tbl>
@@ -20428,6 +19911,7 @@
                 <w:b w:val="0"/>
                 <w:bCs w:val="0"/>
               </w:rPr>
+              <w:lastRenderedPageBreak/>
               <w:t>max_peaks</w:t>
             </w:r>
             <w:proofErr w:type="spellEnd"/>
@@ -20464,8 +19948,8 @@
         <w:tblLook w:val="04A0" w:firstRow="1" w:lastRow="0" w:firstColumn="1" w:lastColumn="0" w:noHBand="0" w:noVBand="1"/>
       </w:tblPr>
       <w:tblGrid>
-        <w:gridCol w:w="1109"/>
-        <w:gridCol w:w="5206"/>
+        <w:gridCol w:w="938"/>
+        <w:gridCol w:w="4943"/>
       </w:tblGrid>
       <w:tr>
         <w:trPr>
@@ -20525,7 +20009,7 @@
                 <w:b w:val="0"/>
                 <w:bCs w:val="0"/>
               </w:rPr>
-              <w:t>theta_inc</w:t>
+              <w:t>npeaks</w:t>
             </w:r>
             <w:proofErr w:type="spellEnd"/>
           </w:p>
@@ -20540,7 +20024,7 @@
               <w:cnfStyle w:val="000000100000" w:firstRow="0" w:lastRow="0" w:firstColumn="0" w:lastColumn="0" w:oddVBand="0" w:evenVBand="0" w:oddHBand="1" w:evenHBand="0" w:firstRowFirstColumn="0" w:firstRowLastColumn="0" w:lastRowFirstColumn="0" w:lastRowLastColumn="0"/>
             </w:pPr>
             <w:r>
-              <w:t>The increment between sampled angles in degrees</w:t>
+              <w:t>Number of peaks returned</w:t>
             </w:r>
           </w:p>
         </w:tc>
@@ -21086,7 +20570,6 @@
           <w:p>
             <w:proofErr w:type="spellStart"/>
             <w:r>
-              <w:lastRenderedPageBreak/>
               <w:t>in_component</w:t>
             </w:r>
             <w:proofErr w:type="spellEnd"/>
@@ -21703,6 +21186,7 @@
                 <w:b w:val="0"/>
                 <w:bCs w:val="0"/>
               </w:rPr>
+              <w:lastRenderedPageBreak/>
               <w:t>depth</w:t>
             </w:r>
           </w:p>
@@ -22471,7 +21955,6 @@
                 <w:b w:val="0"/>
                 <w:bCs w:val="0"/>
               </w:rPr>
-              <w:lastRenderedPageBreak/>
               <w:t>Structuring Element</w:t>
             </w:r>
           </w:p>
@@ -23046,6 +22529,7 @@
                 <w:b w:val="0"/>
                 <w:bCs w:val="0"/>
               </w:rPr>
+              <w:lastRenderedPageBreak/>
               <w:t>thickness</w:t>
             </w:r>
           </w:p>
@@ -23729,7 +23213,6 @@
         <w:pStyle w:val="code"/>
       </w:pPr>
       <w:r>
-        <w:lastRenderedPageBreak/>
         <w:t xml:space="preserve">  if input value &lt; </w:t>
       </w:r>
       <w:proofErr w:type="spellStart"/>
@@ -24237,6 +23720,7 @@
               <w:pStyle w:val="NoSpacing"/>
             </w:pPr>
             <w:r>
+              <w:lastRenderedPageBreak/>
               <w:t>parameter</w:t>
             </w:r>
           </w:p>

</xml_diff>

<commit_message>
first alpha release 0.1.19
</commit_message>
<xml_diff>
--- a/doc/cv-workbench.docx
+++ b/doc/cv-workbench.docx
@@ -1692,10 +1692,7 @@
       </w:r>
       <w:proofErr w:type="spellEnd"/>
       <w:r>
-        <w:t xml:space="preserve"> </w:t>
-      </w:r>
-      <w:r>
-        <w:t xml:space="preserve">JPEG image file format is defined by the </w:t>
+        <w:t xml:space="preserve"> JPEG image file format is defined by the </w:t>
       </w:r>
       <w:hyperlink r:id="rId18" w:history="1">
         <w:r>
@@ -1706,10 +1703,7 @@
         </w:r>
       </w:hyperlink>
       <w:r>
-        <w:t xml:space="preserve">. </w:t>
-      </w:r>
-      <w:r>
-        <w:t xml:space="preserve">Images generated by operators generally use </w:t>
+        <w:t xml:space="preserve">. Images generated by operators generally use </w:t>
       </w:r>
       <w:proofErr w:type="spellStart"/>
       <w:r>
@@ -12443,13 +12437,7 @@
               <w:cnfStyle w:val="000000100000" w:firstRow="0" w:lastRow="0" w:firstColumn="0" w:lastColumn="0" w:oddVBand="0" w:evenVBand="0" w:oddHBand="1" w:evenHBand="0" w:firstRowFirstColumn="0" w:firstRowLastColumn="0" w:lastRowFirstColumn="0" w:lastRowLastColumn="0"/>
             </w:pPr>
             <w:r>
-              <w:t>The number of image components. Grayscale images have 1 component, color image</w:t>
-            </w:r>
-            <w:r>
-              <w:t>s</w:t>
-            </w:r>
-            <w:r>
-              <w:t xml:space="preserve"> have 3 components.</w:t>
+              <w:t>The number of image components. Grayscale images have 1 component, color images have 3 components.</w:t>
             </w:r>
           </w:p>
         </w:tc>
@@ -15618,13 +15606,7 @@
               <w:cnfStyle w:val="000000000000" w:firstRow="0" w:lastRow="0" w:firstColumn="0" w:lastColumn="0" w:oddVBand="0" w:evenVBand="0" w:oddHBand="0" w:evenHBand="0" w:firstRowFirstColumn="0" w:firstRowLastColumn="0" w:lastRowFirstColumn="0" w:lastRowLastColumn="0"/>
             </w:pPr>
             <w:r>
-              <w:t xml:space="preserve">pixel </w:t>
-            </w:r>
-            <w:r>
-              <w:t>value</w:t>
-            </w:r>
-            <w:r>
-              <w:t xml:space="preserve"> mean </w:t>
+              <w:t xml:space="preserve">pixel value mean </w:t>
             </w:r>
           </w:p>
         </w:tc>
@@ -15703,10 +15685,7 @@
               <w:cnfStyle w:val="000000000000" w:firstRow="0" w:lastRow="0" w:firstColumn="0" w:lastColumn="0" w:oddVBand="0" w:evenVBand="0" w:oddHBand="0" w:evenHBand="0" w:firstRowFirstColumn="0" w:firstRowLastColumn="0" w:lastRowFirstColumn="0" w:lastRowLastColumn="0"/>
             </w:pPr>
             <w:r>
-              <w:t xml:space="preserve">minimum </w:t>
-            </w:r>
-            <w:r>
-              <w:t>pixel value</w:t>
+              <w:t>minimum pixel value</w:t>
             </w:r>
           </w:p>
         </w:tc>
@@ -15747,13 +15726,7 @@
               <w:cnfStyle w:val="000000100000" w:firstRow="0" w:lastRow="0" w:firstColumn="0" w:lastColumn="0" w:oddVBand="0" w:evenVBand="0" w:oddHBand="1" w:evenHBand="0" w:firstRowFirstColumn="0" w:firstRowLastColumn="0" w:lastRowFirstColumn="0" w:lastRowLastColumn="0"/>
             </w:pPr>
             <w:r>
-              <w:t>m</w:t>
-            </w:r>
-            <w:r>
-              <w:t>ax</w:t>
-            </w:r>
-            <w:r>
-              <w:t>imum pixel value</w:t>
+              <w:t>maximum pixel value</w:t>
             </w:r>
           </w:p>
         </w:tc>
@@ -15801,19 +15774,7 @@
     </w:p>
     <w:p>
       <w:r>
-        <w:t xml:space="preserve">The create </w:t>
-      </w:r>
-      <w:r>
-        <w:t>Hough accumulator</w:t>
-      </w:r>
-      <w:r>
-        <w:t xml:space="preserve"> histogram operator creates a histogram for a</w:t>
-      </w:r>
-      <w:r>
-        <w:t xml:space="preserve"> </w:t>
-      </w:r>
-      <w:r>
-        <w:t>Hough accumulator and stores it in binary or text format.</w:t>
+        <w:t>The create Hough accumulator histogram operator creates a histogram for a Hough accumulator and stores it in binary or text format.</w:t>
       </w:r>
     </w:p>
     <w:p>
@@ -16436,14 +16397,7 @@
                 <w:b w:val="0"/>
                 <w:bCs w:val="0"/>
               </w:rPr>
-              <w:t xml:space="preserve">accumulator </w:t>
-            </w:r>
-            <w:r>
-              <w:rPr>
-                <w:b w:val="0"/>
-                <w:bCs w:val="0"/>
-              </w:rPr>
-              <w:t>count</w:t>
+              <w:t>accumulator count</w:t>
             </w:r>
           </w:p>
         </w:tc>
@@ -17567,21 +17521,7 @@
                 <w:b w:val="0"/>
                 <w:bCs w:val="0"/>
               </w:rPr>
-              <w:t>min</w:t>
-            </w:r>
-            <w:r>
-              <w:rPr>
-                <w:b w:val="0"/>
-                <w:bCs w:val="0"/>
-              </w:rPr>
-              <w:t xml:space="preserve"> bin </w:t>
-            </w:r>
-            <w:r>
-              <w:rPr>
-                <w:b w:val="0"/>
-                <w:bCs w:val="0"/>
-              </w:rPr>
-              <w:t>count</w:t>
+              <w:t>min bin count</w:t>
             </w:r>
           </w:p>
         </w:tc>
@@ -17622,21 +17562,7 @@
                 <w:b w:val="0"/>
                 <w:bCs w:val="0"/>
               </w:rPr>
-              <w:t>max</w:t>
-            </w:r>
-            <w:r>
-              <w:rPr>
-                <w:b w:val="0"/>
-                <w:bCs w:val="0"/>
-              </w:rPr>
-              <w:t xml:space="preserve"> bin </w:t>
-            </w:r>
-            <w:r>
-              <w:rPr>
-                <w:b w:val="0"/>
-                <w:bCs w:val="0"/>
-              </w:rPr>
-              <w:t>count</w:t>
+              <w:t>max bin count</w:t>
             </w:r>
           </w:p>
         </w:tc>
@@ -18469,13 +18395,7 @@
       </w:r>
       <w:proofErr w:type="spellEnd"/>
       <w:r>
-        <w:t>-draw-line</w:t>
-      </w:r>
-      <w:r>
-        <w:t>s</w:t>
-      </w:r>
-      <w:r>
-        <w:t xml:space="preserve"> Operator</w:t>
+        <w:t>-draw-lines Operator</w:t>
       </w:r>
     </w:p>
     <w:p>
@@ -24404,9 +24324,12 @@
       </w:pPr>
     </w:p>
     <w:sectPr>
-      <w:headerReference w:type="default" r:id="rId23"/>
-      <w:footerReference w:type="default" r:id="rId24"/>
-      <w:footerReference w:type="first" r:id="rId25"/>
+      <w:headerReference w:type="even" r:id="rId23"/>
+      <w:headerReference w:type="default" r:id="rId24"/>
+      <w:footerReference w:type="even" r:id="rId25"/>
+      <w:footerReference w:type="default" r:id="rId26"/>
+      <w:headerReference w:type="first" r:id="rId27"/>
+      <w:footerReference w:type="first" r:id="rId28"/>
       <w:pgSz w:w="12240" w:h="15840" w:code="1"/>
       <w:pgMar w:top="1440" w:right="1440" w:bottom="1440" w:left="1440" w:header="720" w:footer="720" w:gutter="0"/>
       <w:cols w:space="720"/>
@@ -24443,6 +24366,16 @@
 </file>
 
 <file path=word/footer1.xml><?xml version="1.0" encoding="utf-8"?>
+<w:ftr xmlns:wpc="http://schemas.microsoft.com/office/word/2010/wordprocessingCanvas" xmlns:cx="http://schemas.microsoft.com/office/drawing/2014/chartex" xmlns:cx1="http://schemas.microsoft.com/office/drawing/2015/9/8/chartex" xmlns:cx2="http://schemas.microsoft.com/office/drawing/2015/10/21/chartex" xmlns:cx3="http://schemas.microsoft.com/office/drawing/2016/5/9/chartex" xmlns:cx4="http://schemas.microsoft.com/office/drawing/2016/5/10/chartex" xmlns:cx5="http://schemas.microsoft.com/office/drawing/2016/5/11/chartex" xmlns:cx6="http://schemas.microsoft.com/office/drawing/2016/5/12/chartex" xmlns:cx7="http://schemas.microsoft.com/office/drawing/2016/5/13/chartex" xmlns:cx8="http://schemas.microsoft.com/office/drawing/2016/5/14/chartex" xmlns:mc="http://schemas.openxmlformats.org/markup-compatibility/2006" xmlns:aink="http://schemas.microsoft.com/office/drawing/2016/ink" xmlns:am3d="http://schemas.microsoft.com/office/drawing/2017/model3d" xmlns:o="urn:schemas-microsoft-com:office:office" xmlns:oel="http://schemas.microsoft.com/office/2019/extlst" xmlns:r="http://schemas.openxmlformats.org/officeDocument/2006/relationships" xmlns:m="http://schemas.openxmlformats.org/officeDocument/2006/math" xmlns:v="urn:schemas-microsoft-com:vml" xmlns:wp14="http://schemas.microsoft.com/office/word/2010/wordprocessingDrawing" xmlns:wp="http://schemas.openxmlformats.org/drawingml/2006/wordprocessingDrawing" xmlns:w10="urn:schemas-microsoft-com:office:word" xmlns:w="http://schemas.openxmlformats.org/wordprocessingml/2006/main" xmlns:w14="http://schemas.microsoft.com/office/word/2010/wordml" xmlns:w15="http://schemas.microsoft.com/office/word/2012/wordml" xmlns:w16cex="http://schemas.microsoft.com/office/word/2018/wordml/cex" xmlns:w16cid="http://schemas.microsoft.com/office/word/2016/wordml/cid" xmlns:w16="http://schemas.microsoft.com/office/word/2018/wordml" xmlns:w16sdtdh="http://schemas.microsoft.com/office/word/2020/wordml/sdtdatahash" xmlns:w16se="http://schemas.microsoft.com/office/word/2015/wordml/symex" xmlns:wpg="http://schemas.microsoft.com/office/word/2010/wordprocessingGroup" xmlns:wpi="http://schemas.microsoft.com/office/word/2010/wordprocessingInk" xmlns:wne="http://schemas.microsoft.com/office/word/2006/wordml" xmlns:wps="http://schemas.microsoft.com/office/word/2010/wordprocessingShape" mc:Ignorable="w14 w15 w16se w16cid w16 w16cex w16sdtdh wp14">
+  <w:p>
+    <w:pPr>
+      <w:pStyle w:val="Footer"/>
+    </w:pPr>
+  </w:p>
+</w:ftr>
+</file>
+
+<file path=word/footer2.xml><?xml version="1.0" encoding="utf-8"?>
 <w:ftr xmlns:wpc="http://schemas.microsoft.com/office/word/2010/wordprocessingCanvas" xmlns:cx="http://schemas.microsoft.com/office/drawing/2014/chartex" xmlns:cx1="http://schemas.microsoft.com/office/drawing/2015/9/8/chartex" xmlns:cx2="http://schemas.microsoft.com/office/drawing/2015/10/21/chartex" xmlns:cx3="http://schemas.microsoft.com/office/drawing/2016/5/9/chartex" xmlns:cx4="http://schemas.microsoft.com/office/drawing/2016/5/10/chartex" xmlns:cx5="http://schemas.microsoft.com/office/drawing/2016/5/11/chartex" xmlns:cx6="http://schemas.microsoft.com/office/drawing/2016/5/12/chartex" xmlns:cx7="http://schemas.microsoft.com/office/drawing/2016/5/13/chartex" xmlns:cx8="http://schemas.microsoft.com/office/drawing/2016/5/14/chartex" xmlns:mc="http://schemas.openxmlformats.org/markup-compatibility/2006" xmlns:aink="http://schemas.microsoft.com/office/drawing/2016/ink" xmlns:am3d="http://schemas.microsoft.com/office/drawing/2017/model3d" xmlns:o="urn:schemas-microsoft-com:office:office" xmlns:oel="http://schemas.microsoft.com/office/2019/extlst" xmlns:r="http://schemas.openxmlformats.org/officeDocument/2006/relationships" xmlns:m="http://schemas.openxmlformats.org/officeDocument/2006/math" xmlns:v="urn:schemas-microsoft-com:vml" xmlns:wp14="http://schemas.microsoft.com/office/word/2010/wordprocessingDrawing" xmlns:wp="http://schemas.openxmlformats.org/drawingml/2006/wordprocessingDrawing" xmlns:w10="urn:schemas-microsoft-com:office:word" xmlns:w="http://schemas.openxmlformats.org/wordprocessingml/2006/main" xmlns:w14="http://schemas.microsoft.com/office/word/2010/wordml" xmlns:w15="http://schemas.microsoft.com/office/word/2012/wordml" xmlns:w16cex="http://schemas.microsoft.com/office/word/2018/wordml/cex" xmlns:w16cid="http://schemas.microsoft.com/office/word/2016/wordml/cid" xmlns:w16="http://schemas.microsoft.com/office/word/2018/wordml" xmlns:w16sdtdh="http://schemas.microsoft.com/office/word/2020/wordml/sdtdatahash" xmlns:w16se="http://schemas.microsoft.com/office/word/2015/wordml/symex" xmlns:wpg="http://schemas.microsoft.com/office/word/2010/wordprocessingGroup" xmlns:wpi="http://schemas.microsoft.com/office/word/2010/wordprocessingInk" xmlns:wne="http://schemas.microsoft.com/office/word/2006/wordml" xmlns:wps="http://schemas.microsoft.com/office/word/2010/wordprocessingShape" mc:Ignorable="w14 w15 w16se w16cid w16 w16cex w16sdtdh wp14">
   <w:p>
     <w:pPr>
@@ -24461,7 +24394,7 @@
       <w:rPr>
         <w:noProof/>
       </w:rPr>
-      <w:t>7/31/2022 1:08 PM</w:t>
+      <w:t>7/31/2022 4:49 PM</w:t>
     </w:r>
     <w:r>
       <w:fldChar w:fldCharType="end"/>
@@ -24495,7 +24428,7 @@
 </w:ftr>
 </file>
 
-<file path=word/footer2.xml><?xml version="1.0" encoding="utf-8"?>
+<file path=word/footer3.xml><?xml version="1.0" encoding="utf-8"?>
 <w:ftr xmlns:wpc="http://schemas.microsoft.com/office/word/2010/wordprocessingCanvas" xmlns:cx="http://schemas.microsoft.com/office/drawing/2014/chartex" xmlns:cx1="http://schemas.microsoft.com/office/drawing/2015/9/8/chartex" xmlns:cx2="http://schemas.microsoft.com/office/drawing/2015/10/21/chartex" xmlns:cx3="http://schemas.microsoft.com/office/drawing/2016/5/9/chartex" xmlns:cx4="http://schemas.microsoft.com/office/drawing/2016/5/10/chartex" xmlns:cx5="http://schemas.microsoft.com/office/drawing/2016/5/11/chartex" xmlns:cx6="http://schemas.microsoft.com/office/drawing/2016/5/12/chartex" xmlns:cx7="http://schemas.microsoft.com/office/drawing/2016/5/13/chartex" xmlns:cx8="http://schemas.microsoft.com/office/drawing/2016/5/14/chartex" xmlns:mc="http://schemas.openxmlformats.org/markup-compatibility/2006" xmlns:aink="http://schemas.microsoft.com/office/drawing/2016/ink" xmlns:am3d="http://schemas.microsoft.com/office/drawing/2017/model3d" xmlns:o="urn:schemas-microsoft-com:office:office" xmlns:oel="http://schemas.microsoft.com/office/2019/extlst" xmlns:r="http://schemas.openxmlformats.org/officeDocument/2006/relationships" xmlns:m="http://schemas.openxmlformats.org/officeDocument/2006/math" xmlns:v="urn:schemas-microsoft-com:vml" xmlns:wp14="http://schemas.microsoft.com/office/word/2010/wordprocessingDrawing" xmlns:wp="http://schemas.openxmlformats.org/drawingml/2006/wordprocessingDrawing" xmlns:w10="urn:schemas-microsoft-com:office:word" xmlns:w="http://schemas.openxmlformats.org/wordprocessingml/2006/main" xmlns:w14="http://schemas.microsoft.com/office/word/2010/wordml" xmlns:w15="http://schemas.microsoft.com/office/word/2012/wordml" xmlns:w16cex="http://schemas.microsoft.com/office/word/2018/wordml/cex" xmlns:w16cid="http://schemas.microsoft.com/office/word/2016/wordml/cid" xmlns:w16="http://schemas.microsoft.com/office/word/2018/wordml" xmlns:w16sdtdh="http://schemas.microsoft.com/office/word/2020/wordml/sdtdatahash" xmlns:w16se="http://schemas.microsoft.com/office/word/2015/wordml/symex" xmlns:wpg="http://schemas.microsoft.com/office/word/2010/wordprocessingGroup" xmlns:wpi="http://schemas.microsoft.com/office/word/2010/wordprocessingInk" xmlns:wne="http://schemas.microsoft.com/office/word/2006/wordml" xmlns:wps="http://schemas.microsoft.com/office/word/2010/wordprocessingShape" mc:Ignorable="w14 w15 w16se w16cid w16 w16cex w16sdtdh wp14">
   <w:sdt>
     <w:sdtPr>
@@ -24533,7 +24466,7 @@
           <w:rPr>
             <w:noProof/>
           </w:rPr>
-          <w:t>7/31/2022 1:08 PM</w:t>
+          <w:t>7/31/2022 4:49 PM</w:t>
         </w:r>
         <w:r>
           <w:fldChar w:fldCharType="end"/>
@@ -24624,11 +24557,31 @@
   <w:p>
     <w:pPr>
       <w:pStyle w:val="Header"/>
+    </w:pPr>
+  </w:p>
+</w:hdr>
+</file>
+
+<file path=word/header2.xml><?xml version="1.0" encoding="utf-8"?>
+<w:hdr xmlns:wpc="http://schemas.microsoft.com/office/word/2010/wordprocessingCanvas" xmlns:cx="http://schemas.microsoft.com/office/drawing/2014/chartex" xmlns:cx1="http://schemas.microsoft.com/office/drawing/2015/9/8/chartex" xmlns:cx2="http://schemas.microsoft.com/office/drawing/2015/10/21/chartex" xmlns:cx3="http://schemas.microsoft.com/office/drawing/2016/5/9/chartex" xmlns:cx4="http://schemas.microsoft.com/office/drawing/2016/5/10/chartex" xmlns:cx5="http://schemas.microsoft.com/office/drawing/2016/5/11/chartex" xmlns:cx6="http://schemas.microsoft.com/office/drawing/2016/5/12/chartex" xmlns:cx7="http://schemas.microsoft.com/office/drawing/2016/5/13/chartex" xmlns:cx8="http://schemas.microsoft.com/office/drawing/2016/5/14/chartex" xmlns:mc="http://schemas.openxmlformats.org/markup-compatibility/2006" xmlns:aink="http://schemas.microsoft.com/office/drawing/2016/ink" xmlns:am3d="http://schemas.microsoft.com/office/drawing/2017/model3d" xmlns:o="urn:schemas-microsoft-com:office:office" xmlns:oel="http://schemas.microsoft.com/office/2019/extlst" xmlns:r="http://schemas.openxmlformats.org/officeDocument/2006/relationships" xmlns:m="http://schemas.openxmlformats.org/officeDocument/2006/math" xmlns:v="urn:schemas-microsoft-com:vml" xmlns:wp14="http://schemas.microsoft.com/office/word/2010/wordprocessingDrawing" xmlns:wp="http://schemas.openxmlformats.org/drawingml/2006/wordprocessingDrawing" xmlns:w10="urn:schemas-microsoft-com:office:word" xmlns:w="http://schemas.openxmlformats.org/wordprocessingml/2006/main" xmlns:w14="http://schemas.microsoft.com/office/word/2010/wordml" xmlns:w15="http://schemas.microsoft.com/office/word/2012/wordml" xmlns:w16cex="http://schemas.microsoft.com/office/word/2018/wordml/cex" xmlns:w16cid="http://schemas.microsoft.com/office/word/2016/wordml/cid" xmlns:w16="http://schemas.microsoft.com/office/word/2018/wordml" xmlns:w16sdtdh="http://schemas.microsoft.com/office/word/2020/wordml/sdtdatahash" xmlns:w16se="http://schemas.microsoft.com/office/word/2015/wordml/symex" xmlns:wpg="http://schemas.microsoft.com/office/word/2010/wordprocessingGroup" xmlns:wpi="http://schemas.microsoft.com/office/word/2010/wordprocessingInk" xmlns:wne="http://schemas.microsoft.com/office/word/2006/wordml" xmlns:wps="http://schemas.microsoft.com/office/word/2010/wordprocessingShape" mc:Ignorable="w14 w15 w16se w16cid w16 w16cex w16sdtdh wp14">
+  <w:p>
+    <w:pPr>
+      <w:pStyle w:val="Header"/>
       <w:jc w:val="center"/>
     </w:pPr>
     <w:r>
       <w:t>CV Workbench -- Computer Vision Workbench</w:t>
     </w:r>
+  </w:p>
+</w:hdr>
+</file>
+
+<file path=word/header3.xml><?xml version="1.0" encoding="utf-8"?>
+<w:hdr xmlns:wpc="http://schemas.microsoft.com/office/word/2010/wordprocessingCanvas" xmlns:cx="http://schemas.microsoft.com/office/drawing/2014/chartex" xmlns:cx1="http://schemas.microsoft.com/office/drawing/2015/9/8/chartex" xmlns:cx2="http://schemas.microsoft.com/office/drawing/2015/10/21/chartex" xmlns:cx3="http://schemas.microsoft.com/office/drawing/2016/5/9/chartex" xmlns:cx4="http://schemas.microsoft.com/office/drawing/2016/5/10/chartex" xmlns:cx5="http://schemas.microsoft.com/office/drawing/2016/5/11/chartex" xmlns:cx6="http://schemas.microsoft.com/office/drawing/2016/5/12/chartex" xmlns:cx7="http://schemas.microsoft.com/office/drawing/2016/5/13/chartex" xmlns:cx8="http://schemas.microsoft.com/office/drawing/2016/5/14/chartex" xmlns:mc="http://schemas.openxmlformats.org/markup-compatibility/2006" xmlns:aink="http://schemas.microsoft.com/office/drawing/2016/ink" xmlns:am3d="http://schemas.microsoft.com/office/drawing/2017/model3d" xmlns:o="urn:schemas-microsoft-com:office:office" xmlns:oel="http://schemas.microsoft.com/office/2019/extlst" xmlns:r="http://schemas.openxmlformats.org/officeDocument/2006/relationships" xmlns:m="http://schemas.openxmlformats.org/officeDocument/2006/math" xmlns:v="urn:schemas-microsoft-com:vml" xmlns:wp14="http://schemas.microsoft.com/office/word/2010/wordprocessingDrawing" xmlns:wp="http://schemas.openxmlformats.org/drawingml/2006/wordprocessingDrawing" xmlns:w10="urn:schemas-microsoft-com:office:word" xmlns:w="http://schemas.openxmlformats.org/wordprocessingml/2006/main" xmlns:w14="http://schemas.microsoft.com/office/word/2010/wordml" xmlns:w15="http://schemas.microsoft.com/office/word/2012/wordml" xmlns:w16cex="http://schemas.microsoft.com/office/word/2018/wordml/cex" xmlns:w16cid="http://schemas.microsoft.com/office/word/2016/wordml/cid" xmlns:w16="http://schemas.microsoft.com/office/word/2018/wordml" xmlns:w16sdtdh="http://schemas.microsoft.com/office/word/2020/wordml/sdtdatahash" xmlns:w16se="http://schemas.microsoft.com/office/word/2015/wordml/symex" xmlns:wpg="http://schemas.microsoft.com/office/word/2010/wordprocessingGroup" xmlns:wpi="http://schemas.microsoft.com/office/word/2010/wordprocessingInk" xmlns:wne="http://schemas.microsoft.com/office/word/2006/wordml" xmlns:wps="http://schemas.microsoft.com/office/word/2010/wordprocessingShape" mc:Ignorable="w14 w15 w16se w16cid w16 w16cex w16sdtdh wp14">
+  <w:p>
+    <w:pPr>
+      <w:pStyle w:val="Header"/>
+    </w:pPr>
   </w:p>
 </w:hdr>
 </file>

</xml_diff>

<commit_message>
got operation-image-morphology.cpp compiling but didnt run
</commit_message>
<xml_diff>
--- a/doc/cv-workbench.docx
+++ b/doc/cv-workbench.docx
@@ -14145,25 +14145,7 @@
               <w:cnfStyle w:val="000000100000" w:firstRow="0" w:lastRow="0" w:firstColumn="0" w:lastColumn="0" w:oddVBand="0" w:evenVBand="0" w:oddHBand="1" w:evenHBand="0" w:firstRowFirstColumn="0" w:firstRowLastColumn="0" w:lastRowFirstColumn="0" w:lastRowLastColumn="0"/>
             </w:pPr>
             <w:r>
-              <w:t xml:space="preserve">Subtract the </w:t>
-            </w:r>
-            <w:r>
-              <w:t>erod</w:t>
-            </w:r>
-            <w:r>
-              <w:t>ed</w:t>
-            </w:r>
-            <w:r>
-              <w:t xml:space="preserve"> </w:t>
-            </w:r>
-            <w:r>
-              <w:t xml:space="preserve">image from the </w:t>
-            </w:r>
-            <w:r>
-              <w:t>dilat</w:t>
-            </w:r>
-            <w:r>
-              <w:t>ed image</w:t>
+              <w:t>Subtract the eroded image from the dilated image</w:t>
             </w:r>
           </w:p>
         </w:tc>
@@ -14213,13 +14195,7 @@
               <w:cnfStyle w:val="000000000000" w:firstRow="0" w:lastRow="0" w:firstColumn="0" w:lastColumn="0" w:oddVBand="0" w:evenVBand="0" w:oddHBand="0" w:evenHBand="0" w:firstRowFirstColumn="0" w:firstRowLastColumn="0" w:lastRowFirstColumn="0" w:lastRowLastColumn="0"/>
             </w:pPr>
             <w:r>
-              <w:t>Subtract the opened</w:t>
-            </w:r>
-            <w:r>
-              <w:t xml:space="preserve"> image</w:t>
-            </w:r>
-            <w:r>
-              <w:t xml:space="preserve"> from the original image </w:t>
+              <w:t xml:space="preserve">Subtract the opened image from the original image </w:t>
             </w:r>
           </w:p>
         </w:tc>
@@ -14539,7 +14515,7 @@
       </w:tblPr>
       <w:tblGrid>
         <w:gridCol w:w="2099"/>
-        <w:gridCol w:w="6648"/>
+        <w:gridCol w:w="6697"/>
       </w:tblGrid>
       <w:tr>
         <w:trPr>
@@ -14757,43 +14733,7 @@
               <w:cnfStyle w:val="000000100000" w:firstRow="0" w:lastRow="0" w:firstColumn="0" w:lastColumn="0" w:oddVBand="0" w:evenVBand="0" w:oddHBand="1" w:evenHBand="0" w:firstRowFirstColumn="0" w:firstRowLastColumn="0" w:lastRowFirstColumn="0" w:lastRowLastColumn="0"/>
             </w:pPr>
             <w:r>
-              <w:t>“erode”, “dilate”, “open”, “close”, “gradient”, “top-hat”, or “back-hat”</w:t>
-            </w:r>
-          </w:p>
-        </w:tc>
-      </w:tr>
-      <w:tr>
-        <w:tc>
-          <w:tcPr>
-            <w:cnfStyle w:val="001000000000" w:firstRow="0" w:lastRow="0" w:firstColumn="1" w:lastColumn="0" w:oddVBand="0" w:evenVBand="0" w:oddHBand="0" w:evenHBand="0" w:firstRowFirstColumn="0" w:firstRowLastColumn="0" w:lastRowFirstColumn="0" w:lastRowLastColumn="0"/>
-            <w:tcW w:w="0" w:type="auto"/>
-          </w:tcPr>
-          <w:p>
-            <w:pPr>
-              <w:rPr>
-                <w:b w:val="0"/>
-                <w:bCs w:val="0"/>
-              </w:rPr>
-            </w:pPr>
-            <w:r>
-              <w:rPr>
-                <w:b w:val="0"/>
-                <w:bCs w:val="0"/>
-              </w:rPr>
-              <w:t>repeat-count</w:t>
-            </w:r>
-          </w:p>
-        </w:tc>
-        <w:tc>
-          <w:tcPr>
-            <w:tcW w:w="0" w:type="auto"/>
-          </w:tcPr>
-          <w:p>
-            <w:pPr>
-              <w:cnfStyle w:val="000000000000" w:firstRow="0" w:lastRow="0" w:firstColumn="0" w:lastColumn="0" w:oddVBand="0" w:evenVBand="0" w:oddHBand="0" w:evenHBand="0" w:firstRowFirstColumn="0" w:firstRowLastColumn="0" w:lastRowFirstColumn="0" w:lastRowLastColumn="0"/>
-            </w:pPr>
-            <w:r>
-              <w:t>Iteration count for erode or dilate operations</w:t>
+              <w:t>“erode”, “dilate”, “open”, “close”, “gradient”, “top-hat”, or “black-hat”</w:t>
             </w:r>
           </w:p>
         </w:tc>
@@ -21535,7 +21475,7 @@
       <w:rPr>
         <w:noProof/>
       </w:rPr>
-      <w:t>8/2/2022 9:20 AM</w:t>
+      <w:t>8/2/2022 9:19 PM</w:t>
     </w:r>
     <w:r>
       <w:fldChar w:fldCharType="end"/>
@@ -21607,7 +21547,7 @@
           <w:rPr>
             <w:noProof/>
           </w:rPr>
-          <w:t>8/2/2022 9:20 AM</w:t>
+          <w:t>8/2/2022 9:19 PM</w:t>
         </w:r>
         <w:r>
           <w:fldChar w:fldCharType="end"/>

</xml_diff>

<commit_message>
updated with 2022-08-03 10:38am dev version
</commit_message>
<xml_diff>
--- a/doc/cv-workbench.docx
+++ b/doc/cv-workbench.docx
@@ -14145,25 +14145,7 @@
               <w:cnfStyle w:val="000000100000" w:firstRow="0" w:lastRow="0" w:firstColumn="0" w:lastColumn="0" w:oddVBand="0" w:evenVBand="0" w:oddHBand="1" w:evenHBand="0" w:firstRowFirstColumn="0" w:firstRowLastColumn="0" w:lastRowFirstColumn="0" w:lastRowLastColumn="0"/>
             </w:pPr>
             <w:r>
-              <w:t xml:space="preserve">Subtract the </w:t>
-            </w:r>
-            <w:r>
-              <w:t>erod</w:t>
-            </w:r>
-            <w:r>
-              <w:t>ed</w:t>
-            </w:r>
-            <w:r>
-              <w:t xml:space="preserve"> </w:t>
-            </w:r>
-            <w:r>
-              <w:t xml:space="preserve">image from the </w:t>
-            </w:r>
-            <w:r>
-              <w:t>dilat</w:t>
-            </w:r>
-            <w:r>
-              <w:t>ed image</w:t>
+              <w:t>Subtract the eroded image from the dilated image</w:t>
             </w:r>
           </w:p>
         </w:tc>
@@ -14213,13 +14195,7 @@
               <w:cnfStyle w:val="000000000000" w:firstRow="0" w:lastRow="0" w:firstColumn="0" w:lastColumn="0" w:oddVBand="0" w:evenVBand="0" w:oddHBand="0" w:evenHBand="0" w:firstRowFirstColumn="0" w:firstRowLastColumn="0" w:lastRowFirstColumn="0" w:lastRowLastColumn="0"/>
             </w:pPr>
             <w:r>
-              <w:t>Subtract the opened</w:t>
-            </w:r>
-            <w:r>
-              <w:t xml:space="preserve"> image</w:t>
-            </w:r>
-            <w:r>
-              <w:t xml:space="preserve"> from the original image </w:t>
+              <w:t xml:space="preserve">Subtract the opened image from the original image </w:t>
             </w:r>
           </w:p>
         </w:tc>
@@ -14539,7 +14515,7 @@
       </w:tblPr>
       <w:tblGrid>
         <w:gridCol w:w="2099"/>
-        <w:gridCol w:w="6648"/>
+        <w:gridCol w:w="6697"/>
       </w:tblGrid>
       <w:tr>
         <w:trPr>
@@ -14757,43 +14733,7 @@
               <w:cnfStyle w:val="000000100000" w:firstRow="0" w:lastRow="0" w:firstColumn="0" w:lastColumn="0" w:oddVBand="0" w:evenVBand="0" w:oddHBand="1" w:evenHBand="0" w:firstRowFirstColumn="0" w:firstRowLastColumn="0" w:lastRowFirstColumn="0" w:lastRowLastColumn="0"/>
             </w:pPr>
             <w:r>
-              <w:t>“erode”, “dilate”, “open”, “close”, “gradient”, “top-hat”, or “back-hat”</w:t>
-            </w:r>
-          </w:p>
-        </w:tc>
-      </w:tr>
-      <w:tr>
-        <w:tc>
-          <w:tcPr>
-            <w:cnfStyle w:val="001000000000" w:firstRow="0" w:lastRow="0" w:firstColumn="1" w:lastColumn="0" w:oddVBand="0" w:evenVBand="0" w:oddHBand="0" w:evenHBand="0" w:firstRowFirstColumn="0" w:firstRowLastColumn="0" w:lastRowFirstColumn="0" w:lastRowLastColumn="0"/>
-            <w:tcW w:w="0" w:type="auto"/>
-          </w:tcPr>
-          <w:p>
-            <w:pPr>
-              <w:rPr>
-                <w:b w:val="0"/>
-                <w:bCs w:val="0"/>
-              </w:rPr>
-            </w:pPr>
-            <w:r>
-              <w:rPr>
-                <w:b w:val="0"/>
-                <w:bCs w:val="0"/>
-              </w:rPr>
-              <w:t>repeat-count</w:t>
-            </w:r>
-          </w:p>
-        </w:tc>
-        <w:tc>
-          <w:tcPr>
-            <w:tcW w:w="0" w:type="auto"/>
-          </w:tcPr>
-          <w:p>
-            <w:pPr>
-              <w:cnfStyle w:val="000000000000" w:firstRow="0" w:lastRow="0" w:firstColumn="0" w:lastColumn="0" w:oddVBand="0" w:evenVBand="0" w:oddHBand="0" w:evenHBand="0" w:firstRowFirstColumn="0" w:firstRowLastColumn="0" w:lastRowFirstColumn="0" w:lastRowLastColumn="0"/>
-            </w:pPr>
-            <w:r>
-              <w:t>Iteration count for erode or dilate operations</w:t>
+              <w:t>“erode”, “dilate”, “open”, “close”, “gradient”, “top-hat”, or “black-hat”</w:t>
             </w:r>
           </w:p>
         </w:tc>
@@ -21535,7 +21475,7 @@
       <w:rPr>
         <w:noProof/>
       </w:rPr>
-      <w:t>8/2/2022 9:20 AM</w:t>
+      <w:t>8/2/2022 9:19 PM</w:t>
     </w:r>
     <w:r>
       <w:fldChar w:fldCharType="end"/>
@@ -21607,7 +21547,7 @@
           <w:rPr>
             <w:noProof/>
           </w:rPr>
-          <w:t>8/2/2022 9:20 AM</w:t>
+          <w:t>8/2/2022 9:19 PM</w:t>
         </w:r>
         <w:r>
           <w:fldChar w:fldCharType="end"/>

</xml_diff>

<commit_message>
interim checkin refactor of hough_accum using local polar_trig functions
</commit_message>
<xml_diff>
--- a/doc/cv-workbench.docx
+++ b/doc/cv-workbench.docx
@@ -3290,15 +3290,13 @@
                 <w:bCs w:val="0"/>
               </w:rPr>
             </w:pPr>
-            <w:proofErr w:type="spellStart"/>
-            <w:r>
-              <w:rPr>
-                <w:b w:val="0"/>
-                <w:bCs w:val="0"/>
-              </w:rPr>
-              <w:t>nrhos</w:t>
-            </w:r>
-            <w:proofErr w:type="spellEnd"/>
+            <w:r>
+              <w:rPr>
+                <w:b w:val="0"/>
+                <w:bCs w:val="0"/>
+              </w:rPr>
+              <w:t>rows</w:t>
+            </w:r>
           </w:p>
         </w:tc>
         <w:tc>
@@ -3325,7 +3323,7 @@
               <w:cnfStyle w:val="000000000000" w:firstRow="0" w:lastRow="0" w:firstColumn="0" w:lastColumn="0" w:oddVBand="0" w:evenVBand="0" w:oddHBand="0" w:evenHBand="0" w:firstRowFirstColumn="0" w:firstRowLastColumn="0" w:lastRowFirstColumn="0" w:lastRowLastColumn="0"/>
             </w:pPr>
             <w:r>
-              <w:t>The number of rho values sampled</w:t>
+              <w:t>The number of rows in the image used to create the accumulator</w:t>
             </w:r>
           </w:p>
         </w:tc>
@@ -3352,7 +3350,7 @@
                 <w:b w:val="0"/>
                 <w:bCs w:val="0"/>
               </w:rPr>
-              <w:t>rows</w:t>
+              <w:t>cols</w:t>
             </w:r>
           </w:p>
         </w:tc>
@@ -3380,31 +3378,40 @@
               <w:cnfStyle w:val="000000100000" w:firstRow="0" w:lastRow="0" w:firstColumn="0" w:lastColumn="0" w:oddVBand="0" w:evenVBand="0" w:oddHBand="1" w:evenHBand="0" w:firstRowFirstColumn="0" w:firstRowLastColumn="0" w:lastRowFirstColumn="0" w:lastRowLastColumn="0"/>
             </w:pPr>
             <w:r>
-              <w:t>The number of rows in the image used to create the accumulator</w:t>
-            </w:r>
-          </w:p>
-        </w:tc>
-      </w:tr>
-      <w:tr>
-        <w:tc>
-          <w:tcPr>
-            <w:cnfStyle w:val="001000000000" w:firstRow="0" w:lastRow="0" w:firstColumn="1" w:lastColumn="0" w:oddVBand="0" w:evenVBand="0" w:oddHBand="0" w:evenHBand="0" w:firstRowFirstColumn="0" w:firstRowLastColumn="0" w:lastRowFirstColumn="0" w:lastRowLastColumn="0"/>
-            <w:tcW w:w="0" w:type="auto"/>
-          </w:tcPr>
-          <w:p>
-            <w:pPr>
-              <w:pStyle w:val="NoSpacing"/>
-              <w:rPr>
-                <w:b w:val="0"/>
-                <w:bCs w:val="0"/>
-              </w:rPr>
-            </w:pPr>
-            <w:r>
-              <w:rPr>
-                <w:b w:val="0"/>
-                <w:bCs w:val="0"/>
-              </w:rPr>
-              <w:t>cols</w:t>
+              <w:t>The number of columns in the image used to create the accumulator</w:t>
+            </w:r>
+          </w:p>
+        </w:tc>
+      </w:tr>
+      <w:tr>
+        <w:tc>
+          <w:tcPr>
+            <w:cnfStyle w:val="001000000000" w:firstRow="0" w:lastRow="0" w:firstColumn="1" w:lastColumn="0" w:oddVBand="0" w:evenVBand="0" w:oddHBand="0" w:evenHBand="0" w:firstRowFirstColumn="0" w:firstRowLastColumn="0" w:lastRowFirstColumn="0" w:lastRowLastColumn="0"/>
+            <w:tcW w:w="0" w:type="auto"/>
+          </w:tcPr>
+          <w:p>
+            <w:pPr>
+              <w:pStyle w:val="NoSpacing"/>
+              <w:rPr>
+                <w:b w:val="0"/>
+                <w:bCs w:val="0"/>
+              </w:rPr>
+            </w:pPr>
+            <w:proofErr w:type="spellStart"/>
+            <w:r>
+              <w:rPr>
+                <w:b w:val="0"/>
+                <w:bCs w:val="0"/>
+              </w:rPr>
+              <w:t>hough</w:t>
+            </w:r>
+            <w:proofErr w:type="spellEnd"/>
+            <w:r>
+              <w:rPr>
+                <w:b w:val="0"/>
+                <w:bCs w:val="0"/>
+              </w:rPr>
+              <w:t xml:space="preserve"> accumulator data</w:t>
             </w:r>
           </w:p>
         </w:tc>
@@ -3417,8 +3424,21 @@
               <w:pStyle w:val="NoSpacing"/>
               <w:cnfStyle w:val="000000000000" w:firstRow="0" w:lastRow="0" w:firstColumn="0" w:lastColumn="0" w:oddVBand="0" w:evenVBand="0" w:oddHBand="0" w:evenHBand="0" w:firstRowFirstColumn="0" w:firstRowLastColumn="0" w:lastRowFirstColumn="0" w:lastRowLastColumn="0"/>
             </w:pPr>
-            <w:r>
-              <w:t>32-bit integer</w:t>
+            <w:proofErr w:type="spellStart"/>
+            <w:r>
+              <w:t>nrhos</w:t>
+            </w:r>
+            <w:proofErr w:type="spellEnd"/>
+            <w:r>
+              <w:t xml:space="preserve"> * </w:t>
+            </w:r>
+            <w:proofErr w:type="spellStart"/>
+            <w:r>
+              <w:t>nthetas</w:t>
+            </w:r>
+            <w:proofErr w:type="spellEnd"/>
+            <w:r>
+              <w:t xml:space="preserve"> 32-bit integers</w:t>
             </w:r>
           </w:p>
         </w:tc>
@@ -3430,83 +3450,6 @@
             <w:pPr>
               <w:pStyle w:val="NoSpacing"/>
               <w:cnfStyle w:val="000000000000" w:firstRow="0" w:lastRow="0" w:firstColumn="0" w:lastColumn="0" w:oddVBand="0" w:evenVBand="0" w:oddHBand="0" w:evenHBand="0" w:firstRowFirstColumn="0" w:firstRowLastColumn="0" w:lastRowFirstColumn="0" w:lastRowLastColumn="0"/>
-            </w:pPr>
-            <w:r>
-              <w:t>The number of columns in the image used to create the accumulator</w:t>
-            </w:r>
-          </w:p>
-        </w:tc>
-      </w:tr>
-      <w:tr>
-        <w:trPr>
-          <w:cnfStyle w:val="000000100000" w:firstRow="0" w:lastRow="0" w:firstColumn="0" w:lastColumn="0" w:oddVBand="0" w:evenVBand="0" w:oddHBand="1" w:evenHBand="0" w:firstRowFirstColumn="0" w:firstRowLastColumn="0" w:lastRowFirstColumn="0" w:lastRowLastColumn="0"/>
-        </w:trPr>
-        <w:tc>
-          <w:tcPr>
-            <w:cnfStyle w:val="001000000000" w:firstRow="0" w:lastRow="0" w:firstColumn="1" w:lastColumn="0" w:oddVBand="0" w:evenVBand="0" w:oddHBand="0" w:evenHBand="0" w:firstRowFirstColumn="0" w:firstRowLastColumn="0" w:lastRowFirstColumn="0" w:lastRowLastColumn="0"/>
-            <w:tcW w:w="0" w:type="auto"/>
-          </w:tcPr>
-          <w:p>
-            <w:pPr>
-              <w:pStyle w:val="NoSpacing"/>
-              <w:rPr>
-                <w:b w:val="0"/>
-                <w:bCs w:val="0"/>
-              </w:rPr>
-            </w:pPr>
-            <w:proofErr w:type="spellStart"/>
-            <w:r>
-              <w:rPr>
-                <w:b w:val="0"/>
-                <w:bCs w:val="0"/>
-              </w:rPr>
-              <w:t>hough</w:t>
-            </w:r>
-            <w:proofErr w:type="spellEnd"/>
-            <w:r>
-              <w:rPr>
-                <w:b w:val="0"/>
-                <w:bCs w:val="0"/>
-              </w:rPr>
-              <w:t xml:space="preserve"> accumulator data</w:t>
-            </w:r>
-          </w:p>
-        </w:tc>
-        <w:tc>
-          <w:tcPr>
-            <w:tcW w:w="0" w:type="auto"/>
-          </w:tcPr>
-          <w:p>
-            <w:pPr>
-              <w:pStyle w:val="NoSpacing"/>
-              <w:cnfStyle w:val="000000100000" w:firstRow="0" w:lastRow="0" w:firstColumn="0" w:lastColumn="0" w:oddVBand="0" w:evenVBand="0" w:oddHBand="1" w:evenHBand="0" w:firstRowFirstColumn="0" w:firstRowLastColumn="0" w:lastRowFirstColumn="0" w:lastRowLastColumn="0"/>
-            </w:pPr>
-            <w:proofErr w:type="spellStart"/>
-            <w:r>
-              <w:t>nrhos</w:t>
-            </w:r>
-            <w:proofErr w:type="spellEnd"/>
-            <w:r>
-              <w:t xml:space="preserve"> * </w:t>
-            </w:r>
-            <w:proofErr w:type="spellStart"/>
-            <w:r>
-              <w:t>nthetas</w:t>
-            </w:r>
-            <w:proofErr w:type="spellEnd"/>
-            <w:r>
-              <w:t xml:space="preserve"> 32-bit integers</w:t>
-            </w:r>
-          </w:p>
-        </w:tc>
-        <w:tc>
-          <w:tcPr>
-            <w:tcW w:w="0" w:type="auto"/>
-          </w:tcPr>
-          <w:p>
-            <w:pPr>
-              <w:pStyle w:val="NoSpacing"/>
-              <w:cnfStyle w:val="000000100000" w:firstRow="0" w:lastRow="0" w:firstColumn="0" w:lastColumn="0" w:oddVBand="0" w:evenVBand="0" w:oddHBand="1" w:evenHBand="0" w:firstRowFirstColumn="0" w:firstRowLastColumn="0" w:lastRowFirstColumn="0" w:lastRowLastColumn="0"/>
             </w:pPr>
             <w:r>
               <w:t>The Hough accumulator (</w:t>
@@ -24295,7 +24238,7 @@
       <w:rPr>
         <w:noProof/>
       </w:rPr>
-      <w:t>8/5/2022 3:32 PM</w:t>
+      <w:t>8/11/2022 9:54 AM</w:t>
     </w:r>
     <w:r>
       <w:fldChar w:fldCharType="end"/>
@@ -24367,7 +24310,7 @@
           <w:rPr>
             <w:noProof/>
           </w:rPr>
-          <w:t>8/5/2022 3:32 PM</w:t>
+          <w:t>8/11/2022 9:54 AM</w:t>
         </w:r>
         <w:r>
           <w:fldChar w:fldCharType="end"/>

</xml_diff>

<commit_message>
v0.1.25 hough-image-create verified as correct
</commit_message>
<xml_diff>
--- a/doc/cv-workbench.docx
+++ b/doc/cv-workbench.docx
@@ -2323,14 +2323,14 @@
       <w:pPr>
         <w:pStyle w:val="code"/>
         <w:rPr>
-          <w:sz w:val="20"/>
-          <w:szCs w:val="20"/>
-        </w:rPr>
-      </w:pPr>
-      <w:r>
-        <w:rPr>
-          <w:sz w:val="20"/>
-          <w:szCs w:val="20"/>
+          <w:sz w:val="18"/>
+          <w:szCs w:val="18"/>
+        </w:rPr>
+      </w:pPr>
+      <w:r>
+        <w:rPr>
+          <w:sz w:val="18"/>
+          <w:szCs w:val="18"/>
         </w:rPr>
         <w:t xml:space="preserve">  </w:t>
       </w:r>
@@ -2338,15 +2338,15 @@
         <w:rPr>
           <w:i/>
           <w:iCs/>
-          <w:sz w:val="20"/>
-          <w:szCs w:val="20"/>
+          <w:sz w:val="18"/>
+          <w:szCs w:val="18"/>
         </w:rPr>
         <w:t xml:space="preserve">bin-value </w:t>
       </w:r>
       <w:r>
         <w:rPr>
-          <w:sz w:val="20"/>
-          <w:szCs w:val="20"/>
+          <w:sz w:val="18"/>
+          <w:szCs w:val="18"/>
         </w:rPr>
         <w:t>= lower_value + bin no. * (upper_value - lower_value) / (nbins – 1)</w:t>
       </w:r>
@@ -2863,7 +2863,7 @@
                 <w:b w:val="0"/>
                 <w:bCs w:val="0"/>
               </w:rPr>
-              <w:t>nrhos</w:t>
+              <w:t>rows</w:t>
             </w:r>
           </w:p>
         </w:tc>
@@ -2891,7 +2891,7 @@
               <w:cnfStyle w:val="000000000000" w:firstRow="0" w:lastRow="0" w:firstColumn="0" w:lastColumn="0" w:oddVBand="0" w:evenVBand="0" w:oddHBand="0" w:evenHBand="0" w:firstRowFirstColumn="0" w:firstRowLastColumn="0" w:lastRowFirstColumn="0" w:lastRowLastColumn="0"/>
             </w:pPr>
             <w:r>
-              <w:t>The number of rho values sampled</w:t>
+              <w:t>The number of rows in the image used to create the accumulator</w:t>
             </w:r>
           </w:p>
         </w:tc>
@@ -2918,7 +2918,7 @@
                 <w:b w:val="0"/>
                 <w:bCs w:val="0"/>
               </w:rPr>
-              <w:t>rows</w:t>
+              <w:t>cols</w:t>
             </w:r>
           </w:p>
         </w:tc>
@@ -2946,31 +2946,31 @@
               <w:cnfStyle w:val="000000100000" w:firstRow="0" w:lastRow="0" w:firstColumn="0" w:lastColumn="0" w:oddVBand="0" w:evenVBand="0" w:oddHBand="1" w:evenHBand="0" w:firstRowFirstColumn="0" w:firstRowLastColumn="0" w:lastRowFirstColumn="0" w:lastRowLastColumn="0"/>
             </w:pPr>
             <w:r>
-              <w:t>The number of rows in the image used to create the accumulator</w:t>
-            </w:r>
-          </w:p>
-        </w:tc>
-      </w:tr>
-      <w:tr>
-        <w:tc>
-          <w:tcPr>
-            <w:cnfStyle w:val="001000000000" w:firstRow="0" w:lastRow="0" w:firstColumn="1" w:lastColumn="0" w:oddVBand="0" w:evenVBand="0" w:oddHBand="0" w:evenHBand="0" w:firstRowFirstColumn="0" w:firstRowLastColumn="0" w:lastRowFirstColumn="0" w:lastRowLastColumn="0"/>
-            <w:tcW w:w="0" w:type="auto"/>
-          </w:tcPr>
-          <w:p>
-            <w:pPr>
-              <w:pStyle w:val="NoSpacing"/>
-              <w:rPr>
-                <w:b w:val="0"/>
-                <w:bCs w:val="0"/>
-              </w:rPr>
-            </w:pPr>
-            <w:r>
-              <w:rPr>
-                <w:b w:val="0"/>
-                <w:bCs w:val="0"/>
-              </w:rPr>
-              <w:t>cols</w:t>
+              <w:t>The number of columns in the image used to create the accumulator</w:t>
+            </w:r>
+          </w:p>
+        </w:tc>
+      </w:tr>
+      <w:tr>
+        <w:tc>
+          <w:tcPr>
+            <w:cnfStyle w:val="001000000000" w:firstRow="0" w:lastRow="0" w:firstColumn="1" w:lastColumn="0" w:oddVBand="0" w:evenVBand="0" w:oddHBand="0" w:evenHBand="0" w:firstRowFirstColumn="0" w:firstRowLastColumn="0" w:lastRowFirstColumn="0" w:lastRowLastColumn="0"/>
+            <w:tcW w:w="0" w:type="auto"/>
+          </w:tcPr>
+          <w:p>
+            <w:pPr>
+              <w:pStyle w:val="NoSpacing"/>
+              <w:rPr>
+                <w:b w:val="0"/>
+                <w:bCs w:val="0"/>
+              </w:rPr>
+            </w:pPr>
+            <w:r>
+              <w:rPr>
+                <w:b w:val="0"/>
+                <w:bCs w:val="0"/>
+              </w:rPr>
+              <w:t>hough accumulator data</w:t>
             </w:r>
           </w:p>
         </w:tc>
@@ -2984,7 +2984,7 @@
               <w:cnfStyle w:val="000000000000" w:firstRow="0" w:lastRow="0" w:firstColumn="0" w:lastColumn="0" w:oddVBand="0" w:evenVBand="0" w:oddHBand="0" w:evenHBand="0" w:firstRowFirstColumn="0" w:firstRowLastColumn="0" w:lastRowFirstColumn="0" w:lastRowLastColumn="0"/>
             </w:pPr>
             <w:r>
-              <w:t>32-bit integer</w:t>
+              <w:t>nrhos * nthetas 32-bit integers</w:t>
             </w:r>
           </w:p>
         </w:tc>
@@ -2996,61 +2996,6 @@
             <w:pPr>
               <w:pStyle w:val="NoSpacing"/>
               <w:cnfStyle w:val="000000000000" w:firstRow="0" w:lastRow="0" w:firstColumn="0" w:lastColumn="0" w:oddVBand="0" w:evenVBand="0" w:oddHBand="0" w:evenHBand="0" w:firstRowFirstColumn="0" w:firstRowLastColumn="0" w:lastRowFirstColumn="0" w:lastRowLastColumn="0"/>
-            </w:pPr>
-            <w:r>
-              <w:t>The number of columns in the image used to create the accumulator</w:t>
-            </w:r>
-          </w:p>
-        </w:tc>
-      </w:tr>
-      <w:tr>
-        <w:trPr>
-          <w:cnfStyle w:val="000000100000" w:firstRow="0" w:lastRow="0" w:firstColumn="0" w:lastColumn="0" w:oddVBand="0" w:evenVBand="0" w:oddHBand="1" w:evenHBand="0" w:firstRowFirstColumn="0" w:firstRowLastColumn="0" w:lastRowFirstColumn="0" w:lastRowLastColumn="0"/>
-        </w:trPr>
-        <w:tc>
-          <w:tcPr>
-            <w:cnfStyle w:val="001000000000" w:firstRow="0" w:lastRow="0" w:firstColumn="1" w:lastColumn="0" w:oddVBand="0" w:evenVBand="0" w:oddHBand="0" w:evenHBand="0" w:firstRowFirstColumn="0" w:firstRowLastColumn="0" w:lastRowFirstColumn="0" w:lastRowLastColumn="0"/>
-            <w:tcW w:w="0" w:type="auto"/>
-          </w:tcPr>
-          <w:p>
-            <w:pPr>
-              <w:pStyle w:val="NoSpacing"/>
-              <w:rPr>
-                <w:b w:val="0"/>
-                <w:bCs w:val="0"/>
-              </w:rPr>
-            </w:pPr>
-            <w:r>
-              <w:rPr>
-                <w:b w:val="0"/>
-                <w:bCs w:val="0"/>
-              </w:rPr>
-              <w:t>hough accumulator data</w:t>
-            </w:r>
-          </w:p>
-        </w:tc>
-        <w:tc>
-          <w:tcPr>
-            <w:tcW w:w="0" w:type="auto"/>
-          </w:tcPr>
-          <w:p>
-            <w:pPr>
-              <w:pStyle w:val="NoSpacing"/>
-              <w:cnfStyle w:val="000000100000" w:firstRow="0" w:lastRow="0" w:firstColumn="0" w:lastColumn="0" w:oddVBand="0" w:evenVBand="0" w:oddHBand="1" w:evenHBand="0" w:firstRowFirstColumn="0" w:firstRowLastColumn="0" w:lastRowFirstColumn="0" w:lastRowLastColumn="0"/>
-            </w:pPr>
-            <w:r>
-              <w:t>nrhos * nthetas 32-bit integers</w:t>
-            </w:r>
-          </w:p>
-        </w:tc>
-        <w:tc>
-          <w:tcPr>
-            <w:tcW w:w="0" w:type="auto"/>
-          </w:tcPr>
-          <w:p>
-            <w:pPr>
-              <w:pStyle w:val="NoSpacing"/>
-              <w:cnfStyle w:val="000000100000" w:firstRow="0" w:lastRow="0" w:firstColumn="0" w:lastColumn="0" w:oddVBand="0" w:evenVBand="0" w:oddHBand="1" w:evenHBand="0" w:firstRowFirstColumn="0" w:firstRowLastColumn="0" w:lastRowFirstColumn="0" w:lastRowLastColumn="0"/>
             </w:pPr>
             <w:r>
               <w:t>The Hough accumulator (rho_index, theta_index) count data</w:t>
@@ -3139,9 +3084,11 @@
       <w:pPr>
         <w:pStyle w:val="Heading2"/>
       </w:pPr>
+      <w:bookmarkStart w:id="2" w:name="_Ref110426442"/>
       <w:r>
         <w:t>Hough peak line data type format</w:t>
       </w:r>
+      <w:bookmarkEnd w:id="2"/>
     </w:p>
     <w:p>
       <w:pPr>
@@ -3509,7 +3456,7 @@
           <w:i/>
           <w:iCs/>
         </w:rPr>
-        <w:t>line-rho line-theta line-count</w:t>
+        <w:t>rho-index theta_index count</w:t>
       </w:r>
     </w:p>
     <w:p>
@@ -9135,8 +9082,16 @@
           <w:p>
             <w:pPr>
               <w:pStyle w:val="NoSpacing"/>
-            </w:pPr>
-            <w:r>
+              <w:rPr>
+                <w:b w:val="0"/>
+                <w:bCs w:val="0"/>
+              </w:rPr>
+            </w:pPr>
+            <w:r>
+              <w:rPr>
+                <w:b w:val="0"/>
+                <w:bCs w:val="0"/>
+              </w:rPr>
               <w:t>Hough</w:t>
             </w:r>
           </w:p>
@@ -9471,6 +9426,83 @@
               <w:cnfStyle w:val="000000100000" w:firstRow="0" w:lastRow="0" w:firstColumn="0" w:lastColumn="0" w:oddVBand="0" w:evenVBand="0" w:oddHBand="1" w:evenHBand="0" w:firstRowFirstColumn="0" w:firstRowLastColumn="0" w:lastRowFirstColumn="0" w:lastRowLastColumn="0"/>
             </w:pPr>
             <w:r>
+              <w:t>Image</w:t>
+            </w:r>
+          </w:p>
+        </w:tc>
+        <w:tc>
+          <w:tcPr>
+            <w:tcW w:w="0" w:type="auto"/>
+          </w:tcPr>
+          <w:p>
+            <w:pPr>
+              <w:pStyle w:val="NoSpacing"/>
+              <w:cnfStyle w:val="000000100000" w:firstRow="0" w:lastRow="0" w:firstColumn="0" w:lastColumn="0" w:oddVBand="0" w:evenVBand="0" w:oddHBand="1" w:evenHBand="0" w:firstRowFirstColumn="0" w:firstRowLastColumn="0" w:lastRowFirstColumn="0" w:lastRowLastColumn="0"/>
+            </w:pPr>
+            <w:r>
+              <w:t>Create</w:t>
+            </w:r>
+          </w:p>
+        </w:tc>
+        <w:tc>
+          <w:tcPr>
+            <w:tcW w:w="0" w:type="auto"/>
+          </w:tcPr>
+          <w:p>
+            <w:pPr>
+              <w:pStyle w:val="NoSpacing"/>
+              <w:cnfStyle w:val="000000100000" w:firstRow="0" w:lastRow="0" w:firstColumn="0" w:lastColumn="0" w:oddVBand="0" w:evenVBand="0" w:oddHBand="1" w:evenHBand="0" w:firstRowFirstColumn="0" w:firstRowLastColumn="0" w:lastRowFirstColumn="0" w:lastRowLastColumn="0"/>
+            </w:pPr>
+          </w:p>
+        </w:tc>
+        <w:tc>
+          <w:tcPr>
+            <w:tcW w:w="0" w:type="auto"/>
+          </w:tcPr>
+          <w:p>
+            <w:pPr>
+              <w:pStyle w:val="NoSpacing"/>
+              <w:cnfStyle w:val="000000100000" w:firstRow="0" w:lastRow="0" w:firstColumn="0" w:lastColumn="0" w:oddVBand="0" w:evenVBand="0" w:oddHBand="1" w:evenHBand="0" w:firstRowFirstColumn="0" w:firstRowLastColumn="0" w:lastRowFirstColumn="0" w:lastRowLastColumn="0"/>
+            </w:pPr>
+            <w:r>
+              <w:t>Create test image from text file or from scratch optionally with superimposed features</w:t>
+            </w:r>
+          </w:p>
+        </w:tc>
+      </w:tr>
+      <w:tr>
+        <w:tc>
+          <w:tcPr>
+            <w:cnfStyle w:val="001000000000" w:firstRow="0" w:lastRow="0" w:firstColumn="1" w:lastColumn="0" w:oddVBand="0" w:evenVBand="0" w:oddHBand="0" w:evenHBand="0" w:firstRowFirstColumn="0" w:firstRowLastColumn="0" w:lastRowFirstColumn="0" w:lastRowLastColumn="0"/>
+            <w:tcW w:w="0" w:type="auto"/>
+          </w:tcPr>
+          <w:p>
+            <w:pPr>
+              <w:pStyle w:val="NoSpacing"/>
+              <w:rPr>
+                <w:b w:val="0"/>
+                <w:bCs w:val="0"/>
+              </w:rPr>
+            </w:pPr>
+            <w:r>
+              <w:rPr>
+                <w:b w:val="0"/>
+                <w:bCs w:val="0"/>
+              </w:rPr>
+              <w:t>Transform</w:t>
+            </w:r>
+          </w:p>
+        </w:tc>
+        <w:tc>
+          <w:tcPr>
+            <w:tcW w:w="0" w:type="auto"/>
+          </w:tcPr>
+          <w:p>
+            <w:pPr>
+              <w:pStyle w:val="NoSpacing"/>
+              <w:cnfStyle w:val="000000000000" w:firstRow="0" w:lastRow="0" w:firstColumn="0" w:lastColumn="0" w:oddVBand="0" w:evenVBand="0" w:oddHBand="0" w:evenHBand="0" w:firstRowFirstColumn="0" w:firstRowLastColumn="0" w:lastRowFirstColumn="0" w:lastRowLastColumn="0"/>
+            </w:pPr>
+            <w:r>
               <w:t>Intensity</w:t>
             </w:r>
           </w:p>
@@ -9482,7 +9514,7 @@
           <w:p>
             <w:pPr>
               <w:pStyle w:val="NoSpacing"/>
-              <w:cnfStyle w:val="000000100000" w:firstRow="0" w:lastRow="0" w:firstColumn="0" w:lastColumn="0" w:oddVBand="0" w:evenVBand="0" w:oddHBand="1" w:evenHBand="0" w:firstRowFirstColumn="0" w:firstRowLastColumn="0" w:lastRowFirstColumn="0" w:lastRowLastColumn="0"/>
+              <w:cnfStyle w:val="000000000000" w:firstRow="0" w:lastRow="0" w:firstColumn="0" w:lastColumn="0" w:oddVBand="0" w:evenVBand="0" w:oddHBand="0" w:evenHBand="0" w:firstRowFirstColumn="0" w:firstRowLastColumn="0" w:lastRowFirstColumn="0" w:lastRowLastColumn="0"/>
             </w:pPr>
             <w:r>
               <w:t>Map</w:t>
@@ -9496,18 +9528,18 @@
           <w:p>
             <w:pPr>
               <w:pStyle w:val="NoSpacing"/>
-              <w:cnfStyle w:val="000000100000" w:firstRow="0" w:lastRow="0" w:firstColumn="0" w:lastColumn="0" w:oddVBand="0" w:evenVBand="0" w:oddHBand="1" w:evenHBand="0" w:firstRowFirstColumn="0" w:firstRowLastColumn="0" w:lastRowFirstColumn="0" w:lastRowLastColumn="0"/>
-            </w:pPr>
-          </w:p>
-        </w:tc>
-        <w:tc>
-          <w:tcPr>
-            <w:tcW w:w="0" w:type="auto"/>
-          </w:tcPr>
-          <w:p>
-            <w:pPr>
-              <w:pStyle w:val="NoSpacing"/>
-              <w:cnfStyle w:val="000000100000" w:firstRow="0" w:lastRow="0" w:firstColumn="0" w:lastColumn="0" w:oddVBand="0" w:evenVBand="0" w:oddHBand="1" w:evenHBand="0" w:firstRowFirstColumn="0" w:firstRowLastColumn="0" w:lastRowFirstColumn="0" w:lastRowLastColumn="0"/>
+              <w:cnfStyle w:val="000000000000" w:firstRow="0" w:lastRow="0" w:firstColumn="0" w:lastColumn="0" w:oddVBand="0" w:evenVBand="0" w:oddHBand="0" w:evenHBand="0" w:firstRowFirstColumn="0" w:firstRowLastColumn="0" w:lastRowFirstColumn="0" w:lastRowLastColumn="0"/>
+            </w:pPr>
+          </w:p>
+        </w:tc>
+        <w:tc>
+          <w:tcPr>
+            <w:tcW w:w="0" w:type="auto"/>
+          </w:tcPr>
+          <w:p>
+            <w:pPr>
+              <w:pStyle w:val="NoSpacing"/>
+              <w:cnfStyle w:val="000000000000" w:firstRow="0" w:lastRow="0" w:firstColumn="0" w:lastColumn="0" w:oddVBand="0" w:evenVBand="0" w:oddHBand="0" w:evenHBand="0" w:firstRowFirstColumn="0" w:firstRowLastColumn="0" w:lastRowFirstColumn="0" w:lastRowLastColumn="0"/>
             </w:pPr>
             <w:r>
               <w:t xml:space="preserve">Map CV_32S or CV_32F image intensities from an input intensity range to an output intensity range. Output images may be JPEG CV_8U images or binary CV_32S or CV_32F images. </w:t>
@@ -15509,7 +15541,7 @@
         <w:fldChar w:fldCharType="separate"/>
       </w:r>
       <w:r>
-        <w:t>7.2.2</w:t>
+        <w:t>5.2.2</w:t>
       </w:r>
       <w:r>
         <w:fldChar w:fldCharType="end"/>
@@ -16958,9 +16990,1276 @@
     </w:p>
     <w:p>
       <w:r>
-        <w:t>Planned but not yet implemented in the current release.</w:t>
-      </w:r>
-    </w:p>
+        <w:t xml:space="preserve">The Hough detect peak operator extracts the top (rho, theta) polar lines from a Hough accumulator amd stores it in binary or text format as described in section </w:t>
+      </w:r>
+      <w:r>
+        <w:fldChar w:fldCharType="begin"/>
+      </w:r>
+      <w:r>
+        <w:instrText xml:space="preserve"> REF _Ref110426442 \r \h </w:instrText>
+      </w:r>
+      <w:r>
+        <w:fldChar w:fldCharType="separate"/>
+      </w:r>
+      <w:r>
+        <w:t>5.4</w:t>
+      </w:r>
+      <w:r>
+        <w:fldChar w:fldCharType="end"/>
+      </w:r>
+      <w:r>
+        <w:t>.</w:t>
+      </w:r>
+    </w:p>
+    <w:p>
+      <w:r>
+        <w:t>The operator takes the following data descriptors:</w:t>
+      </w:r>
+    </w:p>
+    <w:tbl>
+      <w:tblPr>
+        <w:tblStyle w:val="PlainTable1"/>
+        <w:tblW w:w="9376" w:type="dxa"/>
+        <w:tblLook w:val="04A0" w:firstRow="1" w:lastRow="0" w:firstColumn="1" w:lastColumn="0" w:noHBand="0" w:noVBand="1"/>
+      </w:tblPr>
+      <w:tblGrid>
+        <w:gridCol w:w="1862"/>
+        <w:gridCol w:w="419"/>
+        <w:gridCol w:w="1390"/>
+        <w:gridCol w:w="1813"/>
+        <w:gridCol w:w="3892"/>
+      </w:tblGrid>
+      <w:tr>
+        <w:trPr>
+          <w:cnfStyle w:val="100000000000" w:firstRow="1" w:lastRow="0" w:firstColumn="0" w:lastColumn="0" w:oddVBand="0" w:evenVBand="0" w:oddHBand="0" w:evenHBand="0" w:firstRowFirstColumn="0" w:firstRowLastColumn="0" w:lastRowFirstColumn="0" w:lastRowLastColumn="0"/>
+          <w:cantSplit/>
+          <w:tblHeader/>
+        </w:trPr>
+        <w:tc>
+          <w:tcPr>
+            <w:cnfStyle w:val="001000000000" w:firstRow="0" w:lastRow="0" w:firstColumn="1" w:lastColumn="0" w:oddVBand="0" w:evenVBand="0" w:oddHBand="0" w:evenHBand="0" w:firstRowFirstColumn="0" w:firstRowLastColumn="0" w:lastRowFirstColumn="0" w:lastRowLastColumn="0"/>
+            <w:tcW w:w="0" w:type="auto"/>
+          </w:tcPr>
+          <w:p>
+            <w:r>
+              <w:t>Descriptor type</w:t>
+            </w:r>
+          </w:p>
+        </w:tc>
+        <w:tc>
+          <w:tcPr>
+            <w:tcW w:w="0" w:type="auto"/>
+          </w:tcPr>
+          <w:p>
+            <w:pPr>
+              <w:cnfStyle w:val="100000000000" w:firstRow="1" w:lastRow="0" w:firstColumn="0" w:lastColumn="0" w:oddVBand="0" w:evenVBand="0" w:oddHBand="0" w:evenHBand="0" w:firstRowFirstColumn="0" w:firstRowLastColumn="0" w:lastRowFirstColumn="0" w:lastRowLastColumn="0"/>
+            </w:pPr>
+            <w:r>
+              <w:t>Id</w:t>
+            </w:r>
+          </w:p>
+        </w:tc>
+        <w:tc>
+          <w:tcPr>
+            <w:tcW w:w="0" w:type="auto"/>
+          </w:tcPr>
+          <w:p>
+            <w:pPr>
+              <w:cnfStyle w:val="100000000000" w:firstRow="1" w:lastRow="0" w:firstColumn="0" w:lastColumn="0" w:oddVBand="0" w:evenVBand="0" w:oddHBand="0" w:evenHBand="0" w:firstRowFirstColumn="0" w:firstRowLastColumn="0" w:lastRowFirstColumn="0" w:lastRowLastColumn="0"/>
+            </w:pPr>
+            <w:r>
+              <w:t>type</w:t>
+            </w:r>
+          </w:p>
+        </w:tc>
+        <w:tc>
+          <w:tcPr>
+            <w:tcW w:w="0" w:type="auto"/>
+          </w:tcPr>
+          <w:p>
+            <w:pPr>
+              <w:cnfStyle w:val="100000000000" w:firstRow="1" w:lastRow="0" w:firstColumn="0" w:lastColumn="0" w:oddVBand="0" w:evenVBand="0" w:oddHBand="0" w:evenHBand="0" w:firstRowFirstColumn="0" w:firstRowLastColumn="0" w:lastRowFirstColumn="0" w:lastRowLastColumn="0"/>
+            </w:pPr>
+            <w:r>
+              <w:t>Format</w:t>
+            </w:r>
+          </w:p>
+        </w:tc>
+        <w:tc>
+          <w:tcPr>
+            <w:tcW w:w="0" w:type="auto"/>
+          </w:tcPr>
+          <w:p>
+            <w:pPr>
+              <w:cnfStyle w:val="100000000000" w:firstRow="1" w:lastRow="0" w:firstColumn="0" w:lastColumn="0" w:oddVBand="0" w:evenVBand="0" w:oddHBand="0" w:evenHBand="0" w:firstRowFirstColumn="0" w:firstRowLastColumn="0" w:lastRowFirstColumn="0" w:lastRowLastColumn="0"/>
+            </w:pPr>
+            <w:r>
+              <w:t>Description</w:t>
+            </w:r>
+          </w:p>
+        </w:tc>
+      </w:tr>
+      <w:tr>
+        <w:trPr>
+          <w:cnfStyle w:val="000000100000" w:firstRow="0" w:lastRow="0" w:firstColumn="0" w:lastColumn="0" w:oddVBand="0" w:evenVBand="0" w:oddHBand="1" w:evenHBand="0" w:firstRowFirstColumn="0" w:firstRowLastColumn="0" w:lastRowFirstColumn="0" w:lastRowLastColumn="0"/>
+        </w:trPr>
+        <w:tc>
+          <w:tcPr>
+            <w:cnfStyle w:val="001000000000" w:firstRow="0" w:lastRow="0" w:firstColumn="1" w:lastColumn="0" w:oddVBand="0" w:evenVBand="0" w:oddHBand="0" w:evenHBand="0" w:firstRowFirstColumn="0" w:firstRowLastColumn="0" w:lastRowFirstColumn="0" w:lastRowLastColumn="0"/>
+            <w:tcW w:w="0" w:type="auto"/>
+          </w:tcPr>
+          <w:p>
+            <w:pPr>
+              <w:rPr>
+                <w:b w:val="0"/>
+                <w:bCs w:val="0"/>
+              </w:rPr>
+            </w:pPr>
+            <w:r>
+              <w:rPr>
+                <w:b w:val="0"/>
+                <w:bCs w:val="0"/>
+              </w:rPr>
+              <w:t>input</w:t>
+            </w:r>
+          </w:p>
+        </w:tc>
+        <w:tc>
+          <w:tcPr>
+            <w:tcW w:w="0" w:type="auto"/>
+          </w:tcPr>
+          <w:p>
+            <w:pPr>
+              <w:cnfStyle w:val="000000100000" w:firstRow="0" w:lastRow="0" w:firstColumn="0" w:lastColumn="0" w:oddVBand="0" w:evenVBand="0" w:oddHBand="1" w:evenHBand="0" w:firstRowFirstColumn="0" w:firstRowLastColumn="0" w:lastRowFirstColumn="0" w:lastRowLastColumn="0"/>
+            </w:pPr>
+            <w:r>
+              <w:t>1</w:t>
+            </w:r>
+          </w:p>
+        </w:tc>
+        <w:tc>
+          <w:tcPr>
+            <w:tcW w:w="0" w:type="auto"/>
+          </w:tcPr>
+          <w:p>
+            <w:pPr>
+              <w:cnfStyle w:val="000000100000" w:firstRow="0" w:lastRow="0" w:firstColumn="0" w:lastColumn="0" w:oddVBand="0" w:evenVBand="0" w:oddHBand="1" w:evenHBand="0" w:firstRowFirstColumn="0" w:firstRowLastColumn="0" w:lastRowFirstColumn="0" w:lastRowLastColumn="0"/>
+            </w:pPr>
+            <w:r>
+              <w:t>“hough”</w:t>
+            </w:r>
+          </w:p>
+        </w:tc>
+        <w:tc>
+          <w:tcPr>
+            <w:tcW w:w="0" w:type="auto"/>
+          </w:tcPr>
+          <w:p>
+            <w:pPr>
+              <w:cnfStyle w:val="000000100000" w:firstRow="0" w:lastRow="0" w:firstColumn="0" w:lastColumn="0" w:oddVBand="0" w:evenVBand="0" w:oddHBand="1" w:evenHBand="0" w:firstRowFirstColumn="0" w:firstRowLastColumn="0" w:lastRowFirstColumn="0" w:lastRowLastColumn="0"/>
+            </w:pPr>
+            <w:r>
+              <w:t>“binary”</w:t>
+            </w:r>
+          </w:p>
+        </w:tc>
+        <w:tc>
+          <w:tcPr>
+            <w:tcW w:w="0" w:type="auto"/>
+          </w:tcPr>
+          <w:p>
+            <w:pPr>
+              <w:cnfStyle w:val="000000100000" w:firstRow="0" w:lastRow="0" w:firstColumn="0" w:lastColumn="0" w:oddVBand="0" w:evenVBand="0" w:oddHBand="1" w:evenHBand="0" w:firstRowFirstColumn="0" w:firstRowLastColumn="0" w:lastRowFirstColumn="0" w:lastRowLastColumn="0"/>
+            </w:pPr>
+            <w:r>
+              <w:t>input Hough accumulator data</w:t>
+            </w:r>
+          </w:p>
+        </w:tc>
+      </w:tr>
+      <w:tr>
+        <w:tc>
+          <w:tcPr>
+            <w:cnfStyle w:val="001000000000" w:firstRow="0" w:lastRow="0" w:firstColumn="1" w:lastColumn="0" w:oddVBand="0" w:evenVBand="0" w:oddHBand="0" w:evenHBand="0" w:firstRowFirstColumn="0" w:firstRowLastColumn="0" w:lastRowFirstColumn="0" w:lastRowLastColumn="0"/>
+            <w:tcW w:w="0" w:type="auto"/>
+          </w:tcPr>
+          <w:p>
+            <w:pPr>
+              <w:rPr>
+                <w:b w:val="0"/>
+                <w:bCs w:val="0"/>
+              </w:rPr>
+            </w:pPr>
+            <w:r>
+              <w:rPr>
+                <w:b w:val="0"/>
+                <w:bCs w:val="0"/>
+              </w:rPr>
+              <w:t>output</w:t>
+            </w:r>
+          </w:p>
+        </w:tc>
+        <w:tc>
+          <w:tcPr>
+            <w:tcW w:w="0" w:type="auto"/>
+          </w:tcPr>
+          <w:p>
+            <w:pPr>
+              <w:cnfStyle w:val="000000000000" w:firstRow="0" w:lastRow="0" w:firstColumn="0" w:lastColumn="0" w:oddVBand="0" w:evenVBand="0" w:oddHBand="0" w:evenHBand="0" w:firstRowFirstColumn="0" w:firstRowLastColumn="0" w:lastRowFirstColumn="0" w:lastRowLastColumn="0"/>
+            </w:pPr>
+            <w:r>
+              <w:t>1</w:t>
+            </w:r>
+          </w:p>
+        </w:tc>
+        <w:tc>
+          <w:tcPr>
+            <w:tcW w:w="0" w:type="auto"/>
+          </w:tcPr>
+          <w:p>
+            <w:pPr>
+              <w:cnfStyle w:val="000000000000" w:firstRow="0" w:lastRow="0" w:firstColumn="0" w:lastColumn="0" w:oddVBand="0" w:evenVBand="0" w:oddHBand="0" w:evenHBand="0" w:firstRowFirstColumn="0" w:firstRowLastColumn="0" w:lastRowFirstColumn="0" w:lastRowLastColumn="0"/>
+            </w:pPr>
+            <w:r>
+              <w:t>“peak-lines”</w:t>
+            </w:r>
+          </w:p>
+        </w:tc>
+        <w:tc>
+          <w:tcPr>
+            <w:tcW w:w="0" w:type="auto"/>
+          </w:tcPr>
+          <w:p>
+            <w:pPr>
+              <w:cnfStyle w:val="000000000000" w:firstRow="0" w:lastRow="0" w:firstColumn="0" w:lastColumn="0" w:oddVBand="0" w:evenVBand="0" w:oddHBand="0" w:evenHBand="0" w:firstRowFirstColumn="0" w:firstRowLastColumn="0" w:lastRowFirstColumn="0" w:lastRowLastColumn="0"/>
+            </w:pPr>
+            <w:r>
+              <w:t>“binary” or “text”</w:t>
+            </w:r>
+          </w:p>
+        </w:tc>
+        <w:tc>
+          <w:tcPr>
+            <w:tcW w:w="0" w:type="auto"/>
+          </w:tcPr>
+          <w:p>
+            <w:pPr>
+              <w:cnfStyle w:val="000000000000" w:firstRow="0" w:lastRow="0" w:firstColumn="0" w:lastColumn="0" w:oddVBand="0" w:evenVBand="0" w:oddHBand="0" w:evenHBand="0" w:firstRowFirstColumn="0" w:firstRowLastColumn="0" w:lastRowFirstColumn="0" w:lastRowLastColumn="0"/>
+            </w:pPr>
+            <w:r>
+              <w:t>output Hough accumulator peak data</w:t>
+            </w:r>
+          </w:p>
+        </w:tc>
+      </w:tr>
+    </w:tbl>
+    <w:p>
+      <w:pPr>
+        <w:pStyle w:val="Normalafterlist"/>
+      </w:pPr>
+      <w:r>
+        <w:t>The parameters to the create image Hough operator is:</w:t>
+      </w:r>
+    </w:p>
+    <w:tbl>
+      <w:tblPr>
+        <w:tblStyle w:val="PlainTable1"/>
+        <w:tblW w:w="0" w:type="auto"/>
+        <w:tblLook w:val="04A0" w:firstRow="1" w:lastRow="0" w:firstColumn="1" w:lastColumn="0" w:noHBand="0" w:noVBand="1"/>
+      </w:tblPr>
+      <w:tblGrid>
+        <w:gridCol w:w="1280"/>
+        <w:gridCol w:w="4435"/>
+      </w:tblGrid>
+      <w:tr>
+        <w:trPr>
+          <w:cnfStyle w:val="100000000000" w:firstRow="1" w:lastRow="0" w:firstColumn="0" w:lastColumn="0" w:oddVBand="0" w:evenVBand="0" w:oddHBand="0" w:evenHBand="0" w:firstRowFirstColumn="0" w:firstRowLastColumn="0" w:lastRowFirstColumn="0" w:lastRowLastColumn="0"/>
+          <w:cantSplit/>
+          <w:tblHeader/>
+        </w:trPr>
+        <w:tc>
+          <w:tcPr>
+            <w:cnfStyle w:val="001000000000" w:firstRow="0" w:lastRow="0" w:firstColumn="1" w:lastColumn="0" w:oddVBand="0" w:evenVBand="0" w:oddHBand="0" w:evenHBand="0" w:firstRowFirstColumn="0" w:firstRowLastColumn="0" w:lastRowFirstColumn="0" w:lastRowLastColumn="0"/>
+            <w:tcW w:w="0" w:type="auto"/>
+          </w:tcPr>
+          <w:p>
+            <w:r>
+              <w:t>parameter</w:t>
+            </w:r>
+          </w:p>
+        </w:tc>
+        <w:tc>
+          <w:tcPr>
+            <w:tcW w:w="0" w:type="auto"/>
+          </w:tcPr>
+          <w:p>
+            <w:pPr>
+              <w:cnfStyle w:val="100000000000" w:firstRow="1" w:lastRow="0" w:firstColumn="0" w:lastColumn="0" w:oddVBand="0" w:evenVBand="0" w:oddHBand="0" w:evenHBand="0" w:firstRowFirstColumn="0" w:firstRowLastColumn="0" w:lastRowFirstColumn="0" w:lastRowLastColumn="0"/>
+            </w:pPr>
+            <w:r>
+              <w:t>description</w:t>
+            </w:r>
+          </w:p>
+        </w:tc>
+      </w:tr>
+      <w:tr>
+        <w:trPr>
+          <w:cnfStyle w:val="000000100000" w:firstRow="0" w:lastRow="0" w:firstColumn="0" w:lastColumn="0" w:oddVBand="0" w:evenVBand="0" w:oddHBand="1" w:evenHBand="0" w:firstRowFirstColumn="0" w:firstRowLastColumn="0" w:lastRowFirstColumn="0" w:lastRowLastColumn="0"/>
+        </w:trPr>
+        <w:tc>
+          <w:tcPr>
+            <w:cnfStyle w:val="001000000000" w:firstRow="0" w:lastRow="0" w:firstColumn="1" w:lastColumn="0" w:oddVBand="0" w:evenVBand="0" w:oddHBand="0" w:evenHBand="0" w:firstRowFirstColumn="0" w:firstRowLastColumn="0" w:lastRowFirstColumn="0" w:lastRowLastColumn="0"/>
+            <w:tcW w:w="0" w:type="auto"/>
+          </w:tcPr>
+          <w:p>
+            <w:pPr>
+              <w:rPr>
+                <w:b w:val="0"/>
+                <w:bCs w:val="0"/>
+              </w:rPr>
+            </w:pPr>
+            <w:r>
+              <w:rPr>
+                <w:b w:val="0"/>
+                <w:bCs w:val="0"/>
+              </w:rPr>
+              <w:t>npeaks</w:t>
+            </w:r>
+          </w:p>
+        </w:tc>
+        <w:tc>
+          <w:tcPr>
+            <w:tcW w:w="0" w:type="auto"/>
+          </w:tcPr>
+          <w:p>
+            <w:pPr>
+              <w:cnfStyle w:val="000000100000" w:firstRow="0" w:lastRow="0" w:firstColumn="0" w:lastColumn="0" w:oddVBand="0" w:evenVBand="0" w:oddHBand="1" w:evenHBand="0" w:firstRowFirstColumn="0" w:firstRowLastColumn="0" w:lastRowFirstColumn="0" w:lastRowLastColumn="0"/>
+            </w:pPr>
+            <w:r>
+              <w:t>the number of (rho, theta) polar lines to find</w:t>
+            </w:r>
+          </w:p>
+        </w:tc>
+      </w:tr>
+    </w:tbl>
+    <w:p>
+      <w:pPr>
+        <w:pStyle w:val="Normalafterlist"/>
+      </w:pPr>
+      <w:r>
+        <w:t>The experiment log output includes the output Hough accumulator statistics:</w:t>
+      </w:r>
+    </w:p>
+    <w:tbl>
+      <w:tblPr>
+        <w:tblStyle w:val="PlainTable1"/>
+        <w:tblW w:w="0" w:type="auto"/>
+        <w:tblLook w:val="04A0" w:firstRow="1" w:lastRow="0" w:firstColumn="1" w:lastColumn="0" w:noHBand="0" w:noVBand="1"/>
+      </w:tblPr>
+      <w:tblGrid>
+        <w:gridCol w:w="2369"/>
+        <w:gridCol w:w="5781"/>
+      </w:tblGrid>
+      <w:tr>
+        <w:trPr>
+          <w:cnfStyle w:val="100000000000" w:firstRow="1" w:lastRow="0" w:firstColumn="0" w:lastColumn="0" w:oddVBand="0" w:evenVBand="0" w:oddHBand="0" w:evenHBand="0" w:firstRowFirstColumn="0" w:firstRowLastColumn="0" w:lastRowFirstColumn="0" w:lastRowLastColumn="0"/>
+          <w:cantSplit/>
+          <w:tblHeader/>
+        </w:trPr>
+        <w:tc>
+          <w:tcPr>
+            <w:cnfStyle w:val="001000000000" w:firstRow="0" w:lastRow="0" w:firstColumn="1" w:lastColumn="0" w:oddVBand="0" w:evenVBand="0" w:oddHBand="0" w:evenHBand="0" w:firstRowFirstColumn="0" w:firstRowLastColumn="0" w:lastRowFirstColumn="0" w:lastRowLastColumn="0"/>
+            <w:tcW w:w="0" w:type="auto"/>
+          </w:tcPr>
+          <w:p>
+            <w:pPr>
+              <w:pStyle w:val="NoSpacing"/>
+            </w:pPr>
+            <w:r>
+              <w:t>Field</w:t>
+            </w:r>
+          </w:p>
+        </w:tc>
+        <w:tc>
+          <w:tcPr>
+            <w:tcW w:w="0" w:type="auto"/>
+          </w:tcPr>
+          <w:p>
+            <w:pPr>
+              <w:pStyle w:val="NoSpacing"/>
+              <w:cnfStyle w:val="100000000000" w:firstRow="1" w:lastRow="0" w:firstColumn="0" w:lastColumn="0" w:oddVBand="0" w:evenVBand="0" w:oddHBand="0" w:evenHBand="0" w:firstRowFirstColumn="0" w:firstRowLastColumn="0" w:lastRowFirstColumn="0" w:lastRowLastColumn="0"/>
+            </w:pPr>
+            <w:r>
+              <w:t>Description</w:t>
+            </w:r>
+          </w:p>
+        </w:tc>
+      </w:tr>
+      <w:tr>
+        <w:trPr>
+          <w:cnfStyle w:val="000000100000" w:firstRow="0" w:lastRow="0" w:firstColumn="0" w:lastColumn="0" w:oddVBand="0" w:evenVBand="0" w:oddHBand="1" w:evenHBand="0" w:firstRowFirstColumn="0" w:firstRowLastColumn="0" w:lastRowFirstColumn="0" w:lastRowLastColumn="0"/>
+        </w:trPr>
+        <w:tc>
+          <w:tcPr>
+            <w:cnfStyle w:val="001000000000" w:firstRow="0" w:lastRow="0" w:firstColumn="1" w:lastColumn="0" w:oddVBand="0" w:evenVBand="0" w:oddHBand="0" w:evenHBand="0" w:firstRowFirstColumn="0" w:firstRowLastColumn="0" w:lastRowFirstColumn="0" w:lastRowLastColumn="0"/>
+            <w:tcW w:w="0" w:type="auto"/>
+          </w:tcPr>
+          <w:p>
+            <w:pPr>
+              <w:pStyle w:val="NoSpacing"/>
+            </w:pPr>
+          </w:p>
+        </w:tc>
+        <w:tc>
+          <w:tcPr>
+            <w:tcW w:w="0" w:type="auto"/>
+          </w:tcPr>
+          <w:p>
+            <w:pPr>
+              <w:pStyle w:val="NoSpacing"/>
+              <w:cnfStyle w:val="000000100000" w:firstRow="0" w:lastRow="0" w:firstColumn="0" w:lastColumn="0" w:oddVBand="0" w:evenVBand="0" w:oddHBand="1" w:evenHBand="0" w:firstRowFirstColumn="0" w:firstRowLastColumn="0" w:lastRowFirstColumn="0" w:lastRowLastColumn="0"/>
+            </w:pPr>
+          </w:p>
+        </w:tc>
+      </w:tr>
+      <w:tr>
+        <w:tc>
+          <w:tcPr>
+            <w:cnfStyle w:val="001000000000" w:firstRow="0" w:lastRow="0" w:firstColumn="1" w:lastColumn="0" w:oddVBand="0" w:evenVBand="0" w:oddHBand="0" w:evenHBand="0" w:firstRowFirstColumn="0" w:firstRowLastColumn="0" w:lastRowFirstColumn="0" w:lastRowLastColumn="0"/>
+            <w:tcW w:w="0" w:type="auto"/>
+          </w:tcPr>
+          <w:p>
+            <w:pPr>
+              <w:pStyle w:val="NoSpacing"/>
+              <w:rPr>
+                <w:b w:val="0"/>
+                <w:bCs w:val="0"/>
+              </w:rPr>
+            </w:pPr>
+            <w:r>
+              <w:rPr>
+                <w:b w:val="0"/>
+                <w:bCs w:val="0"/>
+              </w:rPr>
+              <w:t>theta_inc</w:t>
+            </w:r>
+          </w:p>
+        </w:tc>
+        <w:tc>
+          <w:tcPr>
+            <w:tcW w:w="0" w:type="auto"/>
+          </w:tcPr>
+          <w:p>
+            <w:pPr>
+              <w:pStyle w:val="NoSpacing"/>
+              <w:cnfStyle w:val="000000000000" w:firstRow="0" w:lastRow="0" w:firstColumn="0" w:lastColumn="0" w:oddVBand="0" w:evenVBand="0" w:oddHBand="0" w:evenHBand="0" w:firstRowFirstColumn="0" w:firstRowLastColumn="0" w:lastRowFirstColumn="0" w:lastRowLastColumn="0"/>
+            </w:pPr>
+            <w:r>
+              <w:t>The increment between sampled angles in degrees</w:t>
+            </w:r>
+          </w:p>
+        </w:tc>
+      </w:tr>
+      <w:tr>
+        <w:trPr>
+          <w:cnfStyle w:val="000000100000" w:firstRow="0" w:lastRow="0" w:firstColumn="0" w:lastColumn="0" w:oddVBand="0" w:evenVBand="0" w:oddHBand="1" w:evenHBand="0" w:firstRowFirstColumn="0" w:firstRowLastColumn="0" w:lastRowFirstColumn="0" w:lastRowLastColumn="0"/>
+        </w:trPr>
+        <w:tc>
+          <w:tcPr>
+            <w:cnfStyle w:val="001000000000" w:firstRow="0" w:lastRow="0" w:firstColumn="1" w:lastColumn="0" w:oddVBand="0" w:evenVBand="0" w:oddHBand="0" w:evenHBand="0" w:firstRowFirstColumn="0" w:firstRowLastColumn="0" w:lastRowFirstColumn="0" w:lastRowLastColumn="0"/>
+            <w:tcW w:w="0" w:type="auto"/>
+          </w:tcPr>
+          <w:p>
+            <w:pPr>
+              <w:pStyle w:val="NoSpacing"/>
+              <w:rPr>
+                <w:b w:val="0"/>
+                <w:bCs w:val="0"/>
+              </w:rPr>
+            </w:pPr>
+            <w:r>
+              <w:rPr>
+                <w:b w:val="0"/>
+                <w:bCs w:val="0"/>
+              </w:rPr>
+              <w:t>nthetas</w:t>
+            </w:r>
+          </w:p>
+        </w:tc>
+        <w:tc>
+          <w:tcPr>
+            <w:tcW w:w="0" w:type="auto"/>
+          </w:tcPr>
+          <w:p>
+            <w:pPr>
+              <w:pStyle w:val="NoSpacing"/>
+              <w:cnfStyle w:val="000000100000" w:firstRow="0" w:lastRow="0" w:firstColumn="0" w:lastColumn="0" w:oddVBand="0" w:evenVBand="0" w:oddHBand="1" w:evenHBand="0" w:firstRowFirstColumn="0" w:firstRowLastColumn="0" w:lastRowFirstColumn="0" w:lastRowLastColumn="0"/>
+            </w:pPr>
+            <w:r>
+              <w:t>The number of angles sampled = 180 / theta_inc</w:t>
+            </w:r>
+          </w:p>
+        </w:tc>
+      </w:tr>
+      <w:tr>
+        <w:tc>
+          <w:tcPr>
+            <w:cnfStyle w:val="001000000000" w:firstRow="0" w:lastRow="0" w:firstColumn="1" w:lastColumn="0" w:oddVBand="0" w:evenVBand="0" w:oddHBand="0" w:evenHBand="0" w:firstRowFirstColumn="0" w:firstRowLastColumn="0" w:lastRowFirstColumn="0" w:lastRowLastColumn="0"/>
+            <w:tcW w:w="0" w:type="auto"/>
+          </w:tcPr>
+          <w:p>
+            <w:pPr>
+              <w:pStyle w:val="NoSpacing"/>
+              <w:rPr>
+                <w:b w:val="0"/>
+                <w:bCs w:val="0"/>
+              </w:rPr>
+            </w:pPr>
+            <w:r>
+              <w:rPr>
+                <w:b w:val="0"/>
+                <w:bCs w:val="0"/>
+              </w:rPr>
+              <w:t>nrhos</w:t>
+            </w:r>
+          </w:p>
+        </w:tc>
+        <w:tc>
+          <w:tcPr>
+            <w:tcW w:w="0" w:type="auto"/>
+          </w:tcPr>
+          <w:p>
+            <w:pPr>
+              <w:pStyle w:val="NoSpacing"/>
+              <w:cnfStyle w:val="000000000000" w:firstRow="0" w:lastRow="0" w:firstColumn="0" w:lastColumn="0" w:oddVBand="0" w:evenVBand="0" w:oddHBand="0" w:evenHBand="0" w:firstRowFirstColumn="0" w:firstRowLastColumn="0" w:lastRowFirstColumn="0" w:lastRowLastColumn="0"/>
+            </w:pPr>
+            <w:r>
+              <w:t>The number of rho values sampled</w:t>
+            </w:r>
+          </w:p>
+        </w:tc>
+      </w:tr>
+      <w:tr>
+        <w:trPr>
+          <w:cnfStyle w:val="000000100000" w:firstRow="0" w:lastRow="0" w:firstColumn="0" w:lastColumn="0" w:oddVBand="0" w:evenVBand="0" w:oddHBand="1" w:evenHBand="0" w:firstRowFirstColumn="0" w:firstRowLastColumn="0" w:lastRowFirstColumn="0" w:lastRowLastColumn="0"/>
+        </w:trPr>
+        <w:tc>
+          <w:tcPr>
+            <w:cnfStyle w:val="001000000000" w:firstRow="0" w:lastRow="0" w:firstColumn="1" w:lastColumn="0" w:oddVBand="0" w:evenVBand="0" w:oddHBand="0" w:evenHBand="0" w:firstRowFirstColumn="0" w:firstRowLastColumn="0" w:lastRowFirstColumn="0" w:lastRowLastColumn="0"/>
+            <w:tcW w:w="0" w:type="auto"/>
+          </w:tcPr>
+          <w:p>
+            <w:pPr>
+              <w:pStyle w:val="NoSpacing"/>
+              <w:rPr>
+                <w:b w:val="0"/>
+                <w:bCs w:val="0"/>
+              </w:rPr>
+            </w:pPr>
+            <w:r>
+              <w:rPr>
+                <w:b w:val="0"/>
+                <w:bCs w:val="0"/>
+              </w:rPr>
+              <w:t>bin min_count</w:t>
+            </w:r>
+          </w:p>
+        </w:tc>
+        <w:tc>
+          <w:tcPr>
+            <w:tcW w:w="0" w:type="auto"/>
+          </w:tcPr>
+          <w:p>
+            <w:pPr>
+              <w:pStyle w:val="NoSpacing"/>
+              <w:cnfStyle w:val="000000100000" w:firstRow="0" w:lastRow="0" w:firstColumn="0" w:lastColumn="0" w:oddVBand="0" w:evenVBand="0" w:oddHBand="1" w:evenHBand="0" w:firstRowFirstColumn="0" w:firstRowLastColumn="0" w:lastRowFirstColumn="0" w:lastRowLastColumn="0"/>
+            </w:pPr>
+            <w:r>
+              <w:t>The lowest count for any histogram bin</w:t>
+            </w:r>
+          </w:p>
+        </w:tc>
+      </w:tr>
+      <w:tr>
+        <w:tc>
+          <w:tcPr>
+            <w:cnfStyle w:val="001000000000" w:firstRow="0" w:lastRow="0" w:firstColumn="1" w:lastColumn="0" w:oddVBand="0" w:evenVBand="0" w:oddHBand="0" w:evenHBand="0" w:firstRowFirstColumn="0" w:firstRowLastColumn="0" w:lastRowFirstColumn="0" w:lastRowLastColumn="0"/>
+            <w:tcW w:w="0" w:type="auto"/>
+          </w:tcPr>
+          <w:p>
+            <w:pPr>
+              <w:pStyle w:val="NoSpacing"/>
+              <w:rPr>
+                <w:b w:val="0"/>
+                <w:bCs w:val="0"/>
+              </w:rPr>
+            </w:pPr>
+            <w:r>
+              <w:rPr>
+                <w:b w:val="0"/>
+                <w:bCs w:val="0"/>
+              </w:rPr>
+              <w:t>bin max_count</w:t>
+            </w:r>
+          </w:p>
+        </w:tc>
+        <w:tc>
+          <w:tcPr>
+            <w:tcW w:w="0" w:type="auto"/>
+          </w:tcPr>
+          <w:p>
+            <w:pPr>
+              <w:pStyle w:val="NoSpacing"/>
+              <w:cnfStyle w:val="000000000000" w:firstRow="0" w:lastRow="0" w:firstColumn="0" w:lastColumn="0" w:oddVBand="0" w:evenVBand="0" w:oddHBand="0" w:evenHBand="0" w:firstRowFirstColumn="0" w:firstRowLastColumn="0" w:lastRowFirstColumn="0" w:lastRowLastColumn="0"/>
+            </w:pPr>
+            <w:r>
+              <w:t>The largest count for any histogram bin</w:t>
+            </w:r>
+          </w:p>
+        </w:tc>
+      </w:tr>
+      <w:tr>
+        <w:trPr>
+          <w:cnfStyle w:val="000000100000" w:firstRow="0" w:lastRow="0" w:firstColumn="0" w:lastColumn="0" w:oddVBand="0" w:evenVBand="0" w:oddHBand="1" w:evenHBand="0" w:firstRowFirstColumn="0" w:firstRowLastColumn="0" w:lastRowFirstColumn="0" w:lastRowLastColumn="0"/>
+        </w:trPr>
+        <w:tc>
+          <w:tcPr>
+            <w:cnfStyle w:val="001000000000" w:firstRow="0" w:lastRow="0" w:firstColumn="1" w:lastColumn="0" w:oddVBand="0" w:evenVBand="0" w:oddHBand="0" w:evenHBand="0" w:firstRowFirstColumn="0" w:firstRowLastColumn="0" w:lastRowFirstColumn="0" w:lastRowLastColumn="0"/>
+            <w:tcW w:w="0" w:type="auto"/>
+          </w:tcPr>
+          <w:p>
+            <w:pPr>
+              <w:pStyle w:val="NoSpacing"/>
+              <w:rPr>
+                <w:b w:val="0"/>
+                <w:bCs w:val="0"/>
+              </w:rPr>
+            </w:pPr>
+            <w:r>
+              <w:rPr>
+                <w:b w:val="0"/>
+                <w:bCs w:val="0"/>
+              </w:rPr>
+              <w:t>bin mean</w:t>
+            </w:r>
+          </w:p>
+        </w:tc>
+        <w:tc>
+          <w:tcPr>
+            <w:tcW w:w="0" w:type="auto"/>
+          </w:tcPr>
+          <w:p>
+            <w:pPr>
+              <w:pStyle w:val="NoSpacing"/>
+              <w:cnfStyle w:val="000000100000" w:firstRow="0" w:lastRow="0" w:firstColumn="0" w:lastColumn="0" w:oddVBand="0" w:evenVBand="0" w:oddHBand="1" w:evenHBand="0" w:firstRowFirstColumn="0" w:firstRowLastColumn="0" w:lastRowFirstColumn="0" w:lastRowLastColumn="0"/>
+            </w:pPr>
+            <w:r>
+              <w:t>The mean for the hough accumulator counts</w:t>
+            </w:r>
+          </w:p>
+        </w:tc>
+      </w:tr>
+      <w:tr>
+        <w:tc>
+          <w:tcPr>
+            <w:cnfStyle w:val="001000000000" w:firstRow="0" w:lastRow="0" w:firstColumn="1" w:lastColumn="0" w:oddVBand="0" w:evenVBand="0" w:oddHBand="0" w:evenHBand="0" w:firstRowFirstColumn="0" w:firstRowLastColumn="0" w:lastRowFirstColumn="0" w:lastRowLastColumn="0"/>
+            <w:tcW w:w="0" w:type="auto"/>
+          </w:tcPr>
+          <w:p>
+            <w:pPr>
+              <w:pStyle w:val="NoSpacing"/>
+              <w:rPr>
+                <w:b w:val="0"/>
+                <w:bCs w:val="0"/>
+              </w:rPr>
+            </w:pPr>
+            <w:r>
+              <w:rPr>
+                <w:b w:val="0"/>
+                <w:bCs w:val="0"/>
+              </w:rPr>
+              <w:t>bin standard deviation</w:t>
+            </w:r>
+          </w:p>
+        </w:tc>
+        <w:tc>
+          <w:tcPr>
+            <w:tcW w:w="0" w:type="auto"/>
+          </w:tcPr>
+          <w:p>
+            <w:pPr>
+              <w:pStyle w:val="NoSpacing"/>
+              <w:cnfStyle w:val="000000000000" w:firstRow="0" w:lastRow="0" w:firstColumn="0" w:lastColumn="0" w:oddVBand="0" w:evenVBand="0" w:oddHBand="0" w:evenHBand="0" w:firstRowFirstColumn="0" w:firstRowLastColumn="0" w:lastRowFirstColumn="0" w:lastRowLastColumn="0"/>
+            </w:pPr>
+            <w:r>
+              <w:t>The standard deviation for the hough accumulator counts</w:t>
+            </w:r>
+          </w:p>
+        </w:tc>
+      </w:tr>
+    </w:tbl>
+    <w:p>
+      <w:pPr>
+        <w:pStyle w:val="Heading2"/>
+      </w:pPr>
+      <w:r>
+        <w:t>hough-peak-detect Operator</w:t>
+      </w:r>
+    </w:p>
+    <w:p>
+      <w:r>
+        <w:t>The Hough peak detect operator finds polar lines (rho, theta) in the Hough accumulator data where the counts exceed a threshold..</w:t>
+      </w:r>
+    </w:p>
+    <w:p>
+      <w:r>
+        <w:t>The operator takes the following data descriptors:</w:t>
+      </w:r>
+    </w:p>
+    <w:tbl>
+      <w:tblPr>
+        <w:tblStyle w:val="PlainTable1"/>
+        <w:tblW w:w="9363" w:type="dxa"/>
+        <w:tblLook w:val="04A0" w:firstRow="1" w:lastRow="0" w:firstColumn="1" w:lastColumn="0" w:noHBand="0" w:noVBand="1"/>
+      </w:tblPr>
+      <w:tblGrid>
+        <w:gridCol w:w="1819"/>
+        <w:gridCol w:w="412"/>
+        <w:gridCol w:w="975"/>
+        <w:gridCol w:w="1763"/>
+        <w:gridCol w:w="4394"/>
+      </w:tblGrid>
+      <w:tr>
+        <w:trPr>
+          <w:cnfStyle w:val="100000000000" w:firstRow="1" w:lastRow="0" w:firstColumn="0" w:lastColumn="0" w:oddVBand="0" w:evenVBand="0" w:oddHBand="0" w:evenHBand="0" w:firstRowFirstColumn="0" w:firstRowLastColumn="0" w:lastRowFirstColumn="0" w:lastRowLastColumn="0"/>
+          <w:cantSplit/>
+          <w:tblHeader/>
+        </w:trPr>
+        <w:tc>
+          <w:tcPr>
+            <w:cnfStyle w:val="001000000000" w:firstRow="0" w:lastRow="0" w:firstColumn="1" w:lastColumn="0" w:oddVBand="0" w:evenVBand="0" w:oddHBand="0" w:evenHBand="0" w:firstRowFirstColumn="0" w:firstRowLastColumn="0" w:lastRowFirstColumn="0" w:lastRowLastColumn="0"/>
+            <w:tcW w:w="0" w:type="auto"/>
+          </w:tcPr>
+          <w:p>
+            <w:r>
+              <w:t>Descriptor type</w:t>
+            </w:r>
+          </w:p>
+        </w:tc>
+        <w:tc>
+          <w:tcPr>
+            <w:tcW w:w="0" w:type="auto"/>
+          </w:tcPr>
+          <w:p>
+            <w:pPr>
+              <w:cnfStyle w:val="100000000000" w:firstRow="1" w:lastRow="0" w:firstColumn="0" w:lastColumn="0" w:oddVBand="0" w:evenVBand="0" w:oddHBand="0" w:evenHBand="0" w:firstRowFirstColumn="0" w:firstRowLastColumn="0" w:lastRowFirstColumn="0" w:lastRowLastColumn="0"/>
+            </w:pPr>
+            <w:r>
+              <w:t>Id</w:t>
+            </w:r>
+          </w:p>
+        </w:tc>
+        <w:tc>
+          <w:tcPr>
+            <w:tcW w:w="0" w:type="auto"/>
+          </w:tcPr>
+          <w:p>
+            <w:pPr>
+              <w:cnfStyle w:val="100000000000" w:firstRow="1" w:lastRow="0" w:firstColumn="0" w:lastColumn="0" w:oddVBand="0" w:evenVBand="0" w:oddHBand="0" w:evenHBand="0" w:firstRowFirstColumn="0" w:firstRowLastColumn="0" w:lastRowFirstColumn="0" w:lastRowLastColumn="0"/>
+            </w:pPr>
+            <w:r>
+              <w:t>type</w:t>
+            </w:r>
+          </w:p>
+        </w:tc>
+        <w:tc>
+          <w:tcPr>
+            <w:tcW w:w="0" w:type="auto"/>
+          </w:tcPr>
+          <w:p>
+            <w:pPr>
+              <w:cnfStyle w:val="100000000000" w:firstRow="1" w:lastRow="0" w:firstColumn="0" w:lastColumn="0" w:oddVBand="0" w:evenVBand="0" w:oddHBand="0" w:evenHBand="0" w:firstRowFirstColumn="0" w:firstRowLastColumn="0" w:lastRowFirstColumn="0" w:lastRowLastColumn="0"/>
+            </w:pPr>
+            <w:r>
+              <w:t>Format</w:t>
+            </w:r>
+          </w:p>
+        </w:tc>
+        <w:tc>
+          <w:tcPr>
+            <w:tcW w:w="0" w:type="auto"/>
+          </w:tcPr>
+          <w:p>
+            <w:pPr>
+              <w:cnfStyle w:val="100000000000" w:firstRow="1" w:lastRow="0" w:firstColumn="0" w:lastColumn="0" w:oddVBand="0" w:evenVBand="0" w:oddHBand="0" w:evenHBand="0" w:firstRowFirstColumn="0" w:firstRowLastColumn="0" w:lastRowFirstColumn="0" w:lastRowLastColumn="0"/>
+            </w:pPr>
+            <w:r>
+              <w:t>Description</w:t>
+            </w:r>
+          </w:p>
+        </w:tc>
+      </w:tr>
+      <w:tr>
+        <w:trPr>
+          <w:cnfStyle w:val="000000100000" w:firstRow="0" w:lastRow="0" w:firstColumn="0" w:lastColumn="0" w:oddVBand="0" w:evenVBand="0" w:oddHBand="1" w:evenHBand="0" w:firstRowFirstColumn="0" w:firstRowLastColumn="0" w:lastRowFirstColumn="0" w:lastRowLastColumn="0"/>
+        </w:trPr>
+        <w:tc>
+          <w:tcPr>
+            <w:cnfStyle w:val="001000000000" w:firstRow="0" w:lastRow="0" w:firstColumn="1" w:lastColumn="0" w:oddVBand="0" w:evenVBand="0" w:oddHBand="0" w:evenHBand="0" w:firstRowFirstColumn="0" w:firstRowLastColumn="0" w:lastRowFirstColumn="0" w:lastRowLastColumn="0"/>
+            <w:tcW w:w="0" w:type="auto"/>
+          </w:tcPr>
+          <w:p>
+            <w:pPr>
+              <w:rPr>
+                <w:b w:val="0"/>
+                <w:bCs w:val="0"/>
+              </w:rPr>
+            </w:pPr>
+            <w:r>
+              <w:rPr>
+                <w:b w:val="0"/>
+                <w:bCs w:val="0"/>
+              </w:rPr>
+              <w:t>input</w:t>
+            </w:r>
+          </w:p>
+        </w:tc>
+        <w:tc>
+          <w:tcPr>
+            <w:tcW w:w="0" w:type="auto"/>
+          </w:tcPr>
+          <w:p>
+            <w:pPr>
+              <w:cnfStyle w:val="000000100000" w:firstRow="0" w:lastRow="0" w:firstColumn="0" w:lastColumn="0" w:oddVBand="0" w:evenVBand="0" w:oddHBand="1" w:evenHBand="0" w:firstRowFirstColumn="0" w:firstRowLastColumn="0" w:lastRowFirstColumn="0" w:lastRowLastColumn="0"/>
+            </w:pPr>
+            <w:r>
+              <w:t>1</w:t>
+            </w:r>
+          </w:p>
+        </w:tc>
+        <w:tc>
+          <w:tcPr>
+            <w:tcW w:w="0" w:type="auto"/>
+          </w:tcPr>
+          <w:p>
+            <w:pPr>
+              <w:cnfStyle w:val="000000100000" w:firstRow="0" w:lastRow="0" w:firstColumn="0" w:lastColumn="0" w:oddVBand="0" w:evenVBand="0" w:oddHBand="1" w:evenHBand="0" w:firstRowFirstColumn="0" w:firstRowLastColumn="0" w:lastRowFirstColumn="0" w:lastRowLastColumn="0"/>
+            </w:pPr>
+            <w:r>
+              <w:t>“hough”</w:t>
+            </w:r>
+          </w:p>
+        </w:tc>
+        <w:tc>
+          <w:tcPr>
+            <w:tcW w:w="0" w:type="auto"/>
+          </w:tcPr>
+          <w:p>
+            <w:pPr>
+              <w:cnfStyle w:val="000000100000" w:firstRow="0" w:lastRow="0" w:firstColumn="0" w:lastColumn="0" w:oddVBand="0" w:evenVBand="0" w:oddHBand="1" w:evenHBand="0" w:firstRowFirstColumn="0" w:firstRowLastColumn="0" w:lastRowFirstColumn="0" w:lastRowLastColumn="0"/>
+            </w:pPr>
+            <w:r>
+              <w:t xml:space="preserve"> “binary” </w:t>
+            </w:r>
+          </w:p>
+        </w:tc>
+        <w:tc>
+          <w:tcPr>
+            <w:tcW w:w="0" w:type="auto"/>
+          </w:tcPr>
+          <w:p>
+            <w:pPr>
+              <w:cnfStyle w:val="000000100000" w:firstRow="0" w:lastRow="0" w:firstColumn="0" w:lastColumn="0" w:oddVBand="0" w:evenVBand="0" w:oddHBand="1" w:evenHBand="0" w:firstRowFirstColumn="0" w:firstRowLastColumn="0" w:lastRowFirstColumn="0" w:lastRowLastColumn="0"/>
+            </w:pPr>
+            <w:r>
+              <w:t>input Hough accumulator data</w:t>
+            </w:r>
+          </w:p>
+        </w:tc>
+      </w:tr>
+      <w:tr>
+        <w:tc>
+          <w:tcPr>
+            <w:cnfStyle w:val="001000000000" w:firstRow="0" w:lastRow="0" w:firstColumn="1" w:lastColumn="0" w:oddVBand="0" w:evenVBand="0" w:oddHBand="0" w:evenHBand="0" w:firstRowFirstColumn="0" w:firstRowLastColumn="0" w:lastRowFirstColumn="0" w:lastRowLastColumn="0"/>
+            <w:tcW w:w="0" w:type="auto"/>
+          </w:tcPr>
+          <w:p>
+            <w:pPr>
+              <w:rPr>
+                <w:b w:val="0"/>
+                <w:bCs w:val="0"/>
+              </w:rPr>
+            </w:pPr>
+            <w:r>
+              <w:rPr>
+                <w:b w:val="0"/>
+                <w:bCs w:val="0"/>
+              </w:rPr>
+              <w:t>output</w:t>
+            </w:r>
+          </w:p>
+        </w:tc>
+        <w:tc>
+          <w:tcPr>
+            <w:tcW w:w="0" w:type="auto"/>
+          </w:tcPr>
+          <w:p>
+            <w:pPr>
+              <w:cnfStyle w:val="000000000000" w:firstRow="0" w:lastRow="0" w:firstColumn="0" w:lastColumn="0" w:oddVBand="0" w:evenVBand="0" w:oddHBand="0" w:evenHBand="0" w:firstRowFirstColumn="0" w:firstRowLastColumn="0" w:lastRowFirstColumn="0" w:lastRowLastColumn="0"/>
+            </w:pPr>
+            <w:r>
+              <w:t>1</w:t>
+            </w:r>
+          </w:p>
+        </w:tc>
+        <w:tc>
+          <w:tcPr>
+            <w:tcW w:w="0" w:type="auto"/>
+          </w:tcPr>
+          <w:p>
+            <w:pPr>
+              <w:cnfStyle w:val="000000000000" w:firstRow="0" w:lastRow="0" w:firstColumn="0" w:lastColumn="0" w:oddVBand="0" w:evenVBand="0" w:oddHBand="0" w:evenHBand="0" w:firstRowFirstColumn="0" w:firstRowLastColumn="0" w:lastRowFirstColumn="0" w:lastRowLastColumn="0"/>
+            </w:pPr>
+            <w:r>
+              <w:t>“peak”</w:t>
+            </w:r>
+          </w:p>
+        </w:tc>
+        <w:tc>
+          <w:tcPr>
+            <w:tcW w:w="0" w:type="auto"/>
+          </w:tcPr>
+          <w:p>
+            <w:pPr>
+              <w:cnfStyle w:val="000000000000" w:firstRow="0" w:lastRow="0" w:firstColumn="0" w:lastColumn="0" w:oddVBand="0" w:evenVBand="0" w:oddHBand="0" w:evenHBand="0" w:firstRowFirstColumn="0" w:firstRowLastColumn="0" w:lastRowFirstColumn="0" w:lastRowLastColumn="0"/>
+            </w:pPr>
+            <w:r>
+              <w:t xml:space="preserve">“binary” or “text” </w:t>
+            </w:r>
+          </w:p>
+        </w:tc>
+        <w:tc>
+          <w:tcPr>
+            <w:tcW w:w="0" w:type="auto"/>
+          </w:tcPr>
+          <w:p>
+            <w:pPr>
+              <w:cnfStyle w:val="000000000000" w:firstRow="0" w:lastRow="0" w:firstColumn="0" w:lastColumn="0" w:oddVBand="0" w:evenVBand="0" w:oddHBand="0" w:evenHBand="0" w:firstRowFirstColumn="0" w:firstRowLastColumn="0" w:lastRowFirstColumn="0" w:lastRowLastColumn="0"/>
+            </w:pPr>
+            <w:r>
+              <w:t xml:space="preserve">output Hough accumulator polar line peaks. </w:t>
+            </w:r>
+          </w:p>
+        </w:tc>
+      </w:tr>
+    </w:tbl>
+    <w:p>
+      <w:pPr>
+        <w:pStyle w:val="Normalafterlist"/>
+      </w:pPr>
+      <w:r>
+        <w:t>The parameters to the draw Hough peak detect operator are as follows. Only one of either the threshold or max_peaks parameter should be supplied.</w:t>
+      </w:r>
+    </w:p>
+    <w:tbl>
+      <w:tblPr>
+        <w:tblStyle w:val="PlainTable1"/>
+        <w:tblW w:w="0" w:type="auto"/>
+        <w:tblLook w:val="04A0" w:firstRow="1" w:lastRow="0" w:firstColumn="1" w:lastColumn="0" w:noHBand="0" w:noVBand="1"/>
+      </w:tblPr>
+      <w:tblGrid>
+        <w:gridCol w:w="1733"/>
+        <w:gridCol w:w="7617"/>
+      </w:tblGrid>
+      <w:tr>
+        <w:trPr>
+          <w:cnfStyle w:val="100000000000" w:firstRow="1" w:lastRow="0" w:firstColumn="0" w:lastColumn="0" w:oddVBand="0" w:evenVBand="0" w:oddHBand="0" w:evenHBand="0" w:firstRowFirstColumn="0" w:firstRowLastColumn="0" w:lastRowFirstColumn="0" w:lastRowLastColumn="0"/>
+          <w:cantSplit/>
+          <w:tblHeader/>
+        </w:trPr>
+        <w:tc>
+          <w:tcPr>
+            <w:cnfStyle w:val="001000000000" w:firstRow="0" w:lastRow="0" w:firstColumn="1" w:lastColumn="0" w:oddVBand="0" w:evenVBand="0" w:oddHBand="0" w:evenHBand="0" w:firstRowFirstColumn="0" w:firstRowLastColumn="0" w:lastRowFirstColumn="0" w:lastRowLastColumn="0"/>
+            <w:tcW w:w="1733" w:type="dxa"/>
+          </w:tcPr>
+          <w:p>
+            <w:pPr>
+              <w:pStyle w:val="NoSpacing"/>
+            </w:pPr>
+            <w:r>
+              <w:t>parameter</w:t>
+            </w:r>
+          </w:p>
+        </w:tc>
+        <w:tc>
+          <w:tcPr>
+            <w:tcW w:w="7617" w:type="dxa"/>
+          </w:tcPr>
+          <w:p>
+            <w:pPr>
+              <w:pStyle w:val="NoSpacing"/>
+              <w:cnfStyle w:val="100000000000" w:firstRow="1" w:lastRow="0" w:firstColumn="0" w:lastColumn="0" w:oddVBand="0" w:evenVBand="0" w:oddHBand="0" w:evenHBand="0" w:firstRowFirstColumn="0" w:firstRowLastColumn="0" w:lastRowFirstColumn="0" w:lastRowLastColumn="0"/>
+            </w:pPr>
+            <w:r>
+              <w:t>description</w:t>
+            </w:r>
+          </w:p>
+        </w:tc>
+      </w:tr>
+      <w:tr>
+        <w:trPr>
+          <w:cnfStyle w:val="000000100000" w:firstRow="0" w:lastRow="0" w:firstColumn="0" w:lastColumn="0" w:oddVBand="0" w:evenVBand="0" w:oddHBand="1" w:evenHBand="0" w:firstRowFirstColumn="0" w:firstRowLastColumn="0" w:lastRowFirstColumn="0" w:lastRowLastColumn="0"/>
+        </w:trPr>
+        <w:tc>
+          <w:tcPr>
+            <w:cnfStyle w:val="001000000000" w:firstRow="0" w:lastRow="0" w:firstColumn="1" w:lastColumn="0" w:oddVBand="0" w:evenVBand="0" w:oddHBand="0" w:evenHBand="0" w:firstRowFirstColumn="0" w:firstRowLastColumn="0" w:lastRowFirstColumn="0" w:lastRowLastColumn="0"/>
+            <w:tcW w:w="1733" w:type="dxa"/>
+          </w:tcPr>
+          <w:p>
+            <w:pPr>
+              <w:pStyle w:val="NoSpacing"/>
+              <w:rPr>
+                <w:b w:val="0"/>
+                <w:bCs w:val="0"/>
+              </w:rPr>
+            </w:pPr>
+            <w:r>
+              <w:rPr>
+                <w:b w:val="0"/>
+                <w:bCs w:val="0"/>
+              </w:rPr>
+              <w:t>threshold</w:t>
+            </w:r>
+          </w:p>
+        </w:tc>
+        <w:tc>
+          <w:tcPr>
+            <w:tcW w:w="7617" w:type="dxa"/>
+          </w:tcPr>
+          <w:p>
+            <w:pPr>
+              <w:pStyle w:val="NoSpacing"/>
+              <w:cnfStyle w:val="000000100000" w:firstRow="0" w:lastRow="0" w:firstColumn="0" w:lastColumn="0" w:oddVBand="0" w:evenVBand="0" w:oddHBand="1" w:evenHBand="0" w:firstRowFirstColumn="0" w:firstRowLastColumn="0" w:lastRowFirstColumn="0" w:lastRowLastColumn="0"/>
+            </w:pPr>
+            <w:r>
+              <w:t>Hough accumulator count threshold for selecting peaks</w:t>
+            </w:r>
+          </w:p>
+        </w:tc>
+      </w:tr>
+      <w:tr>
+        <w:tc>
+          <w:tcPr>
+            <w:cnfStyle w:val="001000000000" w:firstRow="0" w:lastRow="0" w:firstColumn="1" w:lastColumn="0" w:oddVBand="0" w:evenVBand="0" w:oddHBand="0" w:evenHBand="0" w:firstRowFirstColumn="0" w:firstRowLastColumn="0" w:lastRowFirstColumn="0" w:lastRowLastColumn="0"/>
+            <w:tcW w:w="1733" w:type="dxa"/>
+          </w:tcPr>
+          <w:p>
+            <w:pPr>
+              <w:pStyle w:val="NoSpacing"/>
+              <w:rPr>
+                <w:b w:val="0"/>
+                <w:bCs w:val="0"/>
+              </w:rPr>
+            </w:pPr>
+            <w:r>
+              <w:rPr>
+                <w:b w:val="0"/>
+                <w:bCs w:val="0"/>
+              </w:rPr>
+              <w:t>max-peaks</w:t>
+            </w:r>
+          </w:p>
+        </w:tc>
+        <w:tc>
+          <w:tcPr>
+            <w:tcW w:w="7617" w:type="dxa"/>
+          </w:tcPr>
+          <w:p>
+            <w:pPr>
+              <w:pStyle w:val="NoSpacing"/>
+              <w:cnfStyle w:val="000000000000" w:firstRow="0" w:lastRow="0" w:firstColumn="0" w:lastColumn="0" w:oddVBand="0" w:evenVBand="0" w:oddHBand="0" w:evenHBand="0" w:firstRowFirstColumn="0" w:firstRowLastColumn="0" w:lastRowFirstColumn="0" w:lastRowLastColumn="0"/>
+            </w:pPr>
+            <w:r>
+              <w:t>The maximum number of peaks to return</w:t>
+            </w:r>
+          </w:p>
+        </w:tc>
+      </w:tr>
+    </w:tbl>
+    <w:p>
+      <w:pPr>
+        <w:pStyle w:val="Normalafterlist"/>
+      </w:pPr>
+      <w:r>
+        <w:t>The experiment log output is the peak polar line (rho, theta) data:</w:t>
+      </w:r>
+    </w:p>
+    <w:tbl>
+      <w:tblPr>
+        <w:tblStyle w:val="PlainTable1"/>
+        <w:tblW w:w="0" w:type="auto"/>
+        <w:tblLook w:val="04A0" w:firstRow="1" w:lastRow="0" w:firstColumn="1" w:lastColumn="0" w:noHBand="0" w:noVBand="1"/>
+      </w:tblPr>
+      <w:tblGrid>
+        <w:gridCol w:w="938"/>
+        <w:gridCol w:w="4943"/>
+      </w:tblGrid>
+      <w:tr>
+        <w:trPr>
+          <w:cnfStyle w:val="100000000000" w:firstRow="1" w:lastRow="0" w:firstColumn="0" w:lastColumn="0" w:oddVBand="0" w:evenVBand="0" w:oddHBand="0" w:evenHBand="0" w:firstRowFirstColumn="0" w:firstRowLastColumn="0" w:lastRowFirstColumn="0" w:lastRowLastColumn="0"/>
+          <w:cantSplit/>
+          <w:tblHeader/>
+        </w:trPr>
+        <w:tc>
+          <w:tcPr>
+            <w:cnfStyle w:val="001000000000" w:firstRow="0" w:lastRow="0" w:firstColumn="1" w:lastColumn="0" w:oddVBand="0" w:evenVBand="0" w:oddHBand="0" w:evenHBand="0" w:firstRowFirstColumn="0" w:firstRowLastColumn="0" w:lastRowFirstColumn="0" w:lastRowLastColumn="0"/>
+            <w:tcW w:w="0" w:type="auto"/>
+          </w:tcPr>
+          <w:p>
+            <w:pPr>
+              <w:pStyle w:val="NoSpacing"/>
+            </w:pPr>
+            <w:r>
+              <w:t>Field</w:t>
+            </w:r>
+          </w:p>
+        </w:tc>
+        <w:tc>
+          <w:tcPr>
+            <w:tcW w:w="0" w:type="auto"/>
+          </w:tcPr>
+          <w:p>
+            <w:pPr>
+              <w:pStyle w:val="NoSpacing"/>
+              <w:cnfStyle w:val="100000000000" w:firstRow="1" w:lastRow="0" w:firstColumn="0" w:lastColumn="0" w:oddVBand="0" w:evenVBand="0" w:oddHBand="0" w:evenHBand="0" w:firstRowFirstColumn="0" w:firstRowLastColumn="0" w:lastRowFirstColumn="0" w:lastRowLastColumn="0"/>
+            </w:pPr>
+            <w:r>
+              <w:t>Description</w:t>
+            </w:r>
+          </w:p>
+        </w:tc>
+      </w:tr>
+      <w:tr>
+        <w:trPr>
+          <w:cnfStyle w:val="000000100000" w:firstRow="0" w:lastRow="0" w:firstColumn="0" w:lastColumn="0" w:oddVBand="0" w:evenVBand="0" w:oddHBand="1" w:evenHBand="0" w:firstRowFirstColumn="0" w:firstRowLastColumn="0" w:lastRowFirstColumn="0" w:lastRowLastColumn="0"/>
+        </w:trPr>
+        <w:tc>
+          <w:tcPr>
+            <w:cnfStyle w:val="001000000000" w:firstRow="0" w:lastRow="0" w:firstColumn="1" w:lastColumn="0" w:oddVBand="0" w:evenVBand="0" w:oddHBand="0" w:evenHBand="0" w:firstRowFirstColumn="0" w:firstRowLastColumn="0" w:lastRowFirstColumn="0" w:lastRowLastColumn="0"/>
+            <w:tcW w:w="0" w:type="auto"/>
+          </w:tcPr>
+          <w:p>
+            <w:pPr>
+              <w:pStyle w:val="NoSpacing"/>
+              <w:rPr>
+                <w:b w:val="0"/>
+                <w:bCs w:val="0"/>
+              </w:rPr>
+            </w:pPr>
+            <w:r>
+              <w:rPr>
+                <w:b w:val="0"/>
+                <w:bCs w:val="0"/>
+              </w:rPr>
+              <w:t>npeaks</w:t>
+            </w:r>
+          </w:p>
+        </w:tc>
+        <w:tc>
+          <w:tcPr>
+            <w:tcW w:w="0" w:type="auto"/>
+          </w:tcPr>
+          <w:p>
+            <w:pPr>
+              <w:pStyle w:val="NoSpacing"/>
+              <w:cnfStyle w:val="000000100000" w:firstRow="0" w:lastRow="0" w:firstColumn="0" w:lastColumn="0" w:oddVBand="0" w:evenVBand="0" w:oddHBand="1" w:evenHBand="0" w:firstRowFirstColumn="0" w:firstRowLastColumn="0" w:lastRowFirstColumn="0" w:lastRowLastColumn="0"/>
+            </w:pPr>
+            <w:r>
+              <w:t>Number of peaks returned</w:t>
+            </w:r>
+          </w:p>
+        </w:tc>
+      </w:tr>
+      <w:tr>
+        <w:tc>
+          <w:tcPr>
+            <w:cnfStyle w:val="001000000000" w:firstRow="0" w:lastRow="0" w:firstColumn="1" w:lastColumn="0" w:oddVBand="0" w:evenVBand="0" w:oddHBand="0" w:evenHBand="0" w:firstRowFirstColumn="0" w:firstRowLastColumn="0" w:lastRowFirstColumn="0" w:lastRowLastColumn="0"/>
+            <w:tcW w:w="0" w:type="auto"/>
+          </w:tcPr>
+          <w:p>
+            <w:pPr>
+              <w:pStyle w:val="NoSpacing"/>
+              <w:rPr>
+                <w:b w:val="0"/>
+                <w:bCs w:val="0"/>
+              </w:rPr>
+            </w:pPr>
+            <w:r>
+              <w:rPr>
+                <w:b w:val="0"/>
+                <w:bCs w:val="0"/>
+              </w:rPr>
+              <w:t>nthetas</w:t>
+            </w:r>
+          </w:p>
+        </w:tc>
+        <w:tc>
+          <w:tcPr>
+            <w:tcW w:w="0" w:type="auto"/>
+          </w:tcPr>
+          <w:p>
+            <w:pPr>
+              <w:pStyle w:val="NoSpacing"/>
+              <w:cnfStyle w:val="000000000000" w:firstRow="0" w:lastRow="0" w:firstColumn="0" w:lastColumn="0" w:oddVBand="0" w:evenVBand="0" w:oddHBand="0" w:evenHBand="0" w:firstRowFirstColumn="0" w:firstRowLastColumn="0" w:lastRowFirstColumn="0" w:lastRowLastColumn="0"/>
+            </w:pPr>
+            <w:r>
+              <w:t>The number of angles sampled = 180 / theta_inc</w:t>
+            </w:r>
+          </w:p>
+        </w:tc>
+      </w:tr>
+      <w:tr>
+        <w:trPr>
+          <w:cnfStyle w:val="000000100000" w:firstRow="0" w:lastRow="0" w:firstColumn="0" w:lastColumn="0" w:oddVBand="0" w:evenVBand="0" w:oddHBand="1" w:evenHBand="0" w:firstRowFirstColumn="0" w:firstRowLastColumn="0" w:lastRowFirstColumn="0" w:lastRowLastColumn="0"/>
+        </w:trPr>
+        <w:tc>
+          <w:tcPr>
+            <w:cnfStyle w:val="001000000000" w:firstRow="0" w:lastRow="0" w:firstColumn="1" w:lastColumn="0" w:oddVBand="0" w:evenVBand="0" w:oddHBand="0" w:evenHBand="0" w:firstRowFirstColumn="0" w:firstRowLastColumn="0" w:lastRowFirstColumn="0" w:lastRowLastColumn="0"/>
+            <w:tcW w:w="0" w:type="auto"/>
+          </w:tcPr>
+          <w:p>
+            <w:pPr>
+              <w:pStyle w:val="NoSpacing"/>
+              <w:rPr>
+                <w:b w:val="0"/>
+                <w:bCs w:val="0"/>
+              </w:rPr>
+            </w:pPr>
+            <w:r>
+              <w:rPr>
+                <w:b w:val="0"/>
+                <w:bCs w:val="0"/>
+              </w:rPr>
+              <w:t>nrhos</w:t>
+            </w:r>
+          </w:p>
+        </w:tc>
+        <w:tc>
+          <w:tcPr>
+            <w:tcW w:w="0" w:type="auto"/>
+          </w:tcPr>
+          <w:p>
+            <w:pPr>
+              <w:pStyle w:val="NoSpacing"/>
+              <w:cnfStyle w:val="000000100000" w:firstRow="0" w:lastRow="0" w:firstColumn="0" w:lastColumn="0" w:oddVBand="0" w:evenVBand="0" w:oddHBand="1" w:evenHBand="0" w:firstRowFirstColumn="0" w:firstRowLastColumn="0" w:lastRowFirstColumn="0" w:lastRowLastColumn="0"/>
+            </w:pPr>
+            <w:r>
+              <w:t>The number of rho values sampled</w:t>
+            </w:r>
+          </w:p>
+        </w:tc>
+      </w:tr>
+    </w:tbl>
     <w:p>
       <w:pPr>
         <w:pStyle w:val="Heading2"/>
@@ -20371,6 +21670,1397 @@
         </w:tc>
       </w:tr>
     </w:tbl>
+    <w:p>
+      <w:pPr>
+        <w:pStyle w:val="Heading2"/>
+      </w:pPr>
+      <w:r>
+        <w:t>transform-image-create Operator</w:t>
+      </w:r>
+    </w:p>
+    <w:p>
+      <w:pPr>
+        <w:cnfStyle w:val="100000000000" w:firstRow="1" w:lastRow="0" w:firstColumn="0" w:lastColumn="0" w:oddVBand="0" w:evenVBand="0" w:oddHBand="0" w:evenHBand="0" w:firstRowFirstColumn="0" w:firstRowLastColumn="0" w:lastRowFirstColumn="0" w:lastRowLastColumn="0"/>
+      </w:pPr>
+      <w:r>
+        <w:t>The transform image create operator c</w:t>
+      </w:r>
+      <w:r>
+        <w:t>reate</w:t>
+      </w:r>
+      <w:r>
+        <w:t>s a</w:t>
+      </w:r>
+      <w:r>
+        <w:t xml:space="preserve"> test image from text file or from scratch</w:t>
+      </w:r>
+      <w:r>
+        <w:t>,</w:t>
+      </w:r>
+      <w:r>
+        <w:t xml:space="preserve"> optionally with superimposed features</w:t>
+      </w:r>
+      <w:r>
+        <w:t xml:space="preserve">. </w:t>
+      </w:r>
+      <w:r>
+        <w:t>The operator takes the following data descriptors</w:t>
+      </w:r>
+      <w:r>
+        <w:t xml:space="preserve">. </w:t>
+      </w:r>
+      <w:r>
+        <w:t>If omitted, an image is created from scratch and the ‘rows’ and ‘cols’ parameters are required.</w:t>
+      </w:r>
+      <w:r>
+        <w:t xml:space="preserve"> If a text input file is specified, each line consists of space or tab delimited numeric intensities. The number of rows is the number of lines in the file. The number of columns are the number of fields on each line. The number of fields must be the same on each line. Various parameters optionally draw points, lines, or rectangles in the image.</w:t>
+      </w:r>
+    </w:p>
+    <w:tbl>
+      <w:tblPr>
+        <w:tblStyle w:val="PlainTable1"/>
+        <w:tblW w:w="9583" w:type="dxa"/>
+        <w:tblLook w:val="04A0" w:firstRow="1" w:lastRow="0" w:firstColumn="1" w:lastColumn="0" w:noHBand="0" w:noVBand="1"/>
+      </w:tblPr>
+      <w:tblGrid>
+        <w:gridCol w:w="1761"/>
+        <w:gridCol w:w="412"/>
+        <w:gridCol w:w="962"/>
+        <w:gridCol w:w="1723"/>
+        <w:gridCol w:w="4725"/>
+      </w:tblGrid>
+      <w:tr>
+        <w:trPr>
+          <w:cnfStyle w:val="100000000000" w:firstRow="1" w:lastRow="0" w:firstColumn="0" w:lastColumn="0" w:oddVBand="0" w:evenVBand="0" w:oddHBand="0" w:evenHBand="0" w:firstRowFirstColumn="0" w:firstRowLastColumn="0" w:lastRowFirstColumn="0" w:lastRowLastColumn="0"/>
+          <w:cantSplit/>
+          <w:tblHeader/>
+        </w:trPr>
+        <w:tc>
+          <w:tcPr>
+            <w:cnfStyle w:val="001000000000" w:firstRow="0" w:lastRow="0" w:firstColumn="1" w:lastColumn="0" w:oddVBand="0" w:evenVBand="0" w:oddHBand="0" w:evenHBand="0" w:firstRowFirstColumn="0" w:firstRowLastColumn="0" w:lastRowFirstColumn="0" w:lastRowLastColumn="0"/>
+            <w:tcW w:w="0" w:type="auto"/>
+          </w:tcPr>
+          <w:p>
+            <w:r>
+              <w:t>Descriptor type</w:t>
+            </w:r>
+          </w:p>
+        </w:tc>
+        <w:tc>
+          <w:tcPr>
+            <w:tcW w:w="0" w:type="auto"/>
+          </w:tcPr>
+          <w:p>
+            <w:pPr>
+              <w:cnfStyle w:val="100000000000" w:firstRow="1" w:lastRow="0" w:firstColumn="0" w:lastColumn="0" w:oddVBand="0" w:evenVBand="0" w:oddHBand="0" w:evenHBand="0" w:firstRowFirstColumn="0" w:firstRowLastColumn="0" w:lastRowFirstColumn="0" w:lastRowLastColumn="0"/>
+            </w:pPr>
+            <w:r>
+              <w:t>Id</w:t>
+            </w:r>
+          </w:p>
+        </w:tc>
+        <w:tc>
+          <w:tcPr>
+            <w:tcW w:w="0" w:type="auto"/>
+          </w:tcPr>
+          <w:p>
+            <w:pPr>
+              <w:cnfStyle w:val="100000000000" w:firstRow="1" w:lastRow="0" w:firstColumn="0" w:lastColumn="0" w:oddVBand="0" w:evenVBand="0" w:oddHBand="0" w:evenHBand="0" w:firstRowFirstColumn="0" w:firstRowLastColumn="0" w:lastRowFirstColumn="0" w:lastRowLastColumn="0"/>
+            </w:pPr>
+            <w:r>
+              <w:t>type</w:t>
+            </w:r>
+          </w:p>
+        </w:tc>
+        <w:tc>
+          <w:tcPr>
+            <w:tcW w:w="0" w:type="auto"/>
+          </w:tcPr>
+          <w:p>
+            <w:pPr>
+              <w:cnfStyle w:val="100000000000" w:firstRow="1" w:lastRow="0" w:firstColumn="0" w:lastColumn="0" w:oddVBand="0" w:evenVBand="0" w:oddHBand="0" w:evenHBand="0" w:firstRowFirstColumn="0" w:firstRowLastColumn="0" w:lastRowFirstColumn="0" w:lastRowLastColumn="0"/>
+            </w:pPr>
+            <w:r>
+              <w:t>Format</w:t>
+            </w:r>
+          </w:p>
+        </w:tc>
+        <w:tc>
+          <w:tcPr>
+            <w:tcW w:w="0" w:type="auto"/>
+          </w:tcPr>
+          <w:p>
+            <w:pPr>
+              <w:cnfStyle w:val="100000000000" w:firstRow="1" w:lastRow="0" w:firstColumn="0" w:lastColumn="0" w:oddVBand="0" w:evenVBand="0" w:oddHBand="0" w:evenHBand="0" w:firstRowFirstColumn="0" w:firstRowLastColumn="0" w:lastRowFirstColumn="0" w:lastRowLastColumn="0"/>
+            </w:pPr>
+            <w:r>
+              <w:t>Description</w:t>
+            </w:r>
+          </w:p>
+        </w:tc>
+      </w:tr>
+      <w:tr>
+        <w:trPr>
+          <w:cnfStyle w:val="000000100000" w:firstRow="0" w:lastRow="0" w:firstColumn="0" w:lastColumn="0" w:oddVBand="0" w:evenVBand="0" w:oddHBand="1" w:evenHBand="0" w:firstRowFirstColumn="0" w:firstRowLastColumn="0" w:lastRowFirstColumn="0" w:lastRowLastColumn="0"/>
+        </w:trPr>
+        <w:tc>
+          <w:tcPr>
+            <w:cnfStyle w:val="001000000000" w:firstRow="0" w:lastRow="0" w:firstColumn="1" w:lastColumn="0" w:oddVBand="0" w:evenVBand="0" w:oddHBand="0" w:evenHBand="0" w:firstRowFirstColumn="0" w:firstRowLastColumn="0" w:lastRowFirstColumn="0" w:lastRowLastColumn="0"/>
+            <w:tcW w:w="0" w:type="auto"/>
+          </w:tcPr>
+          <w:p>
+            <w:pPr>
+              <w:rPr>
+                <w:b w:val="0"/>
+                <w:bCs w:val="0"/>
+              </w:rPr>
+            </w:pPr>
+            <w:r>
+              <w:rPr>
+                <w:b w:val="0"/>
+                <w:bCs w:val="0"/>
+              </w:rPr>
+              <w:t>input</w:t>
+            </w:r>
+          </w:p>
+        </w:tc>
+        <w:tc>
+          <w:tcPr>
+            <w:tcW w:w="0" w:type="auto"/>
+          </w:tcPr>
+          <w:p>
+            <w:pPr>
+              <w:cnfStyle w:val="000000100000" w:firstRow="0" w:lastRow="0" w:firstColumn="0" w:lastColumn="0" w:oddVBand="0" w:evenVBand="0" w:oddHBand="1" w:evenHBand="0" w:firstRowFirstColumn="0" w:firstRowLastColumn="0" w:lastRowFirstColumn="0" w:lastRowLastColumn="0"/>
+            </w:pPr>
+            <w:r>
+              <w:t>1</w:t>
+            </w:r>
+          </w:p>
+        </w:tc>
+        <w:tc>
+          <w:tcPr>
+            <w:tcW w:w="0" w:type="auto"/>
+          </w:tcPr>
+          <w:p>
+            <w:pPr>
+              <w:cnfStyle w:val="000000100000" w:firstRow="0" w:lastRow="0" w:firstColumn="0" w:lastColumn="0" w:oddVBand="0" w:evenVBand="0" w:oddHBand="1" w:evenHBand="0" w:firstRowFirstColumn="0" w:firstRowLastColumn="0" w:lastRowFirstColumn="0" w:lastRowLastColumn="0"/>
+            </w:pPr>
+            <w:r>
+              <w:t>“image”</w:t>
+            </w:r>
+          </w:p>
+        </w:tc>
+        <w:tc>
+          <w:tcPr>
+            <w:tcW w:w="0" w:type="auto"/>
+          </w:tcPr>
+          <w:p>
+            <w:pPr>
+              <w:cnfStyle w:val="000000100000" w:firstRow="0" w:lastRow="0" w:firstColumn="0" w:lastColumn="0" w:oddVBand="0" w:evenVBand="0" w:oddHBand="1" w:evenHBand="0" w:firstRowFirstColumn="0" w:firstRowLastColumn="0" w:lastRowFirstColumn="0" w:lastRowLastColumn="0"/>
+            </w:pPr>
+            <w:r>
+              <w:t>“text” or omitted</w:t>
+            </w:r>
+            <w:r>
+              <w:t xml:space="preserve"> </w:t>
+            </w:r>
+          </w:p>
+        </w:tc>
+        <w:tc>
+          <w:tcPr>
+            <w:tcW w:w="0" w:type="auto"/>
+          </w:tcPr>
+          <w:p>
+            <w:pPr>
+              <w:cnfStyle w:val="000000100000" w:firstRow="0" w:lastRow="0" w:firstColumn="0" w:lastColumn="0" w:oddVBand="0" w:evenVBand="0" w:oddHBand="1" w:evenHBand="0" w:firstRowFirstColumn="0" w:firstRowLastColumn="0" w:lastRowFirstColumn="0" w:lastRowLastColumn="0"/>
+            </w:pPr>
+            <w:r>
+              <w:t xml:space="preserve">input </w:t>
+            </w:r>
+            <w:r>
+              <w:t xml:space="preserve">text </w:t>
+            </w:r>
+            <w:r>
+              <w:t xml:space="preserve">CV_32S intensity </w:t>
+            </w:r>
+            <w:r>
+              <w:t xml:space="preserve">value file. </w:t>
+            </w:r>
+          </w:p>
+        </w:tc>
+      </w:tr>
+      <w:tr>
+        <w:tc>
+          <w:tcPr>
+            <w:cnfStyle w:val="001000000000" w:firstRow="0" w:lastRow="0" w:firstColumn="1" w:lastColumn="0" w:oddVBand="0" w:evenVBand="0" w:oddHBand="0" w:evenHBand="0" w:firstRowFirstColumn="0" w:firstRowLastColumn="0" w:lastRowFirstColumn="0" w:lastRowLastColumn="0"/>
+            <w:tcW w:w="0" w:type="auto"/>
+          </w:tcPr>
+          <w:p>
+            <w:pPr>
+              <w:rPr>
+                <w:b w:val="0"/>
+                <w:bCs w:val="0"/>
+              </w:rPr>
+            </w:pPr>
+            <w:r>
+              <w:rPr>
+                <w:b w:val="0"/>
+                <w:bCs w:val="0"/>
+              </w:rPr>
+              <w:t>output</w:t>
+            </w:r>
+          </w:p>
+        </w:tc>
+        <w:tc>
+          <w:tcPr>
+            <w:tcW w:w="0" w:type="auto"/>
+          </w:tcPr>
+          <w:p>
+            <w:pPr>
+              <w:cnfStyle w:val="000000000000" w:firstRow="0" w:lastRow="0" w:firstColumn="0" w:lastColumn="0" w:oddVBand="0" w:evenVBand="0" w:oddHBand="0" w:evenHBand="0" w:firstRowFirstColumn="0" w:firstRowLastColumn="0" w:lastRowFirstColumn="0" w:lastRowLastColumn="0"/>
+            </w:pPr>
+            <w:r>
+              <w:t>1</w:t>
+            </w:r>
+          </w:p>
+        </w:tc>
+        <w:tc>
+          <w:tcPr>
+            <w:tcW w:w="0" w:type="auto"/>
+          </w:tcPr>
+          <w:p>
+            <w:pPr>
+              <w:cnfStyle w:val="000000000000" w:firstRow="0" w:lastRow="0" w:firstColumn="0" w:lastColumn="0" w:oddVBand="0" w:evenVBand="0" w:oddHBand="0" w:evenHBand="0" w:firstRowFirstColumn="0" w:firstRowLastColumn="0" w:lastRowFirstColumn="0" w:lastRowLastColumn="0"/>
+            </w:pPr>
+            <w:r>
+              <w:t>“image”</w:t>
+            </w:r>
+          </w:p>
+        </w:tc>
+        <w:tc>
+          <w:tcPr>
+            <w:tcW w:w="0" w:type="auto"/>
+          </w:tcPr>
+          <w:p>
+            <w:pPr>
+              <w:cnfStyle w:val="000000000000" w:firstRow="0" w:lastRow="0" w:firstColumn="0" w:lastColumn="0" w:oddVBand="0" w:evenVBand="0" w:oddHBand="0" w:evenHBand="0" w:firstRowFirstColumn="0" w:firstRowLastColumn="0" w:lastRowFirstColumn="0" w:lastRowLastColumn="0"/>
+            </w:pPr>
+            <w:r>
+              <w:t xml:space="preserve">“jpeg” or “binary” </w:t>
+            </w:r>
+          </w:p>
+        </w:tc>
+        <w:tc>
+          <w:tcPr>
+            <w:tcW w:w="0" w:type="auto"/>
+          </w:tcPr>
+          <w:p>
+            <w:pPr>
+              <w:cnfStyle w:val="000000000000" w:firstRow="0" w:lastRow="0" w:firstColumn="0" w:lastColumn="0" w:oddVBand="0" w:evenVBand="0" w:oddHBand="0" w:evenHBand="0" w:firstRowFirstColumn="0" w:firstRowLastColumn="0" w:lastRowFirstColumn="0" w:lastRowLastColumn="0"/>
+            </w:pPr>
+            <w:r>
+              <w:t xml:space="preserve">output CV_8U, CV_32S, or CV_32F </w:t>
+            </w:r>
+            <w:r>
+              <w:t>created</w:t>
+            </w:r>
+            <w:r>
+              <w:t xml:space="preserve"> image. </w:t>
+            </w:r>
+          </w:p>
+        </w:tc>
+      </w:tr>
+    </w:tbl>
+    <w:p>
+      <w:pPr>
+        <w:pStyle w:val="Normalafterlist"/>
+        <w:rPr>
+          <w:sz w:val="18"/>
+          <w:szCs w:val="18"/>
+        </w:rPr>
+      </w:pPr>
+      <w:r>
+        <w:t>The</w:t>
+      </w:r>
+      <w:r>
+        <w:t>se are the</w:t>
+      </w:r>
+      <w:r>
+        <w:t xml:space="preserve"> parameters to the draw transform image create operator</w:t>
+      </w:r>
+      <w:r>
+        <w:t xml:space="preserve">. </w:t>
+      </w:r>
+    </w:p>
+    <w:p>
+      <w:pPr>
+        <w:pStyle w:val="NoSpacing"/>
+      </w:pPr>
+    </w:p>
+    <w:tbl>
+      <w:tblPr>
+        <w:tblStyle w:val="PlainTable1"/>
+        <w:tblW w:w="0" w:type="auto"/>
+        <w:tblLook w:val="04A0" w:firstRow="1" w:lastRow="0" w:firstColumn="1" w:lastColumn="0" w:noHBand="0" w:noVBand="1"/>
+      </w:tblPr>
+      <w:tblGrid>
+        <w:gridCol w:w="1366"/>
+        <w:gridCol w:w="7984"/>
+      </w:tblGrid>
+      <w:tr>
+        <w:trPr>
+          <w:cnfStyle w:val="100000000000" w:firstRow="1" w:lastRow="0" w:firstColumn="0" w:lastColumn="0" w:oddVBand="0" w:evenVBand="0" w:oddHBand="0" w:evenHBand="0" w:firstRowFirstColumn="0" w:firstRowLastColumn="0" w:lastRowFirstColumn="0" w:lastRowLastColumn="0"/>
+          <w:cantSplit/>
+          <w:tblHeader/>
+        </w:trPr>
+        <w:tc>
+          <w:tcPr>
+            <w:cnfStyle w:val="001000000000" w:firstRow="0" w:lastRow="0" w:firstColumn="1" w:lastColumn="0" w:oddVBand="0" w:evenVBand="0" w:oddHBand="0" w:evenHBand="0" w:firstRowFirstColumn="0" w:firstRowLastColumn="0" w:lastRowFirstColumn="0" w:lastRowLastColumn="0"/>
+            <w:tcW w:w="0" w:type="auto"/>
+          </w:tcPr>
+          <w:p>
+            <w:pPr>
+              <w:pStyle w:val="NoSpacing"/>
+            </w:pPr>
+            <w:r>
+              <w:t>parameter</w:t>
+            </w:r>
+          </w:p>
+        </w:tc>
+        <w:tc>
+          <w:tcPr>
+            <w:tcW w:w="0" w:type="auto"/>
+          </w:tcPr>
+          <w:p>
+            <w:pPr>
+              <w:pStyle w:val="NoSpacing"/>
+              <w:cnfStyle w:val="100000000000" w:firstRow="1" w:lastRow="0" w:firstColumn="0" w:lastColumn="0" w:oddVBand="0" w:evenVBand="0" w:oddHBand="0" w:evenHBand="0" w:firstRowFirstColumn="0" w:firstRowLastColumn="0" w:lastRowFirstColumn="0" w:lastRowLastColumn="0"/>
+            </w:pPr>
+            <w:r>
+              <w:t>description</w:t>
+            </w:r>
+          </w:p>
+        </w:tc>
+      </w:tr>
+      <w:tr>
+        <w:trPr>
+          <w:cnfStyle w:val="000000100000" w:firstRow="0" w:lastRow="0" w:firstColumn="0" w:lastColumn="0" w:oddVBand="0" w:evenVBand="0" w:oddHBand="1" w:evenHBand="0" w:firstRowFirstColumn="0" w:firstRowLastColumn="0" w:lastRowFirstColumn="0" w:lastRowLastColumn="0"/>
+        </w:trPr>
+        <w:tc>
+          <w:tcPr>
+            <w:cnfStyle w:val="001000000000" w:firstRow="0" w:lastRow="0" w:firstColumn="1" w:lastColumn="0" w:oddVBand="0" w:evenVBand="0" w:oddHBand="0" w:evenHBand="0" w:firstRowFirstColumn="0" w:firstRowLastColumn="0" w:lastRowFirstColumn="0" w:lastRowLastColumn="0"/>
+            <w:tcW w:w="0" w:type="auto"/>
+          </w:tcPr>
+          <w:p>
+            <w:pPr>
+              <w:rPr>
+                <w:b w:val="0"/>
+                <w:bCs w:val="0"/>
+              </w:rPr>
+            </w:pPr>
+            <w:r>
+              <w:rPr>
+                <w:b w:val="0"/>
+                <w:bCs w:val="0"/>
+              </w:rPr>
+              <w:t>rows</w:t>
+            </w:r>
+          </w:p>
+        </w:tc>
+        <w:tc>
+          <w:tcPr>
+            <w:tcW w:w="0" w:type="auto"/>
+          </w:tcPr>
+          <w:p>
+            <w:pPr>
+              <w:pStyle w:val="NoSpacing"/>
+              <w:cnfStyle w:val="000000100000" w:firstRow="0" w:lastRow="0" w:firstColumn="0" w:lastColumn="0" w:oddVBand="0" w:evenVBand="0" w:oddHBand="1" w:evenHBand="0" w:firstRowFirstColumn="0" w:firstRowLastColumn="0" w:lastRowFirstColumn="0" w:lastRowLastColumn="0"/>
+            </w:pPr>
+            <w:r>
+              <w:t>The number of image rows for a new image. Required if a text input image is omitted, else ignored.</w:t>
+            </w:r>
+          </w:p>
+        </w:tc>
+      </w:tr>
+      <w:tr>
+        <w:tc>
+          <w:tcPr>
+            <w:cnfStyle w:val="001000000000" w:firstRow="0" w:lastRow="0" w:firstColumn="1" w:lastColumn="0" w:oddVBand="0" w:evenVBand="0" w:oddHBand="0" w:evenHBand="0" w:firstRowFirstColumn="0" w:firstRowLastColumn="0" w:lastRowFirstColumn="0" w:lastRowLastColumn="0"/>
+            <w:tcW w:w="0" w:type="auto"/>
+          </w:tcPr>
+          <w:p>
+            <w:pPr>
+              <w:rPr>
+                <w:b w:val="0"/>
+                <w:bCs w:val="0"/>
+              </w:rPr>
+            </w:pPr>
+            <w:r>
+              <w:rPr>
+                <w:b w:val="0"/>
+                <w:bCs w:val="0"/>
+              </w:rPr>
+              <w:t>cols</w:t>
+            </w:r>
+          </w:p>
+        </w:tc>
+        <w:tc>
+          <w:tcPr>
+            <w:tcW w:w="0" w:type="auto"/>
+          </w:tcPr>
+          <w:p>
+            <w:pPr>
+              <w:pStyle w:val="NoSpacing"/>
+              <w:cnfStyle w:val="000000000000" w:firstRow="0" w:lastRow="0" w:firstColumn="0" w:lastColumn="0" w:oddVBand="0" w:evenVBand="0" w:oddHBand="0" w:evenHBand="0" w:firstRowFirstColumn="0" w:firstRowLastColumn="0" w:lastRowFirstColumn="0" w:lastRowLastColumn="0"/>
+            </w:pPr>
+            <w:r>
+              <w:t xml:space="preserve">The number of image columns </w:t>
+            </w:r>
+            <w:r>
+              <w:t>for a new image. Required if a text input image is omitted, else ignored</w:t>
+            </w:r>
+            <w:r>
+              <w:t>.</w:t>
+            </w:r>
+          </w:p>
+        </w:tc>
+      </w:tr>
+      <w:tr>
+        <w:trPr>
+          <w:cnfStyle w:val="000000100000" w:firstRow="0" w:lastRow="0" w:firstColumn="0" w:lastColumn="0" w:oddVBand="0" w:evenVBand="0" w:oddHBand="1" w:evenHBand="0" w:firstRowFirstColumn="0" w:firstRowLastColumn="0" w:lastRowFirstColumn="0" w:lastRowLastColumn="0"/>
+        </w:trPr>
+        <w:tc>
+          <w:tcPr>
+            <w:cnfStyle w:val="001000000000" w:firstRow="0" w:lastRow="0" w:firstColumn="1" w:lastColumn="0" w:oddVBand="0" w:evenVBand="0" w:oddHBand="0" w:evenHBand="0" w:firstRowFirstColumn="0" w:firstRowLastColumn="0" w:lastRowFirstColumn="0" w:lastRowLastColumn="0"/>
+            <w:tcW w:w="0" w:type="auto"/>
+          </w:tcPr>
+          <w:p>
+            <w:pPr>
+              <w:rPr>
+                <w:b w:val="0"/>
+                <w:bCs w:val="0"/>
+              </w:rPr>
+            </w:pPr>
+            <w:r>
+              <w:rPr>
+                <w:b w:val="0"/>
+                <w:bCs w:val="0"/>
+              </w:rPr>
+              <w:t>background</w:t>
+            </w:r>
+          </w:p>
+        </w:tc>
+        <w:tc>
+          <w:tcPr>
+            <w:tcW w:w="0" w:type="auto"/>
+          </w:tcPr>
+          <w:p>
+            <w:pPr>
+              <w:pStyle w:val="NoSpacing"/>
+              <w:cnfStyle w:val="000000100000" w:firstRow="0" w:lastRow="0" w:firstColumn="0" w:lastColumn="0" w:oddVBand="0" w:evenVBand="0" w:oddHBand="1" w:evenHBand="0" w:firstRowFirstColumn="0" w:firstRowLastColumn="0" w:lastRowFirstColumn="0" w:lastRowLastColumn="0"/>
+            </w:pPr>
+            <w:r>
+              <w:t xml:space="preserve">The </w:t>
+            </w:r>
+            <w:r>
+              <w:t xml:space="preserve">base </w:t>
+            </w:r>
+            <w:r>
+              <w:t>pixel value of the output image</w:t>
+            </w:r>
+            <w:r>
+              <w:t>, defaults to 0</w:t>
+            </w:r>
+          </w:p>
+        </w:tc>
+      </w:tr>
+      <w:tr>
+        <w:tc>
+          <w:tcPr>
+            <w:cnfStyle w:val="001000000000" w:firstRow="0" w:lastRow="0" w:firstColumn="1" w:lastColumn="0" w:oddVBand="0" w:evenVBand="0" w:oddHBand="0" w:evenHBand="0" w:firstRowFirstColumn="0" w:firstRowLastColumn="0" w:lastRowFirstColumn="0" w:lastRowLastColumn="0"/>
+            <w:tcW w:w="0" w:type="auto"/>
+          </w:tcPr>
+          <w:p>
+            <w:pPr>
+              <w:rPr>
+                <w:b w:val="0"/>
+                <w:bCs w:val="0"/>
+              </w:rPr>
+            </w:pPr>
+            <w:r>
+              <w:rPr>
+                <w:b w:val="0"/>
+                <w:bCs w:val="0"/>
+              </w:rPr>
+              <w:t>foreground</w:t>
+            </w:r>
+          </w:p>
+        </w:tc>
+        <w:tc>
+          <w:tcPr>
+            <w:tcW w:w="0" w:type="auto"/>
+          </w:tcPr>
+          <w:p>
+            <w:pPr>
+              <w:pStyle w:val="NoSpacing"/>
+              <w:cnfStyle w:val="000000000000" w:firstRow="0" w:lastRow="0" w:firstColumn="0" w:lastColumn="0" w:oddVBand="0" w:evenVBand="0" w:oddHBand="0" w:evenHBand="0" w:firstRowFirstColumn="0" w:firstRowLastColumn="0" w:lastRowFirstColumn="0" w:lastRowLastColumn="0"/>
+            </w:pPr>
+            <w:r>
+              <w:t xml:space="preserve">The pixel value of </w:t>
+            </w:r>
+            <w:r>
+              <w:t xml:space="preserve">added features </w:t>
+            </w:r>
+            <w:r>
+              <w:t>the output image</w:t>
+            </w:r>
+            <w:r>
+              <w:t xml:space="preserve"> defaults to 255</w:t>
+            </w:r>
+          </w:p>
+        </w:tc>
+      </w:tr>
+      <w:tr>
+        <w:trPr>
+          <w:cnfStyle w:val="000000100000" w:firstRow="0" w:lastRow="0" w:firstColumn="0" w:lastColumn="0" w:oddVBand="0" w:evenVBand="0" w:oddHBand="1" w:evenHBand="0" w:firstRowFirstColumn="0" w:firstRowLastColumn="0" w:lastRowFirstColumn="0" w:lastRowLastColumn="0"/>
+        </w:trPr>
+        <w:tc>
+          <w:tcPr>
+            <w:cnfStyle w:val="001000000000" w:firstRow="0" w:lastRow="0" w:firstColumn="1" w:lastColumn="0" w:oddVBand="0" w:evenVBand="0" w:oddHBand="0" w:evenHBand="0" w:firstRowFirstColumn="0" w:firstRowLastColumn="0" w:lastRowFirstColumn="0" w:lastRowLastColumn="0"/>
+            <w:tcW w:w="0" w:type="auto"/>
+          </w:tcPr>
+          <w:p>
+            <w:pPr>
+              <w:rPr>
+                <w:b w:val="0"/>
+                <w:bCs w:val="0"/>
+              </w:rPr>
+            </w:pPr>
+            <w:r>
+              <w:rPr>
+                <w:b w:val="0"/>
+                <w:bCs w:val="0"/>
+              </w:rPr>
+              <w:t>point</w:t>
+            </w:r>
+          </w:p>
+        </w:tc>
+        <w:tc>
+          <w:tcPr>
+            <w:tcW w:w="0" w:type="auto"/>
+          </w:tcPr>
+          <w:p>
+            <w:pPr>
+              <w:pStyle w:val="NoSpacing"/>
+              <w:cnfStyle w:val="000000100000" w:firstRow="0" w:lastRow="0" w:firstColumn="0" w:lastColumn="0" w:oddVBand="0" w:evenVBand="0" w:oddHBand="1" w:evenHBand="0" w:firstRowFirstColumn="0" w:firstRowLastColumn="0" w:lastRowFirstColumn="0" w:lastRowLastColumn="0"/>
+            </w:pPr>
+            <w:r>
+              <w:t>A point to add to the image as ‘</w:t>
+            </w:r>
+            <w:r>
+              <w:t>row,col</w:t>
+            </w:r>
+            <w:r>
+              <w:t>’</w:t>
+            </w:r>
+          </w:p>
+        </w:tc>
+      </w:tr>
+      <w:tr>
+        <w:tc>
+          <w:tcPr>
+            <w:cnfStyle w:val="001000000000" w:firstRow="0" w:lastRow="0" w:firstColumn="1" w:lastColumn="0" w:oddVBand="0" w:evenVBand="0" w:oddHBand="0" w:evenHBand="0" w:firstRowFirstColumn="0" w:firstRowLastColumn="0" w:lastRowFirstColumn="0" w:lastRowLastColumn="0"/>
+            <w:tcW w:w="0" w:type="auto"/>
+          </w:tcPr>
+          <w:p>
+            <w:pPr>
+              <w:rPr>
+                <w:b w:val="0"/>
+                <w:bCs w:val="0"/>
+              </w:rPr>
+            </w:pPr>
+            <w:r>
+              <w:rPr>
+                <w:b w:val="0"/>
+                <w:bCs w:val="0"/>
+              </w:rPr>
+              <w:t>line</w:t>
+            </w:r>
+          </w:p>
+        </w:tc>
+        <w:tc>
+          <w:tcPr>
+            <w:tcW w:w="0" w:type="auto"/>
+          </w:tcPr>
+          <w:p>
+            <w:pPr>
+              <w:pStyle w:val="NoSpacing"/>
+              <w:cnfStyle w:val="000000000000" w:firstRow="0" w:lastRow="0" w:firstColumn="0" w:lastColumn="0" w:oddVBand="0" w:evenVBand="0" w:oddHBand="0" w:evenHBand="0" w:firstRowFirstColumn="0" w:firstRowLastColumn="0" w:lastRowFirstColumn="0" w:lastRowLastColumn="0"/>
+            </w:pPr>
+            <w:r>
+              <w:t xml:space="preserve">A </w:t>
+            </w:r>
+            <w:r>
+              <w:t>line segment ‘(row,col):(row,col</w:t>
+            </w:r>
+            <w:r>
+              <w:rPr>
+                <w:b/>
+                <w:bCs/>
+              </w:rPr>
+              <w:t>)’</w:t>
+            </w:r>
+            <w:r>
+              <w:t xml:space="preserve"> to </w:t>
+            </w:r>
+            <w:r>
+              <w:t xml:space="preserve">add to the image, where </w:t>
+            </w:r>
+            <w:r>
+              <w:t>each ‘(</w:t>
+            </w:r>
+            <w:r>
+              <w:t>row,col</w:t>
+            </w:r>
+            <w:r>
+              <w:t>)</w:t>
+            </w:r>
+            <w:r>
+              <w:t xml:space="preserve">’ </w:t>
+            </w:r>
+            <w:r>
+              <w:t>is the start and end points</w:t>
+            </w:r>
+          </w:p>
+        </w:tc>
+      </w:tr>
+      <w:tr>
+        <w:trPr>
+          <w:cnfStyle w:val="000000100000" w:firstRow="0" w:lastRow="0" w:firstColumn="0" w:lastColumn="0" w:oddVBand="0" w:evenVBand="0" w:oddHBand="1" w:evenHBand="0" w:firstRowFirstColumn="0" w:firstRowLastColumn="0" w:lastRowFirstColumn="0" w:lastRowLastColumn="0"/>
+        </w:trPr>
+        <w:tc>
+          <w:tcPr>
+            <w:cnfStyle w:val="001000000000" w:firstRow="0" w:lastRow="0" w:firstColumn="1" w:lastColumn="0" w:oddVBand="0" w:evenVBand="0" w:oddHBand="0" w:evenHBand="0" w:firstRowFirstColumn="0" w:firstRowLastColumn="0" w:lastRowFirstColumn="0" w:lastRowLastColumn="0"/>
+            <w:tcW w:w="0" w:type="auto"/>
+          </w:tcPr>
+          <w:p>
+            <w:pPr>
+              <w:rPr>
+                <w:b w:val="0"/>
+                <w:bCs w:val="0"/>
+              </w:rPr>
+            </w:pPr>
+            <w:r>
+              <w:rPr>
+                <w:b w:val="0"/>
+                <w:bCs w:val="0"/>
+              </w:rPr>
+              <w:t>rectangle</w:t>
+            </w:r>
+          </w:p>
+        </w:tc>
+        <w:tc>
+          <w:tcPr>
+            <w:tcW w:w="0" w:type="auto"/>
+          </w:tcPr>
+          <w:p>
+            <w:pPr>
+              <w:pStyle w:val="NoSpacing"/>
+              <w:cnfStyle w:val="000000100000" w:firstRow="0" w:lastRow="0" w:firstColumn="0" w:lastColumn="0" w:oddVBand="0" w:evenVBand="0" w:oddHBand="1" w:evenHBand="0" w:firstRowFirstColumn="0" w:firstRowLastColumn="0" w:lastRowFirstColumn="0" w:lastRowLastColumn="0"/>
+            </w:pPr>
+            <w:r>
+              <w:t>A rectangle ‘(row,col):(row,col)’ to add to the image, where the first ‘row,col’ is the upper left-hand corner and the second ‘row,col’ is the lower right-hand corner</w:t>
+            </w:r>
+          </w:p>
+        </w:tc>
+      </w:tr>
+    </w:tbl>
+    <w:p>
+      <w:pPr>
+        <w:pStyle w:val="Normalafterlist"/>
+      </w:pPr>
+      <w:r>
+        <w:t xml:space="preserve">The ‘point’, ‘line’, and ‘rectangle’ parameter values may be repeated by separating the values with ‘|’, </w:t>
+      </w:r>
+      <w:r>
+        <w:t>for example</w:t>
+      </w:r>
+      <w:r>
+        <w:t>:</w:t>
+      </w:r>
+    </w:p>
+    <w:p>
+      <w:pPr>
+        <w:pStyle w:val="code"/>
+        <w:ind w:left="720"/>
+        <w:rPr>
+          <w:sz w:val="18"/>
+          <w:szCs w:val="18"/>
+        </w:rPr>
+      </w:pPr>
+      <w:r>
+        <w:rPr>
+          <w:sz w:val="18"/>
+          <w:szCs w:val="18"/>
+        </w:rPr>
+        <w:t>“point”: “(</w:t>
+      </w:r>
+      <w:r>
+        <w:rPr>
+          <w:i/>
+          <w:iCs/>
+          <w:sz w:val="18"/>
+          <w:szCs w:val="18"/>
+        </w:rPr>
+        <w:t>row</w:t>
+      </w:r>
+      <w:r>
+        <w:rPr>
+          <w:sz w:val="18"/>
+          <w:szCs w:val="18"/>
+        </w:rPr>
+        <w:t>,</w:t>
+      </w:r>
+      <w:r>
+        <w:rPr>
+          <w:i/>
+          <w:iCs/>
+          <w:sz w:val="18"/>
+          <w:szCs w:val="18"/>
+        </w:rPr>
+        <w:t>col</w:t>
+      </w:r>
+      <w:r>
+        <w:rPr>
+          <w:sz w:val="18"/>
+          <w:szCs w:val="18"/>
+        </w:rPr>
+        <w:t>)|(</w:t>
+      </w:r>
+      <w:r>
+        <w:rPr>
+          <w:i/>
+          <w:iCs/>
+          <w:sz w:val="18"/>
+          <w:szCs w:val="18"/>
+        </w:rPr>
+        <w:t>row</w:t>
+      </w:r>
+      <w:r>
+        <w:rPr>
+          <w:sz w:val="18"/>
+          <w:szCs w:val="18"/>
+        </w:rPr>
+        <w:t>,</w:t>
+      </w:r>
+      <w:r>
+        <w:rPr>
+          <w:i/>
+          <w:iCs/>
+          <w:sz w:val="18"/>
+          <w:szCs w:val="18"/>
+        </w:rPr>
+        <w:t>col</w:t>
+      </w:r>
+      <w:r>
+        <w:rPr>
+          <w:sz w:val="18"/>
+          <w:szCs w:val="18"/>
+        </w:rPr>
+        <w:t>)”</w:t>
+      </w:r>
+    </w:p>
+    <w:p>
+      <w:pPr>
+        <w:pStyle w:val="code"/>
+        <w:ind w:left="720"/>
+        <w:rPr>
+          <w:sz w:val="18"/>
+          <w:szCs w:val="18"/>
+        </w:rPr>
+      </w:pPr>
+      <w:r>
+        <w:rPr>
+          <w:sz w:val="18"/>
+          <w:szCs w:val="18"/>
+        </w:rPr>
+        <w:t>“line”: “(</w:t>
+      </w:r>
+      <w:r>
+        <w:rPr>
+          <w:i/>
+          <w:iCs/>
+          <w:sz w:val="18"/>
+          <w:szCs w:val="18"/>
+        </w:rPr>
+        <w:t>row</w:t>
+      </w:r>
+      <w:r>
+        <w:rPr>
+          <w:sz w:val="18"/>
+          <w:szCs w:val="18"/>
+        </w:rPr>
+        <w:t>,</w:t>
+      </w:r>
+      <w:r>
+        <w:rPr>
+          <w:i/>
+          <w:iCs/>
+          <w:sz w:val="18"/>
+          <w:szCs w:val="18"/>
+        </w:rPr>
+        <w:t>col</w:t>
+      </w:r>
+      <w:r>
+        <w:rPr>
+          <w:sz w:val="18"/>
+          <w:szCs w:val="18"/>
+        </w:rPr>
+        <w:t>):(</w:t>
+      </w:r>
+      <w:r>
+        <w:rPr>
+          <w:i/>
+          <w:iCs/>
+          <w:sz w:val="18"/>
+          <w:szCs w:val="18"/>
+        </w:rPr>
+        <w:t>row</w:t>
+      </w:r>
+      <w:r>
+        <w:rPr>
+          <w:sz w:val="18"/>
+          <w:szCs w:val="18"/>
+        </w:rPr>
+        <w:t>,</w:t>
+      </w:r>
+      <w:r>
+        <w:rPr>
+          <w:i/>
+          <w:iCs/>
+          <w:sz w:val="18"/>
+          <w:szCs w:val="18"/>
+        </w:rPr>
+        <w:t>col</w:t>
+      </w:r>
+      <w:r>
+        <w:rPr>
+          <w:sz w:val="18"/>
+          <w:szCs w:val="18"/>
+        </w:rPr>
+        <w:t>)|(</w:t>
+      </w:r>
+      <w:r>
+        <w:rPr>
+          <w:i/>
+          <w:iCs/>
+          <w:sz w:val="18"/>
+          <w:szCs w:val="18"/>
+        </w:rPr>
+        <w:t>row</w:t>
+      </w:r>
+      <w:r>
+        <w:rPr>
+          <w:sz w:val="18"/>
+          <w:szCs w:val="18"/>
+        </w:rPr>
+        <w:t>,</w:t>
+      </w:r>
+      <w:r>
+        <w:rPr>
+          <w:i/>
+          <w:iCs/>
+          <w:sz w:val="18"/>
+          <w:szCs w:val="18"/>
+        </w:rPr>
+        <w:t>col</w:t>
+      </w:r>
+      <w:r>
+        <w:rPr>
+          <w:sz w:val="18"/>
+          <w:szCs w:val="18"/>
+        </w:rPr>
+        <w:t>):(</w:t>
+      </w:r>
+      <w:r>
+        <w:rPr>
+          <w:i/>
+          <w:iCs/>
+          <w:sz w:val="18"/>
+          <w:szCs w:val="18"/>
+        </w:rPr>
+        <w:t>row</w:t>
+      </w:r>
+      <w:r>
+        <w:rPr>
+          <w:sz w:val="18"/>
+          <w:szCs w:val="18"/>
+        </w:rPr>
+        <w:t>,</w:t>
+      </w:r>
+      <w:r>
+        <w:rPr>
+          <w:i/>
+          <w:iCs/>
+          <w:sz w:val="18"/>
+          <w:szCs w:val="18"/>
+        </w:rPr>
+        <w:t>col</w:t>
+      </w:r>
+      <w:r>
+        <w:rPr>
+          <w:sz w:val="18"/>
+          <w:szCs w:val="18"/>
+        </w:rPr>
+        <w:t>)”</w:t>
+      </w:r>
+    </w:p>
+    <w:p>
+      <w:pPr>
+        <w:pStyle w:val="code"/>
+        <w:ind w:left="720"/>
+        <w:rPr>
+          <w:sz w:val="18"/>
+          <w:szCs w:val="18"/>
+        </w:rPr>
+      </w:pPr>
+      <w:r>
+        <w:rPr>
+          <w:sz w:val="18"/>
+          <w:szCs w:val="18"/>
+        </w:rPr>
+        <w:t>“rectangle”: “(</w:t>
+      </w:r>
+      <w:r>
+        <w:rPr>
+          <w:i/>
+          <w:iCs/>
+          <w:sz w:val="18"/>
+          <w:szCs w:val="18"/>
+        </w:rPr>
+        <w:t>row</w:t>
+      </w:r>
+      <w:r>
+        <w:rPr>
+          <w:sz w:val="18"/>
+          <w:szCs w:val="18"/>
+        </w:rPr>
+        <w:t>,</w:t>
+      </w:r>
+      <w:r>
+        <w:rPr>
+          <w:i/>
+          <w:iCs/>
+          <w:sz w:val="18"/>
+          <w:szCs w:val="18"/>
+        </w:rPr>
+        <w:t>col</w:t>
+      </w:r>
+      <w:r>
+        <w:rPr>
+          <w:sz w:val="18"/>
+          <w:szCs w:val="18"/>
+        </w:rPr>
+        <w:t>):(</w:t>
+      </w:r>
+      <w:r>
+        <w:rPr>
+          <w:i/>
+          <w:iCs/>
+          <w:sz w:val="18"/>
+          <w:szCs w:val="18"/>
+        </w:rPr>
+        <w:t>row</w:t>
+      </w:r>
+      <w:r>
+        <w:rPr>
+          <w:sz w:val="18"/>
+          <w:szCs w:val="18"/>
+        </w:rPr>
+        <w:t>,</w:t>
+      </w:r>
+      <w:r>
+        <w:rPr>
+          <w:i/>
+          <w:iCs/>
+          <w:sz w:val="18"/>
+          <w:szCs w:val="18"/>
+        </w:rPr>
+        <w:t>col</w:t>
+      </w:r>
+      <w:r>
+        <w:rPr>
+          <w:sz w:val="18"/>
+          <w:szCs w:val="18"/>
+        </w:rPr>
+        <w:t>)|(</w:t>
+      </w:r>
+      <w:r>
+        <w:rPr>
+          <w:i/>
+          <w:iCs/>
+          <w:sz w:val="18"/>
+          <w:szCs w:val="18"/>
+        </w:rPr>
+        <w:t>row</w:t>
+      </w:r>
+      <w:r>
+        <w:rPr>
+          <w:sz w:val="18"/>
+          <w:szCs w:val="18"/>
+        </w:rPr>
+        <w:t>,</w:t>
+      </w:r>
+      <w:r>
+        <w:rPr>
+          <w:i/>
+          <w:iCs/>
+          <w:sz w:val="18"/>
+          <w:szCs w:val="18"/>
+        </w:rPr>
+        <w:t>col</w:t>
+      </w:r>
+      <w:r>
+        <w:rPr>
+          <w:sz w:val="18"/>
+          <w:szCs w:val="18"/>
+        </w:rPr>
+        <w:t>):(</w:t>
+      </w:r>
+      <w:r>
+        <w:rPr>
+          <w:i/>
+          <w:iCs/>
+          <w:sz w:val="18"/>
+          <w:szCs w:val="18"/>
+        </w:rPr>
+        <w:t>row</w:t>
+      </w:r>
+      <w:r>
+        <w:rPr>
+          <w:sz w:val="18"/>
+          <w:szCs w:val="18"/>
+        </w:rPr>
+        <w:t>,</w:t>
+      </w:r>
+      <w:r>
+        <w:rPr>
+          <w:i/>
+          <w:iCs/>
+          <w:sz w:val="18"/>
+          <w:szCs w:val="18"/>
+        </w:rPr>
+        <w:t>col</w:t>
+      </w:r>
+      <w:r>
+        <w:rPr>
+          <w:sz w:val="18"/>
+          <w:szCs w:val="18"/>
+        </w:rPr>
+        <w:t>)”</w:t>
+      </w:r>
+    </w:p>
+    <w:p>
+      <w:pPr>
+        <w:pStyle w:val="Normalafterlist"/>
+      </w:pPr>
+      <w:r>
+        <w:t>The experiment log output includes the output image pixel parameters:</w:t>
+      </w:r>
+    </w:p>
+    <w:tbl>
+      <w:tblPr>
+        <w:tblStyle w:val="PlainTable1"/>
+        <w:tblW w:w="0" w:type="auto"/>
+        <w:tblLook w:val="04A0" w:firstRow="1" w:lastRow="0" w:firstColumn="1" w:lastColumn="0" w:noHBand="0" w:noVBand="1"/>
+      </w:tblPr>
+      <w:tblGrid>
+        <w:gridCol w:w="1415"/>
+        <w:gridCol w:w="7935"/>
+      </w:tblGrid>
+      <w:tr>
+        <w:trPr>
+          <w:cnfStyle w:val="100000000000" w:firstRow="1" w:lastRow="0" w:firstColumn="0" w:lastColumn="0" w:oddVBand="0" w:evenVBand="0" w:oddHBand="0" w:evenHBand="0" w:firstRowFirstColumn="0" w:firstRowLastColumn="0" w:lastRowFirstColumn="0" w:lastRowLastColumn="0"/>
+          <w:cantSplit/>
+          <w:tblHeader/>
+        </w:trPr>
+        <w:tc>
+          <w:tcPr>
+            <w:cnfStyle w:val="001000000000" w:firstRow="0" w:lastRow="0" w:firstColumn="1" w:lastColumn="0" w:oddVBand="0" w:evenVBand="0" w:oddHBand="0" w:evenHBand="0" w:firstRowFirstColumn="0" w:firstRowLastColumn="0" w:lastRowFirstColumn="0" w:lastRowLastColumn="0"/>
+            <w:tcW w:w="0" w:type="auto"/>
+          </w:tcPr>
+          <w:p>
+            <w:pPr>
+              <w:pStyle w:val="NoSpacing"/>
+            </w:pPr>
+            <w:r>
+              <w:t>Field</w:t>
+            </w:r>
+          </w:p>
+        </w:tc>
+        <w:tc>
+          <w:tcPr>
+            <w:tcW w:w="0" w:type="auto"/>
+          </w:tcPr>
+          <w:p>
+            <w:pPr>
+              <w:pStyle w:val="NoSpacing"/>
+              <w:cnfStyle w:val="100000000000" w:firstRow="1" w:lastRow="0" w:firstColumn="0" w:lastColumn="0" w:oddVBand="0" w:evenVBand="0" w:oddHBand="0" w:evenHBand="0" w:firstRowFirstColumn="0" w:firstRowLastColumn="0" w:lastRowFirstColumn="0" w:lastRowLastColumn="0"/>
+            </w:pPr>
+            <w:r>
+              <w:t>Description</w:t>
+            </w:r>
+          </w:p>
+        </w:tc>
+      </w:tr>
+      <w:tr>
+        <w:trPr>
+          <w:cnfStyle w:val="000000100000" w:firstRow="0" w:lastRow="0" w:firstColumn="0" w:lastColumn="0" w:oddVBand="0" w:evenVBand="0" w:oddHBand="1" w:evenHBand="0" w:firstRowFirstColumn="0" w:firstRowLastColumn="0" w:lastRowFirstColumn="0" w:lastRowLastColumn="0"/>
+        </w:trPr>
+        <w:tc>
+          <w:tcPr>
+            <w:cnfStyle w:val="001000000000" w:firstRow="0" w:lastRow="0" w:firstColumn="1" w:lastColumn="0" w:oddVBand="0" w:evenVBand="0" w:oddHBand="0" w:evenHBand="0" w:firstRowFirstColumn="0" w:firstRowLastColumn="0" w:lastRowFirstColumn="0" w:lastRowLastColumn="0"/>
+            <w:tcW w:w="0" w:type="auto"/>
+          </w:tcPr>
+          <w:p>
+            <w:pPr>
+              <w:pStyle w:val="NoSpacing"/>
+              <w:rPr>
+                <w:b w:val="0"/>
+                <w:bCs w:val="0"/>
+              </w:rPr>
+            </w:pPr>
+            <w:r>
+              <w:rPr>
+                <w:b w:val="0"/>
+                <w:bCs w:val="0"/>
+              </w:rPr>
+              <w:t>rows</w:t>
+            </w:r>
+          </w:p>
+        </w:tc>
+        <w:tc>
+          <w:tcPr>
+            <w:tcW w:w="0" w:type="auto"/>
+          </w:tcPr>
+          <w:p>
+            <w:pPr>
+              <w:pStyle w:val="NoSpacing"/>
+              <w:cnfStyle w:val="000000100000" w:firstRow="0" w:lastRow="0" w:firstColumn="0" w:lastColumn="0" w:oddVBand="0" w:evenVBand="0" w:oddHBand="1" w:evenHBand="0" w:firstRowFirstColumn="0" w:firstRowLastColumn="0" w:lastRowFirstColumn="0" w:lastRowLastColumn="0"/>
+            </w:pPr>
+            <w:r>
+              <w:t>The number of image rows</w:t>
+            </w:r>
+          </w:p>
+        </w:tc>
+      </w:tr>
+      <w:tr>
+        <w:tc>
+          <w:tcPr>
+            <w:cnfStyle w:val="001000000000" w:firstRow="0" w:lastRow="0" w:firstColumn="1" w:lastColumn="0" w:oddVBand="0" w:evenVBand="0" w:oddHBand="0" w:evenHBand="0" w:firstRowFirstColumn="0" w:firstRowLastColumn="0" w:lastRowFirstColumn="0" w:lastRowLastColumn="0"/>
+            <w:tcW w:w="0" w:type="auto"/>
+          </w:tcPr>
+          <w:p>
+            <w:pPr>
+              <w:pStyle w:val="NoSpacing"/>
+              <w:rPr>
+                <w:b w:val="0"/>
+                <w:bCs w:val="0"/>
+              </w:rPr>
+            </w:pPr>
+            <w:r>
+              <w:rPr>
+                <w:b w:val="0"/>
+                <w:bCs w:val="0"/>
+              </w:rPr>
+              <w:t>cols</w:t>
+            </w:r>
+          </w:p>
+        </w:tc>
+        <w:tc>
+          <w:tcPr>
+            <w:tcW w:w="0" w:type="auto"/>
+          </w:tcPr>
+          <w:p>
+            <w:pPr>
+              <w:pStyle w:val="NoSpacing"/>
+              <w:cnfStyle w:val="000000000000" w:firstRow="0" w:lastRow="0" w:firstColumn="0" w:lastColumn="0" w:oddVBand="0" w:evenVBand="0" w:oddHBand="0" w:evenHBand="0" w:firstRowFirstColumn="0" w:firstRowLastColumn="0" w:lastRowFirstColumn="0" w:lastRowLastColumn="0"/>
+            </w:pPr>
+            <w:r>
+              <w:t>The number of image columns</w:t>
+            </w:r>
+          </w:p>
+        </w:tc>
+      </w:tr>
+      <w:tr>
+        <w:trPr>
+          <w:cnfStyle w:val="000000100000" w:firstRow="0" w:lastRow="0" w:firstColumn="0" w:lastColumn="0" w:oddVBand="0" w:evenVBand="0" w:oddHBand="1" w:evenHBand="0" w:firstRowFirstColumn="0" w:firstRowLastColumn="0" w:lastRowFirstColumn="0" w:lastRowLastColumn="0"/>
+        </w:trPr>
+        <w:tc>
+          <w:tcPr>
+            <w:cnfStyle w:val="001000000000" w:firstRow="0" w:lastRow="0" w:firstColumn="1" w:lastColumn="0" w:oddVBand="0" w:evenVBand="0" w:oddHBand="0" w:evenHBand="0" w:firstRowFirstColumn="0" w:firstRowLastColumn="0" w:lastRowFirstColumn="0" w:lastRowLastColumn="0"/>
+            <w:tcW w:w="0" w:type="auto"/>
+          </w:tcPr>
+          <w:p>
+            <w:pPr>
+              <w:pStyle w:val="NoSpacing"/>
+              <w:rPr>
+                <w:b w:val="0"/>
+                <w:bCs w:val="0"/>
+              </w:rPr>
+            </w:pPr>
+            <w:r>
+              <w:rPr>
+                <w:b w:val="0"/>
+                <w:bCs w:val="0"/>
+              </w:rPr>
+              <w:t>components</w:t>
+            </w:r>
+          </w:p>
+        </w:tc>
+        <w:tc>
+          <w:tcPr>
+            <w:tcW w:w="0" w:type="auto"/>
+          </w:tcPr>
+          <w:p>
+            <w:pPr>
+              <w:pStyle w:val="NoSpacing"/>
+              <w:cnfStyle w:val="000000100000" w:firstRow="0" w:lastRow="0" w:firstColumn="0" w:lastColumn="0" w:oddVBand="0" w:evenVBand="0" w:oddHBand="1" w:evenHBand="0" w:firstRowFirstColumn="0" w:firstRowLastColumn="0" w:lastRowFirstColumn="0" w:lastRowLastColumn="0"/>
+            </w:pPr>
+            <w:r>
+              <w:t>The number of image components. Grayscale images have 1 component, color images have 3 components.</w:t>
+            </w:r>
+          </w:p>
+        </w:tc>
+      </w:tr>
+      <w:tr>
+        <w:tc>
+          <w:tcPr>
+            <w:cnfStyle w:val="001000000000" w:firstRow="0" w:lastRow="0" w:firstColumn="1" w:lastColumn="0" w:oddVBand="0" w:evenVBand="0" w:oddHBand="0" w:evenHBand="0" w:firstRowFirstColumn="0" w:firstRowLastColumn="0" w:lastRowFirstColumn="0" w:lastRowLastColumn="0"/>
+            <w:tcW w:w="0" w:type="auto"/>
+          </w:tcPr>
+          <w:p>
+            <w:pPr>
+              <w:pStyle w:val="NoSpacing"/>
+              <w:rPr>
+                <w:b w:val="0"/>
+                <w:bCs w:val="0"/>
+              </w:rPr>
+            </w:pPr>
+            <w:r>
+              <w:rPr>
+                <w:b w:val="0"/>
+                <w:bCs w:val="0"/>
+              </w:rPr>
+              <w:t>depth</w:t>
+            </w:r>
+          </w:p>
+        </w:tc>
+        <w:tc>
+          <w:tcPr>
+            <w:tcW w:w="0" w:type="auto"/>
+          </w:tcPr>
+          <w:p>
+            <w:pPr>
+              <w:pStyle w:val="NoSpacing"/>
+              <w:cnfStyle w:val="000000000000" w:firstRow="0" w:lastRow="0" w:firstColumn="0" w:lastColumn="0" w:oddVBand="0" w:evenVBand="0" w:oddHBand="0" w:evenHBand="0" w:firstRowFirstColumn="0" w:firstRowLastColumn="0" w:lastRowFirstColumn="0" w:lastRowLastColumn="0"/>
+            </w:pPr>
+            <w:r>
+              <w:t>Pixel value data type.</w:t>
+            </w:r>
+          </w:p>
+          <w:p>
+            <w:pPr>
+              <w:pStyle w:val="tablebullet"/>
+              <w:cnfStyle w:val="000000000000" w:firstRow="0" w:lastRow="0" w:firstColumn="0" w:lastColumn="0" w:oddVBand="0" w:evenVBand="0" w:oddHBand="0" w:evenHBand="0" w:firstRowFirstColumn="0" w:firstRowLastColumn="0" w:lastRowFirstColumn="0" w:lastRowLastColumn="0"/>
+              <w:rPr>
+                <w:sz w:val="20"/>
+                <w:szCs w:val="20"/>
+              </w:rPr>
+            </w:pPr>
+            <w:r>
+              <w:rPr>
+                <w:sz w:val="20"/>
+                <w:szCs w:val="20"/>
+              </w:rPr>
+              <w:t xml:space="preserve">CV_8U </w:t>
+            </w:r>
+          </w:p>
+          <w:p>
+            <w:pPr>
+              <w:pStyle w:val="tablebullet"/>
+              <w:cnfStyle w:val="000000000000" w:firstRow="0" w:lastRow="0" w:firstColumn="0" w:lastColumn="0" w:oddVBand="0" w:evenVBand="0" w:oddHBand="0" w:evenHBand="0" w:firstRowFirstColumn="0" w:firstRowLastColumn="0" w:lastRowFirstColumn="0" w:lastRowLastColumn="0"/>
+              <w:rPr>
+                <w:sz w:val="20"/>
+                <w:szCs w:val="20"/>
+              </w:rPr>
+            </w:pPr>
+            <w:r>
+              <w:rPr>
+                <w:sz w:val="20"/>
+                <w:szCs w:val="20"/>
+              </w:rPr>
+              <w:t>CV_32S</w:t>
+            </w:r>
+          </w:p>
+          <w:p>
+            <w:pPr>
+              <w:pStyle w:val="tablebullet"/>
+              <w:cnfStyle w:val="000000000000" w:firstRow="0" w:lastRow="0" w:firstColumn="0" w:lastColumn="0" w:oddVBand="0" w:evenVBand="0" w:oddHBand="0" w:evenHBand="0" w:firstRowFirstColumn="0" w:firstRowLastColumn="0" w:lastRowFirstColumn="0" w:lastRowLastColumn="0"/>
+            </w:pPr>
+            <w:r>
+              <w:rPr>
+                <w:sz w:val="20"/>
+                <w:szCs w:val="20"/>
+              </w:rPr>
+              <w:t>CV_32F</w:t>
+            </w:r>
+          </w:p>
+        </w:tc>
+      </w:tr>
+      <w:tr>
+        <w:trPr>
+          <w:cnfStyle w:val="000000100000" w:firstRow="0" w:lastRow="0" w:firstColumn="0" w:lastColumn="0" w:oddVBand="0" w:evenVBand="0" w:oddHBand="1" w:evenHBand="0" w:firstRowFirstColumn="0" w:firstRowLastColumn="0" w:lastRowFirstColumn="0" w:lastRowLastColumn="0"/>
+        </w:trPr>
+        <w:tc>
+          <w:tcPr>
+            <w:cnfStyle w:val="001000000000" w:firstRow="0" w:lastRow="0" w:firstColumn="1" w:lastColumn="0" w:oddVBand="0" w:evenVBand="0" w:oddHBand="0" w:evenHBand="0" w:firstRowFirstColumn="0" w:firstRowLastColumn="0" w:lastRowFirstColumn="0" w:lastRowLastColumn="0"/>
+            <w:tcW w:w="0" w:type="auto"/>
+          </w:tcPr>
+          <w:p>
+            <w:pPr>
+              <w:pStyle w:val="NoSpacing"/>
+              <w:rPr>
+                <w:b w:val="0"/>
+                <w:bCs w:val="0"/>
+              </w:rPr>
+            </w:pPr>
+            <w:r>
+              <w:rPr>
+                <w:b w:val="0"/>
+                <w:bCs w:val="0"/>
+              </w:rPr>
+              <w:t>pixel count</w:t>
+            </w:r>
+          </w:p>
+        </w:tc>
+        <w:tc>
+          <w:tcPr>
+            <w:tcW w:w="0" w:type="auto"/>
+          </w:tcPr>
+          <w:p>
+            <w:pPr>
+              <w:pStyle w:val="NoSpacing"/>
+              <w:cnfStyle w:val="000000100000" w:firstRow="0" w:lastRow="0" w:firstColumn="0" w:lastColumn="0" w:oddVBand="0" w:evenVBand="0" w:oddHBand="1" w:evenHBand="0" w:firstRowFirstColumn="0" w:firstRowLastColumn="0" w:lastRowFirstColumn="0" w:lastRowLastColumn="0"/>
+            </w:pPr>
+            <w:r>
+              <w:t>image rows * cols * components</w:t>
+            </w:r>
+          </w:p>
+        </w:tc>
+      </w:tr>
+    </w:tbl>
+    <w:p/>
     <w:p>
       <w:pPr>
         <w:pStyle w:val="Heading2"/>
@@ -21475,7 +24165,7 @@
       <w:rPr>
         <w:noProof/>
       </w:rPr>
-      <w:t>8/2/2022 9:19 PM</w:t>
+      <w:t>8/11/2022 3:23 PM</w:t>
     </w:r>
     <w:r>
       <w:fldChar w:fldCharType="end"/>
@@ -21547,7 +24237,7 @@
           <w:rPr>
             <w:noProof/>
           </w:rPr>
-          <w:t>8/2/2022 9:19 PM</w:t>
+          <w:t>8/11/2022 3:23 PM</w:t>
         </w:r>
         <w:r>
           <w:fldChar w:fldCharType="end"/>

</xml_diff>

<commit_message>
convolution operators refactored, seem to work, not entirely sure yet
</commit_message>
<xml_diff>
--- a/doc/cv-workbench.docx
+++ b/doc/cv-workbench.docx
@@ -9882,14 +9882,6 @@
         <w:pStyle w:val="Heading2"/>
       </w:pPr>
       <w:r>
-        <w:t>filter-edge-gaussian Operator</w:t>
-      </w:r>
-    </w:p>
-    <w:p>
-      <w:pPr>
-        <w:pStyle w:val="Heading2"/>
-      </w:pPr>
-      <w:r>
         <w:t>filter-edge-kirsch Operator</w:t>
       </w:r>
     </w:p>
@@ -11075,134 +11067,660 @@
     </w:p>
     <w:p>
       <w:r>
-        <w:t>The Prewitt edge operator convolves the image with kernels with orientations corresponding to 0 or 90 degrees as follows, where “[…], […], […]” are the rows of the kernel:</w:t>
+        <w:t xml:space="preserve">The Prewitt edge operator convolves the image with kernels with orientations corresponding to 0 or 90 degrees as follows, </w:t>
       </w:r>
     </w:p>
     <w:tbl>
       <w:tblPr>
-        <w:tblStyle w:val="PlainTable1"/>
+        <w:tblStyle w:val="TableGrid"/>
         <w:tblW w:w="0" w:type="auto"/>
+        <w:tblBorders>
+          <w:top w:val="none" w:sz="0" w:space="0" w:color="auto"/>
+          <w:left w:val="none" w:sz="0" w:space="0" w:color="auto"/>
+          <w:bottom w:val="none" w:sz="0" w:space="0" w:color="auto"/>
+          <w:right w:val="none" w:sz="0" w:space="0" w:color="auto"/>
+          <w:insideH w:val="none" w:sz="0" w:space="0" w:color="auto"/>
+          <w:insideV w:val="none" w:sz="0" w:space="0" w:color="auto"/>
+        </w:tblBorders>
         <w:tblLook w:val="04A0" w:firstRow="1" w:lastRow="0" w:firstColumn="1" w:lastColumn="0" w:noHBand="0" w:noVBand="1"/>
       </w:tblPr>
       <w:tblGrid>
-        <w:gridCol w:w="1353"/>
-        <w:gridCol w:w="3687"/>
+        <w:gridCol w:w="4675"/>
+        <w:gridCol w:w="4675"/>
       </w:tblGrid>
       <w:tr>
-        <w:trPr>
-          <w:cnfStyle w:val="100000000000" w:firstRow="1" w:lastRow="0" w:firstColumn="0" w:lastColumn="0" w:oddVBand="0" w:evenVBand="0" w:oddHBand="0" w:evenHBand="0" w:firstRowFirstColumn="0" w:firstRowLastColumn="0" w:lastRowFirstColumn="0" w:lastRowLastColumn="0"/>
-          <w:cantSplit/>
-          <w:tblHeader/>
-        </w:trPr>
-        <w:tc>
-          <w:tcPr>
-            <w:cnfStyle w:val="001000000000" w:firstRow="0" w:lastRow="0" w:firstColumn="1" w:lastColumn="0" w:oddVBand="0" w:evenVBand="0" w:oddHBand="0" w:evenHBand="0" w:firstRowFirstColumn="0" w:firstRowLastColumn="0" w:lastRowFirstColumn="0" w:lastRowLastColumn="0"/>
-            <w:tcW w:w="0" w:type="auto"/>
-          </w:tcPr>
-          <w:p>
-            <w:pPr>
-              <w:pStyle w:val="NoSpacing"/>
-            </w:pPr>
-            <w:r>
-              <w:t>orientation</w:t>
-            </w:r>
-          </w:p>
-        </w:tc>
-        <w:tc>
-          <w:tcPr>
-            <w:tcW w:w="0" w:type="auto"/>
-          </w:tcPr>
-          <w:p>
-            <w:pPr>
-              <w:pStyle w:val="NoSpacing"/>
-              <w:cnfStyle w:val="100000000000" w:firstRow="1" w:lastRow="0" w:firstColumn="0" w:lastColumn="0" w:oddVBand="0" w:evenVBand="0" w:oddHBand="0" w:evenHBand="0" w:firstRowFirstColumn="0" w:firstRowLastColumn="0" w:lastRowFirstColumn="0" w:lastRowLastColumn="0"/>
-            </w:pPr>
-            <w:r>
-              <w:t>kernel</w:t>
-            </w:r>
-          </w:p>
-        </w:tc>
-      </w:tr>
-      <w:tr>
-        <w:trPr>
-          <w:cnfStyle w:val="000000100000" w:firstRow="0" w:lastRow="0" w:firstColumn="0" w:lastColumn="0" w:oddVBand="0" w:evenVBand="0" w:oddHBand="1" w:evenHBand="0" w:firstRowFirstColumn="0" w:firstRowLastColumn="0" w:lastRowFirstColumn="0" w:lastRowLastColumn="0"/>
-        </w:trPr>
-        <w:tc>
-          <w:tcPr>
-            <w:cnfStyle w:val="001000000000" w:firstRow="0" w:lastRow="0" w:firstColumn="1" w:lastColumn="0" w:oddVBand="0" w:evenVBand="0" w:oddHBand="0" w:evenHBand="0" w:firstRowFirstColumn="0" w:firstRowLastColumn="0" w:lastRowFirstColumn="0" w:lastRowLastColumn="0"/>
-            <w:tcW w:w="0" w:type="auto"/>
-          </w:tcPr>
-          <w:p>
-            <w:pPr>
-              <w:pStyle w:val="NoSpacing"/>
-              <w:rPr>
-                <w:b w:val="0"/>
-                <w:bCs w:val="0"/>
-              </w:rPr>
-            </w:pPr>
-            <w:r>
-              <w:rPr>
-                <w:b w:val="0"/>
-                <w:bCs w:val="0"/>
-              </w:rPr>
-              <w:t>0</w:t>
-            </w:r>
-          </w:p>
-        </w:tc>
-        <w:tc>
-          <w:tcPr>
-            <w:tcW w:w="0" w:type="auto"/>
-          </w:tcPr>
-          <w:p>
-            <w:pPr>
-              <w:pStyle w:val="code"/>
-              <w:cnfStyle w:val="000000100000" w:firstRow="0" w:lastRow="0" w:firstColumn="0" w:lastColumn="0" w:oddVBand="0" w:evenVBand="0" w:oddHBand="1" w:evenHBand="0" w:firstRowFirstColumn="0" w:firstRowLastColumn="0" w:lastRowFirstColumn="0" w:lastRowLastColumn="0"/>
-            </w:pPr>
-            <w:r>
-              <w:t>[-1, 0, 1], [-1, 0, 1], [-1, 0, 1]</w:t>
-            </w:r>
-          </w:p>
-        </w:tc>
-      </w:tr>
-      <w:tr>
-        <w:tc>
-          <w:tcPr>
-            <w:cnfStyle w:val="001000000000" w:firstRow="0" w:lastRow="0" w:firstColumn="1" w:lastColumn="0" w:oddVBand="0" w:evenVBand="0" w:oddHBand="0" w:evenHBand="0" w:firstRowFirstColumn="0" w:firstRowLastColumn="0" w:lastRowFirstColumn="0" w:lastRowLastColumn="0"/>
-            <w:tcW w:w="0" w:type="auto"/>
-          </w:tcPr>
-          <w:p>
-            <w:pPr>
-              <w:pStyle w:val="NoSpacing"/>
-              <w:rPr>
-                <w:b w:val="0"/>
-                <w:bCs w:val="0"/>
-              </w:rPr>
-            </w:pPr>
-            <w:r>
-              <w:rPr>
-                <w:b w:val="0"/>
-                <w:bCs w:val="0"/>
-              </w:rPr>
-              <w:t>90</w:t>
-            </w:r>
-          </w:p>
-        </w:tc>
-        <w:tc>
-          <w:tcPr>
-            <w:tcW w:w="0" w:type="auto"/>
-          </w:tcPr>
-          <w:p>
-            <w:pPr>
-              <w:pStyle w:val="code"/>
-              <w:cnfStyle w:val="000000000000" w:firstRow="0" w:lastRow="0" w:firstColumn="0" w:lastColumn="0" w:oddVBand="0" w:evenVBand="0" w:oddHBand="0" w:evenHBand="0" w:firstRowFirstColumn="0" w:firstRowLastColumn="0" w:lastRowFirstColumn="0" w:lastRowLastColumn="0"/>
-            </w:pPr>
-            <w:r>
-              <w:t>[1, 1, 1],  [0, 0, 0],  [-1, -1, -1]</w:t>
-            </w:r>
+        <w:tc>
+          <w:tcPr>
+            <w:tcW w:w="4675" w:type="dxa"/>
+          </w:tcPr>
+          <w:p>
+            <m:oMathPara>
+              <m:oMath>
+                <m:sSub>
+                  <m:sSubPr>
+                    <m:ctrlPr>
+                      <w:rPr>
+                        <w:rFonts w:ascii="Cambria Math" w:hAnsi="Cambria Math"/>
+                        <w:i/>
+                      </w:rPr>
+                    </m:ctrlPr>
+                  </m:sSubPr>
+                  <m:e>
+                    <m:r>
+                      <w:rPr>
+                        <w:rFonts w:ascii="Cambria Math" w:hAnsi="Cambria Math"/>
+                      </w:rPr>
+                      <m:t>G</m:t>
+                    </m:r>
+                  </m:e>
+                  <m:sub>
+                    <m:r>
+                      <w:rPr>
+                        <w:rFonts w:ascii="Cambria Math" w:hAnsi="Cambria Math"/>
+                      </w:rPr>
+                      <m:t>0</m:t>
+                    </m:r>
+                  </m:sub>
+                </m:sSub>
+                <m:r>
+                  <w:rPr>
+                    <w:rFonts w:ascii="Cambria Math" w:hAnsi="Cambria Math"/>
+                  </w:rPr>
+                  <m:t xml:space="preserve">= </m:t>
+                </m:r>
+                <m:d>
+                  <m:dPr>
+                    <m:begChr m:val="["/>
+                    <m:endChr m:val="]"/>
+                    <m:ctrlPr>
+                      <w:rPr>
+                        <w:rFonts w:ascii="Cambria Math" w:hAnsi="Cambria Math"/>
+                        <w:i/>
+                      </w:rPr>
+                    </m:ctrlPr>
+                  </m:dPr>
+                  <m:e>
+                    <m:m>
+                      <m:mPr>
+                        <m:mcs>
+                          <m:mc>
+                            <m:mcPr>
+                              <m:count m:val="3"/>
+                              <m:mcJc m:val="center"/>
+                            </m:mcPr>
+                          </m:mc>
+                        </m:mcs>
+                        <m:ctrlPr>
+                          <w:rPr>
+                            <w:rFonts w:ascii="Cambria Math" w:hAnsi="Cambria Math"/>
+                            <w:i/>
+                          </w:rPr>
+                        </m:ctrlPr>
+                      </m:mPr>
+                      <m:mr>
+                        <m:e>
+                          <m:r>
+                            <w:rPr>
+                              <w:rFonts w:ascii="Cambria Math" w:hAnsi="Cambria Math"/>
+                            </w:rPr>
+                            <m:t>-1</m:t>
+                          </m:r>
+                        </m:e>
+                        <m:e>
+                          <m:r>
+                            <w:rPr>
+                              <w:rFonts w:ascii="Cambria Math" w:hAnsi="Cambria Math"/>
+                            </w:rPr>
+                            <m:t>0</m:t>
+                          </m:r>
+                        </m:e>
+                        <m:e>
+                          <m:r>
+                            <w:rPr>
+                              <w:rFonts w:ascii="Cambria Math" w:hAnsi="Cambria Math"/>
+                            </w:rPr>
+                            <m:t>+1</m:t>
+                          </m:r>
+                        </m:e>
+                      </m:mr>
+                      <m:mr>
+                        <m:e>
+                          <m:r>
+                            <w:rPr>
+                              <w:rFonts w:ascii="Cambria Math" w:hAnsi="Cambria Math"/>
+                            </w:rPr>
+                            <m:t>-</m:t>
+                          </m:r>
+                          <m:r>
+                            <w:rPr>
+                              <w:rFonts w:ascii="Cambria Math" w:hAnsi="Cambria Math"/>
+                            </w:rPr>
+                            <m:t>1</m:t>
+                          </m:r>
+                        </m:e>
+                        <m:e>
+                          <m:r>
+                            <w:rPr>
+                              <w:rFonts w:ascii="Cambria Math" w:hAnsi="Cambria Math"/>
+                            </w:rPr>
+                            <m:t>0</m:t>
+                          </m:r>
+                        </m:e>
+                        <m:e>
+                          <m:r>
+                            <w:rPr>
+                              <w:rFonts w:ascii="Cambria Math" w:hAnsi="Cambria Math"/>
+                            </w:rPr>
+                            <m:t>+</m:t>
+                          </m:r>
+                          <m:r>
+                            <w:rPr>
+                              <w:rFonts w:ascii="Cambria Math" w:hAnsi="Cambria Math"/>
+                            </w:rPr>
+                            <m:t>1</m:t>
+                          </m:r>
+                        </m:e>
+                      </m:mr>
+                      <m:mr>
+                        <m:e>
+                          <m:r>
+                            <w:rPr>
+                              <w:rFonts w:ascii="Cambria Math" w:hAnsi="Cambria Math"/>
+                            </w:rPr>
+                            <m:t>-1</m:t>
+                          </m:r>
+                        </m:e>
+                        <m:e>
+                          <m:r>
+                            <w:rPr>
+                              <w:rFonts w:ascii="Cambria Math" w:hAnsi="Cambria Math"/>
+                            </w:rPr>
+                            <m:t>0</m:t>
+                          </m:r>
+                        </m:e>
+                        <m:e>
+                          <m:r>
+                            <w:rPr>
+                              <w:rFonts w:ascii="Cambria Math" w:hAnsi="Cambria Math"/>
+                            </w:rPr>
+                            <m:t>+1</m:t>
+                          </m:r>
+                        </m:e>
+                      </m:mr>
+                    </m:m>
+                  </m:e>
+                </m:d>
+              </m:oMath>
+            </m:oMathPara>
+          </w:p>
+        </w:tc>
+        <w:tc>
+          <w:tcPr>
+            <w:tcW w:w="4675" w:type="dxa"/>
+          </w:tcPr>
+          <w:p>
+            <m:oMathPara>
+              <m:oMath>
+                <m:sSub>
+                  <m:sSubPr>
+                    <m:ctrlPr>
+                      <w:rPr>
+                        <w:rFonts w:ascii="Cambria Math" w:hAnsi="Cambria Math"/>
+                        <w:i/>
+                      </w:rPr>
+                    </m:ctrlPr>
+                  </m:sSubPr>
+                  <m:e>
+                    <m:r>
+                      <w:rPr>
+                        <w:rFonts w:ascii="Cambria Math" w:hAnsi="Cambria Math"/>
+                      </w:rPr>
+                      <m:t>G</m:t>
+                    </m:r>
+                  </m:e>
+                  <m:sub>
+                    <m:r>
+                      <w:rPr>
+                        <w:rFonts w:ascii="Cambria Math" w:hAnsi="Cambria Math"/>
+                      </w:rPr>
+                      <m:t>90</m:t>
+                    </m:r>
+                  </m:sub>
+                </m:sSub>
+                <m:r>
+                  <w:rPr>
+                    <w:rFonts w:ascii="Cambria Math" w:hAnsi="Cambria Math"/>
+                  </w:rPr>
+                  <m:t xml:space="preserve">= </m:t>
+                </m:r>
+                <m:d>
+                  <m:dPr>
+                    <m:begChr m:val="["/>
+                    <m:endChr m:val="]"/>
+                    <m:ctrlPr>
+                      <w:rPr>
+                        <w:rFonts w:ascii="Cambria Math" w:hAnsi="Cambria Math"/>
+                        <w:i/>
+                      </w:rPr>
+                    </m:ctrlPr>
+                  </m:dPr>
+                  <m:e>
+                    <m:m>
+                      <m:mPr>
+                        <m:mcs>
+                          <m:mc>
+                            <m:mcPr>
+                              <m:count m:val="3"/>
+                              <m:mcJc m:val="center"/>
+                            </m:mcPr>
+                          </m:mc>
+                        </m:mcs>
+                        <m:ctrlPr>
+                          <w:rPr>
+                            <w:rFonts w:ascii="Cambria Math" w:hAnsi="Cambria Math"/>
+                            <w:i/>
+                          </w:rPr>
+                        </m:ctrlPr>
+                      </m:mPr>
+                      <m:mr>
+                        <m:e>
+                          <m:r>
+                            <w:rPr>
+                              <w:rFonts w:ascii="Cambria Math" w:hAnsi="Cambria Math"/>
+                            </w:rPr>
+                            <m:t>+1</m:t>
+                          </m:r>
+                        </m:e>
+                        <m:e>
+                          <m:r>
+                            <w:rPr>
+                              <w:rFonts w:ascii="Cambria Math" w:hAnsi="Cambria Math"/>
+                            </w:rPr>
+                            <m:t>+</m:t>
+                          </m:r>
+                          <m:r>
+                            <w:rPr>
+                              <w:rFonts w:ascii="Cambria Math" w:hAnsi="Cambria Math"/>
+                            </w:rPr>
+                            <m:t>1</m:t>
+                          </m:r>
+                        </m:e>
+                        <m:e>
+                          <m:r>
+                            <w:rPr>
+                              <w:rFonts w:ascii="Cambria Math" w:hAnsi="Cambria Math"/>
+                            </w:rPr>
+                            <m:t>+1</m:t>
+                          </m:r>
+                        </m:e>
+                      </m:mr>
+                      <m:mr>
+                        <m:e>
+                          <m:r>
+                            <w:rPr>
+                              <w:rFonts w:ascii="Cambria Math" w:hAnsi="Cambria Math"/>
+                            </w:rPr>
+                            <m:t>0</m:t>
+                          </m:r>
+                        </m:e>
+                        <m:e>
+                          <m:r>
+                            <w:rPr>
+                              <w:rFonts w:ascii="Cambria Math" w:hAnsi="Cambria Math"/>
+                            </w:rPr>
+                            <m:t>0</m:t>
+                          </m:r>
+                        </m:e>
+                        <m:e>
+                          <m:r>
+                            <w:rPr>
+                              <w:rFonts w:ascii="Cambria Math" w:hAnsi="Cambria Math"/>
+                            </w:rPr>
+                            <m:t>0</m:t>
+                          </m:r>
+                        </m:e>
+                      </m:mr>
+                      <m:mr>
+                        <m:e>
+                          <m:r>
+                            <w:rPr>
+                              <w:rFonts w:ascii="Cambria Math" w:hAnsi="Cambria Math"/>
+                            </w:rPr>
+                            <m:t>-1</m:t>
+                          </m:r>
+                        </m:e>
+                        <m:e>
+                          <m:r>
+                            <w:rPr>
+                              <w:rFonts w:ascii="Cambria Math" w:hAnsi="Cambria Math"/>
+                            </w:rPr>
+                            <m:t>-</m:t>
+                          </m:r>
+                          <m:r>
+                            <w:rPr>
+                              <w:rFonts w:ascii="Cambria Math" w:hAnsi="Cambria Math"/>
+                            </w:rPr>
+                            <m:t>1</m:t>
+                          </m:r>
+                        </m:e>
+                        <m:e>
+                          <m:r>
+                            <w:rPr>
+                              <w:rFonts w:ascii="Cambria Math" w:hAnsi="Cambria Math"/>
+                            </w:rPr>
+                            <m:t>-1</m:t>
+                          </m:r>
+                        </m:e>
+                      </m:mr>
+                    </m:m>
+                  </m:e>
+                </m:d>
+              </m:oMath>
+            </m:oMathPara>
           </w:p>
         </w:tc>
       </w:tr>
     </w:tbl>
+    <w:p>
+      <w:pPr>
+        <w:pStyle w:val="Normalafterlist"/>
+      </w:pPr>
+      <w:r>
+        <w:t xml:space="preserve">The Sobel operator kernel is separable, so is actually implemented with two one-dimensional convolutions. </w:t>
+      </w:r>
+    </w:p>
+    <w:tbl>
+      <w:tblPr>
+        <w:tblStyle w:val="TableGrid"/>
+        <w:tblW w:w="0" w:type="auto"/>
+        <w:tblBorders>
+          <w:top w:val="none" w:sz="0" w:space="0" w:color="auto"/>
+          <w:left w:val="none" w:sz="0" w:space="0" w:color="auto"/>
+          <w:bottom w:val="none" w:sz="0" w:space="0" w:color="auto"/>
+          <w:right w:val="none" w:sz="0" w:space="0" w:color="auto"/>
+          <w:insideH w:val="none" w:sz="0" w:space="0" w:color="auto"/>
+          <w:insideV w:val="none" w:sz="0" w:space="0" w:color="auto"/>
+        </w:tblBorders>
+        <w:tblLook w:val="04A0" w:firstRow="1" w:lastRow="0" w:firstColumn="1" w:lastColumn="0" w:noHBand="0" w:noVBand="1"/>
+      </w:tblPr>
+      <w:tblGrid>
+        <w:gridCol w:w="4675"/>
+        <w:gridCol w:w="4675"/>
+      </w:tblGrid>
+      <w:tr>
+        <w:tc>
+          <w:tcPr>
+            <w:tcW w:w="4675" w:type="dxa"/>
+          </w:tcPr>
+          <w:p>
+            <m:oMathPara>
+              <m:oMath>
+                <m:sSub>
+                  <m:sSubPr>
+                    <m:ctrlPr>
+                      <w:rPr>
+                        <w:rFonts w:ascii="Cambria Math" w:hAnsi="Cambria Math"/>
+                        <w:i/>
+                      </w:rPr>
+                    </m:ctrlPr>
+                  </m:sSubPr>
+                  <m:e>
+                    <m:r>
+                      <w:rPr>
+                        <w:rFonts w:ascii="Cambria Math" w:hAnsi="Cambria Math"/>
+                      </w:rPr>
+                      <m:t>G</m:t>
+                    </m:r>
+                  </m:e>
+                  <m:sub>
+                    <m:r>
+                      <w:rPr>
+                        <w:rFonts w:ascii="Cambria Math" w:hAnsi="Cambria Math"/>
+                      </w:rPr>
+                      <m:t>0</m:t>
+                    </m:r>
+                  </m:sub>
+                </m:sSub>
+                <m:r>
+                  <w:rPr>
+                    <w:rFonts w:ascii="Cambria Math" w:hAnsi="Cambria Math"/>
+                  </w:rPr>
+                  <m:t>=</m:t>
+                </m:r>
+                <m:d>
+                  <m:dPr>
+                    <m:begChr m:val="["/>
+                    <m:endChr m:val="]"/>
+                    <m:ctrlPr>
+                      <w:rPr>
+                        <w:rFonts w:ascii="Cambria Math" w:hAnsi="Cambria Math"/>
+                        <w:i/>
+                      </w:rPr>
+                    </m:ctrlPr>
+                  </m:dPr>
+                  <m:e>
+                    <m:eqArr>
+                      <m:eqArrPr>
+                        <m:ctrlPr>
+                          <w:rPr>
+                            <w:rFonts w:ascii="Cambria Math" w:hAnsi="Cambria Math"/>
+                            <w:i/>
+                          </w:rPr>
+                        </m:ctrlPr>
+                      </m:eqArrPr>
+                      <m:e>
+                        <m:r>
+                          <w:rPr>
+                            <w:rFonts w:ascii="Cambria Math" w:hAnsi="Cambria Math"/>
+                          </w:rPr>
+                          <m:t>0.33</m:t>
+                        </m:r>
+                      </m:e>
+                      <m:e>
+                        <m:r>
+                          <w:rPr>
+                            <w:rFonts w:ascii="Cambria Math" w:hAnsi="Cambria Math"/>
+                          </w:rPr>
+                          <m:t>0.33</m:t>
+                        </m:r>
+                        <m:ctrlPr>
+                          <w:rPr>
+                            <w:rFonts w:ascii="Cambria Math" w:eastAsia="Cambria Math" w:hAnsi="Cambria Math" w:cs="Cambria Math"/>
+                            <w:i/>
+                          </w:rPr>
+                        </m:ctrlPr>
+                      </m:e>
+                      <m:e>
+                        <m:r>
+                          <w:rPr>
+                            <w:rFonts w:ascii="Cambria Math" w:hAnsi="Cambria Math"/>
+                          </w:rPr>
+                          <m:t>0.33</m:t>
+                        </m:r>
+                      </m:e>
+                    </m:eqArr>
+                  </m:e>
+                </m:d>
+                <m:r>
+                  <w:rPr>
+                    <w:rFonts w:ascii="Cambria Math" w:hAnsi="Cambria Math"/>
+                  </w:rPr>
+                  <m:t>*</m:t>
+                </m:r>
+                <m:d>
+                  <m:dPr>
+                    <m:begChr m:val="["/>
+                    <m:endChr m:val="]"/>
+                    <m:ctrlPr>
+                      <w:rPr>
+                        <w:rFonts w:ascii="Cambria Math" w:hAnsi="Cambria Math"/>
+                        <w:i/>
+                      </w:rPr>
+                    </m:ctrlPr>
+                  </m:dPr>
+                  <m:e>
+                    <m:r>
+                      <w:rPr>
+                        <w:rFonts w:ascii="Cambria Math" w:hAnsi="Cambria Math"/>
+                      </w:rPr>
+                      <m:t>+1   0  -1</m:t>
+                    </m:r>
+                  </m:e>
+                </m:d>
+              </m:oMath>
+            </m:oMathPara>
+          </w:p>
+        </w:tc>
+        <w:tc>
+          <w:tcPr>
+            <w:tcW w:w="4675" w:type="dxa"/>
+          </w:tcPr>
+          <w:p>
+            <m:oMathPara>
+              <m:oMath>
+                <m:sSub>
+                  <m:sSubPr>
+                    <m:ctrlPr>
+                      <w:rPr>
+                        <w:rFonts w:ascii="Cambria Math" w:hAnsi="Cambria Math"/>
+                        <w:i/>
+                      </w:rPr>
+                    </m:ctrlPr>
+                  </m:sSubPr>
+                  <m:e>
+                    <m:r>
+                      <w:rPr>
+                        <w:rFonts w:ascii="Cambria Math" w:hAnsi="Cambria Math"/>
+                      </w:rPr>
+                      <m:t>G</m:t>
+                    </m:r>
+                  </m:e>
+                  <m:sub>
+                    <m:r>
+                      <w:rPr>
+                        <w:rFonts w:ascii="Cambria Math" w:hAnsi="Cambria Math"/>
+                      </w:rPr>
+                      <m:t>90</m:t>
+                    </m:r>
+                  </m:sub>
+                </m:sSub>
+                <m:r>
+                  <w:rPr>
+                    <w:rFonts w:ascii="Cambria Math" w:hAnsi="Cambria Math"/>
+                  </w:rPr>
+                  <m:t>=</m:t>
+                </m:r>
+                <m:d>
+                  <m:dPr>
+                    <m:begChr m:val="["/>
+                    <m:endChr m:val="]"/>
+                    <m:ctrlPr>
+                      <w:rPr>
+                        <w:rFonts w:ascii="Cambria Math" w:hAnsi="Cambria Math"/>
+                        <w:i/>
+                      </w:rPr>
+                    </m:ctrlPr>
+                  </m:dPr>
+                  <m:e>
+                    <m:eqArr>
+                      <m:eqArrPr>
+                        <m:ctrlPr>
+                          <w:rPr>
+                            <w:rFonts w:ascii="Cambria Math" w:hAnsi="Cambria Math"/>
+                            <w:i/>
+                          </w:rPr>
+                        </m:ctrlPr>
+                      </m:eqArrPr>
+                      <m:e>
+                        <m:r>
+                          <w:rPr>
+                            <w:rFonts w:ascii="Cambria Math" w:hAnsi="Cambria Math"/>
+                          </w:rPr>
+                          <m:t>+1</m:t>
+                        </m:r>
+                      </m:e>
+                      <m:e>
+                        <m:r>
+                          <w:rPr>
+                            <w:rFonts w:ascii="Cambria Math" w:hAnsi="Cambria Math"/>
+                          </w:rPr>
+                          <m:t>0</m:t>
+                        </m:r>
+                        <m:ctrlPr>
+                          <w:rPr>
+                            <w:rFonts w:ascii="Cambria Math" w:eastAsia="Cambria Math" w:hAnsi="Cambria Math" w:cs="Cambria Math"/>
+                            <w:i/>
+                          </w:rPr>
+                        </m:ctrlPr>
+                      </m:e>
+                      <m:e>
+                        <m:r>
+                          <w:rPr>
+                            <w:rFonts w:ascii="Cambria Math" w:eastAsia="Cambria Math" w:hAnsi="Cambria Math" w:cs="Cambria Math"/>
+                          </w:rPr>
+                          <m:t>-1</m:t>
+                        </m:r>
+                      </m:e>
+                    </m:eqArr>
+                  </m:e>
+                </m:d>
+                <m:r>
+                  <w:rPr>
+                    <w:rFonts w:ascii="Cambria Math" w:hAnsi="Cambria Math"/>
+                  </w:rPr>
+                  <m:t>*</m:t>
+                </m:r>
+                <m:d>
+                  <m:dPr>
+                    <m:begChr m:val="["/>
+                    <m:endChr m:val="]"/>
+                    <m:ctrlPr>
+                      <w:rPr>
+                        <w:rFonts w:ascii="Cambria Math" w:hAnsi="Cambria Math"/>
+                        <w:i/>
+                      </w:rPr>
+                    </m:ctrlPr>
+                  </m:dPr>
+                  <m:e>
+                    <m:r>
+                      <w:rPr>
+                        <w:rFonts w:ascii="Cambria Math" w:hAnsi="Cambria Math"/>
+                      </w:rPr>
+                      <m:t>0.33</m:t>
+                    </m:r>
+                    <m:r>
+                      <w:rPr>
+                        <w:rFonts w:ascii="Cambria Math" w:hAnsi="Cambria Math"/>
+                      </w:rPr>
+                      <m:t xml:space="preserve">  </m:t>
+                    </m:r>
+                    <m:r>
+                      <w:rPr>
+                        <w:rFonts w:ascii="Cambria Math" w:hAnsi="Cambria Math"/>
+                      </w:rPr>
+                      <m:t>0.33</m:t>
+                    </m:r>
+                    <m:r>
+                      <w:rPr>
+                        <w:rFonts w:ascii="Cambria Math" w:hAnsi="Cambria Math"/>
+                      </w:rPr>
+                      <m:t xml:space="preserve">  </m:t>
+                    </m:r>
+                    <m:r>
+                      <w:rPr>
+                        <w:rFonts w:ascii="Cambria Math" w:hAnsi="Cambria Math"/>
+                      </w:rPr>
+                      <m:t>0.33</m:t>
+                    </m:r>
+                  </m:e>
+                </m:d>
+              </m:oMath>
+            </m:oMathPara>
+          </w:p>
+        </w:tc>
+      </w:tr>
+    </w:tbl>
+    <w:p/>
     <w:p>
       <w:pPr>
         <w:pStyle w:val="Normalafterlist"/>
@@ -12007,6 +12525,13 @@
       <w:r>
         <w:t>The Roberts edge operator convolves the image with kernels with orientations corresponding to 0 or 90 degrees as follows, where “[…], […]” are the rows of the kernel:</w:t>
       </w:r>
+      <w:r>
+        <w:rPr>
+          <w:rFonts w:ascii="Cambria Math" w:hAnsi="Cambria Math"/>
+          <w:i/>
+        </w:rPr>
+        <w:br/>
+      </w:r>
     </w:p>
     <w:tbl>
       <w:tblPr>
@@ -12016,7 +12541,7 @@
       </w:tblPr>
       <w:tblGrid>
         <w:gridCol w:w="1353"/>
-        <w:gridCol w:w="1759"/>
+        <w:gridCol w:w="1005"/>
       </w:tblGrid>
       <w:tr>
         <w:trPr>
@@ -12087,10 +12612,95 @@
             <w:pPr>
               <w:pStyle w:val="code"/>
               <w:cnfStyle w:val="000000100000" w:firstRow="0" w:lastRow="0" w:firstColumn="0" w:lastColumn="0" w:oddVBand="0" w:evenVBand="0" w:oddHBand="1" w:evenHBand="0" w:firstRowFirstColumn="0" w:firstRowLastColumn="0" w:lastRowFirstColumn="0" w:lastRowLastColumn="0"/>
-            </w:pPr>
-            <w:r>
-              <w:t>[0, 1], [-1, 0]</w:t>
-            </w:r>
+              <w:rPr>
+                <w:sz w:val="22"/>
+                <w:szCs w:val="22"/>
+              </w:rPr>
+            </w:pPr>
+            <m:oMathPara>
+              <m:oMath>
+                <m:d>
+                  <m:dPr>
+                    <m:begChr m:val="["/>
+                    <m:endChr m:val="]"/>
+                    <m:ctrlPr>
+                      <w:rPr>
+                        <w:rFonts w:ascii="Cambria Math" w:hAnsi="Cambria Math"/>
+                        <w:i/>
+                        <w:sz w:val="22"/>
+                        <w:szCs w:val="22"/>
+                      </w:rPr>
+                    </m:ctrlPr>
+                  </m:dPr>
+                  <m:e>
+                    <m:m>
+                      <m:mPr>
+                        <m:mcs>
+                          <m:mc>
+                            <m:mcPr>
+                              <m:count m:val="2"/>
+                              <m:mcJc m:val="center"/>
+                            </m:mcPr>
+                          </m:mc>
+                        </m:mcs>
+                        <m:ctrlPr>
+                          <w:rPr>
+                            <w:rFonts w:ascii="Cambria Math" w:hAnsi="Cambria Math"/>
+                            <w:i/>
+                            <w:sz w:val="22"/>
+                            <w:szCs w:val="22"/>
+                          </w:rPr>
+                        </m:ctrlPr>
+                      </m:mPr>
+                      <m:mr>
+                        <m:e>
+                          <m:r>
+                            <w:rPr>
+                              <w:rFonts w:ascii="Cambria Math" w:hAnsi="Cambria Math"/>
+                              <w:sz w:val="22"/>
+                              <w:szCs w:val="22"/>
+                            </w:rPr>
+                            <m:t>0</m:t>
+                          </m:r>
+                        </m:e>
+                        <m:e>
+                          <m:r>
+                            <w:rPr>
+                              <w:rFonts w:ascii="Cambria Math" w:hAnsi="Cambria Math"/>
+                              <w:sz w:val="22"/>
+                              <w:szCs w:val="22"/>
+                            </w:rPr>
+                            <m:t>1</m:t>
+                          </m:r>
+                        </m:e>
+                      </m:mr>
+                      <m:mr>
+                        <m:e>
+                          <m:r>
+                            <w:rPr>
+                              <w:rFonts w:ascii="Cambria Math" w:hAnsi="Cambria Math"/>
+                              <w:sz w:val="22"/>
+                              <w:szCs w:val="22"/>
+                            </w:rPr>
+                            <m:t>-1</m:t>
+                          </m:r>
+                        </m:e>
+                        <m:e>
+                          <m:r>
+                            <w:rPr>
+                              <w:rFonts w:ascii="Cambria Math" w:hAnsi="Cambria Math"/>
+                              <w:sz w:val="22"/>
+                              <w:szCs w:val="22"/>
+                            </w:rPr>
+                            <m:t>0</m:t>
+                          </m:r>
+                        </m:e>
+                      </m:mr>
+                    </m:m>
+                  </m:e>
+                </m:d>
+              </m:oMath>
+            </m:oMathPara>
           </w:p>
         </w:tc>
       </w:tr>
@@ -12125,10 +12735,95 @@
             <w:pPr>
               <w:pStyle w:val="code"/>
               <w:cnfStyle w:val="000000000000" w:firstRow="0" w:lastRow="0" w:firstColumn="0" w:lastColumn="0" w:oddVBand="0" w:evenVBand="0" w:oddHBand="0" w:evenHBand="0" w:firstRowFirstColumn="0" w:firstRowLastColumn="0" w:lastRowFirstColumn="0" w:lastRowLastColumn="0"/>
-            </w:pPr>
-            <w:r>
-              <w:t>[1, 0],  [0, -1]</w:t>
-            </w:r>
+              <w:rPr>
+                <w:sz w:val="22"/>
+                <w:szCs w:val="22"/>
+              </w:rPr>
+            </w:pPr>
+            <m:oMathPara>
+              <m:oMath>
+                <m:d>
+                  <m:dPr>
+                    <m:begChr m:val="["/>
+                    <m:endChr m:val="]"/>
+                    <m:ctrlPr>
+                      <w:rPr>
+                        <w:rFonts w:ascii="Cambria Math" w:hAnsi="Cambria Math"/>
+                        <w:i/>
+                        <w:sz w:val="22"/>
+                        <w:szCs w:val="22"/>
+                      </w:rPr>
+                    </m:ctrlPr>
+                  </m:dPr>
+                  <m:e>
+                    <m:m>
+                      <m:mPr>
+                        <m:mcs>
+                          <m:mc>
+                            <m:mcPr>
+                              <m:count m:val="2"/>
+                              <m:mcJc m:val="center"/>
+                            </m:mcPr>
+                          </m:mc>
+                        </m:mcs>
+                        <m:ctrlPr>
+                          <w:rPr>
+                            <w:rFonts w:ascii="Cambria Math" w:hAnsi="Cambria Math"/>
+                            <w:i/>
+                            <w:sz w:val="22"/>
+                            <w:szCs w:val="22"/>
+                          </w:rPr>
+                        </m:ctrlPr>
+                      </m:mPr>
+                      <m:mr>
+                        <m:e>
+                          <m:r>
+                            <w:rPr>
+                              <w:rFonts w:ascii="Cambria Math" w:hAnsi="Cambria Math"/>
+                              <w:sz w:val="22"/>
+                              <w:szCs w:val="22"/>
+                            </w:rPr>
+                            <m:t>1</m:t>
+                          </m:r>
+                        </m:e>
+                        <m:e>
+                          <m:r>
+                            <w:rPr>
+                              <w:rFonts w:ascii="Cambria Math" w:hAnsi="Cambria Math"/>
+                              <w:sz w:val="22"/>
+                              <w:szCs w:val="22"/>
+                            </w:rPr>
+                            <m:t>0</m:t>
+                          </m:r>
+                        </m:e>
+                      </m:mr>
+                      <m:mr>
+                        <m:e>
+                          <m:r>
+                            <w:rPr>
+                              <w:rFonts w:ascii="Cambria Math" w:hAnsi="Cambria Math"/>
+                              <w:sz w:val="22"/>
+                              <w:szCs w:val="22"/>
+                            </w:rPr>
+                            <m:t>0</m:t>
+                          </m:r>
+                        </m:e>
+                        <m:e>
+                          <m:r>
+                            <w:rPr>
+                              <w:rFonts w:ascii="Cambria Math" w:hAnsi="Cambria Math"/>
+                              <w:sz w:val="22"/>
+                              <w:szCs w:val="22"/>
+                            </w:rPr>
+                            <m:t>-1</m:t>
+                          </m:r>
+                        </m:e>
+                      </m:mr>
+                    </m:m>
+                  </m:e>
+                </m:d>
+              </m:oMath>
+            </m:oMathPara>
           </w:p>
         </w:tc>
       </w:tr>
@@ -12935,130 +13630,629 @@
     </w:p>
     <w:p>
       <w:r>
-        <w:t>The Sobel edge operator convolves the image with kernels with orientations corresponding to 0 or 90 degrees as follows, where “[…], […], […]” are the rows of the kernel:</w:t>
+        <w:t xml:space="preserve">The Sobel edge operator convolves the image with kernels with orientations corresponding to 0 or 90 degrees as follows, </w:t>
       </w:r>
     </w:p>
     <w:tbl>
       <w:tblPr>
-        <w:tblStyle w:val="PlainTable1"/>
+        <w:tblStyle w:val="TableGrid"/>
         <w:tblW w:w="0" w:type="auto"/>
+        <w:tblBorders>
+          <w:top w:val="none" w:sz="0" w:space="0" w:color="auto"/>
+          <w:left w:val="none" w:sz="0" w:space="0" w:color="auto"/>
+          <w:bottom w:val="none" w:sz="0" w:space="0" w:color="auto"/>
+          <w:right w:val="none" w:sz="0" w:space="0" w:color="auto"/>
+          <w:insideH w:val="none" w:sz="0" w:space="0" w:color="auto"/>
+          <w:insideV w:val="none" w:sz="0" w:space="0" w:color="auto"/>
+        </w:tblBorders>
         <w:tblLook w:val="04A0" w:firstRow="1" w:lastRow="0" w:firstColumn="1" w:lastColumn="0" w:noHBand="0" w:noVBand="1"/>
       </w:tblPr>
       <w:tblGrid>
-        <w:gridCol w:w="1353"/>
-        <w:gridCol w:w="3687"/>
+        <w:gridCol w:w="4675"/>
+        <w:gridCol w:w="4675"/>
       </w:tblGrid>
       <w:tr>
-        <w:trPr>
-          <w:cnfStyle w:val="100000000000" w:firstRow="1" w:lastRow="0" w:firstColumn="0" w:lastColumn="0" w:oddVBand="0" w:evenVBand="0" w:oddHBand="0" w:evenHBand="0" w:firstRowFirstColumn="0" w:firstRowLastColumn="0" w:lastRowFirstColumn="0" w:lastRowLastColumn="0"/>
-          <w:cantSplit/>
-          <w:tblHeader/>
-        </w:trPr>
-        <w:tc>
-          <w:tcPr>
-            <w:cnfStyle w:val="001000000000" w:firstRow="0" w:lastRow="0" w:firstColumn="1" w:lastColumn="0" w:oddVBand="0" w:evenVBand="0" w:oddHBand="0" w:evenHBand="0" w:firstRowFirstColumn="0" w:firstRowLastColumn="0" w:lastRowFirstColumn="0" w:lastRowLastColumn="0"/>
-            <w:tcW w:w="0" w:type="auto"/>
-          </w:tcPr>
-          <w:p>
-            <w:pPr>
-              <w:pStyle w:val="NoSpacing"/>
-            </w:pPr>
-            <w:r>
-              <w:t>orientation</w:t>
-            </w:r>
-          </w:p>
-        </w:tc>
-        <w:tc>
-          <w:tcPr>
-            <w:tcW w:w="0" w:type="auto"/>
-          </w:tcPr>
-          <w:p>
-            <w:pPr>
-              <w:pStyle w:val="NoSpacing"/>
-              <w:cnfStyle w:val="100000000000" w:firstRow="1" w:lastRow="0" w:firstColumn="0" w:lastColumn="0" w:oddVBand="0" w:evenVBand="0" w:oddHBand="0" w:evenHBand="0" w:firstRowFirstColumn="0" w:firstRowLastColumn="0" w:lastRowFirstColumn="0" w:lastRowLastColumn="0"/>
-            </w:pPr>
-            <w:r>
-              <w:t>kernel</w:t>
-            </w:r>
-          </w:p>
-        </w:tc>
-      </w:tr>
-      <w:tr>
-        <w:trPr>
-          <w:cnfStyle w:val="000000100000" w:firstRow="0" w:lastRow="0" w:firstColumn="0" w:lastColumn="0" w:oddVBand="0" w:evenVBand="0" w:oddHBand="1" w:evenHBand="0" w:firstRowFirstColumn="0" w:firstRowLastColumn="0" w:lastRowFirstColumn="0" w:lastRowLastColumn="0"/>
-        </w:trPr>
-        <w:tc>
-          <w:tcPr>
-            <w:cnfStyle w:val="001000000000" w:firstRow="0" w:lastRow="0" w:firstColumn="1" w:lastColumn="0" w:oddVBand="0" w:evenVBand="0" w:oddHBand="0" w:evenHBand="0" w:firstRowFirstColumn="0" w:firstRowLastColumn="0" w:lastRowFirstColumn="0" w:lastRowLastColumn="0"/>
-            <w:tcW w:w="0" w:type="auto"/>
-          </w:tcPr>
-          <w:p>
-            <w:pPr>
-              <w:pStyle w:val="NoSpacing"/>
-              <w:rPr>
-                <w:b w:val="0"/>
-                <w:bCs w:val="0"/>
-              </w:rPr>
-            </w:pPr>
-            <w:r>
-              <w:rPr>
-                <w:b w:val="0"/>
-                <w:bCs w:val="0"/>
-              </w:rPr>
-              <w:t>0</w:t>
-            </w:r>
-          </w:p>
-        </w:tc>
-        <w:tc>
-          <w:tcPr>
-            <w:tcW w:w="0" w:type="auto"/>
-          </w:tcPr>
-          <w:p>
-            <w:pPr>
-              <w:pStyle w:val="code"/>
-              <w:cnfStyle w:val="000000100000" w:firstRow="0" w:lastRow="0" w:firstColumn="0" w:lastColumn="0" w:oddVBand="0" w:evenVBand="0" w:oddHBand="1" w:evenHBand="0" w:firstRowFirstColumn="0" w:firstRowLastColumn="0" w:lastRowFirstColumn="0" w:lastRowLastColumn="0"/>
-            </w:pPr>
-            <w:r>
-              <w:t>[-1, 0, 1], [-2, 0, 2], [-1, 0, 1]</w:t>
-            </w:r>
-          </w:p>
-        </w:tc>
-      </w:tr>
-      <w:tr>
-        <w:tc>
-          <w:tcPr>
-            <w:cnfStyle w:val="001000000000" w:firstRow="0" w:lastRow="0" w:firstColumn="1" w:lastColumn="0" w:oddVBand="0" w:evenVBand="0" w:oddHBand="0" w:evenHBand="0" w:firstRowFirstColumn="0" w:firstRowLastColumn="0" w:lastRowFirstColumn="0" w:lastRowLastColumn="0"/>
-            <w:tcW w:w="0" w:type="auto"/>
-          </w:tcPr>
-          <w:p>
-            <w:pPr>
-              <w:pStyle w:val="NoSpacing"/>
-              <w:rPr>
-                <w:b w:val="0"/>
-                <w:bCs w:val="0"/>
-              </w:rPr>
-            </w:pPr>
-            <w:r>
-              <w:rPr>
-                <w:b w:val="0"/>
-                <w:bCs w:val="0"/>
-              </w:rPr>
-              <w:t>90</w:t>
-            </w:r>
-          </w:p>
-        </w:tc>
-        <w:tc>
-          <w:tcPr>
-            <w:tcW w:w="0" w:type="auto"/>
-          </w:tcPr>
-          <w:p>
-            <w:pPr>
-              <w:pStyle w:val="code"/>
-              <w:cnfStyle w:val="000000000000" w:firstRow="0" w:lastRow="0" w:firstColumn="0" w:lastColumn="0" w:oddVBand="0" w:evenVBand="0" w:oddHBand="0" w:evenHBand="0" w:firstRowFirstColumn="0" w:firstRowLastColumn="0" w:lastRowFirstColumn="0" w:lastRowLastColumn="0"/>
-            </w:pPr>
-            <w:r>
-              <w:t>[1, 2, 1],  [0, 0, 0],  [-1, -2, -1]</w:t>
-            </w:r>
+        <w:tc>
+          <w:tcPr>
+            <w:tcW w:w="4675" w:type="dxa"/>
+          </w:tcPr>
+          <w:p>
+            <m:oMathPara>
+              <m:oMath>
+                <m:sSub>
+                  <m:sSubPr>
+                    <m:ctrlPr>
+                      <w:rPr>
+                        <w:rFonts w:ascii="Cambria Math" w:hAnsi="Cambria Math"/>
+                        <w:i/>
+                      </w:rPr>
+                    </m:ctrlPr>
+                  </m:sSubPr>
+                  <m:e>
+                    <m:r>
+                      <w:rPr>
+                        <w:rFonts w:ascii="Cambria Math" w:hAnsi="Cambria Math"/>
+                      </w:rPr>
+                      <m:t>G</m:t>
+                    </m:r>
+                  </m:e>
+                  <m:sub>
+                    <m:r>
+                      <w:rPr>
+                        <w:rFonts w:ascii="Cambria Math" w:hAnsi="Cambria Math"/>
+                      </w:rPr>
+                      <m:t>0</m:t>
+                    </m:r>
+                  </m:sub>
+                </m:sSub>
+                <m:r>
+                  <w:rPr>
+                    <w:rFonts w:ascii="Cambria Math" w:hAnsi="Cambria Math"/>
+                  </w:rPr>
+                  <m:t xml:space="preserve">= </m:t>
+                </m:r>
+                <m:d>
+                  <m:dPr>
+                    <m:begChr m:val="["/>
+                    <m:endChr m:val="]"/>
+                    <m:ctrlPr>
+                      <w:rPr>
+                        <w:rFonts w:ascii="Cambria Math" w:hAnsi="Cambria Math"/>
+                        <w:i/>
+                      </w:rPr>
+                    </m:ctrlPr>
+                  </m:dPr>
+                  <m:e>
+                    <m:m>
+                      <m:mPr>
+                        <m:mcs>
+                          <m:mc>
+                            <m:mcPr>
+                              <m:count m:val="3"/>
+                              <m:mcJc m:val="center"/>
+                            </m:mcPr>
+                          </m:mc>
+                        </m:mcs>
+                        <m:ctrlPr>
+                          <w:rPr>
+                            <w:rFonts w:ascii="Cambria Math" w:hAnsi="Cambria Math"/>
+                            <w:i/>
+                          </w:rPr>
+                        </m:ctrlPr>
+                      </m:mPr>
+                      <m:mr>
+                        <m:e>
+                          <m:r>
+                            <w:rPr>
+                              <w:rFonts w:ascii="Cambria Math" w:hAnsi="Cambria Math"/>
+                            </w:rPr>
+                            <m:t>-1</m:t>
+                          </m:r>
+                        </m:e>
+                        <m:e>
+                          <m:r>
+                            <w:rPr>
+                              <w:rFonts w:ascii="Cambria Math" w:hAnsi="Cambria Math"/>
+                            </w:rPr>
+                            <m:t>0</m:t>
+                          </m:r>
+                        </m:e>
+                        <m:e>
+                          <m:r>
+                            <w:rPr>
+                              <w:rFonts w:ascii="Cambria Math" w:hAnsi="Cambria Math"/>
+                            </w:rPr>
+                            <m:t>+1</m:t>
+                          </m:r>
+                        </m:e>
+                      </m:mr>
+                      <m:mr>
+                        <m:e>
+                          <m:r>
+                            <w:rPr>
+                              <w:rFonts w:ascii="Cambria Math" w:hAnsi="Cambria Math"/>
+                            </w:rPr>
+                            <m:t>-2</m:t>
+                          </m:r>
+                        </m:e>
+                        <m:e>
+                          <m:r>
+                            <w:rPr>
+                              <w:rFonts w:ascii="Cambria Math" w:hAnsi="Cambria Math"/>
+                            </w:rPr>
+                            <m:t>0</m:t>
+                          </m:r>
+                        </m:e>
+                        <m:e>
+                          <m:r>
+                            <w:rPr>
+                              <w:rFonts w:ascii="Cambria Math" w:hAnsi="Cambria Math"/>
+                            </w:rPr>
+                            <m:t>+2</m:t>
+                          </m:r>
+                        </m:e>
+                      </m:mr>
+                      <m:mr>
+                        <m:e>
+                          <m:r>
+                            <w:rPr>
+                              <w:rFonts w:ascii="Cambria Math" w:hAnsi="Cambria Math"/>
+                            </w:rPr>
+                            <m:t>-1</m:t>
+                          </m:r>
+                        </m:e>
+                        <m:e>
+                          <m:r>
+                            <w:rPr>
+                              <w:rFonts w:ascii="Cambria Math" w:hAnsi="Cambria Math"/>
+                            </w:rPr>
+                            <m:t>0</m:t>
+                          </m:r>
+                        </m:e>
+                        <m:e>
+                          <m:r>
+                            <w:rPr>
+                              <w:rFonts w:ascii="Cambria Math" w:hAnsi="Cambria Math"/>
+                            </w:rPr>
+                            <m:t>+1</m:t>
+                          </m:r>
+                        </m:e>
+                      </m:mr>
+                    </m:m>
+                  </m:e>
+                </m:d>
+              </m:oMath>
+            </m:oMathPara>
+          </w:p>
+        </w:tc>
+        <w:tc>
+          <w:tcPr>
+            <w:tcW w:w="4675" w:type="dxa"/>
+          </w:tcPr>
+          <w:p>
+            <m:oMathPara>
+              <m:oMath>
+                <m:sSub>
+                  <m:sSubPr>
+                    <m:ctrlPr>
+                      <w:rPr>
+                        <w:rFonts w:ascii="Cambria Math" w:hAnsi="Cambria Math"/>
+                        <w:i/>
+                      </w:rPr>
+                    </m:ctrlPr>
+                  </m:sSubPr>
+                  <m:e>
+                    <m:r>
+                      <w:rPr>
+                        <w:rFonts w:ascii="Cambria Math" w:hAnsi="Cambria Math"/>
+                      </w:rPr>
+                      <m:t>G</m:t>
+                    </m:r>
+                  </m:e>
+                  <m:sub>
+                    <m:r>
+                      <w:rPr>
+                        <w:rFonts w:ascii="Cambria Math" w:hAnsi="Cambria Math"/>
+                      </w:rPr>
+                      <m:t>90</m:t>
+                    </m:r>
+                  </m:sub>
+                </m:sSub>
+                <m:r>
+                  <w:rPr>
+                    <w:rFonts w:ascii="Cambria Math" w:hAnsi="Cambria Math"/>
+                  </w:rPr>
+                  <m:t xml:space="preserve">= </m:t>
+                </m:r>
+                <m:d>
+                  <m:dPr>
+                    <m:begChr m:val="["/>
+                    <m:endChr m:val="]"/>
+                    <m:ctrlPr>
+                      <w:rPr>
+                        <w:rFonts w:ascii="Cambria Math" w:hAnsi="Cambria Math"/>
+                        <w:i/>
+                      </w:rPr>
+                    </m:ctrlPr>
+                  </m:dPr>
+                  <m:e>
+                    <m:m>
+                      <m:mPr>
+                        <m:mcs>
+                          <m:mc>
+                            <m:mcPr>
+                              <m:count m:val="3"/>
+                              <m:mcJc m:val="center"/>
+                            </m:mcPr>
+                          </m:mc>
+                        </m:mcs>
+                        <m:ctrlPr>
+                          <w:rPr>
+                            <w:rFonts w:ascii="Cambria Math" w:hAnsi="Cambria Math"/>
+                            <w:i/>
+                          </w:rPr>
+                        </m:ctrlPr>
+                      </m:mPr>
+                      <m:mr>
+                        <m:e>
+                          <m:r>
+                            <w:rPr>
+                              <w:rFonts w:ascii="Cambria Math" w:hAnsi="Cambria Math"/>
+                            </w:rPr>
+                            <m:t>+1</m:t>
+                          </m:r>
+                        </m:e>
+                        <m:e>
+                          <m:r>
+                            <w:rPr>
+                              <w:rFonts w:ascii="Cambria Math" w:hAnsi="Cambria Math"/>
+                            </w:rPr>
+                            <m:t>+2</m:t>
+                          </m:r>
+                        </m:e>
+                        <m:e>
+                          <m:r>
+                            <w:rPr>
+                              <w:rFonts w:ascii="Cambria Math" w:hAnsi="Cambria Math"/>
+                            </w:rPr>
+                            <m:t>+1</m:t>
+                          </m:r>
+                        </m:e>
+                      </m:mr>
+                      <m:mr>
+                        <m:e>
+                          <m:r>
+                            <w:rPr>
+                              <w:rFonts w:ascii="Cambria Math" w:hAnsi="Cambria Math"/>
+                            </w:rPr>
+                            <m:t>0</m:t>
+                          </m:r>
+                        </m:e>
+                        <m:e>
+                          <m:r>
+                            <w:rPr>
+                              <w:rFonts w:ascii="Cambria Math" w:hAnsi="Cambria Math"/>
+                            </w:rPr>
+                            <m:t>0</m:t>
+                          </m:r>
+                        </m:e>
+                        <m:e>
+                          <m:r>
+                            <w:rPr>
+                              <w:rFonts w:ascii="Cambria Math" w:hAnsi="Cambria Math"/>
+                            </w:rPr>
+                            <m:t>0</m:t>
+                          </m:r>
+                        </m:e>
+                      </m:mr>
+                      <m:mr>
+                        <m:e>
+                          <m:r>
+                            <w:rPr>
+                              <w:rFonts w:ascii="Cambria Math" w:hAnsi="Cambria Math"/>
+                            </w:rPr>
+                            <m:t>-1</m:t>
+                          </m:r>
+                        </m:e>
+                        <m:e>
+                          <m:r>
+                            <w:rPr>
+                              <w:rFonts w:ascii="Cambria Math" w:hAnsi="Cambria Math"/>
+                            </w:rPr>
+                            <m:t>-2</m:t>
+                          </m:r>
+                        </m:e>
+                        <m:e>
+                          <m:r>
+                            <w:rPr>
+                              <w:rFonts w:ascii="Cambria Math" w:hAnsi="Cambria Math"/>
+                            </w:rPr>
+                            <m:t>-1</m:t>
+                          </m:r>
+                        </m:e>
+                      </m:mr>
+                    </m:m>
+                  </m:e>
+                </m:d>
+              </m:oMath>
+            </m:oMathPara>
+          </w:p>
+        </w:tc>
+      </w:tr>
+    </w:tbl>
+    <w:p>
+      <w:pPr>
+        <w:pStyle w:val="Normalafterlist"/>
+      </w:pPr>
+      <w:r>
+        <w:t xml:space="preserve">The Sobel operator kernel is separable, so is actually implemented with two one-dimensional convolutions. </w:t>
+      </w:r>
+    </w:p>
+    <w:tbl>
+      <w:tblPr>
+        <w:tblStyle w:val="TableGrid"/>
+        <w:tblW w:w="0" w:type="auto"/>
+        <w:tblBorders>
+          <w:top w:val="none" w:sz="0" w:space="0" w:color="auto"/>
+          <w:left w:val="none" w:sz="0" w:space="0" w:color="auto"/>
+          <w:bottom w:val="none" w:sz="0" w:space="0" w:color="auto"/>
+          <w:right w:val="none" w:sz="0" w:space="0" w:color="auto"/>
+          <w:insideH w:val="none" w:sz="0" w:space="0" w:color="auto"/>
+          <w:insideV w:val="none" w:sz="0" w:space="0" w:color="auto"/>
+        </w:tblBorders>
+        <w:tblLook w:val="04A0" w:firstRow="1" w:lastRow="0" w:firstColumn="1" w:lastColumn="0" w:noHBand="0" w:noVBand="1"/>
+      </w:tblPr>
+      <w:tblGrid>
+        <w:gridCol w:w="4675"/>
+        <w:gridCol w:w="4675"/>
+      </w:tblGrid>
+      <w:tr>
+        <w:tc>
+          <w:tcPr>
+            <w:tcW w:w="4675" w:type="dxa"/>
+          </w:tcPr>
+          <w:p>
+            <m:oMathPara>
+              <m:oMath>
+                <m:sSub>
+                  <m:sSubPr>
+                    <m:ctrlPr>
+                      <w:rPr>
+                        <w:rFonts w:ascii="Cambria Math" w:hAnsi="Cambria Math"/>
+                        <w:i/>
+                      </w:rPr>
+                    </m:ctrlPr>
+                  </m:sSubPr>
+                  <m:e>
+                    <m:r>
+                      <w:rPr>
+                        <w:rFonts w:ascii="Cambria Math" w:hAnsi="Cambria Math"/>
+                      </w:rPr>
+                      <m:t>G</m:t>
+                    </m:r>
+                  </m:e>
+                  <m:sub>
+                    <m:r>
+                      <w:rPr>
+                        <w:rFonts w:ascii="Cambria Math" w:hAnsi="Cambria Math"/>
+                      </w:rPr>
+                      <m:t>0</m:t>
+                    </m:r>
+                  </m:sub>
+                </m:sSub>
+                <m:r>
+                  <w:rPr>
+                    <w:rFonts w:ascii="Cambria Math" w:hAnsi="Cambria Math"/>
+                  </w:rPr>
+                  <m:t>=</m:t>
+                </m:r>
+                <m:d>
+                  <m:dPr>
+                    <m:begChr m:val="["/>
+                    <m:endChr m:val="]"/>
+                    <m:ctrlPr>
+                      <w:rPr>
+                        <w:rFonts w:ascii="Cambria Math" w:hAnsi="Cambria Math"/>
+                        <w:i/>
+                      </w:rPr>
+                    </m:ctrlPr>
+                  </m:dPr>
+                  <m:e>
+                    <m:eqArr>
+                      <m:eqArrPr>
+                        <m:ctrlPr>
+                          <w:rPr>
+                            <w:rFonts w:ascii="Cambria Math" w:hAnsi="Cambria Math"/>
+                            <w:i/>
+                          </w:rPr>
+                        </m:ctrlPr>
+                      </m:eqArrPr>
+                      <m:e>
+                        <m:r>
+                          <w:rPr>
+                            <w:rFonts w:ascii="Cambria Math" w:hAnsi="Cambria Math"/>
+                          </w:rPr>
+                          <m:t>0.25</m:t>
+                        </m:r>
+                      </m:e>
+                      <m:e>
+                        <m:ctrlPr>
+                          <w:rPr>
+                            <w:rFonts w:ascii="Cambria Math" w:eastAsia="Cambria Math" w:hAnsi="Cambria Math" w:cs="Cambria Math"/>
+                            <w:i/>
+                          </w:rPr>
+                        </m:ctrlPr>
+                      </m:e>
+                      <m:e>
+                        <m:r>
+                          <w:rPr>
+                            <w:rFonts w:ascii="Cambria Math" w:hAnsi="Cambria Math"/>
+                          </w:rPr>
+                          <m:t>0.5</m:t>
+                        </m:r>
+                        <m:ctrlPr>
+                          <w:rPr>
+                            <w:rFonts w:ascii="Cambria Math" w:eastAsia="Cambria Math" w:hAnsi="Cambria Math" w:cs="Cambria Math"/>
+                            <w:i/>
+                          </w:rPr>
+                        </m:ctrlPr>
+                      </m:e>
+                      <m:e>
+                        <m:ctrlPr>
+                          <w:rPr>
+                            <w:rFonts w:ascii="Cambria Math" w:eastAsia="Cambria Math" w:hAnsi="Cambria Math" w:cs="Cambria Math"/>
+                            <w:i/>
+                          </w:rPr>
+                        </m:ctrlPr>
+                      </m:e>
+                      <m:e>
+                        <m:r>
+                          <w:rPr>
+                            <w:rFonts w:ascii="Cambria Math" w:eastAsia="Cambria Math" w:hAnsi="Cambria Math" w:cs="Cambria Math"/>
+                          </w:rPr>
+                          <m:t>0.25</m:t>
+                        </m:r>
+                      </m:e>
+                    </m:eqArr>
+                  </m:e>
+                </m:d>
+                <m:r>
+                  <w:rPr>
+                    <w:rFonts w:ascii="Cambria Math" w:hAnsi="Cambria Math"/>
+                  </w:rPr>
+                  <m:t>*</m:t>
+                </m:r>
+                <m:d>
+                  <m:dPr>
+                    <m:begChr m:val="["/>
+                    <m:endChr m:val="]"/>
+                    <m:ctrlPr>
+                      <w:rPr>
+                        <w:rFonts w:ascii="Cambria Math" w:hAnsi="Cambria Math"/>
+                        <w:i/>
+                      </w:rPr>
+                    </m:ctrlPr>
+                  </m:dPr>
+                  <m:e>
+                    <m:r>
+                      <w:rPr>
+                        <w:rFonts w:ascii="Cambria Math" w:hAnsi="Cambria Math"/>
+                      </w:rPr>
+                      <m:t>+1   0  -1</m:t>
+                    </m:r>
+                  </m:e>
+                </m:d>
+              </m:oMath>
+            </m:oMathPara>
+          </w:p>
+        </w:tc>
+        <w:tc>
+          <w:tcPr>
+            <w:tcW w:w="4675" w:type="dxa"/>
+          </w:tcPr>
+          <w:p>
+            <m:oMathPara>
+              <m:oMath>
+                <m:sSub>
+                  <m:sSubPr>
+                    <m:ctrlPr>
+                      <w:rPr>
+                        <w:rFonts w:ascii="Cambria Math" w:hAnsi="Cambria Math"/>
+                        <w:i/>
+                      </w:rPr>
+                    </m:ctrlPr>
+                  </m:sSubPr>
+                  <m:e>
+                    <m:r>
+                      <w:rPr>
+                        <w:rFonts w:ascii="Cambria Math" w:hAnsi="Cambria Math"/>
+                      </w:rPr>
+                      <m:t>G</m:t>
+                    </m:r>
+                  </m:e>
+                  <m:sub>
+                    <m:r>
+                      <w:rPr>
+                        <w:rFonts w:ascii="Cambria Math" w:hAnsi="Cambria Math"/>
+                      </w:rPr>
+                      <m:t>9</m:t>
+                    </m:r>
+                    <m:r>
+                      <w:rPr>
+                        <w:rFonts w:ascii="Cambria Math" w:hAnsi="Cambria Math"/>
+                      </w:rPr>
+                      <m:t>0</m:t>
+                    </m:r>
+                  </m:sub>
+                </m:sSub>
+                <m:r>
+                  <w:rPr>
+                    <w:rFonts w:ascii="Cambria Math" w:hAnsi="Cambria Math"/>
+                  </w:rPr>
+                  <m:t>=</m:t>
+                </m:r>
+                <m:d>
+                  <m:dPr>
+                    <m:begChr m:val="["/>
+                    <m:endChr m:val="]"/>
+                    <m:ctrlPr>
+                      <w:rPr>
+                        <w:rFonts w:ascii="Cambria Math" w:hAnsi="Cambria Math"/>
+                        <w:i/>
+                      </w:rPr>
+                    </m:ctrlPr>
+                  </m:dPr>
+                  <m:e>
+                    <m:eqArr>
+                      <m:eqArrPr>
+                        <m:ctrlPr>
+                          <w:rPr>
+                            <w:rFonts w:ascii="Cambria Math" w:hAnsi="Cambria Math"/>
+                            <w:i/>
+                          </w:rPr>
+                        </m:ctrlPr>
+                      </m:eqArrPr>
+                      <m:e>
+                        <m:r>
+                          <w:rPr>
+                            <w:rFonts w:ascii="Cambria Math" w:hAnsi="Cambria Math"/>
+                          </w:rPr>
+                          <m:t>+1</m:t>
+                        </m:r>
+                      </m:e>
+                      <m:e>
+                        <m:r>
+                          <w:rPr>
+                            <w:rFonts w:ascii="Cambria Math" w:hAnsi="Cambria Math"/>
+                          </w:rPr>
+                          <m:t>0</m:t>
+                        </m:r>
+                        <m:ctrlPr>
+                          <w:rPr>
+                            <w:rFonts w:ascii="Cambria Math" w:eastAsia="Cambria Math" w:hAnsi="Cambria Math" w:cs="Cambria Math"/>
+                            <w:i/>
+                          </w:rPr>
+                        </m:ctrlPr>
+                      </m:e>
+                      <m:e>
+                        <m:r>
+                          <w:rPr>
+                            <w:rFonts w:ascii="Cambria Math" w:eastAsia="Cambria Math" w:hAnsi="Cambria Math" w:cs="Cambria Math"/>
+                          </w:rPr>
+                          <m:t>-1</m:t>
+                        </m:r>
+                      </m:e>
+                    </m:eqArr>
+                  </m:e>
+                </m:d>
+                <m:r>
+                  <w:rPr>
+                    <w:rFonts w:ascii="Cambria Math" w:hAnsi="Cambria Math"/>
+                  </w:rPr>
+                  <m:t>*</m:t>
+                </m:r>
+                <m:d>
+                  <m:dPr>
+                    <m:begChr m:val="["/>
+                    <m:endChr m:val="]"/>
+                    <m:ctrlPr>
+                      <w:rPr>
+                        <w:rFonts w:ascii="Cambria Math" w:hAnsi="Cambria Math"/>
+                        <w:i/>
+                      </w:rPr>
+                    </m:ctrlPr>
+                  </m:dPr>
+                  <m:e>
+                    <m:r>
+                      <w:rPr>
+                        <w:rFonts w:ascii="Cambria Math" w:hAnsi="Cambria Math"/>
+                      </w:rPr>
+                      <m:t>0.25 0.5  0.25</m:t>
+                    </m:r>
+                  </m:e>
+                </m:d>
+              </m:oMath>
+            </m:oMathPara>
           </w:p>
         </w:tc>
       </w:tr>
@@ -15242,16 +16436,7 @@
     </w:p>
     <w:p>
       <w:r>
-        <w:t xml:space="preserve">The </w:t>
-      </w:r>
-      <w:r>
-        <w:t>filter smooth average</w:t>
-      </w:r>
-      <w:r>
-        <w:t xml:space="preserve"> operator convolves the image with </w:t>
-      </w:r>
-      <w:r>
-        <w:t>a kernel that averages the pixels under the kernel. For a kernel that is size rows x cols, the output pixel is the sum of the pixels in a rectangle rows x cols around the input pixel, divided by 1/(rows * cols).</w:t>
+        <w:t>The filter smooth average operator convolves the image with a kernel that averages the pixels under the kernel. For a kernel that is size rows x cols, the output pixel is the sum of the pixels in a rectangle rows x cols around the input pixel, divided by 1/(rows * cols).</w:t>
       </w:r>
     </w:p>
     <w:p>
@@ -15504,25 +16689,7 @@
         <w:pStyle w:val="Normalafterlist"/>
       </w:pPr>
       <w:r>
-        <w:t>The parameter</w:t>
-      </w:r>
-      <w:r>
-        <w:t>s</w:t>
-      </w:r>
-      <w:r>
-        <w:t xml:space="preserve"> to the </w:t>
-      </w:r>
-      <w:r>
-        <w:t>smooth average</w:t>
-      </w:r>
-      <w:r>
-        <w:t xml:space="preserve"> operator </w:t>
-      </w:r>
-      <w:r>
-        <w:t>are</w:t>
-      </w:r>
-      <w:r>
-        <w:t>:</w:t>
+        <w:t>The parameters to the smooth average operator are:</w:t>
       </w:r>
     </w:p>
     <w:tbl>
@@ -16111,9 +17278,1490 @@
     </w:p>
     <w:p>
       <w:r>
-        <w:t>Planned but not yet implemented in the current release.</w:t>
-      </w:r>
-    </w:p>
+        <w:t xml:space="preserve">The filter smooth gaussian operator convolves the image with a </w:t>
+      </w:r>
+      <w:r>
+        <w:t xml:space="preserve">gaussian </w:t>
+      </w:r>
+      <w:r>
+        <w:t xml:space="preserve">kernel that </w:t>
+      </w:r>
+      <w:r>
+        <w:t xml:space="preserve">does a weighted </w:t>
+      </w:r>
+      <w:r>
+        <w:t>average</w:t>
+      </w:r>
+      <w:r>
+        <w:t xml:space="preserve"> of</w:t>
+      </w:r>
+      <w:r>
+        <w:t xml:space="preserve"> the pixels under the kernel. </w:t>
+      </w:r>
+      <w:r>
+        <w:t xml:space="preserve">The 1-dimensional gaussian using variance  </w:t>
+      </w:r>
+      <m:oMath>
+        <m:sSub>
+          <m:sSubPr>
+            <m:ctrlPr>
+              <w:rPr>
+                <w:rFonts w:ascii="Cambria Math" w:hAnsi="Cambria Math"/>
+                <w:i/>
+              </w:rPr>
+            </m:ctrlPr>
+          </m:sSubPr>
+          <m:e>
+            <m:r>
+              <w:rPr>
+                <w:rFonts w:ascii="Cambria Math" w:hAnsi="Cambria Math"/>
+              </w:rPr>
+              <m:t>σ</m:t>
+            </m:r>
+          </m:e>
+          <m:sub>
+            <m:r>
+              <w:rPr>
+                <w:rFonts w:ascii="Cambria Math" w:hAnsi="Cambria Math"/>
+              </w:rPr>
+              <m:t>x</m:t>
+            </m:r>
+          </m:sub>
+        </m:sSub>
+      </m:oMath>
+      <w:r>
+        <w:t xml:space="preserve"> can be computed by convolving with this this formula:</w:t>
+      </w:r>
+    </w:p>
+    <w:p>
+      <m:oMathPara>
+        <m:oMath>
+          <m:r>
+            <w:rPr>
+              <w:rFonts w:ascii="Cambria Math" w:hAnsi="Cambria Math"/>
+            </w:rPr>
+            <m:t>G</m:t>
+          </m:r>
+          <m:d>
+            <m:dPr>
+              <m:ctrlPr>
+                <w:rPr>
+                  <w:rFonts w:ascii="Cambria Math" w:hAnsi="Cambria Math"/>
+                  <w:i/>
+                </w:rPr>
+              </m:ctrlPr>
+            </m:dPr>
+            <m:e>
+              <m:r>
+                <w:rPr>
+                  <w:rFonts w:ascii="Cambria Math" w:hAnsi="Cambria Math"/>
+                </w:rPr>
+                <m:t>x</m:t>
+              </m:r>
+            </m:e>
+          </m:d>
+          <m:r>
+            <w:rPr>
+              <w:rFonts w:ascii="Cambria Math" w:hAnsi="Cambria Math"/>
+            </w:rPr>
+            <m:t>=</m:t>
+          </m:r>
+          <m:f>
+            <m:fPr>
+              <m:ctrlPr>
+                <w:rPr>
+                  <w:rFonts w:ascii="Cambria Math" w:hAnsi="Cambria Math"/>
+                  <w:i/>
+                </w:rPr>
+              </m:ctrlPr>
+            </m:fPr>
+            <m:num>
+              <m:r>
+                <w:rPr>
+                  <w:rFonts w:ascii="Cambria Math" w:hAnsi="Cambria Math"/>
+                </w:rPr>
+                <m:t>1</m:t>
+              </m:r>
+            </m:num>
+            <m:den>
+              <m:sSub>
+                <m:sSubPr>
+                  <m:ctrlPr>
+                    <w:rPr>
+                      <w:rFonts w:ascii="Cambria Math" w:hAnsi="Cambria Math"/>
+                      <w:i/>
+                    </w:rPr>
+                  </m:ctrlPr>
+                </m:sSubPr>
+                <m:e>
+                  <m:r>
+                    <w:rPr>
+                      <w:rFonts w:ascii="Cambria Math" w:hAnsi="Cambria Math"/>
+                    </w:rPr>
+                    <m:t>σ</m:t>
+                  </m:r>
+                </m:e>
+                <m:sub>
+                  <m:r>
+                    <w:rPr>
+                      <w:rFonts w:ascii="Cambria Math" w:hAnsi="Cambria Math"/>
+                    </w:rPr>
+                    <m:t>x</m:t>
+                  </m:r>
+                </m:sub>
+              </m:sSub>
+              <m:rad>
+                <m:radPr>
+                  <m:degHide m:val="1"/>
+                  <m:ctrlPr>
+                    <w:rPr>
+                      <w:rFonts w:ascii="Cambria Math" w:hAnsi="Cambria Math"/>
+                      <w:i/>
+                    </w:rPr>
+                  </m:ctrlPr>
+                </m:radPr>
+                <m:deg/>
+                <m:e>
+                  <m:r>
+                    <w:rPr>
+                      <w:rFonts w:ascii="Cambria Math" w:hAnsi="Cambria Math"/>
+                    </w:rPr>
+                    <m:t>2π</m:t>
+                  </m:r>
+                </m:e>
+              </m:rad>
+            </m:den>
+          </m:f>
+          <m:sSup>
+            <m:sSupPr>
+              <m:ctrlPr>
+                <w:rPr>
+                  <w:rFonts w:ascii="Cambria Math" w:hAnsi="Cambria Math"/>
+                  <w:i/>
+                </w:rPr>
+              </m:ctrlPr>
+            </m:sSupPr>
+            <m:e>
+              <m:r>
+                <w:rPr>
+                  <w:rFonts w:ascii="Cambria Math" w:hAnsi="Cambria Math"/>
+                </w:rPr>
+                <m:t>e</m:t>
+              </m:r>
+            </m:e>
+            <m:sup>
+              <m:r>
+                <w:rPr>
+                  <w:rFonts w:ascii="Cambria Math" w:hAnsi="Cambria Math"/>
+                </w:rPr>
+                <m:t>-</m:t>
+              </m:r>
+              <m:f>
+                <m:fPr>
+                  <m:ctrlPr>
+                    <w:rPr>
+                      <w:rFonts w:ascii="Cambria Math" w:hAnsi="Cambria Math"/>
+                      <w:i/>
+                    </w:rPr>
+                  </m:ctrlPr>
+                </m:fPr>
+                <m:num>
+                  <m:sSup>
+                    <m:sSupPr>
+                      <m:ctrlPr>
+                        <w:rPr>
+                          <w:rFonts w:ascii="Cambria Math" w:hAnsi="Cambria Math"/>
+                          <w:i/>
+                        </w:rPr>
+                      </m:ctrlPr>
+                    </m:sSupPr>
+                    <m:e>
+                      <m:r>
+                        <w:rPr>
+                          <w:rFonts w:ascii="Cambria Math" w:hAnsi="Cambria Math"/>
+                        </w:rPr>
+                        <m:t>x</m:t>
+                      </m:r>
+                    </m:e>
+                    <m:sup>
+                      <m:r>
+                        <w:rPr>
+                          <w:rFonts w:ascii="Cambria Math" w:hAnsi="Cambria Math"/>
+                        </w:rPr>
+                        <m:t>2</m:t>
+                      </m:r>
+                    </m:sup>
+                  </m:sSup>
+                </m:num>
+                <m:den>
+                  <m:r>
+                    <w:rPr>
+                      <w:rFonts w:ascii="Cambria Math" w:hAnsi="Cambria Math"/>
+                    </w:rPr>
+                    <m:t>2</m:t>
+                  </m:r>
+                  <m:sSup>
+                    <m:sSupPr>
+                      <m:ctrlPr>
+                        <w:rPr>
+                          <w:rFonts w:ascii="Cambria Math" w:hAnsi="Cambria Math"/>
+                          <w:i/>
+                        </w:rPr>
+                      </m:ctrlPr>
+                    </m:sSupPr>
+                    <m:e>
+                      <m:sSubSup>
+                        <m:sSubSupPr>
+                          <m:ctrlPr>
+                            <w:rPr>
+                              <w:rFonts w:ascii="Cambria Math" w:hAnsi="Cambria Math"/>
+                              <w:i/>
+                            </w:rPr>
+                          </m:ctrlPr>
+                        </m:sSubSupPr>
+                        <m:e>
+                          <m:r>
+                            <w:rPr>
+                              <w:rFonts w:ascii="Cambria Math" w:hAnsi="Cambria Math"/>
+                            </w:rPr>
+                            <m:t>σ</m:t>
+                          </m:r>
+                          <m:ctrlPr>
+                            <w:rPr>
+                              <w:rFonts w:ascii="Cambria Math" w:eastAsia="Cambria Math" w:hAnsi="Cambria Math" w:cs="Cambria Math"/>
+                              <w:i/>
+                            </w:rPr>
+                          </m:ctrlPr>
+                        </m:e>
+                        <m:sub>
+                          <m:r>
+                            <w:rPr>
+                              <w:rFonts w:ascii="Cambria Math" w:hAnsi="Cambria Math"/>
+                            </w:rPr>
+                            <m:t>x</m:t>
+                          </m:r>
+                        </m:sub>
+                        <m:sup>
+                          <m:r>
+                            <w:rPr>
+                              <w:rFonts w:ascii="Cambria Math" w:hAnsi="Cambria Math"/>
+                            </w:rPr>
+                            <m:t>2</m:t>
+                          </m:r>
+                        </m:sup>
+                      </m:sSubSup>
+                      <m:ctrlPr>
+                        <w:rPr>
+                          <w:rFonts w:ascii="Cambria Math" w:eastAsia="Cambria Math" w:hAnsi="Cambria Math" w:cs="Cambria Math"/>
+                          <w:i/>
+                        </w:rPr>
+                      </m:ctrlPr>
+                    </m:e>
+                    <m:sup/>
+                  </m:sSup>
+                </m:den>
+              </m:f>
+            </m:sup>
+          </m:sSup>
+        </m:oMath>
+      </m:oMathPara>
+    </w:p>
+    <w:p>
+      <w:r>
+        <w:t xml:space="preserve">The gaussian has a separable kernel, so the 2-dimensional gaussian can be computed </w:t>
+      </w:r>
+      <w:r>
+        <w:t xml:space="preserve">asymmetrically </w:t>
+      </w:r>
+      <w:r>
+        <w:t xml:space="preserve">by convolving with the above 1-dimensional formula in the x direction and with the following formula using </w:t>
+      </w:r>
+      <w:r>
+        <w:t xml:space="preserve">variance  </w:t>
+      </w:r>
+      <m:oMath>
+        <m:sSub>
+          <m:sSubPr>
+            <m:ctrlPr>
+              <w:rPr>
+                <w:rFonts w:ascii="Cambria Math" w:hAnsi="Cambria Math"/>
+                <w:i/>
+              </w:rPr>
+            </m:ctrlPr>
+          </m:sSubPr>
+          <m:e>
+            <m:r>
+              <w:rPr>
+                <w:rFonts w:ascii="Cambria Math" w:hAnsi="Cambria Math"/>
+              </w:rPr>
+              <m:t>σ</m:t>
+            </m:r>
+          </m:e>
+          <m:sub>
+            <m:r>
+              <w:rPr>
+                <w:rFonts w:ascii="Cambria Math" w:hAnsi="Cambria Math"/>
+              </w:rPr>
+              <m:t>x</m:t>
+            </m:r>
+          </m:sub>
+        </m:sSub>
+      </m:oMath>
+      <w:r>
+        <w:t xml:space="preserve"> </w:t>
+      </w:r>
+      <w:r>
+        <w:t>in the y direction:</w:t>
+      </w:r>
+    </w:p>
+    <w:p>
+      <m:oMathPara>
+        <m:oMath>
+          <m:r>
+            <w:rPr>
+              <w:rFonts w:ascii="Cambria Math" w:hAnsi="Cambria Math"/>
+            </w:rPr>
+            <m:t>G</m:t>
+          </m:r>
+          <m:d>
+            <m:dPr>
+              <m:ctrlPr>
+                <w:rPr>
+                  <w:rFonts w:ascii="Cambria Math" w:hAnsi="Cambria Math"/>
+                  <w:i/>
+                </w:rPr>
+              </m:ctrlPr>
+            </m:dPr>
+            <m:e>
+              <m:r>
+                <w:rPr>
+                  <w:rFonts w:ascii="Cambria Math" w:hAnsi="Cambria Math"/>
+                </w:rPr>
+                <m:t>y</m:t>
+              </m:r>
+            </m:e>
+          </m:d>
+          <m:r>
+            <w:rPr>
+              <w:rFonts w:ascii="Cambria Math" w:hAnsi="Cambria Math"/>
+            </w:rPr>
+            <m:t>=</m:t>
+          </m:r>
+          <m:f>
+            <m:fPr>
+              <m:ctrlPr>
+                <w:rPr>
+                  <w:rFonts w:ascii="Cambria Math" w:hAnsi="Cambria Math"/>
+                  <w:i/>
+                </w:rPr>
+              </m:ctrlPr>
+            </m:fPr>
+            <m:num>
+              <m:r>
+                <w:rPr>
+                  <w:rFonts w:ascii="Cambria Math" w:hAnsi="Cambria Math"/>
+                </w:rPr>
+                <m:t>1</m:t>
+              </m:r>
+            </m:num>
+            <m:den>
+              <m:sSub>
+                <m:sSubPr>
+                  <m:ctrlPr>
+                    <w:rPr>
+                      <w:rFonts w:ascii="Cambria Math" w:hAnsi="Cambria Math"/>
+                      <w:i/>
+                    </w:rPr>
+                  </m:ctrlPr>
+                </m:sSubPr>
+                <m:e>
+                  <m:r>
+                    <w:rPr>
+                      <w:rFonts w:ascii="Cambria Math" w:hAnsi="Cambria Math"/>
+                    </w:rPr>
+                    <m:t>σ</m:t>
+                  </m:r>
+                </m:e>
+                <m:sub>
+                  <m:r>
+                    <w:rPr>
+                      <w:rFonts w:ascii="Cambria Math" w:hAnsi="Cambria Math"/>
+                    </w:rPr>
+                    <m:t>y</m:t>
+                  </m:r>
+                </m:sub>
+              </m:sSub>
+              <m:rad>
+                <m:radPr>
+                  <m:degHide m:val="1"/>
+                  <m:ctrlPr>
+                    <w:rPr>
+                      <w:rFonts w:ascii="Cambria Math" w:hAnsi="Cambria Math"/>
+                      <w:i/>
+                    </w:rPr>
+                  </m:ctrlPr>
+                </m:radPr>
+                <m:deg/>
+                <m:e>
+                  <m:r>
+                    <w:rPr>
+                      <w:rFonts w:ascii="Cambria Math" w:hAnsi="Cambria Math"/>
+                    </w:rPr>
+                    <m:t>2π</m:t>
+                  </m:r>
+                </m:e>
+              </m:rad>
+            </m:den>
+          </m:f>
+          <m:sSup>
+            <m:sSupPr>
+              <m:ctrlPr>
+                <w:rPr>
+                  <w:rFonts w:ascii="Cambria Math" w:hAnsi="Cambria Math"/>
+                  <w:i/>
+                </w:rPr>
+              </m:ctrlPr>
+            </m:sSupPr>
+            <m:e>
+              <m:r>
+                <w:rPr>
+                  <w:rFonts w:ascii="Cambria Math" w:hAnsi="Cambria Math"/>
+                </w:rPr>
+                <m:t>e</m:t>
+              </m:r>
+            </m:e>
+            <m:sup>
+              <m:r>
+                <w:rPr>
+                  <w:rFonts w:ascii="Cambria Math" w:hAnsi="Cambria Math"/>
+                </w:rPr>
+                <m:t>-</m:t>
+              </m:r>
+              <m:f>
+                <m:fPr>
+                  <m:ctrlPr>
+                    <w:rPr>
+                      <w:rFonts w:ascii="Cambria Math" w:hAnsi="Cambria Math"/>
+                      <w:i/>
+                    </w:rPr>
+                  </m:ctrlPr>
+                </m:fPr>
+                <m:num>
+                  <m:sSup>
+                    <m:sSupPr>
+                      <m:ctrlPr>
+                        <w:rPr>
+                          <w:rFonts w:ascii="Cambria Math" w:hAnsi="Cambria Math"/>
+                          <w:i/>
+                        </w:rPr>
+                      </m:ctrlPr>
+                    </m:sSupPr>
+                    <m:e>
+                      <m:r>
+                        <w:rPr>
+                          <w:rFonts w:ascii="Cambria Math" w:hAnsi="Cambria Math"/>
+                        </w:rPr>
+                        <m:t>y</m:t>
+                      </m:r>
+                    </m:e>
+                    <m:sup>
+                      <m:r>
+                        <w:rPr>
+                          <w:rFonts w:ascii="Cambria Math" w:hAnsi="Cambria Math"/>
+                        </w:rPr>
+                        <m:t>2</m:t>
+                      </m:r>
+                    </m:sup>
+                  </m:sSup>
+                </m:num>
+                <m:den>
+                  <m:r>
+                    <w:rPr>
+                      <w:rFonts w:ascii="Cambria Math" w:hAnsi="Cambria Math"/>
+                    </w:rPr>
+                    <m:t>2</m:t>
+                  </m:r>
+                  <m:sSup>
+                    <m:sSupPr>
+                      <m:ctrlPr>
+                        <w:rPr>
+                          <w:rFonts w:ascii="Cambria Math" w:hAnsi="Cambria Math"/>
+                          <w:i/>
+                        </w:rPr>
+                      </m:ctrlPr>
+                    </m:sSupPr>
+                    <m:e>
+                      <m:sSubSup>
+                        <m:sSubSupPr>
+                          <m:ctrlPr>
+                            <w:rPr>
+                              <w:rFonts w:ascii="Cambria Math" w:hAnsi="Cambria Math"/>
+                              <w:i/>
+                            </w:rPr>
+                          </m:ctrlPr>
+                        </m:sSubSupPr>
+                        <m:e>
+                          <m:r>
+                            <w:rPr>
+                              <w:rFonts w:ascii="Cambria Math" w:hAnsi="Cambria Math"/>
+                            </w:rPr>
+                            <m:t>σ</m:t>
+                          </m:r>
+                          <m:ctrlPr>
+                            <w:rPr>
+                              <w:rFonts w:ascii="Cambria Math" w:eastAsia="Cambria Math" w:hAnsi="Cambria Math" w:cs="Cambria Math"/>
+                              <w:i/>
+                            </w:rPr>
+                          </m:ctrlPr>
+                        </m:e>
+                        <m:sub>
+                          <m:r>
+                            <w:rPr>
+                              <w:rFonts w:ascii="Cambria Math" w:hAnsi="Cambria Math"/>
+                            </w:rPr>
+                            <m:t>y</m:t>
+                          </m:r>
+                        </m:sub>
+                        <m:sup>
+                          <m:r>
+                            <w:rPr>
+                              <w:rFonts w:ascii="Cambria Math" w:hAnsi="Cambria Math"/>
+                            </w:rPr>
+                            <m:t>2</m:t>
+                          </m:r>
+                        </m:sup>
+                      </m:sSubSup>
+                      <m:ctrlPr>
+                        <w:rPr>
+                          <w:rFonts w:ascii="Cambria Math" w:eastAsia="Cambria Math" w:hAnsi="Cambria Math" w:cs="Cambria Math"/>
+                          <w:i/>
+                        </w:rPr>
+                      </m:ctrlPr>
+                    </m:e>
+                    <m:sup/>
+                  </m:sSup>
+                </m:den>
+              </m:f>
+            </m:sup>
+          </m:sSup>
+        </m:oMath>
+      </m:oMathPara>
+    </w:p>
+    <w:p>
+      <w:pPr>
+        <w:jc w:val="center"/>
+      </w:pPr>
+    </w:p>
+    <w:p>
+      <w:pPr>
+        <w:pStyle w:val="Normalafterlist"/>
+      </w:pPr>
+      <w:r>
+        <w:t xml:space="preserve">Each convolution is normalized by the sum of the kernel values. </w:t>
+      </w:r>
+      <w:r>
+        <w:t>The operator takes the following data descriptors:</w:t>
+      </w:r>
+    </w:p>
+    <w:tbl>
+      <w:tblPr>
+        <w:tblStyle w:val="PlainTable1"/>
+        <w:tblW w:w="8359" w:type="dxa"/>
+        <w:tblLook w:val="04A0" w:firstRow="1" w:lastRow="0" w:firstColumn="1" w:lastColumn="0" w:noHBand="0" w:noVBand="1"/>
+      </w:tblPr>
+      <w:tblGrid>
+        <w:gridCol w:w="1648"/>
+        <w:gridCol w:w="412"/>
+        <w:gridCol w:w="962"/>
+        <w:gridCol w:w="1530"/>
+        <w:gridCol w:w="3807"/>
+      </w:tblGrid>
+      <w:tr>
+        <w:trPr>
+          <w:cnfStyle w:val="100000000000" w:firstRow="1" w:lastRow="0" w:firstColumn="0" w:lastColumn="0" w:oddVBand="0" w:evenVBand="0" w:oddHBand="0" w:evenHBand="0" w:firstRowFirstColumn="0" w:firstRowLastColumn="0" w:lastRowFirstColumn="0" w:lastRowLastColumn="0"/>
+          <w:cantSplit/>
+          <w:tblHeader/>
+        </w:trPr>
+        <w:tc>
+          <w:tcPr>
+            <w:cnfStyle w:val="001000000000" w:firstRow="0" w:lastRow="0" w:firstColumn="1" w:lastColumn="0" w:oddVBand="0" w:evenVBand="0" w:oddHBand="0" w:evenHBand="0" w:firstRowFirstColumn="0" w:firstRowLastColumn="0" w:lastRowFirstColumn="0" w:lastRowLastColumn="0"/>
+            <w:tcW w:w="0" w:type="auto"/>
+          </w:tcPr>
+          <w:p>
+            <w:r>
+              <w:t>Descriptor type</w:t>
+            </w:r>
+          </w:p>
+        </w:tc>
+        <w:tc>
+          <w:tcPr>
+            <w:tcW w:w="0" w:type="auto"/>
+          </w:tcPr>
+          <w:p>
+            <w:pPr>
+              <w:cnfStyle w:val="100000000000" w:firstRow="1" w:lastRow="0" w:firstColumn="0" w:lastColumn="0" w:oddVBand="0" w:evenVBand="0" w:oddHBand="0" w:evenHBand="0" w:firstRowFirstColumn="0" w:firstRowLastColumn="0" w:lastRowFirstColumn="0" w:lastRowLastColumn="0"/>
+            </w:pPr>
+            <w:r>
+              <w:t>Id</w:t>
+            </w:r>
+          </w:p>
+        </w:tc>
+        <w:tc>
+          <w:tcPr>
+            <w:tcW w:w="0" w:type="auto"/>
+          </w:tcPr>
+          <w:p>
+            <w:pPr>
+              <w:cnfStyle w:val="100000000000" w:firstRow="1" w:lastRow="0" w:firstColumn="0" w:lastColumn="0" w:oddVBand="0" w:evenVBand="0" w:oddHBand="0" w:evenHBand="0" w:firstRowFirstColumn="0" w:firstRowLastColumn="0" w:lastRowFirstColumn="0" w:lastRowLastColumn="0"/>
+            </w:pPr>
+            <w:r>
+              <w:t>type</w:t>
+            </w:r>
+          </w:p>
+        </w:tc>
+        <w:tc>
+          <w:tcPr>
+            <w:tcW w:w="0" w:type="auto"/>
+          </w:tcPr>
+          <w:p>
+            <w:pPr>
+              <w:cnfStyle w:val="100000000000" w:firstRow="1" w:lastRow="0" w:firstColumn="0" w:lastColumn="0" w:oddVBand="0" w:evenVBand="0" w:oddHBand="0" w:evenHBand="0" w:firstRowFirstColumn="0" w:firstRowLastColumn="0" w:lastRowFirstColumn="0" w:lastRowLastColumn="0"/>
+            </w:pPr>
+            <w:r>
+              <w:t>Format</w:t>
+            </w:r>
+          </w:p>
+        </w:tc>
+        <w:tc>
+          <w:tcPr>
+            <w:tcW w:w="0" w:type="auto"/>
+          </w:tcPr>
+          <w:p>
+            <w:pPr>
+              <w:cnfStyle w:val="100000000000" w:firstRow="1" w:lastRow="0" w:firstColumn="0" w:lastColumn="0" w:oddVBand="0" w:evenVBand="0" w:oddHBand="0" w:evenHBand="0" w:firstRowFirstColumn="0" w:firstRowLastColumn="0" w:lastRowFirstColumn="0" w:lastRowLastColumn="0"/>
+            </w:pPr>
+            <w:r>
+              <w:t>Description</w:t>
+            </w:r>
+          </w:p>
+        </w:tc>
+      </w:tr>
+      <w:tr>
+        <w:trPr>
+          <w:cnfStyle w:val="000000100000" w:firstRow="0" w:lastRow="0" w:firstColumn="0" w:lastColumn="0" w:oddVBand="0" w:evenVBand="0" w:oddHBand="1" w:evenHBand="0" w:firstRowFirstColumn="0" w:firstRowLastColumn="0" w:lastRowFirstColumn="0" w:lastRowLastColumn="0"/>
+        </w:trPr>
+        <w:tc>
+          <w:tcPr>
+            <w:cnfStyle w:val="001000000000" w:firstRow="0" w:lastRow="0" w:firstColumn="1" w:lastColumn="0" w:oddVBand="0" w:evenVBand="0" w:oddHBand="0" w:evenHBand="0" w:firstRowFirstColumn="0" w:firstRowLastColumn="0" w:lastRowFirstColumn="0" w:lastRowLastColumn="0"/>
+            <w:tcW w:w="0" w:type="auto"/>
+          </w:tcPr>
+          <w:p>
+            <w:pPr>
+              <w:rPr>
+                <w:b w:val="0"/>
+                <w:bCs w:val="0"/>
+              </w:rPr>
+            </w:pPr>
+            <w:r>
+              <w:rPr>
+                <w:b w:val="0"/>
+                <w:bCs w:val="0"/>
+              </w:rPr>
+              <w:t>input</w:t>
+            </w:r>
+          </w:p>
+        </w:tc>
+        <w:tc>
+          <w:tcPr>
+            <w:tcW w:w="0" w:type="auto"/>
+          </w:tcPr>
+          <w:p>
+            <w:pPr>
+              <w:cnfStyle w:val="000000100000" w:firstRow="0" w:lastRow="0" w:firstColumn="0" w:lastColumn="0" w:oddVBand="0" w:evenVBand="0" w:oddHBand="1" w:evenHBand="0" w:firstRowFirstColumn="0" w:firstRowLastColumn="0" w:lastRowFirstColumn="0" w:lastRowLastColumn="0"/>
+            </w:pPr>
+            <w:r>
+              <w:t>1</w:t>
+            </w:r>
+          </w:p>
+        </w:tc>
+        <w:tc>
+          <w:tcPr>
+            <w:tcW w:w="0" w:type="auto"/>
+          </w:tcPr>
+          <w:p>
+            <w:pPr>
+              <w:cnfStyle w:val="000000100000" w:firstRow="0" w:lastRow="0" w:firstColumn="0" w:lastColumn="0" w:oddVBand="0" w:evenVBand="0" w:oddHBand="1" w:evenHBand="0" w:firstRowFirstColumn="0" w:firstRowLastColumn="0" w:lastRowFirstColumn="0" w:lastRowLastColumn="0"/>
+            </w:pPr>
+            <w:r>
+              <w:t>“image”</w:t>
+            </w:r>
+          </w:p>
+        </w:tc>
+        <w:tc>
+          <w:tcPr>
+            <w:tcW w:w="0" w:type="auto"/>
+          </w:tcPr>
+          <w:p>
+            <w:pPr>
+              <w:cnfStyle w:val="000000100000" w:firstRow="0" w:lastRow="0" w:firstColumn="0" w:lastColumn="0" w:oddVBand="0" w:evenVBand="0" w:oddHBand="1" w:evenHBand="0" w:firstRowFirstColumn="0" w:firstRowLastColumn="0" w:lastRowFirstColumn="0" w:lastRowLastColumn="0"/>
+            </w:pPr>
+            <w:r>
+              <w:t xml:space="preserve">“jpeg” or “binary” </w:t>
+            </w:r>
+          </w:p>
+        </w:tc>
+        <w:tc>
+          <w:tcPr>
+            <w:tcW w:w="0" w:type="auto"/>
+          </w:tcPr>
+          <w:p>
+            <w:pPr>
+              <w:cnfStyle w:val="000000100000" w:firstRow="0" w:lastRow="0" w:firstColumn="0" w:lastColumn="0" w:oddVBand="0" w:evenVBand="0" w:oddHBand="1" w:evenHBand="0" w:firstRowFirstColumn="0" w:firstRowLastColumn="0" w:lastRowFirstColumn="0" w:lastRowLastColumn="0"/>
+            </w:pPr>
+            <w:r>
+              <w:t>input CV_8U, CV_32S, or CV_32F intensity image</w:t>
+            </w:r>
+          </w:p>
+        </w:tc>
+      </w:tr>
+      <w:tr>
+        <w:tc>
+          <w:tcPr>
+            <w:cnfStyle w:val="001000000000" w:firstRow="0" w:lastRow="0" w:firstColumn="1" w:lastColumn="0" w:oddVBand="0" w:evenVBand="0" w:oddHBand="0" w:evenHBand="0" w:firstRowFirstColumn="0" w:firstRowLastColumn="0" w:lastRowFirstColumn="0" w:lastRowLastColumn="0"/>
+            <w:tcW w:w="0" w:type="auto"/>
+          </w:tcPr>
+          <w:p>
+            <w:pPr>
+              <w:rPr>
+                <w:b w:val="0"/>
+                <w:bCs w:val="0"/>
+              </w:rPr>
+            </w:pPr>
+            <w:r>
+              <w:rPr>
+                <w:b w:val="0"/>
+                <w:bCs w:val="0"/>
+              </w:rPr>
+              <w:t>output</w:t>
+            </w:r>
+          </w:p>
+        </w:tc>
+        <w:tc>
+          <w:tcPr>
+            <w:tcW w:w="0" w:type="auto"/>
+          </w:tcPr>
+          <w:p>
+            <w:pPr>
+              <w:cnfStyle w:val="000000000000" w:firstRow="0" w:lastRow="0" w:firstColumn="0" w:lastColumn="0" w:oddVBand="0" w:evenVBand="0" w:oddHBand="0" w:evenHBand="0" w:firstRowFirstColumn="0" w:firstRowLastColumn="0" w:lastRowFirstColumn="0" w:lastRowLastColumn="0"/>
+            </w:pPr>
+            <w:r>
+              <w:t>1</w:t>
+            </w:r>
+          </w:p>
+        </w:tc>
+        <w:tc>
+          <w:tcPr>
+            <w:tcW w:w="0" w:type="auto"/>
+          </w:tcPr>
+          <w:p>
+            <w:pPr>
+              <w:cnfStyle w:val="000000000000" w:firstRow="0" w:lastRow="0" w:firstColumn="0" w:lastColumn="0" w:oddVBand="0" w:evenVBand="0" w:oddHBand="0" w:evenHBand="0" w:firstRowFirstColumn="0" w:firstRowLastColumn="0" w:lastRowFirstColumn="0" w:lastRowLastColumn="0"/>
+            </w:pPr>
+            <w:r>
+              <w:t>“image”</w:t>
+            </w:r>
+          </w:p>
+        </w:tc>
+        <w:tc>
+          <w:tcPr>
+            <w:tcW w:w="0" w:type="auto"/>
+          </w:tcPr>
+          <w:p>
+            <w:pPr>
+              <w:cnfStyle w:val="000000000000" w:firstRow="0" w:lastRow="0" w:firstColumn="0" w:lastColumn="0" w:oddVBand="0" w:evenVBand="0" w:oddHBand="0" w:evenHBand="0" w:firstRowFirstColumn="0" w:firstRowLastColumn="0" w:lastRowFirstColumn="0" w:lastRowLastColumn="0"/>
+            </w:pPr>
+            <w:r>
+              <w:t>“binary”</w:t>
+            </w:r>
+          </w:p>
+        </w:tc>
+        <w:tc>
+          <w:tcPr>
+            <w:tcW w:w="0" w:type="auto"/>
+          </w:tcPr>
+          <w:p>
+            <w:pPr>
+              <w:cnfStyle w:val="000000000000" w:firstRow="0" w:lastRow="0" w:firstColumn="0" w:lastColumn="0" w:oddVBand="0" w:evenVBand="0" w:oddHBand="0" w:evenHBand="0" w:firstRowFirstColumn="0" w:firstRowLastColumn="0" w:lastRowFirstColumn="0" w:lastRowLastColumn="0"/>
+            </w:pPr>
+            <w:r>
+              <w:t>output CV_32S, or CV_32F edge image</w:t>
+            </w:r>
+          </w:p>
+        </w:tc>
+      </w:tr>
+    </w:tbl>
+    <w:p>
+      <w:pPr>
+        <w:pStyle w:val="Normalafterlist"/>
+      </w:pPr>
+      <w:r>
+        <w:t>The parameters to the smooth average operator are:</w:t>
+      </w:r>
+    </w:p>
+    <w:tbl>
+      <w:tblPr>
+        <w:tblStyle w:val="PlainTable1"/>
+        <w:tblW w:w="0" w:type="auto"/>
+        <w:tblLook w:val="04A0" w:firstRow="1" w:lastRow="0" w:firstColumn="1" w:lastColumn="0" w:noHBand="0" w:noVBand="1"/>
+      </w:tblPr>
+      <w:tblGrid>
+        <w:gridCol w:w="1280"/>
+        <w:gridCol w:w="3286"/>
+      </w:tblGrid>
+      <w:tr>
+        <w:trPr>
+          <w:cnfStyle w:val="100000000000" w:firstRow="1" w:lastRow="0" w:firstColumn="0" w:lastColumn="0" w:oddVBand="0" w:evenVBand="0" w:oddHBand="0" w:evenHBand="0" w:firstRowFirstColumn="0" w:firstRowLastColumn="0" w:lastRowFirstColumn="0" w:lastRowLastColumn="0"/>
+          <w:cantSplit/>
+          <w:tblHeader/>
+        </w:trPr>
+        <w:tc>
+          <w:tcPr>
+            <w:cnfStyle w:val="001000000000" w:firstRow="0" w:lastRow="0" w:firstColumn="1" w:lastColumn="0" w:oddVBand="0" w:evenVBand="0" w:oddHBand="0" w:evenHBand="0" w:firstRowFirstColumn="0" w:firstRowLastColumn="0" w:lastRowFirstColumn="0" w:lastRowLastColumn="0"/>
+            <w:tcW w:w="0" w:type="auto"/>
+          </w:tcPr>
+          <w:p>
+            <w:r>
+              <w:t>parameter</w:t>
+            </w:r>
+          </w:p>
+        </w:tc>
+        <w:tc>
+          <w:tcPr>
+            <w:tcW w:w="0" w:type="auto"/>
+          </w:tcPr>
+          <w:p>
+            <w:pPr>
+              <w:cnfStyle w:val="100000000000" w:firstRow="1" w:lastRow="0" w:firstColumn="0" w:lastColumn="0" w:oddVBand="0" w:evenVBand="0" w:oddHBand="0" w:evenHBand="0" w:firstRowFirstColumn="0" w:firstRowLastColumn="0" w:lastRowFirstColumn="0" w:lastRowLastColumn="0"/>
+            </w:pPr>
+            <w:r>
+              <w:t>description</w:t>
+            </w:r>
+          </w:p>
+        </w:tc>
+      </w:tr>
+      <w:tr>
+        <w:trPr>
+          <w:cnfStyle w:val="000000100000" w:firstRow="0" w:lastRow="0" w:firstColumn="0" w:lastColumn="0" w:oddVBand="0" w:evenVBand="0" w:oddHBand="1" w:evenHBand="0" w:firstRowFirstColumn="0" w:firstRowLastColumn="0" w:lastRowFirstColumn="0" w:lastRowLastColumn="0"/>
+        </w:trPr>
+        <w:tc>
+          <w:tcPr>
+            <w:cnfStyle w:val="001000000000" w:firstRow="0" w:lastRow="0" w:firstColumn="1" w:lastColumn="0" w:oddVBand="0" w:evenVBand="0" w:oddHBand="0" w:evenHBand="0" w:firstRowFirstColumn="0" w:firstRowLastColumn="0" w:lastRowFirstColumn="0" w:lastRowLastColumn="0"/>
+            <w:tcW w:w="0" w:type="auto"/>
+          </w:tcPr>
+          <w:p>
+            <w:pPr>
+              <w:rPr>
+                <w:b w:val="0"/>
+                <w:bCs w:val="0"/>
+              </w:rPr>
+            </w:pPr>
+            <w:r>
+              <w:rPr>
+                <w:b w:val="0"/>
+                <w:bCs w:val="0"/>
+              </w:rPr>
+              <w:t>rows</w:t>
+            </w:r>
+          </w:p>
+        </w:tc>
+        <w:tc>
+          <w:tcPr>
+            <w:tcW w:w="0" w:type="auto"/>
+          </w:tcPr>
+          <w:p>
+            <w:pPr>
+              <w:cnfStyle w:val="000000100000" w:firstRow="0" w:lastRow="0" w:firstColumn="0" w:lastColumn="0" w:oddVBand="0" w:evenVBand="0" w:oddHBand="1" w:evenHBand="0" w:firstRowFirstColumn="0" w:firstRowLastColumn="0" w:lastRowFirstColumn="0" w:lastRowLastColumn="0"/>
+            </w:pPr>
+            <w:r>
+              <w:t>kernel height</w:t>
+            </w:r>
+          </w:p>
+        </w:tc>
+      </w:tr>
+      <w:tr>
+        <w:tc>
+          <w:tcPr>
+            <w:cnfStyle w:val="001000000000" w:firstRow="0" w:lastRow="0" w:firstColumn="1" w:lastColumn="0" w:oddVBand="0" w:evenVBand="0" w:oddHBand="0" w:evenHBand="0" w:firstRowFirstColumn="0" w:firstRowLastColumn="0" w:lastRowFirstColumn="0" w:lastRowLastColumn="0"/>
+            <w:tcW w:w="0" w:type="auto"/>
+          </w:tcPr>
+          <w:p>
+            <w:pPr>
+              <w:rPr>
+                <w:b w:val="0"/>
+                <w:bCs w:val="0"/>
+              </w:rPr>
+            </w:pPr>
+            <w:r>
+              <w:rPr>
+                <w:b w:val="0"/>
+                <w:bCs w:val="0"/>
+              </w:rPr>
+              <w:t>cols</w:t>
+            </w:r>
+          </w:p>
+        </w:tc>
+        <w:tc>
+          <w:tcPr>
+            <w:tcW w:w="0" w:type="auto"/>
+          </w:tcPr>
+          <w:p>
+            <w:pPr>
+              <w:cnfStyle w:val="000000000000" w:firstRow="0" w:lastRow="0" w:firstColumn="0" w:lastColumn="0" w:oddVBand="0" w:evenVBand="0" w:oddHBand="0" w:evenHBand="0" w:firstRowFirstColumn="0" w:firstRowLastColumn="0" w:lastRowFirstColumn="0" w:lastRowLastColumn="0"/>
+            </w:pPr>
+            <w:r>
+              <w:t>kernel width</w:t>
+            </w:r>
+          </w:p>
+        </w:tc>
+      </w:tr>
+      <w:tr>
+        <w:trPr>
+          <w:cnfStyle w:val="000000100000" w:firstRow="0" w:lastRow="0" w:firstColumn="0" w:lastColumn="0" w:oddVBand="0" w:evenVBand="0" w:oddHBand="1" w:evenHBand="0" w:firstRowFirstColumn="0" w:firstRowLastColumn="0" w:lastRowFirstColumn="0" w:lastRowLastColumn="0"/>
+        </w:trPr>
+        <w:tc>
+          <w:tcPr>
+            <w:cnfStyle w:val="001000000000" w:firstRow="0" w:lastRow="0" w:firstColumn="1" w:lastColumn="0" w:oddVBand="0" w:evenVBand="0" w:oddHBand="0" w:evenHBand="0" w:firstRowFirstColumn="0" w:firstRowLastColumn="0" w:lastRowFirstColumn="0" w:lastRowLastColumn="0"/>
+            <w:tcW w:w="0" w:type="auto"/>
+          </w:tcPr>
+          <w:p>
+            <w:pPr>
+              <w:rPr>
+                <w:b w:val="0"/>
+                <w:bCs w:val="0"/>
+              </w:rPr>
+            </w:pPr>
+            <w:r>
+              <w:rPr>
+                <w:b w:val="0"/>
+                <w:bCs w:val="0"/>
+              </w:rPr>
+              <w:t>sigma-x</w:t>
+            </w:r>
+          </w:p>
+        </w:tc>
+        <w:tc>
+          <w:tcPr>
+            <w:tcW w:w="0" w:type="auto"/>
+          </w:tcPr>
+          <w:p>
+            <w:pPr>
+              <w:cnfStyle w:val="000000100000" w:firstRow="0" w:lastRow="0" w:firstColumn="0" w:lastColumn="0" w:oddVBand="0" w:evenVBand="0" w:oddHBand="1" w:evenHBand="0" w:firstRowFirstColumn="0" w:firstRowLastColumn="0" w:lastRowFirstColumn="0" w:lastRowLastColumn="0"/>
+            </w:pPr>
+            <w:r>
+              <w:t>x direction variance square root</w:t>
+            </w:r>
+          </w:p>
+        </w:tc>
+      </w:tr>
+      <w:tr>
+        <w:tc>
+          <w:tcPr>
+            <w:cnfStyle w:val="001000000000" w:firstRow="0" w:lastRow="0" w:firstColumn="1" w:lastColumn="0" w:oddVBand="0" w:evenVBand="0" w:oddHBand="0" w:evenHBand="0" w:firstRowFirstColumn="0" w:firstRowLastColumn="0" w:lastRowFirstColumn="0" w:lastRowLastColumn="0"/>
+            <w:tcW w:w="0" w:type="auto"/>
+          </w:tcPr>
+          <w:p>
+            <w:pPr>
+              <w:rPr>
+                <w:b w:val="0"/>
+                <w:bCs w:val="0"/>
+              </w:rPr>
+            </w:pPr>
+            <w:r>
+              <w:rPr>
+                <w:b w:val="0"/>
+                <w:bCs w:val="0"/>
+              </w:rPr>
+              <w:t>sigma-y</w:t>
+            </w:r>
+          </w:p>
+        </w:tc>
+        <w:tc>
+          <w:tcPr>
+            <w:tcW w:w="0" w:type="auto"/>
+          </w:tcPr>
+          <w:p>
+            <w:pPr>
+              <w:cnfStyle w:val="000000000000" w:firstRow="0" w:lastRow="0" w:firstColumn="0" w:lastColumn="0" w:oddVBand="0" w:evenVBand="0" w:oddHBand="0" w:evenHBand="0" w:firstRowFirstColumn="0" w:firstRowLastColumn="0" w:lastRowFirstColumn="0" w:lastRowLastColumn="0"/>
+            </w:pPr>
+            <w:r>
+              <w:t>y direction variance</w:t>
+            </w:r>
+            <w:r>
+              <w:t xml:space="preserve"> square root</w:t>
+            </w:r>
+          </w:p>
+        </w:tc>
+      </w:tr>
+    </w:tbl>
+    <w:p>
+      <w:pPr>
+        <w:pStyle w:val="Normalafterlist"/>
+      </w:pPr>
+      <w:r>
+        <w:t>The experiment log output includes the output image pixel statistics:</w:t>
+      </w:r>
+    </w:p>
+    <w:tbl>
+      <w:tblPr>
+        <w:tblStyle w:val="PlainTable1"/>
+        <w:tblW w:w="0" w:type="auto"/>
+        <w:tblLook w:val="04A0" w:firstRow="1" w:lastRow="0" w:firstColumn="1" w:lastColumn="0" w:noHBand="0" w:noVBand="1"/>
+      </w:tblPr>
+      <w:tblGrid>
+        <w:gridCol w:w="2108"/>
+        <w:gridCol w:w="7242"/>
+      </w:tblGrid>
+      <w:tr>
+        <w:trPr>
+          <w:cnfStyle w:val="100000000000" w:firstRow="1" w:lastRow="0" w:firstColumn="0" w:lastColumn="0" w:oddVBand="0" w:evenVBand="0" w:oddHBand="0" w:evenHBand="0" w:firstRowFirstColumn="0" w:firstRowLastColumn="0" w:lastRowFirstColumn="0" w:lastRowLastColumn="0"/>
+          <w:cantSplit/>
+          <w:tblHeader/>
+        </w:trPr>
+        <w:tc>
+          <w:tcPr>
+            <w:cnfStyle w:val="001000000000" w:firstRow="0" w:lastRow="0" w:firstColumn="1" w:lastColumn="0" w:oddVBand="0" w:evenVBand="0" w:oddHBand="0" w:evenHBand="0" w:firstRowFirstColumn="0" w:firstRowLastColumn="0" w:lastRowFirstColumn="0" w:lastRowLastColumn="0"/>
+            <w:tcW w:w="0" w:type="auto"/>
+          </w:tcPr>
+          <w:p>
+            <w:pPr>
+              <w:pStyle w:val="NoSpacing"/>
+            </w:pPr>
+            <w:r>
+              <w:t>Field</w:t>
+            </w:r>
+          </w:p>
+        </w:tc>
+        <w:tc>
+          <w:tcPr>
+            <w:tcW w:w="0" w:type="auto"/>
+          </w:tcPr>
+          <w:p>
+            <w:pPr>
+              <w:pStyle w:val="NoSpacing"/>
+              <w:cnfStyle w:val="100000000000" w:firstRow="1" w:lastRow="0" w:firstColumn="0" w:lastColumn="0" w:oddVBand="0" w:evenVBand="0" w:oddHBand="0" w:evenHBand="0" w:firstRowFirstColumn="0" w:firstRowLastColumn="0" w:lastRowFirstColumn="0" w:lastRowLastColumn="0"/>
+            </w:pPr>
+            <w:r>
+              <w:t>Description</w:t>
+            </w:r>
+          </w:p>
+        </w:tc>
+      </w:tr>
+      <w:tr>
+        <w:trPr>
+          <w:cnfStyle w:val="000000100000" w:firstRow="0" w:lastRow="0" w:firstColumn="0" w:lastColumn="0" w:oddVBand="0" w:evenVBand="0" w:oddHBand="1" w:evenHBand="0" w:firstRowFirstColumn="0" w:firstRowLastColumn="0" w:lastRowFirstColumn="0" w:lastRowLastColumn="0"/>
+        </w:trPr>
+        <w:tc>
+          <w:tcPr>
+            <w:cnfStyle w:val="001000000000" w:firstRow="0" w:lastRow="0" w:firstColumn="1" w:lastColumn="0" w:oddVBand="0" w:evenVBand="0" w:oddHBand="0" w:evenHBand="0" w:firstRowFirstColumn="0" w:firstRowLastColumn="0" w:lastRowFirstColumn="0" w:lastRowLastColumn="0"/>
+            <w:tcW w:w="0" w:type="auto"/>
+          </w:tcPr>
+          <w:p>
+            <w:pPr>
+              <w:pStyle w:val="NoSpacing"/>
+              <w:rPr>
+                <w:b w:val="0"/>
+                <w:bCs w:val="0"/>
+              </w:rPr>
+            </w:pPr>
+            <w:r>
+              <w:rPr>
+                <w:b w:val="0"/>
+                <w:bCs w:val="0"/>
+              </w:rPr>
+              <w:t>rows</w:t>
+            </w:r>
+          </w:p>
+        </w:tc>
+        <w:tc>
+          <w:tcPr>
+            <w:tcW w:w="0" w:type="auto"/>
+          </w:tcPr>
+          <w:p>
+            <w:pPr>
+              <w:pStyle w:val="NoSpacing"/>
+              <w:cnfStyle w:val="000000100000" w:firstRow="0" w:lastRow="0" w:firstColumn="0" w:lastColumn="0" w:oddVBand="0" w:evenVBand="0" w:oddHBand="1" w:evenHBand="0" w:firstRowFirstColumn="0" w:firstRowLastColumn="0" w:lastRowFirstColumn="0" w:lastRowLastColumn="0"/>
+            </w:pPr>
+            <w:r>
+              <w:t>The number of image rows</w:t>
+            </w:r>
+          </w:p>
+        </w:tc>
+      </w:tr>
+      <w:tr>
+        <w:tc>
+          <w:tcPr>
+            <w:cnfStyle w:val="001000000000" w:firstRow="0" w:lastRow="0" w:firstColumn="1" w:lastColumn="0" w:oddVBand="0" w:evenVBand="0" w:oddHBand="0" w:evenHBand="0" w:firstRowFirstColumn="0" w:firstRowLastColumn="0" w:lastRowFirstColumn="0" w:lastRowLastColumn="0"/>
+            <w:tcW w:w="0" w:type="auto"/>
+          </w:tcPr>
+          <w:p>
+            <w:pPr>
+              <w:pStyle w:val="NoSpacing"/>
+              <w:rPr>
+                <w:b w:val="0"/>
+                <w:bCs w:val="0"/>
+              </w:rPr>
+            </w:pPr>
+            <w:r>
+              <w:rPr>
+                <w:b w:val="0"/>
+                <w:bCs w:val="0"/>
+              </w:rPr>
+              <w:t>cols</w:t>
+            </w:r>
+          </w:p>
+        </w:tc>
+        <w:tc>
+          <w:tcPr>
+            <w:tcW w:w="0" w:type="auto"/>
+          </w:tcPr>
+          <w:p>
+            <w:pPr>
+              <w:pStyle w:val="NoSpacing"/>
+              <w:cnfStyle w:val="000000000000" w:firstRow="0" w:lastRow="0" w:firstColumn="0" w:lastColumn="0" w:oddVBand="0" w:evenVBand="0" w:oddHBand="0" w:evenHBand="0" w:firstRowFirstColumn="0" w:firstRowLastColumn="0" w:lastRowFirstColumn="0" w:lastRowLastColumn="0"/>
+            </w:pPr>
+            <w:r>
+              <w:t>The number of image columns</w:t>
+            </w:r>
+          </w:p>
+        </w:tc>
+      </w:tr>
+      <w:tr>
+        <w:trPr>
+          <w:cnfStyle w:val="000000100000" w:firstRow="0" w:lastRow="0" w:firstColumn="0" w:lastColumn="0" w:oddVBand="0" w:evenVBand="0" w:oddHBand="1" w:evenHBand="0" w:firstRowFirstColumn="0" w:firstRowLastColumn="0" w:lastRowFirstColumn="0" w:lastRowLastColumn="0"/>
+        </w:trPr>
+        <w:tc>
+          <w:tcPr>
+            <w:cnfStyle w:val="001000000000" w:firstRow="0" w:lastRow="0" w:firstColumn="1" w:lastColumn="0" w:oddVBand="0" w:evenVBand="0" w:oddHBand="0" w:evenHBand="0" w:firstRowFirstColumn="0" w:firstRowLastColumn="0" w:lastRowFirstColumn="0" w:lastRowLastColumn="0"/>
+            <w:tcW w:w="0" w:type="auto"/>
+          </w:tcPr>
+          <w:p>
+            <w:pPr>
+              <w:pStyle w:val="NoSpacing"/>
+              <w:rPr>
+                <w:b w:val="0"/>
+                <w:bCs w:val="0"/>
+              </w:rPr>
+            </w:pPr>
+            <w:r>
+              <w:rPr>
+                <w:b w:val="0"/>
+                <w:bCs w:val="0"/>
+              </w:rPr>
+              <w:t>components</w:t>
+            </w:r>
+          </w:p>
+        </w:tc>
+        <w:tc>
+          <w:tcPr>
+            <w:tcW w:w="0" w:type="auto"/>
+          </w:tcPr>
+          <w:p>
+            <w:pPr>
+              <w:pStyle w:val="NoSpacing"/>
+              <w:cnfStyle w:val="000000100000" w:firstRow="0" w:lastRow="0" w:firstColumn="0" w:lastColumn="0" w:oddVBand="0" w:evenVBand="0" w:oddHBand="1" w:evenHBand="0" w:firstRowFirstColumn="0" w:firstRowLastColumn="0" w:lastRowFirstColumn="0" w:lastRowLastColumn="0"/>
+            </w:pPr>
+            <w:r>
+              <w:t>The number of image components. Grayscale images have 1 component, color images have 3 components.</w:t>
+            </w:r>
+          </w:p>
+        </w:tc>
+      </w:tr>
+      <w:tr>
+        <w:tc>
+          <w:tcPr>
+            <w:cnfStyle w:val="001000000000" w:firstRow="0" w:lastRow="0" w:firstColumn="1" w:lastColumn="0" w:oddVBand="0" w:evenVBand="0" w:oddHBand="0" w:evenHBand="0" w:firstRowFirstColumn="0" w:firstRowLastColumn="0" w:lastRowFirstColumn="0" w:lastRowLastColumn="0"/>
+            <w:tcW w:w="0" w:type="auto"/>
+          </w:tcPr>
+          <w:p>
+            <w:pPr>
+              <w:pStyle w:val="NoSpacing"/>
+              <w:rPr>
+                <w:b w:val="0"/>
+                <w:bCs w:val="0"/>
+              </w:rPr>
+            </w:pPr>
+            <w:r>
+              <w:rPr>
+                <w:b w:val="0"/>
+                <w:bCs w:val="0"/>
+              </w:rPr>
+              <w:t>depth</w:t>
+            </w:r>
+          </w:p>
+        </w:tc>
+        <w:tc>
+          <w:tcPr>
+            <w:tcW w:w="0" w:type="auto"/>
+          </w:tcPr>
+          <w:p>
+            <w:pPr>
+              <w:pStyle w:val="NoSpacing"/>
+              <w:cnfStyle w:val="000000000000" w:firstRow="0" w:lastRow="0" w:firstColumn="0" w:lastColumn="0" w:oddVBand="0" w:evenVBand="0" w:oddHBand="0" w:evenHBand="0" w:firstRowFirstColumn="0" w:firstRowLastColumn="0" w:lastRowFirstColumn="0" w:lastRowLastColumn="0"/>
+            </w:pPr>
+            <w:r>
+              <w:t>Pixel value data type.</w:t>
+            </w:r>
+          </w:p>
+          <w:p>
+            <w:pPr>
+              <w:pStyle w:val="tablebullet"/>
+              <w:cnfStyle w:val="000000000000" w:firstRow="0" w:lastRow="0" w:firstColumn="0" w:lastColumn="0" w:oddVBand="0" w:evenVBand="0" w:oddHBand="0" w:evenHBand="0" w:firstRowFirstColumn="0" w:firstRowLastColumn="0" w:lastRowFirstColumn="0" w:lastRowLastColumn="0"/>
+              <w:rPr>
+                <w:sz w:val="20"/>
+                <w:szCs w:val="20"/>
+              </w:rPr>
+            </w:pPr>
+            <w:r>
+              <w:rPr>
+                <w:sz w:val="20"/>
+                <w:szCs w:val="20"/>
+              </w:rPr>
+              <w:t xml:space="preserve">CV_8U </w:t>
+            </w:r>
+          </w:p>
+          <w:p>
+            <w:pPr>
+              <w:pStyle w:val="tablebullet"/>
+              <w:cnfStyle w:val="000000000000" w:firstRow="0" w:lastRow="0" w:firstColumn="0" w:lastColumn="0" w:oddVBand="0" w:evenVBand="0" w:oddHBand="0" w:evenHBand="0" w:firstRowFirstColumn="0" w:firstRowLastColumn="0" w:lastRowFirstColumn="0" w:lastRowLastColumn="0"/>
+              <w:rPr>
+                <w:sz w:val="20"/>
+                <w:szCs w:val="20"/>
+              </w:rPr>
+            </w:pPr>
+            <w:r>
+              <w:rPr>
+                <w:sz w:val="20"/>
+                <w:szCs w:val="20"/>
+              </w:rPr>
+              <w:t>CV_32S</w:t>
+            </w:r>
+          </w:p>
+          <w:p>
+            <w:pPr>
+              <w:pStyle w:val="tablebullet"/>
+              <w:cnfStyle w:val="000000000000" w:firstRow="0" w:lastRow="0" w:firstColumn="0" w:lastColumn="0" w:oddVBand="0" w:evenVBand="0" w:oddHBand="0" w:evenHBand="0" w:firstRowFirstColumn="0" w:firstRowLastColumn="0" w:lastRowFirstColumn="0" w:lastRowLastColumn="0"/>
+            </w:pPr>
+            <w:r>
+              <w:rPr>
+                <w:sz w:val="20"/>
+                <w:szCs w:val="20"/>
+              </w:rPr>
+              <w:t>CV_32F</w:t>
+            </w:r>
+          </w:p>
+        </w:tc>
+      </w:tr>
+      <w:tr>
+        <w:trPr>
+          <w:cnfStyle w:val="000000100000" w:firstRow="0" w:lastRow="0" w:firstColumn="0" w:lastColumn="0" w:oddVBand="0" w:evenVBand="0" w:oddHBand="1" w:evenHBand="0" w:firstRowFirstColumn="0" w:firstRowLastColumn="0" w:lastRowFirstColumn="0" w:lastRowLastColumn="0"/>
+        </w:trPr>
+        <w:tc>
+          <w:tcPr>
+            <w:cnfStyle w:val="001000000000" w:firstRow="0" w:lastRow="0" w:firstColumn="1" w:lastColumn="0" w:oddVBand="0" w:evenVBand="0" w:oddHBand="0" w:evenHBand="0" w:firstRowFirstColumn="0" w:firstRowLastColumn="0" w:lastRowFirstColumn="0" w:lastRowLastColumn="0"/>
+            <w:tcW w:w="0" w:type="auto"/>
+          </w:tcPr>
+          <w:p>
+            <w:pPr>
+              <w:pStyle w:val="NoSpacing"/>
+              <w:rPr>
+                <w:b w:val="0"/>
+                <w:bCs w:val="0"/>
+              </w:rPr>
+            </w:pPr>
+            <w:r>
+              <w:rPr>
+                <w:b w:val="0"/>
+                <w:bCs w:val="0"/>
+              </w:rPr>
+              <w:t>pixel count</w:t>
+            </w:r>
+          </w:p>
+        </w:tc>
+        <w:tc>
+          <w:tcPr>
+            <w:tcW w:w="0" w:type="auto"/>
+          </w:tcPr>
+          <w:p>
+            <w:pPr>
+              <w:pStyle w:val="NoSpacing"/>
+              <w:cnfStyle w:val="000000100000" w:firstRow="0" w:lastRow="0" w:firstColumn="0" w:lastColumn="0" w:oddVBand="0" w:evenVBand="0" w:oddHBand="1" w:evenHBand="0" w:firstRowFirstColumn="0" w:firstRowLastColumn="0" w:lastRowFirstColumn="0" w:lastRowLastColumn="0"/>
+            </w:pPr>
+            <w:r>
+              <w:t>image rows * cols * components</w:t>
+            </w:r>
+          </w:p>
+        </w:tc>
+      </w:tr>
+      <w:tr>
+        <w:tc>
+          <w:tcPr>
+            <w:cnfStyle w:val="001000000000" w:firstRow="0" w:lastRow="0" w:firstColumn="1" w:lastColumn="0" w:oddVBand="0" w:evenVBand="0" w:oddHBand="0" w:evenHBand="0" w:firstRowFirstColumn="0" w:firstRowLastColumn="0" w:lastRowFirstColumn="0" w:lastRowLastColumn="0"/>
+            <w:tcW w:w="0" w:type="auto"/>
+          </w:tcPr>
+          <w:p>
+            <w:pPr>
+              <w:pStyle w:val="NoSpacing"/>
+              <w:rPr>
+                <w:b w:val="0"/>
+                <w:bCs w:val="0"/>
+              </w:rPr>
+            </w:pPr>
+            <w:r>
+              <w:rPr>
+                <w:b w:val="0"/>
+                <w:bCs w:val="0"/>
+              </w:rPr>
+              <w:t>pixel mean</w:t>
+            </w:r>
+          </w:p>
+        </w:tc>
+        <w:tc>
+          <w:tcPr>
+            <w:tcW w:w="0" w:type="auto"/>
+          </w:tcPr>
+          <w:p>
+            <w:pPr>
+              <w:pStyle w:val="NoSpacing"/>
+              <w:cnfStyle w:val="000000000000" w:firstRow="0" w:lastRow="0" w:firstColumn="0" w:lastColumn="0" w:oddVBand="0" w:evenVBand="0" w:oddHBand="0" w:evenHBand="0" w:firstRowFirstColumn="0" w:firstRowLastColumn="0" w:lastRowFirstColumn="0" w:lastRowLastColumn="0"/>
+            </w:pPr>
+            <w:r>
+              <w:t xml:space="preserve">pixel value mean </w:t>
+            </w:r>
+          </w:p>
+        </w:tc>
+      </w:tr>
+      <w:tr>
+        <w:trPr>
+          <w:cnfStyle w:val="000000100000" w:firstRow="0" w:lastRow="0" w:firstColumn="0" w:lastColumn="0" w:oddVBand="0" w:evenVBand="0" w:oddHBand="1" w:evenHBand="0" w:firstRowFirstColumn="0" w:firstRowLastColumn="0" w:lastRowFirstColumn="0" w:lastRowLastColumn="0"/>
+        </w:trPr>
+        <w:tc>
+          <w:tcPr>
+            <w:cnfStyle w:val="001000000000" w:firstRow="0" w:lastRow="0" w:firstColumn="1" w:lastColumn="0" w:oddVBand="0" w:evenVBand="0" w:oddHBand="0" w:evenHBand="0" w:firstRowFirstColumn="0" w:firstRowLastColumn="0" w:lastRowFirstColumn="0" w:lastRowLastColumn="0"/>
+            <w:tcW w:w="0" w:type="auto"/>
+          </w:tcPr>
+          <w:p>
+            <w:pPr>
+              <w:pStyle w:val="NoSpacing"/>
+              <w:rPr>
+                <w:b w:val="0"/>
+                <w:bCs w:val="0"/>
+              </w:rPr>
+            </w:pPr>
+            <w:r>
+              <w:rPr>
+                <w:b w:val="0"/>
+                <w:bCs w:val="0"/>
+              </w:rPr>
+              <w:t>pixel standard deviation</w:t>
+            </w:r>
+          </w:p>
+        </w:tc>
+        <w:tc>
+          <w:tcPr>
+            <w:tcW w:w="0" w:type="auto"/>
+          </w:tcPr>
+          <w:p>
+            <w:pPr>
+              <w:pStyle w:val="NoSpacing"/>
+              <w:cnfStyle w:val="000000100000" w:firstRow="0" w:lastRow="0" w:firstColumn="0" w:lastColumn="0" w:oddVBand="0" w:evenVBand="0" w:oddHBand="1" w:evenHBand="0" w:firstRowFirstColumn="0" w:firstRowLastColumn="0" w:lastRowFirstColumn="0" w:lastRowLastColumn="0"/>
+            </w:pPr>
+            <w:r>
+              <w:t>pixel value standard deviation</w:t>
+            </w:r>
+          </w:p>
+        </w:tc>
+      </w:tr>
+      <w:tr>
+        <w:tc>
+          <w:tcPr>
+            <w:cnfStyle w:val="001000000000" w:firstRow="0" w:lastRow="0" w:firstColumn="1" w:lastColumn="0" w:oddVBand="0" w:evenVBand="0" w:oddHBand="0" w:evenHBand="0" w:firstRowFirstColumn="0" w:firstRowLastColumn="0" w:lastRowFirstColumn="0" w:lastRowLastColumn="0"/>
+            <w:tcW w:w="0" w:type="auto"/>
+          </w:tcPr>
+          <w:p>
+            <w:pPr>
+              <w:pStyle w:val="NoSpacing"/>
+              <w:rPr>
+                <w:b w:val="0"/>
+                <w:bCs w:val="0"/>
+              </w:rPr>
+            </w:pPr>
+            <w:r>
+              <w:rPr>
+                <w:b w:val="0"/>
+                <w:bCs w:val="0"/>
+              </w:rPr>
+              <w:t>min pixel value</w:t>
+            </w:r>
+          </w:p>
+        </w:tc>
+        <w:tc>
+          <w:tcPr>
+            <w:tcW w:w="0" w:type="auto"/>
+          </w:tcPr>
+          <w:p>
+            <w:pPr>
+              <w:pStyle w:val="NoSpacing"/>
+              <w:cnfStyle w:val="000000000000" w:firstRow="0" w:lastRow="0" w:firstColumn="0" w:lastColumn="0" w:oddVBand="0" w:evenVBand="0" w:oddHBand="0" w:evenHBand="0" w:firstRowFirstColumn="0" w:firstRowLastColumn="0" w:lastRowFirstColumn="0" w:lastRowLastColumn="0"/>
+            </w:pPr>
+            <w:r>
+              <w:t>minimum pixel value</w:t>
+            </w:r>
+          </w:p>
+        </w:tc>
+      </w:tr>
+      <w:tr>
+        <w:trPr>
+          <w:cnfStyle w:val="000000100000" w:firstRow="0" w:lastRow="0" w:firstColumn="0" w:lastColumn="0" w:oddVBand="0" w:evenVBand="0" w:oddHBand="1" w:evenHBand="0" w:firstRowFirstColumn="0" w:firstRowLastColumn="0" w:lastRowFirstColumn="0" w:lastRowLastColumn="0"/>
+        </w:trPr>
+        <w:tc>
+          <w:tcPr>
+            <w:cnfStyle w:val="001000000000" w:firstRow="0" w:lastRow="0" w:firstColumn="1" w:lastColumn="0" w:oddVBand="0" w:evenVBand="0" w:oddHBand="0" w:evenHBand="0" w:firstRowFirstColumn="0" w:firstRowLastColumn="0" w:lastRowFirstColumn="0" w:lastRowLastColumn="0"/>
+            <w:tcW w:w="0" w:type="auto"/>
+          </w:tcPr>
+          <w:p>
+            <w:pPr>
+              <w:pStyle w:val="NoSpacing"/>
+              <w:rPr>
+                <w:b w:val="0"/>
+                <w:bCs w:val="0"/>
+              </w:rPr>
+            </w:pPr>
+            <w:r>
+              <w:rPr>
+                <w:b w:val="0"/>
+                <w:bCs w:val="0"/>
+              </w:rPr>
+              <w:t>max pixel value</w:t>
+            </w:r>
+          </w:p>
+        </w:tc>
+        <w:tc>
+          <w:tcPr>
+            <w:tcW w:w="0" w:type="auto"/>
+          </w:tcPr>
+          <w:p>
+            <w:pPr>
+              <w:pStyle w:val="NoSpacing"/>
+              <w:cnfStyle w:val="000000100000" w:firstRow="0" w:lastRow="0" w:firstColumn="0" w:lastColumn="0" w:oddVBand="0" w:evenVBand="0" w:oddHBand="1" w:evenHBand="0" w:firstRowFirstColumn="0" w:firstRowLastColumn="0" w:lastRowFirstColumn="0" w:lastRowLastColumn="0"/>
+            </w:pPr>
+            <w:r>
+              <w:t>maximum pixel value</w:t>
+            </w:r>
+          </w:p>
+        </w:tc>
+      </w:tr>
+    </w:tbl>
+    <w:p/>
     <w:p>
       <w:pPr>
         <w:pStyle w:val="Heading2"/>
@@ -24962,7 +27610,7 @@
       <w:rPr>
         <w:noProof/>
       </w:rPr>
-      <w:t>8/16/2022 4:44 PM</w:t>
+      <w:t>8/17/2022 4:17 PM</w:t>
     </w:r>
     <w:r>
       <w:fldChar w:fldCharType="end"/>
@@ -25034,7 +27682,7 @@
           <w:rPr>
             <w:noProof/>
           </w:rPr>
-          <w:t>8/16/2022 4:44 PM</w:t>
+          <w:t>8/17/2022 4:17 PM</w:t>
         </w:r>
         <w:r>
           <w:fldChar w:fldCharType="end"/>
@@ -29522,7 +32170,6 @@
   <w:style w:type="character" w:default="1" w:styleId="DefaultParagraphFont">
     <w:name w:val="Default Paragraph Font"/>
     <w:uiPriority w:val="1"/>
-    <w:semiHidden/>
     <w:unhideWhenUsed/>
   </w:style>
   <w:style w:type="table" w:default="1" w:styleId="TableNormal">

</xml_diff>

<commit_message>
old lenovo update cv-workbench.docx
</commit_message>
<xml_diff>
--- a/doc/cv-workbench.docx
+++ b/doc/cv-workbench.docx
@@ -30,6 +30,9 @@
     <w:p>
       <w:r>
         <w:t>The CV-Workbench is a framework to perform image processing experiments using scripts. Users define scripts that are experiments with multiple image processing operator steps that process input data and store outputs. Scripts allow easily reproducing experiments with different data. The advantages of the system are:</w:t>
+      </w:r>
+      <w:r>
+        <w:t>s</w:t>
       </w:r>
     </w:p>
     <w:p>
@@ -176,6 +179,7 @@
         <w:pStyle w:val="Heading1"/>
       </w:pPr>
       <w:r>
+        <w:lastRenderedPageBreak/>
         <w:t>Operators</w:t>
       </w:r>
     </w:p>
@@ -1054,6 +1058,7 @@
         </w:numPr>
       </w:pPr>
       <w:r>
+        <w:lastRenderedPageBreak/>
         <w:t xml:space="preserve">One or more output image or other types of data </w:t>
       </w:r>
     </w:p>
@@ -1912,6 +1917,7 @@
         <w:pStyle w:val="Heading2"/>
       </w:pPr>
       <w:r>
+        <w:lastRenderedPageBreak/>
         <w:t>Histogram data type format</w:t>
       </w:r>
     </w:p>
@@ -2525,6 +2531,7 @@
       </w:pPr>
       <w:bookmarkStart w:id="1" w:name="_Ref108779080"/>
       <w:r>
+        <w:lastRenderedPageBreak/>
         <w:t>Hough accumulator data type format</w:t>
       </w:r>
       <w:bookmarkEnd w:id="1"/>
@@ -3086,6 +3093,7 @@
       </w:pPr>
       <w:bookmarkStart w:id="2" w:name="_Ref110426442"/>
       <w:r>
+        <w:lastRenderedPageBreak/>
         <w:t>Hough peak line data type format</w:t>
       </w:r>
       <w:bookmarkEnd w:id="2"/>
@@ -3847,6 +3855,7 @@
           <w:sz w:val="16"/>
           <w:szCs w:val="16"/>
         </w:rPr>
+        <w:lastRenderedPageBreak/>
         <w:t xml:space="preserve">        "operator": "</w:t>
       </w:r>
       <w:r>
@@ -4685,6 +4694,7 @@
         <w:pStyle w:val="Normalafterlist"/>
       </w:pPr>
       <w:r>
+        <w:lastRenderedPageBreak/>
         <w:t>The filesystem data repository supports all data types and data formats listed above. The file path associated with the data descriptor is “</w:t>
       </w:r>
       <w:r>
@@ -5599,6 +5609,7 @@
         <w:pStyle w:val="Normalafterlist"/>
       </w:pPr>
       <w:r>
+        <w:lastRenderedPageBreak/>
         <w:t xml:space="preserve">The </w:t>
       </w:r>
       <w:r>
@@ -6413,6 +6424,7 @@
         <w:pStyle w:val="Normalafterlist"/>
       </w:pPr>
       <w:r>
+        <w:lastRenderedPageBreak/>
         <w:t>The significant elements of the script are:</w:t>
       </w:r>
     </w:p>
@@ -7500,6 +7512,7 @@
           </w:tcPr>
           <w:p>
             <w:r>
+              <w:lastRenderedPageBreak/>
               <w:t>Script segment</w:t>
             </w:r>
           </w:p>
@@ -9329,6 +9342,7 @@
                 <w:b w:val="0"/>
                 <w:bCs w:val="0"/>
               </w:rPr>
+              <w:lastRenderedPageBreak/>
               <w:t>Transform</w:t>
             </w:r>
           </w:p>
@@ -10599,6 +10613,7 @@
         <w:pStyle w:val="Normalafterlist"/>
       </w:pPr>
       <w:r>
+        <w:lastRenderedPageBreak/>
         <w:t>The experiment log output includes the output image pixel statistics:</w:t>
       </w:r>
     </w:p>
@@ -11777,6 +11792,7 @@
                 <w:sz w:val="20"/>
                 <w:szCs w:val="20"/>
               </w:rPr>
+              <w:lastRenderedPageBreak/>
               <w:t>CV_32S</w:t>
             </w:r>
           </w:p>
@@ -11817,6 +11833,7 @@
                 <w:b w:val="0"/>
                 <w:bCs w:val="0"/>
               </w:rPr>
+              <w:lastRenderedPageBreak/>
               <w:t>pixel count</w:t>
             </w:r>
           </w:p>
@@ -12930,6 +12947,7 @@
         <w:pStyle w:val="Heading2"/>
       </w:pPr>
       <w:r>
+        <w:lastRenderedPageBreak/>
         <w:t>filter-edge-sobel Operator</w:t>
       </w:r>
     </w:p>
@@ -14097,6 +14115,7 @@
                 <w:b w:val="0"/>
                 <w:bCs w:val="0"/>
               </w:rPr>
+              <w:lastRenderedPageBreak/>
               <w:t>Closing</w:t>
             </w:r>
           </w:p>
@@ -15274,6 +15293,7 @@
         <w:pStyle w:val="Heading2"/>
       </w:pPr>
       <w:r>
+        <w:lastRenderedPageBreak/>
         <w:t>histogram-hough-create Operator</w:t>
       </w:r>
     </w:p>
@@ -16385,6 +16405,7 @@
         <w:pStyle w:val="Normalafterlist"/>
       </w:pPr>
       <w:r>
+        <w:lastRenderedPageBreak/>
         <w:t xml:space="preserve">For text output format, the output data descriptor extension is ignored. The output text file has the extension “.txt” and the output gnuplot script has the extension “.gp” as described in section </w:t>
       </w:r>
       <w:r>
@@ -17703,6 +17724,7 @@
         <w:pStyle w:val="Heading2"/>
       </w:pPr>
       <w:r>
+        <w:lastRenderedPageBreak/>
         <w:t>hough-peak-detect Operator</w:t>
       </w:r>
     </w:p>
@@ -18746,6 +18768,7 @@
                 <w:b w:val="0"/>
                 <w:bCs w:val="0"/>
               </w:rPr>
+              <w:lastRenderedPageBreak/>
               <w:t>out-component</w:t>
             </w:r>
           </w:p>
@@ -19865,6 +19888,7 @@
                 <w:b w:val="0"/>
                 <w:bCs w:val="0"/>
               </w:rPr>
+              <w:lastRenderedPageBreak/>
               <w:t>bin mean</w:t>
             </w:r>
           </w:p>
@@ -20843,6 +20867,7 @@
           </w:tcPr>
           <w:p>
             <w:r>
+              <w:lastRenderedPageBreak/>
               <w:t>in_component</w:t>
             </w:r>
           </w:p>
@@ -21679,41 +21704,8 @@
       </w:r>
     </w:p>
     <w:p>
-      <w:pPr>
-        <w:cnfStyle w:val="100000000000" w:firstRow="1" w:lastRow="0" w:firstColumn="0" w:lastColumn="0" w:oddVBand="0" w:evenVBand="0" w:oddHBand="0" w:evenHBand="0" w:firstRowFirstColumn="0" w:firstRowLastColumn="0" w:lastRowFirstColumn="0" w:lastRowLastColumn="0"/>
-      </w:pPr>
-      <w:r>
-        <w:t>The transform image create operator c</w:t>
-      </w:r>
-      <w:r>
-        <w:t>reate</w:t>
-      </w:r>
-      <w:r>
-        <w:t>s a</w:t>
-      </w:r>
-      <w:r>
-        <w:t xml:space="preserve"> test image from text file or from scratch</w:t>
-      </w:r>
-      <w:r>
-        <w:t>,</w:t>
-      </w:r>
-      <w:r>
-        <w:t xml:space="preserve"> optionally with superimposed features</w:t>
-      </w:r>
-      <w:r>
-        <w:t xml:space="preserve">. </w:t>
-      </w:r>
-      <w:r>
-        <w:t>The operator takes the following data descriptors</w:t>
-      </w:r>
-      <w:r>
-        <w:t xml:space="preserve">. </w:t>
-      </w:r>
-      <w:r>
-        <w:t>If omitted, an image is created from scratch and the ‘rows’ and ‘cols’ parameters are required.</w:t>
-      </w:r>
-      <w:r>
-        <w:t xml:space="preserve"> If a text input file is specified, each line consists of space or tab delimited numeric intensities. The number of rows is the number of lines in the file. The number of columns are the number of fields on each line. The number of fields must be the same on each line. Various parameters optionally draw points, lines, or rectangles in the image.</w:t>
+      <w:r>
+        <w:t>The transform image create operator creates a test image from text file or from scratch, optionally with superimposed features. The operator takes the following data descriptors. If omitted, an image is created from scratch and the ‘rows’ and ‘cols’ parameters are required. If a text input file is specified, each line consists of space or tab delimited numeric intensities. The number of rows is the number of lines in the file. The number of columns are the number of fields on each line. The number of fields must be the same on each line. Various parameters optionally draw points, lines, or rectangles in the image.</w:t>
       </w:r>
     </w:p>
     <w:tbl>
@@ -21859,10 +21851,7 @@
               <w:cnfStyle w:val="000000100000" w:firstRow="0" w:lastRow="0" w:firstColumn="0" w:lastColumn="0" w:oddVBand="0" w:evenVBand="0" w:oddHBand="1" w:evenHBand="0" w:firstRowFirstColumn="0" w:firstRowLastColumn="0" w:lastRowFirstColumn="0" w:lastRowLastColumn="0"/>
             </w:pPr>
             <w:r>
-              <w:t>“text” or omitted</w:t>
-            </w:r>
-            <w:r>
-              <w:t xml:space="preserve"> </w:t>
+              <w:t xml:space="preserve">“text” or omitted </w:t>
             </w:r>
           </w:p>
         </w:tc>
@@ -21875,16 +21864,7 @@
               <w:cnfStyle w:val="000000100000" w:firstRow="0" w:lastRow="0" w:firstColumn="0" w:lastColumn="0" w:oddVBand="0" w:evenVBand="0" w:oddHBand="1" w:evenHBand="0" w:firstRowFirstColumn="0" w:firstRowLastColumn="0" w:lastRowFirstColumn="0" w:lastRowLastColumn="0"/>
             </w:pPr>
             <w:r>
-              <w:t xml:space="preserve">input </w:t>
-            </w:r>
-            <w:r>
-              <w:t xml:space="preserve">text </w:t>
-            </w:r>
-            <w:r>
-              <w:t xml:space="preserve">CV_32S intensity </w:t>
-            </w:r>
-            <w:r>
-              <w:t xml:space="preserve">value file. </w:t>
+              <w:t xml:space="preserve">input text CV_32S intensity value file. </w:t>
             </w:r>
           </w:p>
         </w:tc>
@@ -21959,13 +21939,7 @@
               <w:cnfStyle w:val="000000000000" w:firstRow="0" w:lastRow="0" w:firstColumn="0" w:lastColumn="0" w:oddVBand="0" w:evenVBand="0" w:oddHBand="0" w:evenHBand="0" w:firstRowFirstColumn="0" w:firstRowLastColumn="0" w:lastRowFirstColumn="0" w:lastRowLastColumn="0"/>
             </w:pPr>
             <w:r>
-              <w:t xml:space="preserve">output CV_8U, CV_32S, or CV_32F </w:t>
-            </w:r>
-            <w:r>
-              <w:t>created</w:t>
-            </w:r>
-            <w:r>
-              <w:t xml:space="preserve"> image. </w:t>
+              <w:t xml:space="preserve">output CV_8U, CV_32S, or CV_32F created image. </w:t>
             </w:r>
           </w:p>
         </w:tc>
@@ -21980,16 +21954,7 @@
         </w:rPr>
       </w:pPr>
       <w:r>
-        <w:t>The</w:t>
-      </w:r>
-      <w:r>
-        <w:t>se are the</w:t>
-      </w:r>
-      <w:r>
-        <w:t xml:space="preserve"> parameters to the draw transform image create operator</w:t>
-      </w:r>
-      <w:r>
-        <w:t xml:space="preserve">. </w:t>
+        <w:t xml:space="preserve">These are the parameters to the draw transform image create operator. </w:t>
       </w:r>
     </w:p>
     <w:p>
@@ -22023,6 +21988,7 @@
               <w:pStyle w:val="NoSpacing"/>
             </w:pPr>
             <w:r>
+              <w:lastRenderedPageBreak/>
               <w:t>parameter</w:t>
             </w:r>
           </w:p>
@@ -22114,13 +22080,7 @@
               <w:cnfStyle w:val="000000000000" w:firstRow="0" w:lastRow="0" w:firstColumn="0" w:lastColumn="0" w:oddVBand="0" w:evenVBand="0" w:oddHBand="0" w:evenHBand="0" w:firstRowFirstColumn="0" w:firstRowLastColumn="0" w:lastRowFirstColumn="0" w:lastRowLastColumn="0"/>
             </w:pPr>
             <w:r>
-              <w:t xml:space="preserve">The number of image columns </w:t>
-            </w:r>
-            <w:r>
-              <w:t>for a new image. Required if a text input image is omitted, else ignored</w:t>
-            </w:r>
-            <w:r>
-              <w:t>.</w:t>
+              <w:t>The number of image columns for a new image. Required if a text input image is omitted, else ignored.</w:t>
             </w:r>
           </w:p>
         </w:tc>
@@ -22160,16 +22120,7 @@
               <w:cnfStyle w:val="000000100000" w:firstRow="0" w:lastRow="0" w:firstColumn="0" w:lastColumn="0" w:oddVBand="0" w:evenVBand="0" w:oddHBand="1" w:evenHBand="0" w:firstRowFirstColumn="0" w:firstRowLastColumn="0" w:lastRowFirstColumn="0" w:lastRowLastColumn="0"/>
             </w:pPr>
             <w:r>
-              <w:t xml:space="preserve">The </w:t>
-            </w:r>
-            <w:r>
-              <w:t xml:space="preserve">base </w:t>
-            </w:r>
-            <w:r>
-              <w:t>pixel value of the output image</w:t>
-            </w:r>
-            <w:r>
-              <w:t>, defaults to 0</w:t>
+              <w:t>The base pixel value of the output image, defaults to 0</w:t>
             </w:r>
           </w:p>
         </w:tc>
@@ -22206,16 +22157,7 @@
               <w:cnfStyle w:val="000000000000" w:firstRow="0" w:lastRow="0" w:firstColumn="0" w:lastColumn="0" w:oddVBand="0" w:evenVBand="0" w:oddHBand="0" w:evenHBand="0" w:firstRowFirstColumn="0" w:firstRowLastColumn="0" w:lastRowFirstColumn="0" w:lastRowLastColumn="0"/>
             </w:pPr>
             <w:r>
-              <w:t xml:space="preserve">The pixel value of </w:t>
-            </w:r>
-            <w:r>
-              <w:t xml:space="preserve">added features </w:t>
-            </w:r>
-            <w:r>
-              <w:t>the output image</w:t>
-            </w:r>
-            <w:r>
-              <w:t xml:space="preserve"> defaults to 255</w:t>
+              <w:t>The pixel value of added features the output image defaults to 255</w:t>
             </w:r>
           </w:p>
         </w:tc>
@@ -22255,13 +22197,7 @@
               <w:cnfStyle w:val="000000100000" w:firstRow="0" w:lastRow="0" w:firstColumn="0" w:lastColumn="0" w:oddVBand="0" w:evenVBand="0" w:oddHBand="1" w:evenHBand="0" w:firstRowFirstColumn="0" w:firstRowLastColumn="0" w:lastRowFirstColumn="0" w:lastRowLastColumn="0"/>
             </w:pPr>
             <w:r>
-              <w:t>A point to add to the image as ‘</w:t>
-            </w:r>
-            <w:r>
-              <w:t>row,col</w:t>
-            </w:r>
-            <w:r>
-              <w:t>’</w:t>
+              <w:t>A point to add to the image as ‘row,col’</w:t>
             </w:r>
           </w:p>
         </w:tc>
@@ -22298,10 +22234,7 @@
               <w:cnfStyle w:val="000000000000" w:firstRow="0" w:lastRow="0" w:firstColumn="0" w:lastColumn="0" w:oddVBand="0" w:evenVBand="0" w:oddHBand="0" w:evenHBand="0" w:firstRowFirstColumn="0" w:firstRowLastColumn="0" w:lastRowFirstColumn="0" w:lastRowLastColumn="0"/>
             </w:pPr>
             <w:r>
-              <w:t xml:space="preserve">A </w:t>
-            </w:r>
-            <w:r>
-              <w:t>line segment ‘(row,col):(row,col</w:t>
+              <w:t>A line segment ‘(row,col):(row,col</w:t>
             </w:r>
             <w:r>
               <w:rPr>
@@ -22311,25 +22244,7 @@
               <w:t>)’</w:t>
             </w:r>
             <w:r>
-              <w:t xml:space="preserve"> to </w:t>
-            </w:r>
-            <w:r>
-              <w:t xml:space="preserve">add to the image, where </w:t>
-            </w:r>
-            <w:r>
-              <w:t>each ‘(</w:t>
-            </w:r>
-            <w:r>
-              <w:t>row,col</w:t>
-            </w:r>
-            <w:r>
-              <w:t>)</w:t>
-            </w:r>
-            <w:r>
-              <w:t xml:space="preserve">’ </w:t>
-            </w:r>
-            <w:r>
-              <w:t>is the start and end points</w:t>
+              <w:t xml:space="preserve"> to add to the image, where each ‘(row,col)’ is the start and end points</w:t>
             </w:r>
           </w:p>
         </w:tc>
@@ -22380,13 +22295,7 @@
         <w:pStyle w:val="Normalafterlist"/>
       </w:pPr>
       <w:r>
-        <w:t xml:space="preserve">The ‘point’, ‘line’, and ‘rectangle’ parameter values may be repeated by separating the values with ‘|’, </w:t>
-      </w:r>
-      <w:r>
-        <w:t>for example</w:t>
-      </w:r>
-      <w:r>
-        <w:t>:</w:t>
+        <w:t>The ‘point’, ‘line’, and ‘rectangle’ parameter values may be repeated by separating the values with ‘|’, for example:</w:t>
       </w:r>
     </w:p>
     <w:p>
@@ -23217,6 +23126,7 @@
           </w:tcPr>
           <w:p>
             <w:r>
+              <w:lastRenderedPageBreak/>
               <w:t>Descriptor type</w:t>
             </w:r>
           </w:p>
@@ -24165,7 +24075,7 @@
       <w:rPr>
         <w:noProof/>
       </w:rPr>
-      <w:t>8/11/2022 3:23 PM</w:t>
+      <w:t>8/20/2022 11:24 AM</w:t>
     </w:r>
     <w:r>
       <w:fldChar w:fldCharType="end"/>
@@ -24237,7 +24147,7 @@
           <w:rPr>
             <w:noProof/>
           </w:rPr>
-          <w:t>8/11/2022 3:23 PM</w:t>
+          <w:t>8/20/2022 11:24 AM</w:t>
         </w:r>
         <w:r>
           <w:fldChar w:fldCharType="end"/>

</xml_diff>